<commit_message>
Ch 6 Description Draft
</commit_message>
<xml_diff>
--- a/Draft/6 Case Study.docx
+++ b/Draft/6 Case Study.docx
@@ -1,10 +1,10 @@
 
 <file path=word/document.xml><?xml version="1.0" encoding="utf-8"?>
-<w:document xmlns:wpc="http://schemas.microsoft.com/office/word/2010/wordprocessingCanvas" xmlns:cx="http://schemas.microsoft.com/office/drawing/2014/chartex" xmlns:cx1="http://schemas.microsoft.com/office/drawing/2015/9/8/chartex" xmlns:cx2="http://schemas.microsoft.com/office/drawing/2015/10/21/chartex" xmlns:cx3="http://schemas.microsoft.com/office/drawing/2016/5/9/chartex" xmlns:cx4="http://schemas.microsoft.com/office/drawing/2016/5/10/chartex" xmlns:cx5="http://schemas.microsoft.com/office/drawing/2016/5/11/chartex" xmlns:cx6="http://schemas.microsoft.com/office/drawing/2016/5/12/chartex" xmlns:cx7="http://schemas.microsoft.com/office/drawing/2016/5/13/chartex" xmlns:cx8="http://schemas.microsoft.com/office/drawing/2016/5/14/chartex" xmlns:mc="http://schemas.openxmlformats.org/markup-compatibility/2006" xmlns:aink="http://schemas.microsoft.com/office/drawing/2016/ink" xmlns:am3d="http://schemas.microsoft.com/office/drawing/2017/model3d" xmlns:o="urn:schemas-microsoft-com:office:office" xmlns:oel="http://schemas.microsoft.com/office/2019/extlst" xmlns:r="http://schemas.openxmlformats.org/officeDocument/2006/relationships" xmlns:m="http://schemas.openxmlformats.org/officeDocument/2006/math" xmlns:v="urn:schemas-microsoft-com:vml" xmlns:wp14="http://schemas.microsoft.com/office/word/2010/wordprocessingDrawing" xmlns:wp="http://schemas.openxmlformats.org/drawingml/2006/wordprocessingDrawing" xmlns:w10="urn:schemas-microsoft-com:office:word" xmlns:w="http://schemas.openxmlformats.org/wordprocessingml/2006/main" xmlns:w14="http://schemas.microsoft.com/office/word/2010/wordml" xmlns:w15="http://schemas.microsoft.com/office/word/2012/wordml" xmlns:w16cex="http://schemas.microsoft.com/office/word/2018/wordml/cex" xmlns:w16cid="http://schemas.microsoft.com/office/word/2016/wordml/cid" xmlns:w16="http://schemas.microsoft.com/office/word/2018/wordml" xmlns:w16du="http://schemas.microsoft.com/office/word/2023/wordml/word16du" xmlns:w16sdtdh="http://schemas.microsoft.com/office/word/2020/wordml/sdtdatahash" xmlns:w16sdtfl="http://schemas.microsoft.com/office/word/2024/wordml/sdtformatlock" xmlns:w16se="http://schemas.microsoft.com/office/word/2015/wordml/symex" xmlns:wpg="http://schemas.microsoft.com/office/word/2010/wordprocessingGroup" xmlns:wpi="http://schemas.microsoft.com/office/word/2010/wordprocessingInk" xmlns:wne="http://schemas.microsoft.com/office/word/2006/wordml" xmlns:wps="http://schemas.microsoft.com/office/word/2010/wordprocessingShape" mc:Ignorable="w14 w15 w16se w16cid w16 w16cex w16sdtdh w16sdtfl w16du wp14">
+<w:document xmlns:wpc="http://schemas.microsoft.com/office/word/2010/wordprocessingCanvas" xmlns:cx="http://schemas.microsoft.com/office/drawing/2014/chartex" xmlns:cx1="http://schemas.microsoft.com/office/drawing/2015/9/8/chartex" xmlns:cx2="http://schemas.microsoft.com/office/drawing/2015/10/21/chartex" xmlns:cx3="http://schemas.microsoft.com/office/drawing/2016/5/9/chartex" xmlns:cx4="http://schemas.microsoft.com/office/drawing/2016/5/10/chartex" xmlns:cx5="http://schemas.microsoft.com/office/drawing/2016/5/11/chartex" xmlns:cx6="http://schemas.microsoft.com/office/drawing/2016/5/12/chartex" xmlns:cx7="http://schemas.microsoft.com/office/drawing/2016/5/13/chartex" xmlns:cx8="http://schemas.microsoft.com/office/drawing/2016/5/14/chartex" xmlns:mc="http://schemas.openxmlformats.org/markup-compatibility/2006" xmlns:aink="http://schemas.microsoft.com/office/drawing/2016/ink" xmlns:am3d="http://schemas.microsoft.com/office/drawing/2017/model3d" xmlns:o="urn:schemas-microsoft-com:office:office" xmlns:r="http://schemas.openxmlformats.org/officeDocument/2006/relationships" xmlns:m="http://schemas.openxmlformats.org/officeDocument/2006/math" xmlns:v="urn:schemas-microsoft-com:vml" xmlns:wp14="http://schemas.microsoft.com/office/word/2010/wordprocessingDrawing" xmlns:wp="http://schemas.openxmlformats.org/drawingml/2006/wordprocessingDrawing" xmlns:w10="urn:schemas-microsoft-com:office:word" xmlns:w="http://schemas.openxmlformats.org/wordprocessingml/2006/main" xmlns:w14="http://schemas.microsoft.com/office/word/2010/wordml" xmlns:w15="http://schemas.microsoft.com/office/word/2012/wordml" xmlns:w16cex="http://schemas.microsoft.com/office/word/2018/wordml/cex" xmlns:w16cid="http://schemas.microsoft.com/office/word/2016/wordml/cid" xmlns:w16="http://schemas.microsoft.com/office/word/2018/wordml" xmlns:w16sdtdh="http://schemas.microsoft.com/office/word/2020/wordml/sdtdatahash" xmlns:w16se="http://schemas.microsoft.com/office/word/2015/wordml/symex" xmlns:wpg="http://schemas.microsoft.com/office/word/2010/wordprocessingGroup" xmlns:wpi="http://schemas.microsoft.com/office/word/2010/wordprocessingInk" xmlns:wne="http://schemas.microsoft.com/office/word/2006/wordml" xmlns:wps="http://schemas.microsoft.com/office/word/2010/wordprocessingShape" mc:Ignorable="w14 w15 w16se w16cid w16 w16cex w16sdtdh wp14">
   <w:body>
     <w:p>
       <w:pPr>
-        <w:pStyle w:val="Ttulo"/>
+        <w:pStyle w:val="Title"/>
         <w:rPr>
           <w:rFonts w:asciiTheme="majorHAnsi" w:hAnsiTheme="majorHAnsi" w:cstheme="majorHAnsi"/>
           <w:sz w:val="24"/>
@@ -241,12 +241,30 @@
           <w:szCs w:val="24"/>
           <w:lang w:val="en-NZ"/>
         </w:rPr>
-        <w:t>Finally, the last group of section will offer a description and analysis of the overall experience from the point of view of the students and the teaching staff based on the data obtained from the complementary research instruments such as interviews and questionnaires.</w:t>
-      </w:r>
-    </w:p>
-    <w:p>
-      <w:pPr>
-        <w:pStyle w:val="Ttulo1"/>
+        <w:t>Finally, the last group of section</w:t>
+      </w:r>
+      <w:r>
+        <w:rPr>
+          <w:rFonts w:asciiTheme="majorHAnsi" w:hAnsiTheme="majorHAnsi" w:cstheme="majorHAnsi"/>
+          <w:sz w:val="24"/>
+          <w:szCs w:val="24"/>
+          <w:lang w:val="en-NZ"/>
+        </w:rPr>
+        <w:t>s</w:t>
+      </w:r>
+      <w:r>
+        <w:rPr>
+          <w:rFonts w:asciiTheme="majorHAnsi" w:hAnsiTheme="majorHAnsi" w:cstheme="majorHAnsi"/>
+          <w:sz w:val="24"/>
+          <w:szCs w:val="24"/>
+          <w:lang w:val="en-NZ"/>
+        </w:rPr>
+        <w:t xml:space="preserve"> will offer a description and analysis of the overall experience from the point of view of the students and the teaching staff based on the data obtained from the complementary research instruments such as interviews and questionnaires.</w:t>
+      </w:r>
+    </w:p>
+    <w:p>
+      <w:pPr>
+        <w:pStyle w:val="Heading1"/>
         <w:rPr>
           <w:rFonts w:asciiTheme="majorHAnsi" w:hAnsiTheme="majorHAnsi" w:cstheme="majorHAnsi"/>
           <w:sz w:val="24"/>
@@ -280,7 +298,25 @@
           <w:szCs w:val="24"/>
           <w:lang w:val="en-NZ"/>
         </w:rPr>
-        <w:t xml:space="preserve">Industry Project is a last year course offered by the school of Built Environments at the Auckland University of Technology. The course offers students of the Architectural Desing, Construction Engineering, Construction Management and Quantity Surveillance programs </w:t>
+        <w:t xml:space="preserve">Industry Project is a last year course offered by the school of Built Environments at the Auckland University of Technology. The course offers students of the Architectural </w:t>
+      </w:r>
+      <w:r>
+        <w:rPr>
+          <w:rFonts w:asciiTheme="majorHAnsi" w:hAnsiTheme="majorHAnsi" w:cstheme="majorHAnsi"/>
+          <w:sz w:val="24"/>
+          <w:szCs w:val="24"/>
+          <w:lang w:val="en-NZ"/>
+        </w:rPr>
+        <w:t>Design</w:t>
+      </w:r>
+      <w:r>
+        <w:rPr>
+          <w:rFonts w:asciiTheme="majorHAnsi" w:hAnsiTheme="majorHAnsi" w:cstheme="majorHAnsi"/>
+          <w:sz w:val="24"/>
+          <w:szCs w:val="24"/>
+          <w:lang w:val="en-NZ"/>
+        </w:rPr>
+        <w:t xml:space="preserve">, Construction Engineering, Construction Management and Quantity Surveillance programs </w:t>
       </w:r>
       <w:r>
         <w:rPr>
@@ -351,7 +387,837 @@
     </w:p>
     <w:p>
       <w:pPr>
-        <w:pStyle w:val="Ttulo1"/>
+        <w:pStyle w:val="ListParagraph"/>
+        <w:numPr>
+          <w:ilvl w:val="0"/>
+          <w:numId w:val="5"/>
+        </w:numPr>
+        <w:rPr>
+          <w:rFonts w:asciiTheme="majorHAnsi" w:hAnsiTheme="majorHAnsi" w:cstheme="majorHAnsi"/>
+          <w:sz w:val="24"/>
+          <w:szCs w:val="24"/>
+          <w:lang w:val="en-NZ"/>
+        </w:rPr>
+      </w:pPr>
+      <w:r>
+        <w:rPr>
+          <w:rFonts w:asciiTheme="majorHAnsi" w:hAnsiTheme="majorHAnsi" w:cstheme="majorHAnsi"/>
+          <w:sz w:val="24"/>
+          <w:szCs w:val="24"/>
+          <w:lang w:val="en-NZ"/>
+        </w:rPr>
+        <w:t>Propose, organise, design, analyse, execute and reflect on a multi-disciplinary</w:t>
+      </w:r>
+      <w:r>
+        <w:rPr>
+          <w:rFonts w:asciiTheme="majorHAnsi" w:hAnsiTheme="majorHAnsi" w:cstheme="majorHAnsi"/>
+          <w:sz w:val="24"/>
+          <w:szCs w:val="24"/>
+          <w:lang w:val="en-NZ"/>
+        </w:rPr>
+        <w:t xml:space="preserve"> </w:t>
+      </w:r>
+      <w:r>
+        <w:rPr>
+          <w:rFonts w:asciiTheme="majorHAnsi" w:hAnsiTheme="majorHAnsi" w:cstheme="majorHAnsi"/>
+          <w:sz w:val="24"/>
+          <w:szCs w:val="24"/>
+          <w:lang w:val="en-NZ"/>
+        </w:rPr>
+        <w:t>project.</w:t>
+      </w:r>
+    </w:p>
+    <w:p>
+      <w:pPr>
+        <w:pStyle w:val="ListParagraph"/>
+        <w:numPr>
+          <w:ilvl w:val="0"/>
+          <w:numId w:val="5"/>
+        </w:numPr>
+        <w:rPr>
+          <w:rFonts w:asciiTheme="majorHAnsi" w:hAnsiTheme="majorHAnsi" w:cstheme="majorHAnsi"/>
+          <w:sz w:val="24"/>
+          <w:szCs w:val="24"/>
+          <w:lang w:val="en-NZ"/>
+        </w:rPr>
+      </w:pPr>
+      <w:r>
+        <w:rPr>
+          <w:rFonts w:asciiTheme="majorHAnsi" w:hAnsiTheme="majorHAnsi" w:cstheme="majorHAnsi"/>
+          <w:sz w:val="24"/>
+          <w:szCs w:val="24"/>
+          <w:lang w:val="en-NZ"/>
+        </w:rPr>
+        <w:t>Apply existing construction</w:t>
+      </w:r>
+      <w:r>
+        <w:rPr>
+          <w:rFonts w:asciiTheme="majorHAnsi" w:hAnsiTheme="majorHAnsi" w:cstheme="majorHAnsi"/>
+          <w:sz w:val="24"/>
+          <w:szCs w:val="24"/>
+          <w:lang w:val="en-NZ"/>
+        </w:rPr>
+        <w:t xml:space="preserve"> and </w:t>
+      </w:r>
+      <w:r>
+        <w:rPr>
+          <w:rFonts w:asciiTheme="majorHAnsi" w:hAnsiTheme="majorHAnsi" w:cstheme="majorHAnsi"/>
+          <w:sz w:val="24"/>
+          <w:szCs w:val="24"/>
+          <w:lang w:val="en-NZ"/>
+        </w:rPr>
+        <w:t>engineering knowledge and skills to the project.</w:t>
+      </w:r>
+    </w:p>
+    <w:p>
+      <w:pPr>
+        <w:pStyle w:val="ListParagraph"/>
+        <w:numPr>
+          <w:ilvl w:val="0"/>
+          <w:numId w:val="5"/>
+        </w:numPr>
+        <w:spacing w:after="160" w:line="259" w:lineRule="auto"/>
+        <w:jc w:val="both"/>
+        <w:rPr>
+          <w:lang w:val="en-NZ"/>
+        </w:rPr>
+      </w:pPr>
+      <w:r>
+        <w:rPr>
+          <w:lang w:val="en-NZ"/>
+        </w:rPr>
+        <w:t>Conduct a systematic literature review to identify works previously undertaken and gaps requiring research</w:t>
+      </w:r>
+      <w:r>
+        <w:rPr>
+          <w:lang w:val="en-NZ"/>
+        </w:rPr>
+        <w:t>.</w:t>
+      </w:r>
+    </w:p>
+    <w:p>
+      <w:pPr>
+        <w:pStyle w:val="ListParagraph"/>
+        <w:numPr>
+          <w:ilvl w:val="0"/>
+          <w:numId w:val="5"/>
+        </w:numPr>
+        <w:rPr>
+          <w:rFonts w:asciiTheme="majorHAnsi" w:hAnsiTheme="majorHAnsi" w:cstheme="majorHAnsi"/>
+          <w:sz w:val="24"/>
+          <w:szCs w:val="24"/>
+          <w:lang w:val="en-NZ"/>
+        </w:rPr>
+      </w:pPr>
+      <w:r>
+        <w:rPr>
+          <w:rFonts w:asciiTheme="majorHAnsi" w:hAnsiTheme="majorHAnsi" w:cstheme="majorHAnsi"/>
+          <w:sz w:val="24"/>
+          <w:szCs w:val="24"/>
+          <w:lang w:val="en-NZ"/>
+        </w:rPr>
+        <w:t>Demonstrate initiative and independence in decision making where appropriate.</w:t>
+      </w:r>
+    </w:p>
+    <w:p>
+      <w:pPr>
+        <w:pStyle w:val="ListParagraph"/>
+        <w:numPr>
+          <w:ilvl w:val="0"/>
+          <w:numId w:val="5"/>
+        </w:numPr>
+        <w:rPr>
+          <w:rFonts w:asciiTheme="majorHAnsi" w:hAnsiTheme="majorHAnsi" w:cstheme="majorHAnsi"/>
+          <w:sz w:val="24"/>
+          <w:szCs w:val="24"/>
+          <w:lang w:val="en-NZ"/>
+        </w:rPr>
+      </w:pPr>
+      <w:r>
+        <w:rPr>
+          <w:rFonts w:asciiTheme="majorHAnsi" w:hAnsiTheme="majorHAnsi" w:cstheme="majorHAnsi"/>
+          <w:sz w:val="24"/>
+          <w:szCs w:val="24"/>
+          <w:lang w:val="en-NZ"/>
+        </w:rPr>
+        <w:t>Present project progress and technical details to multi-disciplinary audiences.</w:t>
+      </w:r>
+    </w:p>
+    <w:p>
+      <w:pPr>
+        <w:pStyle w:val="ListParagraph"/>
+        <w:numPr>
+          <w:ilvl w:val="0"/>
+          <w:numId w:val="5"/>
+        </w:numPr>
+        <w:rPr>
+          <w:rFonts w:asciiTheme="majorHAnsi" w:hAnsiTheme="majorHAnsi" w:cstheme="majorHAnsi"/>
+          <w:sz w:val="24"/>
+          <w:szCs w:val="24"/>
+          <w:lang w:val="en-NZ"/>
+        </w:rPr>
+      </w:pPr>
+      <w:r>
+        <w:rPr>
+          <w:rFonts w:asciiTheme="majorHAnsi" w:hAnsiTheme="majorHAnsi" w:cstheme="majorHAnsi"/>
+          <w:sz w:val="24"/>
+          <w:szCs w:val="24"/>
+          <w:lang w:val="en-NZ"/>
+        </w:rPr>
+        <w:t>Deliver and present comprehensive client reports at relevant professional standards.</w:t>
+      </w:r>
+    </w:p>
+    <w:p>
+      <w:pPr>
+        <w:rPr>
+          <w:rFonts w:asciiTheme="majorHAnsi" w:hAnsiTheme="majorHAnsi" w:cstheme="majorHAnsi"/>
+          <w:sz w:val="24"/>
+          <w:szCs w:val="24"/>
+          <w:lang w:val="en-NZ"/>
+        </w:rPr>
+      </w:pPr>
+      <w:r>
+        <w:rPr>
+          <w:rFonts w:asciiTheme="majorHAnsi" w:hAnsiTheme="majorHAnsi" w:cstheme="majorHAnsi"/>
+          <w:sz w:val="24"/>
+          <w:szCs w:val="24"/>
+          <w:lang w:val="en-NZ"/>
+        </w:rPr>
+        <w:t>It is possible to see that the main learning goals of the course align with the main ideas promoted trough the learning intervention of WorkshopAR in key aspects like decision-making, communication and multi-disciplinary, multiuser work.</w:t>
+      </w:r>
+      <w:r>
+        <w:rPr>
+          <w:rFonts w:asciiTheme="majorHAnsi" w:hAnsiTheme="majorHAnsi" w:cstheme="majorHAnsi"/>
+          <w:sz w:val="24"/>
+          <w:szCs w:val="24"/>
+          <w:lang w:val="en-NZ"/>
+        </w:rPr>
+        <w:t xml:space="preserve"> Industry Project offers the opportunity to apply the knowledge and skills that the students have gathered through their career in a situation that requires to understand a real-life problem and collaborate with other professionals to propose, design and execute a solution.</w:t>
+      </w:r>
+    </w:p>
+    <w:p>
+      <w:pPr>
+        <w:rPr>
+          <w:rFonts w:asciiTheme="majorHAnsi" w:hAnsiTheme="majorHAnsi" w:cstheme="majorHAnsi"/>
+          <w:sz w:val="24"/>
+          <w:szCs w:val="24"/>
+          <w:lang w:val="en-NZ"/>
+        </w:rPr>
+      </w:pPr>
+      <w:r>
+        <w:rPr>
+          <w:rFonts w:asciiTheme="majorHAnsi" w:hAnsiTheme="majorHAnsi" w:cstheme="majorHAnsi"/>
+          <w:sz w:val="24"/>
+          <w:szCs w:val="24"/>
+          <w:lang w:val="en-NZ"/>
+        </w:rPr>
+        <w:t>The methodology of the course helps the students in the development of the project through three main mechanisms: the client simulation, weekly workshops and open work sessions. These three elements feed on each other to help the students immerse in the development of the project in a way that simulates real work experience and can access the support of the teaching staff and other professionals to aid them with issues related to the project and with team management.</w:t>
+      </w:r>
+    </w:p>
+    <w:p>
+      <w:pPr>
+        <w:rPr>
+          <w:rFonts w:asciiTheme="majorHAnsi" w:hAnsiTheme="majorHAnsi" w:cstheme="majorHAnsi"/>
+          <w:sz w:val="24"/>
+          <w:szCs w:val="24"/>
+          <w:lang w:val="en-NZ"/>
+        </w:rPr>
+      </w:pPr>
+      <w:r>
+        <w:rPr>
+          <w:rFonts w:asciiTheme="majorHAnsi" w:hAnsiTheme="majorHAnsi" w:cstheme="majorHAnsi"/>
+          <w:sz w:val="24"/>
+          <w:szCs w:val="24"/>
+          <w:lang w:val="en-NZ"/>
+        </w:rPr>
+        <w:t>The client simulation involved a substantial effort of creating the context of the project with the help and input of several professional, both part of the faculty and from external sources. The project asked the students to analyse:</w:t>
+      </w:r>
+    </w:p>
+    <w:p>
+      <w:pPr>
+        <w:pStyle w:val="ListParagraph"/>
+        <w:numPr>
+          <w:ilvl w:val="0"/>
+          <w:numId w:val="7"/>
+        </w:numPr>
+        <w:rPr>
+          <w:rFonts w:asciiTheme="majorHAnsi" w:hAnsiTheme="majorHAnsi" w:cstheme="majorHAnsi"/>
+          <w:sz w:val="24"/>
+          <w:szCs w:val="24"/>
+          <w:lang w:val="en-NZ"/>
+        </w:rPr>
+      </w:pPr>
+      <w:r>
+        <w:rPr>
+          <w:rFonts w:asciiTheme="majorHAnsi" w:hAnsiTheme="majorHAnsi" w:cstheme="majorHAnsi"/>
+          <w:sz w:val="24"/>
+          <w:szCs w:val="24"/>
+          <w:lang w:val="en-NZ"/>
+        </w:rPr>
+        <w:t>Geotechnical data of the terrain to be developed.</w:t>
+      </w:r>
+    </w:p>
+    <w:p>
+      <w:pPr>
+        <w:pStyle w:val="ListParagraph"/>
+        <w:numPr>
+          <w:ilvl w:val="0"/>
+          <w:numId w:val="7"/>
+        </w:numPr>
+        <w:rPr>
+          <w:rFonts w:asciiTheme="majorHAnsi" w:hAnsiTheme="majorHAnsi" w:cstheme="majorHAnsi"/>
+          <w:sz w:val="24"/>
+          <w:szCs w:val="24"/>
+          <w:lang w:val="en-NZ"/>
+        </w:rPr>
+      </w:pPr>
+      <w:r>
+        <w:rPr>
+          <w:rFonts w:asciiTheme="majorHAnsi" w:hAnsiTheme="majorHAnsi" w:cstheme="majorHAnsi"/>
+          <w:sz w:val="24"/>
+          <w:szCs w:val="24"/>
+          <w:lang w:val="en-NZ"/>
+        </w:rPr>
+        <w:t>Cultural, economical and social factors of the zone where the terrain was located.</w:t>
+      </w:r>
+    </w:p>
+    <w:p>
+      <w:pPr>
+        <w:pStyle w:val="ListParagraph"/>
+        <w:numPr>
+          <w:ilvl w:val="0"/>
+          <w:numId w:val="7"/>
+        </w:numPr>
+        <w:rPr>
+          <w:rFonts w:asciiTheme="majorHAnsi" w:hAnsiTheme="majorHAnsi" w:cstheme="majorHAnsi"/>
+          <w:sz w:val="24"/>
+          <w:szCs w:val="24"/>
+          <w:lang w:val="en-NZ"/>
+        </w:rPr>
+      </w:pPr>
+      <w:r>
+        <w:rPr>
+          <w:rFonts w:asciiTheme="majorHAnsi" w:hAnsiTheme="majorHAnsi" w:cstheme="majorHAnsi"/>
+          <w:sz w:val="24"/>
+          <w:szCs w:val="24"/>
+          <w:lang w:val="en-NZ"/>
+        </w:rPr>
+        <w:lastRenderedPageBreak/>
+        <w:t>Requirements and proposal from the client, a fictional firm in charge of the development project.</w:t>
+      </w:r>
+    </w:p>
+    <w:p>
+      <w:pPr>
+        <w:pStyle w:val="ListParagraph"/>
+        <w:numPr>
+          <w:ilvl w:val="0"/>
+          <w:numId w:val="7"/>
+        </w:numPr>
+        <w:rPr>
+          <w:rFonts w:asciiTheme="majorHAnsi" w:hAnsiTheme="majorHAnsi" w:cstheme="majorHAnsi"/>
+          <w:sz w:val="24"/>
+          <w:szCs w:val="24"/>
+          <w:lang w:val="en-NZ"/>
+        </w:rPr>
+      </w:pPr>
+      <w:r>
+        <w:rPr>
+          <w:rFonts w:asciiTheme="majorHAnsi" w:hAnsiTheme="majorHAnsi" w:cstheme="majorHAnsi"/>
+          <w:sz w:val="24"/>
+          <w:szCs w:val="24"/>
+          <w:lang w:val="en-NZ"/>
+        </w:rPr>
+        <w:t>Requirements and proposals from other stakeholders like local residents and the government.</w:t>
+      </w:r>
+    </w:p>
+    <w:p>
+      <w:pPr>
+        <w:rPr>
+          <w:rFonts w:asciiTheme="majorHAnsi" w:hAnsiTheme="majorHAnsi" w:cstheme="majorHAnsi"/>
+          <w:sz w:val="24"/>
+          <w:szCs w:val="24"/>
+          <w:lang w:val="en-NZ"/>
+        </w:rPr>
+      </w:pPr>
+      <w:r>
+        <w:rPr>
+          <w:rFonts w:asciiTheme="majorHAnsi" w:hAnsiTheme="majorHAnsi" w:cstheme="majorHAnsi"/>
+          <w:sz w:val="24"/>
+          <w:szCs w:val="24"/>
+          <w:lang w:val="en-NZ"/>
+        </w:rPr>
+        <w:t>The fictional client firm would be represented by several experts, most of them part of the faculty but not directly part of the teaching staff, but that where available to answer questions about their requirements and also about the work expected from each of the four roles present in the course.</w:t>
+      </w:r>
+      <w:r>
+        <w:rPr>
+          <w:rFonts w:asciiTheme="majorHAnsi" w:hAnsiTheme="majorHAnsi" w:cstheme="majorHAnsi"/>
+          <w:sz w:val="24"/>
+          <w:szCs w:val="24"/>
+          <w:lang w:val="en-NZ"/>
+        </w:rPr>
+        <w:t xml:space="preserve"> Additionally, each group would act as a task team in charge of the design and surveillance of the development of the project. </w:t>
+      </w:r>
+      <w:r>
+        <w:rPr>
+          <w:rFonts w:asciiTheme="majorHAnsi" w:hAnsiTheme="majorHAnsi" w:cstheme="majorHAnsi"/>
+          <w:sz w:val="24"/>
+          <w:szCs w:val="24"/>
+          <w:lang w:val="en-NZ"/>
+        </w:rPr>
+        <w:t>ENBU 79X/89X</w:t>
+      </w:r>
+      <w:r>
+        <w:rPr>
+          <w:rFonts w:asciiTheme="majorHAnsi" w:hAnsiTheme="majorHAnsi" w:cstheme="majorHAnsi"/>
+          <w:sz w:val="24"/>
+          <w:szCs w:val="24"/>
+          <w:lang w:val="en-NZ"/>
+        </w:rPr>
+        <w:t xml:space="preserve"> acts as the capstone for four different programs, and each group had at least one representative of each role: Architectural Engineer, Construction Engineer, Construction Manager and Quantity Surveyor. The group was expected to coordinate efforts to create a coherent proposal for the development project, while fulfilling specific tasks and deliveries specific for each role. Finally, the group as a whole had to create weekly and milestone reports to the client, creating a summary document meant to explain the current state of the project in a way that tackles the different profiles that the fictional client firm was representing</w:t>
+      </w:r>
+      <w:r>
+        <w:rPr>
+          <w:rFonts w:asciiTheme="majorHAnsi" w:hAnsiTheme="majorHAnsi" w:cstheme="majorHAnsi"/>
+          <w:sz w:val="24"/>
+          <w:szCs w:val="24"/>
+          <w:lang w:val="en-NZ"/>
+        </w:rPr>
+        <w:t>.</w:t>
+      </w:r>
+    </w:p>
+    <w:p>
+      <w:pPr>
+        <w:rPr>
+          <w:rFonts w:asciiTheme="majorHAnsi" w:hAnsiTheme="majorHAnsi" w:cstheme="majorHAnsi"/>
+          <w:sz w:val="24"/>
+          <w:szCs w:val="24"/>
+          <w:lang w:val="en-NZ"/>
+        </w:rPr>
+      </w:pPr>
+      <w:r>
+        <w:rPr>
+          <w:rFonts w:asciiTheme="majorHAnsi" w:hAnsiTheme="majorHAnsi" w:cstheme="majorHAnsi"/>
+          <w:sz w:val="24"/>
+          <w:szCs w:val="24"/>
+          <w:lang w:val="en-NZ"/>
+        </w:rPr>
+        <w:t>As can be noted, the course relies entirely on the project approach to provide the teaching material to fulfil the learning outcomes. There is no technical content in the course for any of the roles, relying more on giving the students quick access to material of previous courses and curated information on the web, all through the LMS. A second support tool for the technical content is the client itself, which can be approached with questions about the requirements asked for each role for feedback about the work done or how to approach the deliveries (breaking the immersion factor a little, which will be a point of analysis later).</w:t>
+      </w:r>
+    </w:p>
+    <w:p>
+      <w:pPr>
+        <w:rPr>
+          <w:rFonts w:asciiTheme="majorHAnsi" w:hAnsiTheme="majorHAnsi" w:cstheme="majorHAnsi"/>
+          <w:sz w:val="24"/>
+          <w:szCs w:val="24"/>
+          <w:lang w:val="en-NZ"/>
+        </w:rPr>
+      </w:pPr>
+      <w:r>
+        <w:rPr>
+          <w:rFonts w:asciiTheme="majorHAnsi" w:hAnsiTheme="majorHAnsi" w:cstheme="majorHAnsi"/>
+          <w:sz w:val="24"/>
+          <w:szCs w:val="24"/>
+          <w:lang w:val="en-NZ"/>
+        </w:rPr>
+        <w:t>The main tool used by the course to give help material to the students is the weekly workshops. These take two possible forms, either workshops guided by the teaching staff, often talking about due deliverables or clarifying aspects of the project, or workshop guided by external professionals tackling subjects like conflict management, team management techniques, and professional information about the different tasks found in the project.</w:t>
+      </w:r>
+    </w:p>
+    <w:p>
+      <w:pPr>
+        <w:rPr>
+          <w:rFonts w:asciiTheme="majorHAnsi" w:hAnsiTheme="majorHAnsi" w:cstheme="majorHAnsi"/>
+          <w:sz w:val="24"/>
+          <w:szCs w:val="24"/>
+          <w:lang w:val="en-NZ"/>
+        </w:rPr>
+      </w:pPr>
+      <w:r>
+        <w:rPr>
+          <w:rFonts w:asciiTheme="majorHAnsi" w:hAnsiTheme="majorHAnsi" w:cstheme="majorHAnsi"/>
+          <w:sz w:val="24"/>
+          <w:szCs w:val="24"/>
+          <w:lang w:val="en-NZ"/>
+        </w:rPr>
+        <w:t>The final methodological implementation of the course is the open work sessions, which represent the majority of the time spend by the students in the course. As the name suggest, they are open in nature, allowing the students to use the time in the classroom (about two sessions of 1 hour per week, depending on the length of other activities) to meet with their group or with other students to organize their work and progress towards the competition of the different deliverables. These sessions also allowed the students to have direct access to the teaching staff and a somewhat reliable access to their peers, specially to the students fulfilling the role of Architectural Engineers, that had to be shared among several groups.</w:t>
+      </w:r>
+    </w:p>
+    <w:p>
+      <w:pPr>
+        <w:rPr>
+          <w:rFonts w:asciiTheme="majorHAnsi" w:hAnsiTheme="majorHAnsi" w:cstheme="majorHAnsi"/>
+          <w:sz w:val="24"/>
+          <w:szCs w:val="24"/>
+          <w:lang w:val="en-NZ"/>
+        </w:rPr>
+      </w:pPr>
+      <w:r>
+        <w:rPr>
+          <w:rFonts w:asciiTheme="majorHAnsi" w:hAnsiTheme="majorHAnsi" w:cstheme="majorHAnsi"/>
+          <w:sz w:val="24"/>
+          <w:szCs w:val="24"/>
+          <w:lang w:val="en-NZ"/>
+        </w:rPr>
+        <w:lastRenderedPageBreak/>
+        <w:t>Assessment of the course is completely individual. Deliverables and the whole solution proposal to the project are build as a group, but each student presents at the end his own oral presentation and final client report to be marked. The main assessment tools are the oral presentations and the final client report. The presentations consist on short 5-minute presentations about the overall proposal of the group for the project, the current state of development and the personal contributions of the students n the construction of that proposal. There were two oral presentations along the course, one focused on the architectural design and the other on the final proposal.</w:t>
+      </w:r>
+    </w:p>
+    <w:p>
+      <w:pPr>
+        <w:rPr>
+          <w:rFonts w:asciiTheme="majorHAnsi" w:hAnsiTheme="majorHAnsi" w:cstheme="majorHAnsi"/>
+          <w:sz w:val="24"/>
+          <w:szCs w:val="24"/>
+          <w:lang w:val="en-NZ"/>
+        </w:rPr>
+      </w:pPr>
+      <w:r>
+        <w:rPr>
+          <w:rFonts w:asciiTheme="majorHAnsi" w:hAnsiTheme="majorHAnsi" w:cstheme="majorHAnsi"/>
+          <w:sz w:val="24"/>
+          <w:szCs w:val="24"/>
+          <w:lang w:val="en-NZ"/>
+        </w:rPr>
+        <w:t xml:space="preserve">The client reports consistent of weekly formative assessment of the </w:t>
+      </w:r>
+      <w:r>
+        <w:rPr>
+          <w:rFonts w:asciiTheme="majorHAnsi" w:hAnsiTheme="majorHAnsi" w:cstheme="majorHAnsi"/>
+          <w:sz w:val="24"/>
+          <w:szCs w:val="24"/>
+          <w:lang w:val="en-NZ"/>
+        </w:rPr>
+        <w:t>group’s</w:t>
+      </w:r>
+      <w:r>
+        <w:rPr>
+          <w:rFonts w:asciiTheme="majorHAnsi" w:hAnsiTheme="majorHAnsi" w:cstheme="majorHAnsi"/>
+          <w:sz w:val="24"/>
+          <w:szCs w:val="24"/>
+          <w:lang w:val="en-NZ"/>
+        </w:rPr>
+        <w:t xml:space="preserve"> pro</w:t>
+      </w:r>
+      <w:r>
+        <w:rPr>
+          <w:rFonts w:asciiTheme="majorHAnsi" w:hAnsiTheme="majorHAnsi" w:cstheme="majorHAnsi"/>
+          <w:sz w:val="24"/>
+          <w:szCs w:val="24"/>
+          <w:lang w:val="en-NZ"/>
+        </w:rPr>
+        <w:t>gress</w:t>
+      </w:r>
+      <w:r>
+        <w:rPr>
+          <w:rFonts w:asciiTheme="majorHAnsi" w:hAnsiTheme="majorHAnsi" w:cstheme="majorHAnsi"/>
+          <w:sz w:val="24"/>
+          <w:szCs w:val="24"/>
+          <w:lang w:val="en-NZ"/>
+        </w:rPr>
+        <w:t xml:space="preserve"> and two final reports and the end of each semester. The </w:t>
+      </w:r>
+      <w:r>
+        <w:rPr>
+          <w:rFonts w:asciiTheme="majorHAnsi" w:hAnsiTheme="majorHAnsi" w:cstheme="majorHAnsi"/>
+          <w:sz w:val="24"/>
+          <w:szCs w:val="24"/>
+          <w:lang w:val="en-NZ"/>
+        </w:rPr>
+        <w:t>bi-</w:t>
+      </w:r>
+      <w:r>
+        <w:rPr>
+          <w:rFonts w:asciiTheme="majorHAnsi" w:hAnsiTheme="majorHAnsi" w:cstheme="majorHAnsi"/>
+          <w:sz w:val="24"/>
+          <w:szCs w:val="24"/>
+          <w:lang w:val="en-NZ"/>
+        </w:rPr>
+        <w:t>weekly report where not marked but w</w:t>
+      </w:r>
+      <w:r>
+        <w:rPr>
+          <w:rFonts w:asciiTheme="majorHAnsi" w:hAnsiTheme="majorHAnsi" w:cstheme="majorHAnsi"/>
+          <w:sz w:val="24"/>
+          <w:szCs w:val="24"/>
+          <w:lang w:val="en-NZ"/>
+        </w:rPr>
+        <w:t>ere analysed weekly, and a brief workshop was held bi-weekly to tackle common issues found in the reports. It was also a useful tool to identify the overall progress of al the groups and take decisions of how to manage due dates and marking expectations.</w:t>
+      </w:r>
+      <w:r>
+        <w:rPr>
+          <w:rFonts w:asciiTheme="majorHAnsi" w:hAnsiTheme="majorHAnsi" w:cstheme="majorHAnsi"/>
+          <w:sz w:val="24"/>
+          <w:szCs w:val="24"/>
+          <w:lang w:val="en-NZ"/>
+        </w:rPr>
+        <w:t xml:space="preserve"> The final report was marked, and consisted on a quick summary of the personal contributions of each student in the project, as well as a reflection of the work done by the group, the problems found and the steps taken to solve them.</w:t>
+      </w:r>
+    </w:p>
+    <w:p>
+      <w:pPr>
+        <w:rPr>
+          <w:rFonts w:asciiTheme="majorHAnsi" w:hAnsiTheme="majorHAnsi" w:cstheme="majorHAnsi"/>
+          <w:sz w:val="24"/>
+          <w:szCs w:val="24"/>
+          <w:lang w:val="en-NZ"/>
+        </w:rPr>
+      </w:pPr>
+      <w:r>
+        <w:rPr>
+          <w:rFonts w:asciiTheme="majorHAnsi" w:hAnsiTheme="majorHAnsi" w:cstheme="majorHAnsi"/>
+          <w:sz w:val="24"/>
+          <w:szCs w:val="24"/>
+          <w:lang w:val="en-NZ"/>
+        </w:rPr>
+        <w:t>As for the content of the project itself</w:t>
+      </w:r>
+      <w:r>
+        <w:rPr>
+          <w:rFonts w:asciiTheme="majorHAnsi" w:hAnsiTheme="majorHAnsi" w:cstheme="majorHAnsi"/>
+          <w:sz w:val="24"/>
+          <w:szCs w:val="24"/>
+          <w:lang w:val="en-NZ"/>
+        </w:rPr>
+        <w:t>, it was meant to cover activities for each of the roles of the course. The specifics of the work done are not that necessary for the analysis of this case study, but overall, the students had to propose a solution for:</w:t>
+      </w:r>
+    </w:p>
+    <w:p>
+      <w:pPr>
+        <w:pStyle w:val="ListParagraph"/>
+        <w:numPr>
+          <w:ilvl w:val="0"/>
+          <w:numId w:val="8"/>
+        </w:numPr>
+        <w:rPr>
+          <w:rFonts w:asciiTheme="majorHAnsi" w:hAnsiTheme="majorHAnsi" w:cstheme="majorHAnsi"/>
+          <w:sz w:val="24"/>
+          <w:szCs w:val="24"/>
+          <w:lang w:val="en-NZ"/>
+        </w:rPr>
+      </w:pPr>
+      <w:r>
+        <w:rPr>
+          <w:rFonts w:asciiTheme="majorHAnsi" w:hAnsiTheme="majorHAnsi" w:cstheme="majorHAnsi"/>
+          <w:sz w:val="24"/>
+          <w:szCs w:val="24"/>
+          <w:lang w:val="en-NZ"/>
+        </w:rPr>
+        <w:t>An architectural design for a building complex that takes into account the geotechnical data of the construction site, the functional necessities of the project and the complications and peculiarities found in the selected site.</w:t>
+      </w:r>
+    </w:p>
+    <w:p>
+      <w:pPr>
+        <w:pStyle w:val="ListParagraph"/>
+        <w:numPr>
+          <w:ilvl w:val="0"/>
+          <w:numId w:val="8"/>
+        </w:numPr>
+        <w:rPr>
+          <w:rFonts w:asciiTheme="majorHAnsi" w:hAnsiTheme="majorHAnsi" w:cstheme="majorHAnsi"/>
+          <w:sz w:val="24"/>
+          <w:szCs w:val="24"/>
+          <w:lang w:val="en-NZ"/>
+        </w:rPr>
+      </w:pPr>
+      <w:r>
+        <w:rPr>
+          <w:rFonts w:asciiTheme="majorHAnsi" w:hAnsiTheme="majorHAnsi" w:cstheme="majorHAnsi"/>
+          <w:sz w:val="24"/>
+          <w:szCs w:val="24"/>
+          <w:lang w:val="en-NZ"/>
+        </w:rPr>
+        <w:t>A construction plan that considers building materials, functional necessities and local regulations.</w:t>
+      </w:r>
+    </w:p>
+    <w:p>
+      <w:pPr>
+        <w:pStyle w:val="ListParagraph"/>
+        <w:numPr>
+          <w:ilvl w:val="0"/>
+          <w:numId w:val="8"/>
+        </w:numPr>
+        <w:rPr>
+          <w:rFonts w:asciiTheme="majorHAnsi" w:hAnsiTheme="majorHAnsi" w:cstheme="majorHAnsi"/>
+          <w:sz w:val="24"/>
+          <w:szCs w:val="24"/>
+          <w:lang w:val="en-NZ"/>
+        </w:rPr>
+      </w:pPr>
+      <w:r>
+        <w:rPr>
+          <w:rFonts w:asciiTheme="majorHAnsi" w:hAnsiTheme="majorHAnsi" w:cstheme="majorHAnsi"/>
+          <w:sz w:val="24"/>
+          <w:szCs w:val="24"/>
+          <w:lang w:val="en-NZ"/>
+        </w:rPr>
+        <w:t>A detailed schedule for the management of the construction, considering aspects like budget, necessary contractors, needed studies and the impact on the local community.</w:t>
+      </w:r>
+    </w:p>
+    <w:p>
+      <w:pPr>
+        <w:pStyle w:val="ListParagraph"/>
+        <w:numPr>
+          <w:ilvl w:val="0"/>
+          <w:numId w:val="8"/>
+        </w:numPr>
+        <w:rPr>
+          <w:rFonts w:asciiTheme="majorHAnsi" w:hAnsiTheme="majorHAnsi" w:cstheme="majorHAnsi"/>
+          <w:sz w:val="24"/>
+          <w:szCs w:val="24"/>
+          <w:lang w:val="en-NZ"/>
+        </w:rPr>
+      </w:pPr>
+      <w:r>
+        <w:rPr>
+          <w:rFonts w:asciiTheme="majorHAnsi" w:hAnsiTheme="majorHAnsi" w:cstheme="majorHAnsi"/>
+          <w:sz w:val="24"/>
+          <w:szCs w:val="24"/>
+          <w:lang w:val="en-NZ"/>
+        </w:rPr>
+        <w:t>A detailed consideration of the local construction requirements, the legal implications of the design and the consideration needed in aspect like the economic and ecological impacts of the proposal, as well as the consideration needed related to the Waitangi treaty.</w:t>
+      </w:r>
+    </w:p>
+    <w:p>
+      <w:pPr>
+        <w:rPr>
+          <w:rFonts w:asciiTheme="majorHAnsi" w:hAnsiTheme="majorHAnsi" w:cstheme="majorHAnsi"/>
+          <w:sz w:val="24"/>
+          <w:szCs w:val="24"/>
+          <w:lang w:val="en-NZ"/>
+        </w:rPr>
+      </w:pPr>
+      <w:r>
+        <w:rPr>
+          <w:rFonts w:asciiTheme="majorHAnsi" w:hAnsiTheme="majorHAnsi" w:cstheme="majorHAnsi"/>
+          <w:sz w:val="24"/>
+          <w:szCs w:val="24"/>
+          <w:lang w:val="en-NZ"/>
+        </w:rPr>
+        <w:t xml:space="preserve">It is important to remark that all of these objectives are evaluated in two fronts, first, the work done by the group, how information flowed across the different roles and how </w:t>
+      </w:r>
+      <w:r>
+        <w:rPr>
+          <w:rFonts w:asciiTheme="majorHAnsi" w:hAnsiTheme="majorHAnsi" w:cstheme="majorHAnsi"/>
+          <w:sz w:val="24"/>
+          <w:szCs w:val="24"/>
+          <w:lang w:val="en-NZ"/>
+        </w:rPr>
+        <w:t xml:space="preserve">work was coordinate to create a coherent proposal. This aspect was mostly assessed through the oral presentation, while </w:t>
+      </w:r>
+      <w:r>
+        <w:rPr>
+          <w:rFonts w:asciiTheme="majorHAnsi" w:hAnsiTheme="majorHAnsi" w:cstheme="majorHAnsi"/>
+          <w:sz w:val="24"/>
+          <w:szCs w:val="24"/>
+          <w:lang w:val="en-NZ"/>
+        </w:rPr>
+        <w:t>t</w:t>
+      </w:r>
+      <w:r>
+        <w:rPr>
+          <w:rFonts w:asciiTheme="majorHAnsi" w:hAnsiTheme="majorHAnsi" w:cstheme="majorHAnsi"/>
+          <w:sz w:val="24"/>
+          <w:szCs w:val="24"/>
+          <w:lang w:val="en-NZ"/>
+        </w:rPr>
+        <w:t>he individual contribution and performance</w:t>
+      </w:r>
+      <w:r>
+        <w:rPr>
+          <w:rFonts w:asciiTheme="majorHAnsi" w:hAnsiTheme="majorHAnsi" w:cstheme="majorHAnsi"/>
+          <w:sz w:val="24"/>
+          <w:szCs w:val="24"/>
+          <w:lang w:val="en-NZ"/>
+        </w:rPr>
+        <w:t>, marked mostly by the accuracy and quality of the tasks completed,</w:t>
+      </w:r>
+      <w:r>
+        <w:rPr>
+          <w:rFonts w:asciiTheme="majorHAnsi" w:hAnsiTheme="majorHAnsi" w:cstheme="majorHAnsi"/>
+          <w:sz w:val="24"/>
+          <w:szCs w:val="24"/>
+          <w:lang w:val="en-NZ"/>
+        </w:rPr>
+        <w:t xml:space="preserve"> was </w:t>
+      </w:r>
+      <w:r>
+        <w:rPr>
+          <w:rFonts w:asciiTheme="majorHAnsi" w:hAnsiTheme="majorHAnsi" w:cstheme="majorHAnsi"/>
+          <w:sz w:val="24"/>
+          <w:szCs w:val="24"/>
+          <w:lang w:val="en-NZ"/>
+        </w:rPr>
+        <w:t>evaluated</w:t>
+      </w:r>
+      <w:r>
+        <w:rPr>
+          <w:rFonts w:asciiTheme="majorHAnsi" w:hAnsiTheme="majorHAnsi" w:cstheme="majorHAnsi"/>
+          <w:sz w:val="24"/>
+          <w:szCs w:val="24"/>
+          <w:lang w:val="en-NZ"/>
+        </w:rPr>
+        <w:t xml:space="preserve"> </w:t>
+      </w:r>
+      <w:r>
+        <w:rPr>
+          <w:rFonts w:asciiTheme="majorHAnsi" w:hAnsiTheme="majorHAnsi" w:cstheme="majorHAnsi"/>
+          <w:sz w:val="24"/>
+          <w:szCs w:val="24"/>
+          <w:lang w:val="en-NZ"/>
+        </w:rPr>
+        <w:t xml:space="preserve">through </w:t>
+      </w:r>
+      <w:r>
+        <w:rPr>
+          <w:rFonts w:asciiTheme="majorHAnsi" w:hAnsiTheme="majorHAnsi" w:cstheme="majorHAnsi"/>
+          <w:sz w:val="24"/>
+          <w:szCs w:val="24"/>
+          <w:lang w:val="en-NZ"/>
+        </w:rPr>
+        <w:t>the individual final client report.</w:t>
+      </w:r>
+    </w:p>
+    <w:p>
+      <w:pPr>
+        <w:rPr>
+          <w:rFonts w:asciiTheme="majorHAnsi" w:hAnsiTheme="majorHAnsi" w:cstheme="majorHAnsi"/>
+          <w:sz w:val="24"/>
+          <w:szCs w:val="24"/>
+          <w:lang w:val="en-NZ"/>
+        </w:rPr>
+      </w:pPr>
+      <w:r>
+        <w:rPr>
+          <w:rFonts w:asciiTheme="majorHAnsi" w:hAnsiTheme="majorHAnsi" w:cstheme="majorHAnsi"/>
+          <w:sz w:val="24"/>
+          <w:szCs w:val="24"/>
+          <w:lang w:val="en-NZ"/>
+        </w:rPr>
+        <w:lastRenderedPageBreak/>
+        <w:t xml:space="preserve">This summarizes the main elements of the learning design proposed for </w:t>
+      </w:r>
+      <w:r>
+        <w:rPr>
+          <w:rFonts w:asciiTheme="majorHAnsi" w:hAnsiTheme="majorHAnsi" w:cstheme="majorHAnsi"/>
+          <w:sz w:val="24"/>
+          <w:szCs w:val="24"/>
+          <w:lang w:val="en-NZ"/>
+        </w:rPr>
+        <w:t>ENBU 79X/89X Industry Project</w:t>
+      </w:r>
+      <w:r>
+        <w:rPr>
+          <w:rFonts w:asciiTheme="majorHAnsi" w:hAnsiTheme="majorHAnsi" w:cstheme="majorHAnsi"/>
+          <w:sz w:val="24"/>
+          <w:szCs w:val="24"/>
+          <w:lang w:val="en-NZ"/>
+        </w:rPr>
+        <w:t xml:space="preserve"> and the methodologies used to implement that design. Some other aspect of the development of the course were present, like the role of the teaching assistances during the open work sessions and the organization between track A and track B students that will be explained in more detail during the development of the case study. For now, there is enough information here to stablish how WorkshopAR was integrated into de learning design of the course and how the goals of the software tool were implemented and coordinated with the activities of the course.</w:t>
+      </w:r>
+    </w:p>
+    <w:p>
+      <w:pPr>
+        <w:pStyle w:val="Heading1"/>
         <w:rPr>
           <w:rFonts w:asciiTheme="majorHAnsi" w:hAnsiTheme="majorHAnsi" w:cstheme="majorHAnsi"/>
           <w:sz w:val="24"/>
@@ -371,7 +1237,14 @@
     </w:p>
     <w:p>
       <w:pPr>
-        <w:pStyle w:val="Ttulo1"/>
+        <w:rPr>
+          <w:lang w:val="en-NZ"/>
+        </w:rPr>
+      </w:pPr>
+    </w:p>
+    <w:p>
+      <w:pPr>
+        <w:pStyle w:val="Heading1"/>
         <w:rPr>
           <w:rFonts w:asciiTheme="majorHAnsi" w:hAnsiTheme="majorHAnsi" w:cstheme="majorHAnsi"/>
           <w:sz w:val="24"/>
@@ -417,12 +1290,24 @@
         <w:rPr>
           <w:lang w:val="en-NZ"/>
         </w:rPr>
-        <w:t>The information gathering process for the development of the case study was conducted in three distinct stages with different set of objectives in mind. All three stages were meant to collect descriptive data about the development of the course,, either to create a better picture of the context in which the course was happening, to gather descriptive data about the progress of the project or to ask for more granular opinions from the students and the teaching staff, all these with the goal in mind of creating a rich recount of the course.</w:t>
-      </w:r>
-    </w:p>
-    <w:p>
-      <w:pPr>
-        <w:pStyle w:val="Ttulo2"/>
+        <w:t xml:space="preserve">The information gathering process for the development of the case study was conducted in three distinct stages with different set of objectives in mind. All three stages were meant to collect descriptive data about the development of the </w:t>
+      </w:r>
+      <w:r>
+        <w:rPr>
+          <w:lang w:val="en-NZ"/>
+        </w:rPr>
+        <w:t>course,</w:t>
+      </w:r>
+      <w:r>
+        <w:rPr>
+          <w:lang w:val="en-NZ"/>
+        </w:rPr>
+        <w:t xml:space="preserve"> either to create a better picture of the context in which the course was happening, to gather descriptive data about the progress of the project or to ask for more granular opinions from the students and the teaching staff, all these with the goal in mind of creating a rich recount of the course.</w:t>
+      </w:r>
+    </w:p>
+    <w:p>
+      <w:pPr>
+        <w:pStyle w:val="Heading2"/>
         <w:rPr>
           <w:rFonts w:asciiTheme="majorHAnsi" w:hAnsiTheme="majorHAnsi" w:cstheme="majorHAnsi"/>
           <w:sz w:val="24"/>
@@ -489,20 +1374,20 @@
         <w:rPr>
           <w:lang w:val="en-NZ"/>
         </w:rPr>
+        <w:t>It was also possible to analyse the weekly report of the students to identify the development process followed by most groups as reported by the students, the general progress of the project and the most common issues reported, allowing for comparisons against what was being directly observed during the work sessions.</w:t>
+      </w:r>
+    </w:p>
+    <w:p>
+      <w:pPr>
+        <w:rPr>
+          <w:lang w:val="en-NZ"/>
+        </w:rPr>
+      </w:pPr>
+      <w:r>
+        <w:rPr>
+          <w:lang w:val="en-NZ"/>
+        </w:rPr>
         <w:lastRenderedPageBreak/>
-        <w:t>It was also possible to analyse the weekly report of the students to identify the development process followed by most groups as reported by the students, the general progress of the project and the most common issues reported, allowing for comparisons against what was being directly observed during the work sessions.</w:t>
-      </w:r>
-    </w:p>
-    <w:p>
-      <w:pPr>
-        <w:rPr>
-          <w:lang w:val="en-NZ"/>
-        </w:rPr>
-      </w:pPr>
-      <w:r>
-        <w:rPr>
-          <w:lang w:val="en-NZ"/>
-        </w:rPr>
         <w:t xml:space="preserve">Finally, the LMS portal also offered a discussion forum for the students meant to be the main communication medium between the students and the teaching staff outside the main “simulacrum” of the flow of information with the client. Activity here was almost non-existent </w:t>
       </w:r>
       <w:r>
@@ -520,7 +1405,7 @@
     </w:p>
     <w:p>
       <w:pPr>
-        <w:pStyle w:val="Ttulo2"/>
+        <w:pStyle w:val="Heading2"/>
         <w:rPr>
           <w:rFonts w:asciiTheme="majorHAnsi" w:hAnsiTheme="majorHAnsi" w:cstheme="majorHAnsi"/>
           <w:sz w:val="24"/>
@@ -624,7 +1509,7 @@
     </w:p>
     <w:p>
       <w:pPr>
-        <w:pStyle w:val="Prrafodelista"/>
+        <w:pStyle w:val="ListParagraph"/>
         <w:numPr>
           <w:ilvl w:val="0"/>
           <w:numId w:val="1"/>
@@ -642,7 +1527,7 @@
     </w:p>
     <w:p>
       <w:pPr>
-        <w:pStyle w:val="Prrafodelista"/>
+        <w:pStyle w:val="ListParagraph"/>
         <w:numPr>
           <w:ilvl w:val="0"/>
           <w:numId w:val="1"/>
@@ -655,54 +1540,417 @@
         <w:rPr>
           <w:lang w:val="en-NZ"/>
         </w:rPr>
+        <w:t>Feedback given to the students about an activity or a material produced for the project.</w:t>
+      </w:r>
+    </w:p>
+    <w:p>
+      <w:pPr>
+        <w:rPr>
+          <w:lang w:val="en-NZ"/>
+        </w:rPr>
+      </w:pPr>
+      <w:r>
+        <w:rPr>
+          <w:lang w:val="en-NZ"/>
+        </w:rPr>
+        <w:t xml:space="preserve">These guidelines stablished that the main focus for the teaching staff during the observations was to identify and characterize the relationship created with the students. It was also used to identify how collaboration was being taught and enforced, and if there were </w:t>
+      </w:r>
+      <w:r>
+        <w:rPr>
+          <w:lang w:val="en-NZ"/>
+        </w:rPr>
         <w:lastRenderedPageBreak/>
-        <w:t>Feedback given to the students about an activity or a material produced for the project.</w:t>
-      </w:r>
-    </w:p>
-    <w:p>
-      <w:pPr>
-        <w:pStyle w:val="Ttulo2"/>
-        <w:rPr>
-          <w:rFonts w:asciiTheme="majorHAnsi" w:hAnsiTheme="majorHAnsi" w:cstheme="majorHAnsi"/>
-          <w:sz w:val="24"/>
-          <w:szCs w:val="24"/>
-          <w:lang w:val="en-NZ"/>
-        </w:rPr>
-      </w:pPr>
-      <w:r>
-        <w:rPr>
-          <w:rFonts w:asciiTheme="majorHAnsi" w:hAnsiTheme="majorHAnsi" w:cstheme="majorHAnsi"/>
-          <w:sz w:val="24"/>
-          <w:szCs w:val="24"/>
+        <w:t>any mediums in place to deal with or guide groups having issues with aspects of the team management requirements of the project.</w:t>
+      </w:r>
+    </w:p>
+    <w:p>
+      <w:pPr>
+        <w:rPr>
+          <w:lang w:val="en-NZ"/>
+        </w:rPr>
+      </w:pPr>
+      <w:r>
+        <w:rPr>
+          <w:lang w:val="en-NZ"/>
+        </w:rPr>
+        <w:t xml:space="preserve">The second type of observations was of the general groupwork performed by the students. These work sessions often involved more than one group at a time and the main focus was on gathering information with minimal intervention, sometimes asking quick questions to clarify as </w:t>
+      </w:r>
+      <w:r>
+        <w:rPr>
+          <w:lang w:val="en-NZ"/>
+        </w:rPr>
+        <w:t>situation or get a better idea of the context.</w:t>
+      </w:r>
+    </w:p>
+    <w:p>
+      <w:pPr>
+        <w:rPr>
+          <w:lang w:val="en-NZ"/>
+        </w:rPr>
+      </w:pPr>
+      <w:r>
+        <w:rPr>
+          <w:lang w:val="en-NZ"/>
+        </w:rPr>
+        <w:t>These observations helped to understand the general dynamics of the groups, and the activities being completed for the project. They also constituted the “baseline” observations for those activities that were not using the AR tool, and became the main point of comparison with the other observations.</w:t>
+      </w:r>
+    </w:p>
+    <w:p>
+      <w:pPr>
+        <w:rPr>
+          <w:lang w:val="en-NZ"/>
+        </w:rPr>
+      </w:pPr>
+      <w:r>
+        <w:rPr>
+          <w:lang w:val="en-NZ"/>
+        </w:rPr>
+        <w:t>Initial categorization here was more varied. In one hand there was a group of themes searching for the collaborative strategies being used by students:</w:t>
+      </w:r>
+    </w:p>
+    <w:p>
+      <w:pPr>
+        <w:pStyle w:val="ListParagraph"/>
+        <w:numPr>
+          <w:ilvl w:val="0"/>
+          <w:numId w:val="2"/>
+        </w:numPr>
+        <w:rPr>
+          <w:lang w:val="en-NZ"/>
+        </w:rPr>
+      </w:pPr>
+      <w:r>
+        <w:rPr>
+          <w:lang w:val="en-NZ"/>
+        </w:rPr>
+        <w:t>Activities and resources to organize and manage the team.</w:t>
+      </w:r>
+    </w:p>
+    <w:p>
+      <w:pPr>
+        <w:pStyle w:val="ListParagraph"/>
+        <w:numPr>
+          <w:ilvl w:val="0"/>
+          <w:numId w:val="2"/>
+        </w:numPr>
+        <w:rPr>
+          <w:lang w:val="en-NZ"/>
+        </w:rPr>
+      </w:pPr>
+      <w:r>
+        <w:rPr>
+          <w:lang w:val="en-NZ"/>
+        </w:rPr>
+        <w:t>Recurrent roles (beside the project’s roles) and relationships being created among the students.</w:t>
+      </w:r>
+    </w:p>
+    <w:p>
+      <w:pPr>
+        <w:pStyle w:val="ListParagraph"/>
+        <w:numPr>
+          <w:ilvl w:val="0"/>
+          <w:numId w:val="2"/>
+        </w:numPr>
+        <w:rPr>
+          <w:lang w:val="en-NZ"/>
+        </w:rPr>
+      </w:pPr>
+      <w:r>
+        <w:rPr>
+          <w:lang w:val="en-NZ"/>
+        </w:rPr>
+        <w:t>Mechanisms to take decisions and resolve conflicts.</w:t>
+      </w:r>
+    </w:p>
+    <w:p>
+      <w:pPr>
+        <w:rPr>
+          <w:lang w:val="en-NZ"/>
+        </w:rPr>
+      </w:pPr>
+      <w:r>
+        <w:rPr>
+          <w:lang w:val="en-NZ"/>
+        </w:rPr>
+        <w:t>A second focus for the general observations was the use of technology and trying to identify tendencies about what activities were mediated or delegated to some digital tool:</w:t>
+      </w:r>
+    </w:p>
+    <w:p>
+      <w:pPr>
+        <w:pStyle w:val="ListParagraph"/>
+        <w:numPr>
+          <w:ilvl w:val="0"/>
+          <w:numId w:val="3"/>
+        </w:numPr>
+        <w:rPr>
+          <w:lang w:val="en-NZ"/>
+        </w:rPr>
+      </w:pPr>
+      <w:r>
+        <w:rPr>
+          <w:lang w:val="en-NZ"/>
+        </w:rPr>
+        <w:t>Technologies used to produce content and fulfil learning objectives.</w:t>
+      </w:r>
+    </w:p>
+    <w:p>
+      <w:pPr>
+        <w:pStyle w:val="ListParagraph"/>
+        <w:numPr>
+          <w:ilvl w:val="0"/>
+          <w:numId w:val="3"/>
+        </w:numPr>
+        <w:rPr>
+          <w:lang w:val="en-NZ"/>
+        </w:rPr>
+      </w:pPr>
+      <w:r>
+        <w:rPr>
+          <w:lang w:val="en-NZ"/>
+        </w:rPr>
+        <w:t>Technologies used to access and consume content to create and/or transmit knowledge.</w:t>
+      </w:r>
+    </w:p>
+    <w:p>
+      <w:pPr>
+        <w:pStyle w:val="ListParagraph"/>
+        <w:numPr>
+          <w:ilvl w:val="0"/>
+          <w:numId w:val="3"/>
+        </w:numPr>
+        <w:rPr>
+          <w:lang w:val="en-NZ"/>
+        </w:rPr>
+      </w:pPr>
+      <w:r>
+        <w:rPr>
+          <w:lang w:val="en-NZ"/>
+        </w:rPr>
+        <w:t>Technologies used to mediate or facilitate communication and social relations.</w:t>
+      </w:r>
+    </w:p>
+    <w:p>
+      <w:pPr>
+        <w:rPr>
+          <w:lang w:val="en-NZ"/>
+        </w:rPr>
+      </w:pPr>
+      <w:r>
+        <w:rPr>
+          <w:lang w:val="en-NZ"/>
+        </w:rPr>
+        <w:t>The third and final type of observations were of the instances in which WorkshopAR was used in the activities of a group and if it was changing in some way previously observed behaviour or promoting new ones:</w:t>
+      </w:r>
+    </w:p>
+    <w:p>
+      <w:pPr>
+        <w:pStyle w:val="ListParagraph"/>
+        <w:numPr>
+          <w:ilvl w:val="0"/>
+          <w:numId w:val="4"/>
+        </w:numPr>
+        <w:rPr>
+          <w:lang w:val="en-NZ"/>
+        </w:rPr>
+      </w:pPr>
+      <w:r>
+        <w:rPr>
+          <w:lang w:val="en-NZ"/>
+        </w:rPr>
+        <w:t>Instances in which a problem was solved using WorkshopAR.</w:t>
+      </w:r>
+    </w:p>
+    <w:p>
+      <w:pPr>
+        <w:pStyle w:val="ListParagraph"/>
+        <w:numPr>
+          <w:ilvl w:val="0"/>
+          <w:numId w:val="4"/>
+        </w:numPr>
+        <w:rPr>
+          <w:lang w:val="en-NZ"/>
+        </w:rPr>
+      </w:pPr>
+      <w:r>
+        <w:rPr>
+          <w:lang w:val="en-NZ"/>
+        </w:rPr>
+        <w:t>Instances in which a problem was created because of the use of WorkshopAR.</w:t>
+      </w:r>
+    </w:p>
+    <w:p>
+      <w:pPr>
+        <w:pStyle w:val="ListParagraph"/>
+        <w:numPr>
+          <w:ilvl w:val="0"/>
+          <w:numId w:val="4"/>
+        </w:numPr>
+        <w:rPr>
+          <w:lang w:val="en-NZ"/>
+        </w:rPr>
+      </w:pPr>
+      <w:r>
+        <w:rPr>
+          <w:lang w:val="en-NZ"/>
+        </w:rPr>
+        <w:t>Behaviours promoted by the use of WorkshopAR.</w:t>
+      </w:r>
+    </w:p>
+    <w:p>
+      <w:pPr>
+        <w:pStyle w:val="ListParagraph"/>
+        <w:numPr>
+          <w:ilvl w:val="0"/>
+          <w:numId w:val="4"/>
+        </w:numPr>
+        <w:rPr>
+          <w:lang w:val="en-NZ"/>
+        </w:rPr>
+      </w:pPr>
+      <w:r>
+        <w:rPr>
+          <w:lang w:val="en-NZ"/>
+        </w:rPr>
+        <w:t>Social activities taking place within the digital space of WorkshopAR.</w:t>
+      </w:r>
+    </w:p>
+    <w:p>
+      <w:pPr>
+        <w:rPr>
+          <w:lang w:val="en-NZ"/>
+        </w:rPr>
+      </w:pPr>
+      <w:r>
+        <w:rPr>
+          <w:lang w:val="en-NZ"/>
+        </w:rPr>
+        <w:t>These observations were more guided, prompted mostly by the researcher, asking the students to explore one or two features from the software, asking for feedback and identifying instances in which the tool was used or mentioned without prompt.</w:t>
+      </w:r>
+    </w:p>
+    <w:p>
+      <w:pPr>
+        <w:pStyle w:val="Heading2"/>
+        <w:rPr>
+          <w:rFonts w:asciiTheme="majorHAnsi" w:hAnsiTheme="majorHAnsi" w:cstheme="majorHAnsi"/>
+          <w:sz w:val="24"/>
+          <w:szCs w:val="24"/>
+          <w:lang w:val="en-NZ"/>
+        </w:rPr>
+      </w:pPr>
+      <w:r>
+        <w:rPr>
+          <w:rFonts w:asciiTheme="majorHAnsi" w:hAnsiTheme="majorHAnsi" w:cstheme="majorHAnsi"/>
+          <w:sz w:val="24"/>
+          <w:szCs w:val="24"/>
+          <w:lang w:val="en-NZ"/>
+        </w:rPr>
+        <w:t>6.3.3 Unstructured Interviews</w:t>
+      </w:r>
+    </w:p>
+    <w:p>
+      <w:pPr>
+        <w:rPr>
+          <w:lang w:val="en-NZ"/>
+        </w:rPr>
+      </w:pPr>
+      <w:r>
+        <w:rPr>
+          <w:lang w:val="en-NZ"/>
+        </w:rPr>
+        <w:t xml:space="preserve">The final dataset comes from unstructured interviews performed to a sample of the students and of the teaching staff. Both interviews focused on gathering information about how participants saw collaboration as part of the development of the course. How do the feel about their own collaboration skills and how the course was helping them to develop or improve those </w:t>
+      </w:r>
+      <w:proofErr w:type="gramStart"/>
+      <w:r>
+        <w:rPr>
+          <w:lang w:val="en-NZ"/>
+        </w:rPr>
+        <w:t>skills.</w:t>
+      </w:r>
+      <w:proofErr w:type="gramEnd"/>
+      <w:r>
+        <w:rPr>
+          <w:lang w:val="en-NZ"/>
+        </w:rPr>
+        <w:t xml:space="preserve"> Annex 2 of this document shows the script used for each interview.</w:t>
+      </w:r>
+    </w:p>
+    <w:p>
+      <w:pPr>
+        <w:rPr>
+          <w:lang w:val="en-NZ"/>
+        </w:rPr>
+      </w:pPr>
+      <w:r>
+        <w:rPr>
           <w:lang w:val="en-NZ"/>
         </w:rPr>
         <w:lastRenderedPageBreak/>
-        <w:t>6.3.3 Unstructured Interviews</w:t>
-      </w:r>
-    </w:p>
-    <w:p>
-      <w:pPr>
-        <w:pStyle w:val="Ttulo1"/>
-        <w:rPr>
-          <w:rFonts w:asciiTheme="majorHAnsi" w:hAnsiTheme="majorHAnsi" w:cstheme="majorHAnsi"/>
-          <w:sz w:val="24"/>
-          <w:szCs w:val="24"/>
-          <w:lang w:val="en-NZ"/>
-        </w:rPr>
-      </w:pPr>
-      <w:r>
-        <w:rPr>
-          <w:rFonts w:asciiTheme="majorHAnsi" w:hAnsiTheme="majorHAnsi" w:cstheme="majorHAnsi"/>
-          <w:sz w:val="24"/>
-          <w:szCs w:val="24"/>
-          <w:lang w:val="en-NZ"/>
-        </w:rPr>
+        <w:t>The interviews for the teaching staff were one-to-one conversations about what they perceived as effective collaboration and how did they evidence, if at all, those ideas in the work done by different groups in the course.</w:t>
+      </w:r>
+    </w:p>
+    <w:p>
+      <w:pPr>
+        <w:rPr>
+          <w:lang w:val="en-NZ"/>
+        </w:rPr>
+      </w:pPr>
+      <w:r>
+        <w:rPr>
+          <w:lang w:val="en-NZ"/>
+        </w:rPr>
+        <w:t>During these interviews it was also possible to gather information about the development of this cohort of the course, the challenges and complexities in managing the course and more personal opinions on the quality of the student’s work and what could be done to improve the course in general.</w:t>
+      </w:r>
+    </w:p>
+    <w:p>
+      <w:pPr>
+        <w:rPr>
+          <w:lang w:val="en-NZ"/>
+        </w:rPr>
+      </w:pPr>
+      <w:r>
+        <w:rPr>
+          <w:lang w:val="en-NZ"/>
+        </w:rPr>
+        <w:t>The interviews with students focused more on trying to reconstruct the team dynamics of those groups that was not possible to directly observe, asking questions about the different activities done to fulfil the requirements of the course, rules or decisions taken to manage the group and how effective did the students found those elements.</w:t>
+      </w:r>
+    </w:p>
+    <w:p>
+      <w:pPr>
+        <w:rPr>
+          <w:lang w:val="en-NZ"/>
+        </w:rPr>
+      </w:pPr>
+      <w:r>
+        <w:rPr>
+          <w:lang w:val="en-NZ"/>
+        </w:rPr>
+        <w:t>The documentation of all three types of observations, plus the analysis, categorization and organization of the information found and registered help to create the recount and analysis that will be shown in the following sections.</w:t>
+      </w:r>
+    </w:p>
+    <w:p>
+      <w:pPr>
+        <w:pStyle w:val="Heading1"/>
+        <w:rPr>
+          <w:rFonts w:asciiTheme="majorHAnsi" w:hAnsiTheme="majorHAnsi" w:cstheme="majorHAnsi"/>
+          <w:sz w:val="24"/>
+          <w:szCs w:val="24"/>
+          <w:lang w:val="en-NZ"/>
+        </w:rPr>
+      </w:pPr>
+      <w:r>
+        <w:rPr>
+          <w:rFonts w:asciiTheme="majorHAnsi" w:hAnsiTheme="majorHAnsi" w:cstheme="majorHAnsi"/>
+          <w:sz w:val="24"/>
+          <w:szCs w:val="24"/>
+          <w:lang w:val="en-NZ"/>
+        </w:rPr>
+        <w:lastRenderedPageBreak/>
         <w:t>6.4 Weeks 1 to 4: First Contact and Team Establishment</w:t>
       </w:r>
     </w:p>
     <w:p>
       <w:pPr>
-        <w:pStyle w:val="Ttulo2"/>
+        <w:pStyle w:val="Heading2"/>
         <w:rPr>
           <w:rFonts w:asciiTheme="majorHAnsi" w:hAnsiTheme="majorHAnsi" w:cstheme="majorHAnsi"/>
           <w:sz w:val="24"/>
@@ -722,7 +1970,7 @@
     </w:p>
     <w:p>
       <w:pPr>
-        <w:pStyle w:val="Ttulo2"/>
+        <w:pStyle w:val="Heading2"/>
         <w:rPr>
           <w:rFonts w:asciiTheme="majorHAnsi" w:hAnsiTheme="majorHAnsi" w:cstheme="majorHAnsi"/>
           <w:sz w:val="24"/>
@@ -742,7 +1990,7 @@
     </w:p>
     <w:p>
       <w:pPr>
-        <w:pStyle w:val="Ttulo2"/>
+        <w:pStyle w:val="Heading2"/>
         <w:rPr>
           <w:rFonts w:asciiTheme="majorHAnsi" w:hAnsiTheme="majorHAnsi" w:cstheme="majorHAnsi"/>
           <w:sz w:val="24"/>
@@ -762,7 +2010,7 @@
     </w:p>
     <w:p>
       <w:pPr>
-        <w:pStyle w:val="Ttulo1"/>
+        <w:pStyle w:val="Heading1"/>
         <w:rPr>
           <w:rFonts w:asciiTheme="majorHAnsi" w:hAnsiTheme="majorHAnsi" w:cstheme="majorHAnsi"/>
           <w:sz w:val="24"/>
@@ -782,7 +2030,7 @@
     </w:p>
     <w:p>
       <w:pPr>
-        <w:pStyle w:val="Ttulo2"/>
+        <w:pStyle w:val="Heading2"/>
         <w:rPr>
           <w:rFonts w:asciiTheme="majorHAnsi" w:hAnsiTheme="majorHAnsi" w:cstheme="majorHAnsi"/>
           <w:sz w:val="24"/>
@@ -802,7 +2050,7 @@
     </w:p>
     <w:p>
       <w:pPr>
-        <w:pStyle w:val="Ttulo2"/>
+        <w:pStyle w:val="Heading2"/>
         <w:rPr>
           <w:rFonts w:asciiTheme="majorHAnsi" w:hAnsiTheme="majorHAnsi" w:cstheme="majorHAnsi"/>
           <w:sz w:val="24"/>
@@ -822,7 +2070,7 @@
     </w:p>
     <w:p>
       <w:pPr>
-        <w:pStyle w:val="Ttulo2"/>
+        <w:pStyle w:val="Heading2"/>
         <w:rPr>
           <w:rFonts w:asciiTheme="majorHAnsi" w:hAnsiTheme="majorHAnsi" w:cstheme="majorHAnsi"/>
           <w:sz w:val="24"/>
@@ -842,7 +2090,7 @@
     </w:p>
     <w:p>
       <w:pPr>
-        <w:pStyle w:val="Ttulo1"/>
+        <w:pStyle w:val="Heading1"/>
         <w:rPr>
           <w:rFonts w:asciiTheme="majorHAnsi" w:hAnsiTheme="majorHAnsi" w:cstheme="majorHAnsi"/>
           <w:sz w:val="24"/>
@@ -862,7 +2110,7 @@
     </w:p>
     <w:p>
       <w:pPr>
-        <w:pStyle w:val="Ttulo2"/>
+        <w:pStyle w:val="Heading2"/>
         <w:rPr>
           <w:rFonts w:asciiTheme="majorHAnsi" w:hAnsiTheme="majorHAnsi" w:cstheme="majorHAnsi"/>
           <w:sz w:val="24"/>
@@ -882,7 +2130,7 @@
     </w:p>
     <w:p>
       <w:pPr>
-        <w:pStyle w:val="Ttulo2"/>
+        <w:pStyle w:val="Heading2"/>
         <w:rPr>
           <w:rFonts w:asciiTheme="majorHAnsi" w:hAnsiTheme="majorHAnsi" w:cstheme="majorHAnsi"/>
           <w:sz w:val="24"/>
@@ -902,7 +2150,7 @@
     </w:p>
     <w:p>
       <w:pPr>
-        <w:pStyle w:val="Ttulo2"/>
+        <w:pStyle w:val="Heading2"/>
         <w:rPr>
           <w:rFonts w:asciiTheme="majorHAnsi" w:hAnsiTheme="majorHAnsi" w:cstheme="majorHAnsi"/>
           <w:sz w:val="24"/>
@@ -922,7 +2170,7 @@
     </w:p>
     <w:p>
       <w:pPr>
-        <w:pStyle w:val="Ttulo1"/>
+        <w:pStyle w:val="Heading1"/>
         <w:rPr>
           <w:rFonts w:asciiTheme="majorHAnsi" w:hAnsiTheme="majorHAnsi" w:cstheme="majorHAnsi"/>
           <w:sz w:val="24"/>
@@ -942,7 +2190,7 @@
     </w:p>
     <w:p>
       <w:pPr>
-        <w:pStyle w:val="Ttulo1"/>
+        <w:pStyle w:val="Heading1"/>
         <w:rPr>
           <w:rFonts w:asciiTheme="majorHAnsi" w:hAnsiTheme="majorHAnsi" w:cstheme="majorHAnsi"/>
           <w:sz w:val="24"/>
@@ -962,7 +2210,7 @@
     </w:p>
     <w:p>
       <w:pPr>
-        <w:pStyle w:val="Ttulo2"/>
+        <w:pStyle w:val="Heading2"/>
         <w:rPr>
           <w:rFonts w:asciiTheme="majorHAnsi" w:hAnsiTheme="majorHAnsi" w:cstheme="majorHAnsi"/>
           <w:sz w:val="24"/>
@@ -1000,7 +2248,7 @@
     </w:p>
     <w:p>
       <w:pPr>
-        <w:pStyle w:val="Ttulo2"/>
+        <w:pStyle w:val="Heading2"/>
         <w:rPr>
           <w:rFonts w:asciiTheme="majorHAnsi" w:hAnsiTheme="majorHAnsi" w:cstheme="majorHAnsi"/>
           <w:sz w:val="24"/>
@@ -1038,7 +2286,7 @@
     </w:p>
     <w:p>
       <w:pPr>
-        <w:pStyle w:val="Ttulo2"/>
+        <w:pStyle w:val="Heading2"/>
         <w:rPr>
           <w:rFonts w:asciiTheme="majorHAnsi" w:hAnsiTheme="majorHAnsi" w:cstheme="majorHAnsi"/>
           <w:sz w:val="24"/>
@@ -1076,7 +2324,7 @@
     </w:p>
     <w:p>
       <w:pPr>
-        <w:pStyle w:val="Ttulo1"/>
+        <w:pStyle w:val="Heading1"/>
         <w:rPr>
           <w:rFonts w:asciiTheme="majorHAnsi" w:hAnsiTheme="majorHAnsi" w:cstheme="majorHAnsi"/>
           <w:sz w:val="24"/>
@@ -1096,7 +2344,7 @@
     </w:p>
     <w:p>
       <w:pPr>
-        <w:pStyle w:val="Ttulo1"/>
+        <w:pStyle w:val="Heading1"/>
         <w:rPr>
           <w:rFonts w:asciiTheme="majorHAnsi" w:hAnsiTheme="majorHAnsi" w:cstheme="majorHAnsi"/>
           <w:sz w:val="24"/>
@@ -1116,22 +2364,21 @@
     </w:p>
     <w:p>
       <w:pPr>
-        <w:pStyle w:val="Ttulo1"/>
-        <w:rPr>
-          <w:rFonts w:asciiTheme="majorHAnsi" w:hAnsiTheme="majorHAnsi" w:cstheme="majorHAnsi"/>
-          <w:sz w:val="24"/>
-          <w:szCs w:val="24"/>
-          <w:lang w:val="en-NZ"/>
-        </w:rPr>
-      </w:pPr>
-      <w:r>
-        <w:rPr>
-          <w:rFonts w:asciiTheme="majorHAnsi" w:hAnsiTheme="majorHAnsi" w:cstheme="majorHAnsi"/>
-          <w:sz w:val="24"/>
-          <w:szCs w:val="24"/>
-          <w:lang w:val="en-NZ"/>
-        </w:rPr>
-        <w:lastRenderedPageBreak/>
+        <w:pStyle w:val="Heading1"/>
+        <w:rPr>
+          <w:rFonts w:asciiTheme="majorHAnsi" w:hAnsiTheme="majorHAnsi" w:cstheme="majorHAnsi"/>
+          <w:sz w:val="24"/>
+          <w:szCs w:val="24"/>
+          <w:lang w:val="en-NZ"/>
+        </w:rPr>
+      </w:pPr>
+      <w:r>
+        <w:rPr>
+          <w:rFonts w:asciiTheme="majorHAnsi" w:hAnsiTheme="majorHAnsi" w:cstheme="majorHAnsi"/>
+          <w:sz w:val="24"/>
+          <w:szCs w:val="24"/>
+          <w:lang w:val="en-NZ"/>
+        </w:rPr>
         <w:t xml:space="preserve">6.11 Conclusions </w:t>
       </w:r>
     </w:p>
@@ -1176,8 +2423,347 @@
 </file>
 
 <file path=word/numbering.xml><?xml version="1.0" encoding="utf-8"?>
-<w:numbering xmlns:wpc="http://schemas.microsoft.com/office/word/2010/wordprocessingCanvas" xmlns:cx="http://schemas.microsoft.com/office/drawing/2014/chartex" xmlns:cx1="http://schemas.microsoft.com/office/drawing/2015/9/8/chartex" xmlns:cx2="http://schemas.microsoft.com/office/drawing/2015/10/21/chartex" xmlns:cx3="http://schemas.microsoft.com/office/drawing/2016/5/9/chartex" xmlns:cx4="http://schemas.microsoft.com/office/drawing/2016/5/10/chartex" xmlns:cx5="http://schemas.microsoft.com/office/drawing/2016/5/11/chartex" xmlns:cx6="http://schemas.microsoft.com/office/drawing/2016/5/12/chartex" xmlns:cx7="http://schemas.microsoft.com/office/drawing/2016/5/13/chartex" xmlns:cx8="http://schemas.microsoft.com/office/drawing/2016/5/14/chartex" xmlns:mc="http://schemas.openxmlformats.org/markup-compatibility/2006" xmlns:aink="http://schemas.microsoft.com/office/drawing/2016/ink" xmlns:am3d="http://schemas.microsoft.com/office/drawing/2017/model3d" xmlns:o="urn:schemas-microsoft-com:office:office" xmlns:oel="http://schemas.microsoft.com/office/2019/extlst" xmlns:r="http://schemas.openxmlformats.org/officeDocument/2006/relationships" xmlns:m="http://schemas.openxmlformats.org/officeDocument/2006/math" xmlns:v="urn:schemas-microsoft-com:vml" xmlns:wp14="http://schemas.microsoft.com/office/word/2010/wordprocessingDrawing" xmlns:wp="http://schemas.openxmlformats.org/drawingml/2006/wordprocessingDrawing" xmlns:w10="urn:schemas-microsoft-com:office:word" xmlns:w="http://schemas.openxmlformats.org/wordprocessingml/2006/main" xmlns:w14="http://schemas.microsoft.com/office/word/2010/wordml" xmlns:w15="http://schemas.microsoft.com/office/word/2012/wordml" xmlns:w16cex="http://schemas.microsoft.com/office/word/2018/wordml/cex" xmlns:w16cid="http://schemas.microsoft.com/office/word/2016/wordml/cid" xmlns:w16="http://schemas.microsoft.com/office/word/2018/wordml" xmlns:w16du="http://schemas.microsoft.com/office/word/2023/wordml/word16du" xmlns:w16sdtdh="http://schemas.microsoft.com/office/word/2020/wordml/sdtdatahash" xmlns:w16sdtfl="http://schemas.microsoft.com/office/word/2024/wordml/sdtformatlock" xmlns:w16se="http://schemas.microsoft.com/office/word/2015/wordml/symex" xmlns:wpg="http://schemas.microsoft.com/office/word/2010/wordprocessingGroup" xmlns:wpi="http://schemas.microsoft.com/office/word/2010/wordprocessingInk" xmlns:wne="http://schemas.microsoft.com/office/word/2006/wordml" xmlns:wps="http://schemas.microsoft.com/office/word/2010/wordprocessingShape" mc:Ignorable="w14 w15 w16se w16cid w16 w16cex w16sdtdh w16sdtfl w16du wp14">
+<w:numbering xmlns:wpc="http://schemas.microsoft.com/office/word/2010/wordprocessingCanvas" xmlns:cx="http://schemas.microsoft.com/office/drawing/2014/chartex" xmlns:cx1="http://schemas.microsoft.com/office/drawing/2015/9/8/chartex" xmlns:cx2="http://schemas.microsoft.com/office/drawing/2015/10/21/chartex" xmlns:cx3="http://schemas.microsoft.com/office/drawing/2016/5/9/chartex" xmlns:cx4="http://schemas.microsoft.com/office/drawing/2016/5/10/chartex" xmlns:cx5="http://schemas.microsoft.com/office/drawing/2016/5/11/chartex" xmlns:cx6="http://schemas.microsoft.com/office/drawing/2016/5/12/chartex" xmlns:cx7="http://schemas.microsoft.com/office/drawing/2016/5/13/chartex" xmlns:cx8="http://schemas.microsoft.com/office/drawing/2016/5/14/chartex" xmlns:mc="http://schemas.openxmlformats.org/markup-compatibility/2006" xmlns:aink="http://schemas.microsoft.com/office/drawing/2016/ink" xmlns:am3d="http://schemas.microsoft.com/office/drawing/2017/model3d" xmlns:o="urn:schemas-microsoft-com:office:office" xmlns:r="http://schemas.openxmlformats.org/officeDocument/2006/relationships" xmlns:m="http://schemas.openxmlformats.org/officeDocument/2006/math" xmlns:v="urn:schemas-microsoft-com:vml" xmlns:wp14="http://schemas.microsoft.com/office/word/2010/wordprocessingDrawing" xmlns:wp="http://schemas.openxmlformats.org/drawingml/2006/wordprocessingDrawing" xmlns:w10="urn:schemas-microsoft-com:office:word" xmlns:w="http://schemas.openxmlformats.org/wordprocessingml/2006/main" xmlns:w14="http://schemas.microsoft.com/office/word/2010/wordml" xmlns:w15="http://schemas.microsoft.com/office/word/2012/wordml" xmlns:w16cex="http://schemas.microsoft.com/office/word/2018/wordml/cex" xmlns:w16cid="http://schemas.microsoft.com/office/word/2016/wordml/cid" xmlns:w16="http://schemas.microsoft.com/office/word/2018/wordml" xmlns:w16sdtdh="http://schemas.microsoft.com/office/word/2020/wordml/sdtdatahash" xmlns:w16se="http://schemas.microsoft.com/office/word/2015/wordml/symex" xmlns:wpg="http://schemas.microsoft.com/office/word/2010/wordprocessingGroup" xmlns:wpi="http://schemas.microsoft.com/office/word/2010/wordprocessingInk" xmlns:wne="http://schemas.microsoft.com/office/word/2006/wordml" xmlns:wps="http://schemas.microsoft.com/office/word/2010/wordprocessingShape" mc:Ignorable="w14 w15 w16se w16cid w16 w16cex w16sdtdh wp14">
   <w:abstractNum w:abstractNumId="0" w15:restartNumberingAfterBreak="0">
+    <w:nsid w:val="164346F4"/>
+    <w:multiLevelType w:val="hybridMultilevel"/>
+    <w:tmpl w:val="6E0C3D10"/>
+    <w:lvl w:ilvl="0" w:tplc="240A0001">
+      <w:start w:val="1"/>
+      <w:numFmt w:val="bullet"/>
+      <w:lvlText w:val=""/>
+      <w:lvlJc w:val="left"/>
+      <w:pPr>
+        <w:ind w:left="720" w:hanging="360"/>
+      </w:pPr>
+      <w:rPr>
+        <w:rFonts w:ascii="Symbol" w:hAnsi="Symbol" w:hint="default"/>
+      </w:rPr>
+    </w:lvl>
+    <w:lvl w:ilvl="1" w:tplc="240A0003" w:tentative="1">
+      <w:start w:val="1"/>
+      <w:numFmt w:val="bullet"/>
+      <w:lvlText w:val="o"/>
+      <w:lvlJc w:val="left"/>
+      <w:pPr>
+        <w:ind w:left="1440" w:hanging="360"/>
+      </w:pPr>
+      <w:rPr>
+        <w:rFonts w:ascii="Courier New" w:hAnsi="Courier New" w:cs="Courier New" w:hint="default"/>
+      </w:rPr>
+    </w:lvl>
+    <w:lvl w:ilvl="2" w:tplc="240A0005" w:tentative="1">
+      <w:start w:val="1"/>
+      <w:numFmt w:val="bullet"/>
+      <w:lvlText w:val=""/>
+      <w:lvlJc w:val="left"/>
+      <w:pPr>
+        <w:ind w:left="2160" w:hanging="360"/>
+      </w:pPr>
+      <w:rPr>
+        <w:rFonts w:ascii="Wingdings" w:hAnsi="Wingdings" w:hint="default"/>
+      </w:rPr>
+    </w:lvl>
+    <w:lvl w:ilvl="3" w:tplc="240A0001" w:tentative="1">
+      <w:start w:val="1"/>
+      <w:numFmt w:val="bullet"/>
+      <w:lvlText w:val=""/>
+      <w:lvlJc w:val="left"/>
+      <w:pPr>
+        <w:ind w:left="2880" w:hanging="360"/>
+      </w:pPr>
+      <w:rPr>
+        <w:rFonts w:ascii="Symbol" w:hAnsi="Symbol" w:hint="default"/>
+      </w:rPr>
+    </w:lvl>
+    <w:lvl w:ilvl="4" w:tplc="240A0003" w:tentative="1">
+      <w:start w:val="1"/>
+      <w:numFmt w:val="bullet"/>
+      <w:lvlText w:val="o"/>
+      <w:lvlJc w:val="left"/>
+      <w:pPr>
+        <w:ind w:left="3600" w:hanging="360"/>
+      </w:pPr>
+      <w:rPr>
+        <w:rFonts w:ascii="Courier New" w:hAnsi="Courier New" w:cs="Courier New" w:hint="default"/>
+      </w:rPr>
+    </w:lvl>
+    <w:lvl w:ilvl="5" w:tplc="240A0005" w:tentative="1">
+      <w:start w:val="1"/>
+      <w:numFmt w:val="bullet"/>
+      <w:lvlText w:val=""/>
+      <w:lvlJc w:val="left"/>
+      <w:pPr>
+        <w:ind w:left="4320" w:hanging="360"/>
+      </w:pPr>
+      <w:rPr>
+        <w:rFonts w:ascii="Wingdings" w:hAnsi="Wingdings" w:hint="default"/>
+      </w:rPr>
+    </w:lvl>
+    <w:lvl w:ilvl="6" w:tplc="240A0001" w:tentative="1">
+      <w:start w:val="1"/>
+      <w:numFmt w:val="bullet"/>
+      <w:lvlText w:val=""/>
+      <w:lvlJc w:val="left"/>
+      <w:pPr>
+        <w:ind w:left="5040" w:hanging="360"/>
+      </w:pPr>
+      <w:rPr>
+        <w:rFonts w:ascii="Symbol" w:hAnsi="Symbol" w:hint="default"/>
+      </w:rPr>
+    </w:lvl>
+    <w:lvl w:ilvl="7" w:tplc="240A0003" w:tentative="1">
+      <w:start w:val="1"/>
+      <w:numFmt w:val="bullet"/>
+      <w:lvlText w:val="o"/>
+      <w:lvlJc w:val="left"/>
+      <w:pPr>
+        <w:ind w:left="5760" w:hanging="360"/>
+      </w:pPr>
+      <w:rPr>
+        <w:rFonts w:ascii="Courier New" w:hAnsi="Courier New" w:cs="Courier New" w:hint="default"/>
+      </w:rPr>
+    </w:lvl>
+    <w:lvl w:ilvl="8" w:tplc="240A0005" w:tentative="1">
+      <w:start w:val="1"/>
+      <w:numFmt w:val="bullet"/>
+      <w:lvlText w:val=""/>
+      <w:lvlJc w:val="left"/>
+      <w:pPr>
+        <w:ind w:left="6480" w:hanging="360"/>
+      </w:pPr>
+      <w:rPr>
+        <w:rFonts w:ascii="Wingdings" w:hAnsi="Wingdings" w:hint="default"/>
+      </w:rPr>
+    </w:lvl>
+  </w:abstractNum>
+  <w:abstractNum w:abstractNumId="1" w15:restartNumberingAfterBreak="0">
+    <w:nsid w:val="36720225"/>
+    <w:multiLevelType w:val="hybridMultilevel"/>
+    <w:tmpl w:val="E5CEAEC4"/>
+    <w:lvl w:ilvl="0" w:tplc="14090001">
+      <w:start w:val="1"/>
+      <w:numFmt w:val="bullet"/>
+      <w:lvlText w:val=""/>
+      <w:lvlJc w:val="left"/>
+      <w:pPr>
+        <w:ind w:left="720" w:hanging="360"/>
+      </w:pPr>
+      <w:rPr>
+        <w:rFonts w:ascii="Symbol" w:hAnsi="Symbol" w:hint="default"/>
+      </w:rPr>
+    </w:lvl>
+    <w:lvl w:ilvl="1" w:tplc="14090003" w:tentative="1">
+      <w:start w:val="1"/>
+      <w:numFmt w:val="bullet"/>
+      <w:lvlText w:val="o"/>
+      <w:lvlJc w:val="left"/>
+      <w:pPr>
+        <w:ind w:left="1440" w:hanging="360"/>
+      </w:pPr>
+      <w:rPr>
+        <w:rFonts w:ascii="Courier New" w:hAnsi="Courier New" w:cs="Courier New" w:hint="default"/>
+      </w:rPr>
+    </w:lvl>
+    <w:lvl w:ilvl="2" w:tplc="14090005" w:tentative="1">
+      <w:start w:val="1"/>
+      <w:numFmt w:val="bullet"/>
+      <w:lvlText w:val=""/>
+      <w:lvlJc w:val="left"/>
+      <w:pPr>
+        <w:ind w:left="2160" w:hanging="360"/>
+      </w:pPr>
+      <w:rPr>
+        <w:rFonts w:ascii="Wingdings" w:hAnsi="Wingdings" w:hint="default"/>
+      </w:rPr>
+    </w:lvl>
+    <w:lvl w:ilvl="3" w:tplc="14090001" w:tentative="1">
+      <w:start w:val="1"/>
+      <w:numFmt w:val="bullet"/>
+      <w:lvlText w:val=""/>
+      <w:lvlJc w:val="left"/>
+      <w:pPr>
+        <w:ind w:left="2880" w:hanging="360"/>
+      </w:pPr>
+      <w:rPr>
+        <w:rFonts w:ascii="Symbol" w:hAnsi="Symbol" w:hint="default"/>
+      </w:rPr>
+    </w:lvl>
+    <w:lvl w:ilvl="4" w:tplc="14090003" w:tentative="1">
+      <w:start w:val="1"/>
+      <w:numFmt w:val="bullet"/>
+      <w:lvlText w:val="o"/>
+      <w:lvlJc w:val="left"/>
+      <w:pPr>
+        <w:ind w:left="3600" w:hanging="360"/>
+      </w:pPr>
+      <w:rPr>
+        <w:rFonts w:ascii="Courier New" w:hAnsi="Courier New" w:cs="Courier New" w:hint="default"/>
+      </w:rPr>
+    </w:lvl>
+    <w:lvl w:ilvl="5" w:tplc="14090005" w:tentative="1">
+      <w:start w:val="1"/>
+      <w:numFmt w:val="bullet"/>
+      <w:lvlText w:val=""/>
+      <w:lvlJc w:val="left"/>
+      <w:pPr>
+        <w:ind w:left="4320" w:hanging="360"/>
+      </w:pPr>
+      <w:rPr>
+        <w:rFonts w:ascii="Wingdings" w:hAnsi="Wingdings" w:hint="default"/>
+      </w:rPr>
+    </w:lvl>
+    <w:lvl w:ilvl="6" w:tplc="14090001" w:tentative="1">
+      <w:start w:val="1"/>
+      <w:numFmt w:val="bullet"/>
+      <w:lvlText w:val=""/>
+      <w:lvlJc w:val="left"/>
+      <w:pPr>
+        <w:ind w:left="5040" w:hanging="360"/>
+      </w:pPr>
+      <w:rPr>
+        <w:rFonts w:ascii="Symbol" w:hAnsi="Symbol" w:hint="default"/>
+      </w:rPr>
+    </w:lvl>
+    <w:lvl w:ilvl="7" w:tplc="14090003" w:tentative="1">
+      <w:start w:val="1"/>
+      <w:numFmt w:val="bullet"/>
+      <w:lvlText w:val="o"/>
+      <w:lvlJc w:val="left"/>
+      <w:pPr>
+        <w:ind w:left="5760" w:hanging="360"/>
+      </w:pPr>
+      <w:rPr>
+        <w:rFonts w:ascii="Courier New" w:hAnsi="Courier New" w:cs="Courier New" w:hint="default"/>
+      </w:rPr>
+    </w:lvl>
+    <w:lvl w:ilvl="8" w:tplc="14090005" w:tentative="1">
+      <w:start w:val="1"/>
+      <w:numFmt w:val="bullet"/>
+      <w:lvlText w:val=""/>
+      <w:lvlJc w:val="left"/>
+      <w:pPr>
+        <w:ind w:left="6480" w:hanging="360"/>
+      </w:pPr>
+      <w:rPr>
+        <w:rFonts w:ascii="Wingdings" w:hAnsi="Wingdings" w:hint="default"/>
+      </w:rPr>
+    </w:lvl>
+  </w:abstractNum>
+  <w:abstractNum w:abstractNumId="2" w15:restartNumberingAfterBreak="0">
+    <w:nsid w:val="513B7EA1"/>
+    <w:multiLevelType w:val="hybridMultilevel"/>
+    <w:tmpl w:val="6B5C4A68"/>
+    <w:lvl w:ilvl="0" w:tplc="14090001">
+      <w:start w:val="1"/>
+      <w:numFmt w:val="bullet"/>
+      <w:lvlText w:val=""/>
+      <w:lvlJc w:val="left"/>
+      <w:pPr>
+        <w:ind w:left="720" w:hanging="360"/>
+      </w:pPr>
+      <w:rPr>
+        <w:rFonts w:ascii="Symbol" w:hAnsi="Symbol" w:hint="default"/>
+      </w:rPr>
+    </w:lvl>
+    <w:lvl w:ilvl="1" w:tplc="14090003" w:tentative="1">
+      <w:start w:val="1"/>
+      <w:numFmt w:val="bullet"/>
+      <w:lvlText w:val="o"/>
+      <w:lvlJc w:val="left"/>
+      <w:pPr>
+        <w:ind w:left="1440" w:hanging="360"/>
+      </w:pPr>
+      <w:rPr>
+        <w:rFonts w:ascii="Courier New" w:hAnsi="Courier New" w:cs="Courier New" w:hint="default"/>
+      </w:rPr>
+    </w:lvl>
+    <w:lvl w:ilvl="2" w:tplc="14090005" w:tentative="1">
+      <w:start w:val="1"/>
+      <w:numFmt w:val="bullet"/>
+      <w:lvlText w:val=""/>
+      <w:lvlJc w:val="left"/>
+      <w:pPr>
+        <w:ind w:left="2160" w:hanging="360"/>
+      </w:pPr>
+      <w:rPr>
+        <w:rFonts w:ascii="Wingdings" w:hAnsi="Wingdings" w:hint="default"/>
+      </w:rPr>
+    </w:lvl>
+    <w:lvl w:ilvl="3" w:tplc="14090001" w:tentative="1">
+      <w:start w:val="1"/>
+      <w:numFmt w:val="bullet"/>
+      <w:lvlText w:val=""/>
+      <w:lvlJc w:val="left"/>
+      <w:pPr>
+        <w:ind w:left="2880" w:hanging="360"/>
+      </w:pPr>
+      <w:rPr>
+        <w:rFonts w:ascii="Symbol" w:hAnsi="Symbol" w:hint="default"/>
+      </w:rPr>
+    </w:lvl>
+    <w:lvl w:ilvl="4" w:tplc="14090003" w:tentative="1">
+      <w:start w:val="1"/>
+      <w:numFmt w:val="bullet"/>
+      <w:lvlText w:val="o"/>
+      <w:lvlJc w:val="left"/>
+      <w:pPr>
+        <w:ind w:left="3600" w:hanging="360"/>
+      </w:pPr>
+      <w:rPr>
+        <w:rFonts w:ascii="Courier New" w:hAnsi="Courier New" w:cs="Courier New" w:hint="default"/>
+      </w:rPr>
+    </w:lvl>
+    <w:lvl w:ilvl="5" w:tplc="14090005" w:tentative="1">
+      <w:start w:val="1"/>
+      <w:numFmt w:val="bullet"/>
+      <w:lvlText w:val=""/>
+      <w:lvlJc w:val="left"/>
+      <w:pPr>
+        <w:ind w:left="4320" w:hanging="360"/>
+      </w:pPr>
+      <w:rPr>
+        <w:rFonts w:ascii="Wingdings" w:hAnsi="Wingdings" w:hint="default"/>
+      </w:rPr>
+    </w:lvl>
+    <w:lvl w:ilvl="6" w:tplc="14090001" w:tentative="1">
+      <w:start w:val="1"/>
+      <w:numFmt w:val="bullet"/>
+      <w:lvlText w:val=""/>
+      <w:lvlJc w:val="left"/>
+      <w:pPr>
+        <w:ind w:left="5040" w:hanging="360"/>
+      </w:pPr>
+      <w:rPr>
+        <w:rFonts w:ascii="Symbol" w:hAnsi="Symbol" w:hint="default"/>
+      </w:rPr>
+    </w:lvl>
+    <w:lvl w:ilvl="7" w:tplc="14090003" w:tentative="1">
+      <w:start w:val="1"/>
+      <w:numFmt w:val="bullet"/>
+      <w:lvlText w:val="o"/>
+      <w:lvlJc w:val="left"/>
+      <w:pPr>
+        <w:ind w:left="5760" w:hanging="360"/>
+      </w:pPr>
+      <w:rPr>
+        <w:rFonts w:ascii="Courier New" w:hAnsi="Courier New" w:cs="Courier New" w:hint="default"/>
+      </w:rPr>
+    </w:lvl>
+    <w:lvl w:ilvl="8" w:tplc="14090005" w:tentative="1">
+      <w:start w:val="1"/>
+      <w:numFmt w:val="bullet"/>
+      <w:lvlText w:val=""/>
+      <w:lvlJc w:val="left"/>
+      <w:pPr>
+        <w:ind w:left="6480" w:hanging="360"/>
+      </w:pPr>
+      <w:rPr>
+        <w:rFonts w:ascii="Wingdings" w:hAnsi="Wingdings" w:hint="default"/>
+      </w:rPr>
+    </w:lvl>
+  </w:abstractNum>
+  <w:abstractNum w:abstractNumId="3" w15:restartNumberingAfterBreak="0">
     <w:nsid w:val="58B14600"/>
     <w:multiLevelType w:val="hybridMultilevel"/>
     <w:tmpl w:val="433A6502"/>
@@ -1290,14 +2876,487 @@
       </w:rPr>
     </w:lvl>
   </w:abstractNum>
-  <w:num w:numId="1" w16cid:durableId="1243565146">
+  <w:abstractNum w:abstractNumId="4" w15:restartNumberingAfterBreak="0">
+    <w:nsid w:val="5F436901"/>
+    <w:multiLevelType w:val="hybridMultilevel"/>
+    <w:tmpl w:val="4DE48B7C"/>
+    <w:lvl w:ilvl="0" w:tplc="14090001">
+      <w:start w:val="1"/>
+      <w:numFmt w:val="bullet"/>
+      <w:lvlText w:val=""/>
+      <w:lvlJc w:val="left"/>
+      <w:pPr>
+        <w:ind w:left="720" w:hanging="360"/>
+      </w:pPr>
+      <w:rPr>
+        <w:rFonts w:ascii="Symbol" w:hAnsi="Symbol" w:hint="default"/>
+      </w:rPr>
+    </w:lvl>
+    <w:lvl w:ilvl="1" w:tplc="14090003" w:tentative="1">
+      <w:start w:val="1"/>
+      <w:numFmt w:val="bullet"/>
+      <w:lvlText w:val="o"/>
+      <w:lvlJc w:val="left"/>
+      <w:pPr>
+        <w:ind w:left="1440" w:hanging="360"/>
+      </w:pPr>
+      <w:rPr>
+        <w:rFonts w:ascii="Courier New" w:hAnsi="Courier New" w:cs="Courier New" w:hint="default"/>
+      </w:rPr>
+    </w:lvl>
+    <w:lvl w:ilvl="2" w:tplc="14090005" w:tentative="1">
+      <w:start w:val="1"/>
+      <w:numFmt w:val="bullet"/>
+      <w:lvlText w:val=""/>
+      <w:lvlJc w:val="left"/>
+      <w:pPr>
+        <w:ind w:left="2160" w:hanging="360"/>
+      </w:pPr>
+      <w:rPr>
+        <w:rFonts w:ascii="Wingdings" w:hAnsi="Wingdings" w:hint="default"/>
+      </w:rPr>
+    </w:lvl>
+    <w:lvl w:ilvl="3" w:tplc="14090001" w:tentative="1">
+      <w:start w:val="1"/>
+      <w:numFmt w:val="bullet"/>
+      <w:lvlText w:val=""/>
+      <w:lvlJc w:val="left"/>
+      <w:pPr>
+        <w:ind w:left="2880" w:hanging="360"/>
+      </w:pPr>
+      <w:rPr>
+        <w:rFonts w:ascii="Symbol" w:hAnsi="Symbol" w:hint="default"/>
+      </w:rPr>
+    </w:lvl>
+    <w:lvl w:ilvl="4" w:tplc="14090003" w:tentative="1">
+      <w:start w:val="1"/>
+      <w:numFmt w:val="bullet"/>
+      <w:lvlText w:val="o"/>
+      <w:lvlJc w:val="left"/>
+      <w:pPr>
+        <w:ind w:left="3600" w:hanging="360"/>
+      </w:pPr>
+      <w:rPr>
+        <w:rFonts w:ascii="Courier New" w:hAnsi="Courier New" w:cs="Courier New" w:hint="default"/>
+      </w:rPr>
+    </w:lvl>
+    <w:lvl w:ilvl="5" w:tplc="14090005" w:tentative="1">
+      <w:start w:val="1"/>
+      <w:numFmt w:val="bullet"/>
+      <w:lvlText w:val=""/>
+      <w:lvlJc w:val="left"/>
+      <w:pPr>
+        <w:ind w:left="4320" w:hanging="360"/>
+      </w:pPr>
+      <w:rPr>
+        <w:rFonts w:ascii="Wingdings" w:hAnsi="Wingdings" w:hint="default"/>
+      </w:rPr>
+    </w:lvl>
+    <w:lvl w:ilvl="6" w:tplc="14090001" w:tentative="1">
+      <w:start w:val="1"/>
+      <w:numFmt w:val="bullet"/>
+      <w:lvlText w:val=""/>
+      <w:lvlJc w:val="left"/>
+      <w:pPr>
+        <w:ind w:left="5040" w:hanging="360"/>
+      </w:pPr>
+      <w:rPr>
+        <w:rFonts w:ascii="Symbol" w:hAnsi="Symbol" w:hint="default"/>
+      </w:rPr>
+    </w:lvl>
+    <w:lvl w:ilvl="7" w:tplc="14090003" w:tentative="1">
+      <w:start w:val="1"/>
+      <w:numFmt w:val="bullet"/>
+      <w:lvlText w:val="o"/>
+      <w:lvlJc w:val="left"/>
+      <w:pPr>
+        <w:ind w:left="5760" w:hanging="360"/>
+      </w:pPr>
+      <w:rPr>
+        <w:rFonts w:ascii="Courier New" w:hAnsi="Courier New" w:cs="Courier New" w:hint="default"/>
+      </w:rPr>
+    </w:lvl>
+    <w:lvl w:ilvl="8" w:tplc="14090005" w:tentative="1">
+      <w:start w:val="1"/>
+      <w:numFmt w:val="bullet"/>
+      <w:lvlText w:val=""/>
+      <w:lvlJc w:val="left"/>
+      <w:pPr>
+        <w:ind w:left="6480" w:hanging="360"/>
+      </w:pPr>
+      <w:rPr>
+        <w:rFonts w:ascii="Wingdings" w:hAnsi="Wingdings" w:hint="default"/>
+      </w:rPr>
+    </w:lvl>
+  </w:abstractNum>
+  <w:abstractNum w:abstractNumId="5" w15:restartNumberingAfterBreak="0">
+    <w:nsid w:val="6F1C43A0"/>
+    <w:multiLevelType w:val="hybridMultilevel"/>
+    <w:tmpl w:val="239205CC"/>
+    <w:lvl w:ilvl="0" w:tplc="14090001">
+      <w:start w:val="1"/>
+      <w:numFmt w:val="bullet"/>
+      <w:lvlText w:val=""/>
+      <w:lvlJc w:val="left"/>
+      <w:pPr>
+        <w:ind w:left="720" w:hanging="360"/>
+      </w:pPr>
+      <w:rPr>
+        <w:rFonts w:ascii="Symbol" w:hAnsi="Symbol" w:hint="default"/>
+      </w:rPr>
+    </w:lvl>
+    <w:lvl w:ilvl="1" w:tplc="14090003" w:tentative="1">
+      <w:start w:val="1"/>
+      <w:numFmt w:val="bullet"/>
+      <w:lvlText w:val="o"/>
+      <w:lvlJc w:val="left"/>
+      <w:pPr>
+        <w:ind w:left="1440" w:hanging="360"/>
+      </w:pPr>
+      <w:rPr>
+        <w:rFonts w:ascii="Courier New" w:hAnsi="Courier New" w:cs="Courier New" w:hint="default"/>
+      </w:rPr>
+    </w:lvl>
+    <w:lvl w:ilvl="2" w:tplc="14090005" w:tentative="1">
+      <w:start w:val="1"/>
+      <w:numFmt w:val="bullet"/>
+      <w:lvlText w:val=""/>
+      <w:lvlJc w:val="left"/>
+      <w:pPr>
+        <w:ind w:left="2160" w:hanging="360"/>
+      </w:pPr>
+      <w:rPr>
+        <w:rFonts w:ascii="Wingdings" w:hAnsi="Wingdings" w:hint="default"/>
+      </w:rPr>
+    </w:lvl>
+    <w:lvl w:ilvl="3" w:tplc="14090001" w:tentative="1">
+      <w:start w:val="1"/>
+      <w:numFmt w:val="bullet"/>
+      <w:lvlText w:val=""/>
+      <w:lvlJc w:val="left"/>
+      <w:pPr>
+        <w:ind w:left="2880" w:hanging="360"/>
+      </w:pPr>
+      <w:rPr>
+        <w:rFonts w:ascii="Symbol" w:hAnsi="Symbol" w:hint="default"/>
+      </w:rPr>
+    </w:lvl>
+    <w:lvl w:ilvl="4" w:tplc="14090003" w:tentative="1">
+      <w:start w:val="1"/>
+      <w:numFmt w:val="bullet"/>
+      <w:lvlText w:val="o"/>
+      <w:lvlJc w:val="left"/>
+      <w:pPr>
+        <w:ind w:left="3600" w:hanging="360"/>
+      </w:pPr>
+      <w:rPr>
+        <w:rFonts w:ascii="Courier New" w:hAnsi="Courier New" w:cs="Courier New" w:hint="default"/>
+      </w:rPr>
+    </w:lvl>
+    <w:lvl w:ilvl="5" w:tplc="14090005" w:tentative="1">
+      <w:start w:val="1"/>
+      <w:numFmt w:val="bullet"/>
+      <w:lvlText w:val=""/>
+      <w:lvlJc w:val="left"/>
+      <w:pPr>
+        <w:ind w:left="4320" w:hanging="360"/>
+      </w:pPr>
+      <w:rPr>
+        <w:rFonts w:ascii="Wingdings" w:hAnsi="Wingdings" w:hint="default"/>
+      </w:rPr>
+    </w:lvl>
+    <w:lvl w:ilvl="6" w:tplc="14090001" w:tentative="1">
+      <w:start w:val="1"/>
+      <w:numFmt w:val="bullet"/>
+      <w:lvlText w:val=""/>
+      <w:lvlJc w:val="left"/>
+      <w:pPr>
+        <w:ind w:left="5040" w:hanging="360"/>
+      </w:pPr>
+      <w:rPr>
+        <w:rFonts w:ascii="Symbol" w:hAnsi="Symbol" w:hint="default"/>
+      </w:rPr>
+    </w:lvl>
+    <w:lvl w:ilvl="7" w:tplc="14090003" w:tentative="1">
+      <w:start w:val="1"/>
+      <w:numFmt w:val="bullet"/>
+      <w:lvlText w:val="o"/>
+      <w:lvlJc w:val="left"/>
+      <w:pPr>
+        <w:ind w:left="5760" w:hanging="360"/>
+      </w:pPr>
+      <w:rPr>
+        <w:rFonts w:ascii="Courier New" w:hAnsi="Courier New" w:cs="Courier New" w:hint="default"/>
+      </w:rPr>
+    </w:lvl>
+    <w:lvl w:ilvl="8" w:tplc="14090005" w:tentative="1">
+      <w:start w:val="1"/>
+      <w:numFmt w:val="bullet"/>
+      <w:lvlText w:val=""/>
+      <w:lvlJc w:val="left"/>
+      <w:pPr>
+        <w:ind w:left="6480" w:hanging="360"/>
+      </w:pPr>
+      <w:rPr>
+        <w:rFonts w:ascii="Wingdings" w:hAnsi="Wingdings" w:hint="default"/>
+      </w:rPr>
+    </w:lvl>
+  </w:abstractNum>
+  <w:abstractNum w:abstractNumId="6" w15:restartNumberingAfterBreak="0">
+    <w:nsid w:val="719B15A0"/>
+    <w:multiLevelType w:val="hybridMultilevel"/>
+    <w:tmpl w:val="8B6A06FC"/>
+    <w:lvl w:ilvl="0" w:tplc="14090001">
+      <w:start w:val="1"/>
+      <w:numFmt w:val="bullet"/>
+      <w:lvlText w:val=""/>
+      <w:lvlJc w:val="left"/>
+      <w:pPr>
+        <w:ind w:left="720" w:hanging="360"/>
+      </w:pPr>
+      <w:rPr>
+        <w:rFonts w:ascii="Symbol" w:hAnsi="Symbol" w:hint="default"/>
+      </w:rPr>
+    </w:lvl>
+    <w:lvl w:ilvl="1" w:tplc="14090003" w:tentative="1">
+      <w:start w:val="1"/>
+      <w:numFmt w:val="bullet"/>
+      <w:lvlText w:val="o"/>
+      <w:lvlJc w:val="left"/>
+      <w:pPr>
+        <w:ind w:left="1440" w:hanging="360"/>
+      </w:pPr>
+      <w:rPr>
+        <w:rFonts w:ascii="Courier New" w:hAnsi="Courier New" w:cs="Courier New" w:hint="default"/>
+      </w:rPr>
+    </w:lvl>
+    <w:lvl w:ilvl="2" w:tplc="14090005" w:tentative="1">
+      <w:start w:val="1"/>
+      <w:numFmt w:val="bullet"/>
+      <w:lvlText w:val=""/>
+      <w:lvlJc w:val="left"/>
+      <w:pPr>
+        <w:ind w:left="2160" w:hanging="360"/>
+      </w:pPr>
+      <w:rPr>
+        <w:rFonts w:ascii="Wingdings" w:hAnsi="Wingdings" w:hint="default"/>
+      </w:rPr>
+    </w:lvl>
+    <w:lvl w:ilvl="3" w:tplc="14090001" w:tentative="1">
+      <w:start w:val="1"/>
+      <w:numFmt w:val="bullet"/>
+      <w:lvlText w:val=""/>
+      <w:lvlJc w:val="left"/>
+      <w:pPr>
+        <w:ind w:left="2880" w:hanging="360"/>
+      </w:pPr>
+      <w:rPr>
+        <w:rFonts w:ascii="Symbol" w:hAnsi="Symbol" w:hint="default"/>
+      </w:rPr>
+    </w:lvl>
+    <w:lvl w:ilvl="4" w:tplc="14090003" w:tentative="1">
+      <w:start w:val="1"/>
+      <w:numFmt w:val="bullet"/>
+      <w:lvlText w:val="o"/>
+      <w:lvlJc w:val="left"/>
+      <w:pPr>
+        <w:ind w:left="3600" w:hanging="360"/>
+      </w:pPr>
+      <w:rPr>
+        <w:rFonts w:ascii="Courier New" w:hAnsi="Courier New" w:cs="Courier New" w:hint="default"/>
+      </w:rPr>
+    </w:lvl>
+    <w:lvl w:ilvl="5" w:tplc="14090005" w:tentative="1">
+      <w:start w:val="1"/>
+      <w:numFmt w:val="bullet"/>
+      <w:lvlText w:val=""/>
+      <w:lvlJc w:val="left"/>
+      <w:pPr>
+        <w:ind w:left="4320" w:hanging="360"/>
+      </w:pPr>
+      <w:rPr>
+        <w:rFonts w:ascii="Wingdings" w:hAnsi="Wingdings" w:hint="default"/>
+      </w:rPr>
+    </w:lvl>
+    <w:lvl w:ilvl="6" w:tplc="14090001" w:tentative="1">
+      <w:start w:val="1"/>
+      <w:numFmt w:val="bullet"/>
+      <w:lvlText w:val=""/>
+      <w:lvlJc w:val="left"/>
+      <w:pPr>
+        <w:ind w:left="5040" w:hanging="360"/>
+      </w:pPr>
+      <w:rPr>
+        <w:rFonts w:ascii="Symbol" w:hAnsi="Symbol" w:hint="default"/>
+      </w:rPr>
+    </w:lvl>
+    <w:lvl w:ilvl="7" w:tplc="14090003" w:tentative="1">
+      <w:start w:val="1"/>
+      <w:numFmt w:val="bullet"/>
+      <w:lvlText w:val="o"/>
+      <w:lvlJc w:val="left"/>
+      <w:pPr>
+        <w:ind w:left="5760" w:hanging="360"/>
+      </w:pPr>
+      <w:rPr>
+        <w:rFonts w:ascii="Courier New" w:hAnsi="Courier New" w:cs="Courier New" w:hint="default"/>
+      </w:rPr>
+    </w:lvl>
+    <w:lvl w:ilvl="8" w:tplc="14090005" w:tentative="1">
+      <w:start w:val="1"/>
+      <w:numFmt w:val="bullet"/>
+      <w:lvlText w:val=""/>
+      <w:lvlJc w:val="left"/>
+      <w:pPr>
+        <w:ind w:left="6480" w:hanging="360"/>
+      </w:pPr>
+      <w:rPr>
+        <w:rFonts w:ascii="Wingdings" w:hAnsi="Wingdings" w:hint="default"/>
+      </w:rPr>
+    </w:lvl>
+  </w:abstractNum>
+  <w:abstractNum w:abstractNumId="7" w15:restartNumberingAfterBreak="0">
+    <w:nsid w:val="7760001C"/>
+    <w:multiLevelType w:val="hybridMultilevel"/>
+    <w:tmpl w:val="DA00D140"/>
+    <w:lvl w:ilvl="0" w:tplc="14090001">
+      <w:start w:val="1"/>
+      <w:numFmt w:val="bullet"/>
+      <w:lvlText w:val=""/>
+      <w:lvlJc w:val="left"/>
+      <w:pPr>
+        <w:ind w:left="720" w:hanging="360"/>
+      </w:pPr>
+      <w:rPr>
+        <w:rFonts w:ascii="Symbol" w:hAnsi="Symbol" w:hint="default"/>
+      </w:rPr>
+    </w:lvl>
+    <w:lvl w:ilvl="1" w:tplc="14090003" w:tentative="1">
+      <w:start w:val="1"/>
+      <w:numFmt w:val="bullet"/>
+      <w:lvlText w:val="o"/>
+      <w:lvlJc w:val="left"/>
+      <w:pPr>
+        <w:ind w:left="1440" w:hanging="360"/>
+      </w:pPr>
+      <w:rPr>
+        <w:rFonts w:ascii="Courier New" w:hAnsi="Courier New" w:cs="Courier New" w:hint="default"/>
+      </w:rPr>
+    </w:lvl>
+    <w:lvl w:ilvl="2" w:tplc="14090005" w:tentative="1">
+      <w:start w:val="1"/>
+      <w:numFmt w:val="bullet"/>
+      <w:lvlText w:val=""/>
+      <w:lvlJc w:val="left"/>
+      <w:pPr>
+        <w:ind w:left="2160" w:hanging="360"/>
+      </w:pPr>
+      <w:rPr>
+        <w:rFonts w:ascii="Wingdings" w:hAnsi="Wingdings" w:hint="default"/>
+      </w:rPr>
+    </w:lvl>
+    <w:lvl w:ilvl="3" w:tplc="14090001" w:tentative="1">
+      <w:start w:val="1"/>
+      <w:numFmt w:val="bullet"/>
+      <w:lvlText w:val=""/>
+      <w:lvlJc w:val="left"/>
+      <w:pPr>
+        <w:ind w:left="2880" w:hanging="360"/>
+      </w:pPr>
+      <w:rPr>
+        <w:rFonts w:ascii="Symbol" w:hAnsi="Symbol" w:hint="default"/>
+      </w:rPr>
+    </w:lvl>
+    <w:lvl w:ilvl="4" w:tplc="14090003" w:tentative="1">
+      <w:start w:val="1"/>
+      <w:numFmt w:val="bullet"/>
+      <w:lvlText w:val="o"/>
+      <w:lvlJc w:val="left"/>
+      <w:pPr>
+        <w:ind w:left="3600" w:hanging="360"/>
+      </w:pPr>
+      <w:rPr>
+        <w:rFonts w:ascii="Courier New" w:hAnsi="Courier New" w:cs="Courier New" w:hint="default"/>
+      </w:rPr>
+    </w:lvl>
+    <w:lvl w:ilvl="5" w:tplc="14090005" w:tentative="1">
+      <w:start w:val="1"/>
+      <w:numFmt w:val="bullet"/>
+      <w:lvlText w:val=""/>
+      <w:lvlJc w:val="left"/>
+      <w:pPr>
+        <w:ind w:left="4320" w:hanging="360"/>
+      </w:pPr>
+      <w:rPr>
+        <w:rFonts w:ascii="Wingdings" w:hAnsi="Wingdings" w:hint="default"/>
+      </w:rPr>
+    </w:lvl>
+    <w:lvl w:ilvl="6" w:tplc="14090001" w:tentative="1">
+      <w:start w:val="1"/>
+      <w:numFmt w:val="bullet"/>
+      <w:lvlText w:val=""/>
+      <w:lvlJc w:val="left"/>
+      <w:pPr>
+        <w:ind w:left="5040" w:hanging="360"/>
+      </w:pPr>
+      <w:rPr>
+        <w:rFonts w:ascii="Symbol" w:hAnsi="Symbol" w:hint="default"/>
+      </w:rPr>
+    </w:lvl>
+    <w:lvl w:ilvl="7" w:tplc="14090003" w:tentative="1">
+      <w:start w:val="1"/>
+      <w:numFmt w:val="bullet"/>
+      <w:lvlText w:val="o"/>
+      <w:lvlJc w:val="left"/>
+      <w:pPr>
+        <w:ind w:left="5760" w:hanging="360"/>
+      </w:pPr>
+      <w:rPr>
+        <w:rFonts w:ascii="Courier New" w:hAnsi="Courier New" w:cs="Courier New" w:hint="default"/>
+      </w:rPr>
+    </w:lvl>
+    <w:lvl w:ilvl="8" w:tplc="14090005" w:tentative="1">
+      <w:start w:val="1"/>
+      <w:numFmt w:val="bullet"/>
+      <w:lvlText w:val=""/>
+      <w:lvlJc w:val="left"/>
+      <w:pPr>
+        <w:ind w:left="6480" w:hanging="360"/>
+      </w:pPr>
+      <w:rPr>
+        <w:rFonts w:ascii="Wingdings" w:hAnsi="Wingdings" w:hint="default"/>
+      </w:rPr>
+    </w:lvl>
+  </w:abstractNum>
+  <w:num w:numId="1">
+    <w:abstractNumId w:val="3"/>
+  </w:num>
+  <w:num w:numId="2">
+    <w:abstractNumId w:val="2"/>
+  </w:num>
+  <w:num w:numId="3">
+    <w:abstractNumId w:val="5"/>
+  </w:num>
+  <w:num w:numId="4">
+    <w:abstractNumId w:val="7"/>
+  </w:num>
+  <w:num w:numId="5">
+    <w:abstractNumId w:val="6"/>
+  </w:num>
+  <w:num w:numId="6">
     <w:abstractNumId w:val="0"/>
+  </w:num>
+  <w:num w:numId="7">
+    <w:abstractNumId w:val="4"/>
+  </w:num>
+  <w:num w:numId="8">
+    <w:abstractNumId w:val="1"/>
   </w:num>
 </w:numbering>
 </file>
 
 <file path=word/styles.xml><?xml version="1.0" encoding="utf-8"?>
-<w:styles xmlns:mc="http://schemas.openxmlformats.org/markup-compatibility/2006" xmlns:r="http://schemas.openxmlformats.org/officeDocument/2006/relationships" xmlns:w="http://schemas.openxmlformats.org/wordprocessingml/2006/main" xmlns:w14="http://schemas.microsoft.com/office/word/2010/wordml" xmlns:w15="http://schemas.microsoft.com/office/word/2012/wordml" xmlns:w16cex="http://schemas.microsoft.com/office/word/2018/wordml/cex" xmlns:w16cid="http://schemas.microsoft.com/office/word/2016/wordml/cid" xmlns:w16="http://schemas.microsoft.com/office/word/2018/wordml" xmlns:w16du="http://schemas.microsoft.com/office/word/2023/wordml/word16du" xmlns:w16sdtdh="http://schemas.microsoft.com/office/word/2020/wordml/sdtdatahash" xmlns:w16sdtfl="http://schemas.microsoft.com/office/word/2024/wordml/sdtformatlock" xmlns:w16se="http://schemas.microsoft.com/office/word/2015/wordml/symex" mc:Ignorable="w14 w15 w16se w16cid w16 w16cex w16sdtdh w16sdtfl w16du">
+<w:styles xmlns:mc="http://schemas.openxmlformats.org/markup-compatibility/2006" xmlns:r="http://schemas.openxmlformats.org/officeDocument/2006/relationships" xmlns:w="http://schemas.openxmlformats.org/wordprocessingml/2006/main" xmlns:w14="http://schemas.microsoft.com/office/word/2010/wordml" xmlns:w15="http://schemas.microsoft.com/office/word/2012/wordml" xmlns:w16cex="http://schemas.microsoft.com/office/word/2018/wordml/cex" xmlns:w16cid="http://schemas.microsoft.com/office/word/2016/wordml/cid" xmlns:w16="http://schemas.microsoft.com/office/word/2018/wordml" xmlns:w16sdtdh="http://schemas.microsoft.com/office/word/2020/wordml/sdtdatahash" xmlns:w16se="http://schemas.microsoft.com/office/word/2015/wordml/symex" mc:Ignorable="w14 w15 w16se w16cid w16 w16cex w16sdtdh">
   <w:docDefaults>
     <w:rPrDefault>
       <w:rPr>
@@ -1695,7 +3754,7 @@
     <w:name w:val="Normal"/>
     <w:qFormat/>
   </w:style>
-  <w:style w:type="paragraph" w:styleId="Ttulo1">
+  <w:style w:type="paragraph" w:styleId="Heading1">
     <w:name w:val="heading 1"/>
     <w:basedOn w:val="Normal"/>
     <w:next w:val="Normal"/>
@@ -1712,7 +3771,7 @@
       <w:szCs w:val="40"/>
     </w:rPr>
   </w:style>
-  <w:style w:type="paragraph" w:styleId="Ttulo2">
+  <w:style w:type="paragraph" w:styleId="Heading2">
     <w:name w:val="heading 2"/>
     <w:basedOn w:val="Normal"/>
     <w:next w:val="Normal"/>
@@ -1730,7 +3789,7 @@
       <w:szCs w:val="32"/>
     </w:rPr>
   </w:style>
-  <w:style w:type="paragraph" w:styleId="Ttulo3">
+  <w:style w:type="paragraph" w:styleId="Heading3">
     <w:name w:val="heading 3"/>
     <w:basedOn w:val="Normal"/>
     <w:next w:val="Normal"/>
@@ -1750,7 +3809,7 @@
       <w:szCs w:val="28"/>
     </w:rPr>
   </w:style>
-  <w:style w:type="paragraph" w:styleId="Ttulo4">
+  <w:style w:type="paragraph" w:styleId="Heading4">
     <w:name w:val="heading 4"/>
     <w:basedOn w:val="Normal"/>
     <w:next w:val="Normal"/>
@@ -1770,7 +3829,7 @@
       <w:szCs w:val="24"/>
     </w:rPr>
   </w:style>
-  <w:style w:type="paragraph" w:styleId="Ttulo5">
+  <w:style w:type="paragraph" w:styleId="Heading5">
     <w:name w:val="heading 5"/>
     <w:basedOn w:val="Normal"/>
     <w:next w:val="Normal"/>
@@ -1788,7 +3847,7 @@
       <w:color w:val="666666"/>
     </w:rPr>
   </w:style>
-  <w:style w:type="paragraph" w:styleId="Ttulo6">
+  <w:style w:type="paragraph" w:styleId="Heading6">
     <w:name w:val="heading 6"/>
     <w:basedOn w:val="Normal"/>
     <w:next w:val="Normal"/>
@@ -1807,13 +3866,13 @@
       <w:color w:val="666666"/>
     </w:rPr>
   </w:style>
-  <w:style w:type="character" w:default="1" w:styleId="Fuentedeprrafopredeter">
+  <w:style w:type="character" w:default="1" w:styleId="DefaultParagraphFont">
     <w:name w:val="Default Paragraph Font"/>
     <w:uiPriority w:val="1"/>
     <w:semiHidden/>
     <w:unhideWhenUsed/>
   </w:style>
-  <w:style w:type="table" w:default="1" w:styleId="Tablanormal">
+  <w:style w:type="table" w:default="1" w:styleId="TableNormal">
     <w:name w:val="Normal Table"/>
     <w:uiPriority w:val="99"/>
     <w:semiHidden/>
@@ -1828,13 +3887,13 @@
       </w:tblCellMar>
     </w:tblPr>
   </w:style>
-  <w:style w:type="numbering" w:default="1" w:styleId="Sinlista">
+  <w:style w:type="numbering" w:default="1" w:styleId="NoList">
     <w:name w:val="No List"/>
     <w:uiPriority w:val="99"/>
     <w:semiHidden/>
     <w:unhideWhenUsed/>
   </w:style>
-  <w:style w:type="paragraph" w:styleId="Ttulo">
+  <w:style w:type="paragraph" w:styleId="Title">
     <w:name w:val="Title"/>
     <w:basedOn w:val="Normal"/>
     <w:next w:val="Normal"/>
@@ -1850,7 +3909,7 @@
       <w:szCs w:val="52"/>
     </w:rPr>
   </w:style>
-  <w:style w:type="paragraph" w:styleId="Subttulo">
+  <w:style w:type="paragraph" w:styleId="Subtitle">
     <w:name w:val="Subtitle"/>
     <w:basedOn w:val="Normal"/>
     <w:next w:val="Normal"/>
@@ -1867,7 +3926,7 @@
       <w:szCs w:val="30"/>
     </w:rPr>
   </w:style>
-  <w:style w:type="paragraph" w:styleId="Prrafodelista">
+  <w:style w:type="paragraph" w:styleId="ListParagraph">
     <w:name w:val="List Paragraph"/>
     <w:basedOn w:val="Normal"/>
     <w:uiPriority w:val="34"/>

</xml_diff>

<commit_message>
Working on Ch SLR Second revision
</commit_message>
<xml_diff>
--- a/Draft/6 Case Study.docx
+++ b/Draft/6 Case Study.docx
@@ -406,25 +406,7 @@
           <w:szCs w:val="24"/>
           <w:lang w:val="en-NZ"/>
         </w:rPr>
-        <w:t>Propose, organise, design, analyse, execute and reflect on a multi-disciplinary</w:t>
-      </w:r>
-      <w:r>
-        <w:rPr>
-          <w:rFonts w:asciiTheme="majorHAnsi" w:hAnsiTheme="majorHAnsi" w:cstheme="majorHAnsi"/>
-          <w:sz w:val="24"/>
-          <w:szCs w:val="24"/>
-          <w:lang w:val="en-NZ"/>
-        </w:rPr>
-        <w:t xml:space="preserve"> </w:t>
-      </w:r>
-      <w:r>
-        <w:rPr>
-          <w:rFonts w:asciiTheme="majorHAnsi" w:hAnsiTheme="majorHAnsi" w:cstheme="majorHAnsi"/>
-          <w:sz w:val="24"/>
-          <w:szCs w:val="24"/>
-          <w:lang w:val="en-NZ"/>
-        </w:rPr>
-        <w:t>project.</w:t>
+        <w:t>Propose, organise, design, analyse, execute and reflect on a multi-disciplinary project.</w:t>
       </w:r>
     </w:p>
     <w:p>
@@ -448,25 +430,7 @@
           <w:szCs w:val="24"/>
           <w:lang w:val="en-NZ"/>
         </w:rPr>
-        <w:t>Apply existing construction</w:t>
-      </w:r>
-      <w:r>
-        <w:rPr>
-          <w:rFonts w:asciiTheme="majorHAnsi" w:hAnsiTheme="majorHAnsi" w:cstheme="majorHAnsi"/>
-          <w:sz w:val="24"/>
-          <w:szCs w:val="24"/>
-          <w:lang w:val="en-NZ"/>
-        </w:rPr>
-        <w:t xml:space="preserve"> and </w:t>
-      </w:r>
-      <w:r>
-        <w:rPr>
-          <w:rFonts w:asciiTheme="majorHAnsi" w:hAnsiTheme="majorHAnsi" w:cstheme="majorHAnsi"/>
-          <w:sz w:val="24"/>
-          <w:szCs w:val="24"/>
-          <w:lang w:val="en-NZ"/>
-        </w:rPr>
-        <w:t>engineering knowledge and skills to the project.</w:t>
+        <w:t>Apply existing construction and engineering knowledge and skills to the project.</w:t>
       </w:r>
     </w:p>
     <w:p>
@@ -479,20 +443,20 @@
         <w:spacing w:after="160" w:line="259" w:lineRule="auto"/>
         <w:jc w:val="both"/>
         <w:rPr>
-          <w:lang w:val="en-NZ"/>
-        </w:rPr>
-      </w:pPr>
-      <w:r>
-        <w:rPr>
-          <w:lang w:val="en-NZ"/>
-        </w:rPr>
-        <w:t>Conduct a systematic literature review to identify works previously undertaken and gaps requiring research</w:t>
-      </w:r>
-      <w:r>
-        <w:rPr>
-          <w:lang w:val="en-NZ"/>
-        </w:rPr>
-        <w:t>.</w:t>
+          <w:rFonts w:asciiTheme="majorHAnsi" w:hAnsiTheme="majorHAnsi" w:cstheme="majorHAnsi"/>
+          <w:sz w:val="24"/>
+          <w:szCs w:val="24"/>
+          <w:lang w:val="en-NZ"/>
+        </w:rPr>
+      </w:pPr>
+      <w:r>
+        <w:rPr>
+          <w:rFonts w:asciiTheme="majorHAnsi" w:hAnsiTheme="majorHAnsi" w:cstheme="majorHAnsi"/>
+          <w:sz w:val="24"/>
+          <w:szCs w:val="24"/>
+          <w:lang w:val="en-NZ"/>
+        </w:rPr>
+        <w:t>Conduct a systematic literature review to identify works previously undertaken and gaps requiring research.</w:t>
       </w:r>
     </w:p>
     <w:p>
@@ -755,25 +719,7 @@
           <w:szCs w:val="24"/>
           <w:lang w:val="en-NZ"/>
         </w:rPr>
-        <w:t xml:space="preserve"> Additionally, each group would act as a task team in charge of the design and surveillance of the development of the project. </w:t>
-      </w:r>
-      <w:r>
-        <w:rPr>
-          <w:rFonts w:asciiTheme="majorHAnsi" w:hAnsiTheme="majorHAnsi" w:cstheme="majorHAnsi"/>
-          <w:sz w:val="24"/>
-          <w:szCs w:val="24"/>
-          <w:lang w:val="en-NZ"/>
-        </w:rPr>
-        <w:t>ENBU 79X/89X</w:t>
-      </w:r>
-      <w:r>
-        <w:rPr>
-          <w:rFonts w:asciiTheme="majorHAnsi" w:hAnsiTheme="majorHAnsi" w:cstheme="majorHAnsi"/>
-          <w:sz w:val="24"/>
-          <w:szCs w:val="24"/>
-          <w:lang w:val="en-NZ"/>
-        </w:rPr>
-        <w:t xml:space="preserve"> acts as the capstone for four different programs, and each group had at least one representative of each role: Architectural Engineer, Construction Engineer, Construction Manager and Quantity Surveyor. The group was expected to coordinate efforts to create a coherent proposal for the development project, while fulfilling specific tasks and deliveries specific for each role. Finally, the group as a whole had to create weekly and milestone reports to the client, creating a summary document meant to explain the current state of the project in a way that tackles the different profiles that the fictional client firm was representing</w:t>
+        <w:t xml:space="preserve"> Additionally, each group would act as a task team in charge of the design and surveillance of the development of the project. ENBU 79X/89X acts as the capstone for four different programs, and each group had at least one representative of each role: Architectural Engineer, Construction Engineer, Construction Manager and Quantity Surveyor. The group was expected to coordinate efforts to create a coherent proposal for the development project, while fulfilling specific tasks and deliveries specific for each role. Finally, the group as a whole had to create weekly and milestone reports to the client, creating a summary document meant to explain the current state of the project in a way that tackles the different profiles that the fictional client firm was representing</w:t>
       </w:r>
       <w:r>
         <w:rPr>
@@ -1194,25 +1140,7 @@
           <w:lang w:val="en-NZ"/>
         </w:rPr>
         <w:lastRenderedPageBreak/>
-        <w:t xml:space="preserve">This summarizes the main elements of the learning design proposed for </w:t>
-      </w:r>
-      <w:r>
-        <w:rPr>
-          <w:rFonts w:asciiTheme="majorHAnsi" w:hAnsiTheme="majorHAnsi" w:cstheme="majorHAnsi"/>
-          <w:sz w:val="24"/>
-          <w:szCs w:val="24"/>
-          <w:lang w:val="en-NZ"/>
-        </w:rPr>
-        <w:t>ENBU 79X/89X Industry Project</w:t>
-      </w:r>
-      <w:r>
-        <w:rPr>
-          <w:rFonts w:asciiTheme="majorHAnsi" w:hAnsiTheme="majorHAnsi" w:cstheme="majorHAnsi"/>
-          <w:sz w:val="24"/>
-          <w:szCs w:val="24"/>
-          <w:lang w:val="en-NZ"/>
-        </w:rPr>
-        <w:t xml:space="preserve"> and the methodologies used to implement that design. Some other aspect of the development of the course were present, like the role of the teaching assistances during the open work sessions and the organization between track A and track B students that will be explained in more detail during the development of the case study. For now, there is enough information here to stablish how WorkshopAR was integrated into de learning design of the course and how the goals of the software tool were implemented and coordinated with the activities of the course.</w:t>
+        <w:t>This summarizes the main elements of the learning design proposed for ENBU 79X/89X Industry Project and the methodologies used to implement that design. Some other aspect of the development of the course were present, like the role of the teaching assistances during the open work sessions and the organization between track A and track B students that will be explained in more detail during the development of the case study. For now, there is enough information here to stablish how WorkshopAR was integrated into de learning design of the course and how the goals of the software tool were implemented and coordinated with the activities of the course.</w:t>
       </w:r>
     </w:p>
     <w:p>
@@ -1238,9 +1166,263 @@
     <w:p>
       <w:pPr>
         <w:rPr>
-          <w:lang w:val="en-NZ"/>
-        </w:rPr>
-      </w:pPr>
+          <w:rFonts w:asciiTheme="majorHAnsi" w:hAnsiTheme="majorHAnsi" w:cstheme="majorHAnsi"/>
+          <w:sz w:val="24"/>
+          <w:szCs w:val="24"/>
+          <w:lang w:val="en-NZ"/>
+        </w:rPr>
+      </w:pPr>
+      <w:r>
+        <w:rPr>
+          <w:rFonts w:asciiTheme="majorHAnsi" w:hAnsiTheme="majorHAnsi" w:cstheme="majorHAnsi"/>
+          <w:sz w:val="24"/>
+          <w:szCs w:val="24"/>
+          <w:lang w:val="en-NZ"/>
+        </w:rPr>
+        <w:t>This section seeks to elaborate on the information presented in section 3.1.1.3 about the structure of the learning design for the project. More specifically, this section will show how WorkshopAR approaches the learning goals proposed and how they are integrated with the structure of the course.</w:t>
+      </w:r>
+    </w:p>
+    <w:p>
+      <w:pPr>
+        <w:rPr>
+          <w:rFonts w:asciiTheme="majorHAnsi" w:hAnsiTheme="majorHAnsi" w:cstheme="majorHAnsi"/>
+          <w:sz w:val="24"/>
+          <w:szCs w:val="24"/>
+          <w:lang w:val="en-NZ"/>
+        </w:rPr>
+      </w:pPr>
+      <w:r>
+        <w:rPr>
+          <w:rFonts w:asciiTheme="majorHAnsi" w:hAnsiTheme="majorHAnsi" w:cstheme="majorHAnsi"/>
+          <w:sz w:val="24"/>
+          <w:szCs w:val="24"/>
+          <w:lang w:val="en-NZ"/>
+        </w:rPr>
+        <w:t>LO1 establishes that the students can plan their work session by analysing the current state of their work and determining clear goals to achieve during the session. WorkshopAR supports this strategy by linking the creation of the Room with the definition of a goal for the work session. It also helps by distributing the activity by associating current tasks with the profile of each participant.</w:t>
+      </w:r>
+    </w:p>
+    <w:p>
+      <w:pPr>
+        <w:rPr>
+          <w:rFonts w:asciiTheme="majorHAnsi" w:hAnsiTheme="majorHAnsi" w:cstheme="majorHAnsi"/>
+          <w:sz w:val="24"/>
+          <w:szCs w:val="24"/>
+          <w:lang w:val="en-NZ"/>
+        </w:rPr>
+      </w:pPr>
+      <w:r>
+        <w:rPr>
+          <w:rFonts w:asciiTheme="majorHAnsi" w:hAnsiTheme="majorHAnsi" w:cstheme="majorHAnsi"/>
+          <w:sz w:val="24"/>
+          <w:szCs w:val="24"/>
+          <w:lang w:val="en-NZ"/>
+        </w:rPr>
+        <w:t>Observations related to LO1 can go beyond just checking if the students are defining goals and tasks during the configuration or not</w:t>
+      </w:r>
+      <w:r>
+        <w:rPr>
+          <w:rFonts w:asciiTheme="majorHAnsi" w:hAnsiTheme="majorHAnsi" w:cstheme="majorHAnsi"/>
+          <w:sz w:val="24"/>
+          <w:szCs w:val="24"/>
+          <w:lang w:val="en-NZ"/>
+        </w:rPr>
+        <w:t>. It could be possible to check the level of detail applied to the definition of goals, like checking if the process was done just for the sake of doing it or if there was real though behind the activity, to check if the tasks were updated along the progress of the session or if similar analysis of the goals or progress of work was done outside WorkshopAR.</w:t>
+      </w:r>
+    </w:p>
+    <w:p>
+      <w:pPr>
+        <w:rPr>
+          <w:rFonts w:asciiTheme="majorHAnsi" w:hAnsiTheme="majorHAnsi" w:cstheme="majorHAnsi"/>
+          <w:sz w:val="24"/>
+          <w:szCs w:val="24"/>
+          <w:lang w:val="en-NZ"/>
+        </w:rPr>
+      </w:pPr>
+      <w:r>
+        <w:rPr>
+          <w:rFonts w:asciiTheme="majorHAnsi" w:hAnsiTheme="majorHAnsi" w:cstheme="majorHAnsi"/>
+          <w:sz w:val="24"/>
+          <w:szCs w:val="24"/>
+          <w:lang w:val="en-NZ"/>
+        </w:rPr>
+        <w:t>LO2 is related to the execution of effective collaboration and can be evidenced by using the criteria identified in literature and explained in section 2.1.4 and 2.1.5. It is of particular interest for this project and for the overall evaluation of WorkshopAR t</w:t>
+      </w:r>
+      <w:r>
+        <w:rPr>
+          <w:rFonts w:asciiTheme="majorHAnsi" w:hAnsiTheme="majorHAnsi" w:cstheme="majorHAnsi"/>
+          <w:sz w:val="24"/>
+          <w:szCs w:val="24"/>
+          <w:lang w:val="en-NZ"/>
+        </w:rPr>
+        <w:t>o</w:t>
+      </w:r>
+      <w:r>
+        <w:rPr>
+          <w:rFonts w:asciiTheme="majorHAnsi" w:hAnsiTheme="majorHAnsi" w:cstheme="majorHAnsi"/>
+          <w:sz w:val="24"/>
+          <w:szCs w:val="24"/>
+          <w:lang w:val="en-NZ"/>
+        </w:rPr>
+        <w:t xml:space="preserve"> see if any of the tools provided, specially those associated with the interaction with the play models and annotations, </w:t>
+      </w:r>
+      <w:r>
+        <w:rPr>
+          <w:rFonts w:asciiTheme="majorHAnsi" w:hAnsiTheme="majorHAnsi" w:cstheme="majorHAnsi"/>
+          <w:sz w:val="24"/>
+          <w:szCs w:val="24"/>
+          <w:lang w:val="en-NZ"/>
+        </w:rPr>
+        <w:t>help in creating the structures identified as useful for effective collaboration such as a free flow of information, accountability, quality assurance and mutual dependence for achievements.</w:t>
+      </w:r>
+    </w:p>
+    <w:p>
+      <w:pPr>
+        <w:rPr>
+          <w:rFonts w:asciiTheme="majorHAnsi" w:hAnsiTheme="majorHAnsi" w:cstheme="majorHAnsi"/>
+          <w:sz w:val="24"/>
+          <w:szCs w:val="24"/>
+          <w:lang w:val="en-NZ"/>
+        </w:rPr>
+      </w:pPr>
+      <w:r>
+        <w:rPr>
+          <w:rFonts w:asciiTheme="majorHAnsi" w:hAnsiTheme="majorHAnsi" w:cstheme="majorHAnsi"/>
+          <w:sz w:val="24"/>
+          <w:szCs w:val="24"/>
+          <w:lang w:val="en-NZ"/>
+        </w:rPr>
+        <w:t>For this learning objective it is also interesting to observe the types of collaboration being used by the students as described by Salmons (2019), and if WorkshopAR was promoting or helping in the development of a particular form of collaboration. In general, the digital space created by WorkshopAR would facilitate activities of co-creation, by allowing the testing and record of ideas for the architectural design, and also transfer activities, by offering visuals that can be used to explain concepts, decisions or design pro</w:t>
+      </w:r>
+      <w:r>
+        <w:rPr>
+          <w:rFonts w:asciiTheme="majorHAnsi" w:hAnsiTheme="majorHAnsi" w:cstheme="majorHAnsi"/>
+          <w:sz w:val="24"/>
+          <w:szCs w:val="24"/>
+          <w:lang w:val="en-NZ"/>
+        </w:rPr>
+        <w:t>posals</w:t>
+      </w:r>
+      <w:r>
+        <w:rPr>
+          <w:rFonts w:asciiTheme="majorHAnsi" w:hAnsiTheme="majorHAnsi" w:cstheme="majorHAnsi"/>
+          <w:sz w:val="24"/>
+          <w:szCs w:val="24"/>
+          <w:lang w:val="en-NZ"/>
+        </w:rPr>
+        <w:t>.</w:t>
+      </w:r>
+    </w:p>
+    <w:p>
+      <w:pPr>
+        <w:rPr>
+          <w:rFonts w:asciiTheme="majorHAnsi" w:hAnsiTheme="majorHAnsi" w:cstheme="majorHAnsi"/>
+          <w:sz w:val="24"/>
+          <w:szCs w:val="24"/>
+          <w:lang w:val="en-NZ"/>
+        </w:rPr>
+      </w:pPr>
+      <w:r>
+        <w:rPr>
+          <w:rFonts w:asciiTheme="majorHAnsi" w:hAnsiTheme="majorHAnsi" w:cstheme="majorHAnsi"/>
+          <w:sz w:val="24"/>
+          <w:szCs w:val="24"/>
+          <w:lang w:val="en-NZ"/>
+        </w:rPr>
+        <w:lastRenderedPageBreak/>
+        <w:t xml:space="preserve">LO3 keeps the idea of effective structures for collaboration </w:t>
+      </w:r>
+      <w:r>
+        <w:rPr>
+          <w:rFonts w:asciiTheme="majorHAnsi" w:hAnsiTheme="majorHAnsi" w:cstheme="majorHAnsi"/>
+          <w:sz w:val="24"/>
+          <w:szCs w:val="24"/>
+          <w:lang w:val="en-NZ"/>
+        </w:rPr>
+        <w:t xml:space="preserve">but focuses entirely on how the group manages internal and external communication. The debate features of WorkshopAR is the obvious implementation build specially to cover this learning objective, which at the same time helps the group to create an instance of dialogue, as defined by Salmons as the type of structured conversation that best </w:t>
+      </w:r>
+      <w:r>
+        <w:rPr>
+          <w:rFonts w:asciiTheme="majorHAnsi" w:hAnsiTheme="majorHAnsi" w:cstheme="majorHAnsi"/>
+          <w:sz w:val="24"/>
+          <w:szCs w:val="24"/>
+          <w:lang w:val="en-NZ"/>
+        </w:rPr>
+        <w:t>promotes</w:t>
+      </w:r>
+      <w:r>
+        <w:rPr>
+          <w:rFonts w:asciiTheme="majorHAnsi" w:hAnsiTheme="majorHAnsi" w:cstheme="majorHAnsi"/>
+          <w:sz w:val="24"/>
+          <w:szCs w:val="24"/>
+          <w:lang w:val="en-NZ"/>
+        </w:rPr>
+        <w:t xml:space="preserve"> and executes collaboration. Observations will also search for other aspects of the tool that promote conversation instead, the un</w:t>
+      </w:r>
+      <w:r>
+        <w:rPr>
+          <w:rFonts w:asciiTheme="majorHAnsi" w:hAnsiTheme="majorHAnsi" w:cstheme="majorHAnsi"/>
+          <w:sz w:val="24"/>
+          <w:szCs w:val="24"/>
+          <w:lang w:val="en-NZ"/>
+        </w:rPr>
+        <w:t>structured type of communication used more to foster relationships in the group.</w:t>
+      </w:r>
+    </w:p>
+    <w:p>
+      <w:pPr>
+        <w:rPr>
+          <w:rFonts w:asciiTheme="majorHAnsi" w:hAnsiTheme="majorHAnsi" w:cstheme="majorHAnsi"/>
+          <w:sz w:val="24"/>
+          <w:szCs w:val="24"/>
+          <w:lang w:val="en-NZ"/>
+        </w:rPr>
+      </w:pPr>
+      <w:r>
+        <w:rPr>
+          <w:rFonts w:asciiTheme="majorHAnsi" w:hAnsiTheme="majorHAnsi" w:cstheme="majorHAnsi"/>
+          <w:sz w:val="24"/>
+          <w:szCs w:val="24"/>
+          <w:lang w:val="en-NZ"/>
+        </w:rPr>
+        <w:t xml:space="preserve">Finally, LO4 evaluates how the group proposes and organizes structured review. WorkshopAR doe not dedicates one particular functionality to support this learning objective, relying more on the use of all the previously mentioned use cases to offer </w:t>
+      </w:r>
+      <w:r>
+        <w:rPr>
+          <w:rFonts w:asciiTheme="majorHAnsi" w:hAnsiTheme="majorHAnsi" w:cstheme="majorHAnsi"/>
+          <w:sz w:val="24"/>
+          <w:szCs w:val="24"/>
+          <w:lang w:val="en-NZ"/>
+        </w:rPr>
+        <w:t>a</w:t>
+      </w:r>
+      <w:r>
+        <w:rPr>
+          <w:rFonts w:asciiTheme="majorHAnsi" w:hAnsiTheme="majorHAnsi" w:cstheme="majorHAnsi"/>
+          <w:sz w:val="24"/>
+          <w:szCs w:val="24"/>
+          <w:lang w:val="en-NZ"/>
+        </w:rPr>
+        <w:t xml:space="preserve"> structured evaluation of a design proposal, of feedback received from the client or to organize the work needed to create the final reflection of the project.</w:t>
+      </w:r>
+    </w:p>
+    <w:p>
+      <w:pPr>
+        <w:rPr>
+          <w:rFonts w:asciiTheme="majorHAnsi" w:hAnsiTheme="majorHAnsi" w:cstheme="majorHAnsi"/>
+          <w:sz w:val="24"/>
+          <w:szCs w:val="24"/>
+          <w:lang w:val="en-NZ"/>
+        </w:rPr>
+      </w:pPr>
+      <w:r>
+        <w:rPr>
+          <w:rFonts w:asciiTheme="majorHAnsi" w:hAnsiTheme="majorHAnsi" w:cstheme="majorHAnsi"/>
+          <w:sz w:val="24"/>
+          <w:szCs w:val="24"/>
+          <w:lang w:val="en-NZ"/>
+        </w:rPr>
+        <w:t>The learning objectives of WorkshopAR were designed taking into consideration the design of Industry Project, and meant to help the students to tackle the course objective of constant communication and coordination of tasks. Figure 1 shows an ideal flow of activities during the development of a classroom session, which incorporates the main activities proposed in the course design (class housekeep, weekly workshops, open work sessions) with an idealized version of a work session that a group could perform while using WorkshopAR.</w:t>
+      </w:r>
     </w:p>
     <w:p>
       <w:pPr>
@@ -1283,23 +1465,35 @@
     <w:p>
       <w:pPr>
         <w:rPr>
-          <w:lang w:val="en-NZ"/>
-        </w:rPr>
-      </w:pPr>
-      <w:r>
-        <w:rPr>
+          <w:rFonts w:asciiTheme="majorHAnsi" w:hAnsiTheme="majorHAnsi" w:cstheme="majorHAnsi"/>
+          <w:sz w:val="24"/>
+          <w:szCs w:val="24"/>
+          <w:lang w:val="en-NZ"/>
+        </w:rPr>
+      </w:pPr>
+      <w:r>
+        <w:rPr>
+          <w:rFonts w:asciiTheme="majorHAnsi" w:hAnsiTheme="majorHAnsi" w:cstheme="majorHAnsi"/>
+          <w:sz w:val="24"/>
+          <w:szCs w:val="24"/>
           <w:lang w:val="en-NZ"/>
         </w:rPr>
         <w:t xml:space="preserve">The information gathering process for the development of the case study was conducted in three distinct stages with different set of objectives in mind. All three stages were meant to collect descriptive data about the development of the </w:t>
       </w:r>
       <w:r>
         <w:rPr>
+          <w:rFonts w:asciiTheme="majorHAnsi" w:hAnsiTheme="majorHAnsi" w:cstheme="majorHAnsi"/>
+          <w:sz w:val="24"/>
+          <w:szCs w:val="24"/>
           <w:lang w:val="en-NZ"/>
         </w:rPr>
         <w:t>course,</w:t>
       </w:r>
       <w:r>
         <w:rPr>
+          <w:rFonts w:asciiTheme="majorHAnsi" w:hAnsiTheme="majorHAnsi" w:cstheme="majorHAnsi"/>
+          <w:sz w:val="24"/>
+          <w:szCs w:val="24"/>
           <w:lang w:val="en-NZ"/>
         </w:rPr>
         <w:t xml:space="preserve"> either to create a better picture of the context in which the course was happening, to gather descriptive data about the progress of the project or to ask for more granular opinions from the students and the teaching staff, all these with the goal in mind of creating a rich recount of the course.</w:t>
@@ -1328,11 +1522,17 @@
     <w:p>
       <w:pPr>
         <w:rPr>
-          <w:lang w:val="en-NZ"/>
-        </w:rPr>
-      </w:pPr>
-      <w:r>
-        <w:rPr>
+          <w:rFonts w:asciiTheme="majorHAnsi" w:hAnsiTheme="majorHAnsi" w:cstheme="majorHAnsi"/>
+          <w:sz w:val="24"/>
+          <w:szCs w:val="24"/>
+          <w:lang w:val="en-NZ"/>
+        </w:rPr>
+      </w:pPr>
+      <w:r>
+        <w:rPr>
+          <w:rFonts w:asciiTheme="majorHAnsi" w:hAnsiTheme="majorHAnsi" w:cstheme="majorHAnsi"/>
+          <w:sz w:val="24"/>
+          <w:szCs w:val="24"/>
           <w:lang w:val="en-NZ"/>
         </w:rPr>
         <w:t>It was possible to access most of the written material available for the teaching staff and the students through the Learning Management System (LMS) supporting the course. The LMS was the primary communication method for the course, besides direct announcements ant the beginning of a session. Students would find all the basic information about the project and the different deliveries of the course in the LMS, and it became the main repository for the different forms and documentation needed for the coursework such as client repots, presentation formats and assessment rubrics. Information about the structure, learning goals and methodology of the course was also found here.</w:t>
@@ -1341,24 +1541,37 @@
     <w:p>
       <w:pPr>
         <w:rPr>
-          <w:lang w:val="en-NZ"/>
-        </w:rPr>
-      </w:pPr>
-      <w:r>
-        <w:rPr>
-          <w:lang w:val="en-NZ"/>
-        </w:rPr>
+          <w:rFonts w:asciiTheme="majorHAnsi" w:hAnsiTheme="majorHAnsi" w:cstheme="majorHAnsi"/>
+          <w:sz w:val="24"/>
+          <w:szCs w:val="24"/>
+          <w:lang w:val="en-NZ"/>
+        </w:rPr>
+      </w:pPr>
+      <w:r>
+        <w:rPr>
+          <w:rFonts w:asciiTheme="majorHAnsi" w:hAnsiTheme="majorHAnsi" w:cstheme="majorHAnsi"/>
+          <w:sz w:val="24"/>
+          <w:szCs w:val="24"/>
+          <w:lang w:val="en-NZ"/>
+        </w:rPr>
+        <w:lastRenderedPageBreak/>
         <w:t>This information was used mostly to build a good understanding of the objectives and background of the course, as well as to stablish a good idea of the work expected from the students for the development of the project and all the required deliveries, even when there was not that much familiarity of the researcher with the main subject of the course.</w:t>
       </w:r>
     </w:p>
     <w:p>
       <w:pPr>
         <w:rPr>
-          <w:lang w:val="en-NZ"/>
-        </w:rPr>
-      </w:pPr>
-      <w:r>
-        <w:rPr>
+          <w:rFonts w:asciiTheme="majorHAnsi" w:hAnsiTheme="majorHAnsi" w:cstheme="majorHAnsi"/>
+          <w:sz w:val="24"/>
+          <w:szCs w:val="24"/>
+          <w:lang w:val="en-NZ"/>
+        </w:rPr>
+      </w:pPr>
+      <w:r>
+        <w:rPr>
+          <w:rFonts w:asciiTheme="majorHAnsi" w:hAnsiTheme="majorHAnsi" w:cstheme="majorHAnsi"/>
+          <w:sz w:val="24"/>
+          <w:szCs w:val="24"/>
           <w:lang w:val="en-NZ"/>
         </w:rPr>
         <w:t>Although most of the assessment tools of the course consisted of oral presentations, a good amount of material had to be submitted through the LMS, either as its own assessment or as a complement to the oral presentations. A lot of this material consisted of individual work and allowed for an interesting analysis of how the students were organizing their work as part of the group activities as well as creating points of comparison between groups.</w:t>
@@ -1367,11 +1580,17 @@
     <w:p>
       <w:pPr>
         <w:rPr>
-          <w:lang w:val="en-NZ"/>
-        </w:rPr>
-      </w:pPr>
-      <w:r>
-        <w:rPr>
+          <w:rFonts w:asciiTheme="majorHAnsi" w:hAnsiTheme="majorHAnsi" w:cstheme="majorHAnsi"/>
+          <w:sz w:val="24"/>
+          <w:szCs w:val="24"/>
+          <w:lang w:val="en-NZ"/>
+        </w:rPr>
+      </w:pPr>
+      <w:r>
+        <w:rPr>
+          <w:rFonts w:asciiTheme="majorHAnsi" w:hAnsiTheme="majorHAnsi" w:cstheme="majorHAnsi"/>
+          <w:sz w:val="24"/>
+          <w:szCs w:val="24"/>
           <w:lang w:val="en-NZ"/>
         </w:rPr>
         <w:t>It was also possible to analyse the weekly report of the students to identify the development process followed by most groups as reported by the students, the general progress of the project and the most common issues reported, allowing for comparisons against what was being directly observed during the work sessions.</w:t>
@@ -1380,115 +1599,160 @@
     <w:p>
       <w:pPr>
         <w:rPr>
-          <w:lang w:val="en-NZ"/>
-        </w:rPr>
-      </w:pPr>
-      <w:r>
-        <w:rPr>
+          <w:rFonts w:asciiTheme="majorHAnsi" w:hAnsiTheme="majorHAnsi" w:cstheme="majorHAnsi"/>
+          <w:sz w:val="24"/>
+          <w:szCs w:val="24"/>
+          <w:lang w:val="en-NZ"/>
+        </w:rPr>
+      </w:pPr>
+      <w:r>
+        <w:rPr>
+          <w:rFonts w:asciiTheme="majorHAnsi" w:hAnsiTheme="majorHAnsi" w:cstheme="majorHAnsi"/>
+          <w:sz w:val="24"/>
+          <w:szCs w:val="24"/>
+          <w:lang w:val="en-NZ"/>
+        </w:rPr>
+        <w:t xml:space="preserve">Finally, the LMS portal also offered a discussion forum for the students meant to be the main communication medium between the students and the teaching staff outside the main “simulacrum” of the flow of information with the client. Activity here was almost non-existent </w:t>
+      </w:r>
+      <w:r>
+        <w:rPr>
+          <w:rFonts w:asciiTheme="majorHAnsi" w:hAnsiTheme="majorHAnsi" w:cstheme="majorHAnsi"/>
+          <w:sz w:val="24"/>
+          <w:szCs w:val="24"/>
+          <w:lang w:val="en-NZ"/>
+        </w:rPr>
+        <w:t>before</w:t>
+      </w:r>
+      <w:r>
+        <w:rPr>
+          <w:rFonts w:asciiTheme="majorHAnsi" w:hAnsiTheme="majorHAnsi" w:cstheme="majorHAnsi"/>
+          <w:sz w:val="24"/>
+          <w:szCs w:val="24"/>
+          <w:lang w:val="en-NZ"/>
+        </w:rPr>
+        <w:t xml:space="preserve"> the semester break, and students seldom used it after the adjustments to the course during the second semester. The following sections will detail this situation better, as it is an important point of analysis of the course and of the way technology is used in the classroom for communication.</w:t>
+      </w:r>
+    </w:p>
+    <w:p>
+      <w:pPr>
+        <w:pStyle w:val="Heading2"/>
+        <w:rPr>
+          <w:rFonts w:asciiTheme="majorHAnsi" w:hAnsiTheme="majorHAnsi" w:cstheme="majorHAnsi"/>
+          <w:sz w:val="24"/>
+          <w:szCs w:val="24"/>
+          <w:lang w:val="en-NZ"/>
+        </w:rPr>
+      </w:pPr>
+      <w:r>
+        <w:rPr>
+          <w:rFonts w:asciiTheme="majorHAnsi" w:hAnsiTheme="majorHAnsi" w:cstheme="majorHAnsi"/>
+          <w:sz w:val="24"/>
+          <w:szCs w:val="24"/>
+          <w:lang w:val="en-NZ"/>
+        </w:rPr>
+        <w:t>6.3.2 Classroom Observations</w:t>
+      </w:r>
+    </w:p>
+    <w:p>
+      <w:pPr>
+        <w:rPr>
+          <w:rFonts w:asciiTheme="majorHAnsi" w:hAnsiTheme="majorHAnsi" w:cstheme="majorHAnsi"/>
+          <w:sz w:val="24"/>
+          <w:szCs w:val="24"/>
+          <w:lang w:val="en-NZ"/>
+        </w:rPr>
+      </w:pPr>
+      <w:r>
+        <w:rPr>
+          <w:rFonts w:asciiTheme="majorHAnsi" w:hAnsiTheme="majorHAnsi" w:cstheme="majorHAnsi"/>
+          <w:sz w:val="24"/>
+          <w:szCs w:val="24"/>
+          <w:lang w:val="en-NZ"/>
+        </w:rPr>
+        <w:t>The main source of data for the development of the case study was the direct observation of work session of different groups along the development of the course during the weekly classroom meetings.</w:t>
+      </w:r>
+    </w:p>
+    <w:p>
+      <w:pPr>
+        <w:rPr>
+          <w:rFonts w:asciiTheme="majorHAnsi" w:hAnsiTheme="majorHAnsi" w:cstheme="majorHAnsi"/>
+          <w:sz w:val="24"/>
+          <w:szCs w:val="24"/>
+          <w:lang w:val="en-NZ"/>
+        </w:rPr>
+      </w:pPr>
+      <w:r>
+        <w:rPr>
+          <w:rFonts w:asciiTheme="majorHAnsi" w:hAnsiTheme="majorHAnsi" w:cstheme="majorHAnsi"/>
+          <w:sz w:val="24"/>
+          <w:szCs w:val="24"/>
+          <w:lang w:val="en-NZ"/>
+        </w:rPr>
+        <w:t>This is already a departure from the original methodology that proposed observations of the groups outside of the classroom. It was evident during the first weeks that the students were using mostly the classroom time for their groupwork, opting for individual work outside the classroom and for asynchronous communication with their teammates. This situation caused for some of the mechanisms of the observation to change and adapt to what the students where really doing but the general approach and goals for this stage were the same.</w:t>
+      </w:r>
+    </w:p>
+    <w:p>
+      <w:pPr>
+        <w:rPr>
+          <w:rFonts w:asciiTheme="majorHAnsi" w:hAnsiTheme="majorHAnsi" w:cstheme="majorHAnsi"/>
+          <w:sz w:val="24"/>
+          <w:szCs w:val="24"/>
+          <w:lang w:val="en-NZ"/>
+        </w:rPr>
+      </w:pPr>
+      <w:r>
+        <w:rPr>
+          <w:rFonts w:asciiTheme="majorHAnsi" w:hAnsiTheme="majorHAnsi" w:cstheme="majorHAnsi"/>
+          <w:sz w:val="24"/>
+          <w:szCs w:val="24"/>
+          <w:lang w:val="en-NZ"/>
+        </w:rPr>
+        <w:t>There were three main types of observations that composed most of the data collected. All types focused on describing in as much detail as possible the type and objectives of the activities being observed, the outstanding characteristics of the students participating and information about the background that was possible to collect. All observations were recorded using mostly the researcher’s personal notes, and video recordings when it was possible to do it without disrupting too much the classroom.</w:t>
+      </w:r>
+    </w:p>
+    <w:p>
+      <w:pPr>
+        <w:rPr>
+          <w:rFonts w:asciiTheme="majorHAnsi" w:hAnsiTheme="majorHAnsi" w:cstheme="majorHAnsi"/>
+          <w:sz w:val="24"/>
+          <w:szCs w:val="24"/>
+          <w:lang w:val="en-NZ"/>
+        </w:rPr>
+      </w:pPr>
+      <w:r>
+        <w:rPr>
+          <w:rFonts w:asciiTheme="majorHAnsi" w:hAnsiTheme="majorHAnsi" w:cstheme="majorHAnsi"/>
+          <w:sz w:val="24"/>
+          <w:szCs w:val="24"/>
           <w:lang w:val="en-NZ"/>
         </w:rPr>
         <w:lastRenderedPageBreak/>
-        <w:t xml:space="preserve">Finally, the LMS portal also offered a discussion forum for the students meant to be the main communication medium between the students and the teaching staff outside the main “simulacrum” of the flow of information with the client. Activity here was almost non-existent </w:t>
-      </w:r>
-      <w:r>
-        <w:rPr>
-          <w:lang w:val="en-NZ"/>
-        </w:rPr>
-        <w:t>before</w:t>
-      </w:r>
-      <w:r>
-        <w:rPr>
-          <w:lang w:val="en-NZ"/>
-        </w:rPr>
-        <w:t xml:space="preserve"> the semester break, and students seldom used it after the adjustments to the course during the second semester. The following sections will detail this situation better, as it is an important point of analysis of the course and of the way technology is used in the classroom for communication.</w:t>
-      </w:r>
-    </w:p>
-    <w:p>
-      <w:pPr>
-        <w:pStyle w:val="Heading2"/>
-        <w:rPr>
-          <w:rFonts w:asciiTheme="majorHAnsi" w:hAnsiTheme="majorHAnsi" w:cstheme="majorHAnsi"/>
-          <w:sz w:val="24"/>
-          <w:szCs w:val="24"/>
-          <w:lang w:val="en-NZ"/>
-        </w:rPr>
-      </w:pPr>
-      <w:r>
-        <w:rPr>
-          <w:rFonts w:asciiTheme="majorHAnsi" w:hAnsiTheme="majorHAnsi" w:cstheme="majorHAnsi"/>
-          <w:sz w:val="24"/>
-          <w:szCs w:val="24"/>
-          <w:lang w:val="en-NZ"/>
-        </w:rPr>
-        <w:t>6.3.2 Classroom Observations</w:t>
-      </w:r>
-    </w:p>
-    <w:p>
-      <w:pPr>
-        <w:rPr>
-          <w:lang w:val="en-NZ"/>
-        </w:rPr>
-      </w:pPr>
-      <w:r>
-        <w:rPr>
-          <w:lang w:val="en-NZ"/>
-        </w:rPr>
-        <w:t>The main source of data for the development of the case study was the direct observation of work session of different groups along the development of the course during the weekly classroom meetings.</w:t>
-      </w:r>
-    </w:p>
-    <w:p>
-      <w:pPr>
-        <w:rPr>
-          <w:lang w:val="en-NZ"/>
-        </w:rPr>
-      </w:pPr>
-      <w:r>
-        <w:rPr>
-          <w:lang w:val="en-NZ"/>
-        </w:rPr>
-        <w:t>This is already a departure from the original methodology that proposed observations of the groups outside of the classroom. It was evident during the first weeks that the students were using mostly the classroom time for their groupwork, opting for individual work outside the classroom and for asynchronous communication with their teammates. This situation caused for some of the mechanisms of the observation to change and adapt to what the students where really doing but the general approach and goals for this stage were the same.</w:t>
-      </w:r>
-    </w:p>
-    <w:p>
-      <w:pPr>
-        <w:rPr>
-          <w:lang w:val="en-NZ"/>
-        </w:rPr>
-      </w:pPr>
-      <w:r>
-        <w:rPr>
-          <w:lang w:val="en-NZ"/>
-        </w:rPr>
-        <w:t>There were three main types of observations that composed most of the data collected. All types focused on describing in as much detail as possible the type and objectives of the activities being observed, the outstanding characteristics of the students participating and information about the background that was possible to collect. All observations were recorded using mostly the researcher’s personal notes, and video recordings when it was possible to do it without disrupting too much the classroom.</w:t>
-      </w:r>
-    </w:p>
-    <w:p>
-      <w:pPr>
-        <w:rPr>
-          <w:lang w:val="en-NZ"/>
-        </w:rPr>
-      </w:pPr>
-      <w:r>
-        <w:rPr>
-          <w:lang w:val="en-NZ"/>
-        </w:rPr>
         <w:t>The first type of observations was of general activities for the whole classroom, guided normally by the teaching staff or by a guest speaker. These activities included all the students and were not directly related to group activities, although they often required the students to group based on their assigned roles.</w:t>
       </w:r>
     </w:p>
     <w:p>
       <w:pPr>
         <w:rPr>
-          <w:lang w:val="en-NZ"/>
-        </w:rPr>
-      </w:pPr>
-      <w:r>
-        <w:rPr>
+          <w:rFonts w:asciiTheme="majorHAnsi" w:hAnsiTheme="majorHAnsi" w:cstheme="majorHAnsi"/>
+          <w:sz w:val="24"/>
+          <w:szCs w:val="24"/>
+          <w:lang w:val="en-NZ"/>
+        </w:rPr>
+      </w:pPr>
+      <w:r>
+        <w:rPr>
+          <w:rFonts w:asciiTheme="majorHAnsi" w:hAnsiTheme="majorHAnsi" w:cstheme="majorHAnsi"/>
+          <w:sz w:val="24"/>
+          <w:szCs w:val="24"/>
           <w:lang w:val="en-NZ"/>
         </w:rPr>
         <w:t>These observations were useful for understanding the general structure and dynamics of the course, especially those relations between the teaching staff and the students since these activities often were used to deal with general questions from the students and to deal with the housekeeping of the course.</w:t>
       </w:r>
       <w:r>
         <w:rPr>
+          <w:rFonts w:asciiTheme="majorHAnsi" w:hAnsiTheme="majorHAnsi" w:cstheme="majorHAnsi"/>
+          <w:sz w:val="24"/>
+          <w:szCs w:val="24"/>
           <w:lang w:val="en-NZ"/>
         </w:rPr>
         <w:t xml:space="preserve"> These spaces were also used to hold several workshops for the students meant to give them different tools for activities related to project management, team dynamics and conflict resolution.</w:t>
@@ -1497,11 +1761,17 @@
     <w:p>
       <w:pPr>
         <w:rPr>
-          <w:lang w:val="en-NZ"/>
-        </w:rPr>
-      </w:pPr>
-      <w:r>
-        <w:rPr>
+          <w:rFonts w:asciiTheme="majorHAnsi" w:hAnsiTheme="majorHAnsi" w:cstheme="majorHAnsi"/>
+          <w:sz w:val="24"/>
+          <w:szCs w:val="24"/>
+          <w:lang w:val="en-NZ"/>
+        </w:rPr>
+      </w:pPr>
+      <w:r>
+        <w:rPr>
+          <w:rFonts w:asciiTheme="majorHAnsi" w:hAnsiTheme="majorHAnsi" w:cstheme="majorHAnsi"/>
+          <w:sz w:val="24"/>
+          <w:szCs w:val="24"/>
           <w:lang w:val="en-NZ"/>
         </w:rPr>
         <w:t>The initial categorization of themes for these observations was very general and consisted basically of:</w:t>
@@ -1515,11 +1785,17 @@
           <w:numId w:val="1"/>
         </w:numPr>
         <w:rPr>
-          <w:lang w:val="en-NZ"/>
-        </w:rPr>
-      </w:pPr>
-      <w:r>
-        <w:rPr>
+          <w:rFonts w:asciiTheme="majorHAnsi" w:hAnsiTheme="majorHAnsi" w:cstheme="majorHAnsi"/>
+          <w:sz w:val="24"/>
+          <w:szCs w:val="24"/>
+          <w:lang w:val="en-NZ"/>
+        </w:rPr>
+      </w:pPr>
+      <w:r>
+        <w:rPr>
+          <w:rFonts w:asciiTheme="majorHAnsi" w:hAnsiTheme="majorHAnsi" w:cstheme="majorHAnsi"/>
+          <w:sz w:val="24"/>
+          <w:szCs w:val="24"/>
           <w:lang w:val="en-NZ"/>
         </w:rPr>
         <w:t>Guidelines from the teaching staff to the students about teamwork and collaboration.</w:t>
@@ -1533,11 +1809,17 @@
           <w:numId w:val="1"/>
         </w:numPr>
         <w:rPr>
-          <w:lang w:val="en-NZ"/>
-        </w:rPr>
-      </w:pPr>
-      <w:r>
-        <w:rPr>
+          <w:rFonts w:asciiTheme="majorHAnsi" w:hAnsiTheme="majorHAnsi" w:cstheme="majorHAnsi"/>
+          <w:sz w:val="24"/>
+          <w:szCs w:val="24"/>
+          <w:lang w:val="en-NZ"/>
+        </w:rPr>
+      </w:pPr>
+      <w:r>
+        <w:rPr>
+          <w:rFonts w:asciiTheme="majorHAnsi" w:hAnsiTheme="majorHAnsi" w:cstheme="majorHAnsi"/>
+          <w:sz w:val="24"/>
+          <w:szCs w:val="24"/>
           <w:lang w:val="en-NZ"/>
         </w:rPr>
         <w:t>Feedback given to the students about an activity or a material produced for the project.</w:t>
@@ -1546,37 +1828,45 @@
     <w:p>
       <w:pPr>
         <w:rPr>
-          <w:lang w:val="en-NZ"/>
-        </w:rPr>
-      </w:pPr>
-      <w:r>
-        <w:rPr>
-          <w:lang w:val="en-NZ"/>
-        </w:rPr>
-        <w:t xml:space="preserve">These guidelines stablished that the main focus for the teaching staff during the observations was to identify and characterize the relationship created with the students. It was also used to identify how collaboration was being taught and enforced, and if there were </w:t>
-      </w:r>
-      <w:r>
-        <w:rPr>
-          <w:lang w:val="en-NZ"/>
-        </w:rPr>
-        <w:lastRenderedPageBreak/>
-        <w:t>any mediums in place to deal with or guide groups having issues with aspects of the team management requirements of the project.</w:t>
-      </w:r>
-    </w:p>
-    <w:p>
-      <w:pPr>
-        <w:rPr>
-          <w:lang w:val="en-NZ"/>
-        </w:rPr>
-      </w:pPr>
-      <w:r>
-        <w:rPr>
+          <w:rFonts w:asciiTheme="majorHAnsi" w:hAnsiTheme="majorHAnsi" w:cstheme="majorHAnsi"/>
+          <w:sz w:val="24"/>
+          <w:szCs w:val="24"/>
+          <w:lang w:val="en-NZ"/>
+        </w:rPr>
+      </w:pPr>
+      <w:r>
+        <w:rPr>
+          <w:rFonts w:asciiTheme="majorHAnsi" w:hAnsiTheme="majorHAnsi" w:cstheme="majorHAnsi"/>
+          <w:sz w:val="24"/>
+          <w:szCs w:val="24"/>
+          <w:lang w:val="en-NZ"/>
+        </w:rPr>
+        <w:t>These guidelines stablished that the main focus for the teaching staff during the observations was to identify and characterize the relationship created with the students. It was also used to identify how collaboration was being taught and enforced, and if there were any mediums in place to deal with or guide groups having issues with aspects of the team management requirements of the project.</w:t>
+      </w:r>
+    </w:p>
+    <w:p>
+      <w:pPr>
+        <w:rPr>
+          <w:rFonts w:asciiTheme="majorHAnsi" w:hAnsiTheme="majorHAnsi" w:cstheme="majorHAnsi"/>
+          <w:sz w:val="24"/>
+          <w:szCs w:val="24"/>
+          <w:lang w:val="en-NZ"/>
+        </w:rPr>
+      </w:pPr>
+      <w:r>
+        <w:rPr>
+          <w:rFonts w:asciiTheme="majorHAnsi" w:hAnsiTheme="majorHAnsi" w:cstheme="majorHAnsi"/>
+          <w:sz w:val="24"/>
+          <w:szCs w:val="24"/>
           <w:lang w:val="en-NZ"/>
         </w:rPr>
         <w:t xml:space="preserve">The second type of observations was of the general groupwork performed by the students. These work sessions often involved more than one group at a time and the main focus was on gathering information with minimal intervention, sometimes asking quick questions to clarify as </w:t>
       </w:r>
       <w:r>
         <w:rPr>
+          <w:rFonts w:asciiTheme="majorHAnsi" w:hAnsiTheme="majorHAnsi" w:cstheme="majorHAnsi"/>
+          <w:sz w:val="24"/>
+          <w:szCs w:val="24"/>
           <w:lang w:val="en-NZ"/>
         </w:rPr>
         <w:t>situation or get a better idea of the context.</w:t>
@@ -1585,11 +1875,17 @@
     <w:p>
       <w:pPr>
         <w:rPr>
-          <w:lang w:val="en-NZ"/>
-        </w:rPr>
-      </w:pPr>
-      <w:r>
-        <w:rPr>
+          <w:rFonts w:asciiTheme="majorHAnsi" w:hAnsiTheme="majorHAnsi" w:cstheme="majorHAnsi"/>
+          <w:sz w:val="24"/>
+          <w:szCs w:val="24"/>
+          <w:lang w:val="en-NZ"/>
+        </w:rPr>
+      </w:pPr>
+      <w:r>
+        <w:rPr>
+          <w:rFonts w:asciiTheme="majorHAnsi" w:hAnsiTheme="majorHAnsi" w:cstheme="majorHAnsi"/>
+          <w:sz w:val="24"/>
+          <w:szCs w:val="24"/>
           <w:lang w:val="en-NZ"/>
         </w:rPr>
         <w:t>These observations helped to understand the general dynamics of the groups, and the activities being completed for the project. They also constituted the “baseline” observations for those activities that were not using the AR tool, and became the main point of comparison with the other observations.</w:t>
@@ -1598,11 +1894,17 @@
     <w:p>
       <w:pPr>
         <w:rPr>
-          <w:lang w:val="en-NZ"/>
-        </w:rPr>
-      </w:pPr>
-      <w:r>
-        <w:rPr>
+          <w:rFonts w:asciiTheme="majorHAnsi" w:hAnsiTheme="majorHAnsi" w:cstheme="majorHAnsi"/>
+          <w:sz w:val="24"/>
+          <w:szCs w:val="24"/>
+          <w:lang w:val="en-NZ"/>
+        </w:rPr>
+      </w:pPr>
+      <w:r>
+        <w:rPr>
+          <w:rFonts w:asciiTheme="majorHAnsi" w:hAnsiTheme="majorHAnsi" w:cstheme="majorHAnsi"/>
+          <w:sz w:val="24"/>
+          <w:szCs w:val="24"/>
           <w:lang w:val="en-NZ"/>
         </w:rPr>
         <w:t>Initial categorization here was more varied. In one hand there was a group of themes searching for the collaborative strategies being used by students:</w:t>
@@ -1616,11 +1918,17 @@
           <w:numId w:val="2"/>
         </w:numPr>
         <w:rPr>
-          <w:lang w:val="en-NZ"/>
-        </w:rPr>
-      </w:pPr>
-      <w:r>
-        <w:rPr>
+          <w:rFonts w:asciiTheme="majorHAnsi" w:hAnsiTheme="majorHAnsi" w:cstheme="majorHAnsi"/>
+          <w:sz w:val="24"/>
+          <w:szCs w:val="24"/>
+          <w:lang w:val="en-NZ"/>
+        </w:rPr>
+      </w:pPr>
+      <w:r>
+        <w:rPr>
+          <w:rFonts w:asciiTheme="majorHAnsi" w:hAnsiTheme="majorHAnsi" w:cstheme="majorHAnsi"/>
+          <w:sz w:val="24"/>
+          <w:szCs w:val="24"/>
           <w:lang w:val="en-NZ"/>
         </w:rPr>
         <w:t>Activities and resources to organize and manage the team.</w:t>
@@ -1634,11 +1942,17 @@
           <w:numId w:val="2"/>
         </w:numPr>
         <w:rPr>
-          <w:lang w:val="en-NZ"/>
-        </w:rPr>
-      </w:pPr>
-      <w:r>
-        <w:rPr>
+          <w:rFonts w:asciiTheme="majorHAnsi" w:hAnsiTheme="majorHAnsi" w:cstheme="majorHAnsi"/>
+          <w:sz w:val="24"/>
+          <w:szCs w:val="24"/>
+          <w:lang w:val="en-NZ"/>
+        </w:rPr>
+      </w:pPr>
+      <w:r>
+        <w:rPr>
+          <w:rFonts w:asciiTheme="majorHAnsi" w:hAnsiTheme="majorHAnsi" w:cstheme="majorHAnsi"/>
+          <w:sz w:val="24"/>
+          <w:szCs w:val="24"/>
           <w:lang w:val="en-NZ"/>
         </w:rPr>
         <w:t>Recurrent roles (beside the project’s roles) and relationships being created among the students.</w:t>
@@ -1652,11 +1966,17 @@
           <w:numId w:val="2"/>
         </w:numPr>
         <w:rPr>
-          <w:lang w:val="en-NZ"/>
-        </w:rPr>
-      </w:pPr>
-      <w:r>
-        <w:rPr>
+          <w:rFonts w:asciiTheme="majorHAnsi" w:hAnsiTheme="majorHAnsi" w:cstheme="majorHAnsi"/>
+          <w:sz w:val="24"/>
+          <w:szCs w:val="24"/>
+          <w:lang w:val="en-NZ"/>
+        </w:rPr>
+      </w:pPr>
+      <w:r>
+        <w:rPr>
+          <w:rFonts w:asciiTheme="majorHAnsi" w:hAnsiTheme="majorHAnsi" w:cstheme="majorHAnsi"/>
+          <w:sz w:val="24"/>
+          <w:szCs w:val="24"/>
           <w:lang w:val="en-NZ"/>
         </w:rPr>
         <w:t>Mechanisms to take decisions and resolve conflicts.</w:t>
@@ -1665,13 +1985,20 @@
     <w:p>
       <w:pPr>
         <w:rPr>
-          <w:lang w:val="en-NZ"/>
-        </w:rPr>
-      </w:pPr>
-      <w:r>
-        <w:rPr>
-          <w:lang w:val="en-NZ"/>
-        </w:rPr>
+          <w:rFonts w:asciiTheme="majorHAnsi" w:hAnsiTheme="majorHAnsi" w:cstheme="majorHAnsi"/>
+          <w:sz w:val="24"/>
+          <w:szCs w:val="24"/>
+          <w:lang w:val="en-NZ"/>
+        </w:rPr>
+      </w:pPr>
+      <w:r>
+        <w:rPr>
+          <w:rFonts w:asciiTheme="majorHAnsi" w:hAnsiTheme="majorHAnsi" w:cstheme="majorHAnsi"/>
+          <w:sz w:val="24"/>
+          <w:szCs w:val="24"/>
+          <w:lang w:val="en-NZ"/>
+        </w:rPr>
+        <w:lastRenderedPageBreak/>
         <w:t>A second focus for the general observations was the use of technology and trying to identify tendencies about what activities were mediated or delegated to some digital tool:</w:t>
       </w:r>
     </w:p>
@@ -1683,11 +2010,17 @@
           <w:numId w:val="3"/>
         </w:numPr>
         <w:rPr>
-          <w:lang w:val="en-NZ"/>
-        </w:rPr>
-      </w:pPr>
-      <w:r>
-        <w:rPr>
+          <w:rFonts w:asciiTheme="majorHAnsi" w:hAnsiTheme="majorHAnsi" w:cstheme="majorHAnsi"/>
+          <w:sz w:val="24"/>
+          <w:szCs w:val="24"/>
+          <w:lang w:val="en-NZ"/>
+        </w:rPr>
+      </w:pPr>
+      <w:r>
+        <w:rPr>
+          <w:rFonts w:asciiTheme="majorHAnsi" w:hAnsiTheme="majorHAnsi" w:cstheme="majorHAnsi"/>
+          <w:sz w:val="24"/>
+          <w:szCs w:val="24"/>
           <w:lang w:val="en-NZ"/>
         </w:rPr>
         <w:t>Technologies used to produce content and fulfil learning objectives.</w:t>
@@ -1701,11 +2034,17 @@
           <w:numId w:val="3"/>
         </w:numPr>
         <w:rPr>
-          <w:lang w:val="en-NZ"/>
-        </w:rPr>
-      </w:pPr>
-      <w:r>
-        <w:rPr>
+          <w:rFonts w:asciiTheme="majorHAnsi" w:hAnsiTheme="majorHAnsi" w:cstheme="majorHAnsi"/>
+          <w:sz w:val="24"/>
+          <w:szCs w:val="24"/>
+          <w:lang w:val="en-NZ"/>
+        </w:rPr>
+      </w:pPr>
+      <w:r>
+        <w:rPr>
+          <w:rFonts w:asciiTheme="majorHAnsi" w:hAnsiTheme="majorHAnsi" w:cstheme="majorHAnsi"/>
+          <w:sz w:val="24"/>
+          <w:szCs w:val="24"/>
           <w:lang w:val="en-NZ"/>
         </w:rPr>
         <w:t>Technologies used to access and consume content to create and/or transmit knowledge.</w:t>
@@ -1719,11 +2058,17 @@
           <w:numId w:val="3"/>
         </w:numPr>
         <w:rPr>
-          <w:lang w:val="en-NZ"/>
-        </w:rPr>
-      </w:pPr>
-      <w:r>
-        <w:rPr>
+          <w:rFonts w:asciiTheme="majorHAnsi" w:hAnsiTheme="majorHAnsi" w:cstheme="majorHAnsi"/>
+          <w:sz w:val="24"/>
+          <w:szCs w:val="24"/>
+          <w:lang w:val="en-NZ"/>
+        </w:rPr>
+      </w:pPr>
+      <w:r>
+        <w:rPr>
+          <w:rFonts w:asciiTheme="majorHAnsi" w:hAnsiTheme="majorHAnsi" w:cstheme="majorHAnsi"/>
+          <w:sz w:val="24"/>
+          <w:szCs w:val="24"/>
           <w:lang w:val="en-NZ"/>
         </w:rPr>
         <w:t>Technologies used to mediate or facilitate communication and social relations.</w:t>
@@ -1732,11 +2077,17 @@
     <w:p>
       <w:pPr>
         <w:rPr>
-          <w:lang w:val="en-NZ"/>
-        </w:rPr>
-      </w:pPr>
-      <w:r>
-        <w:rPr>
+          <w:rFonts w:asciiTheme="majorHAnsi" w:hAnsiTheme="majorHAnsi" w:cstheme="majorHAnsi"/>
+          <w:sz w:val="24"/>
+          <w:szCs w:val="24"/>
+          <w:lang w:val="en-NZ"/>
+        </w:rPr>
+      </w:pPr>
+      <w:r>
+        <w:rPr>
+          <w:rFonts w:asciiTheme="majorHAnsi" w:hAnsiTheme="majorHAnsi" w:cstheme="majorHAnsi"/>
+          <w:sz w:val="24"/>
+          <w:szCs w:val="24"/>
           <w:lang w:val="en-NZ"/>
         </w:rPr>
         <w:t>The third and final type of observations were of the instances in which WorkshopAR was used in the activities of a group and if it was changing in some way previously observed behaviour or promoting new ones:</w:t>
@@ -1750,11 +2101,17 @@
           <w:numId w:val="4"/>
         </w:numPr>
         <w:rPr>
-          <w:lang w:val="en-NZ"/>
-        </w:rPr>
-      </w:pPr>
-      <w:r>
-        <w:rPr>
+          <w:rFonts w:asciiTheme="majorHAnsi" w:hAnsiTheme="majorHAnsi" w:cstheme="majorHAnsi"/>
+          <w:sz w:val="24"/>
+          <w:szCs w:val="24"/>
+          <w:lang w:val="en-NZ"/>
+        </w:rPr>
+      </w:pPr>
+      <w:r>
+        <w:rPr>
+          <w:rFonts w:asciiTheme="majorHAnsi" w:hAnsiTheme="majorHAnsi" w:cstheme="majorHAnsi"/>
+          <w:sz w:val="24"/>
+          <w:szCs w:val="24"/>
           <w:lang w:val="en-NZ"/>
         </w:rPr>
         <w:t>Instances in which a problem was solved using WorkshopAR.</w:t>
@@ -1768,11 +2125,17 @@
           <w:numId w:val="4"/>
         </w:numPr>
         <w:rPr>
-          <w:lang w:val="en-NZ"/>
-        </w:rPr>
-      </w:pPr>
-      <w:r>
-        <w:rPr>
+          <w:rFonts w:asciiTheme="majorHAnsi" w:hAnsiTheme="majorHAnsi" w:cstheme="majorHAnsi"/>
+          <w:sz w:val="24"/>
+          <w:szCs w:val="24"/>
+          <w:lang w:val="en-NZ"/>
+        </w:rPr>
+      </w:pPr>
+      <w:r>
+        <w:rPr>
+          <w:rFonts w:asciiTheme="majorHAnsi" w:hAnsiTheme="majorHAnsi" w:cstheme="majorHAnsi"/>
+          <w:sz w:val="24"/>
+          <w:szCs w:val="24"/>
           <w:lang w:val="en-NZ"/>
         </w:rPr>
         <w:t>Instances in which a problem was created because of the use of WorkshopAR.</w:t>
@@ -1786,11 +2149,17 @@
           <w:numId w:val="4"/>
         </w:numPr>
         <w:rPr>
-          <w:lang w:val="en-NZ"/>
-        </w:rPr>
-      </w:pPr>
-      <w:r>
-        <w:rPr>
+          <w:rFonts w:asciiTheme="majorHAnsi" w:hAnsiTheme="majorHAnsi" w:cstheme="majorHAnsi"/>
+          <w:sz w:val="24"/>
+          <w:szCs w:val="24"/>
+          <w:lang w:val="en-NZ"/>
+        </w:rPr>
+      </w:pPr>
+      <w:r>
+        <w:rPr>
+          <w:rFonts w:asciiTheme="majorHAnsi" w:hAnsiTheme="majorHAnsi" w:cstheme="majorHAnsi"/>
+          <w:sz w:val="24"/>
+          <w:szCs w:val="24"/>
           <w:lang w:val="en-NZ"/>
         </w:rPr>
         <w:t>Behaviours promoted by the use of WorkshopAR.</w:t>
@@ -1804,11 +2173,17 @@
           <w:numId w:val="4"/>
         </w:numPr>
         <w:rPr>
-          <w:lang w:val="en-NZ"/>
-        </w:rPr>
-      </w:pPr>
-      <w:r>
-        <w:rPr>
+          <w:rFonts w:asciiTheme="majorHAnsi" w:hAnsiTheme="majorHAnsi" w:cstheme="majorHAnsi"/>
+          <w:sz w:val="24"/>
+          <w:szCs w:val="24"/>
+          <w:lang w:val="en-NZ"/>
+        </w:rPr>
+      </w:pPr>
+      <w:r>
+        <w:rPr>
+          <w:rFonts w:asciiTheme="majorHAnsi" w:hAnsiTheme="majorHAnsi" w:cstheme="majorHAnsi"/>
+          <w:sz w:val="24"/>
+          <w:szCs w:val="24"/>
           <w:lang w:val="en-NZ"/>
         </w:rPr>
         <w:t>Social activities taking place within the digital space of WorkshopAR.</w:t>
@@ -1817,11 +2192,17 @@
     <w:p>
       <w:pPr>
         <w:rPr>
-          <w:lang w:val="en-NZ"/>
-        </w:rPr>
-      </w:pPr>
-      <w:r>
-        <w:rPr>
+          <w:rFonts w:asciiTheme="majorHAnsi" w:hAnsiTheme="majorHAnsi" w:cstheme="majorHAnsi"/>
+          <w:sz w:val="24"/>
+          <w:szCs w:val="24"/>
+          <w:lang w:val="en-NZ"/>
+        </w:rPr>
+      </w:pPr>
+      <w:r>
+        <w:rPr>
+          <w:rFonts w:asciiTheme="majorHAnsi" w:hAnsiTheme="majorHAnsi" w:cstheme="majorHAnsi"/>
+          <w:sz w:val="24"/>
+          <w:szCs w:val="24"/>
           <w:lang w:val="en-NZ"/>
         </w:rPr>
         <w:t>These observations were more guided, prompted mostly by the researcher, asking the students to explore one or two features from the software, asking for feedback and identifying instances in which the tool was used or mentioned without prompt.</w:t>
@@ -1850,81 +2231,187 @@
     <w:p>
       <w:pPr>
         <w:rPr>
-          <w:lang w:val="en-NZ"/>
-        </w:rPr>
-      </w:pPr>
-      <w:r>
-        <w:rPr>
-          <w:lang w:val="en-NZ"/>
-        </w:rPr>
-        <w:t xml:space="preserve">The final dataset comes from unstructured interviews performed to a sample of the students and of the teaching staff. Both interviews focused on gathering information about how participants saw collaboration as part of the development of the course. How do the feel about their own collaboration skills and how the course was helping them to develop or improve those </w:t>
-      </w:r>
-      <w:proofErr w:type="gramStart"/>
-      <w:r>
-        <w:rPr>
-          <w:lang w:val="en-NZ"/>
-        </w:rPr>
-        <w:t>skills.</w:t>
-      </w:r>
-      <w:proofErr w:type="gramEnd"/>
-      <w:r>
-        <w:rPr>
-          <w:lang w:val="en-NZ"/>
-        </w:rPr>
-        <w:t xml:space="preserve"> Annex 2 of this document shows the script used for each interview.</w:t>
-      </w:r>
-    </w:p>
-    <w:p>
-      <w:pPr>
-        <w:rPr>
-          <w:lang w:val="en-NZ"/>
-        </w:rPr>
-      </w:pPr>
-      <w:r>
-        <w:rPr>
+          <w:rFonts w:asciiTheme="majorHAnsi" w:hAnsiTheme="majorHAnsi" w:cstheme="majorHAnsi"/>
+          <w:sz w:val="24"/>
+          <w:szCs w:val="24"/>
+          <w:lang w:val="en-NZ"/>
+        </w:rPr>
+      </w:pPr>
+      <w:r>
+        <w:rPr>
+          <w:rFonts w:asciiTheme="majorHAnsi" w:hAnsiTheme="majorHAnsi" w:cstheme="majorHAnsi"/>
+          <w:sz w:val="24"/>
+          <w:szCs w:val="24"/>
+          <w:lang w:val="en-NZ"/>
+        </w:rPr>
+        <w:t>The final dataset comes from unstructured interviews performed to a sample of the students and of the teaching staff. Both interviews focused on gathering information about how participants saw collaboration as part of the development of the course. How do the feel about their own collaboration skills and how the course was helping them to develop or improve those skills. Annex 2 of this document shows the script used for each interview.</w:t>
+      </w:r>
+    </w:p>
+    <w:p>
+      <w:pPr>
+        <w:rPr>
+          <w:rFonts w:asciiTheme="majorHAnsi" w:hAnsiTheme="majorHAnsi" w:cstheme="majorHAnsi"/>
+          <w:sz w:val="24"/>
+          <w:szCs w:val="24"/>
+          <w:lang w:val="en-NZ"/>
+        </w:rPr>
+      </w:pPr>
+      <w:r>
+        <w:rPr>
+          <w:rFonts w:asciiTheme="majorHAnsi" w:hAnsiTheme="majorHAnsi" w:cstheme="majorHAnsi"/>
+          <w:sz w:val="24"/>
+          <w:szCs w:val="24"/>
+          <w:lang w:val="en-NZ"/>
+        </w:rPr>
+        <w:t>The interviews for the teaching staff were one-to-one conversations about what they perceived as effective collaboration and how did they evidence, if at all, those ideas in the work done by different groups in the course.</w:t>
+      </w:r>
+    </w:p>
+    <w:p>
+      <w:pPr>
+        <w:rPr>
+          <w:rFonts w:asciiTheme="majorHAnsi" w:hAnsiTheme="majorHAnsi" w:cstheme="majorHAnsi"/>
+          <w:sz w:val="24"/>
+          <w:szCs w:val="24"/>
+          <w:lang w:val="en-NZ"/>
+        </w:rPr>
+      </w:pPr>
+      <w:r>
+        <w:rPr>
+          <w:rFonts w:asciiTheme="majorHAnsi" w:hAnsiTheme="majorHAnsi" w:cstheme="majorHAnsi"/>
+          <w:sz w:val="24"/>
+          <w:szCs w:val="24"/>
+          <w:lang w:val="en-NZ"/>
+        </w:rPr>
+        <w:t>During these interviews it was also possible to gather information about the development of this cohort of the course, the challenges and complexities in managing the course and more personal opinions on the quality of the student’s work and what could be done to improve the course in general.</w:t>
+      </w:r>
+    </w:p>
+    <w:p>
+      <w:pPr>
+        <w:rPr>
+          <w:rFonts w:asciiTheme="majorHAnsi" w:hAnsiTheme="majorHAnsi" w:cstheme="majorHAnsi"/>
+          <w:sz w:val="24"/>
+          <w:szCs w:val="24"/>
+          <w:lang w:val="en-NZ"/>
+        </w:rPr>
+      </w:pPr>
+      <w:r>
+        <w:rPr>
+          <w:rFonts w:asciiTheme="majorHAnsi" w:hAnsiTheme="majorHAnsi" w:cstheme="majorHAnsi"/>
+          <w:sz w:val="24"/>
+          <w:szCs w:val="24"/>
+          <w:lang w:val="en-NZ"/>
+        </w:rPr>
+        <w:t>The interviews with students focused more on trying to reconstruct the team dynamics of those groups that was not possible to directly observe, asking questions about the different activities done to fulfil the requirements of the course, rules or decisions taken to manage the group and how effective did the students found those elements.</w:t>
+      </w:r>
+    </w:p>
+    <w:p>
+      <w:pPr>
+        <w:rPr>
+          <w:rFonts w:asciiTheme="majorHAnsi" w:hAnsiTheme="majorHAnsi" w:cstheme="majorHAnsi"/>
+          <w:sz w:val="24"/>
+          <w:szCs w:val="24"/>
+          <w:lang w:val="en-NZ"/>
+        </w:rPr>
+      </w:pPr>
+      <w:r>
+        <w:rPr>
+          <w:rFonts w:asciiTheme="majorHAnsi" w:hAnsiTheme="majorHAnsi" w:cstheme="majorHAnsi"/>
+          <w:sz w:val="24"/>
+          <w:szCs w:val="24"/>
+          <w:lang w:val="en-NZ"/>
+        </w:rPr>
+        <w:t>With the learning objectives of WorkshopAR detailed, clear mechanisms proposed for the students to fulfil those goals and t</w:t>
+      </w:r>
+      <w:r>
+        <w:rPr>
+          <w:rFonts w:asciiTheme="majorHAnsi" w:hAnsiTheme="majorHAnsi" w:cstheme="majorHAnsi"/>
+          <w:sz w:val="24"/>
+          <w:szCs w:val="24"/>
+          <w:lang w:val="en-NZ"/>
+        </w:rPr>
+        <w:t xml:space="preserve">he documentation of all </w:t>
+      </w:r>
+      <w:r>
+        <w:rPr>
+          <w:rFonts w:asciiTheme="majorHAnsi" w:hAnsiTheme="majorHAnsi" w:cstheme="majorHAnsi"/>
+          <w:sz w:val="24"/>
+          <w:szCs w:val="24"/>
+          <w:lang w:val="en-NZ"/>
+        </w:rPr>
+        <w:t>the types</w:t>
+      </w:r>
+      <w:r>
+        <w:rPr>
+          <w:rFonts w:asciiTheme="majorHAnsi" w:hAnsiTheme="majorHAnsi" w:cstheme="majorHAnsi"/>
+          <w:sz w:val="24"/>
+          <w:szCs w:val="24"/>
+          <w:lang w:val="en-NZ"/>
+        </w:rPr>
+        <w:t xml:space="preserve"> of observations</w:t>
+      </w:r>
+      <w:r>
+        <w:rPr>
+          <w:rFonts w:asciiTheme="majorHAnsi" w:hAnsiTheme="majorHAnsi" w:cstheme="majorHAnsi"/>
+          <w:sz w:val="24"/>
+          <w:szCs w:val="24"/>
+          <w:lang w:val="en-NZ"/>
+        </w:rPr>
+        <w:t xml:space="preserve"> </w:t>
+      </w:r>
+      <w:r>
+        <w:rPr>
+          <w:rFonts w:asciiTheme="majorHAnsi" w:hAnsiTheme="majorHAnsi" w:cstheme="majorHAnsi"/>
+          <w:sz w:val="24"/>
+          <w:szCs w:val="24"/>
           <w:lang w:val="en-NZ"/>
         </w:rPr>
         <w:lastRenderedPageBreak/>
-        <w:t>The interviews for the teaching staff were one-to-one conversations about what they perceived as effective collaboration and how did they evidence, if at all, those ideas in the work done by different groups in the course.</w:t>
-      </w:r>
-    </w:p>
-    <w:p>
-      <w:pPr>
-        <w:rPr>
-          <w:lang w:val="en-NZ"/>
-        </w:rPr>
-      </w:pPr>
-      <w:r>
-        <w:rPr>
-          <w:lang w:val="en-NZ"/>
-        </w:rPr>
-        <w:t>During these interviews it was also possible to gather information about the development of this cohort of the course, the challenges and complexities in managing the course and more personal opinions on the quality of the student’s work and what could be done to improve the course in general.</w:t>
-      </w:r>
-    </w:p>
-    <w:p>
-      <w:pPr>
-        <w:rPr>
-          <w:lang w:val="en-NZ"/>
-        </w:rPr>
-      </w:pPr>
-      <w:r>
-        <w:rPr>
-          <w:lang w:val="en-NZ"/>
-        </w:rPr>
-        <w:t>The interviews with students focused more on trying to reconstruct the team dynamics of those groups that was not possible to directly observe, asking questions about the different activities done to fulfil the requirements of the course, rules or decisions taken to manage the group and how effective did the students found those elements.</w:t>
-      </w:r>
-    </w:p>
-    <w:p>
-      <w:pPr>
-        <w:rPr>
-          <w:lang w:val="en-NZ"/>
-        </w:rPr>
-      </w:pPr>
-      <w:r>
-        <w:rPr>
-          <w:lang w:val="en-NZ"/>
-        </w:rPr>
-        <w:t>The documentation of all three types of observations, plus the analysis, categorization and organization of the information found and registered help to create the recount and analysis that will be shown in the following sections.</w:t>
+        <w:t>proposed</w:t>
+      </w:r>
+      <w:r>
+        <w:rPr>
+          <w:rFonts w:asciiTheme="majorHAnsi" w:hAnsiTheme="majorHAnsi" w:cstheme="majorHAnsi"/>
+          <w:sz w:val="24"/>
+          <w:szCs w:val="24"/>
+          <w:lang w:val="en-NZ"/>
+        </w:rPr>
+        <w:t xml:space="preserve">, </w:t>
+      </w:r>
+      <w:r>
+        <w:rPr>
+          <w:rFonts w:asciiTheme="majorHAnsi" w:hAnsiTheme="majorHAnsi" w:cstheme="majorHAnsi"/>
+          <w:sz w:val="24"/>
+          <w:szCs w:val="24"/>
+          <w:lang w:val="en-NZ"/>
+        </w:rPr>
+        <w:t>it is possible now to</w:t>
+      </w:r>
+      <w:r>
+        <w:rPr>
+          <w:rFonts w:asciiTheme="majorHAnsi" w:hAnsiTheme="majorHAnsi" w:cstheme="majorHAnsi"/>
+          <w:sz w:val="24"/>
+          <w:szCs w:val="24"/>
+          <w:lang w:val="en-NZ"/>
+        </w:rPr>
+        <w:t xml:space="preserve"> create the recount and analysis </w:t>
+      </w:r>
+      <w:r>
+        <w:rPr>
+          <w:rFonts w:asciiTheme="majorHAnsi" w:hAnsiTheme="majorHAnsi" w:cstheme="majorHAnsi"/>
+          <w:sz w:val="24"/>
+          <w:szCs w:val="24"/>
+          <w:lang w:val="en-NZ"/>
+        </w:rPr>
+        <w:t>of the execution of the Industry Project course</w:t>
+      </w:r>
+      <w:r>
+        <w:rPr>
+          <w:rFonts w:asciiTheme="majorHAnsi" w:hAnsiTheme="majorHAnsi" w:cstheme="majorHAnsi"/>
+          <w:sz w:val="24"/>
+          <w:szCs w:val="24"/>
+          <w:lang w:val="en-NZ"/>
+        </w:rPr>
+        <w:t>.</w:t>
       </w:r>
     </w:p>
     <w:p>

</xml_diff>

<commit_message>
working on c6 week 1 draft
</commit_message>
<xml_diff>
--- a/Draft/6 Case Study.docx
+++ b/Draft/6 Case Study.docx
@@ -642,7 +642,27 @@
           <w:szCs w:val="24"/>
           <w:lang w:val="en-NZ"/>
         </w:rPr>
-        <w:t>Cultural, economical and social factors of the zone where the terrain was located.</w:t>
+        <w:t xml:space="preserve">Cultural, </w:t>
+      </w:r>
+      <w:proofErr w:type="spellStart"/>
+      <w:r>
+        <w:rPr>
+          <w:rFonts w:asciiTheme="majorHAnsi" w:hAnsiTheme="majorHAnsi" w:cstheme="majorHAnsi"/>
+          <w:sz w:val="24"/>
+          <w:szCs w:val="24"/>
+          <w:lang w:val="en-NZ"/>
+        </w:rPr>
+        <w:t>economical</w:t>
+      </w:r>
+      <w:proofErr w:type="spellEnd"/>
+      <w:r>
+        <w:rPr>
+          <w:rFonts w:asciiTheme="majorHAnsi" w:hAnsiTheme="majorHAnsi" w:cstheme="majorHAnsi"/>
+          <w:sz w:val="24"/>
+          <w:szCs w:val="24"/>
+          <w:lang w:val="en-NZ"/>
+        </w:rPr>
+        <w:t xml:space="preserve"> and social factors of the zone where the terrain was located.</w:t>
       </w:r>
     </w:p>
     <w:p>
@@ -805,7 +825,47 @@
           <w:lang w:val="en-NZ"/>
         </w:rPr>
         <w:lastRenderedPageBreak/>
-        <w:t>Assessment of the course is completely individual. Deliverables and the whole solution proposal to the project are build as a group, but each student presents at the end his own oral presentation and final client report to be marked. The main assessment tools are the oral presentations and the final client report. The presentations consist on short 5-minute presentations about the overall proposal of the group for the project, the current state of development and the personal contributions of the students n the construction of that proposal. There were two oral presentations along the course, one focused on the architectural design and the other on the final proposal.</w:t>
+        <w:t xml:space="preserve">Assessment of the course is completely individual. Deliverables and the whole solution proposal to the project are </w:t>
+      </w:r>
+      <w:proofErr w:type="spellStart"/>
+      <w:r>
+        <w:rPr>
+          <w:rFonts w:asciiTheme="majorHAnsi" w:hAnsiTheme="majorHAnsi" w:cstheme="majorHAnsi"/>
+          <w:sz w:val="24"/>
+          <w:szCs w:val="24"/>
+          <w:lang w:val="en-NZ"/>
+        </w:rPr>
+        <w:t>build</w:t>
+      </w:r>
+      <w:proofErr w:type="spellEnd"/>
+      <w:r>
+        <w:rPr>
+          <w:rFonts w:asciiTheme="majorHAnsi" w:hAnsiTheme="majorHAnsi" w:cstheme="majorHAnsi"/>
+          <w:sz w:val="24"/>
+          <w:szCs w:val="24"/>
+          <w:lang w:val="en-NZ"/>
+        </w:rPr>
+        <w:t xml:space="preserve"> as a group, but each student presents at the end his own oral presentation and final client report to be marked. The main assessment tools are the oral presentations and the final client report. The presentations consist on short 5-minute presentations about the overall proposal of the group for the project, the current state of development and the personal contributions of the students </w:t>
+      </w:r>
+      <w:proofErr w:type="spellStart"/>
+      <w:r>
+        <w:rPr>
+          <w:rFonts w:asciiTheme="majorHAnsi" w:hAnsiTheme="majorHAnsi" w:cstheme="majorHAnsi"/>
+          <w:sz w:val="24"/>
+          <w:szCs w:val="24"/>
+          <w:lang w:val="en-NZ"/>
+        </w:rPr>
+        <w:t>n</w:t>
+      </w:r>
+      <w:proofErr w:type="spellEnd"/>
+      <w:r>
+        <w:rPr>
+          <w:rFonts w:asciiTheme="majorHAnsi" w:hAnsiTheme="majorHAnsi" w:cstheme="majorHAnsi"/>
+          <w:sz w:val="24"/>
+          <w:szCs w:val="24"/>
+          <w:lang w:val="en-NZ"/>
+        </w:rPr>
+        <w:t xml:space="preserve"> the construction of that proposal. There were two oral presentations along the course, one focused on the architectural design and the other on the final proposal.</w:t>
       </w:r>
     </w:p>
     <w:p>
@@ -1263,7 +1323,27 @@
           <w:szCs w:val="24"/>
           <w:lang w:val="en-NZ"/>
         </w:rPr>
-        <w:t xml:space="preserve"> see if any of the tools provided, specially those associated with the interaction with the play models and annotations, </w:t>
+        <w:t xml:space="preserve"> see if any of the tools provided, </w:t>
+      </w:r>
+      <w:proofErr w:type="spellStart"/>
+      <w:r>
+        <w:rPr>
+          <w:rFonts w:asciiTheme="majorHAnsi" w:hAnsiTheme="majorHAnsi" w:cstheme="majorHAnsi"/>
+          <w:sz w:val="24"/>
+          <w:szCs w:val="24"/>
+          <w:lang w:val="en-NZ"/>
+        </w:rPr>
+        <w:t>specially</w:t>
+      </w:r>
+      <w:proofErr w:type="spellEnd"/>
+      <w:r>
+        <w:rPr>
+          <w:rFonts w:asciiTheme="majorHAnsi" w:hAnsiTheme="majorHAnsi" w:cstheme="majorHAnsi"/>
+          <w:sz w:val="24"/>
+          <w:szCs w:val="24"/>
+          <w:lang w:val="en-NZ"/>
+        </w:rPr>
+        <w:t xml:space="preserve"> those associated with the interaction with the play models and annotations, </w:t>
       </w:r>
       <w:r>
         <w:rPr>
@@ -1291,25 +1371,7 @@
           <w:szCs w:val="24"/>
           <w:lang w:val="en-NZ"/>
         </w:rPr>
-        <w:t>For this learning objective it is also interesting to observe the types of collaboration being used by the students as described by Salmons (2019), and if WorkshopAR was promoting or helping in the development of a particular form of collaboration. In general, the digital space created by WorkshopAR would facilitate activities of co-creation, by allowing the testing and record of ideas for the architectural design, and also transfer activities, by offering visuals that can be used to explain concepts, decisions or design pro</w:t>
-      </w:r>
-      <w:r>
-        <w:rPr>
-          <w:rFonts w:asciiTheme="majorHAnsi" w:hAnsiTheme="majorHAnsi" w:cstheme="majorHAnsi"/>
-          <w:sz w:val="24"/>
-          <w:szCs w:val="24"/>
-          <w:lang w:val="en-NZ"/>
-        </w:rPr>
-        <w:t>posals</w:t>
-      </w:r>
-      <w:r>
-        <w:rPr>
-          <w:rFonts w:asciiTheme="majorHAnsi" w:hAnsiTheme="majorHAnsi" w:cstheme="majorHAnsi"/>
-          <w:sz w:val="24"/>
-          <w:szCs w:val="24"/>
-          <w:lang w:val="en-NZ"/>
-        </w:rPr>
-        <w:t>.</w:t>
+        <w:t>For this learning objective it is also interesting to observe the types of collaboration being used by the students as described by Salmons (2019), and if WorkshopAR was promoting or helping in the development of a particular form of collaboration. In general, the digital space created by WorkshopAR would facilitate activities of co-creation, by allowing the testing and record of ideas for the architectural design, and also transfer activities, by offering visuals that can be used to explain concepts, decisions or design proposals.</w:t>
       </w:r>
     </w:p>
     <w:p>
@@ -1384,7 +1446,27 @@
           <w:szCs w:val="24"/>
           <w:lang w:val="en-NZ"/>
         </w:rPr>
-        <w:t xml:space="preserve">Finally, LO4 evaluates how the group proposes and organizes structured review. WorkshopAR doe not dedicates one particular functionality to support this learning objective, relying more on the use of all the previously mentioned use cases to offer </w:t>
+        <w:t xml:space="preserve">Finally, LO4 evaluates how the group proposes and organizes structured review. WorkshopAR </w:t>
+      </w:r>
+      <w:proofErr w:type="spellStart"/>
+      <w:r>
+        <w:rPr>
+          <w:rFonts w:asciiTheme="majorHAnsi" w:hAnsiTheme="majorHAnsi" w:cstheme="majorHAnsi"/>
+          <w:sz w:val="24"/>
+          <w:szCs w:val="24"/>
+          <w:lang w:val="en-NZ"/>
+        </w:rPr>
+        <w:t>doe</w:t>
+      </w:r>
+      <w:proofErr w:type="spellEnd"/>
+      <w:r>
+        <w:rPr>
+          <w:rFonts w:asciiTheme="majorHAnsi" w:hAnsiTheme="majorHAnsi" w:cstheme="majorHAnsi"/>
+          <w:sz w:val="24"/>
+          <w:szCs w:val="24"/>
+          <w:lang w:val="en-NZ"/>
+        </w:rPr>
+        <w:t xml:space="preserve"> not dedicates one particular functionality to support this learning objective, relying more on the use of all the previously mentioned use cases to offer </w:t>
       </w:r>
       <w:r>
         <w:rPr>
@@ -1426,6 +1508,435 @@
     </w:p>
     <w:p>
       <w:pPr>
+        <w:keepNext/>
+        <w:rPr>
+          <w:lang w:val="en-NZ"/>
+        </w:rPr>
+      </w:pPr>
+      <w:r>
+        <w:rPr>
+          <w:noProof/>
+          <w:lang w:val="en-NZ"/>
+        </w:rPr>
+        <w:drawing>
+          <wp:inline distT="0" distB="0" distL="0" distR="0" wp14:anchorId="2151F946" wp14:editId="0A32E472">
+            <wp:extent cx="5733415" cy="3406140"/>
+            <wp:effectExtent l="0" t="0" r="635" b="3810"/>
+            <wp:docPr id="1" name="Picture 1"/>
+            <wp:cNvGraphicFramePr>
+              <a:graphicFrameLocks xmlns:a="http://schemas.openxmlformats.org/drawingml/2006/main" noChangeAspect="1"/>
+            </wp:cNvGraphicFramePr>
+            <a:graphic xmlns:a="http://schemas.openxmlformats.org/drawingml/2006/main">
+              <a:graphicData uri="http://schemas.openxmlformats.org/drawingml/2006/picture">
+                <pic:pic xmlns:pic="http://schemas.openxmlformats.org/drawingml/2006/picture">
+                  <pic:nvPicPr>
+                    <pic:cNvPr id="0" name="Picture 1"/>
+                    <pic:cNvPicPr>
+                      <a:picLocks noChangeAspect="1" noChangeArrowheads="1"/>
+                    </pic:cNvPicPr>
+                  </pic:nvPicPr>
+                  <pic:blipFill>
+                    <a:blip r:embed="rId5">
+                      <a:extLst>
+                        <a:ext uri="{28A0092B-C50C-407E-A947-70E740481C1C}">
+                          <a14:useLocalDpi xmlns:a14="http://schemas.microsoft.com/office/drawing/2010/main" val="0"/>
+                        </a:ext>
+                      </a:extLst>
+                    </a:blip>
+                    <a:srcRect/>
+                    <a:stretch>
+                      <a:fillRect/>
+                    </a:stretch>
+                  </pic:blipFill>
+                  <pic:spPr bwMode="auto">
+                    <a:xfrm>
+                      <a:off x="0" y="0"/>
+                      <a:ext cx="5733415" cy="3406140"/>
+                    </a:xfrm>
+                    <a:prstGeom prst="rect">
+                      <a:avLst/>
+                    </a:prstGeom>
+                    <a:noFill/>
+                    <a:ln>
+                      <a:noFill/>
+                    </a:ln>
+                  </pic:spPr>
+                </pic:pic>
+              </a:graphicData>
+            </a:graphic>
+          </wp:inline>
+        </w:drawing>
+      </w:r>
+    </w:p>
+    <w:p>
+      <w:pPr>
+        <w:pStyle w:val="Caption"/>
+        <w:jc w:val="center"/>
+        <w:rPr>
+          <w:lang w:val="en-NZ"/>
+        </w:rPr>
+      </w:pPr>
+      <w:r>
+        <w:rPr>
+          <w:lang w:val="en-NZ"/>
+        </w:rPr>
+        <w:t xml:space="preserve">Figure </w:t>
+      </w:r>
+      <w:r>
+        <w:rPr>
+          <w:lang w:val="en-NZ"/>
+        </w:rPr>
+        <w:fldChar w:fldCharType="begin"/>
+      </w:r>
+      <w:r>
+        <w:rPr>
+          <w:lang w:val="en-NZ"/>
+        </w:rPr>
+        <w:instrText xml:space="preserve"> SEQ Figure \* ARABIC </w:instrText>
+      </w:r>
+      <w:r>
+        <w:rPr>
+          <w:lang w:val="en-NZ"/>
+        </w:rPr>
+        <w:fldChar w:fldCharType="separate"/>
+      </w:r>
+      <w:r>
+        <w:rPr>
+          <w:noProof/>
+          <w:lang w:val="en-NZ"/>
+        </w:rPr>
+        <w:t>1</w:t>
+      </w:r>
+      <w:r>
+        <w:rPr>
+          <w:lang w:val="en-NZ"/>
+        </w:rPr>
+        <w:fldChar w:fldCharType="end"/>
+      </w:r>
+      <w:r>
+        <w:rPr>
+          <w:lang w:val="en-NZ"/>
+        </w:rPr>
+        <w:t xml:space="preserve"> Flow of Activities in a Classroom Session</w:t>
+      </w:r>
+    </w:p>
+    <w:p>
+      <w:pPr>
+        <w:rPr>
+          <w:rFonts w:asciiTheme="majorHAnsi" w:hAnsiTheme="majorHAnsi" w:cstheme="majorHAnsi"/>
+          <w:sz w:val="24"/>
+          <w:szCs w:val="24"/>
+          <w:lang w:val="en-NZ"/>
+        </w:rPr>
+      </w:pPr>
+      <w:r>
+        <w:rPr>
+          <w:rFonts w:asciiTheme="majorHAnsi" w:hAnsiTheme="majorHAnsi" w:cstheme="majorHAnsi"/>
+          <w:sz w:val="24"/>
+          <w:szCs w:val="24"/>
+          <w:lang w:val="en-NZ"/>
+        </w:rPr>
+        <w:lastRenderedPageBreak/>
+        <w:t>This learning design is also informed by other aspects found in the literature about effective collaborative learning and the approaches taken by other projects in similar context. Section 2.1.4 details some important barriers that impede a good flow of collaboration in the classroom. Two of the ideas mentioned resonated the most with the characteristics found in the Industry Project course:</w:t>
+      </w:r>
+    </w:p>
+    <w:p>
+      <w:pPr>
+        <w:pStyle w:val="ListParagraph"/>
+        <w:numPr>
+          <w:ilvl w:val="0"/>
+          <w:numId w:val="9"/>
+        </w:numPr>
+        <w:rPr>
+          <w:rFonts w:asciiTheme="majorHAnsi" w:hAnsiTheme="majorHAnsi" w:cstheme="majorHAnsi"/>
+          <w:sz w:val="24"/>
+          <w:szCs w:val="24"/>
+          <w:lang w:val="en-NZ"/>
+        </w:rPr>
+      </w:pPr>
+      <w:r>
+        <w:rPr>
+          <w:rFonts w:asciiTheme="majorHAnsi" w:hAnsiTheme="majorHAnsi" w:cstheme="majorHAnsi"/>
+          <w:sz w:val="24"/>
+          <w:szCs w:val="24"/>
+          <w:lang w:val="en-NZ"/>
+        </w:rPr>
+        <w:t>Power imbalance among the members of a group</w:t>
+      </w:r>
+    </w:p>
+    <w:p>
+      <w:pPr>
+        <w:pStyle w:val="ListParagraph"/>
+        <w:numPr>
+          <w:ilvl w:val="0"/>
+          <w:numId w:val="9"/>
+        </w:numPr>
+        <w:rPr>
+          <w:rFonts w:asciiTheme="majorHAnsi" w:hAnsiTheme="majorHAnsi" w:cstheme="majorHAnsi"/>
+          <w:sz w:val="24"/>
+          <w:szCs w:val="24"/>
+          <w:lang w:val="en-NZ"/>
+        </w:rPr>
+      </w:pPr>
+      <w:r>
+        <w:rPr>
+          <w:rFonts w:asciiTheme="majorHAnsi" w:hAnsiTheme="majorHAnsi" w:cstheme="majorHAnsi"/>
+          <w:sz w:val="24"/>
+          <w:szCs w:val="24"/>
+          <w:lang w:val="en-NZ"/>
+        </w:rPr>
+        <w:t>Difficulties transferring knowledge between students</w:t>
+      </w:r>
+    </w:p>
+    <w:p>
+      <w:pPr>
+        <w:rPr>
+          <w:rFonts w:asciiTheme="majorHAnsi" w:hAnsiTheme="majorHAnsi" w:cstheme="majorHAnsi"/>
+          <w:sz w:val="24"/>
+          <w:szCs w:val="24"/>
+          <w:lang w:val="en-NZ"/>
+        </w:rPr>
+      </w:pPr>
+      <w:r>
+        <w:rPr>
+          <w:rFonts w:asciiTheme="majorHAnsi" w:hAnsiTheme="majorHAnsi" w:cstheme="majorHAnsi"/>
+          <w:sz w:val="24"/>
+          <w:szCs w:val="24"/>
+          <w:lang w:val="en-NZ"/>
+        </w:rPr>
+        <w:t>Issues of power imbalance are inherent to any social activity (</w:t>
+      </w:r>
+      <w:proofErr w:type="spellStart"/>
+      <w:r>
+        <w:rPr>
+          <w:rFonts w:asciiTheme="majorHAnsi" w:hAnsiTheme="majorHAnsi" w:cstheme="majorHAnsi"/>
+          <w:sz w:val="24"/>
+          <w:szCs w:val="24"/>
+          <w:lang w:val="en-NZ"/>
+        </w:rPr>
+        <w:t>Essabar</w:t>
+      </w:r>
+      <w:proofErr w:type="spellEnd"/>
+      <w:r>
+        <w:rPr>
+          <w:rFonts w:asciiTheme="majorHAnsi" w:hAnsiTheme="majorHAnsi" w:cstheme="majorHAnsi"/>
+          <w:sz w:val="24"/>
+          <w:szCs w:val="24"/>
+          <w:lang w:val="en-NZ"/>
+        </w:rPr>
+        <w:t xml:space="preserve"> et. </w:t>
+      </w:r>
+      <w:r>
+        <w:rPr>
+          <w:rFonts w:asciiTheme="majorHAnsi" w:hAnsiTheme="majorHAnsi" w:cstheme="majorHAnsi"/>
+          <w:sz w:val="24"/>
+          <w:szCs w:val="24"/>
+          <w:lang w:val="en-NZ"/>
+        </w:rPr>
+        <w:t>a</w:t>
+      </w:r>
+      <w:r>
+        <w:rPr>
+          <w:rFonts w:asciiTheme="majorHAnsi" w:hAnsiTheme="majorHAnsi" w:cstheme="majorHAnsi"/>
+          <w:sz w:val="24"/>
+          <w:szCs w:val="24"/>
+          <w:lang w:val="en-NZ"/>
+        </w:rPr>
+        <w:t xml:space="preserve">l, 2016), but it was identified </w:t>
+      </w:r>
+      <w:r>
+        <w:rPr>
+          <w:rFonts w:asciiTheme="majorHAnsi" w:hAnsiTheme="majorHAnsi" w:cstheme="majorHAnsi"/>
+          <w:sz w:val="24"/>
+          <w:szCs w:val="24"/>
+          <w:lang w:val="en-NZ"/>
+        </w:rPr>
+        <w:t>that the role structure proposed for the project could promote substantial differences in the work done by every student and the relationships created inside the groups. In the same way, WorkshopAR proposes a very structured approach to collaboration, encouraging the students to assign roles and distribute tasks according to what have been discussed. A central objective of the observation process will be to identify positive and negative behaviours derived from this design implementation, and course correct the implementation of the software if needed.</w:t>
+      </w:r>
+    </w:p>
+    <w:p>
+      <w:pPr>
+        <w:rPr>
+          <w:rFonts w:asciiTheme="majorHAnsi" w:hAnsiTheme="majorHAnsi" w:cstheme="majorHAnsi"/>
+          <w:sz w:val="24"/>
+          <w:szCs w:val="24"/>
+          <w:lang w:val="en-NZ"/>
+        </w:rPr>
+      </w:pPr>
+      <w:r>
+        <w:rPr>
+          <w:rFonts w:asciiTheme="majorHAnsi" w:hAnsiTheme="majorHAnsi" w:cstheme="majorHAnsi"/>
+          <w:sz w:val="24"/>
+          <w:szCs w:val="24"/>
+          <w:lang w:val="en-NZ"/>
+        </w:rPr>
+        <w:t xml:space="preserve">Knowledge flow in project-based approaches is also an issue that have been discussed in the past </w:t>
+      </w:r>
+      <w:r>
+        <w:rPr>
+          <w:rFonts w:asciiTheme="majorHAnsi" w:hAnsiTheme="majorHAnsi" w:cstheme="majorHAnsi"/>
+          <w:sz w:val="24"/>
+          <w:szCs w:val="24"/>
+          <w:lang w:val="en-NZ"/>
+        </w:rPr>
+        <w:t>(</w:t>
+      </w:r>
+      <w:proofErr w:type="spellStart"/>
+      <w:r>
+        <w:rPr>
+          <w:rFonts w:asciiTheme="majorHAnsi" w:hAnsiTheme="majorHAnsi" w:cstheme="majorHAnsi"/>
+          <w:sz w:val="24"/>
+          <w:szCs w:val="24"/>
+          <w:lang w:val="en-NZ"/>
+        </w:rPr>
+        <w:t>Kogtikov</w:t>
+      </w:r>
+      <w:proofErr w:type="spellEnd"/>
+      <w:r>
+        <w:rPr>
+          <w:rFonts w:asciiTheme="majorHAnsi" w:hAnsiTheme="majorHAnsi" w:cstheme="majorHAnsi"/>
+          <w:sz w:val="24"/>
+          <w:szCs w:val="24"/>
+          <w:lang w:val="en-NZ"/>
+        </w:rPr>
+        <w:t xml:space="preserve"> et al., 2016</w:t>
+      </w:r>
+      <w:r>
+        <w:rPr>
+          <w:rFonts w:asciiTheme="majorHAnsi" w:hAnsiTheme="majorHAnsi" w:cstheme="majorHAnsi"/>
+          <w:sz w:val="24"/>
+          <w:szCs w:val="24"/>
+          <w:lang w:val="en-NZ"/>
+        </w:rPr>
+        <w:t xml:space="preserve"> and </w:t>
+      </w:r>
+      <w:proofErr w:type="spellStart"/>
+      <w:r>
+        <w:rPr>
+          <w:rFonts w:asciiTheme="majorHAnsi" w:hAnsiTheme="majorHAnsi" w:cstheme="majorHAnsi"/>
+          <w:sz w:val="24"/>
+          <w:szCs w:val="24"/>
+          <w:lang w:val="en-NZ"/>
+        </w:rPr>
+        <w:t>Granado-Alcón</w:t>
+      </w:r>
+      <w:proofErr w:type="spellEnd"/>
+      <w:r>
+        <w:rPr>
+          <w:rFonts w:asciiTheme="majorHAnsi" w:hAnsiTheme="majorHAnsi" w:cstheme="majorHAnsi"/>
+          <w:sz w:val="24"/>
+          <w:szCs w:val="24"/>
+          <w:lang w:val="en-NZ"/>
+        </w:rPr>
+        <w:t xml:space="preserve"> et al., 2020</w:t>
+      </w:r>
+      <w:r>
+        <w:rPr>
+          <w:rFonts w:asciiTheme="majorHAnsi" w:hAnsiTheme="majorHAnsi" w:cstheme="majorHAnsi"/>
+          <w:sz w:val="24"/>
+          <w:szCs w:val="24"/>
+          <w:lang w:val="en-NZ"/>
+        </w:rPr>
+        <w:t xml:space="preserve"> and </w:t>
+      </w:r>
+      <w:proofErr w:type="spellStart"/>
+      <w:r>
+        <w:rPr>
+          <w:rFonts w:asciiTheme="majorHAnsi" w:hAnsiTheme="majorHAnsi" w:cstheme="majorHAnsi"/>
+          <w:sz w:val="24"/>
+          <w:szCs w:val="24"/>
+          <w:lang w:val="en-NZ"/>
+        </w:rPr>
+        <w:t>Shpeizer</w:t>
+      </w:r>
+      <w:proofErr w:type="spellEnd"/>
+      <w:r>
+        <w:rPr>
+          <w:rFonts w:asciiTheme="majorHAnsi" w:hAnsiTheme="majorHAnsi" w:cstheme="majorHAnsi"/>
+          <w:sz w:val="24"/>
+          <w:szCs w:val="24"/>
+          <w:lang w:val="en-NZ"/>
+        </w:rPr>
+        <w:t>, 2019)</w:t>
+      </w:r>
+      <w:r>
+        <w:rPr>
+          <w:rFonts w:asciiTheme="majorHAnsi" w:hAnsiTheme="majorHAnsi" w:cstheme="majorHAnsi"/>
+          <w:sz w:val="24"/>
+          <w:szCs w:val="24"/>
+          <w:lang w:val="en-NZ"/>
+        </w:rPr>
+        <w:t xml:space="preserve">. A possible barrier for any group in the curse could be to have issues </w:t>
+      </w:r>
+      <w:r>
+        <w:rPr>
+          <w:rFonts w:asciiTheme="majorHAnsi" w:hAnsiTheme="majorHAnsi" w:cstheme="majorHAnsi"/>
+          <w:sz w:val="24"/>
+          <w:szCs w:val="24"/>
+          <w:lang w:val="en-NZ"/>
+        </w:rPr>
+        <w:t>communicating and transferring knowledge between the members of the group, considering that every role in the group has a distinct set of abilities and approaches the project in a slightly different way, yet the project needs a coherent and unified proposal from the group. Workshop can act in this situation as a facilitator for the transference of knowledge, helping in the communication process by offering visual tools to better coney ideas, using the space and context of the work to facilitate conversation and serving as a visual repository of the ideas and decisions discussed among the group members.</w:t>
+      </w:r>
+    </w:p>
+    <w:p>
+      <w:pPr>
+        <w:rPr>
+          <w:rFonts w:asciiTheme="majorHAnsi" w:hAnsiTheme="majorHAnsi" w:cstheme="majorHAnsi"/>
+          <w:sz w:val="24"/>
+          <w:szCs w:val="24"/>
+          <w:lang w:val="en-NZ"/>
+        </w:rPr>
+      </w:pPr>
+      <w:r>
+        <w:rPr>
+          <w:rFonts w:asciiTheme="majorHAnsi" w:hAnsiTheme="majorHAnsi" w:cstheme="majorHAnsi"/>
+          <w:sz w:val="24"/>
+          <w:szCs w:val="24"/>
+          <w:lang w:val="en-NZ"/>
+        </w:rPr>
+        <w:t>A final design consideration is the integration of the CoP framework in the design of WorkshopAR. As discussed in section 2.1.2, it is detrimental for a CoP to force its development, and effectives communities thrive when formed naturally and providing the resources needed to grow. It has been proposed that a CoP in the classroom is better represented in the effort done by the students themselves to organize and work towards the learning objectives. Due to the nature of this project-based course, it is possible that some of the characteristics of a CoP like instances of peripheral learning and a culture of self-reflection can be observed in the students, and WorkshopAR can be used in these circumstances</w:t>
+      </w:r>
+      <w:r>
+        <w:rPr>
+          <w:rFonts w:asciiTheme="majorHAnsi" w:hAnsiTheme="majorHAnsi" w:cstheme="majorHAnsi"/>
+          <w:sz w:val="24"/>
+          <w:szCs w:val="24"/>
+          <w:lang w:val="en-NZ"/>
+        </w:rPr>
+        <w:t xml:space="preserve"> as part of the knowledge that the community is creating, as a medium to transfer that knowledge or as a facilitator for the communication process of the community.</w:t>
+      </w:r>
+    </w:p>
+    <w:p>
+      <w:pPr>
+        <w:rPr>
+          <w:rFonts w:asciiTheme="majorHAnsi" w:hAnsiTheme="majorHAnsi" w:cstheme="majorHAnsi"/>
+          <w:sz w:val="24"/>
+          <w:szCs w:val="24"/>
+          <w:lang w:val="en-NZ"/>
+        </w:rPr>
+      </w:pPr>
+    </w:p>
+    <w:p>
+      <w:pPr>
+        <w:rPr>
+          <w:rFonts w:asciiTheme="majorHAnsi" w:hAnsiTheme="majorHAnsi" w:cstheme="majorHAnsi"/>
+          <w:sz w:val="24"/>
+          <w:szCs w:val="24"/>
+          <w:lang w:val="en-NZ"/>
+        </w:rPr>
+      </w:pPr>
+      <w:r>
+        <w:rPr>
+          <w:rFonts w:asciiTheme="majorHAnsi" w:hAnsiTheme="majorHAnsi" w:cstheme="majorHAnsi"/>
+          <w:sz w:val="24"/>
+          <w:szCs w:val="24"/>
+          <w:lang w:val="en-NZ"/>
+        </w:rPr>
+        <w:t xml:space="preserve"> </w:t>
+      </w:r>
+    </w:p>
+    <w:p>
+      <w:pPr>
         <w:pStyle w:val="Heading1"/>
         <w:rPr>
           <w:rFonts w:asciiTheme="majorHAnsi" w:hAnsiTheme="majorHAnsi" w:cstheme="majorHAnsi"/>
@@ -1441,6 +1952,7 @@
           <w:szCs w:val="24"/>
           <w:lang w:val="en-NZ"/>
         </w:rPr>
+        <w:lastRenderedPageBreak/>
         <w:t xml:space="preserve">6.3 </w:t>
       </w:r>
       <w:r>
@@ -1554,102 +2066,102 @@
           <w:szCs w:val="24"/>
           <w:lang w:val="en-NZ"/>
         </w:rPr>
+        <w:t>This information was used mostly to build a good understanding of the objectives and background of the course, as well as to stablish a good idea of the work expected from the students for the development of the project and all the required deliveries, even when there was not that much familiarity of the researcher with the main subject of the course.</w:t>
+      </w:r>
+    </w:p>
+    <w:p>
+      <w:pPr>
+        <w:rPr>
+          <w:rFonts w:asciiTheme="majorHAnsi" w:hAnsiTheme="majorHAnsi" w:cstheme="majorHAnsi"/>
+          <w:sz w:val="24"/>
+          <w:szCs w:val="24"/>
+          <w:lang w:val="en-NZ"/>
+        </w:rPr>
+      </w:pPr>
+      <w:r>
+        <w:rPr>
+          <w:rFonts w:asciiTheme="majorHAnsi" w:hAnsiTheme="majorHAnsi" w:cstheme="majorHAnsi"/>
+          <w:sz w:val="24"/>
+          <w:szCs w:val="24"/>
+          <w:lang w:val="en-NZ"/>
+        </w:rPr>
+        <w:t>Although most of the assessment tools of the course consisted of oral presentations, a good amount of material had to be submitted through the LMS, either as its own assessment or as a complement to the oral presentations. A lot of this material consisted of individual work and allowed for an interesting analysis of how the students were organizing their work as part of the group activities as well as creating points of comparison between groups.</w:t>
+      </w:r>
+    </w:p>
+    <w:p>
+      <w:pPr>
+        <w:rPr>
+          <w:rFonts w:asciiTheme="majorHAnsi" w:hAnsiTheme="majorHAnsi" w:cstheme="majorHAnsi"/>
+          <w:sz w:val="24"/>
+          <w:szCs w:val="24"/>
+          <w:lang w:val="en-NZ"/>
+        </w:rPr>
+      </w:pPr>
+      <w:r>
+        <w:rPr>
+          <w:rFonts w:asciiTheme="majorHAnsi" w:hAnsiTheme="majorHAnsi" w:cstheme="majorHAnsi"/>
+          <w:sz w:val="24"/>
+          <w:szCs w:val="24"/>
+          <w:lang w:val="en-NZ"/>
+        </w:rPr>
+        <w:t>It was also possible to analyse the weekly report of the students to identify the development process followed by most groups as reported by the students, the general progress of the project and the most common issues reported, allowing for comparisons against what was being directly observed during the work sessions.</w:t>
+      </w:r>
+    </w:p>
+    <w:p>
+      <w:pPr>
+        <w:rPr>
+          <w:rFonts w:asciiTheme="majorHAnsi" w:hAnsiTheme="majorHAnsi" w:cstheme="majorHAnsi"/>
+          <w:sz w:val="24"/>
+          <w:szCs w:val="24"/>
+          <w:lang w:val="en-NZ"/>
+        </w:rPr>
+      </w:pPr>
+      <w:r>
+        <w:rPr>
+          <w:rFonts w:asciiTheme="majorHAnsi" w:hAnsiTheme="majorHAnsi" w:cstheme="majorHAnsi"/>
+          <w:sz w:val="24"/>
+          <w:szCs w:val="24"/>
+          <w:lang w:val="en-NZ"/>
+        </w:rPr>
+        <w:t xml:space="preserve">Finally, the LMS portal also offered a discussion forum for the students meant to be the main communication medium between the students and the teaching staff outside the main “simulacrum” of the flow of information with the client. Activity here was almost non-existent </w:t>
+      </w:r>
+      <w:r>
+        <w:rPr>
+          <w:rFonts w:asciiTheme="majorHAnsi" w:hAnsiTheme="majorHAnsi" w:cstheme="majorHAnsi"/>
+          <w:sz w:val="24"/>
+          <w:szCs w:val="24"/>
+          <w:lang w:val="en-NZ"/>
+        </w:rPr>
+        <w:t>before</w:t>
+      </w:r>
+      <w:r>
+        <w:rPr>
+          <w:rFonts w:asciiTheme="majorHAnsi" w:hAnsiTheme="majorHAnsi" w:cstheme="majorHAnsi"/>
+          <w:sz w:val="24"/>
+          <w:szCs w:val="24"/>
+          <w:lang w:val="en-NZ"/>
+        </w:rPr>
+        <w:t xml:space="preserve"> the semester break, and students seldom used it after the adjustments to the course during the second semester. The following sections will detail this situation better, as it is an important point of analysis of the course and of the way technology is used in the classroom for communication.</w:t>
+      </w:r>
+    </w:p>
+    <w:p>
+      <w:pPr>
+        <w:pStyle w:val="Heading2"/>
+        <w:rPr>
+          <w:rFonts w:asciiTheme="majorHAnsi" w:hAnsiTheme="majorHAnsi" w:cstheme="majorHAnsi"/>
+          <w:sz w:val="24"/>
+          <w:szCs w:val="24"/>
+          <w:lang w:val="en-NZ"/>
+        </w:rPr>
+      </w:pPr>
+      <w:r>
+        <w:rPr>
+          <w:rFonts w:asciiTheme="majorHAnsi" w:hAnsiTheme="majorHAnsi" w:cstheme="majorHAnsi"/>
+          <w:sz w:val="24"/>
+          <w:szCs w:val="24"/>
+          <w:lang w:val="en-NZ"/>
+        </w:rPr>
         <w:lastRenderedPageBreak/>
-        <w:t>This information was used mostly to build a good understanding of the objectives and background of the course, as well as to stablish a good idea of the work expected from the students for the development of the project and all the required deliveries, even when there was not that much familiarity of the researcher with the main subject of the course.</w:t>
-      </w:r>
-    </w:p>
-    <w:p>
-      <w:pPr>
-        <w:rPr>
-          <w:rFonts w:asciiTheme="majorHAnsi" w:hAnsiTheme="majorHAnsi" w:cstheme="majorHAnsi"/>
-          <w:sz w:val="24"/>
-          <w:szCs w:val="24"/>
-          <w:lang w:val="en-NZ"/>
-        </w:rPr>
-      </w:pPr>
-      <w:r>
-        <w:rPr>
-          <w:rFonts w:asciiTheme="majorHAnsi" w:hAnsiTheme="majorHAnsi" w:cstheme="majorHAnsi"/>
-          <w:sz w:val="24"/>
-          <w:szCs w:val="24"/>
-          <w:lang w:val="en-NZ"/>
-        </w:rPr>
-        <w:t>Although most of the assessment tools of the course consisted of oral presentations, a good amount of material had to be submitted through the LMS, either as its own assessment or as a complement to the oral presentations. A lot of this material consisted of individual work and allowed for an interesting analysis of how the students were organizing their work as part of the group activities as well as creating points of comparison between groups.</w:t>
-      </w:r>
-    </w:p>
-    <w:p>
-      <w:pPr>
-        <w:rPr>
-          <w:rFonts w:asciiTheme="majorHAnsi" w:hAnsiTheme="majorHAnsi" w:cstheme="majorHAnsi"/>
-          <w:sz w:val="24"/>
-          <w:szCs w:val="24"/>
-          <w:lang w:val="en-NZ"/>
-        </w:rPr>
-      </w:pPr>
-      <w:r>
-        <w:rPr>
-          <w:rFonts w:asciiTheme="majorHAnsi" w:hAnsiTheme="majorHAnsi" w:cstheme="majorHAnsi"/>
-          <w:sz w:val="24"/>
-          <w:szCs w:val="24"/>
-          <w:lang w:val="en-NZ"/>
-        </w:rPr>
-        <w:t>It was also possible to analyse the weekly report of the students to identify the development process followed by most groups as reported by the students, the general progress of the project and the most common issues reported, allowing for comparisons against what was being directly observed during the work sessions.</w:t>
-      </w:r>
-    </w:p>
-    <w:p>
-      <w:pPr>
-        <w:rPr>
-          <w:rFonts w:asciiTheme="majorHAnsi" w:hAnsiTheme="majorHAnsi" w:cstheme="majorHAnsi"/>
-          <w:sz w:val="24"/>
-          <w:szCs w:val="24"/>
-          <w:lang w:val="en-NZ"/>
-        </w:rPr>
-      </w:pPr>
-      <w:r>
-        <w:rPr>
-          <w:rFonts w:asciiTheme="majorHAnsi" w:hAnsiTheme="majorHAnsi" w:cstheme="majorHAnsi"/>
-          <w:sz w:val="24"/>
-          <w:szCs w:val="24"/>
-          <w:lang w:val="en-NZ"/>
-        </w:rPr>
-        <w:t xml:space="preserve">Finally, the LMS portal also offered a discussion forum for the students meant to be the main communication medium between the students and the teaching staff outside the main “simulacrum” of the flow of information with the client. Activity here was almost non-existent </w:t>
-      </w:r>
-      <w:r>
-        <w:rPr>
-          <w:rFonts w:asciiTheme="majorHAnsi" w:hAnsiTheme="majorHAnsi" w:cstheme="majorHAnsi"/>
-          <w:sz w:val="24"/>
-          <w:szCs w:val="24"/>
-          <w:lang w:val="en-NZ"/>
-        </w:rPr>
-        <w:t>before</w:t>
-      </w:r>
-      <w:r>
-        <w:rPr>
-          <w:rFonts w:asciiTheme="majorHAnsi" w:hAnsiTheme="majorHAnsi" w:cstheme="majorHAnsi"/>
-          <w:sz w:val="24"/>
-          <w:szCs w:val="24"/>
-          <w:lang w:val="en-NZ"/>
-        </w:rPr>
-        <w:t xml:space="preserve"> the semester break, and students seldom used it after the adjustments to the course during the second semester. The following sections will detail this situation better, as it is an important point of analysis of the course and of the way technology is used in the classroom for communication.</w:t>
-      </w:r>
-    </w:p>
-    <w:p>
-      <w:pPr>
-        <w:pStyle w:val="Heading2"/>
-        <w:rPr>
-          <w:rFonts w:asciiTheme="majorHAnsi" w:hAnsiTheme="majorHAnsi" w:cstheme="majorHAnsi"/>
-          <w:sz w:val="24"/>
-          <w:szCs w:val="24"/>
-          <w:lang w:val="en-NZ"/>
-        </w:rPr>
-      </w:pPr>
-      <w:r>
-        <w:rPr>
-          <w:rFonts w:asciiTheme="majorHAnsi" w:hAnsiTheme="majorHAnsi" w:cstheme="majorHAnsi"/>
-          <w:sz w:val="24"/>
-          <w:szCs w:val="24"/>
-          <w:lang w:val="en-NZ"/>
-        </w:rPr>
         <w:t>6.3.2 Classroom Observations</w:t>
       </w:r>
     </w:p>
@@ -1726,7 +2238,6 @@
           <w:szCs w:val="24"/>
           <w:lang w:val="en-NZ"/>
         </w:rPr>
-        <w:lastRenderedPageBreak/>
         <w:t>The first type of observations was of general activities for the whole classroom, guided normally by the teaching staff or by a guest speaker. These activities included all the students and were not directly related to group activities, although they often required the students to group based on their assigned roles.</w:t>
       </w:r>
     </w:p>
@@ -1841,7 +2352,17 @@
           <w:szCs w:val="24"/>
           <w:lang w:val="en-NZ"/>
         </w:rPr>
-        <w:t>These guidelines stablished that the main focus for the teaching staff during the observations was to identify and characterize the relationship created with the students. It was also used to identify how collaboration was being taught and enforced, and if there were any mediums in place to deal with or guide groups having issues with aspects of the team management requirements of the project.</w:t>
+        <w:t xml:space="preserve">These guidelines stablished that the main focus for the teaching staff during the observations was to identify and characterize the relationship created with the students. It was also used to identify how collaboration was being taught and enforced, and if there </w:t>
+      </w:r>
+      <w:r>
+        <w:rPr>
+          <w:rFonts w:asciiTheme="majorHAnsi" w:hAnsiTheme="majorHAnsi" w:cstheme="majorHAnsi"/>
+          <w:sz w:val="24"/>
+          <w:szCs w:val="24"/>
+          <w:lang w:val="en-NZ"/>
+        </w:rPr>
+        <w:lastRenderedPageBreak/>
+        <w:t>were any mediums in place to deal with or guide groups having issues with aspects of the team management requirements of the project.</w:t>
       </w:r>
     </w:p>
     <w:p>
@@ -1998,7 +2519,6 @@
           <w:szCs w:val="24"/>
           <w:lang w:val="en-NZ"/>
         </w:rPr>
-        <w:lastRenderedPageBreak/>
         <w:t>A second focus for the general observations was the use of technology and trying to identify tendencies about what activities were mediated or delegated to some digital tool:</w:t>
       </w:r>
     </w:p>
@@ -2225,6 +2745,7 @@
           <w:szCs w:val="24"/>
           <w:lang w:val="en-NZ"/>
         </w:rPr>
+        <w:lastRenderedPageBreak/>
         <w:t>6.3.3 Unstructured Interviews</w:t>
       </w:r>
     </w:p>
@@ -2244,7 +2765,27 @@
           <w:szCs w:val="24"/>
           <w:lang w:val="en-NZ"/>
         </w:rPr>
-        <w:t>The final dataset comes from unstructured interviews performed to a sample of the students and of the teaching staff. Both interviews focused on gathering information about how participants saw collaboration as part of the development of the course. How do the feel about their own collaboration skills and how the course was helping them to develop or improve those skills. Annex 2 of this document shows the script used for each interview.</w:t>
+        <w:t xml:space="preserve">The final dataset comes from unstructured interviews performed to a sample of the students and of the teaching staff. Both interviews focused on gathering information about how participants saw collaboration as part of the development of the course. How do the feel about their own collaboration skills and how the course was helping them to develop or improve those </w:t>
+      </w:r>
+      <w:proofErr w:type="gramStart"/>
+      <w:r>
+        <w:rPr>
+          <w:rFonts w:asciiTheme="majorHAnsi" w:hAnsiTheme="majorHAnsi" w:cstheme="majorHAnsi"/>
+          <w:sz w:val="24"/>
+          <w:szCs w:val="24"/>
+          <w:lang w:val="en-NZ"/>
+        </w:rPr>
+        <w:t>skills.</w:t>
+      </w:r>
+      <w:proofErr w:type="gramEnd"/>
+      <w:r>
+        <w:rPr>
+          <w:rFonts w:asciiTheme="majorHAnsi" w:hAnsiTheme="majorHAnsi" w:cstheme="majorHAnsi"/>
+          <w:sz w:val="24"/>
+          <w:szCs w:val="24"/>
+          <w:lang w:val="en-NZ"/>
+        </w:rPr>
+        <w:t xml:space="preserve"> Annex 2 of this document shows the script used for each interview.</w:t>
       </w:r>
     </w:p>
     <w:p>
@@ -2356,67 +2897,759 @@
           <w:szCs w:val="24"/>
           <w:lang w:val="en-NZ"/>
         </w:rPr>
-        <w:t xml:space="preserve"> </w:t>
-      </w:r>
-      <w:r>
-        <w:rPr>
-          <w:rFonts w:asciiTheme="majorHAnsi" w:hAnsiTheme="majorHAnsi" w:cstheme="majorHAnsi"/>
-          <w:sz w:val="24"/>
-          <w:szCs w:val="24"/>
+        <w:t xml:space="preserve"> proposed</w:t>
+      </w:r>
+      <w:r>
+        <w:rPr>
+          <w:rFonts w:asciiTheme="majorHAnsi" w:hAnsiTheme="majorHAnsi" w:cstheme="majorHAnsi"/>
+          <w:sz w:val="24"/>
+          <w:szCs w:val="24"/>
+          <w:lang w:val="en-NZ"/>
+        </w:rPr>
+        <w:t xml:space="preserve">, </w:t>
+      </w:r>
+      <w:r>
+        <w:rPr>
+          <w:rFonts w:asciiTheme="majorHAnsi" w:hAnsiTheme="majorHAnsi" w:cstheme="majorHAnsi"/>
+          <w:sz w:val="24"/>
+          <w:szCs w:val="24"/>
+          <w:lang w:val="en-NZ"/>
+        </w:rPr>
+        <w:t>it is possible now to</w:t>
+      </w:r>
+      <w:r>
+        <w:rPr>
+          <w:rFonts w:asciiTheme="majorHAnsi" w:hAnsiTheme="majorHAnsi" w:cstheme="majorHAnsi"/>
+          <w:sz w:val="24"/>
+          <w:szCs w:val="24"/>
+          <w:lang w:val="en-NZ"/>
+        </w:rPr>
+        <w:t xml:space="preserve"> create the recount and analysis </w:t>
+      </w:r>
+      <w:r>
+        <w:rPr>
+          <w:rFonts w:asciiTheme="majorHAnsi" w:hAnsiTheme="majorHAnsi" w:cstheme="majorHAnsi"/>
+          <w:sz w:val="24"/>
+          <w:szCs w:val="24"/>
+          <w:lang w:val="en-NZ"/>
+        </w:rPr>
+        <w:t>of the execution of the Industry Project course</w:t>
+      </w:r>
+      <w:r>
+        <w:rPr>
+          <w:rFonts w:asciiTheme="majorHAnsi" w:hAnsiTheme="majorHAnsi" w:cstheme="majorHAnsi"/>
+          <w:sz w:val="24"/>
+          <w:szCs w:val="24"/>
+          <w:lang w:val="en-NZ"/>
+        </w:rPr>
+        <w:t>.</w:t>
+      </w:r>
+    </w:p>
+    <w:p>
+      <w:pPr>
+        <w:pStyle w:val="Heading1"/>
+        <w:rPr>
+          <w:rFonts w:asciiTheme="majorHAnsi" w:hAnsiTheme="majorHAnsi" w:cstheme="majorHAnsi"/>
+          <w:sz w:val="24"/>
+          <w:szCs w:val="24"/>
+          <w:lang w:val="en-NZ"/>
+        </w:rPr>
+      </w:pPr>
+      <w:r>
+        <w:rPr>
+          <w:rFonts w:asciiTheme="majorHAnsi" w:hAnsiTheme="majorHAnsi" w:cstheme="majorHAnsi"/>
+          <w:sz w:val="24"/>
+          <w:szCs w:val="24"/>
+          <w:lang w:val="en-NZ"/>
+        </w:rPr>
+        <w:t>6.4 Weeks 1 to 4: First Contact and Team Establishment</w:t>
+      </w:r>
+    </w:p>
+    <w:p>
+      <w:pPr>
+        <w:rPr>
+          <w:lang w:val="en-NZ"/>
+        </w:rPr>
+      </w:pPr>
+      <w:r>
+        <w:rPr>
+          <w:lang w:val="en-NZ"/>
+        </w:rPr>
+        <w:t>The first weeks of the course were characterized by a period of accommodation. The industry Project course offers a unique experience among the other courses available in all the programs represented. Although the students at this point have already experienced project-based approaches several times, none had been in such a multidisciplinary context as the one present in the course, nor with such an emphasis on simulating a real professional setting.</w:t>
+      </w:r>
+    </w:p>
+    <w:p>
+      <w:pPr>
+        <w:rPr>
+          <w:lang w:val="en-NZ"/>
+        </w:rPr>
+      </w:pPr>
+      <w:r>
+        <w:rPr>
+          <w:lang w:val="en-NZ"/>
+        </w:rPr>
+        <w:t>For the activities with WorkshopAR, it was also a period of introduction, letting the student familiarise with the dynamics of the course before adding the extra layer of complexity that of the observations and the usage of the software.</w:t>
+      </w:r>
+    </w:p>
+    <w:p>
+      <w:pPr>
+        <w:pStyle w:val="Heading2"/>
+        <w:rPr>
+          <w:rFonts w:asciiTheme="majorHAnsi" w:hAnsiTheme="majorHAnsi" w:cstheme="majorHAnsi"/>
+          <w:sz w:val="24"/>
+          <w:szCs w:val="24"/>
+          <w:lang w:val="en-NZ"/>
+        </w:rPr>
+      </w:pPr>
+      <w:r>
+        <w:rPr>
+          <w:rFonts w:asciiTheme="majorHAnsi" w:hAnsiTheme="majorHAnsi" w:cstheme="majorHAnsi"/>
+          <w:sz w:val="24"/>
+          <w:szCs w:val="24"/>
+          <w:lang w:val="en-NZ"/>
+        </w:rPr>
+        <w:t>6.4.1 General Observations</w:t>
+      </w:r>
+    </w:p>
+    <w:p>
+      <w:pPr>
+        <w:rPr>
+          <w:lang w:val="en-NZ"/>
+        </w:rPr>
+      </w:pPr>
+      <w:r>
+        <w:rPr>
+          <w:lang w:val="en-NZ"/>
+        </w:rPr>
+        <w:t xml:space="preserve">The classroom session of the course took place on Friday’s morning across two big arrangeable lecture rooms, needed to accommodate the close to 80 students enrolled in this </w:t>
+      </w:r>
+      <w:r>
+        <w:rPr>
+          <w:lang w:val="en-NZ"/>
+        </w:rPr>
+        <w:t>cohort</w:t>
+      </w:r>
+      <w:r>
+        <w:rPr>
+          <w:lang w:val="en-NZ"/>
+        </w:rPr>
+        <w:t xml:space="preserve"> of the course. The lecture rooms provided several rectangular tables that could be easily moved, separated or merged to create different room configuration, ideal for the dynamic groupwork that the course was relying the most on. The rooms also </w:t>
+      </w:r>
+      <w:r>
+        <w:rPr>
+          <w:lang w:val="en-NZ"/>
+        </w:rPr>
+        <w:t xml:space="preserve">enabled the </w:t>
+      </w:r>
+      <w:r>
+        <w:rPr>
           <w:lang w:val="en-NZ"/>
         </w:rPr>
         <w:lastRenderedPageBreak/>
-        <w:t>proposed</w:t>
-      </w:r>
-      <w:r>
-        <w:rPr>
-          <w:rFonts w:asciiTheme="majorHAnsi" w:hAnsiTheme="majorHAnsi" w:cstheme="majorHAnsi"/>
-          <w:sz w:val="24"/>
-          <w:szCs w:val="24"/>
-          <w:lang w:val="en-NZ"/>
-        </w:rPr>
-        <w:t xml:space="preserve">, </w:t>
-      </w:r>
-      <w:r>
-        <w:rPr>
-          <w:rFonts w:asciiTheme="majorHAnsi" w:hAnsiTheme="majorHAnsi" w:cstheme="majorHAnsi"/>
-          <w:sz w:val="24"/>
-          <w:szCs w:val="24"/>
-          <w:lang w:val="en-NZ"/>
-        </w:rPr>
-        <w:t>it is possible now to</w:t>
-      </w:r>
-      <w:r>
-        <w:rPr>
-          <w:rFonts w:asciiTheme="majorHAnsi" w:hAnsiTheme="majorHAnsi" w:cstheme="majorHAnsi"/>
-          <w:sz w:val="24"/>
-          <w:szCs w:val="24"/>
-          <w:lang w:val="en-NZ"/>
-        </w:rPr>
-        <w:t xml:space="preserve"> create the recount and analysis </w:t>
-      </w:r>
-      <w:r>
-        <w:rPr>
-          <w:rFonts w:asciiTheme="majorHAnsi" w:hAnsiTheme="majorHAnsi" w:cstheme="majorHAnsi"/>
-          <w:sz w:val="24"/>
-          <w:szCs w:val="24"/>
-          <w:lang w:val="en-NZ"/>
-        </w:rPr>
-        <w:t>of the execution of the Industry Project course</w:t>
-      </w:r>
-      <w:r>
-        <w:rPr>
-          <w:rFonts w:asciiTheme="majorHAnsi" w:hAnsiTheme="majorHAnsi" w:cstheme="majorHAnsi"/>
-          <w:sz w:val="24"/>
-          <w:szCs w:val="24"/>
-          <w:lang w:val="en-NZ"/>
-        </w:rPr>
-        <w:t>.</w:t>
-      </w:r>
-    </w:p>
-    <w:p>
-      <w:pPr>
-        <w:pStyle w:val="Heading1"/>
+        <w:t>constantly changing flow of activities present in one session as described in section 6.3. The rooms were also of considerable size, allowing for more than 10 tables at a time in different configuration, providing ample space for each group to work comfortable using their personal equipment and allowing free and undisruptive movement around the room.</w:t>
+      </w:r>
+    </w:p>
+    <w:p>
+      <w:pPr>
+        <w:keepNext/>
+        <w:jc w:val="center"/>
+        <w:rPr>
+          <w:lang w:val="en-NZ"/>
+        </w:rPr>
+      </w:pPr>
+      <w:r>
+        <w:rPr>
+          <w:noProof/>
+          <w:lang w:val="en-NZ"/>
+        </w:rPr>
+        <w:drawing>
+          <wp:inline distT="0" distB="0" distL="0" distR="0" wp14:anchorId="722CF4F1" wp14:editId="462D7A22">
+            <wp:extent cx="3619500" cy="2714726"/>
+            <wp:effectExtent l="0" t="0" r="0" b="9525"/>
+            <wp:docPr id="2" name="Picture 2"/>
+            <wp:cNvGraphicFramePr>
+              <a:graphicFrameLocks xmlns:a="http://schemas.openxmlformats.org/drawingml/2006/main" noChangeAspect="1"/>
+            </wp:cNvGraphicFramePr>
+            <a:graphic xmlns:a="http://schemas.openxmlformats.org/drawingml/2006/main">
+              <a:graphicData uri="http://schemas.openxmlformats.org/drawingml/2006/picture">
+                <pic:pic xmlns:pic="http://schemas.openxmlformats.org/drawingml/2006/picture">
+                  <pic:nvPicPr>
+                    <pic:cNvPr id="0" name="Picture 3"/>
+                    <pic:cNvPicPr>
+                      <a:picLocks noChangeAspect="1" noChangeArrowheads="1"/>
+                    </pic:cNvPicPr>
+                  </pic:nvPicPr>
+                  <pic:blipFill>
+                    <a:blip r:embed="rId6" cstate="print">
+                      <a:extLst>
+                        <a:ext uri="{28A0092B-C50C-407E-A947-70E740481C1C}">
+                          <a14:useLocalDpi xmlns:a14="http://schemas.microsoft.com/office/drawing/2010/main" val="0"/>
+                        </a:ext>
+                      </a:extLst>
+                    </a:blip>
+                    <a:srcRect/>
+                    <a:stretch>
+                      <a:fillRect/>
+                    </a:stretch>
+                  </pic:blipFill>
+                  <pic:spPr bwMode="auto">
+                    <a:xfrm>
+                      <a:off x="0" y="0"/>
+                      <a:ext cx="3624565" cy="2718525"/>
+                    </a:xfrm>
+                    <a:prstGeom prst="rect">
+                      <a:avLst/>
+                    </a:prstGeom>
+                    <a:noFill/>
+                    <a:ln>
+                      <a:noFill/>
+                    </a:ln>
+                  </pic:spPr>
+                </pic:pic>
+              </a:graphicData>
+            </a:graphic>
+          </wp:inline>
+        </w:drawing>
+      </w:r>
+    </w:p>
+    <w:p>
+      <w:pPr>
+        <w:pStyle w:val="Caption"/>
+        <w:jc w:val="center"/>
+        <w:rPr>
+          <w:lang w:val="en-NZ"/>
+        </w:rPr>
+      </w:pPr>
+      <w:r>
+        <w:rPr>
+          <w:lang w:val="en-NZ"/>
+        </w:rPr>
+        <w:t xml:space="preserve">Figure </w:t>
+      </w:r>
+      <w:r>
+        <w:rPr>
+          <w:lang w:val="en-NZ"/>
+        </w:rPr>
+        <w:fldChar w:fldCharType="begin"/>
+      </w:r>
+      <w:r>
+        <w:rPr>
+          <w:lang w:val="en-NZ"/>
+        </w:rPr>
+        <w:instrText xml:space="preserve"> SEQ Figure \* ARABIC </w:instrText>
+      </w:r>
+      <w:r>
+        <w:rPr>
+          <w:lang w:val="en-NZ"/>
+        </w:rPr>
+        <w:fldChar w:fldCharType="separate"/>
+      </w:r>
+      <w:r>
+        <w:rPr>
+          <w:noProof/>
+          <w:lang w:val="en-NZ"/>
+        </w:rPr>
+        <w:t>2</w:t>
+      </w:r>
+      <w:r>
+        <w:rPr>
+          <w:lang w:val="en-NZ"/>
+        </w:rPr>
+        <w:fldChar w:fldCharType="end"/>
+      </w:r>
+      <w:r>
+        <w:rPr>
+          <w:lang w:val="en-NZ"/>
+        </w:rPr>
+        <w:t xml:space="preserve"> Main Lecture Room</w:t>
+      </w:r>
+    </w:p>
+    <w:p>
+      <w:pPr>
+        <w:rPr>
+          <w:rFonts w:asciiTheme="majorHAnsi" w:hAnsiTheme="majorHAnsi" w:cstheme="majorHAnsi"/>
+          <w:sz w:val="24"/>
+          <w:szCs w:val="24"/>
+          <w:lang w:val="en-NZ"/>
+        </w:rPr>
+      </w:pPr>
+      <w:r>
+        <w:rPr>
+          <w:rFonts w:asciiTheme="majorHAnsi" w:hAnsiTheme="majorHAnsi" w:cstheme="majorHAnsi"/>
+          <w:sz w:val="24"/>
+          <w:szCs w:val="24"/>
+          <w:lang w:val="en-NZ"/>
+        </w:rPr>
+        <w:t xml:space="preserve">The very first session of the semester set-up the tone and flow for all the other session, which followed more or less the same template. Students </w:t>
+      </w:r>
+      <w:r>
+        <w:rPr>
+          <w:rFonts w:asciiTheme="majorHAnsi" w:hAnsiTheme="majorHAnsi" w:cstheme="majorHAnsi"/>
+          <w:sz w:val="24"/>
+          <w:szCs w:val="24"/>
+          <w:lang w:val="en-NZ"/>
+        </w:rPr>
+        <w:t>arrived</w:t>
+      </w:r>
+      <w:r>
+        <w:rPr>
+          <w:rFonts w:asciiTheme="majorHAnsi" w:hAnsiTheme="majorHAnsi" w:cstheme="majorHAnsi"/>
+          <w:sz w:val="24"/>
+          <w:szCs w:val="24"/>
+          <w:lang w:val="en-NZ"/>
+        </w:rPr>
+        <w:t xml:space="preserve"> within the first ten to twenty minutes of the session while the teaching staff prepared the room and discuss the activities of the day</w:t>
+      </w:r>
+      <w:r>
+        <w:rPr>
+          <w:rFonts w:asciiTheme="majorHAnsi" w:hAnsiTheme="majorHAnsi" w:cstheme="majorHAnsi"/>
+          <w:sz w:val="24"/>
+          <w:szCs w:val="24"/>
+          <w:lang w:val="en-NZ"/>
+        </w:rPr>
+        <w:t xml:space="preserve">. As it is tradition in almost all of the Built </w:t>
+      </w:r>
+      <w:proofErr w:type="gramStart"/>
+      <w:r>
+        <w:rPr>
+          <w:rFonts w:asciiTheme="majorHAnsi" w:hAnsiTheme="majorHAnsi" w:cstheme="majorHAnsi"/>
+          <w:sz w:val="24"/>
+          <w:szCs w:val="24"/>
+          <w:lang w:val="en-NZ"/>
+        </w:rPr>
+        <w:t>Environments</w:t>
+      </w:r>
+      <w:proofErr w:type="gramEnd"/>
+      <w:r>
+        <w:rPr>
+          <w:rFonts w:asciiTheme="majorHAnsi" w:hAnsiTheme="majorHAnsi" w:cstheme="majorHAnsi"/>
+          <w:sz w:val="24"/>
+          <w:szCs w:val="24"/>
+          <w:lang w:val="en-NZ"/>
+        </w:rPr>
+        <w:t xml:space="preserve"> programs (and many other programs at AUT), the lecture started </w:t>
+      </w:r>
+      <w:r>
+        <w:rPr>
+          <w:rFonts w:asciiTheme="majorHAnsi" w:hAnsiTheme="majorHAnsi" w:cstheme="majorHAnsi"/>
+          <w:sz w:val="24"/>
+          <w:szCs w:val="24"/>
+          <w:lang w:val="en-NZ"/>
+        </w:rPr>
+        <w:t>with</w:t>
+      </w:r>
+      <w:r>
+        <w:rPr>
+          <w:rFonts w:asciiTheme="majorHAnsi" w:hAnsiTheme="majorHAnsi" w:cstheme="majorHAnsi"/>
+          <w:sz w:val="24"/>
+          <w:szCs w:val="24"/>
+          <w:lang w:val="en-NZ"/>
+        </w:rPr>
+        <w:t xml:space="preserve"> a karakia, a traditional Māori prayer to open any social meeting</w:t>
+      </w:r>
+      <w:r>
+        <w:rPr>
+          <w:rFonts w:asciiTheme="majorHAnsi" w:hAnsiTheme="majorHAnsi" w:cstheme="majorHAnsi"/>
+          <w:sz w:val="24"/>
+          <w:szCs w:val="24"/>
+          <w:lang w:val="en-NZ"/>
+        </w:rPr>
+        <w:t xml:space="preserve"> or significant event</w:t>
+      </w:r>
+      <w:r>
+        <w:rPr>
+          <w:rFonts w:asciiTheme="majorHAnsi" w:hAnsiTheme="majorHAnsi" w:cstheme="majorHAnsi"/>
+          <w:sz w:val="24"/>
+          <w:szCs w:val="24"/>
+          <w:lang w:val="en-NZ"/>
+        </w:rPr>
+        <w:t>, which Table 1 shows in its Te Reo and English versions.</w:t>
+      </w:r>
+    </w:p>
+    <w:p>
+      <w:pPr>
+        <w:pStyle w:val="Caption"/>
+        <w:keepNext/>
+        <w:jc w:val="center"/>
+        <w:rPr>
+          <w:lang w:val="en-NZ"/>
+        </w:rPr>
+      </w:pPr>
+      <w:r>
+        <w:rPr>
+          <w:lang w:val="en-NZ"/>
+        </w:rPr>
+        <w:t xml:space="preserve">Table </w:t>
+      </w:r>
+      <w:r>
+        <w:rPr>
+          <w:lang w:val="en-NZ"/>
+        </w:rPr>
+        <w:fldChar w:fldCharType="begin"/>
+      </w:r>
+      <w:r>
+        <w:rPr>
+          <w:lang w:val="en-NZ"/>
+        </w:rPr>
+        <w:instrText xml:space="preserve"> SEQ Table \* ARABIC </w:instrText>
+      </w:r>
+      <w:r>
+        <w:rPr>
+          <w:lang w:val="en-NZ"/>
+        </w:rPr>
+        <w:fldChar w:fldCharType="separate"/>
+      </w:r>
+      <w:r>
+        <w:rPr>
+          <w:noProof/>
+          <w:lang w:val="en-NZ"/>
+        </w:rPr>
+        <w:t>1</w:t>
+      </w:r>
+      <w:r>
+        <w:rPr>
+          <w:lang w:val="en-NZ"/>
+        </w:rPr>
+        <w:fldChar w:fldCharType="end"/>
+      </w:r>
+      <w:r>
+        <w:rPr>
+          <w:lang w:val="en-NZ"/>
+        </w:rPr>
+        <w:t xml:space="preserve"> Weekly Karakia</w:t>
+      </w:r>
+    </w:p>
+    <w:tbl>
+      <w:tblPr>
+        <w:tblStyle w:val="PlainTable2"/>
+        <w:tblW w:w="0" w:type="auto"/>
+        <w:tblLook w:val="04A0" w:firstRow="1" w:lastRow="0" w:firstColumn="1" w:lastColumn="0" w:noHBand="0" w:noVBand="1"/>
+      </w:tblPr>
+      <w:tblGrid>
+        <w:gridCol w:w="4509"/>
+        <w:gridCol w:w="4510"/>
+      </w:tblGrid>
+      <w:tr>
+        <w:trPr>
+          <w:cnfStyle w:val="100000000000" w:firstRow="1" w:lastRow="0" w:firstColumn="0" w:lastColumn="0" w:oddVBand="0" w:evenVBand="0" w:oddHBand="0" w:evenHBand="0" w:firstRowFirstColumn="0" w:firstRowLastColumn="0" w:lastRowFirstColumn="0" w:lastRowLastColumn="0"/>
+        </w:trPr>
+        <w:tc>
+          <w:tcPr>
+            <w:cnfStyle w:val="001000000000" w:firstRow="0" w:lastRow="0" w:firstColumn="1" w:lastColumn="0" w:oddVBand="0" w:evenVBand="0" w:oddHBand="0" w:evenHBand="0" w:firstRowFirstColumn="0" w:firstRowLastColumn="0" w:lastRowFirstColumn="0" w:lastRowLastColumn="0"/>
+            <w:tcW w:w="4509" w:type="dxa"/>
+          </w:tcPr>
+          <w:p>
+            <w:pPr>
+              <w:jc w:val="center"/>
+              <w:rPr>
+                <w:rFonts w:asciiTheme="majorHAnsi" w:hAnsiTheme="majorHAnsi" w:cstheme="majorHAnsi"/>
+                <w:sz w:val="24"/>
+                <w:szCs w:val="24"/>
+                <w:lang w:val="en-NZ"/>
+              </w:rPr>
+            </w:pPr>
+            <w:r>
+              <w:rPr>
+                <w:rFonts w:asciiTheme="majorHAnsi" w:hAnsiTheme="majorHAnsi" w:cstheme="majorHAnsi"/>
+                <w:sz w:val="24"/>
+                <w:szCs w:val="24"/>
+                <w:lang w:val="en-NZ"/>
+              </w:rPr>
+              <w:t>Te Reo</w:t>
+            </w:r>
+          </w:p>
+        </w:tc>
+        <w:tc>
+          <w:tcPr>
+            <w:tcW w:w="4510" w:type="dxa"/>
+          </w:tcPr>
+          <w:p>
+            <w:pPr>
+              <w:jc w:val="center"/>
+              <w:cnfStyle w:val="100000000000" w:firstRow="1" w:lastRow="0" w:firstColumn="0" w:lastColumn="0" w:oddVBand="0" w:evenVBand="0" w:oddHBand="0" w:evenHBand="0" w:firstRowFirstColumn="0" w:firstRowLastColumn="0" w:lastRowFirstColumn="0" w:lastRowLastColumn="0"/>
+              <w:rPr>
+                <w:rFonts w:asciiTheme="majorHAnsi" w:hAnsiTheme="majorHAnsi" w:cstheme="majorHAnsi"/>
+                <w:sz w:val="24"/>
+                <w:szCs w:val="24"/>
+                <w:lang w:val="en-NZ"/>
+              </w:rPr>
+            </w:pPr>
+            <w:r>
+              <w:rPr>
+                <w:rFonts w:asciiTheme="majorHAnsi" w:hAnsiTheme="majorHAnsi" w:cstheme="majorHAnsi"/>
+                <w:sz w:val="24"/>
+                <w:szCs w:val="24"/>
+                <w:lang w:val="en-NZ"/>
+              </w:rPr>
+              <w:t>English</w:t>
+            </w:r>
+          </w:p>
+        </w:tc>
+      </w:tr>
+      <w:tr>
+        <w:trPr>
+          <w:cnfStyle w:val="000000100000" w:firstRow="0" w:lastRow="0" w:firstColumn="0" w:lastColumn="0" w:oddVBand="0" w:evenVBand="0" w:oddHBand="1" w:evenHBand="0" w:firstRowFirstColumn="0" w:firstRowLastColumn="0" w:lastRowFirstColumn="0" w:lastRowLastColumn="0"/>
+        </w:trPr>
+        <w:tc>
+          <w:tcPr>
+            <w:cnfStyle w:val="001000000000" w:firstRow="0" w:lastRow="0" w:firstColumn="1" w:lastColumn="0" w:oddVBand="0" w:evenVBand="0" w:oddHBand="0" w:evenHBand="0" w:firstRowFirstColumn="0" w:firstRowLastColumn="0" w:lastRowFirstColumn="0" w:lastRowLastColumn="0"/>
+            <w:tcW w:w="4509" w:type="dxa"/>
+          </w:tcPr>
+          <w:p>
+            <w:pPr>
+              <w:jc w:val="center"/>
+              <w:rPr>
+                <w:rFonts w:asciiTheme="majorHAnsi" w:hAnsiTheme="majorHAnsi" w:cstheme="majorHAnsi"/>
+                <w:sz w:val="24"/>
+                <w:szCs w:val="24"/>
+                <w:lang w:val="en-NZ"/>
+              </w:rPr>
+            </w:pPr>
+            <w:r>
+              <w:rPr>
+                <w:rFonts w:asciiTheme="majorHAnsi" w:hAnsiTheme="majorHAnsi" w:cstheme="majorHAnsi"/>
+                <w:sz w:val="24"/>
+                <w:szCs w:val="24"/>
+                <w:lang w:val="en-NZ"/>
+              </w:rPr>
+              <w:t>Mauri oho</w:t>
+            </w:r>
+          </w:p>
+          <w:p>
+            <w:pPr>
+              <w:jc w:val="center"/>
+              <w:rPr>
+                <w:rFonts w:asciiTheme="majorHAnsi" w:hAnsiTheme="majorHAnsi" w:cstheme="majorHAnsi"/>
+                <w:sz w:val="24"/>
+                <w:szCs w:val="24"/>
+                <w:lang w:val="en-NZ"/>
+              </w:rPr>
+            </w:pPr>
+            <w:r>
+              <w:rPr>
+                <w:rFonts w:asciiTheme="majorHAnsi" w:hAnsiTheme="majorHAnsi" w:cstheme="majorHAnsi"/>
+                <w:sz w:val="24"/>
+                <w:szCs w:val="24"/>
+                <w:lang w:val="en-NZ"/>
+              </w:rPr>
+              <w:t>Mauri tū.</w:t>
+            </w:r>
+          </w:p>
+          <w:p>
+            <w:pPr>
+              <w:jc w:val="center"/>
+              <w:rPr>
+                <w:rFonts w:asciiTheme="majorHAnsi" w:hAnsiTheme="majorHAnsi" w:cstheme="majorHAnsi"/>
+                <w:sz w:val="24"/>
+                <w:szCs w:val="24"/>
+                <w:lang w:val="en-NZ"/>
+              </w:rPr>
+            </w:pPr>
+            <w:r>
+              <w:rPr>
+                <w:rFonts w:asciiTheme="majorHAnsi" w:hAnsiTheme="majorHAnsi" w:cstheme="majorHAnsi"/>
+                <w:sz w:val="24"/>
+                <w:szCs w:val="24"/>
+                <w:lang w:val="en-NZ"/>
+              </w:rPr>
+              <w:t>Mauri ora ki a tātou.</w:t>
+            </w:r>
+          </w:p>
+          <w:p>
+            <w:pPr>
+              <w:jc w:val="center"/>
+              <w:rPr>
+                <w:rFonts w:asciiTheme="majorHAnsi" w:hAnsiTheme="majorHAnsi" w:cstheme="majorHAnsi"/>
+                <w:sz w:val="24"/>
+                <w:szCs w:val="24"/>
+                <w:lang w:val="en-NZ"/>
+              </w:rPr>
+            </w:pPr>
+            <w:proofErr w:type="spellStart"/>
+            <w:r>
+              <w:rPr>
+                <w:rFonts w:asciiTheme="majorHAnsi" w:hAnsiTheme="majorHAnsi" w:cstheme="majorHAnsi"/>
+                <w:sz w:val="24"/>
+                <w:szCs w:val="24"/>
+                <w:lang w:val="en-NZ"/>
+              </w:rPr>
+              <w:t>Haumi</w:t>
+            </w:r>
+            <w:proofErr w:type="spellEnd"/>
+            <w:r>
+              <w:rPr>
+                <w:rFonts w:asciiTheme="majorHAnsi" w:hAnsiTheme="majorHAnsi" w:cstheme="majorHAnsi"/>
+                <w:sz w:val="24"/>
+                <w:szCs w:val="24"/>
+                <w:lang w:val="en-NZ"/>
+              </w:rPr>
+              <w:t xml:space="preserve"> e, Hui e! </w:t>
+            </w:r>
+            <w:proofErr w:type="spellStart"/>
+            <w:r>
+              <w:rPr>
+                <w:rFonts w:asciiTheme="majorHAnsi" w:hAnsiTheme="majorHAnsi" w:cstheme="majorHAnsi"/>
+                <w:sz w:val="24"/>
+                <w:szCs w:val="24"/>
+                <w:lang w:val="en-NZ"/>
+              </w:rPr>
+              <w:t>Tāiki</w:t>
+            </w:r>
+            <w:proofErr w:type="spellEnd"/>
+            <w:r>
+              <w:rPr>
+                <w:rFonts w:asciiTheme="majorHAnsi" w:hAnsiTheme="majorHAnsi" w:cstheme="majorHAnsi"/>
+                <w:sz w:val="24"/>
+                <w:szCs w:val="24"/>
+                <w:lang w:val="en-NZ"/>
+              </w:rPr>
+              <w:t xml:space="preserve"> e!</w:t>
+            </w:r>
+          </w:p>
+        </w:tc>
+        <w:tc>
+          <w:tcPr>
+            <w:tcW w:w="4510" w:type="dxa"/>
+          </w:tcPr>
+          <w:p>
+            <w:pPr>
+              <w:jc w:val="center"/>
+              <w:cnfStyle w:val="000000100000" w:firstRow="0" w:lastRow="0" w:firstColumn="0" w:lastColumn="0" w:oddVBand="0" w:evenVBand="0" w:oddHBand="1" w:evenHBand="0" w:firstRowFirstColumn="0" w:firstRowLastColumn="0" w:lastRowFirstColumn="0" w:lastRowLastColumn="0"/>
+              <w:rPr>
+                <w:rFonts w:asciiTheme="majorHAnsi" w:hAnsiTheme="majorHAnsi" w:cstheme="majorHAnsi"/>
+                <w:sz w:val="24"/>
+                <w:szCs w:val="24"/>
+                <w:lang w:val="en-NZ"/>
+              </w:rPr>
+            </w:pPr>
+            <w:r>
+              <w:rPr>
+                <w:rFonts w:asciiTheme="majorHAnsi" w:hAnsiTheme="majorHAnsi" w:cstheme="majorHAnsi"/>
+                <w:sz w:val="24"/>
+                <w:szCs w:val="24"/>
+                <w:lang w:val="en-NZ"/>
+              </w:rPr>
+              <w:t>Life force awaken.</w:t>
+            </w:r>
+          </w:p>
+          <w:p>
+            <w:pPr>
+              <w:jc w:val="center"/>
+              <w:cnfStyle w:val="000000100000" w:firstRow="0" w:lastRow="0" w:firstColumn="0" w:lastColumn="0" w:oddVBand="0" w:evenVBand="0" w:oddHBand="1" w:evenHBand="0" w:firstRowFirstColumn="0" w:firstRowLastColumn="0" w:lastRowFirstColumn="0" w:lastRowLastColumn="0"/>
+              <w:rPr>
+                <w:rFonts w:asciiTheme="majorHAnsi" w:hAnsiTheme="majorHAnsi" w:cstheme="majorHAnsi"/>
+                <w:sz w:val="24"/>
+                <w:szCs w:val="24"/>
+                <w:lang w:val="en-NZ"/>
+              </w:rPr>
+            </w:pPr>
+            <w:r>
+              <w:rPr>
+                <w:rFonts w:asciiTheme="majorHAnsi" w:hAnsiTheme="majorHAnsi" w:cstheme="majorHAnsi"/>
+                <w:sz w:val="24"/>
+                <w:szCs w:val="24"/>
+                <w:lang w:val="en-NZ"/>
+              </w:rPr>
+              <w:t>Life force stand tall.</w:t>
+            </w:r>
+          </w:p>
+          <w:p>
+            <w:pPr>
+              <w:jc w:val="center"/>
+              <w:cnfStyle w:val="000000100000" w:firstRow="0" w:lastRow="0" w:firstColumn="0" w:lastColumn="0" w:oddVBand="0" w:evenVBand="0" w:oddHBand="1" w:evenHBand="0" w:firstRowFirstColumn="0" w:firstRowLastColumn="0" w:lastRowFirstColumn="0" w:lastRowLastColumn="0"/>
+              <w:rPr>
+                <w:rFonts w:asciiTheme="majorHAnsi" w:hAnsiTheme="majorHAnsi" w:cstheme="majorHAnsi"/>
+                <w:sz w:val="24"/>
+                <w:szCs w:val="24"/>
+                <w:lang w:val="en-NZ"/>
+              </w:rPr>
+            </w:pPr>
+            <w:r>
+              <w:rPr>
+                <w:rFonts w:asciiTheme="majorHAnsi" w:hAnsiTheme="majorHAnsi" w:cstheme="majorHAnsi"/>
+                <w:sz w:val="24"/>
+                <w:szCs w:val="24"/>
+                <w:lang w:val="en-NZ"/>
+              </w:rPr>
+              <w:t xml:space="preserve">Life </w:t>
+            </w:r>
+            <w:proofErr w:type="gramStart"/>
+            <w:r>
+              <w:rPr>
+                <w:rFonts w:asciiTheme="majorHAnsi" w:hAnsiTheme="majorHAnsi" w:cstheme="majorHAnsi"/>
+                <w:sz w:val="24"/>
+                <w:szCs w:val="24"/>
+                <w:lang w:val="en-NZ"/>
+              </w:rPr>
+              <w:t>force</w:t>
+            </w:r>
+            <w:proofErr w:type="gramEnd"/>
+            <w:r>
+              <w:rPr>
+                <w:rFonts w:asciiTheme="majorHAnsi" w:hAnsiTheme="majorHAnsi" w:cstheme="majorHAnsi"/>
+                <w:sz w:val="24"/>
+                <w:szCs w:val="24"/>
+                <w:lang w:val="en-NZ"/>
+              </w:rPr>
+              <w:t xml:space="preserve"> all wellness, good health for all.</w:t>
+            </w:r>
+          </w:p>
+          <w:p>
+            <w:pPr>
+              <w:jc w:val="center"/>
+              <w:cnfStyle w:val="000000100000" w:firstRow="0" w:lastRow="0" w:firstColumn="0" w:lastColumn="0" w:oddVBand="0" w:evenVBand="0" w:oddHBand="1" w:evenHBand="0" w:firstRowFirstColumn="0" w:firstRowLastColumn="0" w:lastRowFirstColumn="0" w:lastRowLastColumn="0"/>
+              <w:rPr>
+                <w:rFonts w:asciiTheme="majorHAnsi" w:hAnsiTheme="majorHAnsi" w:cstheme="majorHAnsi"/>
+                <w:sz w:val="24"/>
+                <w:szCs w:val="24"/>
+                <w:lang w:val="en-NZ"/>
+              </w:rPr>
+            </w:pPr>
+            <w:r>
+              <w:rPr>
+                <w:rFonts w:asciiTheme="majorHAnsi" w:hAnsiTheme="majorHAnsi" w:cstheme="majorHAnsi"/>
+                <w:sz w:val="24"/>
+                <w:szCs w:val="24"/>
+                <w:lang w:val="en-NZ"/>
+              </w:rPr>
+              <w:t>Join together, unite, the group is ready to progress for the purpose of coming together.</w:t>
+            </w:r>
+          </w:p>
+        </w:tc>
+      </w:tr>
+    </w:tbl>
+    <w:p>
+      <w:pPr>
+        <w:rPr>
+          <w:rFonts w:asciiTheme="majorHAnsi" w:hAnsiTheme="majorHAnsi" w:cstheme="majorHAnsi"/>
+          <w:sz w:val="24"/>
+          <w:szCs w:val="24"/>
+          <w:lang w:val="en-NZ"/>
+        </w:rPr>
+      </w:pPr>
+    </w:p>
+    <w:p>
+      <w:pPr>
+        <w:rPr>
+          <w:rFonts w:asciiTheme="majorHAnsi" w:hAnsiTheme="majorHAnsi" w:cstheme="majorHAnsi"/>
+          <w:sz w:val="24"/>
+          <w:szCs w:val="24"/>
+          <w:lang w:val="en-NZ"/>
+        </w:rPr>
+      </w:pPr>
+      <w:r>
+        <w:rPr>
+          <w:rFonts w:asciiTheme="majorHAnsi" w:hAnsiTheme="majorHAnsi" w:cstheme="majorHAnsi"/>
+          <w:sz w:val="24"/>
+          <w:szCs w:val="24"/>
+          <w:lang w:val="en-NZ"/>
+        </w:rPr>
+        <w:t>Although a simple detail and a bit detached from the overall objectives of the observations, the karakia is a constant reminder of the tone and mindset needed for a successful experience in the course, and a charming tradition that reminds the students that they are entering a place meant for learning together.</w:t>
+      </w:r>
+    </w:p>
+    <w:p>
+      <w:pPr>
+        <w:pStyle w:val="Heading2"/>
         <w:rPr>
           <w:rFonts w:asciiTheme="majorHAnsi" w:hAnsiTheme="majorHAnsi" w:cstheme="majorHAnsi"/>
           <w:sz w:val="24"/>
@@ -2432,46 +3665,6 @@
           <w:lang w:val="en-NZ"/>
         </w:rPr>
         <w:lastRenderedPageBreak/>
-        <w:t>6.4 Weeks 1 to 4: First Contact and Team Establishment</w:t>
-      </w:r>
-    </w:p>
-    <w:p>
-      <w:pPr>
-        <w:pStyle w:val="Heading2"/>
-        <w:rPr>
-          <w:rFonts w:asciiTheme="majorHAnsi" w:hAnsiTheme="majorHAnsi" w:cstheme="majorHAnsi"/>
-          <w:sz w:val="24"/>
-          <w:szCs w:val="24"/>
-          <w:lang w:val="en-NZ"/>
-        </w:rPr>
-      </w:pPr>
-      <w:r>
-        <w:rPr>
-          <w:rFonts w:asciiTheme="majorHAnsi" w:hAnsiTheme="majorHAnsi" w:cstheme="majorHAnsi"/>
-          <w:sz w:val="24"/>
-          <w:szCs w:val="24"/>
-          <w:lang w:val="en-NZ"/>
-        </w:rPr>
-        <w:t>6.4.1 General Observations</w:t>
-      </w:r>
-    </w:p>
-    <w:p>
-      <w:pPr>
-        <w:pStyle w:val="Heading2"/>
-        <w:rPr>
-          <w:rFonts w:asciiTheme="majorHAnsi" w:hAnsiTheme="majorHAnsi" w:cstheme="majorHAnsi"/>
-          <w:sz w:val="24"/>
-          <w:szCs w:val="24"/>
-          <w:lang w:val="en-NZ"/>
-        </w:rPr>
-      </w:pPr>
-      <w:r>
-        <w:rPr>
-          <w:rFonts w:asciiTheme="majorHAnsi" w:hAnsiTheme="majorHAnsi" w:cstheme="majorHAnsi"/>
-          <w:sz w:val="24"/>
-          <w:szCs w:val="24"/>
-          <w:lang w:val="en-NZ"/>
-        </w:rPr>
         <w:t>6.4.2 Intervention with WorkshopAR</w:t>
       </w:r>
     </w:p>
@@ -3706,6 +4899,119 @@
     <w:nsid w:val="7760001C"/>
     <w:multiLevelType w:val="hybridMultilevel"/>
     <w:tmpl w:val="DA00D140"/>
+    <w:lvl w:ilvl="0" w:tplc="14090001">
+      <w:start w:val="1"/>
+      <w:numFmt w:val="bullet"/>
+      <w:lvlText w:val=""/>
+      <w:lvlJc w:val="left"/>
+      <w:pPr>
+        <w:ind w:left="720" w:hanging="360"/>
+      </w:pPr>
+      <w:rPr>
+        <w:rFonts w:ascii="Symbol" w:hAnsi="Symbol" w:hint="default"/>
+      </w:rPr>
+    </w:lvl>
+    <w:lvl w:ilvl="1" w:tplc="14090003" w:tentative="1">
+      <w:start w:val="1"/>
+      <w:numFmt w:val="bullet"/>
+      <w:lvlText w:val="o"/>
+      <w:lvlJc w:val="left"/>
+      <w:pPr>
+        <w:ind w:left="1440" w:hanging="360"/>
+      </w:pPr>
+      <w:rPr>
+        <w:rFonts w:ascii="Courier New" w:hAnsi="Courier New" w:cs="Courier New" w:hint="default"/>
+      </w:rPr>
+    </w:lvl>
+    <w:lvl w:ilvl="2" w:tplc="14090005" w:tentative="1">
+      <w:start w:val="1"/>
+      <w:numFmt w:val="bullet"/>
+      <w:lvlText w:val=""/>
+      <w:lvlJc w:val="left"/>
+      <w:pPr>
+        <w:ind w:left="2160" w:hanging="360"/>
+      </w:pPr>
+      <w:rPr>
+        <w:rFonts w:ascii="Wingdings" w:hAnsi="Wingdings" w:hint="default"/>
+      </w:rPr>
+    </w:lvl>
+    <w:lvl w:ilvl="3" w:tplc="14090001" w:tentative="1">
+      <w:start w:val="1"/>
+      <w:numFmt w:val="bullet"/>
+      <w:lvlText w:val=""/>
+      <w:lvlJc w:val="left"/>
+      <w:pPr>
+        <w:ind w:left="2880" w:hanging="360"/>
+      </w:pPr>
+      <w:rPr>
+        <w:rFonts w:ascii="Symbol" w:hAnsi="Symbol" w:hint="default"/>
+      </w:rPr>
+    </w:lvl>
+    <w:lvl w:ilvl="4" w:tplc="14090003" w:tentative="1">
+      <w:start w:val="1"/>
+      <w:numFmt w:val="bullet"/>
+      <w:lvlText w:val="o"/>
+      <w:lvlJc w:val="left"/>
+      <w:pPr>
+        <w:ind w:left="3600" w:hanging="360"/>
+      </w:pPr>
+      <w:rPr>
+        <w:rFonts w:ascii="Courier New" w:hAnsi="Courier New" w:cs="Courier New" w:hint="default"/>
+      </w:rPr>
+    </w:lvl>
+    <w:lvl w:ilvl="5" w:tplc="14090005" w:tentative="1">
+      <w:start w:val="1"/>
+      <w:numFmt w:val="bullet"/>
+      <w:lvlText w:val=""/>
+      <w:lvlJc w:val="left"/>
+      <w:pPr>
+        <w:ind w:left="4320" w:hanging="360"/>
+      </w:pPr>
+      <w:rPr>
+        <w:rFonts w:ascii="Wingdings" w:hAnsi="Wingdings" w:hint="default"/>
+      </w:rPr>
+    </w:lvl>
+    <w:lvl w:ilvl="6" w:tplc="14090001" w:tentative="1">
+      <w:start w:val="1"/>
+      <w:numFmt w:val="bullet"/>
+      <w:lvlText w:val=""/>
+      <w:lvlJc w:val="left"/>
+      <w:pPr>
+        <w:ind w:left="5040" w:hanging="360"/>
+      </w:pPr>
+      <w:rPr>
+        <w:rFonts w:ascii="Symbol" w:hAnsi="Symbol" w:hint="default"/>
+      </w:rPr>
+    </w:lvl>
+    <w:lvl w:ilvl="7" w:tplc="14090003" w:tentative="1">
+      <w:start w:val="1"/>
+      <w:numFmt w:val="bullet"/>
+      <w:lvlText w:val="o"/>
+      <w:lvlJc w:val="left"/>
+      <w:pPr>
+        <w:ind w:left="5760" w:hanging="360"/>
+      </w:pPr>
+      <w:rPr>
+        <w:rFonts w:ascii="Courier New" w:hAnsi="Courier New" w:cs="Courier New" w:hint="default"/>
+      </w:rPr>
+    </w:lvl>
+    <w:lvl w:ilvl="8" w:tplc="14090005" w:tentative="1">
+      <w:start w:val="1"/>
+      <w:numFmt w:val="bullet"/>
+      <w:lvlText w:val=""/>
+      <w:lvlJc w:val="left"/>
+      <w:pPr>
+        <w:ind w:left="6480" w:hanging="360"/>
+      </w:pPr>
+      <w:rPr>
+        <w:rFonts w:ascii="Wingdings" w:hAnsi="Wingdings" w:hint="default"/>
+      </w:rPr>
+    </w:lvl>
+  </w:abstractNum>
+  <w:abstractNum w:abstractNumId="8" w15:restartNumberingAfterBreak="0">
+    <w:nsid w:val="7A944C52"/>
+    <w:multiLevelType w:val="hybridMultilevel"/>
+    <w:tmpl w:val="4DF8A4A6"/>
     <w:lvl w:ilvl="0" w:tplc="14090001">
       <w:start w:val="1"/>
       <w:numFmt w:val="bullet"/>
@@ -3838,6 +5144,9 @@
   </w:num>
   <w:num w:numId="8">
     <w:abstractNumId w:val="1"/>
+  </w:num>
+  <w:num w:numId="9">
+    <w:abstractNumId w:val="8"/>
   </w:num>
 </w:numbering>
 </file>
@@ -4424,6 +5733,124 @@
       <w:contextualSpacing/>
     </w:pPr>
   </w:style>
+  <w:style w:type="paragraph" w:styleId="Caption">
+    <w:name w:val="caption"/>
+    <w:basedOn w:val="Normal"/>
+    <w:next w:val="Normal"/>
+    <w:uiPriority w:val="35"/>
+    <w:unhideWhenUsed/>
+    <w:qFormat/>
+    <w:rsid w:val="00777AAC"/>
+    <w:pPr>
+      <w:spacing w:line="240" w:lineRule="auto"/>
+    </w:pPr>
+    <w:rPr>
+      <w:i/>
+      <w:iCs/>
+      <w:color w:val="1F497D" w:themeColor="text2"/>
+      <w:sz w:val="18"/>
+      <w:szCs w:val="18"/>
+    </w:rPr>
+  </w:style>
+  <w:style w:type="table" w:styleId="TableGrid">
+    <w:name w:val="Table Grid"/>
+    <w:basedOn w:val="TableNormal"/>
+    <w:uiPriority w:val="39"/>
+    <w:rsid w:val="00C3546B"/>
+    <w:pPr>
+      <w:spacing w:after="0" w:line="240" w:lineRule="auto"/>
+    </w:pPr>
+    <w:tblPr>
+      <w:tblBorders>
+        <w:top w:val="single" w:sz="4" w:space="0" w:color="auto"/>
+        <w:left w:val="single" w:sz="4" w:space="0" w:color="auto"/>
+        <w:bottom w:val="single" w:sz="4" w:space="0" w:color="auto"/>
+        <w:right w:val="single" w:sz="4" w:space="0" w:color="auto"/>
+        <w:insideH w:val="single" w:sz="4" w:space="0" w:color="auto"/>
+        <w:insideV w:val="single" w:sz="4" w:space="0" w:color="auto"/>
+      </w:tblBorders>
+    </w:tblPr>
+  </w:style>
+  <w:style w:type="table" w:styleId="PlainTable2">
+    <w:name w:val="Plain Table 2"/>
+    <w:basedOn w:val="TableNormal"/>
+    <w:uiPriority w:val="42"/>
+    <w:rsid w:val="00522EB9"/>
+    <w:pPr>
+      <w:spacing w:after="0" w:line="240" w:lineRule="auto"/>
+    </w:pPr>
+    <w:tblPr>
+      <w:tblStyleRowBandSize w:val="1"/>
+      <w:tblStyleColBandSize w:val="1"/>
+      <w:tblBorders>
+        <w:top w:val="single" w:sz="4" w:space="0" w:color="7F7F7F" w:themeColor="text1" w:themeTint="80"/>
+        <w:bottom w:val="single" w:sz="4" w:space="0" w:color="7F7F7F" w:themeColor="text1" w:themeTint="80"/>
+      </w:tblBorders>
+    </w:tblPr>
+    <w:tblStylePr w:type="firstRow">
+      <w:rPr>
+        <w:b/>
+        <w:bCs/>
+      </w:rPr>
+      <w:tblPr/>
+      <w:tcPr>
+        <w:tcBorders>
+          <w:bottom w:val="single" w:sz="4" w:space="0" w:color="7F7F7F" w:themeColor="text1" w:themeTint="80"/>
+        </w:tcBorders>
+      </w:tcPr>
+    </w:tblStylePr>
+    <w:tblStylePr w:type="lastRow">
+      <w:rPr>
+        <w:b/>
+        <w:bCs/>
+      </w:rPr>
+      <w:tblPr/>
+      <w:tcPr>
+        <w:tcBorders>
+          <w:top w:val="single" w:sz="4" w:space="0" w:color="7F7F7F" w:themeColor="text1" w:themeTint="80"/>
+        </w:tcBorders>
+      </w:tcPr>
+    </w:tblStylePr>
+    <w:tblStylePr w:type="firstCol">
+      <w:rPr>
+        <w:b/>
+        <w:bCs/>
+      </w:rPr>
+    </w:tblStylePr>
+    <w:tblStylePr w:type="lastCol">
+      <w:rPr>
+        <w:b/>
+        <w:bCs/>
+      </w:rPr>
+    </w:tblStylePr>
+    <w:tblStylePr w:type="band1Vert">
+      <w:tblPr/>
+      <w:tcPr>
+        <w:tcBorders>
+          <w:left w:val="single" w:sz="4" w:space="0" w:color="7F7F7F" w:themeColor="text1" w:themeTint="80"/>
+          <w:right w:val="single" w:sz="4" w:space="0" w:color="7F7F7F" w:themeColor="text1" w:themeTint="80"/>
+        </w:tcBorders>
+      </w:tcPr>
+    </w:tblStylePr>
+    <w:tblStylePr w:type="band2Vert">
+      <w:tblPr/>
+      <w:tcPr>
+        <w:tcBorders>
+          <w:left w:val="single" w:sz="4" w:space="0" w:color="7F7F7F" w:themeColor="text1" w:themeTint="80"/>
+          <w:right w:val="single" w:sz="4" w:space="0" w:color="7F7F7F" w:themeColor="text1" w:themeTint="80"/>
+        </w:tcBorders>
+      </w:tcPr>
+    </w:tblStylePr>
+    <w:tblStylePr w:type="band1Horz">
+      <w:tblPr/>
+      <w:tcPr>
+        <w:tcBorders>
+          <w:top w:val="single" w:sz="4" w:space="0" w:color="7F7F7F" w:themeColor="text1" w:themeTint="80"/>
+          <w:bottom w:val="single" w:sz="4" w:space="0" w:color="7F7F7F" w:themeColor="text1" w:themeTint="80"/>
+        </w:tcBorders>
+      </w:tcPr>
+    </w:tblStylePr>
+  </w:style>
 </w:styles>
 </file>
 

</xml_diff>

<commit_message>
Working on Appendix A
</commit_message>
<xml_diff>
--- a/Draft/6 Case Study.docx
+++ b/Draft/6 Case Study.docx
@@ -1,10 +1,10 @@
 
 <file path=word/document.xml><?xml version="1.0" encoding="utf-8"?>
-<w:document xmlns:wpc="http://schemas.microsoft.com/office/word/2010/wordprocessingCanvas" xmlns:cx="http://schemas.microsoft.com/office/drawing/2014/chartex" xmlns:cx1="http://schemas.microsoft.com/office/drawing/2015/9/8/chartex" xmlns:cx2="http://schemas.microsoft.com/office/drawing/2015/10/21/chartex" xmlns:cx3="http://schemas.microsoft.com/office/drawing/2016/5/9/chartex" xmlns:cx4="http://schemas.microsoft.com/office/drawing/2016/5/10/chartex" xmlns:cx5="http://schemas.microsoft.com/office/drawing/2016/5/11/chartex" xmlns:cx6="http://schemas.microsoft.com/office/drawing/2016/5/12/chartex" xmlns:cx7="http://schemas.microsoft.com/office/drawing/2016/5/13/chartex" xmlns:cx8="http://schemas.microsoft.com/office/drawing/2016/5/14/chartex" xmlns:mc="http://schemas.openxmlformats.org/markup-compatibility/2006" xmlns:aink="http://schemas.microsoft.com/office/drawing/2016/ink" xmlns:am3d="http://schemas.microsoft.com/office/drawing/2017/model3d" xmlns:o="urn:schemas-microsoft-com:office:office" xmlns:r="http://schemas.openxmlformats.org/officeDocument/2006/relationships" xmlns:m="http://schemas.openxmlformats.org/officeDocument/2006/math" xmlns:v="urn:schemas-microsoft-com:vml" xmlns:wp14="http://schemas.microsoft.com/office/word/2010/wordprocessingDrawing" xmlns:wp="http://schemas.openxmlformats.org/drawingml/2006/wordprocessingDrawing" xmlns:w10="urn:schemas-microsoft-com:office:word" xmlns:w="http://schemas.openxmlformats.org/wordprocessingml/2006/main" xmlns:w14="http://schemas.microsoft.com/office/word/2010/wordml" xmlns:w15="http://schemas.microsoft.com/office/word/2012/wordml" xmlns:w16cex="http://schemas.microsoft.com/office/word/2018/wordml/cex" xmlns:w16cid="http://schemas.microsoft.com/office/word/2016/wordml/cid" xmlns:w16="http://schemas.microsoft.com/office/word/2018/wordml" xmlns:w16sdtdh="http://schemas.microsoft.com/office/word/2020/wordml/sdtdatahash" xmlns:w16se="http://schemas.microsoft.com/office/word/2015/wordml/symex" xmlns:wpg="http://schemas.microsoft.com/office/word/2010/wordprocessingGroup" xmlns:wpi="http://schemas.microsoft.com/office/word/2010/wordprocessingInk" xmlns:wne="http://schemas.microsoft.com/office/word/2006/wordml" xmlns:wps="http://schemas.microsoft.com/office/word/2010/wordprocessingShape" mc:Ignorable="w14 w15 w16se w16cid w16 w16cex w16sdtdh wp14">
+<w:document xmlns:wpc="http://schemas.microsoft.com/office/word/2010/wordprocessingCanvas" xmlns:cx="http://schemas.microsoft.com/office/drawing/2014/chartex" xmlns:cx1="http://schemas.microsoft.com/office/drawing/2015/9/8/chartex" xmlns:cx2="http://schemas.microsoft.com/office/drawing/2015/10/21/chartex" xmlns:cx3="http://schemas.microsoft.com/office/drawing/2016/5/9/chartex" xmlns:cx4="http://schemas.microsoft.com/office/drawing/2016/5/10/chartex" xmlns:cx5="http://schemas.microsoft.com/office/drawing/2016/5/11/chartex" xmlns:cx6="http://schemas.microsoft.com/office/drawing/2016/5/12/chartex" xmlns:cx7="http://schemas.microsoft.com/office/drawing/2016/5/13/chartex" xmlns:cx8="http://schemas.microsoft.com/office/drawing/2016/5/14/chartex" xmlns:mc="http://schemas.openxmlformats.org/markup-compatibility/2006" xmlns:aink="http://schemas.microsoft.com/office/drawing/2016/ink" xmlns:am3d="http://schemas.microsoft.com/office/drawing/2017/model3d" xmlns:o="urn:schemas-microsoft-com:office:office" xmlns:oel="http://schemas.microsoft.com/office/2019/extlst" xmlns:r="http://schemas.openxmlformats.org/officeDocument/2006/relationships" xmlns:m="http://schemas.openxmlformats.org/officeDocument/2006/math" xmlns:v="urn:schemas-microsoft-com:vml" xmlns:wp14="http://schemas.microsoft.com/office/word/2010/wordprocessingDrawing" xmlns:wp="http://schemas.openxmlformats.org/drawingml/2006/wordprocessingDrawing" xmlns:w10="urn:schemas-microsoft-com:office:word" xmlns:w="http://schemas.openxmlformats.org/wordprocessingml/2006/main" xmlns:w14="http://schemas.microsoft.com/office/word/2010/wordml" xmlns:w15="http://schemas.microsoft.com/office/word/2012/wordml" xmlns:w16cex="http://schemas.microsoft.com/office/word/2018/wordml/cex" xmlns:w16cid="http://schemas.microsoft.com/office/word/2016/wordml/cid" xmlns:w16="http://schemas.microsoft.com/office/word/2018/wordml" xmlns:w16du="http://schemas.microsoft.com/office/word/2023/wordml/word16du" xmlns:w16sdtdh="http://schemas.microsoft.com/office/word/2020/wordml/sdtdatahash" xmlns:w16sdtfl="http://schemas.microsoft.com/office/word/2024/wordml/sdtformatlock" xmlns:w16se="http://schemas.microsoft.com/office/word/2015/wordml/symex" xmlns:wpg="http://schemas.microsoft.com/office/word/2010/wordprocessingGroup" xmlns:wpi="http://schemas.microsoft.com/office/word/2010/wordprocessingInk" xmlns:wne="http://schemas.microsoft.com/office/word/2006/wordml" xmlns:wps="http://schemas.microsoft.com/office/word/2010/wordprocessingShape" mc:Ignorable="w14 w15 w16se w16cid w16 w16cex w16sdtdh w16sdtfl w16du wp14">
   <w:body>
     <w:p>
       <w:pPr>
-        <w:pStyle w:val="Title"/>
+        <w:pStyle w:val="Ttulo"/>
         <w:rPr>
           <w:rFonts w:asciiTheme="majorHAnsi" w:hAnsiTheme="majorHAnsi" w:cstheme="majorHAnsi"/>
           <w:sz w:val="24"/>
@@ -264,7 +264,7 @@
     </w:p>
     <w:p>
       <w:pPr>
-        <w:pStyle w:val="Heading1"/>
+        <w:pStyle w:val="Ttulo1"/>
         <w:rPr>
           <w:rFonts w:asciiTheme="majorHAnsi" w:hAnsiTheme="majorHAnsi" w:cstheme="majorHAnsi"/>
           <w:sz w:val="24"/>
@@ -387,7 +387,7 @@
     </w:p>
     <w:p>
       <w:pPr>
-        <w:pStyle w:val="ListParagraph"/>
+        <w:pStyle w:val="Prrafodelista"/>
         <w:numPr>
           <w:ilvl w:val="0"/>
           <w:numId w:val="5"/>
@@ -411,7 +411,7 @@
     </w:p>
     <w:p>
       <w:pPr>
-        <w:pStyle w:val="ListParagraph"/>
+        <w:pStyle w:val="Prrafodelista"/>
         <w:numPr>
           <w:ilvl w:val="0"/>
           <w:numId w:val="5"/>
@@ -435,7 +435,7 @@
     </w:p>
     <w:p>
       <w:pPr>
-        <w:pStyle w:val="ListParagraph"/>
+        <w:pStyle w:val="Prrafodelista"/>
         <w:numPr>
           <w:ilvl w:val="0"/>
           <w:numId w:val="5"/>
@@ -461,7 +461,7 @@
     </w:p>
     <w:p>
       <w:pPr>
-        <w:pStyle w:val="ListParagraph"/>
+        <w:pStyle w:val="Prrafodelista"/>
         <w:numPr>
           <w:ilvl w:val="0"/>
           <w:numId w:val="5"/>
@@ -485,7 +485,7 @@
     </w:p>
     <w:p>
       <w:pPr>
-        <w:pStyle w:val="ListParagraph"/>
+        <w:pStyle w:val="Prrafodelista"/>
         <w:numPr>
           <w:ilvl w:val="0"/>
           <w:numId w:val="5"/>
@@ -509,7 +509,7 @@
     </w:p>
     <w:p>
       <w:pPr>
-        <w:pStyle w:val="ListParagraph"/>
+        <w:pStyle w:val="Prrafodelista"/>
         <w:numPr>
           <w:ilvl w:val="0"/>
           <w:numId w:val="5"/>
@@ -599,7 +599,7 @@
     </w:p>
     <w:p>
       <w:pPr>
-        <w:pStyle w:val="ListParagraph"/>
+        <w:pStyle w:val="Prrafodelista"/>
         <w:numPr>
           <w:ilvl w:val="0"/>
           <w:numId w:val="7"/>
@@ -623,7 +623,7 @@
     </w:p>
     <w:p>
       <w:pPr>
-        <w:pStyle w:val="ListParagraph"/>
+        <w:pStyle w:val="Prrafodelista"/>
         <w:numPr>
           <w:ilvl w:val="0"/>
           <w:numId w:val="7"/>
@@ -667,7 +667,7 @@
     </w:p>
     <w:p>
       <w:pPr>
-        <w:pStyle w:val="ListParagraph"/>
+        <w:pStyle w:val="Prrafodelista"/>
         <w:numPr>
           <w:ilvl w:val="0"/>
           <w:numId w:val="7"/>
@@ -692,7 +692,7 @@
     </w:p>
     <w:p>
       <w:pPr>
-        <w:pStyle w:val="ListParagraph"/>
+        <w:pStyle w:val="Prrafodelista"/>
         <w:numPr>
           <w:ilvl w:val="0"/>
           <w:numId w:val="7"/>
@@ -711,35 +711,95 @@
           <w:szCs w:val="24"/>
           <w:lang w:val="en-NZ"/>
         </w:rPr>
-        <w:t>Requirements and proposals from other stakeholders like local residents and the government.</w:t>
-      </w:r>
-    </w:p>
-    <w:p>
-      <w:pPr>
-        <w:rPr>
-          <w:rFonts w:asciiTheme="majorHAnsi" w:hAnsiTheme="majorHAnsi" w:cstheme="majorHAnsi"/>
-          <w:sz w:val="24"/>
-          <w:szCs w:val="24"/>
-          <w:lang w:val="en-NZ"/>
-        </w:rPr>
-      </w:pPr>
-      <w:r>
-        <w:rPr>
-          <w:rFonts w:asciiTheme="majorHAnsi" w:hAnsiTheme="majorHAnsi" w:cstheme="majorHAnsi"/>
-          <w:sz w:val="24"/>
-          <w:szCs w:val="24"/>
-          <w:lang w:val="en-NZ"/>
-        </w:rPr>
-        <w:t>The fictional client firm would be represented by several experts, most of them part of the faculty but not directly part of the teaching staff, but that where available to answer questions about their requirements and also about the work expected from each of the four roles present in the course.</w:t>
-      </w:r>
-      <w:r>
-        <w:rPr>
-          <w:rFonts w:asciiTheme="majorHAnsi" w:hAnsiTheme="majorHAnsi" w:cstheme="majorHAnsi"/>
-          <w:sz w:val="24"/>
-          <w:szCs w:val="24"/>
-          <w:lang w:val="en-NZ"/>
-        </w:rPr>
-        <w:t xml:space="preserve"> Additionally, each group would act as a task team in charge of the design and surveillance of the development of the project. ENBU 79X/89X acts as the capstone for four different programs, and each group had at least one representative of each role: Architectural Engineer, Construction Engineer, Construction Manager and Quantity Surveyor. The group was expected to coordinate efforts to create a coherent proposal for the development project, while fulfilling specific tasks and deliveries specific for each role. Finally, the group as a whole had to create weekly and milestone reports to the client, creating a summary document meant to explain the current state of the project in a way that tackles the different profiles that the fictional client firm was representing</w:t>
+        <w:t xml:space="preserve">Requirements and proposals from other stakeholders like </w:t>
+      </w:r>
+      <w:proofErr w:type="gramStart"/>
+      <w:r>
+        <w:rPr>
+          <w:rFonts w:asciiTheme="majorHAnsi" w:hAnsiTheme="majorHAnsi" w:cstheme="majorHAnsi"/>
+          <w:sz w:val="24"/>
+          <w:szCs w:val="24"/>
+          <w:lang w:val="en-NZ"/>
+        </w:rPr>
+        <w:t>local residents</w:t>
+      </w:r>
+      <w:proofErr w:type="gramEnd"/>
+      <w:r>
+        <w:rPr>
+          <w:rFonts w:asciiTheme="majorHAnsi" w:hAnsiTheme="majorHAnsi" w:cstheme="majorHAnsi"/>
+          <w:sz w:val="24"/>
+          <w:szCs w:val="24"/>
+          <w:lang w:val="en-NZ"/>
+        </w:rPr>
+        <w:t xml:space="preserve"> and the government.</w:t>
+      </w:r>
+    </w:p>
+    <w:p>
+      <w:pPr>
+        <w:rPr>
+          <w:rFonts w:asciiTheme="majorHAnsi" w:hAnsiTheme="majorHAnsi" w:cstheme="majorHAnsi"/>
+          <w:sz w:val="24"/>
+          <w:szCs w:val="24"/>
+          <w:lang w:val="en-NZ"/>
+        </w:rPr>
+      </w:pPr>
+      <w:r>
+        <w:rPr>
+          <w:rFonts w:asciiTheme="majorHAnsi" w:hAnsiTheme="majorHAnsi" w:cstheme="majorHAnsi"/>
+          <w:sz w:val="24"/>
+          <w:szCs w:val="24"/>
+          <w:lang w:val="en-NZ"/>
+        </w:rPr>
+        <w:t xml:space="preserve">The fictional client firm would be represented by several experts, most of them part of the faculty but not directly part of the teaching staff, but that where available to answer questions about their requirements </w:t>
+      </w:r>
+      <w:proofErr w:type="gramStart"/>
+      <w:r>
+        <w:rPr>
+          <w:rFonts w:asciiTheme="majorHAnsi" w:hAnsiTheme="majorHAnsi" w:cstheme="majorHAnsi"/>
+          <w:sz w:val="24"/>
+          <w:szCs w:val="24"/>
+          <w:lang w:val="en-NZ"/>
+        </w:rPr>
+        <w:t>and also</w:t>
+      </w:r>
+      <w:proofErr w:type="gramEnd"/>
+      <w:r>
+        <w:rPr>
+          <w:rFonts w:asciiTheme="majorHAnsi" w:hAnsiTheme="majorHAnsi" w:cstheme="majorHAnsi"/>
+          <w:sz w:val="24"/>
+          <w:szCs w:val="24"/>
+          <w:lang w:val="en-NZ"/>
+        </w:rPr>
+        <w:t xml:space="preserve"> about the work expected from each of the four roles present in the course.</w:t>
+      </w:r>
+      <w:r>
+        <w:rPr>
+          <w:rFonts w:asciiTheme="majorHAnsi" w:hAnsiTheme="majorHAnsi" w:cstheme="majorHAnsi"/>
+          <w:sz w:val="24"/>
+          <w:szCs w:val="24"/>
+          <w:lang w:val="en-NZ"/>
+        </w:rPr>
+        <w:t xml:space="preserve"> Additionally, each group would act as a task team in charge of the design and surveillance of the development of the project. ENBU 79X/89X acts as the capstone for four different programs, and each group had at least one representative of each role: Architectural Engineer, Construction Engineer, Construction Manager and Quantity Surveyor. The group was expected to coordinate efforts to create a coherent proposal for the development project, while fulfilling specific tasks and deliveries specific for each role. Finally, the group </w:t>
+      </w:r>
+      <w:proofErr w:type="gramStart"/>
+      <w:r>
+        <w:rPr>
+          <w:rFonts w:asciiTheme="majorHAnsi" w:hAnsiTheme="majorHAnsi" w:cstheme="majorHAnsi"/>
+          <w:sz w:val="24"/>
+          <w:szCs w:val="24"/>
+          <w:lang w:val="en-NZ"/>
+        </w:rPr>
+        <w:t>as a whole had</w:t>
+      </w:r>
+      <w:proofErr w:type="gramEnd"/>
+      <w:r>
+        <w:rPr>
+          <w:rFonts w:asciiTheme="majorHAnsi" w:hAnsiTheme="majorHAnsi" w:cstheme="majorHAnsi"/>
+          <w:sz w:val="24"/>
+          <w:szCs w:val="24"/>
+          <w:lang w:val="en-NZ"/>
+        </w:rPr>
+        <w:t xml:space="preserve"> to create weekly and milestone reports to the client, creating a summary document meant to explain the current state of the project in a way that tackles the different profiles that the fictional client firm was representing</w:t>
       </w:r>
       <w:r>
         <w:rPr>
@@ -805,7 +865,27 @@
           <w:szCs w:val="24"/>
           <w:lang w:val="en-NZ"/>
         </w:rPr>
-        <w:t>The final methodological implementation of the course is the open work sessions, which represent the majority of the time spend by the students in the course. As the name suggest, they are open in nature, allowing the students to use the time in the classroom (about two sessions of 1 hour per week, depending on the length of other activities) to meet with their group or with other students to organize their work and progress towards the competition of the different deliverables. These sessions also allowed the students to have direct access to the teaching staff and a somewhat reliable access to their peers, specially to the students fulfilling the role of Architectural Engineers, that had to be shared among several groups.</w:t>
+        <w:t xml:space="preserve">The final methodological implementation of the course is the open work sessions, which represent </w:t>
+      </w:r>
+      <w:proofErr w:type="gramStart"/>
+      <w:r>
+        <w:rPr>
+          <w:rFonts w:asciiTheme="majorHAnsi" w:hAnsiTheme="majorHAnsi" w:cstheme="majorHAnsi"/>
+          <w:sz w:val="24"/>
+          <w:szCs w:val="24"/>
+          <w:lang w:val="en-NZ"/>
+        </w:rPr>
+        <w:t>the majority of</w:t>
+      </w:r>
+      <w:proofErr w:type="gramEnd"/>
+      <w:r>
+        <w:rPr>
+          <w:rFonts w:asciiTheme="majorHAnsi" w:hAnsiTheme="majorHAnsi" w:cstheme="majorHAnsi"/>
+          <w:sz w:val="24"/>
+          <w:szCs w:val="24"/>
+          <w:lang w:val="en-NZ"/>
+        </w:rPr>
+        <w:t xml:space="preserve"> the time spend by the students in the course. As the name suggest, they are open in nature, allowing the students to use the time in the classroom (about two sessions of 1 hour per week, depending on the length of other activities) to meet with their group or with other students to organize their work and progress towards the competition of the different deliverables. These sessions also allowed the students to have direct access to the teaching staff and a somewhat reliable access to their peers, specially to the students fulfilling the role of Architectural Engineers, that had to be shared among several groups.</w:t>
       </w:r>
     </w:p>
     <w:p>
@@ -845,7 +925,27 @@
           <w:szCs w:val="24"/>
           <w:lang w:val="en-NZ"/>
         </w:rPr>
-        <w:t xml:space="preserve"> as a group, but each student presents at the end his own oral presentation and final client report to be marked. The main assessment tools are the oral presentations and the final client report. The presentations consist on short 5-minute presentations about the overall proposal of the group for the project, the current state of development and the personal contributions of the students </w:t>
+        <w:t xml:space="preserve"> as a group, but each student presents at the end his own oral presentation and final client report to be marked. The main assessment tools are the oral presentations and the final client report. The presentations consist </w:t>
+      </w:r>
+      <w:proofErr w:type="gramStart"/>
+      <w:r>
+        <w:rPr>
+          <w:rFonts w:asciiTheme="majorHAnsi" w:hAnsiTheme="majorHAnsi" w:cstheme="majorHAnsi"/>
+          <w:sz w:val="24"/>
+          <w:szCs w:val="24"/>
+          <w:lang w:val="en-NZ"/>
+        </w:rPr>
+        <w:t>on</w:t>
+      </w:r>
+      <w:proofErr w:type="gramEnd"/>
+      <w:r>
+        <w:rPr>
+          <w:rFonts w:asciiTheme="majorHAnsi" w:hAnsiTheme="majorHAnsi" w:cstheme="majorHAnsi"/>
+          <w:sz w:val="24"/>
+          <w:szCs w:val="24"/>
+          <w:lang w:val="en-NZ"/>
+        </w:rPr>
+        <w:t xml:space="preserve"> short 5-minute presentations about the overall proposal of the group for the project, the current state of development and the personal contributions of the students </w:t>
       </w:r>
       <w:proofErr w:type="spellStart"/>
       <w:r>
@@ -956,7 +1056,27 @@
           <w:szCs w:val="24"/>
           <w:lang w:val="en-NZ"/>
         </w:rPr>
-        <w:t xml:space="preserve"> The final report was marked, and consisted on a quick summary of the personal contributions of each student in the project, as well as a reflection of the work done by the group, the problems found and the steps taken to solve them.</w:t>
+        <w:t xml:space="preserve"> The final report was marked, and consisted </w:t>
+      </w:r>
+      <w:proofErr w:type="gramStart"/>
+      <w:r>
+        <w:rPr>
+          <w:rFonts w:asciiTheme="majorHAnsi" w:hAnsiTheme="majorHAnsi" w:cstheme="majorHAnsi"/>
+          <w:sz w:val="24"/>
+          <w:szCs w:val="24"/>
+          <w:lang w:val="en-NZ"/>
+        </w:rPr>
+        <w:t>on</w:t>
+      </w:r>
+      <w:proofErr w:type="gramEnd"/>
+      <w:r>
+        <w:rPr>
+          <w:rFonts w:asciiTheme="majorHAnsi" w:hAnsiTheme="majorHAnsi" w:cstheme="majorHAnsi"/>
+          <w:sz w:val="24"/>
+          <w:szCs w:val="24"/>
+          <w:lang w:val="en-NZ"/>
+        </w:rPr>
+        <w:t xml:space="preserve"> a quick summary of the personal contributions of each student in the project, as well as a reflection of the work done by the group, the problems found and the steps taken to solve them.</w:t>
       </w:r>
     </w:p>
     <w:p>
@@ -989,7 +1109,7 @@
     </w:p>
     <w:p>
       <w:pPr>
-        <w:pStyle w:val="ListParagraph"/>
+        <w:pStyle w:val="Prrafodelista"/>
         <w:numPr>
           <w:ilvl w:val="0"/>
           <w:numId w:val="8"/>
@@ -1008,12 +1128,32 @@
           <w:szCs w:val="24"/>
           <w:lang w:val="en-NZ"/>
         </w:rPr>
-        <w:t>An architectural design for a building complex that takes into account the geotechnical data of the construction site, the functional necessities of the project and the complications and peculiarities found in the selected site.</w:t>
-      </w:r>
-    </w:p>
-    <w:p>
-      <w:pPr>
-        <w:pStyle w:val="ListParagraph"/>
+        <w:t xml:space="preserve">An architectural design for a building complex that </w:t>
+      </w:r>
+      <w:proofErr w:type="gramStart"/>
+      <w:r>
+        <w:rPr>
+          <w:rFonts w:asciiTheme="majorHAnsi" w:hAnsiTheme="majorHAnsi" w:cstheme="majorHAnsi"/>
+          <w:sz w:val="24"/>
+          <w:szCs w:val="24"/>
+          <w:lang w:val="en-NZ"/>
+        </w:rPr>
+        <w:t>takes into account</w:t>
+      </w:r>
+      <w:proofErr w:type="gramEnd"/>
+      <w:r>
+        <w:rPr>
+          <w:rFonts w:asciiTheme="majorHAnsi" w:hAnsiTheme="majorHAnsi" w:cstheme="majorHAnsi"/>
+          <w:sz w:val="24"/>
+          <w:szCs w:val="24"/>
+          <w:lang w:val="en-NZ"/>
+        </w:rPr>
+        <w:t xml:space="preserve"> the geotechnical data of the construction site, the functional necessities of the project and the complications and peculiarities found in the selected site.</w:t>
+      </w:r>
+    </w:p>
+    <w:p>
+      <w:pPr>
+        <w:pStyle w:val="Prrafodelista"/>
         <w:numPr>
           <w:ilvl w:val="0"/>
           <w:numId w:val="8"/>
@@ -1037,7 +1177,7 @@
     </w:p>
     <w:p>
       <w:pPr>
-        <w:pStyle w:val="ListParagraph"/>
+        <w:pStyle w:val="Prrafodelista"/>
         <w:numPr>
           <w:ilvl w:val="0"/>
           <w:numId w:val="8"/>
@@ -1061,7 +1201,7 @@
     </w:p>
     <w:p>
       <w:pPr>
-        <w:pStyle w:val="ListParagraph"/>
+        <w:pStyle w:val="Prrafodelista"/>
         <w:numPr>
           <w:ilvl w:val="0"/>
           <w:numId w:val="8"/>
@@ -1099,7 +1239,27 @@
           <w:szCs w:val="24"/>
           <w:lang w:val="en-NZ"/>
         </w:rPr>
-        <w:t xml:space="preserve">It is important to remark that all of these objectives are evaluated in two fronts, first, the work done by the group, how information flowed across the different roles and how </w:t>
+        <w:t xml:space="preserve">It is important to remark that </w:t>
+      </w:r>
+      <w:proofErr w:type="gramStart"/>
+      <w:r>
+        <w:rPr>
+          <w:rFonts w:asciiTheme="majorHAnsi" w:hAnsiTheme="majorHAnsi" w:cstheme="majorHAnsi"/>
+          <w:sz w:val="24"/>
+          <w:szCs w:val="24"/>
+          <w:lang w:val="en-NZ"/>
+        </w:rPr>
+        <w:t>all of</w:t>
+      </w:r>
+      <w:proofErr w:type="gramEnd"/>
+      <w:r>
+        <w:rPr>
+          <w:rFonts w:asciiTheme="majorHAnsi" w:hAnsiTheme="majorHAnsi" w:cstheme="majorHAnsi"/>
+          <w:sz w:val="24"/>
+          <w:szCs w:val="24"/>
+          <w:lang w:val="en-NZ"/>
+        </w:rPr>
+        <w:t xml:space="preserve"> these objectives are evaluated in two fronts, first, the work done by the group, how information flowed across the different roles and how </w:t>
       </w:r>
       <w:r>
         <w:rPr>
@@ -1200,12 +1360,32 @@
           <w:lang w:val="en-NZ"/>
         </w:rPr>
         <w:lastRenderedPageBreak/>
-        <w:t>This summarizes the main elements of the learning design proposed for ENBU 79X/89X Industry Project and the methodologies used to implement that design. Some other aspect of the development of the course were present, like the role of the teaching assistances during the open work sessions and the organization between track A and track B students that will be explained in more detail during the development of the case study. For now, there is enough information here to stablish how WorkshopAR was integrated into de learning design of the course and how the goals of the software tool were implemented and coordinated with the activities of the course.</w:t>
-      </w:r>
-    </w:p>
-    <w:p>
-      <w:pPr>
-        <w:pStyle w:val="Heading1"/>
+        <w:t xml:space="preserve">This summarizes the main elements of the learning design proposed for ENBU 79X/89X Industry Project and the methodologies used to implement that design. Some other aspect of the development of the course </w:t>
+      </w:r>
+      <w:proofErr w:type="gramStart"/>
+      <w:r>
+        <w:rPr>
+          <w:rFonts w:asciiTheme="majorHAnsi" w:hAnsiTheme="majorHAnsi" w:cstheme="majorHAnsi"/>
+          <w:sz w:val="24"/>
+          <w:szCs w:val="24"/>
+          <w:lang w:val="en-NZ"/>
+        </w:rPr>
+        <w:t>were</w:t>
+      </w:r>
+      <w:proofErr w:type="gramEnd"/>
+      <w:r>
+        <w:rPr>
+          <w:rFonts w:asciiTheme="majorHAnsi" w:hAnsiTheme="majorHAnsi" w:cstheme="majorHAnsi"/>
+          <w:sz w:val="24"/>
+          <w:szCs w:val="24"/>
+          <w:lang w:val="en-NZ"/>
+        </w:rPr>
+        <w:t xml:space="preserve"> present, like the role of the teaching assistances during the open work sessions and the organization between track A and track B students that will be explained in more detail during the development of the case study. For now, there is enough information here to stablish how WorkshopAR was integrated into de learning design of the course and how the goals of the software tool were implemented and coordinated with the activities of the course.</w:t>
+      </w:r>
+    </w:p>
+    <w:p>
+      <w:pPr>
+        <w:pStyle w:val="Ttulo1"/>
         <w:rPr>
           <w:rFonts w:asciiTheme="majorHAnsi" w:hAnsiTheme="majorHAnsi" w:cstheme="majorHAnsi"/>
           <w:sz w:val="24"/>
@@ -1371,7 +1551,27 @@
           <w:szCs w:val="24"/>
           <w:lang w:val="en-NZ"/>
         </w:rPr>
-        <w:t>For this learning objective it is also interesting to observe the types of collaboration being used by the students as described by Salmons (2019), and if WorkshopAR was promoting or helping in the development of a particular form of collaboration. In general, the digital space created by WorkshopAR would facilitate activities of co-creation, by allowing the testing and record of ideas for the architectural design, and also transfer activities, by offering visuals that can be used to explain concepts, decisions or design proposals.</w:t>
+        <w:t xml:space="preserve">For this learning objective it is also interesting to observe the types of collaboration being used by the students as described by Salmons (2019), and if WorkshopAR was promoting or helping in the development of a particular form of collaboration. In general, the digital space created by WorkshopAR would facilitate activities of co-creation, by allowing the testing and record of ideas for the architectural design, </w:t>
+      </w:r>
+      <w:proofErr w:type="gramStart"/>
+      <w:r>
+        <w:rPr>
+          <w:rFonts w:asciiTheme="majorHAnsi" w:hAnsiTheme="majorHAnsi" w:cstheme="majorHAnsi"/>
+          <w:sz w:val="24"/>
+          <w:szCs w:val="24"/>
+          <w:lang w:val="en-NZ"/>
+        </w:rPr>
+        <w:t>and also</w:t>
+      </w:r>
+      <w:proofErr w:type="gramEnd"/>
+      <w:r>
+        <w:rPr>
+          <w:rFonts w:asciiTheme="majorHAnsi" w:hAnsiTheme="majorHAnsi" w:cstheme="majorHAnsi"/>
+          <w:sz w:val="24"/>
+          <w:szCs w:val="24"/>
+          <w:lang w:val="en-NZ"/>
+        </w:rPr>
+        <w:t xml:space="preserve"> transfer activities, by offering visuals that can be used to explain concepts, decisions or design proposals.</w:t>
       </w:r>
     </w:p>
     <w:p>
@@ -1466,7 +1666,47 @@
           <w:szCs w:val="24"/>
           <w:lang w:val="en-NZ"/>
         </w:rPr>
-        <w:t xml:space="preserve"> not dedicates one particular functionality to support this learning objective, relying more on the use of all the previously mentioned use cases to offer </w:t>
+        <w:t xml:space="preserve"> </w:t>
+      </w:r>
+      <w:proofErr w:type="gramStart"/>
+      <w:r>
+        <w:rPr>
+          <w:rFonts w:asciiTheme="majorHAnsi" w:hAnsiTheme="majorHAnsi" w:cstheme="majorHAnsi"/>
+          <w:sz w:val="24"/>
+          <w:szCs w:val="24"/>
+          <w:lang w:val="en-NZ"/>
+        </w:rPr>
+        <w:t>not dedicates</w:t>
+      </w:r>
+      <w:proofErr w:type="gramEnd"/>
+      <w:r>
+        <w:rPr>
+          <w:rFonts w:asciiTheme="majorHAnsi" w:hAnsiTheme="majorHAnsi" w:cstheme="majorHAnsi"/>
+          <w:sz w:val="24"/>
+          <w:szCs w:val="24"/>
+          <w:lang w:val="en-NZ"/>
+        </w:rPr>
+        <w:t xml:space="preserve"> one </w:t>
+      </w:r>
+      <w:proofErr w:type="gramStart"/>
+      <w:r>
+        <w:rPr>
+          <w:rFonts w:asciiTheme="majorHAnsi" w:hAnsiTheme="majorHAnsi" w:cstheme="majorHAnsi"/>
+          <w:sz w:val="24"/>
+          <w:szCs w:val="24"/>
+          <w:lang w:val="en-NZ"/>
+        </w:rPr>
+        <w:t>particular functionality</w:t>
+      </w:r>
+      <w:proofErr w:type="gramEnd"/>
+      <w:r>
+        <w:rPr>
+          <w:rFonts w:asciiTheme="majorHAnsi" w:hAnsiTheme="majorHAnsi" w:cstheme="majorHAnsi"/>
+          <w:sz w:val="24"/>
+          <w:szCs w:val="24"/>
+          <w:lang w:val="en-NZ"/>
+        </w:rPr>
+        <w:t xml:space="preserve"> to support this learning objective, relying more on the use of all the previously mentioned use cases to offer </w:t>
       </w:r>
       <w:r>
         <w:rPr>
@@ -1503,7 +1743,27 @@
           <w:szCs w:val="24"/>
           <w:lang w:val="en-NZ"/>
         </w:rPr>
-        <w:t>The learning objectives of WorkshopAR were designed taking into consideration the design of Industry Project, and meant to help the students to tackle the course objective of constant communication and coordination of tasks. Figure 1 shows an ideal flow of activities during the development of a classroom session, which incorporates the main activities proposed in the course design (class housekeep, weekly workshops, open work sessions) with an idealized version of a work session that a group could perform while using WorkshopAR.</w:t>
+        <w:t xml:space="preserve">The learning objectives of WorkshopAR were designed taking into consideration the design of Industry </w:t>
+      </w:r>
+      <w:proofErr w:type="gramStart"/>
+      <w:r>
+        <w:rPr>
+          <w:rFonts w:asciiTheme="majorHAnsi" w:hAnsiTheme="majorHAnsi" w:cstheme="majorHAnsi"/>
+          <w:sz w:val="24"/>
+          <w:szCs w:val="24"/>
+          <w:lang w:val="en-NZ"/>
+        </w:rPr>
+        <w:t>Project, and</w:t>
+      </w:r>
+      <w:proofErr w:type="gramEnd"/>
+      <w:r>
+        <w:rPr>
+          <w:rFonts w:asciiTheme="majorHAnsi" w:hAnsiTheme="majorHAnsi" w:cstheme="majorHAnsi"/>
+          <w:sz w:val="24"/>
+          <w:szCs w:val="24"/>
+          <w:lang w:val="en-NZ"/>
+        </w:rPr>
+        <w:t xml:space="preserve"> meant to help the students to tackle the course objective of constant communication and coordination of tasks. Figure 1 shows an ideal flow of activities during the development of a classroom session, which incorporates the main activities proposed in the course design (class housekeep, weekly workshops, open work sessions) with an idealized version of a work session that a group could perform while using WorkshopAR.</w:t>
       </w:r>
     </w:p>
     <w:p>
@@ -1570,7 +1830,7 @@
     </w:p>
     <w:p>
       <w:pPr>
-        <w:pStyle w:val="Caption"/>
+        <w:pStyle w:val="Descripcin"/>
         <w:jc w:val="center"/>
         <w:rPr>
           <w:lang w:val="en-NZ"/>
@@ -1642,7 +1902,7 @@
     </w:p>
     <w:p>
       <w:pPr>
-        <w:pStyle w:val="ListParagraph"/>
+        <w:pStyle w:val="Prrafodelista"/>
         <w:numPr>
           <w:ilvl w:val="0"/>
           <w:numId w:val="9"/>
@@ -1666,7 +1926,7 @@
     </w:p>
     <w:p>
       <w:pPr>
-        <w:pStyle w:val="ListParagraph"/>
+        <w:pStyle w:val="Prrafodelista"/>
         <w:numPr>
           <w:ilvl w:val="0"/>
           <w:numId w:val="9"/>
@@ -1770,16 +2030,7 @@
           <w:szCs w:val="24"/>
           <w:lang w:val="en-NZ"/>
         </w:rPr>
-        <w:t xml:space="preserve">Knowledge flow in project-based approaches is also an issue that have been discussed in the past </w:t>
-      </w:r>
-      <w:r>
-        <w:rPr>
-          <w:rFonts w:asciiTheme="majorHAnsi" w:hAnsiTheme="majorHAnsi" w:cstheme="majorHAnsi"/>
-          <w:sz w:val="24"/>
-          <w:szCs w:val="24"/>
-          <w:lang w:val="en-NZ"/>
-        </w:rPr>
-        <w:t>(</w:t>
+        <w:t>Knowledge flow in project-based approaches is also an issue that have been discussed in the past (</w:t>
       </w:r>
       <w:proofErr w:type="spellStart"/>
       <w:r>
@@ -1799,16 +2050,7 @@
           <w:szCs w:val="24"/>
           <w:lang w:val="en-NZ"/>
         </w:rPr>
-        <w:t xml:space="preserve"> et al., 2016</w:t>
-      </w:r>
-      <w:r>
-        <w:rPr>
-          <w:rFonts w:asciiTheme="majorHAnsi" w:hAnsiTheme="majorHAnsi" w:cstheme="majorHAnsi"/>
-          <w:sz w:val="24"/>
-          <w:szCs w:val="24"/>
-          <w:lang w:val="en-NZ"/>
-        </w:rPr>
-        <w:t xml:space="preserve"> and </w:t>
+        <w:t xml:space="preserve"> et al., 2016 and Granado-</w:t>
       </w:r>
       <w:proofErr w:type="spellStart"/>
       <w:r>
@@ -1818,7 +2060,7 @@
           <w:szCs w:val="24"/>
           <w:lang w:val="en-NZ"/>
         </w:rPr>
-        <w:t>Granado-Alcón</w:t>
+        <w:t>Alcón</w:t>
       </w:r>
       <w:proofErr w:type="spellEnd"/>
       <w:r>
@@ -1828,16 +2070,7 @@
           <w:szCs w:val="24"/>
           <w:lang w:val="en-NZ"/>
         </w:rPr>
-        <w:t xml:space="preserve"> et al., 2020</w:t>
-      </w:r>
-      <w:r>
-        <w:rPr>
-          <w:rFonts w:asciiTheme="majorHAnsi" w:hAnsiTheme="majorHAnsi" w:cstheme="majorHAnsi"/>
-          <w:sz w:val="24"/>
-          <w:szCs w:val="24"/>
-          <w:lang w:val="en-NZ"/>
-        </w:rPr>
-        <w:t xml:space="preserve"> and </w:t>
+        <w:t xml:space="preserve"> et al., 2020 and </w:t>
       </w:r>
       <w:proofErr w:type="spellStart"/>
       <w:r>
@@ -1857,16 +2090,7 @@
           <w:szCs w:val="24"/>
           <w:lang w:val="en-NZ"/>
         </w:rPr>
-        <w:t>, 2019)</w:t>
-      </w:r>
-      <w:r>
-        <w:rPr>
-          <w:rFonts w:asciiTheme="majorHAnsi" w:hAnsiTheme="majorHAnsi" w:cstheme="majorHAnsi"/>
-          <w:sz w:val="24"/>
-          <w:szCs w:val="24"/>
-          <w:lang w:val="en-NZ"/>
-        </w:rPr>
-        <w:t xml:space="preserve">. A possible barrier for any group in the curse could be to have issues </w:t>
+        <w:t xml:space="preserve">, 2019). A possible barrier for any group in the curse could be to have issues </w:t>
       </w:r>
       <w:r>
         <w:rPr>
@@ -1937,7 +2161,7 @@
     </w:p>
     <w:p>
       <w:pPr>
-        <w:pStyle w:val="Heading1"/>
+        <w:pStyle w:val="Ttulo1"/>
         <w:rPr>
           <w:rFonts w:asciiTheme="majorHAnsi" w:hAnsiTheme="majorHAnsi" w:cstheme="majorHAnsi"/>
           <w:sz w:val="24"/>
@@ -2013,7 +2237,7 @@
     </w:p>
     <w:p>
       <w:pPr>
-        <w:pStyle w:val="Heading2"/>
+        <w:pStyle w:val="Ttulo2"/>
         <w:rPr>
           <w:rFonts w:asciiTheme="majorHAnsi" w:hAnsiTheme="majorHAnsi" w:cstheme="majorHAnsi"/>
           <w:sz w:val="24"/>
@@ -2146,7 +2370,7 @@
     </w:p>
     <w:p>
       <w:pPr>
-        <w:pStyle w:val="Heading2"/>
+        <w:pStyle w:val="Ttulo2"/>
         <w:rPr>
           <w:rFonts w:asciiTheme="majorHAnsi" w:hAnsiTheme="majorHAnsi" w:cstheme="majorHAnsi"/>
           <w:sz w:val="24"/>
@@ -2290,7 +2514,7 @@
     </w:p>
     <w:p>
       <w:pPr>
-        <w:pStyle w:val="ListParagraph"/>
+        <w:pStyle w:val="Prrafodelista"/>
         <w:numPr>
           <w:ilvl w:val="0"/>
           <w:numId w:val="1"/>
@@ -2314,7 +2538,7 @@
     </w:p>
     <w:p>
       <w:pPr>
-        <w:pStyle w:val="ListParagraph"/>
+        <w:pStyle w:val="Prrafodelista"/>
         <w:numPr>
           <w:ilvl w:val="0"/>
           <w:numId w:val="1"/>
@@ -2352,7 +2576,27 @@
           <w:szCs w:val="24"/>
           <w:lang w:val="en-NZ"/>
         </w:rPr>
-        <w:t xml:space="preserve">These guidelines stablished that the main focus for the teaching staff during the observations was to identify and characterize the relationship created with the students. It was also used to identify how collaboration was being taught and enforced, and if there </w:t>
+        <w:t xml:space="preserve">These guidelines stablished that the </w:t>
+      </w:r>
+      <w:proofErr w:type="gramStart"/>
+      <w:r>
+        <w:rPr>
+          <w:rFonts w:asciiTheme="majorHAnsi" w:hAnsiTheme="majorHAnsi" w:cstheme="majorHAnsi"/>
+          <w:sz w:val="24"/>
+          <w:szCs w:val="24"/>
+          <w:lang w:val="en-NZ"/>
+        </w:rPr>
+        <w:t>main focus</w:t>
+      </w:r>
+      <w:proofErr w:type="gramEnd"/>
+      <w:r>
+        <w:rPr>
+          <w:rFonts w:asciiTheme="majorHAnsi" w:hAnsiTheme="majorHAnsi" w:cstheme="majorHAnsi"/>
+          <w:sz w:val="24"/>
+          <w:szCs w:val="24"/>
+          <w:lang w:val="en-NZ"/>
+        </w:rPr>
+        <w:t xml:space="preserve"> for the teaching staff during the observations was to identify and characterize the relationship created with the students. It was also used to identify how collaboration was being taught and enforced, and if there </w:t>
       </w:r>
       <w:r>
         <w:rPr>
@@ -2381,7 +2625,47 @@
           <w:szCs w:val="24"/>
           <w:lang w:val="en-NZ"/>
         </w:rPr>
-        <w:t xml:space="preserve">The second type of observations was of the general groupwork performed by the students. These work sessions often involved more than one group at a time and the main focus was on gathering information with minimal intervention, sometimes asking quick questions to clarify as </w:t>
+        <w:t xml:space="preserve">The second type of observations was of the general groupwork performed by the students. These work sessions often involved more than one group at a </w:t>
+      </w:r>
+      <w:proofErr w:type="gramStart"/>
+      <w:r>
+        <w:rPr>
+          <w:rFonts w:asciiTheme="majorHAnsi" w:hAnsiTheme="majorHAnsi" w:cstheme="majorHAnsi"/>
+          <w:sz w:val="24"/>
+          <w:szCs w:val="24"/>
+          <w:lang w:val="en-NZ"/>
+        </w:rPr>
+        <w:t>time</w:t>
+      </w:r>
+      <w:proofErr w:type="gramEnd"/>
+      <w:r>
+        <w:rPr>
+          <w:rFonts w:asciiTheme="majorHAnsi" w:hAnsiTheme="majorHAnsi" w:cstheme="majorHAnsi"/>
+          <w:sz w:val="24"/>
+          <w:szCs w:val="24"/>
+          <w:lang w:val="en-NZ"/>
+        </w:rPr>
+        <w:t xml:space="preserve"> and the </w:t>
+      </w:r>
+      <w:proofErr w:type="gramStart"/>
+      <w:r>
+        <w:rPr>
+          <w:rFonts w:asciiTheme="majorHAnsi" w:hAnsiTheme="majorHAnsi" w:cstheme="majorHAnsi"/>
+          <w:sz w:val="24"/>
+          <w:szCs w:val="24"/>
+          <w:lang w:val="en-NZ"/>
+        </w:rPr>
+        <w:t>main focus</w:t>
+      </w:r>
+      <w:proofErr w:type="gramEnd"/>
+      <w:r>
+        <w:rPr>
+          <w:rFonts w:asciiTheme="majorHAnsi" w:hAnsiTheme="majorHAnsi" w:cstheme="majorHAnsi"/>
+          <w:sz w:val="24"/>
+          <w:szCs w:val="24"/>
+          <w:lang w:val="en-NZ"/>
+        </w:rPr>
+        <w:t xml:space="preserve"> was on gathering information with minimal intervention, sometimes asking quick questions to clarify as </w:t>
       </w:r>
       <w:r>
         <w:rPr>
@@ -2409,7 +2693,27 @@
           <w:szCs w:val="24"/>
           <w:lang w:val="en-NZ"/>
         </w:rPr>
-        <w:t>These observations helped to understand the general dynamics of the groups, and the activities being completed for the project. They also constituted the “baseline” observations for those activities that were not using the AR tool, and became the main point of comparison with the other observations.</w:t>
+        <w:t xml:space="preserve">These observations helped to understand the general dynamics of the groups, and the activities being completed for the project. They also constituted the “baseline” observations for those activities that were not using the AR </w:t>
+      </w:r>
+      <w:proofErr w:type="gramStart"/>
+      <w:r>
+        <w:rPr>
+          <w:rFonts w:asciiTheme="majorHAnsi" w:hAnsiTheme="majorHAnsi" w:cstheme="majorHAnsi"/>
+          <w:sz w:val="24"/>
+          <w:szCs w:val="24"/>
+          <w:lang w:val="en-NZ"/>
+        </w:rPr>
+        <w:t>tool, and</w:t>
+      </w:r>
+      <w:proofErr w:type="gramEnd"/>
+      <w:r>
+        <w:rPr>
+          <w:rFonts w:asciiTheme="majorHAnsi" w:hAnsiTheme="majorHAnsi" w:cstheme="majorHAnsi"/>
+          <w:sz w:val="24"/>
+          <w:szCs w:val="24"/>
+          <w:lang w:val="en-NZ"/>
+        </w:rPr>
+        <w:t xml:space="preserve"> became the main point of comparison with the other observations.</w:t>
       </w:r>
     </w:p>
     <w:p>
@@ -2433,7 +2737,7 @@
     </w:p>
     <w:p>
       <w:pPr>
-        <w:pStyle w:val="ListParagraph"/>
+        <w:pStyle w:val="Prrafodelista"/>
         <w:numPr>
           <w:ilvl w:val="0"/>
           <w:numId w:val="2"/>
@@ -2457,7 +2761,7 @@
     </w:p>
     <w:p>
       <w:pPr>
-        <w:pStyle w:val="ListParagraph"/>
+        <w:pStyle w:val="Prrafodelista"/>
         <w:numPr>
           <w:ilvl w:val="0"/>
           <w:numId w:val="2"/>
@@ -2481,7 +2785,7 @@
     </w:p>
     <w:p>
       <w:pPr>
-        <w:pStyle w:val="ListParagraph"/>
+        <w:pStyle w:val="Prrafodelista"/>
         <w:numPr>
           <w:ilvl w:val="0"/>
           <w:numId w:val="2"/>
@@ -2524,7 +2828,7 @@
     </w:p>
     <w:p>
       <w:pPr>
-        <w:pStyle w:val="ListParagraph"/>
+        <w:pStyle w:val="Prrafodelista"/>
         <w:numPr>
           <w:ilvl w:val="0"/>
           <w:numId w:val="3"/>
@@ -2548,7 +2852,7 @@
     </w:p>
     <w:p>
       <w:pPr>
-        <w:pStyle w:val="ListParagraph"/>
+        <w:pStyle w:val="Prrafodelista"/>
         <w:numPr>
           <w:ilvl w:val="0"/>
           <w:numId w:val="3"/>
@@ -2572,7 +2876,7 @@
     </w:p>
     <w:p>
       <w:pPr>
-        <w:pStyle w:val="ListParagraph"/>
+        <w:pStyle w:val="Prrafodelista"/>
         <w:numPr>
           <w:ilvl w:val="0"/>
           <w:numId w:val="3"/>
@@ -2615,7 +2919,7 @@
     </w:p>
     <w:p>
       <w:pPr>
-        <w:pStyle w:val="ListParagraph"/>
+        <w:pStyle w:val="Prrafodelista"/>
         <w:numPr>
           <w:ilvl w:val="0"/>
           <w:numId w:val="4"/>
@@ -2639,7 +2943,7 @@
     </w:p>
     <w:p>
       <w:pPr>
-        <w:pStyle w:val="ListParagraph"/>
+        <w:pStyle w:val="Prrafodelista"/>
         <w:numPr>
           <w:ilvl w:val="0"/>
           <w:numId w:val="4"/>
@@ -2663,7 +2967,7 @@
     </w:p>
     <w:p>
       <w:pPr>
-        <w:pStyle w:val="ListParagraph"/>
+        <w:pStyle w:val="Prrafodelista"/>
         <w:numPr>
           <w:ilvl w:val="0"/>
           <w:numId w:val="4"/>
@@ -2682,12 +2986,32 @@
           <w:szCs w:val="24"/>
           <w:lang w:val="en-NZ"/>
         </w:rPr>
-        <w:t>Behaviours promoted by the use of WorkshopAR.</w:t>
-      </w:r>
-    </w:p>
-    <w:p>
-      <w:pPr>
-        <w:pStyle w:val="ListParagraph"/>
+        <w:t xml:space="preserve">Behaviours promoted </w:t>
+      </w:r>
+      <w:proofErr w:type="gramStart"/>
+      <w:r>
+        <w:rPr>
+          <w:rFonts w:asciiTheme="majorHAnsi" w:hAnsiTheme="majorHAnsi" w:cstheme="majorHAnsi"/>
+          <w:sz w:val="24"/>
+          <w:szCs w:val="24"/>
+          <w:lang w:val="en-NZ"/>
+        </w:rPr>
+        <w:t>by the use of</w:t>
+      </w:r>
+      <w:proofErr w:type="gramEnd"/>
+      <w:r>
+        <w:rPr>
+          <w:rFonts w:asciiTheme="majorHAnsi" w:hAnsiTheme="majorHAnsi" w:cstheme="majorHAnsi"/>
+          <w:sz w:val="24"/>
+          <w:szCs w:val="24"/>
+          <w:lang w:val="en-NZ"/>
+        </w:rPr>
+        <w:t xml:space="preserve"> WorkshopAR.</w:t>
+      </w:r>
+    </w:p>
+    <w:p>
+      <w:pPr>
+        <w:pStyle w:val="Prrafodelista"/>
         <w:numPr>
           <w:ilvl w:val="0"/>
           <w:numId w:val="4"/>
@@ -2730,7 +3054,7 @@
     </w:p>
     <w:p>
       <w:pPr>
-        <w:pStyle w:val="Heading2"/>
+        <w:pStyle w:val="Ttulo2"/>
         <w:rPr>
           <w:rFonts w:asciiTheme="majorHAnsi" w:hAnsiTheme="majorHAnsi" w:cstheme="majorHAnsi"/>
           <w:sz w:val="24"/>
@@ -2765,27 +3089,27 @@
           <w:szCs w:val="24"/>
           <w:lang w:val="en-NZ"/>
         </w:rPr>
-        <w:t xml:space="preserve">The final dataset comes from unstructured interviews performed to a sample of the students and of the teaching staff. Both interviews focused on gathering information about how participants saw collaboration as part of the development of the course. How do the feel about their own collaboration skills and how the course was helping them to develop or improve those </w:t>
-      </w:r>
-      <w:proofErr w:type="gramStart"/>
-      <w:r>
-        <w:rPr>
-          <w:rFonts w:asciiTheme="majorHAnsi" w:hAnsiTheme="majorHAnsi" w:cstheme="majorHAnsi"/>
-          <w:sz w:val="24"/>
-          <w:szCs w:val="24"/>
-          <w:lang w:val="en-NZ"/>
-        </w:rPr>
-        <w:t>skills.</w:t>
-      </w:r>
-      <w:proofErr w:type="gramEnd"/>
-      <w:r>
-        <w:rPr>
-          <w:rFonts w:asciiTheme="majorHAnsi" w:hAnsiTheme="majorHAnsi" w:cstheme="majorHAnsi"/>
-          <w:sz w:val="24"/>
-          <w:szCs w:val="24"/>
-          <w:lang w:val="en-NZ"/>
-        </w:rPr>
-        <w:t xml:space="preserve"> Annex 2 of this document shows the script used for each interview.</w:t>
+        <w:t xml:space="preserve">The final dataset comes from unstructured interviews performed to a sample of the students and of the teaching staff. Both interviews focused on gathering information about how participants saw collaboration as part of the development of the course. How do </w:t>
+      </w:r>
+      <w:proofErr w:type="spellStart"/>
+      <w:r>
+        <w:rPr>
+          <w:rFonts w:asciiTheme="majorHAnsi" w:hAnsiTheme="majorHAnsi" w:cstheme="majorHAnsi"/>
+          <w:sz w:val="24"/>
+          <w:szCs w:val="24"/>
+          <w:lang w:val="en-NZ"/>
+        </w:rPr>
+        <w:t>the</w:t>
+      </w:r>
+      <w:proofErr w:type="spellEnd"/>
+      <w:r>
+        <w:rPr>
+          <w:rFonts w:asciiTheme="majorHAnsi" w:hAnsiTheme="majorHAnsi" w:cstheme="majorHAnsi"/>
+          <w:sz w:val="24"/>
+          <w:szCs w:val="24"/>
+          <w:lang w:val="en-NZ"/>
+        </w:rPr>
+        <w:t xml:space="preserve"> feel about their own collaboration skills and how the course was helping them to develop or improve those skills. Annex 2 of this document shows the script used for each interview.</w:t>
       </w:r>
     </w:p>
     <w:p>
@@ -2947,7 +3271,7 @@
     </w:p>
     <w:p>
       <w:pPr>
-        <w:pStyle w:val="Heading1"/>
+        <w:pStyle w:val="Ttulo1"/>
         <w:rPr>
           <w:rFonts w:asciiTheme="majorHAnsi" w:hAnsiTheme="majorHAnsi" w:cstheme="majorHAnsi"/>
           <w:sz w:val="24"/>
@@ -2993,7 +3317,7 @@
     </w:p>
     <w:p>
       <w:pPr>
-        <w:pStyle w:val="Heading2"/>
+        <w:pStyle w:val="Ttulo2"/>
         <w:rPr>
           <w:rFonts w:asciiTheme="majorHAnsi" w:hAnsiTheme="majorHAnsi" w:cstheme="majorHAnsi"/>
           <w:sz w:val="24"/>
@@ -3114,7 +3438,7 @@
     </w:p>
     <w:p>
       <w:pPr>
-        <w:pStyle w:val="Caption"/>
+        <w:pStyle w:val="Descripcin"/>
         <w:jc w:val="center"/>
         <w:rPr>
           <w:lang w:val="en-NZ"/>
@@ -3180,7 +3504,27 @@
           <w:szCs w:val="24"/>
           <w:lang w:val="en-NZ"/>
         </w:rPr>
-        <w:t xml:space="preserve">The very first session of the semester set-up the tone and flow for all the other session, which followed more or less the same template. Students </w:t>
+        <w:t xml:space="preserve">The very first session of the semester set-up the tone and flow for all the other session, which followed </w:t>
+      </w:r>
+      <w:proofErr w:type="gramStart"/>
+      <w:r>
+        <w:rPr>
+          <w:rFonts w:asciiTheme="majorHAnsi" w:hAnsiTheme="majorHAnsi" w:cstheme="majorHAnsi"/>
+          <w:sz w:val="24"/>
+          <w:szCs w:val="24"/>
+          <w:lang w:val="en-NZ"/>
+        </w:rPr>
+        <w:t>more or less the</w:t>
+      </w:r>
+      <w:proofErr w:type="gramEnd"/>
+      <w:r>
+        <w:rPr>
+          <w:rFonts w:asciiTheme="majorHAnsi" w:hAnsiTheme="majorHAnsi" w:cstheme="majorHAnsi"/>
+          <w:sz w:val="24"/>
+          <w:szCs w:val="24"/>
+          <w:lang w:val="en-NZ"/>
+        </w:rPr>
+        <w:t xml:space="preserve"> same template. Students </w:t>
       </w:r>
       <w:r>
         <w:rPr>
@@ -3207,27 +3551,25 @@
           <w:szCs w:val="24"/>
           <w:lang w:val="en-NZ"/>
         </w:rPr>
-        <w:t xml:space="preserve">. As it is tradition in almost all of the Built </w:t>
-      </w:r>
-      <w:proofErr w:type="gramStart"/>
-      <w:r>
-        <w:rPr>
-          <w:rFonts w:asciiTheme="majorHAnsi" w:hAnsiTheme="majorHAnsi" w:cstheme="majorHAnsi"/>
-          <w:sz w:val="24"/>
-          <w:szCs w:val="24"/>
-          <w:lang w:val="en-NZ"/>
-        </w:rPr>
-        <w:t>Environments</w:t>
-      </w:r>
-      <w:proofErr w:type="gramEnd"/>
-      <w:r>
-        <w:rPr>
-          <w:rFonts w:asciiTheme="majorHAnsi" w:hAnsiTheme="majorHAnsi" w:cstheme="majorHAnsi"/>
-          <w:sz w:val="24"/>
-          <w:szCs w:val="24"/>
-          <w:lang w:val="en-NZ"/>
-        </w:rPr>
-        <w:t xml:space="preserve"> programs (and many other programs at AUT), the lecture started </w:t>
+        <w:t xml:space="preserve">. As it is tradition in almost </w:t>
+      </w:r>
+      <w:r>
+        <w:rPr>
+          <w:rFonts w:asciiTheme="majorHAnsi" w:hAnsiTheme="majorHAnsi" w:cstheme="majorHAnsi"/>
+          <w:sz w:val="24"/>
+          <w:szCs w:val="24"/>
+          <w:lang w:val="en-NZ"/>
+        </w:rPr>
+        <w:t>all</w:t>
+      </w:r>
+      <w:r>
+        <w:rPr>
+          <w:rFonts w:asciiTheme="majorHAnsi" w:hAnsiTheme="majorHAnsi" w:cstheme="majorHAnsi"/>
+          <w:sz w:val="24"/>
+          <w:szCs w:val="24"/>
+          <w:lang w:val="en-NZ"/>
+        </w:rPr>
+        <w:t xml:space="preserve"> the Built Environments programs (and many other programs at AUT), the lecture started </w:t>
       </w:r>
       <w:r>
         <w:rPr>
@@ -3245,7 +3587,27 @@
           <w:szCs w:val="24"/>
           <w:lang w:val="en-NZ"/>
         </w:rPr>
-        <w:t xml:space="preserve"> a karakia, a traditional Māori prayer to open any social meeting</w:t>
+        <w:t xml:space="preserve"> a </w:t>
+      </w:r>
+      <w:proofErr w:type="spellStart"/>
+      <w:r>
+        <w:rPr>
+          <w:rFonts w:asciiTheme="majorHAnsi" w:hAnsiTheme="majorHAnsi" w:cstheme="majorHAnsi"/>
+          <w:sz w:val="24"/>
+          <w:szCs w:val="24"/>
+          <w:lang w:val="en-NZ"/>
+        </w:rPr>
+        <w:t>karakia</w:t>
+      </w:r>
+      <w:proofErr w:type="spellEnd"/>
+      <w:r>
+        <w:rPr>
+          <w:rFonts w:asciiTheme="majorHAnsi" w:hAnsiTheme="majorHAnsi" w:cstheme="majorHAnsi"/>
+          <w:sz w:val="24"/>
+          <w:szCs w:val="24"/>
+          <w:lang w:val="en-NZ"/>
+        </w:rPr>
+        <w:t>, a traditional Māori prayer to open any social meeting</w:t>
       </w:r>
       <w:r>
         <w:rPr>
@@ -3263,12 +3625,32 @@
           <w:szCs w:val="24"/>
           <w:lang w:val="en-NZ"/>
         </w:rPr>
-        <w:t>, which Table 1 shows in its Te Reo and English versions.</w:t>
-      </w:r>
-    </w:p>
-    <w:p>
-      <w:pPr>
-        <w:pStyle w:val="Caption"/>
+        <w:t xml:space="preserve">, which Table 1 shows in its </w:t>
+      </w:r>
+      <w:proofErr w:type="spellStart"/>
+      <w:r>
+        <w:rPr>
+          <w:rFonts w:asciiTheme="majorHAnsi" w:hAnsiTheme="majorHAnsi" w:cstheme="majorHAnsi"/>
+          <w:sz w:val="24"/>
+          <w:szCs w:val="24"/>
+          <w:lang w:val="en-NZ"/>
+        </w:rPr>
+        <w:t>Te</w:t>
+      </w:r>
+      <w:proofErr w:type="spellEnd"/>
+      <w:r>
+        <w:rPr>
+          <w:rFonts w:asciiTheme="majorHAnsi" w:hAnsiTheme="majorHAnsi" w:cstheme="majorHAnsi"/>
+          <w:sz w:val="24"/>
+          <w:szCs w:val="24"/>
+          <w:lang w:val="en-NZ"/>
+        </w:rPr>
+        <w:t xml:space="preserve"> Reo and English versions.</w:t>
+      </w:r>
+    </w:p>
+    <w:p>
+      <w:pPr>
+        <w:pStyle w:val="Descripcin"/>
         <w:keepNext/>
         <w:jc w:val="center"/>
         <w:rPr>
@@ -3321,7 +3703,7 @@
     </w:p>
     <w:tbl>
       <w:tblPr>
-        <w:tblStyle w:val="PlainTable2"/>
+        <w:tblStyle w:val="Tablanormal2"/>
         <w:tblW w:w="0" w:type="auto"/>
         <w:tblLook w:val="04A0" w:firstRow="1" w:lastRow="0" w:firstColumn="1" w:lastColumn="0" w:noHBand="0" w:noVBand="1"/>
       </w:tblPr>
@@ -3348,6 +3730,7 @@
                 <w:lang w:val="en-NZ"/>
               </w:rPr>
             </w:pPr>
+            <w:proofErr w:type="spellStart"/>
             <w:r>
               <w:rPr>
                 <w:rFonts w:asciiTheme="majorHAnsi" w:hAnsiTheme="majorHAnsi" w:cstheme="majorHAnsi"/>
@@ -3355,7 +3738,17 @@
                 <w:szCs w:val="24"/>
                 <w:lang w:val="en-NZ"/>
               </w:rPr>
-              <w:t>Te Reo</w:t>
+              <w:t>Te</w:t>
+            </w:r>
+            <w:proofErr w:type="spellEnd"/>
+            <w:r>
+              <w:rPr>
+                <w:rFonts w:asciiTheme="majorHAnsi" w:hAnsiTheme="majorHAnsi" w:cstheme="majorHAnsi"/>
+                <w:sz w:val="24"/>
+                <w:szCs w:val="24"/>
+                <w:lang w:val="en-NZ"/>
+              </w:rPr>
+              <w:t xml:space="preserve"> Reo</w:t>
             </w:r>
           </w:p>
         </w:tc>
@@ -3432,7 +3825,27 @@
                 <w:szCs w:val="24"/>
                 <w:lang w:val="en-NZ"/>
               </w:rPr>
-              <w:t>Mauri tū.</w:t>
+              <w:t xml:space="preserve">Mauri </w:t>
+            </w:r>
+            <w:proofErr w:type="spellStart"/>
+            <w:r>
+              <w:rPr>
+                <w:rFonts w:asciiTheme="majorHAnsi" w:hAnsiTheme="majorHAnsi" w:cstheme="majorHAnsi"/>
+                <w:sz w:val="24"/>
+                <w:szCs w:val="24"/>
+                <w:lang w:val="en-NZ"/>
+              </w:rPr>
+              <w:t>tū</w:t>
+            </w:r>
+            <w:proofErr w:type="spellEnd"/>
+            <w:r>
+              <w:rPr>
+                <w:rFonts w:asciiTheme="majorHAnsi" w:hAnsiTheme="majorHAnsi" w:cstheme="majorHAnsi"/>
+                <w:sz w:val="24"/>
+                <w:szCs w:val="24"/>
+                <w:lang w:val="en-NZ"/>
+              </w:rPr>
+              <w:t>.</w:t>
             </w:r>
           </w:p>
           <w:p>
@@ -3452,7 +3865,27 @@
                 <w:szCs w:val="24"/>
                 <w:lang w:val="en-NZ"/>
               </w:rPr>
-              <w:t>Mauri ora ki a tātou.</w:t>
+              <w:t xml:space="preserve">Mauri ora ki a </w:t>
+            </w:r>
+            <w:proofErr w:type="spellStart"/>
+            <w:r>
+              <w:rPr>
+                <w:rFonts w:asciiTheme="majorHAnsi" w:hAnsiTheme="majorHAnsi" w:cstheme="majorHAnsi"/>
+                <w:sz w:val="24"/>
+                <w:szCs w:val="24"/>
+                <w:lang w:val="en-NZ"/>
+              </w:rPr>
+              <w:t>tātou</w:t>
+            </w:r>
+            <w:proofErr w:type="spellEnd"/>
+            <w:r>
+              <w:rPr>
+                <w:rFonts w:asciiTheme="majorHAnsi" w:hAnsiTheme="majorHAnsi" w:cstheme="majorHAnsi"/>
+                <w:sz w:val="24"/>
+                <w:szCs w:val="24"/>
+                <w:lang w:val="en-NZ"/>
+              </w:rPr>
+              <w:t>.</w:t>
             </w:r>
           </w:p>
           <w:p>
@@ -3529,7 +3962,27 @@
                 <w:szCs w:val="24"/>
                 <w:lang w:val="en-NZ"/>
               </w:rPr>
-              <w:t>Life force awaken.</w:t>
+              <w:t xml:space="preserve">Life force </w:t>
+            </w:r>
+            <w:proofErr w:type="gramStart"/>
+            <w:r>
+              <w:rPr>
+                <w:rFonts w:asciiTheme="majorHAnsi" w:hAnsiTheme="majorHAnsi" w:cstheme="majorHAnsi"/>
+                <w:sz w:val="24"/>
+                <w:szCs w:val="24"/>
+                <w:lang w:val="en-NZ"/>
+              </w:rPr>
+              <w:t>awaken</w:t>
+            </w:r>
+            <w:proofErr w:type="gramEnd"/>
+            <w:r>
+              <w:rPr>
+                <w:rFonts w:asciiTheme="majorHAnsi" w:hAnsiTheme="majorHAnsi" w:cstheme="majorHAnsi"/>
+                <w:sz w:val="24"/>
+                <w:szCs w:val="24"/>
+                <w:lang w:val="en-NZ"/>
+              </w:rPr>
+              <w:t>.</w:t>
             </w:r>
           </w:p>
           <w:p>
@@ -3550,7 +4003,27 @@
                 <w:szCs w:val="24"/>
                 <w:lang w:val="en-NZ"/>
               </w:rPr>
-              <w:t>Life force stand tall.</w:t>
+              <w:t xml:space="preserve">Life force </w:t>
+            </w:r>
+            <w:proofErr w:type="gramStart"/>
+            <w:r>
+              <w:rPr>
+                <w:rFonts w:asciiTheme="majorHAnsi" w:hAnsiTheme="majorHAnsi" w:cstheme="majorHAnsi"/>
+                <w:sz w:val="24"/>
+                <w:szCs w:val="24"/>
+                <w:lang w:val="en-NZ"/>
+              </w:rPr>
+              <w:t>stand</w:t>
+            </w:r>
+            <w:proofErr w:type="gramEnd"/>
+            <w:r>
+              <w:rPr>
+                <w:rFonts w:asciiTheme="majorHAnsi" w:hAnsiTheme="majorHAnsi" w:cstheme="majorHAnsi"/>
+                <w:sz w:val="24"/>
+                <w:szCs w:val="24"/>
+                <w:lang w:val="en-NZ"/>
+              </w:rPr>
+              <w:t xml:space="preserve"> tall.</w:t>
             </w:r>
           </w:p>
           <w:p>
@@ -3605,6 +4078,7 @@
                 <w:lang w:val="en-NZ"/>
               </w:rPr>
             </w:pPr>
+            <w:proofErr w:type="gramStart"/>
             <w:r>
               <w:rPr>
                 <w:rFonts w:asciiTheme="majorHAnsi" w:hAnsiTheme="majorHAnsi" w:cstheme="majorHAnsi"/>
@@ -3612,7 +4086,17 @@
                 <w:szCs w:val="24"/>
                 <w:lang w:val="en-NZ"/>
               </w:rPr>
-              <w:t>Join together, unite, the group is ready to progress for the purpose of coming together.</w:t>
+              <w:t>Join together</w:t>
+            </w:r>
+            <w:proofErr w:type="gramEnd"/>
+            <w:r>
+              <w:rPr>
+                <w:rFonts w:asciiTheme="majorHAnsi" w:hAnsiTheme="majorHAnsi" w:cstheme="majorHAnsi"/>
+                <w:sz w:val="24"/>
+                <w:szCs w:val="24"/>
+                <w:lang w:val="en-NZ"/>
+              </w:rPr>
+              <w:t>, unite, the group is ready to progress for the purpose of coming together.</w:t>
             </w:r>
           </w:p>
         </w:tc>
@@ -3644,12 +4128,644 @@
           <w:szCs w:val="24"/>
           <w:lang w:val="en-NZ"/>
         </w:rPr>
-        <w:t>Although a simple detail and a bit detached from the overall objectives of the observations, the karakia is a constant reminder of the tone and mindset needed for a successful experience in the course, and a charming tradition that reminds the students that they are entering a place meant for learning together.</w:t>
-      </w:r>
-    </w:p>
-    <w:p>
-      <w:pPr>
-        <w:pStyle w:val="Heading2"/>
+        <w:t xml:space="preserve">Although a simple detail and a bit detached from the overall objectives of the observations, the </w:t>
+      </w:r>
+      <w:proofErr w:type="spellStart"/>
+      <w:r>
+        <w:rPr>
+          <w:rFonts w:asciiTheme="majorHAnsi" w:hAnsiTheme="majorHAnsi" w:cstheme="majorHAnsi"/>
+          <w:sz w:val="24"/>
+          <w:szCs w:val="24"/>
+          <w:lang w:val="en-NZ"/>
+        </w:rPr>
+        <w:t>karakia</w:t>
+      </w:r>
+      <w:proofErr w:type="spellEnd"/>
+      <w:r>
+        <w:rPr>
+          <w:rFonts w:asciiTheme="majorHAnsi" w:hAnsiTheme="majorHAnsi" w:cstheme="majorHAnsi"/>
+          <w:sz w:val="24"/>
+          <w:szCs w:val="24"/>
+          <w:lang w:val="en-NZ"/>
+        </w:rPr>
+        <w:t xml:space="preserve"> is a constant reminder of the tone and mindset needed for a successful experience in the course, and a charming tradition that reminds the students that they are entering a place meant for learning together.</w:t>
+      </w:r>
+    </w:p>
+    <w:p>
+      <w:pPr>
+        <w:rPr>
+          <w:rFonts w:asciiTheme="majorHAnsi" w:hAnsiTheme="majorHAnsi" w:cstheme="majorHAnsi"/>
+          <w:sz w:val="24"/>
+          <w:szCs w:val="24"/>
+          <w:lang w:val="en-NZ"/>
+        </w:rPr>
+      </w:pPr>
+      <w:r>
+        <w:rPr>
+          <w:rFonts w:asciiTheme="majorHAnsi" w:hAnsiTheme="majorHAnsi" w:cstheme="majorHAnsi"/>
+          <w:sz w:val="24"/>
+          <w:szCs w:val="24"/>
+          <w:lang w:val="en-NZ"/>
+        </w:rPr>
+        <w:lastRenderedPageBreak/>
+        <w:t>It was also interesting, and a very telling, detail that the first discussion during the introductory session was on tips and recommendations about how to handle the stress of the course. Industry Project is designed to be a complex course, that complexity is what allows the students to gain experience in a project close to what is found on the industry, but it also causes a lot of friction when the students are trying to manage all the academical requirements of the course.</w:t>
+      </w:r>
+    </w:p>
+    <w:p>
+      <w:pPr>
+        <w:rPr>
+          <w:rFonts w:asciiTheme="majorHAnsi" w:hAnsiTheme="majorHAnsi" w:cstheme="majorHAnsi"/>
+          <w:sz w:val="24"/>
+          <w:szCs w:val="24"/>
+          <w:lang w:val="en-NZ"/>
+        </w:rPr>
+      </w:pPr>
+      <w:r>
+        <w:rPr>
+          <w:rFonts w:asciiTheme="majorHAnsi" w:hAnsiTheme="majorHAnsi" w:cstheme="majorHAnsi"/>
+          <w:sz w:val="24"/>
+          <w:szCs w:val="24"/>
+          <w:lang w:val="en-NZ"/>
+        </w:rPr>
+        <w:t xml:space="preserve">I also become a dauting task of administration, since the teaching staff </w:t>
+      </w:r>
+      <w:r>
+        <w:rPr>
+          <w:rFonts w:asciiTheme="majorHAnsi" w:hAnsiTheme="majorHAnsi" w:cstheme="majorHAnsi"/>
+          <w:sz w:val="24"/>
+          <w:szCs w:val="24"/>
+          <w:lang w:val="en-NZ"/>
+        </w:rPr>
+        <w:t>must</w:t>
+      </w:r>
+      <w:r>
+        <w:rPr>
+          <w:rFonts w:asciiTheme="majorHAnsi" w:hAnsiTheme="majorHAnsi" w:cstheme="majorHAnsi"/>
+          <w:sz w:val="24"/>
+          <w:szCs w:val="24"/>
+          <w:lang w:val="en-NZ"/>
+        </w:rPr>
+        <w:t xml:space="preserve"> coordinate the work of what is in essence four different courses along the three different flows of work that the students are moving through.</w:t>
+      </w:r>
+    </w:p>
+    <w:p>
+      <w:pPr>
+        <w:rPr>
+          <w:rFonts w:asciiTheme="majorHAnsi" w:hAnsiTheme="majorHAnsi" w:cstheme="majorHAnsi"/>
+          <w:sz w:val="24"/>
+          <w:szCs w:val="24"/>
+          <w:lang w:val="en-NZ"/>
+        </w:rPr>
+      </w:pPr>
+      <w:r>
+        <w:rPr>
+          <w:rFonts w:asciiTheme="majorHAnsi" w:hAnsiTheme="majorHAnsi" w:cstheme="majorHAnsi"/>
+          <w:sz w:val="24"/>
+          <w:szCs w:val="24"/>
+          <w:lang w:val="en-NZ"/>
+        </w:rPr>
+        <w:t xml:space="preserve">This first general discussion asked the students to think on the requirements of the course from two views: the individual responsibilities to complete the each of the </w:t>
+      </w:r>
+      <w:r>
+        <w:rPr>
+          <w:rFonts w:asciiTheme="majorHAnsi" w:hAnsiTheme="majorHAnsi" w:cstheme="majorHAnsi"/>
+          <w:sz w:val="24"/>
+          <w:szCs w:val="24"/>
+          <w:lang w:val="en-NZ"/>
+        </w:rPr>
+        <w:t>deliveries</w:t>
+      </w:r>
+      <w:r>
+        <w:rPr>
+          <w:rFonts w:asciiTheme="majorHAnsi" w:hAnsiTheme="majorHAnsi" w:cstheme="majorHAnsi"/>
+          <w:sz w:val="24"/>
+          <w:szCs w:val="24"/>
+          <w:lang w:val="en-NZ"/>
+        </w:rPr>
+        <w:t xml:space="preserve"> of the course and the contribution there are giving to the shared project developed with the group. </w:t>
+      </w:r>
+      <w:r>
+        <w:rPr>
+          <w:rFonts w:asciiTheme="majorHAnsi" w:hAnsiTheme="majorHAnsi" w:cstheme="majorHAnsi"/>
+          <w:sz w:val="24"/>
+          <w:szCs w:val="24"/>
+          <w:lang w:val="en-NZ"/>
+        </w:rPr>
+        <w:t>The lecturer gave very clear recommendation for this purpose:</w:t>
+      </w:r>
+    </w:p>
+    <w:p>
+      <w:pPr>
+        <w:pStyle w:val="Prrafodelista"/>
+        <w:numPr>
+          <w:ilvl w:val="0"/>
+          <w:numId w:val="10"/>
+        </w:numPr>
+        <w:rPr>
+          <w:rFonts w:asciiTheme="majorHAnsi" w:hAnsiTheme="majorHAnsi" w:cstheme="majorHAnsi"/>
+          <w:sz w:val="24"/>
+          <w:szCs w:val="24"/>
+          <w:lang w:val="en-NZ"/>
+        </w:rPr>
+      </w:pPr>
+      <w:r>
+        <w:rPr>
+          <w:rFonts w:asciiTheme="majorHAnsi" w:hAnsiTheme="majorHAnsi" w:cstheme="majorHAnsi"/>
+          <w:sz w:val="24"/>
+          <w:szCs w:val="24"/>
+          <w:lang w:val="en-NZ"/>
+        </w:rPr>
+        <w:t>Be proactive with work, decisions and resources. Don’t assume that everyone knows what is happening.</w:t>
+      </w:r>
+    </w:p>
+    <w:p>
+      <w:pPr>
+        <w:pStyle w:val="Prrafodelista"/>
+        <w:numPr>
+          <w:ilvl w:val="0"/>
+          <w:numId w:val="10"/>
+        </w:numPr>
+        <w:rPr>
+          <w:rFonts w:asciiTheme="majorHAnsi" w:hAnsiTheme="majorHAnsi" w:cstheme="majorHAnsi"/>
+          <w:sz w:val="24"/>
+          <w:szCs w:val="24"/>
+          <w:lang w:val="en-NZ"/>
+        </w:rPr>
+      </w:pPr>
+      <w:r>
+        <w:rPr>
+          <w:rFonts w:asciiTheme="majorHAnsi" w:hAnsiTheme="majorHAnsi" w:cstheme="majorHAnsi"/>
+          <w:sz w:val="24"/>
+          <w:szCs w:val="24"/>
+          <w:lang w:val="en-NZ"/>
+        </w:rPr>
+        <w:t>Work together, the whole project cannot be finished by one person.</w:t>
+      </w:r>
+    </w:p>
+    <w:p>
+      <w:pPr>
+        <w:pStyle w:val="Prrafodelista"/>
+        <w:numPr>
+          <w:ilvl w:val="0"/>
+          <w:numId w:val="10"/>
+        </w:numPr>
+        <w:rPr>
+          <w:rFonts w:asciiTheme="majorHAnsi" w:hAnsiTheme="majorHAnsi" w:cstheme="majorHAnsi"/>
+          <w:sz w:val="24"/>
+          <w:szCs w:val="24"/>
+          <w:lang w:val="en-NZ"/>
+        </w:rPr>
+      </w:pPr>
+      <w:r>
+        <w:rPr>
+          <w:rFonts w:asciiTheme="majorHAnsi" w:hAnsiTheme="majorHAnsi" w:cstheme="majorHAnsi"/>
+          <w:sz w:val="24"/>
+          <w:szCs w:val="24"/>
+          <w:lang w:val="en-NZ"/>
+        </w:rPr>
+        <w:t>Distribute and communicate. Remember that team management also needs time to be completed.</w:t>
+      </w:r>
+    </w:p>
+    <w:p>
+      <w:pPr>
+        <w:rPr>
+          <w:rFonts w:asciiTheme="majorHAnsi" w:hAnsiTheme="majorHAnsi" w:cstheme="majorHAnsi"/>
+          <w:sz w:val="24"/>
+          <w:szCs w:val="24"/>
+          <w:lang w:val="en-NZ"/>
+        </w:rPr>
+      </w:pPr>
+      <w:r>
+        <w:rPr>
+          <w:rFonts w:asciiTheme="majorHAnsi" w:hAnsiTheme="majorHAnsi" w:cstheme="majorHAnsi"/>
+          <w:sz w:val="24"/>
+          <w:szCs w:val="24"/>
+          <w:lang w:val="en-NZ"/>
+        </w:rPr>
+        <w:t>The introductory discussion also allocated some time to stablish a clear idea of the objectives of the course. Curiously, the lectures did not use the learning objectives present in the course description (which was also available to the students in the LMS), but opted to summarise the information in two main points:</w:t>
+      </w:r>
+    </w:p>
+    <w:p>
+      <w:pPr>
+        <w:pStyle w:val="Prrafodelista"/>
+        <w:numPr>
+          <w:ilvl w:val="0"/>
+          <w:numId w:val="11"/>
+        </w:numPr>
+        <w:rPr>
+          <w:rFonts w:asciiTheme="majorHAnsi" w:hAnsiTheme="majorHAnsi" w:cstheme="majorHAnsi"/>
+          <w:sz w:val="24"/>
+          <w:szCs w:val="24"/>
+          <w:lang w:val="en-NZ"/>
+        </w:rPr>
+      </w:pPr>
+      <w:r>
+        <w:rPr>
+          <w:rFonts w:asciiTheme="majorHAnsi" w:hAnsiTheme="majorHAnsi" w:cstheme="majorHAnsi"/>
+          <w:sz w:val="24"/>
+          <w:szCs w:val="24"/>
+          <w:lang w:val="en-NZ"/>
+        </w:rPr>
+        <w:t>Gather and distribute the information needed for the project from those who have it to those who need it.</w:t>
+      </w:r>
+    </w:p>
+    <w:p>
+      <w:pPr>
+        <w:pStyle w:val="Prrafodelista"/>
+        <w:numPr>
+          <w:ilvl w:val="0"/>
+          <w:numId w:val="11"/>
+        </w:numPr>
+        <w:rPr>
+          <w:rFonts w:asciiTheme="majorHAnsi" w:hAnsiTheme="majorHAnsi" w:cstheme="majorHAnsi"/>
+          <w:sz w:val="24"/>
+          <w:szCs w:val="24"/>
+          <w:lang w:val="en-NZ"/>
+        </w:rPr>
+      </w:pPr>
+      <w:r>
+        <w:rPr>
+          <w:rFonts w:asciiTheme="majorHAnsi" w:hAnsiTheme="majorHAnsi" w:cstheme="majorHAnsi"/>
+          <w:sz w:val="24"/>
+          <w:szCs w:val="24"/>
+          <w:lang w:val="en-NZ"/>
+        </w:rPr>
+        <w:t>Move through the stages of a construction project as it would be expected to be done in the context of New Zealand.</w:t>
+      </w:r>
+    </w:p>
+    <w:p>
+      <w:pPr>
+        <w:rPr>
+          <w:rFonts w:asciiTheme="majorHAnsi" w:hAnsiTheme="majorHAnsi" w:cstheme="majorHAnsi"/>
+          <w:sz w:val="24"/>
+          <w:szCs w:val="24"/>
+          <w:lang w:val="en-NZ"/>
+        </w:rPr>
+      </w:pPr>
+      <w:r>
+        <w:rPr>
+          <w:rFonts w:asciiTheme="majorHAnsi" w:hAnsiTheme="majorHAnsi" w:cstheme="majorHAnsi"/>
+          <w:sz w:val="24"/>
+          <w:szCs w:val="24"/>
+          <w:lang w:val="en-NZ"/>
+        </w:rPr>
+        <w:t>In other words, the students need to develop the entirety of a construction project taking into consideration that each of the disciplines represented in the group has a piece of the information and the expertise needed. Communication and proper management were a key aspect to successfully propose a coherent solution.</w:t>
+      </w:r>
+    </w:p>
+    <w:p>
+      <w:pPr>
+        <w:rPr>
+          <w:rFonts w:asciiTheme="majorHAnsi" w:hAnsiTheme="majorHAnsi" w:cstheme="majorHAnsi"/>
+          <w:sz w:val="24"/>
+          <w:szCs w:val="24"/>
+          <w:lang w:val="en-NZ"/>
+        </w:rPr>
+      </w:pPr>
+      <w:r>
+        <w:rPr>
+          <w:rFonts w:asciiTheme="majorHAnsi" w:hAnsiTheme="majorHAnsi" w:cstheme="majorHAnsi"/>
+          <w:sz w:val="24"/>
+          <w:szCs w:val="24"/>
+          <w:lang w:val="en-NZ"/>
+        </w:rPr>
+        <w:t xml:space="preserve">The third theme of the discussion was the issue of group assignation, a completely administrative tasks, but by far the </w:t>
+      </w:r>
+      <w:proofErr w:type="gramStart"/>
+      <w:r>
+        <w:rPr>
+          <w:rFonts w:asciiTheme="majorHAnsi" w:hAnsiTheme="majorHAnsi" w:cstheme="majorHAnsi"/>
+          <w:sz w:val="24"/>
+          <w:szCs w:val="24"/>
+          <w:lang w:val="en-NZ"/>
+        </w:rPr>
+        <w:t>main focus</w:t>
+      </w:r>
+      <w:proofErr w:type="gramEnd"/>
+      <w:r>
+        <w:rPr>
+          <w:rFonts w:asciiTheme="majorHAnsi" w:hAnsiTheme="majorHAnsi" w:cstheme="majorHAnsi"/>
+          <w:sz w:val="24"/>
+          <w:szCs w:val="24"/>
+          <w:lang w:val="en-NZ"/>
+        </w:rPr>
+        <w:t xml:space="preserve"> of the first session, at least form the point of view of the students. Groups were pre-sorted and distribution communicated to the students at the beginning of the week, which led to the students scrambling around the room searching for members </w:t>
+      </w:r>
+      <w:proofErr w:type="spellStart"/>
+      <w:r>
+        <w:rPr>
+          <w:rFonts w:asciiTheme="majorHAnsi" w:hAnsiTheme="majorHAnsi" w:cstheme="majorHAnsi"/>
+          <w:sz w:val="24"/>
+          <w:szCs w:val="24"/>
+          <w:lang w:val="en-NZ"/>
+        </w:rPr>
+        <w:t>o</w:t>
+      </w:r>
+      <w:proofErr w:type="spellEnd"/>
+      <w:r>
+        <w:rPr>
+          <w:rFonts w:asciiTheme="majorHAnsi" w:hAnsiTheme="majorHAnsi" w:cstheme="majorHAnsi"/>
+          <w:sz w:val="24"/>
+          <w:szCs w:val="24"/>
+          <w:lang w:val="en-NZ"/>
+        </w:rPr>
+        <w:t xml:space="preserve"> their team. Not everyone was fully aware of their team allocation, and a couple of teams had only one student attending the room that day.</w:t>
+      </w:r>
+    </w:p>
+    <w:p>
+      <w:pPr>
+        <w:rPr>
+          <w:rFonts w:asciiTheme="majorHAnsi" w:hAnsiTheme="majorHAnsi" w:cstheme="majorHAnsi"/>
+          <w:sz w:val="24"/>
+          <w:szCs w:val="24"/>
+          <w:lang w:val="en-NZ"/>
+        </w:rPr>
+      </w:pPr>
+      <w:r>
+        <w:rPr>
+          <w:rFonts w:asciiTheme="majorHAnsi" w:hAnsiTheme="majorHAnsi" w:cstheme="majorHAnsi"/>
+          <w:sz w:val="24"/>
+          <w:szCs w:val="24"/>
+          <w:lang w:val="en-NZ"/>
+        </w:rPr>
+        <w:lastRenderedPageBreak/>
+        <w:t>The different groups of students are often dived in three tracks, depending on the amount of the students in each semester. Tracks A and B move through the semester at a normal pace, with track A doing the activities of semester 1 and track B doing the activities of semester 2. At the end of the semester, the groups at track A move to track B and new students enter track A. The fast track does all the activities of semester 1 and 2 in only one semester, with a more condensed timeframe for deliveries and a shorter scope project. The main purpose of this format is to move a lot of students through the course quickly each semester.</w:t>
+      </w:r>
+    </w:p>
+    <w:p>
+      <w:pPr>
+        <w:rPr>
+          <w:rFonts w:asciiTheme="majorHAnsi" w:hAnsiTheme="majorHAnsi" w:cstheme="majorHAnsi"/>
+          <w:sz w:val="24"/>
+          <w:szCs w:val="24"/>
+          <w:lang w:val="en-NZ"/>
+        </w:rPr>
+      </w:pPr>
+      <w:r>
+        <w:rPr>
+          <w:rFonts w:asciiTheme="majorHAnsi" w:hAnsiTheme="majorHAnsi" w:cstheme="majorHAnsi"/>
+          <w:sz w:val="24"/>
+          <w:szCs w:val="24"/>
+          <w:lang w:val="en-NZ"/>
+        </w:rPr>
+        <w:t>From now one, and for the purposes of the development of this case study, the observations and the descriptions of the activities done, the focus will be on the groups in track A that moved to track B on semester 2.</w:t>
+      </w:r>
+    </w:p>
+    <w:p>
+      <w:pPr>
+        <w:rPr>
+          <w:rFonts w:asciiTheme="majorHAnsi" w:hAnsiTheme="majorHAnsi" w:cstheme="majorHAnsi"/>
+          <w:sz w:val="24"/>
+          <w:szCs w:val="24"/>
+          <w:lang w:val="en-NZ"/>
+        </w:rPr>
+      </w:pPr>
+      <w:r>
+        <w:rPr>
+          <w:rFonts w:asciiTheme="majorHAnsi" w:hAnsiTheme="majorHAnsi" w:cstheme="majorHAnsi"/>
+          <w:sz w:val="24"/>
+          <w:szCs w:val="24"/>
+          <w:lang w:val="en-NZ"/>
+        </w:rPr>
+        <w:t>The composition of the groups tried to accommodate two students per group of each of the roles: Architectural Engineer, Construction Engineer, Construction Manager and Quantity Surveyor. The number of students in each program did not allow to cover all spots, with an approximate ratio of two quantity surveyors and construction engineers per construction manager, and only 3 architectural engineers for all the groups in track A. Figure 3 shows a simplified example of the distribution of roles used so that the available architectural engineers and construction managers could be shared between different groups.</w:t>
+      </w:r>
+    </w:p>
+    <w:p>
+      <w:pPr>
+        <w:keepNext/>
+        <w:rPr>
+          <w:lang w:val="en-NZ"/>
+        </w:rPr>
+      </w:pPr>
+      <w:r>
+        <w:rPr>
+          <w:noProof/>
+          <w:lang w:val="en-NZ"/>
+        </w:rPr>
+        <w:drawing>
+          <wp:inline distT="0" distB="0" distL="0" distR="0" wp14:anchorId="5C324F2C" wp14:editId="558CE9D2">
+            <wp:extent cx="5733415" cy="2621280"/>
+            <wp:effectExtent l="0" t="0" r="635" b="7620"/>
+            <wp:docPr id="1921472127" name="Imagen 1" descr="Diagrama&#10;&#10;El contenido generado por IA puede ser incorrecto."/>
+            <wp:cNvGraphicFramePr>
+              <a:graphicFrameLocks xmlns:a="http://schemas.openxmlformats.org/drawingml/2006/main" noChangeAspect="1"/>
+            </wp:cNvGraphicFramePr>
+            <a:graphic xmlns:a="http://schemas.openxmlformats.org/drawingml/2006/main">
+              <a:graphicData uri="http://schemas.openxmlformats.org/drawingml/2006/picture">
+                <pic:pic xmlns:pic="http://schemas.openxmlformats.org/drawingml/2006/picture">
+                  <pic:nvPicPr>
+                    <pic:cNvPr id="1921472127" name="Imagen 1" descr="Diagrama&#10;&#10;El contenido generado por IA puede ser incorrecto."/>
+                    <pic:cNvPicPr>
+                      <a:picLocks noChangeAspect="1" noChangeArrowheads="1"/>
+                    </pic:cNvPicPr>
+                  </pic:nvPicPr>
+                  <pic:blipFill>
+                    <a:blip r:embed="rId7">
+                      <a:extLst>
+                        <a:ext uri="{28A0092B-C50C-407E-A947-70E740481C1C}">
+                          <a14:useLocalDpi xmlns:a14="http://schemas.microsoft.com/office/drawing/2010/main" val="0"/>
+                        </a:ext>
+                      </a:extLst>
+                    </a:blip>
+                    <a:srcRect/>
+                    <a:stretch>
+                      <a:fillRect/>
+                    </a:stretch>
+                  </pic:blipFill>
+                  <pic:spPr bwMode="auto">
+                    <a:xfrm>
+                      <a:off x="0" y="0"/>
+                      <a:ext cx="5733415" cy="2621280"/>
+                    </a:xfrm>
+                    <a:prstGeom prst="rect">
+                      <a:avLst/>
+                    </a:prstGeom>
+                    <a:noFill/>
+                    <a:ln>
+                      <a:noFill/>
+                    </a:ln>
+                  </pic:spPr>
+                </pic:pic>
+              </a:graphicData>
+            </a:graphic>
+          </wp:inline>
+        </w:drawing>
+      </w:r>
+    </w:p>
+    <w:p>
+      <w:pPr>
+        <w:pStyle w:val="Descripcin"/>
+        <w:jc w:val="center"/>
+        <w:rPr>
+          <w:rFonts w:asciiTheme="majorHAnsi" w:hAnsiTheme="majorHAnsi" w:cstheme="majorHAnsi"/>
+          <w:sz w:val="24"/>
+          <w:szCs w:val="24"/>
+          <w:lang w:val="en-NZ"/>
+        </w:rPr>
+      </w:pPr>
+      <w:r>
+        <w:rPr>
+          <w:lang w:val="en-NZ"/>
+        </w:rPr>
+        <w:t xml:space="preserve">Figure </w:t>
+      </w:r>
+      <w:r>
+        <w:rPr>
+          <w:lang w:val="en-NZ"/>
+        </w:rPr>
+        <w:fldChar w:fldCharType="begin"/>
+      </w:r>
+      <w:r>
+        <w:rPr>
+          <w:lang w:val="en-NZ"/>
+        </w:rPr>
+        <w:instrText xml:space="preserve"> SEQ Figure \* ARABIC </w:instrText>
+      </w:r>
+      <w:r>
+        <w:rPr>
+          <w:lang w:val="en-NZ"/>
+        </w:rPr>
+        <w:fldChar w:fldCharType="separate"/>
+      </w:r>
+      <w:r>
+        <w:rPr>
+          <w:noProof/>
+          <w:lang w:val="en-NZ"/>
+        </w:rPr>
+        <w:t>3</w:t>
+      </w:r>
+      <w:r>
+        <w:rPr>
+          <w:lang w:val="en-NZ"/>
+        </w:rPr>
+        <w:fldChar w:fldCharType="end"/>
+      </w:r>
+      <w:r>
+        <w:rPr>
+          <w:lang w:val="en-NZ"/>
+        </w:rPr>
+        <w:t xml:space="preserve"> Distribution of Shared Roles in the Groups</w:t>
+      </w:r>
+    </w:p>
+    <w:p>
+      <w:pPr>
+        <w:rPr>
+          <w:rFonts w:asciiTheme="majorHAnsi" w:hAnsiTheme="majorHAnsi" w:cstheme="majorHAnsi"/>
+          <w:sz w:val="24"/>
+          <w:szCs w:val="24"/>
+          <w:lang w:val="en-NZ"/>
+        </w:rPr>
+      </w:pPr>
+      <w:r>
+        <w:rPr>
+          <w:rFonts w:asciiTheme="majorHAnsi" w:hAnsiTheme="majorHAnsi" w:cstheme="majorHAnsi"/>
+          <w:sz w:val="24"/>
+          <w:szCs w:val="24"/>
+          <w:lang w:val="en-NZ"/>
+        </w:rPr>
+        <w:t xml:space="preserve">With this configuration the groups were forced to share the work of the architectural engineers and propose their own twists and takes on the common ideas present in the classroom. In the same was, one construction manager often had to coordinate the activities of at least two different groups. Intentional or not, this situation required a lot of effort to coordinate the different roles in one group, and a disciplined flow of information from the architectural engineers all the way to the construction engineers and the quantity </w:t>
+      </w:r>
+      <w:r>
+        <w:rPr>
+          <w:rFonts w:asciiTheme="majorHAnsi" w:hAnsiTheme="majorHAnsi" w:cstheme="majorHAnsi"/>
+          <w:sz w:val="24"/>
+          <w:szCs w:val="24"/>
+          <w:lang w:val="en-NZ"/>
+        </w:rPr>
+        <w:lastRenderedPageBreak/>
+        <w:t>surveyors. The situation matched perfectly with the learning objectives of the course, albeit introducing a lot of administrative hurdles for the teaching staff.</w:t>
+      </w:r>
+    </w:p>
+    <w:p>
+      <w:pPr>
+        <w:pStyle w:val="Ttulo3"/>
+        <w:rPr>
+          <w:rFonts w:asciiTheme="majorHAnsi" w:hAnsiTheme="majorHAnsi" w:cstheme="majorHAnsi"/>
+          <w:sz w:val="24"/>
+          <w:szCs w:val="24"/>
+          <w:lang w:val="en-NZ"/>
+        </w:rPr>
+      </w:pPr>
+      <w:r>
+        <w:rPr>
+          <w:rFonts w:asciiTheme="majorHAnsi" w:hAnsiTheme="majorHAnsi" w:cstheme="majorHAnsi"/>
+          <w:sz w:val="24"/>
+          <w:szCs w:val="24"/>
+          <w:lang w:val="en-NZ"/>
+        </w:rPr>
+        <w:t>6.4.1.1 First Bonding Exercise</w:t>
+      </w:r>
+    </w:p>
+    <w:p>
+      <w:pPr>
+        <w:rPr>
+          <w:rFonts w:asciiTheme="majorHAnsi" w:hAnsiTheme="majorHAnsi" w:cstheme="majorHAnsi"/>
+          <w:sz w:val="24"/>
+          <w:szCs w:val="24"/>
+          <w:lang w:val="en-NZ"/>
+        </w:rPr>
+      </w:pPr>
+    </w:p>
+    <w:p>
+      <w:pPr>
+        <w:rPr>
+          <w:rFonts w:asciiTheme="majorHAnsi" w:hAnsiTheme="majorHAnsi" w:cstheme="majorHAnsi"/>
+          <w:sz w:val="24"/>
+          <w:szCs w:val="24"/>
+          <w:lang w:val="en-NZ"/>
+        </w:rPr>
+      </w:pPr>
+    </w:p>
+    <w:p>
+      <w:pPr>
+        <w:rPr>
+          <w:rFonts w:asciiTheme="majorHAnsi" w:hAnsiTheme="majorHAnsi" w:cstheme="majorHAnsi"/>
+          <w:sz w:val="24"/>
+          <w:szCs w:val="24"/>
+          <w:lang w:val="en-NZ"/>
+        </w:rPr>
+      </w:pPr>
+      <w:r>
+        <w:rPr>
+          <w:rFonts w:asciiTheme="majorHAnsi" w:hAnsiTheme="majorHAnsi" w:cstheme="majorHAnsi"/>
+          <w:sz w:val="24"/>
+          <w:szCs w:val="24"/>
+          <w:lang w:val="en-NZ"/>
+        </w:rPr>
+        <w:t xml:space="preserve"> </w:t>
+      </w:r>
+      <w:r>
+        <w:rPr>
+          <w:rFonts w:asciiTheme="majorHAnsi" w:hAnsiTheme="majorHAnsi" w:cstheme="majorHAnsi"/>
+          <w:sz w:val="24"/>
+          <w:szCs w:val="24"/>
+          <w:lang w:val="en-NZ"/>
+        </w:rPr>
+        <w:t xml:space="preserve"> </w:t>
+      </w:r>
+    </w:p>
+    <w:p>
+      <w:pPr>
+        <w:rPr>
+          <w:rFonts w:asciiTheme="majorHAnsi" w:hAnsiTheme="majorHAnsi" w:cstheme="majorHAnsi"/>
+          <w:sz w:val="24"/>
+          <w:szCs w:val="24"/>
+          <w:lang w:val="en-NZ"/>
+        </w:rPr>
+      </w:pPr>
+    </w:p>
+    <w:p>
+      <w:pPr>
+        <w:rPr>
+          <w:rFonts w:asciiTheme="majorHAnsi" w:hAnsiTheme="majorHAnsi" w:cstheme="majorHAnsi"/>
+          <w:sz w:val="24"/>
+          <w:szCs w:val="24"/>
+          <w:lang w:val="en-NZ"/>
+        </w:rPr>
+      </w:pPr>
+    </w:p>
+    <w:p>
+      <w:pPr>
+        <w:pStyle w:val="Ttulo2"/>
         <w:rPr>
           <w:rFonts w:asciiTheme="majorHAnsi" w:hAnsiTheme="majorHAnsi" w:cstheme="majorHAnsi"/>
           <w:sz w:val="24"/>
@@ -3670,7 +4786,7 @@
     </w:p>
     <w:p>
       <w:pPr>
-        <w:pStyle w:val="Heading2"/>
+        <w:pStyle w:val="Ttulo2"/>
         <w:rPr>
           <w:rFonts w:asciiTheme="majorHAnsi" w:hAnsiTheme="majorHAnsi" w:cstheme="majorHAnsi"/>
           <w:sz w:val="24"/>
@@ -3690,7 +4806,7 @@
     </w:p>
     <w:p>
       <w:pPr>
-        <w:pStyle w:val="Heading1"/>
+        <w:pStyle w:val="Ttulo1"/>
         <w:rPr>
           <w:rFonts w:asciiTheme="majorHAnsi" w:hAnsiTheme="majorHAnsi" w:cstheme="majorHAnsi"/>
           <w:sz w:val="24"/>
@@ -3710,7 +4826,7 @@
     </w:p>
     <w:p>
       <w:pPr>
-        <w:pStyle w:val="Heading2"/>
+        <w:pStyle w:val="Ttulo2"/>
         <w:rPr>
           <w:rFonts w:asciiTheme="majorHAnsi" w:hAnsiTheme="majorHAnsi" w:cstheme="majorHAnsi"/>
           <w:sz w:val="24"/>
@@ -3730,7 +4846,7 @@
     </w:p>
     <w:p>
       <w:pPr>
-        <w:pStyle w:val="Heading2"/>
+        <w:pStyle w:val="Ttulo2"/>
         <w:rPr>
           <w:rFonts w:asciiTheme="majorHAnsi" w:hAnsiTheme="majorHAnsi" w:cstheme="majorHAnsi"/>
           <w:sz w:val="24"/>
@@ -3750,7 +4866,7 @@
     </w:p>
     <w:p>
       <w:pPr>
-        <w:pStyle w:val="Heading2"/>
+        <w:pStyle w:val="Ttulo2"/>
         <w:rPr>
           <w:rFonts w:asciiTheme="majorHAnsi" w:hAnsiTheme="majorHAnsi" w:cstheme="majorHAnsi"/>
           <w:sz w:val="24"/>
@@ -3770,7 +4886,7 @@
     </w:p>
     <w:p>
       <w:pPr>
-        <w:pStyle w:val="Heading1"/>
+        <w:pStyle w:val="Ttulo1"/>
         <w:rPr>
           <w:rFonts w:asciiTheme="majorHAnsi" w:hAnsiTheme="majorHAnsi" w:cstheme="majorHAnsi"/>
           <w:sz w:val="24"/>
@@ -3790,7 +4906,7 @@
     </w:p>
     <w:p>
       <w:pPr>
-        <w:pStyle w:val="Heading2"/>
+        <w:pStyle w:val="Ttulo2"/>
         <w:rPr>
           <w:rFonts w:asciiTheme="majorHAnsi" w:hAnsiTheme="majorHAnsi" w:cstheme="majorHAnsi"/>
           <w:sz w:val="24"/>
@@ -3810,7 +4926,7 @@
     </w:p>
     <w:p>
       <w:pPr>
-        <w:pStyle w:val="Heading2"/>
+        <w:pStyle w:val="Ttulo2"/>
         <w:rPr>
           <w:rFonts w:asciiTheme="majorHAnsi" w:hAnsiTheme="majorHAnsi" w:cstheme="majorHAnsi"/>
           <w:sz w:val="24"/>
@@ -3830,7 +4946,7 @@
     </w:p>
     <w:p>
       <w:pPr>
-        <w:pStyle w:val="Heading2"/>
+        <w:pStyle w:val="Ttulo2"/>
         <w:rPr>
           <w:rFonts w:asciiTheme="majorHAnsi" w:hAnsiTheme="majorHAnsi" w:cstheme="majorHAnsi"/>
           <w:sz w:val="24"/>
@@ -3850,7 +4966,7 @@
     </w:p>
     <w:p>
       <w:pPr>
-        <w:pStyle w:val="Heading1"/>
+        <w:pStyle w:val="Ttulo1"/>
         <w:rPr>
           <w:rFonts w:asciiTheme="majorHAnsi" w:hAnsiTheme="majorHAnsi" w:cstheme="majorHAnsi"/>
           <w:sz w:val="24"/>
@@ -3870,7 +4986,7 @@
     </w:p>
     <w:p>
       <w:pPr>
-        <w:pStyle w:val="Heading1"/>
+        <w:pStyle w:val="Ttulo1"/>
         <w:rPr>
           <w:rFonts w:asciiTheme="majorHAnsi" w:hAnsiTheme="majorHAnsi" w:cstheme="majorHAnsi"/>
           <w:sz w:val="24"/>
@@ -3890,7 +5006,7 @@
     </w:p>
     <w:p>
       <w:pPr>
-        <w:pStyle w:val="Heading2"/>
+        <w:pStyle w:val="Ttulo2"/>
         <w:rPr>
           <w:rFonts w:asciiTheme="majorHAnsi" w:hAnsiTheme="majorHAnsi" w:cstheme="majorHAnsi"/>
           <w:sz w:val="24"/>
@@ -3928,7 +5044,7 @@
     </w:p>
     <w:p>
       <w:pPr>
-        <w:pStyle w:val="Heading2"/>
+        <w:pStyle w:val="Ttulo2"/>
         <w:rPr>
           <w:rFonts w:asciiTheme="majorHAnsi" w:hAnsiTheme="majorHAnsi" w:cstheme="majorHAnsi"/>
           <w:sz w:val="24"/>
@@ -3966,7 +5082,7 @@
     </w:p>
     <w:p>
       <w:pPr>
-        <w:pStyle w:val="Heading2"/>
+        <w:pStyle w:val="Ttulo2"/>
         <w:rPr>
           <w:rFonts w:asciiTheme="majorHAnsi" w:hAnsiTheme="majorHAnsi" w:cstheme="majorHAnsi"/>
           <w:sz w:val="24"/>
@@ -4004,7 +5120,7 @@
     </w:p>
     <w:p>
       <w:pPr>
-        <w:pStyle w:val="Heading1"/>
+        <w:pStyle w:val="Ttulo1"/>
         <w:rPr>
           <w:rFonts w:asciiTheme="majorHAnsi" w:hAnsiTheme="majorHAnsi" w:cstheme="majorHAnsi"/>
           <w:sz w:val="24"/>
@@ -4024,7 +5140,7 @@
     </w:p>
     <w:p>
       <w:pPr>
-        <w:pStyle w:val="Heading1"/>
+        <w:pStyle w:val="Ttulo1"/>
         <w:rPr>
           <w:rFonts w:asciiTheme="majorHAnsi" w:hAnsiTheme="majorHAnsi" w:cstheme="majorHAnsi"/>
           <w:sz w:val="24"/>
@@ -4044,7 +5160,7 @@
     </w:p>
     <w:p>
       <w:pPr>
-        <w:pStyle w:val="Heading1"/>
+        <w:pStyle w:val="Ttulo1"/>
         <w:rPr>
           <w:rFonts w:asciiTheme="majorHAnsi" w:hAnsiTheme="majorHAnsi" w:cstheme="majorHAnsi"/>
           <w:sz w:val="24"/>
@@ -4103,7 +5219,7 @@
 </file>
 
 <file path=word/numbering.xml><?xml version="1.0" encoding="utf-8"?>
-<w:numbering xmlns:wpc="http://schemas.microsoft.com/office/word/2010/wordprocessingCanvas" xmlns:cx="http://schemas.microsoft.com/office/drawing/2014/chartex" xmlns:cx1="http://schemas.microsoft.com/office/drawing/2015/9/8/chartex" xmlns:cx2="http://schemas.microsoft.com/office/drawing/2015/10/21/chartex" xmlns:cx3="http://schemas.microsoft.com/office/drawing/2016/5/9/chartex" xmlns:cx4="http://schemas.microsoft.com/office/drawing/2016/5/10/chartex" xmlns:cx5="http://schemas.microsoft.com/office/drawing/2016/5/11/chartex" xmlns:cx6="http://schemas.microsoft.com/office/drawing/2016/5/12/chartex" xmlns:cx7="http://schemas.microsoft.com/office/drawing/2016/5/13/chartex" xmlns:cx8="http://schemas.microsoft.com/office/drawing/2016/5/14/chartex" xmlns:mc="http://schemas.openxmlformats.org/markup-compatibility/2006" xmlns:aink="http://schemas.microsoft.com/office/drawing/2016/ink" xmlns:am3d="http://schemas.microsoft.com/office/drawing/2017/model3d" xmlns:o="urn:schemas-microsoft-com:office:office" xmlns:r="http://schemas.openxmlformats.org/officeDocument/2006/relationships" xmlns:m="http://schemas.openxmlformats.org/officeDocument/2006/math" xmlns:v="urn:schemas-microsoft-com:vml" xmlns:wp14="http://schemas.microsoft.com/office/word/2010/wordprocessingDrawing" xmlns:wp="http://schemas.openxmlformats.org/drawingml/2006/wordprocessingDrawing" xmlns:w10="urn:schemas-microsoft-com:office:word" xmlns:w="http://schemas.openxmlformats.org/wordprocessingml/2006/main" xmlns:w14="http://schemas.microsoft.com/office/word/2010/wordml" xmlns:w15="http://schemas.microsoft.com/office/word/2012/wordml" xmlns:w16cex="http://schemas.microsoft.com/office/word/2018/wordml/cex" xmlns:w16cid="http://schemas.microsoft.com/office/word/2016/wordml/cid" xmlns:w16="http://schemas.microsoft.com/office/word/2018/wordml" xmlns:w16sdtdh="http://schemas.microsoft.com/office/word/2020/wordml/sdtdatahash" xmlns:w16se="http://schemas.microsoft.com/office/word/2015/wordml/symex" xmlns:wpg="http://schemas.microsoft.com/office/word/2010/wordprocessingGroup" xmlns:wpi="http://schemas.microsoft.com/office/word/2010/wordprocessingInk" xmlns:wne="http://schemas.microsoft.com/office/word/2006/wordml" xmlns:wps="http://schemas.microsoft.com/office/word/2010/wordprocessingShape" mc:Ignorable="w14 w15 w16se w16cid w16 w16cex w16sdtdh wp14">
+<w:numbering xmlns:wpc="http://schemas.microsoft.com/office/word/2010/wordprocessingCanvas" xmlns:cx="http://schemas.microsoft.com/office/drawing/2014/chartex" xmlns:cx1="http://schemas.microsoft.com/office/drawing/2015/9/8/chartex" xmlns:cx2="http://schemas.microsoft.com/office/drawing/2015/10/21/chartex" xmlns:cx3="http://schemas.microsoft.com/office/drawing/2016/5/9/chartex" xmlns:cx4="http://schemas.microsoft.com/office/drawing/2016/5/10/chartex" xmlns:cx5="http://schemas.microsoft.com/office/drawing/2016/5/11/chartex" xmlns:cx6="http://schemas.microsoft.com/office/drawing/2016/5/12/chartex" xmlns:cx7="http://schemas.microsoft.com/office/drawing/2016/5/13/chartex" xmlns:cx8="http://schemas.microsoft.com/office/drawing/2016/5/14/chartex" xmlns:mc="http://schemas.openxmlformats.org/markup-compatibility/2006" xmlns:aink="http://schemas.microsoft.com/office/drawing/2016/ink" xmlns:am3d="http://schemas.microsoft.com/office/drawing/2017/model3d" xmlns:o="urn:schemas-microsoft-com:office:office" xmlns:oel="http://schemas.microsoft.com/office/2019/extlst" xmlns:r="http://schemas.openxmlformats.org/officeDocument/2006/relationships" xmlns:m="http://schemas.openxmlformats.org/officeDocument/2006/math" xmlns:v="urn:schemas-microsoft-com:vml" xmlns:wp14="http://schemas.microsoft.com/office/word/2010/wordprocessingDrawing" xmlns:wp="http://schemas.openxmlformats.org/drawingml/2006/wordprocessingDrawing" xmlns:w10="urn:schemas-microsoft-com:office:word" xmlns:w="http://schemas.openxmlformats.org/wordprocessingml/2006/main" xmlns:w14="http://schemas.microsoft.com/office/word/2010/wordml" xmlns:w15="http://schemas.microsoft.com/office/word/2012/wordml" xmlns:w16cex="http://schemas.microsoft.com/office/word/2018/wordml/cex" xmlns:w16cid="http://schemas.microsoft.com/office/word/2016/wordml/cid" xmlns:w16="http://schemas.microsoft.com/office/word/2018/wordml" xmlns:w16du="http://schemas.microsoft.com/office/word/2023/wordml/word16du" xmlns:w16sdtdh="http://schemas.microsoft.com/office/word/2020/wordml/sdtdatahash" xmlns:w16sdtfl="http://schemas.microsoft.com/office/word/2024/wordml/sdtformatlock" xmlns:w16se="http://schemas.microsoft.com/office/word/2015/wordml/symex" xmlns:wpg="http://schemas.microsoft.com/office/word/2010/wordprocessingGroup" xmlns:wpi="http://schemas.microsoft.com/office/word/2010/wordprocessingInk" xmlns:wne="http://schemas.microsoft.com/office/word/2006/wordml" xmlns:wps="http://schemas.microsoft.com/office/word/2010/wordprocessingShape" mc:Ignorable="w14 w15 w16se w16cid w16 w16cex w16sdtdh w16sdtfl w16du wp14">
   <w:abstractNum w:abstractNumId="0" w15:restartNumberingAfterBreak="0">
     <w:nsid w:val="164346F4"/>
     <w:multiLevelType w:val="hybridMultilevel"/>
@@ -4670,6 +5786,119 @@
     </w:lvl>
   </w:abstractNum>
   <w:abstractNum w:abstractNumId="5" w15:restartNumberingAfterBreak="0">
+    <w:nsid w:val="6B48065D"/>
+    <w:multiLevelType w:val="hybridMultilevel"/>
+    <w:tmpl w:val="9566E192"/>
+    <w:lvl w:ilvl="0" w:tplc="240A0001">
+      <w:start w:val="1"/>
+      <w:numFmt w:val="bullet"/>
+      <w:lvlText w:val=""/>
+      <w:lvlJc w:val="left"/>
+      <w:pPr>
+        <w:ind w:left="720" w:hanging="360"/>
+      </w:pPr>
+      <w:rPr>
+        <w:rFonts w:ascii="Symbol" w:hAnsi="Symbol" w:hint="default"/>
+      </w:rPr>
+    </w:lvl>
+    <w:lvl w:ilvl="1" w:tplc="240A0003" w:tentative="1">
+      <w:start w:val="1"/>
+      <w:numFmt w:val="bullet"/>
+      <w:lvlText w:val="o"/>
+      <w:lvlJc w:val="left"/>
+      <w:pPr>
+        <w:ind w:left="1440" w:hanging="360"/>
+      </w:pPr>
+      <w:rPr>
+        <w:rFonts w:ascii="Courier New" w:hAnsi="Courier New" w:cs="Courier New" w:hint="default"/>
+      </w:rPr>
+    </w:lvl>
+    <w:lvl w:ilvl="2" w:tplc="240A0005" w:tentative="1">
+      <w:start w:val="1"/>
+      <w:numFmt w:val="bullet"/>
+      <w:lvlText w:val=""/>
+      <w:lvlJc w:val="left"/>
+      <w:pPr>
+        <w:ind w:left="2160" w:hanging="360"/>
+      </w:pPr>
+      <w:rPr>
+        <w:rFonts w:ascii="Wingdings" w:hAnsi="Wingdings" w:hint="default"/>
+      </w:rPr>
+    </w:lvl>
+    <w:lvl w:ilvl="3" w:tplc="240A0001" w:tentative="1">
+      <w:start w:val="1"/>
+      <w:numFmt w:val="bullet"/>
+      <w:lvlText w:val=""/>
+      <w:lvlJc w:val="left"/>
+      <w:pPr>
+        <w:ind w:left="2880" w:hanging="360"/>
+      </w:pPr>
+      <w:rPr>
+        <w:rFonts w:ascii="Symbol" w:hAnsi="Symbol" w:hint="default"/>
+      </w:rPr>
+    </w:lvl>
+    <w:lvl w:ilvl="4" w:tplc="240A0003" w:tentative="1">
+      <w:start w:val="1"/>
+      <w:numFmt w:val="bullet"/>
+      <w:lvlText w:val="o"/>
+      <w:lvlJc w:val="left"/>
+      <w:pPr>
+        <w:ind w:left="3600" w:hanging="360"/>
+      </w:pPr>
+      <w:rPr>
+        <w:rFonts w:ascii="Courier New" w:hAnsi="Courier New" w:cs="Courier New" w:hint="default"/>
+      </w:rPr>
+    </w:lvl>
+    <w:lvl w:ilvl="5" w:tplc="240A0005" w:tentative="1">
+      <w:start w:val="1"/>
+      <w:numFmt w:val="bullet"/>
+      <w:lvlText w:val=""/>
+      <w:lvlJc w:val="left"/>
+      <w:pPr>
+        <w:ind w:left="4320" w:hanging="360"/>
+      </w:pPr>
+      <w:rPr>
+        <w:rFonts w:ascii="Wingdings" w:hAnsi="Wingdings" w:hint="default"/>
+      </w:rPr>
+    </w:lvl>
+    <w:lvl w:ilvl="6" w:tplc="240A0001" w:tentative="1">
+      <w:start w:val="1"/>
+      <w:numFmt w:val="bullet"/>
+      <w:lvlText w:val=""/>
+      <w:lvlJc w:val="left"/>
+      <w:pPr>
+        <w:ind w:left="5040" w:hanging="360"/>
+      </w:pPr>
+      <w:rPr>
+        <w:rFonts w:ascii="Symbol" w:hAnsi="Symbol" w:hint="default"/>
+      </w:rPr>
+    </w:lvl>
+    <w:lvl w:ilvl="7" w:tplc="240A0003" w:tentative="1">
+      <w:start w:val="1"/>
+      <w:numFmt w:val="bullet"/>
+      <w:lvlText w:val="o"/>
+      <w:lvlJc w:val="left"/>
+      <w:pPr>
+        <w:ind w:left="5760" w:hanging="360"/>
+      </w:pPr>
+      <w:rPr>
+        <w:rFonts w:ascii="Courier New" w:hAnsi="Courier New" w:cs="Courier New" w:hint="default"/>
+      </w:rPr>
+    </w:lvl>
+    <w:lvl w:ilvl="8" w:tplc="240A0005" w:tentative="1">
+      <w:start w:val="1"/>
+      <w:numFmt w:val="bullet"/>
+      <w:lvlText w:val=""/>
+      <w:lvlJc w:val="left"/>
+      <w:pPr>
+        <w:ind w:left="6480" w:hanging="360"/>
+      </w:pPr>
+      <w:rPr>
+        <w:rFonts w:ascii="Wingdings" w:hAnsi="Wingdings" w:hint="default"/>
+      </w:rPr>
+    </w:lvl>
+  </w:abstractNum>
+  <w:abstractNum w:abstractNumId="6" w15:restartNumberingAfterBreak="0">
     <w:nsid w:val="6F1C43A0"/>
     <w:multiLevelType w:val="hybridMultilevel"/>
     <w:tmpl w:val="239205CC"/>
@@ -4782,7 +6011,7 @@
       </w:rPr>
     </w:lvl>
   </w:abstractNum>
-  <w:abstractNum w:abstractNumId="6" w15:restartNumberingAfterBreak="0">
+  <w:abstractNum w:abstractNumId="7" w15:restartNumberingAfterBreak="0">
     <w:nsid w:val="719B15A0"/>
     <w:multiLevelType w:val="hybridMultilevel"/>
     <w:tmpl w:val="8B6A06FC"/>
@@ -4895,7 +6124,7 @@
       </w:rPr>
     </w:lvl>
   </w:abstractNum>
-  <w:abstractNum w:abstractNumId="7" w15:restartNumberingAfterBreak="0">
+  <w:abstractNum w:abstractNumId="8" w15:restartNumberingAfterBreak="0">
     <w:nsid w:val="7760001C"/>
     <w:multiLevelType w:val="hybridMultilevel"/>
     <w:tmpl w:val="DA00D140"/>
@@ -5008,7 +6237,7 @@
       </w:rPr>
     </w:lvl>
   </w:abstractNum>
-  <w:abstractNum w:abstractNumId="8" w15:restartNumberingAfterBreak="0">
+  <w:abstractNum w:abstractNumId="9" w15:restartNumberingAfterBreak="0">
     <w:nsid w:val="7A944C52"/>
     <w:multiLevelType w:val="hybridMultilevel"/>
     <w:tmpl w:val="4DF8A4A6"/>
@@ -5121,38 +6350,130 @@
       </w:rPr>
     </w:lvl>
   </w:abstractNum>
-  <w:num w:numId="1">
+  <w:abstractNum w:abstractNumId="10" w15:restartNumberingAfterBreak="0">
+    <w:nsid w:val="7BCE6F6B"/>
+    <w:multiLevelType w:val="hybridMultilevel"/>
+    <w:tmpl w:val="570004FA"/>
+    <w:lvl w:ilvl="0" w:tplc="240A000F">
+      <w:start w:val="1"/>
+      <w:numFmt w:val="decimal"/>
+      <w:lvlText w:val="%1."/>
+      <w:lvlJc w:val="left"/>
+      <w:pPr>
+        <w:ind w:left="720" w:hanging="360"/>
+      </w:pPr>
+    </w:lvl>
+    <w:lvl w:ilvl="1" w:tplc="240A0019" w:tentative="1">
+      <w:start w:val="1"/>
+      <w:numFmt w:val="lowerLetter"/>
+      <w:lvlText w:val="%2."/>
+      <w:lvlJc w:val="left"/>
+      <w:pPr>
+        <w:ind w:left="1440" w:hanging="360"/>
+      </w:pPr>
+    </w:lvl>
+    <w:lvl w:ilvl="2" w:tplc="240A001B" w:tentative="1">
+      <w:start w:val="1"/>
+      <w:numFmt w:val="lowerRoman"/>
+      <w:lvlText w:val="%3."/>
+      <w:lvlJc w:val="right"/>
+      <w:pPr>
+        <w:ind w:left="2160" w:hanging="180"/>
+      </w:pPr>
+    </w:lvl>
+    <w:lvl w:ilvl="3" w:tplc="240A000F" w:tentative="1">
+      <w:start w:val="1"/>
+      <w:numFmt w:val="decimal"/>
+      <w:lvlText w:val="%4."/>
+      <w:lvlJc w:val="left"/>
+      <w:pPr>
+        <w:ind w:left="2880" w:hanging="360"/>
+      </w:pPr>
+    </w:lvl>
+    <w:lvl w:ilvl="4" w:tplc="240A0019" w:tentative="1">
+      <w:start w:val="1"/>
+      <w:numFmt w:val="lowerLetter"/>
+      <w:lvlText w:val="%5."/>
+      <w:lvlJc w:val="left"/>
+      <w:pPr>
+        <w:ind w:left="3600" w:hanging="360"/>
+      </w:pPr>
+    </w:lvl>
+    <w:lvl w:ilvl="5" w:tplc="240A001B" w:tentative="1">
+      <w:start w:val="1"/>
+      <w:numFmt w:val="lowerRoman"/>
+      <w:lvlText w:val="%6."/>
+      <w:lvlJc w:val="right"/>
+      <w:pPr>
+        <w:ind w:left="4320" w:hanging="180"/>
+      </w:pPr>
+    </w:lvl>
+    <w:lvl w:ilvl="6" w:tplc="240A000F" w:tentative="1">
+      <w:start w:val="1"/>
+      <w:numFmt w:val="decimal"/>
+      <w:lvlText w:val="%7."/>
+      <w:lvlJc w:val="left"/>
+      <w:pPr>
+        <w:ind w:left="5040" w:hanging="360"/>
+      </w:pPr>
+    </w:lvl>
+    <w:lvl w:ilvl="7" w:tplc="240A0019" w:tentative="1">
+      <w:start w:val="1"/>
+      <w:numFmt w:val="lowerLetter"/>
+      <w:lvlText w:val="%8."/>
+      <w:lvlJc w:val="left"/>
+      <w:pPr>
+        <w:ind w:left="5760" w:hanging="360"/>
+      </w:pPr>
+    </w:lvl>
+    <w:lvl w:ilvl="8" w:tplc="240A001B" w:tentative="1">
+      <w:start w:val="1"/>
+      <w:numFmt w:val="lowerRoman"/>
+      <w:lvlText w:val="%9."/>
+      <w:lvlJc w:val="right"/>
+      <w:pPr>
+        <w:ind w:left="6480" w:hanging="180"/>
+      </w:pPr>
+    </w:lvl>
+  </w:abstractNum>
+  <w:num w:numId="1" w16cid:durableId="2052995577">
     <w:abstractNumId w:val="3"/>
   </w:num>
-  <w:num w:numId="2">
+  <w:num w:numId="2" w16cid:durableId="1068961126">
     <w:abstractNumId w:val="2"/>
   </w:num>
-  <w:num w:numId="3">
+  <w:num w:numId="3" w16cid:durableId="911352854">
+    <w:abstractNumId w:val="6"/>
+  </w:num>
+  <w:num w:numId="4" w16cid:durableId="315378784">
+    <w:abstractNumId w:val="8"/>
+  </w:num>
+  <w:num w:numId="5" w16cid:durableId="1158306522">
+    <w:abstractNumId w:val="7"/>
+  </w:num>
+  <w:num w:numId="6" w16cid:durableId="1288773938">
+    <w:abstractNumId w:val="0"/>
+  </w:num>
+  <w:num w:numId="7" w16cid:durableId="1241210122">
+    <w:abstractNumId w:val="4"/>
+  </w:num>
+  <w:num w:numId="8" w16cid:durableId="1337925516">
+    <w:abstractNumId w:val="1"/>
+  </w:num>
+  <w:num w:numId="9" w16cid:durableId="44373224">
+    <w:abstractNumId w:val="9"/>
+  </w:num>
+  <w:num w:numId="10" w16cid:durableId="631861241">
     <w:abstractNumId w:val="5"/>
   </w:num>
-  <w:num w:numId="4">
-    <w:abstractNumId w:val="7"/>
-  </w:num>
-  <w:num w:numId="5">
-    <w:abstractNumId w:val="6"/>
-  </w:num>
-  <w:num w:numId="6">
-    <w:abstractNumId w:val="0"/>
-  </w:num>
-  <w:num w:numId="7">
-    <w:abstractNumId w:val="4"/>
-  </w:num>
-  <w:num w:numId="8">
-    <w:abstractNumId w:val="1"/>
-  </w:num>
-  <w:num w:numId="9">
-    <w:abstractNumId w:val="8"/>
+  <w:num w:numId="11" w16cid:durableId="642809573">
+    <w:abstractNumId w:val="10"/>
   </w:num>
 </w:numbering>
 </file>
 
 <file path=word/styles.xml><?xml version="1.0" encoding="utf-8"?>
-<w:styles xmlns:mc="http://schemas.openxmlformats.org/markup-compatibility/2006" xmlns:r="http://schemas.openxmlformats.org/officeDocument/2006/relationships" xmlns:w="http://schemas.openxmlformats.org/wordprocessingml/2006/main" xmlns:w14="http://schemas.microsoft.com/office/word/2010/wordml" xmlns:w15="http://schemas.microsoft.com/office/word/2012/wordml" xmlns:w16cex="http://schemas.microsoft.com/office/word/2018/wordml/cex" xmlns:w16cid="http://schemas.microsoft.com/office/word/2016/wordml/cid" xmlns:w16="http://schemas.microsoft.com/office/word/2018/wordml" xmlns:w16sdtdh="http://schemas.microsoft.com/office/word/2020/wordml/sdtdatahash" xmlns:w16se="http://schemas.microsoft.com/office/word/2015/wordml/symex" mc:Ignorable="w14 w15 w16se w16cid w16 w16cex w16sdtdh">
+<w:styles xmlns:mc="http://schemas.openxmlformats.org/markup-compatibility/2006" xmlns:r="http://schemas.openxmlformats.org/officeDocument/2006/relationships" xmlns:w="http://schemas.openxmlformats.org/wordprocessingml/2006/main" xmlns:w14="http://schemas.microsoft.com/office/word/2010/wordml" xmlns:w15="http://schemas.microsoft.com/office/word/2012/wordml" xmlns:w16cex="http://schemas.microsoft.com/office/word/2018/wordml/cex" xmlns:w16cid="http://schemas.microsoft.com/office/word/2016/wordml/cid" xmlns:w16="http://schemas.microsoft.com/office/word/2018/wordml" xmlns:w16du="http://schemas.microsoft.com/office/word/2023/wordml/word16du" xmlns:w16sdtdh="http://schemas.microsoft.com/office/word/2020/wordml/sdtdatahash" xmlns:w16sdtfl="http://schemas.microsoft.com/office/word/2024/wordml/sdtformatlock" xmlns:w16se="http://schemas.microsoft.com/office/word/2015/wordml/symex" mc:Ignorable="w14 w15 w16se w16cid w16 w16cex w16sdtdh w16sdtfl w16du">
   <w:docDefaults>
     <w:rPrDefault>
       <w:rPr>
@@ -5550,7 +6871,7 @@
     <w:name w:val="Normal"/>
     <w:qFormat/>
   </w:style>
-  <w:style w:type="paragraph" w:styleId="Heading1">
+  <w:style w:type="paragraph" w:styleId="Ttulo1">
     <w:name w:val="heading 1"/>
     <w:basedOn w:val="Normal"/>
     <w:next w:val="Normal"/>
@@ -5567,7 +6888,7 @@
       <w:szCs w:val="40"/>
     </w:rPr>
   </w:style>
-  <w:style w:type="paragraph" w:styleId="Heading2">
+  <w:style w:type="paragraph" w:styleId="Ttulo2">
     <w:name w:val="heading 2"/>
     <w:basedOn w:val="Normal"/>
     <w:next w:val="Normal"/>
@@ -5585,12 +6906,11 @@
       <w:szCs w:val="32"/>
     </w:rPr>
   </w:style>
-  <w:style w:type="paragraph" w:styleId="Heading3">
+  <w:style w:type="paragraph" w:styleId="Ttulo3">
     <w:name w:val="heading 3"/>
     <w:basedOn w:val="Normal"/>
     <w:next w:val="Normal"/>
     <w:uiPriority w:val="9"/>
-    <w:semiHidden/>
     <w:unhideWhenUsed/>
     <w:qFormat/>
     <w:pPr>
@@ -5605,7 +6925,7 @@
       <w:szCs w:val="28"/>
     </w:rPr>
   </w:style>
-  <w:style w:type="paragraph" w:styleId="Heading4">
+  <w:style w:type="paragraph" w:styleId="Ttulo4">
     <w:name w:val="heading 4"/>
     <w:basedOn w:val="Normal"/>
     <w:next w:val="Normal"/>
@@ -5625,7 +6945,7 @@
       <w:szCs w:val="24"/>
     </w:rPr>
   </w:style>
-  <w:style w:type="paragraph" w:styleId="Heading5">
+  <w:style w:type="paragraph" w:styleId="Ttulo5">
     <w:name w:val="heading 5"/>
     <w:basedOn w:val="Normal"/>
     <w:next w:val="Normal"/>
@@ -5643,7 +6963,7 @@
       <w:color w:val="666666"/>
     </w:rPr>
   </w:style>
-  <w:style w:type="paragraph" w:styleId="Heading6">
+  <w:style w:type="paragraph" w:styleId="Ttulo6">
     <w:name w:val="heading 6"/>
     <w:basedOn w:val="Normal"/>
     <w:next w:val="Normal"/>
@@ -5662,13 +6982,13 @@
       <w:color w:val="666666"/>
     </w:rPr>
   </w:style>
-  <w:style w:type="character" w:default="1" w:styleId="DefaultParagraphFont">
+  <w:style w:type="character" w:default="1" w:styleId="Fuentedeprrafopredeter">
     <w:name w:val="Default Paragraph Font"/>
     <w:uiPriority w:val="1"/>
     <w:semiHidden/>
     <w:unhideWhenUsed/>
   </w:style>
-  <w:style w:type="table" w:default="1" w:styleId="TableNormal">
+  <w:style w:type="table" w:default="1" w:styleId="Tablanormal">
     <w:name w:val="Normal Table"/>
     <w:uiPriority w:val="99"/>
     <w:semiHidden/>
@@ -5683,13 +7003,13 @@
       </w:tblCellMar>
     </w:tblPr>
   </w:style>
-  <w:style w:type="numbering" w:default="1" w:styleId="NoList">
+  <w:style w:type="numbering" w:default="1" w:styleId="Sinlista">
     <w:name w:val="No List"/>
     <w:uiPriority w:val="99"/>
     <w:semiHidden/>
     <w:unhideWhenUsed/>
   </w:style>
-  <w:style w:type="paragraph" w:styleId="Title">
+  <w:style w:type="paragraph" w:styleId="Ttulo">
     <w:name w:val="Title"/>
     <w:basedOn w:val="Normal"/>
     <w:next w:val="Normal"/>
@@ -5705,7 +7025,7 @@
       <w:szCs w:val="52"/>
     </w:rPr>
   </w:style>
-  <w:style w:type="paragraph" w:styleId="Subtitle">
+  <w:style w:type="paragraph" w:styleId="Subttulo">
     <w:name w:val="Subtitle"/>
     <w:basedOn w:val="Normal"/>
     <w:next w:val="Normal"/>
@@ -5722,7 +7042,7 @@
       <w:szCs w:val="30"/>
     </w:rPr>
   </w:style>
-  <w:style w:type="paragraph" w:styleId="ListParagraph">
+  <w:style w:type="paragraph" w:styleId="Prrafodelista">
     <w:name w:val="List Paragraph"/>
     <w:basedOn w:val="Normal"/>
     <w:uiPriority w:val="34"/>
@@ -5733,7 +7053,7 @@
       <w:contextualSpacing/>
     </w:pPr>
   </w:style>
-  <w:style w:type="paragraph" w:styleId="Caption">
+  <w:style w:type="paragraph" w:styleId="Descripcin">
     <w:name w:val="caption"/>
     <w:basedOn w:val="Normal"/>
     <w:next w:val="Normal"/>
@@ -5752,9 +7072,9 @@
       <w:szCs w:val="18"/>
     </w:rPr>
   </w:style>
-  <w:style w:type="table" w:styleId="TableGrid">
+  <w:style w:type="table" w:styleId="Tablaconcuadrcula">
     <w:name w:val="Table Grid"/>
-    <w:basedOn w:val="TableNormal"/>
+    <w:basedOn w:val="Tablanormal"/>
     <w:uiPriority w:val="39"/>
     <w:rsid w:val="00C3546B"/>
     <w:pPr>
@@ -5771,9 +7091,9 @@
       </w:tblBorders>
     </w:tblPr>
   </w:style>
-  <w:style w:type="table" w:styleId="PlainTable2">
+  <w:style w:type="table" w:styleId="Tablanormal2">
     <w:name w:val="Plain Table 2"/>
-    <w:basedOn w:val="TableNormal"/>
+    <w:basedOn w:val="Tablanormal"/>
     <w:uiPriority w:val="42"/>
     <w:rsid w:val="00522EB9"/>
     <w:pPr>

</xml_diff>

<commit_message>
working on week 1 part 2
</commit_message>
<xml_diff>
--- a/Draft/6 Case Study.docx
+++ b/Draft/6 Case Study.docx
@@ -1241,17 +1241,15 @@
         </w:rPr>
         <w:t xml:space="preserve">It is important to remark that </w:t>
       </w:r>
-      <w:proofErr w:type="gramStart"/>
-      <w:r>
-        <w:rPr>
-          <w:rFonts w:asciiTheme="majorHAnsi" w:hAnsiTheme="majorHAnsi" w:cstheme="majorHAnsi"/>
-          <w:sz w:val="24"/>
-          <w:szCs w:val="24"/>
-          <w:lang w:val="en-NZ"/>
-        </w:rPr>
-        <w:t>all of</w:t>
-      </w:r>
-      <w:proofErr w:type="gramEnd"/>
+      <w:r>
+        <w:rPr>
+          <w:rFonts w:asciiTheme="majorHAnsi" w:hAnsiTheme="majorHAnsi" w:cstheme="majorHAnsi"/>
+          <w:sz w:val="24"/>
+          <w:szCs w:val="24"/>
+          <w:lang w:val="en-NZ"/>
+        </w:rPr>
+        <w:t>all</w:t>
+      </w:r>
       <w:r>
         <w:rPr>
           <w:rFonts w:asciiTheme="majorHAnsi" w:hAnsiTheme="majorHAnsi" w:cstheme="majorHAnsi"/>
@@ -1362,17 +1360,15 @@
         <w:lastRenderedPageBreak/>
         <w:t xml:space="preserve">This summarizes the main elements of the learning design proposed for ENBU 79X/89X Industry Project and the methodologies used to implement that design. Some other aspect of the development of the course </w:t>
       </w:r>
-      <w:proofErr w:type="gramStart"/>
-      <w:r>
-        <w:rPr>
-          <w:rFonts w:asciiTheme="majorHAnsi" w:hAnsiTheme="majorHAnsi" w:cstheme="majorHAnsi"/>
-          <w:sz w:val="24"/>
-          <w:szCs w:val="24"/>
-          <w:lang w:val="en-NZ"/>
-        </w:rPr>
-        <w:t>were</w:t>
-      </w:r>
-      <w:proofErr w:type="gramEnd"/>
+      <w:r>
+        <w:rPr>
+          <w:rFonts w:asciiTheme="majorHAnsi" w:hAnsiTheme="majorHAnsi" w:cstheme="majorHAnsi"/>
+          <w:sz w:val="24"/>
+          <w:szCs w:val="24"/>
+          <w:lang w:val="en-NZ"/>
+        </w:rPr>
+        <w:t>was</w:t>
+      </w:r>
       <w:r>
         <w:rPr>
           <w:rFonts w:asciiTheme="majorHAnsi" w:hAnsiTheme="majorHAnsi" w:cstheme="majorHAnsi"/>
@@ -1505,17 +1501,15 @@
         </w:rPr>
         <w:t xml:space="preserve"> see if any of the tools provided, </w:t>
       </w:r>
-      <w:proofErr w:type="spellStart"/>
-      <w:r>
-        <w:rPr>
-          <w:rFonts w:asciiTheme="majorHAnsi" w:hAnsiTheme="majorHAnsi" w:cstheme="majorHAnsi"/>
-          <w:sz w:val="24"/>
-          <w:szCs w:val="24"/>
-          <w:lang w:val="en-NZ"/>
-        </w:rPr>
-        <w:t>specially</w:t>
-      </w:r>
-      <w:proofErr w:type="spellEnd"/>
+      <w:r>
+        <w:rPr>
+          <w:rFonts w:asciiTheme="majorHAnsi" w:hAnsiTheme="majorHAnsi" w:cstheme="majorHAnsi"/>
+          <w:sz w:val="24"/>
+          <w:szCs w:val="24"/>
+          <w:lang w:val="en-NZ"/>
+        </w:rPr>
+        <w:t>especially</w:t>
+      </w:r>
       <w:r>
         <w:rPr>
           <w:rFonts w:asciiTheme="majorHAnsi" w:hAnsiTheme="majorHAnsi" w:cstheme="majorHAnsi"/>
@@ -1648,57 +1642,42 @@
         </w:rPr>
         <w:t xml:space="preserve">Finally, LO4 evaluates how the group proposes and organizes structured review. WorkshopAR </w:t>
       </w:r>
-      <w:proofErr w:type="spellStart"/>
-      <w:r>
-        <w:rPr>
-          <w:rFonts w:asciiTheme="majorHAnsi" w:hAnsiTheme="majorHAnsi" w:cstheme="majorHAnsi"/>
-          <w:sz w:val="24"/>
-          <w:szCs w:val="24"/>
-          <w:lang w:val="en-NZ"/>
-        </w:rPr>
-        <w:t>doe</w:t>
-      </w:r>
-      <w:proofErr w:type="spellEnd"/>
-      <w:r>
-        <w:rPr>
-          <w:rFonts w:asciiTheme="majorHAnsi" w:hAnsiTheme="majorHAnsi" w:cstheme="majorHAnsi"/>
-          <w:sz w:val="24"/>
-          <w:szCs w:val="24"/>
-          <w:lang w:val="en-NZ"/>
-        </w:rPr>
-        <w:t xml:space="preserve"> </w:t>
-      </w:r>
-      <w:proofErr w:type="gramStart"/>
-      <w:r>
-        <w:rPr>
-          <w:rFonts w:asciiTheme="majorHAnsi" w:hAnsiTheme="majorHAnsi" w:cstheme="majorHAnsi"/>
-          <w:sz w:val="24"/>
-          <w:szCs w:val="24"/>
-          <w:lang w:val="en-NZ"/>
-        </w:rPr>
-        <w:t>not dedicates</w:t>
-      </w:r>
-      <w:proofErr w:type="gramEnd"/>
-      <w:r>
-        <w:rPr>
-          <w:rFonts w:asciiTheme="majorHAnsi" w:hAnsiTheme="majorHAnsi" w:cstheme="majorHAnsi"/>
-          <w:sz w:val="24"/>
-          <w:szCs w:val="24"/>
-          <w:lang w:val="en-NZ"/>
-        </w:rPr>
-        <w:t xml:space="preserve"> one </w:t>
-      </w:r>
-      <w:proofErr w:type="gramStart"/>
-      <w:r>
-        <w:rPr>
-          <w:rFonts w:asciiTheme="majorHAnsi" w:hAnsiTheme="majorHAnsi" w:cstheme="majorHAnsi"/>
-          <w:sz w:val="24"/>
-          <w:szCs w:val="24"/>
-          <w:lang w:val="en-NZ"/>
-        </w:rPr>
-        <w:t>particular functionality</w:t>
-      </w:r>
-      <w:proofErr w:type="gramEnd"/>
+      <w:r>
+        <w:rPr>
+          <w:rFonts w:asciiTheme="majorHAnsi" w:hAnsiTheme="majorHAnsi" w:cstheme="majorHAnsi"/>
+          <w:sz w:val="24"/>
+          <w:szCs w:val="24"/>
+          <w:lang w:val="en-NZ"/>
+        </w:rPr>
+        <w:t>do</w:t>
+      </w:r>
+      <w:r>
+        <w:rPr>
+          <w:rFonts w:asciiTheme="majorHAnsi" w:hAnsiTheme="majorHAnsi" w:cstheme="majorHAnsi"/>
+          <w:sz w:val="24"/>
+          <w:szCs w:val="24"/>
+          <w:lang w:val="en-NZ"/>
+        </w:rPr>
+        <w:t>es</w:t>
+      </w:r>
+      <w:r>
+        <w:rPr>
+          <w:rFonts w:asciiTheme="majorHAnsi" w:hAnsiTheme="majorHAnsi" w:cstheme="majorHAnsi"/>
+          <w:sz w:val="24"/>
+          <w:szCs w:val="24"/>
+          <w:lang w:val="en-NZ"/>
+        </w:rPr>
+        <w:t xml:space="preserve"> not dedicate one </w:t>
+      </w:r>
+      <w:r>
+        <w:rPr>
+          <w:rFonts w:asciiTheme="majorHAnsi" w:hAnsiTheme="majorHAnsi" w:cstheme="majorHAnsi"/>
+          <w:sz w:val="24"/>
+          <w:szCs w:val="24"/>
+          <w:lang w:val="en-NZ"/>
+        </w:rPr>
+        <w:t>functionality</w:t>
+      </w:r>
       <w:r>
         <w:rPr>
           <w:rFonts w:asciiTheme="majorHAnsi" w:hAnsiTheme="majorHAnsi" w:cstheme="majorHAnsi"/>
@@ -1745,17 +1724,15 @@
         </w:rPr>
         <w:t xml:space="preserve">The learning objectives of WorkshopAR were designed taking into consideration the design of Industry </w:t>
       </w:r>
-      <w:proofErr w:type="gramStart"/>
-      <w:r>
-        <w:rPr>
-          <w:rFonts w:asciiTheme="majorHAnsi" w:hAnsiTheme="majorHAnsi" w:cstheme="majorHAnsi"/>
-          <w:sz w:val="24"/>
-          <w:szCs w:val="24"/>
-          <w:lang w:val="en-NZ"/>
-        </w:rPr>
-        <w:t>Project, and</w:t>
-      </w:r>
-      <w:proofErr w:type="gramEnd"/>
+      <w:r>
+        <w:rPr>
+          <w:rFonts w:asciiTheme="majorHAnsi" w:hAnsiTheme="majorHAnsi" w:cstheme="majorHAnsi"/>
+          <w:sz w:val="24"/>
+          <w:szCs w:val="24"/>
+          <w:lang w:val="en-NZ"/>
+        </w:rPr>
+        <w:t>Project and</w:t>
+      </w:r>
       <w:r>
         <w:rPr>
           <w:rFonts w:asciiTheme="majorHAnsi" w:hAnsiTheme="majorHAnsi" w:cstheme="majorHAnsi"/>
@@ -1896,8 +1873,17 @@
           <w:szCs w:val="24"/>
           <w:lang w:val="en-NZ"/>
         </w:rPr>
+        <w:t xml:space="preserve">This learning design is also informed by other aspects found in the literature about effective collaborative learning and the approaches taken by other projects in similar context. Section </w:t>
+      </w:r>
+      <w:r>
+        <w:rPr>
+          <w:rFonts w:asciiTheme="majorHAnsi" w:hAnsiTheme="majorHAnsi" w:cstheme="majorHAnsi"/>
+          <w:sz w:val="24"/>
+          <w:szCs w:val="24"/>
+          <w:lang w:val="en-NZ"/>
+        </w:rPr>
         <w:lastRenderedPageBreak/>
-        <w:t>This learning design is also informed by other aspects found in the literature about effective collaborative learning and the approaches taken by other projects in similar context. Section 2.1.4 details some important barriers that impede a good flow of collaboration in the classroom. Two of the ideas mentioned resonated the most with the characteristics found in the Industry Project course:</w:t>
+        <w:t>2.1.4 details some important barriers that impede a good flow of collaboration in the classroom. Two of the ideas mentioned resonated the most with the characteristics found in the Industry Project course:</w:t>
       </w:r>
     </w:p>
     <w:p>
@@ -2627,17 +2613,15 @@
         </w:rPr>
         <w:t xml:space="preserve">The second type of observations was of the general groupwork performed by the students. These work sessions often involved more than one group at a </w:t>
       </w:r>
-      <w:proofErr w:type="gramStart"/>
-      <w:r>
-        <w:rPr>
-          <w:rFonts w:asciiTheme="majorHAnsi" w:hAnsiTheme="majorHAnsi" w:cstheme="majorHAnsi"/>
-          <w:sz w:val="24"/>
-          <w:szCs w:val="24"/>
-          <w:lang w:val="en-NZ"/>
-        </w:rPr>
-        <w:t>time</w:t>
-      </w:r>
-      <w:proofErr w:type="gramEnd"/>
+      <w:r>
+        <w:rPr>
+          <w:rFonts w:asciiTheme="majorHAnsi" w:hAnsiTheme="majorHAnsi" w:cstheme="majorHAnsi"/>
+          <w:sz w:val="24"/>
+          <w:szCs w:val="24"/>
+          <w:lang w:val="en-NZ"/>
+        </w:rPr>
+        <w:t>time,</w:t>
+      </w:r>
       <w:r>
         <w:rPr>
           <w:rFonts w:asciiTheme="majorHAnsi" w:hAnsiTheme="majorHAnsi" w:cstheme="majorHAnsi"/>
@@ -2647,17 +2631,15 @@
         </w:rPr>
         <w:t xml:space="preserve"> and the </w:t>
       </w:r>
-      <w:proofErr w:type="gramStart"/>
-      <w:r>
-        <w:rPr>
-          <w:rFonts w:asciiTheme="majorHAnsi" w:hAnsiTheme="majorHAnsi" w:cstheme="majorHAnsi"/>
-          <w:sz w:val="24"/>
-          <w:szCs w:val="24"/>
-          <w:lang w:val="en-NZ"/>
-        </w:rPr>
-        <w:t>main focus</w:t>
-      </w:r>
-      <w:proofErr w:type="gramEnd"/>
+      <w:r>
+        <w:rPr>
+          <w:rFonts w:asciiTheme="majorHAnsi" w:hAnsiTheme="majorHAnsi" w:cstheme="majorHAnsi"/>
+          <w:sz w:val="24"/>
+          <w:szCs w:val="24"/>
+          <w:lang w:val="en-NZ"/>
+        </w:rPr>
+        <w:t>focus</w:t>
+      </w:r>
       <w:r>
         <w:rPr>
           <w:rFonts w:asciiTheme="majorHAnsi" w:hAnsiTheme="majorHAnsi" w:cstheme="majorHAnsi"/>
@@ -2695,17 +2677,15 @@
         </w:rPr>
         <w:t xml:space="preserve">These observations helped to understand the general dynamics of the groups, and the activities being completed for the project. They also constituted the “baseline” observations for those activities that were not using the AR </w:t>
       </w:r>
-      <w:proofErr w:type="gramStart"/>
-      <w:r>
-        <w:rPr>
-          <w:rFonts w:asciiTheme="majorHAnsi" w:hAnsiTheme="majorHAnsi" w:cstheme="majorHAnsi"/>
-          <w:sz w:val="24"/>
-          <w:szCs w:val="24"/>
-          <w:lang w:val="en-NZ"/>
-        </w:rPr>
-        <w:t>tool, and</w:t>
-      </w:r>
-      <w:proofErr w:type="gramEnd"/>
+      <w:r>
+        <w:rPr>
+          <w:rFonts w:asciiTheme="majorHAnsi" w:hAnsiTheme="majorHAnsi" w:cstheme="majorHAnsi"/>
+          <w:sz w:val="24"/>
+          <w:szCs w:val="24"/>
+          <w:lang w:val="en-NZ"/>
+        </w:rPr>
+        <w:t>tool and</w:t>
+      </w:r>
       <w:r>
         <w:rPr>
           <w:rFonts w:asciiTheme="majorHAnsi" w:hAnsiTheme="majorHAnsi" w:cstheme="majorHAnsi"/>
@@ -2988,17 +2968,15 @@
         </w:rPr>
         <w:t xml:space="preserve">Behaviours promoted </w:t>
       </w:r>
-      <w:proofErr w:type="gramStart"/>
-      <w:r>
-        <w:rPr>
-          <w:rFonts w:asciiTheme="majorHAnsi" w:hAnsiTheme="majorHAnsi" w:cstheme="majorHAnsi"/>
-          <w:sz w:val="24"/>
-          <w:szCs w:val="24"/>
-          <w:lang w:val="en-NZ"/>
-        </w:rPr>
-        <w:t>by the use of</w:t>
-      </w:r>
-      <w:proofErr w:type="gramEnd"/>
+      <w:r>
+        <w:rPr>
+          <w:rFonts w:asciiTheme="majorHAnsi" w:hAnsiTheme="majorHAnsi" w:cstheme="majorHAnsi"/>
+          <w:sz w:val="24"/>
+          <w:szCs w:val="24"/>
+          <w:lang w:val="en-NZ"/>
+        </w:rPr>
+        <w:t>using</w:t>
+      </w:r>
       <w:r>
         <w:rPr>
           <w:rFonts w:asciiTheme="majorHAnsi" w:hAnsiTheme="majorHAnsi" w:cstheme="majorHAnsi"/>
@@ -3091,17 +3069,15 @@
         </w:rPr>
         <w:t xml:space="preserve">The final dataset comes from unstructured interviews performed to a sample of the students and of the teaching staff. Both interviews focused on gathering information about how participants saw collaboration as part of the development of the course. How do </w:t>
       </w:r>
-      <w:proofErr w:type="spellStart"/>
-      <w:r>
-        <w:rPr>
-          <w:rFonts w:asciiTheme="majorHAnsi" w:hAnsiTheme="majorHAnsi" w:cstheme="majorHAnsi"/>
-          <w:sz w:val="24"/>
-          <w:szCs w:val="24"/>
-          <w:lang w:val="en-NZ"/>
-        </w:rPr>
-        <w:t>the</w:t>
-      </w:r>
-      <w:proofErr w:type="spellEnd"/>
+      <w:r>
+        <w:rPr>
+          <w:rFonts w:asciiTheme="majorHAnsi" w:hAnsiTheme="majorHAnsi" w:cstheme="majorHAnsi"/>
+          <w:sz w:val="24"/>
+          <w:szCs w:val="24"/>
+          <w:lang w:val="en-NZ"/>
+        </w:rPr>
+        <w:t>they</w:t>
+      </w:r>
       <w:r>
         <w:rPr>
           <w:rFonts w:asciiTheme="majorHAnsi" w:hAnsiTheme="majorHAnsi" w:cstheme="majorHAnsi"/>
@@ -3506,17 +3482,15 @@
         </w:rPr>
         <w:t xml:space="preserve">The very first session of the semester set-up the tone and flow for all the other session, which followed </w:t>
       </w:r>
-      <w:proofErr w:type="gramStart"/>
-      <w:r>
-        <w:rPr>
-          <w:rFonts w:asciiTheme="majorHAnsi" w:hAnsiTheme="majorHAnsi" w:cstheme="majorHAnsi"/>
-          <w:sz w:val="24"/>
-          <w:szCs w:val="24"/>
-          <w:lang w:val="en-NZ"/>
-        </w:rPr>
-        <w:t>more or less the</w:t>
-      </w:r>
-      <w:proofErr w:type="gramEnd"/>
+      <w:r>
+        <w:rPr>
+          <w:rFonts w:asciiTheme="majorHAnsi" w:hAnsiTheme="majorHAnsi" w:cstheme="majorHAnsi"/>
+          <w:sz w:val="24"/>
+          <w:szCs w:val="24"/>
+          <w:lang w:val="en-NZ"/>
+        </w:rPr>
+        <w:t>the</w:t>
+      </w:r>
       <w:r>
         <w:rPr>
           <w:rFonts w:asciiTheme="majorHAnsi" w:hAnsiTheme="majorHAnsi" w:cstheme="majorHAnsi"/>
@@ -3589,17 +3563,15 @@
         </w:rPr>
         <w:t xml:space="preserve"> a </w:t>
       </w:r>
-      <w:proofErr w:type="spellStart"/>
-      <w:r>
-        <w:rPr>
-          <w:rFonts w:asciiTheme="majorHAnsi" w:hAnsiTheme="majorHAnsi" w:cstheme="majorHAnsi"/>
-          <w:sz w:val="24"/>
-          <w:szCs w:val="24"/>
-          <w:lang w:val="en-NZ"/>
-        </w:rPr>
-        <w:t>karakia</w:t>
-      </w:r>
-      <w:proofErr w:type="spellEnd"/>
+      <w:r>
+        <w:rPr>
+          <w:rFonts w:asciiTheme="majorHAnsi" w:hAnsiTheme="majorHAnsi" w:cstheme="majorHAnsi"/>
+          <w:sz w:val="24"/>
+          <w:szCs w:val="24"/>
+          <w:lang w:val="en-NZ"/>
+        </w:rPr>
+        <w:t>Karakia</w:t>
+      </w:r>
       <w:r>
         <w:rPr>
           <w:rFonts w:asciiTheme="majorHAnsi" w:hAnsiTheme="majorHAnsi" w:cstheme="majorHAnsi"/>
@@ -3625,27 +3597,7 @@
           <w:szCs w:val="24"/>
           <w:lang w:val="en-NZ"/>
         </w:rPr>
-        <w:t xml:space="preserve">, which Table 1 shows in its </w:t>
-      </w:r>
-      <w:proofErr w:type="spellStart"/>
-      <w:r>
-        <w:rPr>
-          <w:rFonts w:asciiTheme="majorHAnsi" w:hAnsiTheme="majorHAnsi" w:cstheme="majorHAnsi"/>
-          <w:sz w:val="24"/>
-          <w:szCs w:val="24"/>
-          <w:lang w:val="en-NZ"/>
-        </w:rPr>
-        <w:t>Te</w:t>
-      </w:r>
-      <w:proofErr w:type="spellEnd"/>
-      <w:r>
-        <w:rPr>
-          <w:rFonts w:asciiTheme="majorHAnsi" w:hAnsiTheme="majorHAnsi" w:cstheme="majorHAnsi"/>
-          <w:sz w:val="24"/>
-          <w:szCs w:val="24"/>
-          <w:lang w:val="en-NZ"/>
-        </w:rPr>
-        <w:t xml:space="preserve"> Reo and English versions.</w:t>
+        <w:t>, which Table 1 shows in its Te Reo and English versions.</w:t>
       </w:r>
     </w:p>
     <w:p>
@@ -3730,7 +3682,6 @@
                 <w:lang w:val="en-NZ"/>
               </w:rPr>
             </w:pPr>
-            <w:proofErr w:type="spellStart"/>
             <w:r>
               <w:rPr>
                 <w:rFonts w:asciiTheme="majorHAnsi" w:hAnsiTheme="majorHAnsi" w:cstheme="majorHAnsi"/>
@@ -3738,17 +3689,7 @@
                 <w:szCs w:val="24"/>
                 <w:lang w:val="en-NZ"/>
               </w:rPr>
-              <w:t>Te</w:t>
-            </w:r>
-            <w:proofErr w:type="spellEnd"/>
-            <w:r>
-              <w:rPr>
-                <w:rFonts w:asciiTheme="majorHAnsi" w:hAnsiTheme="majorHAnsi" w:cstheme="majorHAnsi"/>
-                <w:sz w:val="24"/>
-                <w:szCs w:val="24"/>
-                <w:lang w:val="en-NZ"/>
-              </w:rPr>
-              <w:t xml:space="preserve"> Reo</w:t>
+              <w:t>Te Reo</w:t>
             </w:r>
           </w:p>
         </w:tc>
@@ -3825,27 +3766,7 @@
                 <w:szCs w:val="24"/>
                 <w:lang w:val="en-NZ"/>
               </w:rPr>
-              <w:t xml:space="preserve">Mauri </w:t>
-            </w:r>
-            <w:proofErr w:type="spellStart"/>
-            <w:r>
-              <w:rPr>
-                <w:rFonts w:asciiTheme="majorHAnsi" w:hAnsiTheme="majorHAnsi" w:cstheme="majorHAnsi"/>
-                <w:sz w:val="24"/>
-                <w:szCs w:val="24"/>
-                <w:lang w:val="en-NZ"/>
-              </w:rPr>
-              <w:t>tū</w:t>
-            </w:r>
-            <w:proofErr w:type="spellEnd"/>
-            <w:r>
-              <w:rPr>
-                <w:rFonts w:asciiTheme="majorHAnsi" w:hAnsiTheme="majorHAnsi" w:cstheme="majorHAnsi"/>
-                <w:sz w:val="24"/>
-                <w:szCs w:val="24"/>
-                <w:lang w:val="en-NZ"/>
-              </w:rPr>
-              <w:t>.</w:t>
+              <w:t>Mauri tū.</w:t>
             </w:r>
           </w:p>
           <w:p>
@@ -3865,27 +3786,7 @@
                 <w:szCs w:val="24"/>
                 <w:lang w:val="en-NZ"/>
               </w:rPr>
-              <w:t xml:space="preserve">Mauri ora ki a </w:t>
-            </w:r>
-            <w:proofErr w:type="spellStart"/>
-            <w:r>
-              <w:rPr>
-                <w:rFonts w:asciiTheme="majorHAnsi" w:hAnsiTheme="majorHAnsi" w:cstheme="majorHAnsi"/>
-                <w:sz w:val="24"/>
-                <w:szCs w:val="24"/>
-                <w:lang w:val="en-NZ"/>
-              </w:rPr>
-              <w:t>tātou</w:t>
-            </w:r>
-            <w:proofErr w:type="spellEnd"/>
-            <w:r>
-              <w:rPr>
-                <w:rFonts w:asciiTheme="majorHAnsi" w:hAnsiTheme="majorHAnsi" w:cstheme="majorHAnsi"/>
-                <w:sz w:val="24"/>
-                <w:szCs w:val="24"/>
-                <w:lang w:val="en-NZ"/>
-              </w:rPr>
-              <w:t>.</w:t>
+              <w:t>Mauri ora ki a tātou.</w:t>
             </w:r>
           </w:p>
           <w:p>
@@ -3895,7 +3796,7 @@
                 <w:rFonts w:asciiTheme="majorHAnsi" w:hAnsiTheme="majorHAnsi" w:cstheme="majorHAnsi"/>
                 <w:sz w:val="24"/>
                 <w:szCs w:val="24"/>
-                <w:lang w:val="en-NZ"/>
+                <w:lang w:val="es-CO"/>
               </w:rPr>
             </w:pPr>
             <w:proofErr w:type="spellStart"/>
@@ -3904,7 +3805,7 @@
                 <w:rFonts w:asciiTheme="majorHAnsi" w:hAnsiTheme="majorHAnsi" w:cstheme="majorHAnsi"/>
                 <w:sz w:val="24"/>
                 <w:szCs w:val="24"/>
-                <w:lang w:val="en-NZ"/>
+                <w:lang w:val="es-CO"/>
               </w:rPr>
               <w:t>Haumi</w:t>
             </w:r>
@@ -3914,7 +3815,7 @@
                 <w:rFonts w:asciiTheme="majorHAnsi" w:hAnsiTheme="majorHAnsi" w:cstheme="majorHAnsi"/>
                 <w:sz w:val="24"/>
                 <w:szCs w:val="24"/>
-                <w:lang w:val="en-NZ"/>
+                <w:lang w:val="es-CO"/>
               </w:rPr>
               <w:t xml:space="preserve"> e, Hui e! </w:t>
             </w:r>
@@ -3924,7 +3825,7 @@
                 <w:rFonts w:asciiTheme="majorHAnsi" w:hAnsiTheme="majorHAnsi" w:cstheme="majorHAnsi"/>
                 <w:sz w:val="24"/>
                 <w:szCs w:val="24"/>
-                <w:lang w:val="en-NZ"/>
+                <w:lang w:val="es-CO"/>
               </w:rPr>
               <w:t>Tāiki</w:t>
             </w:r>
@@ -3934,7 +3835,7 @@
                 <w:rFonts w:asciiTheme="majorHAnsi" w:hAnsiTheme="majorHAnsi" w:cstheme="majorHAnsi"/>
                 <w:sz w:val="24"/>
                 <w:szCs w:val="24"/>
-                <w:lang w:val="en-NZ"/>
+                <w:lang w:val="es-CO"/>
               </w:rPr>
               <w:t xml:space="preserve"> e!</w:t>
             </w:r>
@@ -4003,27 +3904,7 @@
                 <w:szCs w:val="24"/>
                 <w:lang w:val="en-NZ"/>
               </w:rPr>
-              <w:t xml:space="preserve">Life force </w:t>
-            </w:r>
-            <w:proofErr w:type="gramStart"/>
-            <w:r>
-              <w:rPr>
-                <w:rFonts w:asciiTheme="majorHAnsi" w:hAnsiTheme="majorHAnsi" w:cstheme="majorHAnsi"/>
-                <w:sz w:val="24"/>
-                <w:szCs w:val="24"/>
-                <w:lang w:val="en-NZ"/>
-              </w:rPr>
-              <w:t>stand</w:t>
-            </w:r>
-            <w:proofErr w:type="gramEnd"/>
-            <w:r>
-              <w:rPr>
-                <w:rFonts w:asciiTheme="majorHAnsi" w:hAnsiTheme="majorHAnsi" w:cstheme="majorHAnsi"/>
-                <w:sz w:val="24"/>
-                <w:szCs w:val="24"/>
-                <w:lang w:val="en-NZ"/>
-              </w:rPr>
-              <w:t xml:space="preserve"> tall.</w:t>
+              <w:t>Life force stand tall.</w:t>
             </w:r>
           </w:p>
           <w:p>
@@ -4044,27 +3925,7 @@
                 <w:szCs w:val="24"/>
                 <w:lang w:val="en-NZ"/>
               </w:rPr>
-              <w:t xml:space="preserve">Life </w:t>
-            </w:r>
-            <w:proofErr w:type="gramStart"/>
-            <w:r>
-              <w:rPr>
-                <w:rFonts w:asciiTheme="majorHAnsi" w:hAnsiTheme="majorHAnsi" w:cstheme="majorHAnsi"/>
-                <w:sz w:val="24"/>
-                <w:szCs w:val="24"/>
-                <w:lang w:val="en-NZ"/>
-              </w:rPr>
-              <w:t>force</w:t>
-            </w:r>
-            <w:proofErr w:type="gramEnd"/>
-            <w:r>
-              <w:rPr>
-                <w:rFonts w:asciiTheme="majorHAnsi" w:hAnsiTheme="majorHAnsi" w:cstheme="majorHAnsi"/>
-                <w:sz w:val="24"/>
-                <w:szCs w:val="24"/>
-                <w:lang w:val="en-NZ"/>
-              </w:rPr>
-              <w:t xml:space="preserve"> all wellness, good health for all.</w:t>
+              <w:t>Life force all wellness, good health for all.</w:t>
             </w:r>
           </w:p>
           <w:p>
@@ -4078,7 +3939,6 @@
                 <w:lang w:val="en-NZ"/>
               </w:rPr>
             </w:pPr>
-            <w:proofErr w:type="gramStart"/>
             <w:r>
               <w:rPr>
                 <w:rFonts w:asciiTheme="majorHAnsi" w:hAnsiTheme="majorHAnsi" w:cstheme="majorHAnsi"/>
@@ -4086,17 +3946,7 @@
                 <w:szCs w:val="24"/>
                 <w:lang w:val="en-NZ"/>
               </w:rPr>
-              <w:t>Join together</w:t>
-            </w:r>
-            <w:proofErr w:type="gramEnd"/>
-            <w:r>
-              <w:rPr>
-                <w:rFonts w:asciiTheme="majorHAnsi" w:hAnsiTheme="majorHAnsi" w:cstheme="majorHAnsi"/>
-                <w:sz w:val="24"/>
-                <w:szCs w:val="24"/>
-                <w:lang w:val="en-NZ"/>
-              </w:rPr>
-              <w:t>, unite, the group is ready to progress for the purpose of coming together.</w:t>
+              <w:t>Join together, unite, the group is ready to progress for the purpose of coming together.</w:t>
             </w:r>
           </w:p>
         </w:tc>
@@ -4130,17 +3980,15 @@
         </w:rPr>
         <w:t xml:space="preserve">Although a simple detail and a bit detached from the overall objectives of the observations, the </w:t>
       </w:r>
-      <w:proofErr w:type="spellStart"/>
-      <w:r>
-        <w:rPr>
-          <w:rFonts w:asciiTheme="majorHAnsi" w:hAnsiTheme="majorHAnsi" w:cstheme="majorHAnsi"/>
-          <w:sz w:val="24"/>
-          <w:szCs w:val="24"/>
-          <w:lang w:val="en-NZ"/>
-        </w:rPr>
-        <w:t>karakia</w:t>
-      </w:r>
-      <w:proofErr w:type="spellEnd"/>
+      <w:r>
+        <w:rPr>
+          <w:rFonts w:asciiTheme="majorHAnsi" w:hAnsiTheme="majorHAnsi" w:cstheme="majorHAnsi"/>
+          <w:sz w:val="24"/>
+          <w:szCs w:val="24"/>
+          <w:lang w:val="en-NZ"/>
+        </w:rPr>
+        <w:t>Karakia</w:t>
+      </w:r>
       <w:r>
         <w:rPr>
           <w:rFonts w:asciiTheme="majorHAnsi" w:hAnsiTheme="majorHAnsi" w:cstheme="majorHAnsi"/>
@@ -4167,8 +4015,17 @@
           <w:szCs w:val="24"/>
           <w:lang w:val="en-NZ"/>
         </w:rPr>
+        <w:t xml:space="preserve">It was also interesting, and a very telling, detail that the first discussion during the introductory session was on tips and recommendations about how to handle the stress of </w:t>
+      </w:r>
+      <w:r>
+        <w:rPr>
+          <w:rFonts w:asciiTheme="majorHAnsi" w:hAnsiTheme="majorHAnsi" w:cstheme="majorHAnsi"/>
+          <w:sz w:val="24"/>
+          <w:szCs w:val="24"/>
+          <w:lang w:val="en-NZ"/>
+        </w:rPr>
         <w:lastRenderedPageBreak/>
-        <w:t>It was also interesting, and a very telling, detail that the first discussion during the introductory session was on tips and recommendations about how to handle the stress of the course. Industry Project is designed to be a complex course, that complexity is what allows the students to gain experience in a project close to what is found on the industry, but it also causes a lot of friction when the students are trying to manage all the academical requirements of the course.</w:t>
+        <w:t>the course. Industry Project is designed to be a complex course, that complexity is what allows the students to gain experience in a project close to what is found on the industry, but it also causes a lot of friction when the students are trying to manage all the academical requirements of the course.</w:t>
       </w:r>
     </w:p>
     <w:p>
@@ -4430,37 +4287,33 @@
         </w:rPr>
         <w:t xml:space="preserve">The third theme of the discussion was the issue of group assignation, a completely administrative tasks, but by far the </w:t>
       </w:r>
-      <w:proofErr w:type="gramStart"/>
-      <w:r>
-        <w:rPr>
-          <w:rFonts w:asciiTheme="majorHAnsi" w:hAnsiTheme="majorHAnsi" w:cstheme="majorHAnsi"/>
-          <w:sz w:val="24"/>
-          <w:szCs w:val="24"/>
-          <w:lang w:val="en-NZ"/>
-        </w:rPr>
-        <w:t>main focus</w:t>
-      </w:r>
-      <w:proofErr w:type="gramEnd"/>
-      <w:r>
-        <w:rPr>
-          <w:rFonts w:asciiTheme="majorHAnsi" w:hAnsiTheme="majorHAnsi" w:cstheme="majorHAnsi"/>
-          <w:sz w:val="24"/>
-          <w:szCs w:val="24"/>
-          <w:lang w:val="en-NZ"/>
-        </w:rPr>
-        <w:t xml:space="preserve"> of the first session, at least form the point of view of the students. Groups were pre-sorted and distribution communicated to the students at the beginning of the week, which led to the students scrambling around the room searching for members </w:t>
-      </w:r>
-      <w:proofErr w:type="spellStart"/>
-      <w:r>
-        <w:rPr>
-          <w:rFonts w:asciiTheme="majorHAnsi" w:hAnsiTheme="majorHAnsi" w:cstheme="majorHAnsi"/>
-          <w:sz w:val="24"/>
-          <w:szCs w:val="24"/>
-          <w:lang w:val="en-NZ"/>
-        </w:rPr>
-        <w:t>o</w:t>
-      </w:r>
-      <w:proofErr w:type="spellEnd"/>
+      <w:r>
+        <w:rPr>
+          <w:rFonts w:asciiTheme="majorHAnsi" w:hAnsiTheme="majorHAnsi" w:cstheme="majorHAnsi"/>
+          <w:sz w:val="24"/>
+          <w:szCs w:val="24"/>
+          <w:lang w:val="en-NZ"/>
+        </w:rPr>
+        <w:t>focus</w:t>
+      </w:r>
+      <w:r>
+        <w:rPr>
+          <w:rFonts w:asciiTheme="majorHAnsi" w:hAnsiTheme="majorHAnsi" w:cstheme="majorHAnsi"/>
+          <w:sz w:val="24"/>
+          <w:szCs w:val="24"/>
+          <w:lang w:val="en-NZ"/>
+        </w:rPr>
+        <w:t xml:space="preserve"> of the first session, at least form the point of view of the students. Groups were pre-sorted and distribution communicated to the students at the beginning of the week, which led to the students scrambling around the room searching for members o</w:t>
+      </w:r>
+      <w:r>
+        <w:rPr>
+          <w:rFonts w:asciiTheme="majorHAnsi" w:hAnsiTheme="majorHAnsi" w:cstheme="majorHAnsi"/>
+          <w:sz w:val="24"/>
+          <w:szCs w:val="24"/>
+          <w:lang w:val="en-NZ"/>
+        </w:rPr>
+        <w:t>f</w:t>
+      </w:r>
       <w:r>
         <w:rPr>
           <w:rFonts w:asciiTheme="majorHAnsi" w:hAnsiTheme="majorHAnsi" w:cstheme="majorHAnsi"/>
@@ -4487,8 +4340,17 @@
           <w:szCs w:val="24"/>
           <w:lang w:val="en-NZ"/>
         </w:rPr>
+        <w:t xml:space="preserve">The different groups of students are often dived in three tracks, depending on the amount of the students in each semester. Tracks A and B move through the semester at a normal </w:t>
+      </w:r>
+      <w:r>
+        <w:rPr>
+          <w:rFonts w:asciiTheme="majorHAnsi" w:hAnsiTheme="majorHAnsi" w:cstheme="majorHAnsi"/>
+          <w:sz w:val="24"/>
+          <w:szCs w:val="24"/>
+          <w:lang w:val="en-NZ"/>
+        </w:rPr>
         <w:lastRenderedPageBreak/>
-        <w:t>The different groups of students are often dived in three tracks, depending on the amount of the students in each semester. Tracks A and B move through the semester at a normal pace, with track A doing the activities of semester 1 and track B doing the activities of semester 2. At the end of the semester, the groups at track A move to track B and new students enter track A. The fast track does all the activities of semester 1 and 2 in only one semester, with a more condensed timeframe for deliveries and a shorter scope project. The main purpose of this format is to move a lot of students through the course quickly each semester.</w:t>
+        <w:t>pace, with track A doing the activities of semester 1 and track B doing the activities of semester 2. At the end of the semester, the groups at track A move to track B and new students enter track A. The fast track does all the activities of semester 1 and 2 in only one semester, with a more condensed timeframe for deliveries and a shorter scope project. The main purpose of this format is to move a lot of students through the course quickly each semester.</w:t>
       </w:r>
     </w:p>
     <w:p>
@@ -4662,8 +4524,19 @@
           <w:szCs w:val="24"/>
           <w:lang w:val="en-NZ"/>
         </w:rPr>
-        <w:t xml:space="preserve">With this configuration the groups were forced to share the work of the architectural engineers and propose their own twists and takes on the common ideas present in the classroom. In the same was, one construction manager often had to coordinate the activities of at least two different groups. Intentional or not, this situation required a lot of effort to coordinate the different roles in one group, and a disciplined flow of information from the architectural engineers all the way to the construction engineers and the quantity </w:t>
-      </w:r>
+        <w:t>With this configuration the groups were forced to share the work of the architectural engineers and propose their own twists and takes on the common ideas present in the classroom. In the same was, one construction manager often had to coordinate the activities of at least two different groups. Intentional or not, this situation required a lot of effort to coordinate the different roles in one group, and a disciplined flow of information from the architectural engineers all the way to the construction engineers and the quantity surveyors. The situation matched perfectly with the learning objectives of the course, albeit introducing a lot of administrative hurdles for the teaching staff.</w:t>
+      </w:r>
+    </w:p>
+    <w:p>
+      <w:pPr>
+        <w:pStyle w:val="Ttulo3"/>
+        <w:rPr>
+          <w:rFonts w:asciiTheme="majorHAnsi" w:hAnsiTheme="majorHAnsi" w:cstheme="majorHAnsi"/>
+          <w:sz w:val="24"/>
+          <w:szCs w:val="24"/>
+          <w:lang w:val="en-NZ"/>
+        </w:rPr>
+      </w:pPr>
       <w:r>
         <w:rPr>
           <w:rFonts w:asciiTheme="majorHAnsi" w:hAnsiTheme="majorHAnsi" w:cstheme="majorHAnsi"/>
@@ -4672,153 +4545,1227 @@
           <w:lang w:val="en-NZ"/>
         </w:rPr>
         <w:lastRenderedPageBreak/>
-        <w:t>surveyors. The situation matched perfectly with the learning objectives of the course, albeit introducing a lot of administrative hurdles for the teaching staff.</w:t>
+        <w:t>6.4.1.1 First Bonding Exercise</w:t>
+      </w:r>
+    </w:p>
+    <w:p>
+      <w:pPr>
+        <w:rPr>
+          <w:lang w:val="en-NZ"/>
+        </w:rPr>
+      </w:pPr>
+      <w:r>
+        <w:rPr>
+          <w:lang w:val="en-NZ"/>
+        </w:rPr>
+        <w:t>After most of the students found their group, the rest of the time was used for what could be considered the first workshop activity of the semester. As with the introduction to the session, the main purpose of the workshop was to set the tone of the activities needed for the course and to create the correct mindset in the students about the requirements of the project. The activity was also used as a way for each member of a group to introduce themselves to the others.</w:t>
+      </w:r>
+    </w:p>
+    <w:p>
+      <w:pPr>
+        <w:rPr>
+          <w:lang w:val="en-NZ"/>
+        </w:rPr>
+      </w:pPr>
+      <w:r>
+        <w:rPr>
+          <w:lang w:val="en-NZ"/>
+        </w:rPr>
+        <w:t>The exercise itself was a simple discussion about the steps needed to bake a cake. The purpose was to create a debate in the group about quantity vs quality in the development of the project and about procuring the proper ingredients for the chosen approach. The reflexion was that such a discussion must take place at the beginning of their project, and highlights the main activities that the group will be working on for during the execution of the project:</w:t>
+      </w:r>
+    </w:p>
+    <w:p>
+      <w:pPr>
+        <w:pStyle w:val="Prrafodelista"/>
+        <w:numPr>
+          <w:ilvl w:val="0"/>
+          <w:numId w:val="12"/>
+        </w:numPr>
+        <w:rPr>
+          <w:lang w:val="en-NZ"/>
+        </w:rPr>
+      </w:pPr>
+      <w:r>
+        <w:rPr>
+          <w:lang w:val="en-NZ"/>
+        </w:rPr>
+        <w:t>Identify possible option to solve a problem.</w:t>
+      </w:r>
+    </w:p>
+    <w:p>
+      <w:pPr>
+        <w:pStyle w:val="Prrafodelista"/>
+        <w:numPr>
+          <w:ilvl w:val="0"/>
+          <w:numId w:val="12"/>
+        </w:numPr>
+        <w:rPr>
+          <w:lang w:val="en-NZ"/>
+        </w:rPr>
+      </w:pPr>
+      <w:r>
+        <w:rPr>
+          <w:lang w:val="en-NZ"/>
+        </w:rPr>
+        <w:t>Discuss with the group all option and pick one.</w:t>
+      </w:r>
+    </w:p>
+    <w:p>
+      <w:pPr>
+        <w:pStyle w:val="Prrafodelista"/>
+        <w:numPr>
+          <w:ilvl w:val="0"/>
+          <w:numId w:val="12"/>
+        </w:numPr>
+        <w:rPr>
+          <w:lang w:val="en-NZ"/>
+        </w:rPr>
+      </w:pPr>
+      <w:r>
+        <w:rPr>
+          <w:lang w:val="en-NZ"/>
+        </w:rPr>
+        <w:t>Work on the individual deliveries of the project based on the option selected.</w:t>
+      </w:r>
+    </w:p>
+    <w:p>
+      <w:pPr>
+        <w:pStyle w:val="Prrafodelista"/>
+        <w:numPr>
+          <w:ilvl w:val="0"/>
+          <w:numId w:val="12"/>
+        </w:numPr>
+        <w:rPr>
+          <w:lang w:val="en-NZ"/>
+        </w:rPr>
+      </w:pPr>
+      <w:r>
+        <w:rPr>
+          <w:lang w:val="en-NZ"/>
+        </w:rPr>
+        <w:t>Communicate to the client the reasons behind the decision and the results of the work done.</w:t>
+      </w:r>
+    </w:p>
+    <w:p>
+      <w:pPr>
+        <w:rPr>
+          <w:lang w:val="en-NZ"/>
+        </w:rPr>
+      </w:pPr>
+      <w:r>
+        <w:rPr>
+          <w:lang w:val="en-NZ"/>
+        </w:rPr>
+        <w:t>Besides the intended objective of the activity, it was possible to observe how different students approached that first contact with their group. The most prevalent an</w:t>
+      </w:r>
+      <w:r>
+        <w:rPr>
+          <w:lang w:val="en-NZ"/>
+        </w:rPr>
+        <w:t>d</w:t>
+      </w:r>
+      <w:r>
+        <w:rPr>
+          <w:lang w:val="en-NZ"/>
+        </w:rPr>
+        <w:t xml:space="preserve"> interesting behaviours were easier to observe in the exercise that followed the cake discussion</w:t>
+      </w:r>
+      <w:r>
+        <w:rPr>
+          <w:lang w:val="en-NZ"/>
+        </w:rPr>
+        <w:t>, a free conversation among the group about the project and about formulating a first draft of what could be the value proposal of the group to the project, an element that became important for the final assessment for each group.</w:t>
+      </w:r>
+    </w:p>
+    <w:p>
+      <w:pPr>
+        <w:rPr>
+          <w:lang w:val="en-NZ"/>
+        </w:rPr>
+      </w:pPr>
+      <w:r>
+        <w:rPr>
+          <w:lang w:val="en-NZ"/>
+        </w:rPr>
+        <w:t>Team A will be a good example of what was observed during this first two activities, and along the description of other teams in future sections, a good point of view to easily describe most of the activities observed in the course.</w:t>
+      </w:r>
+    </w:p>
+    <w:p>
+      <w:pPr>
+        <w:rPr>
+          <w:lang w:val="en-NZ"/>
+        </w:rPr>
+      </w:pPr>
+      <w:r>
+        <w:rPr>
+          <w:lang w:val="en-NZ"/>
+        </w:rPr>
+        <w:t>Team A was mostly complete, all roles were present in the discussion except for one of the QS, who apparently had been in contact with another member of the group but had not been able to assist to the session. This made Team A one of the most complete in the classroom.</w:t>
+      </w:r>
+    </w:p>
+    <w:p>
+      <w:pPr>
+        <w:rPr>
+          <w:lang w:val="en-NZ"/>
+        </w:rPr>
+      </w:pPr>
+      <w:r>
+        <w:rPr>
+          <w:lang w:val="en-NZ"/>
+        </w:rPr>
+        <w:t>For most of the students, this was the first time meeting each other, so their first conversation was not related at all to the activity, but focused on presentations, interchanging names, their current program (which was related to their role) and contact information, mostly phone numbers for contact through WhatsApp, though It was observed in other groups that people were also interchanging data through other mediums like Instagram or Facebook. It was also noticed that in Team A at least two of the students did not interchanged information with anyone.</w:t>
+      </w:r>
+    </w:p>
+    <w:p>
+      <w:pPr>
+        <w:rPr>
+          <w:lang w:val="en-NZ"/>
+        </w:rPr>
+      </w:pPr>
+      <w:r>
+        <w:rPr>
+          <w:lang w:val="en-NZ"/>
+        </w:rPr>
+        <w:t>After the presentation the discussion shyly came back to the proposed activity</w:t>
+      </w:r>
+      <w:r>
+        <w:rPr>
+          <w:lang w:val="en-NZ"/>
+        </w:rPr>
+        <w:t>. The group was almost entirely dominated by one single student voicing questions and prompting responses from the others, followed by the same two teammates with minimal participation from the rest of the group.</w:t>
+      </w:r>
+    </w:p>
+    <w:p>
+      <w:pPr>
+        <w:rPr>
+          <w:lang w:val="en-NZ"/>
+        </w:rPr>
+      </w:pPr>
+      <w:r>
+        <w:rPr>
+          <w:lang w:val="en-NZ"/>
+        </w:rPr>
+        <w:lastRenderedPageBreak/>
+        <w:t>Although the purpose of the activity was to identify and probably formulate the main value proposition of the group, that is, a rough idea of how the group will distinguish their proposal from the rest, the discussion taking place centred more on trying to understand the premise of the project itself, trying to understand what they were supposed to be doing as a group, and for most of them, what was supposed to be the purpose of their role. The students were more interested in identifying as fast as possible what were their immediate responsibility and what was the work to be done, but they were having problems identifying that.</w:t>
+      </w:r>
+    </w:p>
+    <w:p>
+      <w:pPr>
+        <w:rPr>
+          <w:lang w:val="en-NZ"/>
+        </w:rPr>
+      </w:pPr>
+      <w:r>
+        <w:rPr>
+          <w:lang w:val="en-NZ"/>
+        </w:rPr>
+        <w:t xml:space="preserve">Team A positioned themselves in the room far away from the whiteboard. It was possible to observe that those groups closer to the lecturers engaged more in the proposed discussion about the value proposition, with constant interventions, questions and feedback from the lecturers. Further away </w:t>
+      </w:r>
+      <w:r>
+        <w:rPr>
+          <w:lang w:val="en-NZ"/>
+        </w:rPr>
+        <w:t>groups</w:t>
+      </w:r>
+      <w:r>
+        <w:rPr>
+          <w:lang w:val="en-NZ"/>
+        </w:rPr>
+        <w:t>, like Team A, defaulted more to idle chat or</w:t>
+      </w:r>
+      <w:r>
+        <w:rPr>
+          <w:lang w:val="en-NZ"/>
+        </w:rPr>
+        <w:t xml:space="preserve"> to those discussions about the exact work needed for the course, which started to generate a lot of questions among the students.</w:t>
+      </w:r>
+    </w:p>
+    <w:p>
+      <w:pPr>
+        <w:rPr>
+          <w:lang w:val="en-NZ"/>
+        </w:rPr>
+      </w:pPr>
+      <w:r>
+        <w:rPr>
+          <w:lang w:val="en-NZ"/>
+        </w:rPr>
+        <w:t>The lecturers eventually started spreading around the room and talking with more groups, noticing the general doubts about where to find the concrete information of what were the deliverables of the course, and what were the exact responsibilities of each role. The general answer was that the project consisted in one proposal from the group that was communicated to the client through the individual deliveries of each member. It was also remarked that more details about the project would be discussed in the following sessions, and that all information about individual activities could be found in the LMS. The lecturers decided to keep approaching each group individually and engaging in different conversations about the project and the activity to convey this information, instead of addressing the whole room at the same time.</w:t>
+      </w:r>
+    </w:p>
+    <w:p>
+      <w:pPr>
+        <w:rPr>
+          <w:lang w:val="en-NZ"/>
+        </w:rPr>
+      </w:pPr>
+      <w:r>
+        <w:rPr>
+          <w:lang w:val="en-NZ"/>
+        </w:rPr>
+        <w:t>From the activities and observations gathered during that first session, it was already possible to generate a couple of ideas about the design of the course that could affect the development of WorkshopAR or be the source of interesting data:</w:t>
+      </w:r>
+    </w:p>
+    <w:p>
+      <w:pPr>
+        <w:pStyle w:val="Prrafodelista"/>
+        <w:numPr>
+          <w:ilvl w:val="0"/>
+          <w:numId w:val="13"/>
+        </w:numPr>
+        <w:rPr>
+          <w:lang w:val="en-NZ"/>
+        </w:rPr>
+      </w:pPr>
+      <w:r>
+        <w:rPr>
+          <w:lang w:val="en-NZ"/>
+        </w:rPr>
+        <w:t>Industry Project was a very complex course, with a lot of moving parts that had the potential of failing in succession. A lot of effort had to be put in just the management of the course.</w:t>
+      </w:r>
+    </w:p>
+    <w:p>
+      <w:pPr>
+        <w:pStyle w:val="Prrafodelista"/>
+        <w:numPr>
+          <w:ilvl w:val="0"/>
+          <w:numId w:val="13"/>
+        </w:numPr>
+        <w:rPr>
+          <w:lang w:val="en-NZ"/>
+        </w:rPr>
+      </w:pPr>
+      <w:r>
+        <w:rPr>
+          <w:lang w:val="en-NZ"/>
+        </w:rPr>
+        <w:t xml:space="preserve">As with any course, there were very engaged students </w:t>
+      </w:r>
+      <w:r>
+        <w:rPr>
+          <w:lang w:val="en-NZ"/>
+        </w:rPr>
+        <w:t>and</w:t>
+      </w:r>
+      <w:r>
+        <w:rPr>
+          <w:lang w:val="en-NZ"/>
+        </w:rPr>
+        <w:t xml:space="preserve"> many others that were having more problems stablishing themselves in. </w:t>
+      </w:r>
+      <w:r>
+        <w:rPr>
+          <w:lang w:val="en-NZ"/>
+        </w:rPr>
+        <w:t>Regrettably</w:t>
+      </w:r>
+      <w:r>
+        <w:rPr>
+          <w:lang w:val="en-NZ"/>
+        </w:rPr>
+        <w:t>, the complexity of the course</w:t>
+      </w:r>
+      <w:r>
+        <w:rPr>
+          <w:lang w:val="en-NZ"/>
+        </w:rPr>
+        <w:t xml:space="preserve"> was causing that lost or confused students had a difficult time catching up with the rest, and the course was demanding a lot of attention and engagement.</w:t>
+      </w:r>
+    </w:p>
+    <w:p>
+      <w:pPr>
+        <w:pStyle w:val="Prrafodelista"/>
+        <w:numPr>
+          <w:ilvl w:val="0"/>
+          <w:numId w:val="13"/>
+        </w:numPr>
+        <w:rPr>
+          <w:lang w:val="en-NZ"/>
+        </w:rPr>
+      </w:pPr>
+      <w:r>
+        <w:rPr>
+          <w:lang w:val="en-NZ"/>
+        </w:rPr>
+        <w:t>Information flow was crucial for the dynamics of the course, and it had to constantly flow from the lecturers to the students and was being somewhat lost or distorted in its way. The LMS was also failing in provide a clear consolidation of all the information for the students to easily find.</w:t>
       </w:r>
     </w:p>
     <w:p>
       <w:pPr>
         <w:pStyle w:val="Ttulo3"/>
         <w:rPr>
-          <w:rFonts w:asciiTheme="majorHAnsi" w:hAnsiTheme="majorHAnsi" w:cstheme="majorHAnsi"/>
-          <w:sz w:val="24"/>
-          <w:szCs w:val="24"/>
-          <w:lang w:val="en-NZ"/>
-        </w:rPr>
-      </w:pPr>
-      <w:r>
-        <w:rPr>
-          <w:rFonts w:asciiTheme="majorHAnsi" w:hAnsiTheme="majorHAnsi" w:cstheme="majorHAnsi"/>
-          <w:sz w:val="24"/>
-          <w:szCs w:val="24"/>
-          <w:lang w:val="en-NZ"/>
-        </w:rPr>
-        <w:t>6.4.1.1 First Bonding Exercise</w:t>
-      </w:r>
-    </w:p>
-    <w:p>
-      <w:pPr>
-        <w:rPr>
-          <w:rFonts w:asciiTheme="majorHAnsi" w:hAnsiTheme="majorHAnsi" w:cstheme="majorHAnsi"/>
-          <w:sz w:val="24"/>
-          <w:szCs w:val="24"/>
-          <w:lang w:val="en-NZ"/>
-        </w:rPr>
-      </w:pPr>
-    </w:p>
-    <w:p>
-      <w:pPr>
-        <w:rPr>
-          <w:rFonts w:asciiTheme="majorHAnsi" w:hAnsiTheme="majorHAnsi" w:cstheme="majorHAnsi"/>
-          <w:sz w:val="24"/>
-          <w:szCs w:val="24"/>
-          <w:lang w:val="en-NZ"/>
-        </w:rPr>
-      </w:pPr>
-    </w:p>
-    <w:p>
-      <w:pPr>
-        <w:rPr>
-          <w:rFonts w:asciiTheme="majorHAnsi" w:hAnsiTheme="majorHAnsi" w:cstheme="majorHAnsi"/>
-          <w:sz w:val="24"/>
-          <w:szCs w:val="24"/>
-          <w:lang w:val="en-NZ"/>
-        </w:rPr>
-      </w:pPr>
-      <w:r>
-        <w:rPr>
-          <w:rFonts w:asciiTheme="majorHAnsi" w:hAnsiTheme="majorHAnsi" w:cstheme="majorHAnsi"/>
-          <w:sz w:val="24"/>
-          <w:szCs w:val="24"/>
+          <w:sz w:val="22"/>
+          <w:szCs w:val="22"/>
+          <w:lang w:val="en-NZ"/>
+        </w:rPr>
+      </w:pPr>
+      <w:r>
+        <w:rPr>
+          <w:sz w:val="22"/>
+          <w:szCs w:val="22"/>
+          <w:lang w:val="en-NZ"/>
+        </w:rPr>
+        <w:t>6.4.1.2 QA Round Session</w:t>
+      </w:r>
+    </w:p>
+    <w:p>
+      <w:pPr>
+        <w:rPr>
+          <w:lang w:val="en-NZ"/>
+        </w:rPr>
+      </w:pPr>
+      <w:r>
+        <w:rPr>
+          <w:lang w:val="en-NZ"/>
+        </w:rPr>
+        <w:t xml:space="preserve">Expecting the initial reaction of confusion from almost all groups of students, the second session of the course used the workshop slot to create a QA session for the students, with the lecturers acting as the clients and providing information to each of the groups as if they were the consulting firm. Keeping up with the simulation as the main idea, but it quickly fell </w:t>
+      </w:r>
+      <w:r>
+        <w:rPr>
+          <w:lang w:val="en-NZ"/>
+        </w:rPr>
+        <w:lastRenderedPageBreak/>
+        <w:t>apart since most of the questions were related more to details about the deliveries and the marking criteria.</w:t>
+      </w:r>
+    </w:p>
+    <w:p>
+      <w:pPr>
+        <w:rPr>
+          <w:lang w:val="en-NZ"/>
+        </w:rPr>
+      </w:pPr>
+      <w:r>
+        <w:rPr>
+          <w:lang w:val="en-NZ"/>
+        </w:rPr>
+        <w:t xml:space="preserve">Figure 4 shows how the room was organized for the activity. This set-up is relevant because it was reused several times for the activities in the workshop slots. The QA session was repeated several more times in the future, although the </w:t>
+      </w:r>
+      <w:r>
+        <w:rPr>
+          <w:lang w:val="en-NZ"/>
+        </w:rPr>
+        <w:t>first</w:t>
+      </w:r>
+      <w:r>
+        <w:rPr>
+          <w:lang w:val="en-NZ"/>
+        </w:rPr>
+        <w:t xml:space="preserve"> one was the most organized one and the one that presented the most participation. In future versions of the </w:t>
+      </w:r>
+      <w:r>
+        <w:rPr>
+          <w:lang w:val="en-NZ"/>
+        </w:rPr>
+        <w:t>activity,</w:t>
+      </w:r>
+      <w:r>
+        <w:rPr>
+          <w:lang w:val="en-NZ"/>
+        </w:rPr>
+        <w:t xml:space="preserve"> it was used mostly to quickly convey information about the project</w:t>
+      </w:r>
+      <w:r>
+        <w:rPr>
+          <w:lang w:val="en-NZ"/>
+        </w:rPr>
+        <w:t xml:space="preserve"> to all roles, answer common misunderstandings and, what became quite common, venting complains and frustrations to the lecturers about the groups and the lack of progress of someone.</w:t>
+      </w:r>
+    </w:p>
+    <w:p>
+      <w:pPr>
+        <w:keepNext/>
+        <w:jc w:val="center"/>
+        <w:rPr>
+          <w:lang w:val="en-NZ"/>
+        </w:rPr>
+      </w:pPr>
+      <w:r>
+        <w:rPr>
+          <w:noProof/>
+          <w:lang w:val="en-NZ"/>
+        </w:rPr>
+        <w:drawing>
+          <wp:inline distT="0" distB="0" distL="0" distR="0" wp14:anchorId="5F9E2F55" wp14:editId="4DB3D773">
+            <wp:extent cx="5733415" cy="2827020"/>
+            <wp:effectExtent l="0" t="0" r="635" b="0"/>
+            <wp:docPr id="1615459488" name="Imagen 1"/>
+            <wp:cNvGraphicFramePr>
+              <a:graphicFrameLocks xmlns:a="http://schemas.openxmlformats.org/drawingml/2006/main" noChangeAspect="1"/>
+            </wp:cNvGraphicFramePr>
+            <a:graphic xmlns:a="http://schemas.openxmlformats.org/drawingml/2006/main">
+              <a:graphicData uri="http://schemas.openxmlformats.org/drawingml/2006/picture">
+                <pic:pic xmlns:pic="http://schemas.openxmlformats.org/drawingml/2006/picture">
+                  <pic:nvPicPr>
+                    <pic:cNvPr id="0" name="Picture 1"/>
+                    <pic:cNvPicPr>
+                      <a:picLocks noChangeAspect="1" noChangeArrowheads="1"/>
+                    </pic:cNvPicPr>
+                  </pic:nvPicPr>
+                  <pic:blipFill>
+                    <a:blip r:embed="rId8">
+                      <a:extLst>
+                        <a:ext uri="{28A0092B-C50C-407E-A947-70E740481C1C}">
+                          <a14:useLocalDpi xmlns:a14="http://schemas.microsoft.com/office/drawing/2010/main" val="0"/>
+                        </a:ext>
+                      </a:extLst>
+                    </a:blip>
+                    <a:srcRect/>
+                    <a:stretch>
+                      <a:fillRect/>
+                    </a:stretch>
+                  </pic:blipFill>
+                  <pic:spPr bwMode="auto">
+                    <a:xfrm>
+                      <a:off x="0" y="0"/>
+                      <a:ext cx="5733415" cy="2827020"/>
+                    </a:xfrm>
+                    <a:prstGeom prst="rect">
+                      <a:avLst/>
+                    </a:prstGeom>
+                    <a:noFill/>
+                    <a:ln>
+                      <a:noFill/>
+                    </a:ln>
+                  </pic:spPr>
+                </pic:pic>
+              </a:graphicData>
+            </a:graphic>
+          </wp:inline>
+        </w:drawing>
+      </w:r>
+    </w:p>
+    <w:p>
+      <w:pPr>
+        <w:pStyle w:val="Descripcin"/>
+        <w:jc w:val="center"/>
+        <w:rPr>
+          <w:lang w:val="en-NZ"/>
+        </w:rPr>
+      </w:pPr>
+      <w:r>
+        <w:rPr>
+          <w:lang w:val="en-NZ"/>
+        </w:rPr>
+        <w:t xml:space="preserve">Figure </w:t>
+      </w:r>
+      <w:r>
+        <w:rPr>
+          <w:lang w:val="en-NZ"/>
+        </w:rPr>
+        <w:fldChar w:fldCharType="begin"/>
+      </w:r>
+      <w:r>
+        <w:rPr>
+          <w:lang w:val="en-NZ"/>
+        </w:rPr>
+        <w:instrText xml:space="preserve"> SEQ Figure \* ARABIC </w:instrText>
+      </w:r>
+      <w:r>
+        <w:rPr>
+          <w:lang w:val="en-NZ"/>
+        </w:rPr>
+        <w:fldChar w:fldCharType="separate"/>
+      </w:r>
+      <w:r>
+        <w:rPr>
+          <w:noProof/>
+          <w:lang w:val="en-NZ"/>
+        </w:rPr>
+        <w:t>4</w:t>
+      </w:r>
+      <w:r>
+        <w:rPr>
+          <w:lang w:val="en-NZ"/>
+        </w:rPr>
+        <w:fldChar w:fldCharType="end"/>
+      </w:r>
+      <w:r>
+        <w:rPr>
+          <w:lang w:val="en-NZ"/>
+        </w:rPr>
+        <w:t xml:space="preserve"> Distribution of roles during QA sessions</w:t>
+      </w:r>
+    </w:p>
+    <w:p>
+      <w:pPr>
+        <w:rPr>
+          <w:lang w:val="en-NZ"/>
+        </w:rPr>
+      </w:pPr>
+      <w:r>
+        <w:rPr>
+          <w:lang w:val="en-NZ"/>
+        </w:rPr>
+        <w:t>Two aspects of note about this configuration of the classroom. First, the centre-stage position of the AE. Since there were only three students in this role for track A, between five and six groups (an average of 15 to 20 students) depended on the work and decisions of one of the AE. The structure of the project also required for information about the architectural proposal and design to be the first element to be ready for the rest of the roles to be able to start working on their part of the project. Additionally, any question or change proposals had to flow back to the AE, of the to the CM, and the response had to come back the same way.</w:t>
+      </w:r>
+    </w:p>
+    <w:p>
+      <w:pPr>
+        <w:rPr>
+          <w:lang w:val="en-NZ"/>
+        </w:rPr>
+      </w:pPr>
+      <w:r>
+        <w:rPr>
+          <w:lang w:val="en-NZ"/>
+        </w:rPr>
+        <w:t xml:space="preserve">This situation caused the QA sessions to become a mad attempt to try and get the attention and the information needed from the AE or at least from the lecturers </w:t>
+      </w:r>
+      <w:r>
+        <w:rPr>
+          <w:lang w:val="en-NZ"/>
+        </w:rPr>
+        <w:t>to</w:t>
+      </w:r>
+      <w:r>
+        <w:rPr>
+          <w:lang w:val="en-NZ"/>
+        </w:rPr>
+        <w:t xml:space="preserve"> have some material to work upon during the session. It was a little wave of chaos that the teaching staff had to manage.</w:t>
+      </w:r>
+    </w:p>
+    <w:p>
+      <w:pPr>
+        <w:rPr>
+          <w:lang w:val="en-NZ"/>
+        </w:rPr>
+      </w:pPr>
+      <w:r>
+        <w:rPr>
+          <w:lang w:val="en-NZ"/>
+        </w:rPr>
+        <w:t>The second aspect of notice was the Teaching Assistants (TA) table, always set-up in the corner of the room. The TA was very large, eleven different assistants, at least 1 representing each role and other students and lecturers helping with the general administration of the course. At the beginning of every session, when students would start arriving to the room, the TA group would set-up the table and have a short briefing with the lecturers about the plans for the day, then the session would start.</w:t>
+      </w:r>
+    </w:p>
+    <w:p>
+      <w:pPr>
+        <w:rPr>
+          <w:lang w:val="en-NZ"/>
+        </w:rPr>
+      </w:pPr>
+      <w:r>
+        <w:rPr>
+          <w:lang w:val="en-NZ"/>
+        </w:rPr>
+        <w:lastRenderedPageBreak/>
+        <w:t>Often, the responsibilities of any TA would be to help the groups during the open work sessions, answering questions about the project and giving quick feedback to any work in progress. Each TA would do his or her best to help the students, but since each role was represented in the team, it was common for a TA to not have an answer at hand, finding the need to refer the students to another TA. The students quickly found easier to approach the TA table, ask their questions and see who could answer from all the T</w:t>
+      </w:r>
+      <w:r>
+        <w:rPr>
+          <w:lang w:val="en-NZ"/>
+        </w:rPr>
+        <w:t>A</w:t>
+      </w:r>
+      <w:r>
+        <w:rPr>
+          <w:lang w:val="en-NZ"/>
+        </w:rPr>
+        <w:t>s present in the table, hence the importance of the TA corner.</w:t>
+      </w:r>
+    </w:p>
+    <w:p>
+      <w:pPr>
+        <w:rPr>
+          <w:lang w:val="en-NZ"/>
+        </w:rPr>
+      </w:pPr>
+      <w:r>
+        <w:rPr>
+          <w:lang w:val="en-NZ"/>
+        </w:rPr>
+        <w:t>With the first two weeks taking care of the most important administrative issues, it was possible to observe more common open work sessions in week 3 and 4 for the first time. Since the initial stress of being introduced to the course was also passing by, it was also possible to create the first approaches to the students with WorkshopAR, as will be described in the next section.</w:t>
+      </w:r>
+    </w:p>
+    <w:p>
+      <w:pPr>
+        <w:pStyle w:val="Ttulo2"/>
+        <w:rPr>
+          <w:sz w:val="22"/>
+          <w:szCs w:val="22"/>
+          <w:lang w:val="en-NZ"/>
+        </w:rPr>
+      </w:pPr>
+      <w:r>
+        <w:rPr>
+          <w:sz w:val="22"/>
+          <w:szCs w:val="22"/>
+          <w:lang w:val="en-NZ"/>
+        </w:rPr>
+        <w:t>6.4.2 Intervention with WorkshopAR</w:t>
+      </w:r>
+    </w:p>
+    <w:p>
+      <w:pPr>
+        <w:rPr>
+          <w:lang w:val="en-NZ"/>
+        </w:rPr>
+      </w:pPr>
+      <w:r>
+        <w:rPr>
+          <w:lang w:val="en-NZ"/>
+        </w:rPr>
+        <w:t>During the introduction of the teaching staff in the first session, the lectures acknowledged and presented the research project to the students and the ongoing observations taking place in parallel to their work. Given the complexities of the first couple of weeks of the course, no further direct mention of the research was done, with the idea of not adding up even more elements to the already congested list of things that the students had to take care of.</w:t>
+      </w:r>
+    </w:p>
+    <w:p>
+      <w:pPr>
+        <w:rPr>
+          <w:lang w:val="en-NZ"/>
+        </w:rPr>
+      </w:pPr>
+      <w:r>
+        <w:rPr>
+          <w:lang w:val="en-NZ"/>
+        </w:rPr>
+        <w:t>Regrettably</w:t>
+      </w:r>
+      <w:r>
+        <w:rPr>
+          <w:lang w:val="en-NZ"/>
+        </w:rPr>
+        <w:t xml:space="preserve">, this meant </w:t>
+      </w:r>
+      <w:r>
+        <w:rPr>
+          <w:lang w:val="en-NZ"/>
+        </w:rPr>
+        <w:t>that</w:t>
+      </w:r>
+      <w:r>
+        <w:rPr>
           <w:lang w:val="en-NZ"/>
         </w:rPr>
         <w:t xml:space="preserve"> </w:t>
       </w:r>
-      <w:r>
-        <w:rPr>
-          <w:rFonts w:asciiTheme="majorHAnsi" w:hAnsiTheme="majorHAnsi" w:cstheme="majorHAnsi"/>
-          <w:sz w:val="24"/>
-          <w:szCs w:val="24"/>
+      <w:proofErr w:type="gramStart"/>
+      <w:r>
+        <w:rPr>
+          <w:lang w:val="en-NZ"/>
+        </w:rPr>
+        <w:t>all of</w:t>
+      </w:r>
+      <w:proofErr w:type="gramEnd"/>
+      <w:r>
+        <w:rPr>
+          <w:lang w:val="en-NZ"/>
+        </w:rPr>
+        <w:t xml:space="preserve"> the activities that could be classified as part of the first </w:t>
+      </w:r>
+      <w:r>
+        <w:rPr>
+          <w:lang w:val="en-NZ"/>
+        </w:rPr>
+        <w:t>acquaintance</w:t>
+      </w:r>
+      <w:r>
+        <w:rPr>
+          <w:lang w:val="en-NZ"/>
+        </w:rPr>
+        <w:t xml:space="preserve"> and consolidation stage of groupwork (Lowe &amp; Herranen, 1982</w:t>
+      </w:r>
+      <w:r>
+        <w:rPr>
+          <w:lang w:val="en-NZ"/>
+        </w:rPr>
+        <w:t>) were part only of general observations, as described in the previous section, and no direct intervention with WorkshopAR was done. It was not complete impossible to gather some data and direct experiences with the tool about the first encounter process, though. Most of the data and feedback from usability tests and observations about the profile and User Anchor features can be found in section 5.2.1.2, but it is worth mentioning a particular observation that took place later in week 6, but that offered relevant ideas for this context.</w:t>
+      </w:r>
+    </w:p>
+    <w:p>
+      <w:pPr>
+        <w:pStyle w:val="Ttulo3"/>
+        <w:rPr>
+          <w:sz w:val="22"/>
+          <w:szCs w:val="22"/>
+          <w:lang w:val="en-NZ"/>
+        </w:rPr>
+      </w:pPr>
+      <w:r>
+        <w:rPr>
+          <w:sz w:val="22"/>
+          <w:szCs w:val="22"/>
+          <w:lang w:val="en-NZ"/>
+        </w:rPr>
+        <w:t>6.4.2.1 Ideas for the First Encounter Activities</w:t>
+      </w:r>
+    </w:p>
+    <w:p>
+      <w:pPr>
+        <w:rPr>
+          <w:lang w:val="en-NZ"/>
+        </w:rPr>
+      </w:pPr>
+      <w:r>
+        <w:rPr>
+          <w:lang w:val="en-NZ"/>
+        </w:rPr>
+        <w:t>The proper introduction and description of the observed group will be done later in section 6.5.2. For this recount, it is enough to mention that the group was asked to interact with the profile creation and the User Anchor once they created and joined a Room. They were directly asked to remember their experience during the first two weeks of the semester and to try to imagine if something of what happened could have been different (not necessarily better) if WorkshopAR was available to them back then.</w:t>
+      </w:r>
+    </w:p>
+    <w:p>
+      <w:pPr>
+        <w:rPr>
+          <w:lang w:val="en-NZ"/>
+        </w:rPr>
+      </w:pPr>
+      <w:r>
+        <w:rPr>
+          <w:lang w:val="en-NZ"/>
+        </w:rPr>
+        <w:t>Two responses stood up from all the comments given by the students while they were looking around the space created by the Room and mostly playing with the telescopic gaze of the User Anchor once found.</w:t>
+      </w:r>
+    </w:p>
+    <w:p>
+      <w:pPr>
+        <w:rPr>
+          <w:lang w:val="en-NZ"/>
+        </w:rPr>
+      </w:pPr>
+      <w:r>
+        <w:rPr>
+          <w:lang w:val="en-NZ"/>
+        </w:rPr>
+        <w:t xml:space="preserve">They quickly referred to the initial chaos of trying to find their </w:t>
+      </w:r>
+      <w:r>
+        <w:rPr>
+          <w:lang w:val="en-NZ"/>
+        </w:rPr>
+        <w:t>group</w:t>
+      </w:r>
+      <w:r>
+        <w:rPr>
+          <w:lang w:val="en-NZ"/>
+        </w:rPr>
+        <w:t xml:space="preserve">. Most of them only had the number of the group </w:t>
+      </w:r>
+      <w:r>
+        <w:rPr>
+          <w:lang w:val="en-NZ"/>
+        </w:rPr>
+        <w:t>they</w:t>
+      </w:r>
+      <w:r>
+        <w:rPr>
+          <w:lang w:val="en-NZ"/>
+        </w:rPr>
+        <w:t xml:space="preserve"> were a part of as a reference, very few knew each other, and even if they did, the was a high chance the were not in the same group</w:t>
+      </w:r>
+      <w:r>
+        <w:rPr>
+          <w:lang w:val="en-NZ"/>
+        </w:rPr>
+        <w:t xml:space="preserve">. One of the students commented that he ended up shouting his number until he found his other companions, prompting giggles from the other remembering the scene. Although humorous, the students </w:t>
+      </w:r>
+      <w:r>
+        <w:rPr>
+          <w:lang w:val="en-NZ"/>
+        </w:rPr>
+        <w:lastRenderedPageBreak/>
+        <w:t>confessed that it was unnecessarily stressful, and that the only other resource to find their group was a huge diagram in the LMS that they were having problems interpreting (the same diagram used to create the simplified version of Figure 3).</w:t>
+      </w:r>
+    </w:p>
+    <w:p>
+      <w:pPr>
+        <w:rPr>
+          <w:lang w:val="en-NZ"/>
+        </w:rPr>
+      </w:pPr>
+      <w:r>
+        <w:rPr>
+          <w:lang w:val="en-NZ"/>
+        </w:rPr>
+        <w:t>The students related this anecdote to WorkshopAR by noticing that they could personalize the colour of the User Anchor, and that the selection palette (accidentally) resembled that of the diagram. The students commented that the use of colour plus the visual anchor in the AR space could have been used to quickly identify other group members or at least other similar roles, as some workshops asked them to gather with other students of the same role.</w:t>
+      </w:r>
+    </w:p>
+    <w:p>
+      <w:pPr>
+        <w:rPr>
+          <w:lang w:val="en-NZ"/>
+        </w:rPr>
+      </w:pPr>
+      <w:r>
+        <w:rPr>
+          <w:lang w:val="en-NZ"/>
+        </w:rPr>
+        <w:t>This described functionality was outside the designed use case but reflected well the idea of using visual cues created by AR to convey a sense of belonging or identity in the group. A similar set of ideas were discussed about the information that could be displayed when interacting with the User Anchor and with the Room Anchor.</w:t>
+      </w:r>
+    </w:p>
+    <w:p>
+      <w:pPr>
+        <w:rPr>
+          <w:lang w:val="en-NZ"/>
+        </w:rPr>
+      </w:pPr>
+      <w:r>
+        <w:rPr>
+          <w:lang w:val="en-NZ"/>
+        </w:rPr>
+        <w:t xml:space="preserve">The second major discussion was an interesting set of ideas about the technology used by the students to stablish first contact with their peers. Their comments reflected well what was later identified </w:t>
+      </w:r>
+      <w:r>
+        <w:rPr>
+          <w:lang w:val="en-NZ"/>
+        </w:rPr>
+        <w:t>in</w:t>
+      </w:r>
+      <w:r>
+        <w:rPr>
+          <w:lang w:val="en-NZ"/>
+        </w:rPr>
+        <w:t xml:space="preserve"> interviews with students: students preferred to first stablish a proper channel of asynchronous communication and resort to more direct contact </w:t>
+      </w:r>
+      <w:r>
+        <w:rPr>
+          <w:lang w:val="en-NZ"/>
+        </w:rPr>
+        <w:t>only</w:t>
+      </w:r>
+      <w:r>
+        <w:rPr>
+          <w:lang w:val="en-NZ"/>
+        </w:rPr>
+        <w:t xml:space="preserve"> if it was needed</w:t>
+      </w:r>
+      <w:r>
+        <w:rPr>
+          <w:lang w:val="en-NZ"/>
+        </w:rPr>
+        <w:t>. On of the students even commented that she did some “stalking” of one of her company ions in social media to see who she was working with. It was not until the activities in the first week that students started to realise the need for a more direct form of communication since most of the work was being done face-to-face and in the classroom.</w:t>
+      </w:r>
+    </w:p>
+    <w:p>
+      <w:pPr>
+        <w:rPr>
+          <w:lang w:val="en-NZ"/>
+        </w:rPr>
+      </w:pPr>
+      <w:r>
+        <w:rPr>
+          <w:lang w:val="en-NZ"/>
+        </w:rPr>
+        <w:t>As for the perceived role of WorkshopAR in this scenario, the tool was quickly related to part of that “on-face” communication, buy being also a digital tool, it could try to create a bridge with other tools to be more useful, and not just an intermediary in the conversation that was already taking place.</w:t>
+      </w:r>
+    </w:p>
+    <w:p>
+      <w:pPr>
+        <w:pStyle w:val="Ttulo3"/>
+        <w:rPr>
+          <w:sz w:val="22"/>
+          <w:szCs w:val="22"/>
+          <w:lang w:val="en-NZ"/>
+        </w:rPr>
+      </w:pPr>
+      <w:r>
+        <w:rPr>
+          <w:sz w:val="22"/>
+          <w:szCs w:val="22"/>
+          <w:lang w:val="en-NZ"/>
+        </w:rPr>
+        <w:t>6.4.2.2 First Open Work Session</w:t>
+      </w:r>
+    </w:p>
+    <w:p>
+      <w:pPr>
+        <w:rPr>
+          <w:lang w:val="en-NZ"/>
+        </w:rPr>
+      </w:pPr>
+      <w:r>
+        <w:rPr>
+          <w:lang w:val="en-NZ"/>
+        </w:rPr>
+        <w:t>Towards the fourth week of work, it had become clear that the original methodology proposed for the observations had to be altered. The original plan stated that students who wanted to participate in the study could contact the researcher to schedule a work session with the group, they could have access to a space for the group and take all the time they needed for the activity.</w:t>
+      </w:r>
+      <w:r>
+        <w:rPr>
           <w:lang w:val="en-NZ"/>
         </w:rPr>
         <w:t xml:space="preserve"> </w:t>
       </w:r>
-    </w:p>
-    <w:p>
-      <w:pPr>
-        <w:rPr>
-          <w:rFonts w:asciiTheme="majorHAnsi" w:hAnsiTheme="majorHAnsi" w:cstheme="majorHAnsi"/>
-          <w:sz w:val="24"/>
-          <w:szCs w:val="24"/>
-          <w:lang w:val="en-NZ"/>
-        </w:rPr>
-      </w:pPr>
-    </w:p>
-    <w:p>
-      <w:pPr>
-        <w:rPr>
-          <w:rFonts w:asciiTheme="majorHAnsi" w:hAnsiTheme="majorHAnsi" w:cstheme="majorHAnsi"/>
-          <w:sz w:val="24"/>
-          <w:szCs w:val="24"/>
-          <w:lang w:val="en-NZ"/>
-        </w:rPr>
-      </w:pPr>
-    </w:p>
-    <w:p>
-      <w:pPr>
-        <w:pStyle w:val="Ttulo2"/>
-        <w:rPr>
-          <w:rFonts w:asciiTheme="majorHAnsi" w:hAnsiTheme="majorHAnsi" w:cstheme="majorHAnsi"/>
-          <w:sz w:val="24"/>
-          <w:szCs w:val="24"/>
-          <w:lang w:val="en-NZ"/>
-        </w:rPr>
-      </w:pPr>
-      <w:r>
-        <w:rPr>
-          <w:rFonts w:asciiTheme="majorHAnsi" w:hAnsiTheme="majorHAnsi" w:cstheme="majorHAnsi"/>
-          <w:sz w:val="24"/>
-          <w:szCs w:val="24"/>
+      <w:r>
+        <w:rPr>
+          <w:lang w:val="en-NZ"/>
+        </w:rPr>
+        <w:t>No group was taking on the offer, basically because no group was working together outside of the classroom.</w:t>
+      </w:r>
+    </w:p>
+    <w:p>
+      <w:pPr>
+        <w:rPr>
+          <w:lang w:val="en-NZ"/>
+        </w:rPr>
+      </w:pPr>
+      <w:r>
+        <w:rPr>
+          <w:lang w:val="en-NZ"/>
+        </w:rPr>
+        <w:t>Each weekly session had at minimum one hour of open work session for the groups, with some week being dedicated almost completely to open sessions. Students quickly found that they could gather in the classroom, organise the work needed for the week and the work individually outside the classroom, relying on communication tools for quick questions and catch-ups. Since no group was working outside the classroom as a group, the observations using WorkshopAR had to take place during the classroom time, given some changes the protocol to avoid unnecessary disruptions to the classroom:</w:t>
+      </w:r>
+    </w:p>
+    <w:p>
+      <w:pPr>
+        <w:pStyle w:val="Prrafodelista"/>
+        <w:numPr>
+          <w:ilvl w:val="0"/>
+          <w:numId w:val="14"/>
+        </w:numPr>
+        <w:rPr>
+          <w:lang w:val="en-NZ"/>
+        </w:rPr>
+      </w:pPr>
+      <w:r>
+        <w:rPr>
+          <w:lang w:val="en-NZ"/>
+        </w:rPr>
+        <w:t>Interact with only one group at a time and to not take the whole time of the open work session, to not interrupt to much the work of the students.</w:t>
+      </w:r>
+    </w:p>
+    <w:p>
+      <w:pPr>
+        <w:pStyle w:val="Prrafodelista"/>
+        <w:numPr>
+          <w:ilvl w:val="0"/>
+          <w:numId w:val="14"/>
+        </w:numPr>
+        <w:rPr>
+          <w:lang w:val="en-NZ"/>
+        </w:rPr>
+      </w:pPr>
+      <w:r>
+        <w:rPr>
           <w:lang w:val="en-NZ"/>
         </w:rPr>
         <w:lastRenderedPageBreak/>
-        <w:t>6.4.2 Intervention with WorkshopAR</w:t>
-      </w:r>
-    </w:p>
-    <w:p>
-      <w:pPr>
-        <w:pStyle w:val="Ttulo2"/>
-        <w:rPr>
-          <w:rFonts w:asciiTheme="majorHAnsi" w:hAnsiTheme="majorHAnsi" w:cstheme="majorHAnsi"/>
-          <w:sz w:val="24"/>
-          <w:szCs w:val="24"/>
-          <w:lang w:val="en-NZ"/>
-        </w:rPr>
-      </w:pPr>
-      <w:r>
-        <w:rPr>
-          <w:rFonts w:asciiTheme="majorHAnsi" w:hAnsiTheme="majorHAnsi" w:cstheme="majorHAnsi"/>
-          <w:sz w:val="24"/>
-          <w:szCs w:val="24"/>
-          <w:lang w:val="en-NZ"/>
-        </w:rPr>
+        <w:t>Minimize disruptions to other group and to other activities of the classroom. This often meant using more discrete recording methods, relying mostly on audio recordings and he field notes of the researcher.</w:t>
+      </w:r>
+    </w:p>
+    <w:p>
+      <w:pPr>
+        <w:pStyle w:val="Prrafodelista"/>
+        <w:numPr>
+          <w:ilvl w:val="0"/>
+          <w:numId w:val="14"/>
+        </w:numPr>
+        <w:rPr>
+          <w:lang w:val="en-NZ"/>
+        </w:rPr>
+      </w:pPr>
+      <w:r>
+        <w:rPr>
+          <w:lang w:val="en-NZ"/>
+        </w:rPr>
+        <w:t>A focus on testing specific interaction with WorkshopAR rather than the initial proposal of a more unscripted access to the tool</w:t>
+      </w:r>
+      <w:r>
+        <w:rPr>
+          <w:lang w:val="en-NZ"/>
+        </w:rPr>
+        <w:t>. This approach was quicker, could be slotted easier in any schedule of activities for a classroom session and would interrupt the work of students the least.</w:t>
+      </w:r>
+    </w:p>
+    <w:p>
+      <w:pPr>
+        <w:pStyle w:val="Prrafodelista"/>
+        <w:numPr>
+          <w:ilvl w:val="0"/>
+          <w:numId w:val="14"/>
+        </w:numPr>
+        <w:rPr>
+          <w:lang w:val="en-NZ"/>
+        </w:rPr>
+      </w:pPr>
+      <w:r>
+        <w:rPr>
+          <w:lang w:val="en-NZ"/>
+        </w:rPr>
+        <w:t>Not targeting the same group several times in a row. Although it will be shown that a lot of the data comes from the same group, mostly because they were happy to keep collaborating with the project, all observations were done in far apart session and at different stages of the project, so that the process was not an overburden to the students.</w:t>
+      </w:r>
+    </w:p>
+    <w:p>
+      <w:pPr>
+        <w:rPr>
+          <w:lang w:val="en-NZ"/>
+        </w:rPr>
+      </w:pPr>
+      <w:r>
+        <w:rPr>
+          <w:lang w:val="en-NZ"/>
+        </w:rPr>
+        <w:t>With these new considerations, it was possible to plan which features to introduce or focus upon for an observation and to stablish clear categories or move the conversation to more specific points. All the observations of the use of WorkshopAR that follow will have the same structure:</w:t>
+      </w:r>
+    </w:p>
+    <w:p>
+      <w:pPr>
+        <w:pStyle w:val="Prrafodelista"/>
+        <w:numPr>
+          <w:ilvl w:val="0"/>
+          <w:numId w:val="15"/>
+        </w:numPr>
+        <w:rPr>
+          <w:lang w:val="en-NZ"/>
+        </w:rPr>
+      </w:pPr>
+      <w:r>
+        <w:rPr>
+          <w:lang w:val="en-NZ"/>
+        </w:rPr>
+        <w:t>Let the students organise themselves and decide or discuss what are they going to focus on during the work session.</w:t>
+      </w:r>
+    </w:p>
+    <w:p>
+      <w:pPr>
+        <w:pStyle w:val="Prrafodelista"/>
+        <w:numPr>
+          <w:ilvl w:val="0"/>
+          <w:numId w:val="15"/>
+        </w:numPr>
+        <w:rPr>
+          <w:lang w:val="en-NZ"/>
+        </w:rPr>
+      </w:pPr>
+      <w:r>
+        <w:rPr>
+          <w:lang w:val="en-NZ"/>
+        </w:rPr>
+        <w:t>Introduce WorkshopAR, either from the very beginning or the focus features for the observation.</w:t>
+      </w:r>
+    </w:p>
+    <w:p>
+      <w:pPr>
+        <w:pStyle w:val="Prrafodelista"/>
+        <w:numPr>
+          <w:ilvl w:val="0"/>
+          <w:numId w:val="15"/>
+        </w:numPr>
+        <w:rPr>
+          <w:lang w:val="en-NZ"/>
+        </w:rPr>
+      </w:pPr>
+      <w:r>
+        <w:rPr>
+          <w:lang w:val="en-NZ"/>
+        </w:rPr>
+        <w:t>Let the students explore the functionalities, with the researcher asking questions to prompt discussion or to guide the students to a particular interaction with the application. Gather and record observations.</w:t>
+      </w:r>
+    </w:p>
+    <w:p>
+      <w:pPr>
+        <w:rPr>
+          <w:lang w:val="en-NZ"/>
+        </w:rPr>
+      </w:pPr>
+      <w:r>
+        <w:rPr>
+          <w:lang w:val="en-NZ"/>
+        </w:rPr>
+        <w:t>Initially, the group volunteering for observation would move to a different table a bit more secluded from the rest, this with the idea of being able to tack and record without disrupting the other groups. It was not a good idea, moving between rooms took away time from the observation (and from the student’s work) and limited the group access to the TA group or from the lecturers.</w:t>
+      </w:r>
+    </w:p>
+    <w:p>
+      <w:pPr>
+        <w:rPr>
+          <w:lang w:val="en-NZ"/>
+        </w:rPr>
+      </w:pPr>
+      <w:r>
+        <w:rPr>
+          <w:lang w:val="en-NZ"/>
+        </w:rPr>
+        <w:t>This observation was of Team B, formed by four members during this activity, two QS, one CE and one CM. For the group, the main objective of the session was to work on the first poster presentation, which will detailed I the next session. For the observation, the proposal was to focus on two interactions:</w:t>
+      </w:r>
+    </w:p>
+    <w:p>
+      <w:pPr>
+        <w:pStyle w:val="Prrafodelista"/>
+        <w:numPr>
+          <w:ilvl w:val="0"/>
+          <w:numId w:val="16"/>
+        </w:numPr>
+        <w:rPr>
+          <w:lang w:val="en-NZ"/>
+        </w:rPr>
+      </w:pPr>
+      <w:r>
+        <w:rPr>
+          <w:lang w:val="en-NZ"/>
+        </w:rPr>
+        <w:t>The Room configuration.</w:t>
+      </w:r>
+    </w:p>
+    <w:p>
+      <w:pPr>
+        <w:pStyle w:val="Prrafodelista"/>
+        <w:numPr>
+          <w:ilvl w:val="0"/>
+          <w:numId w:val="16"/>
+        </w:numPr>
+        <w:rPr>
+          <w:lang w:val="en-NZ"/>
+        </w:rPr>
+      </w:pPr>
+      <w:r>
+        <w:rPr>
+          <w:lang w:val="en-NZ"/>
+        </w:rPr>
+        <w:t>Setting the profile and interaction with the User Anchors.</w:t>
+      </w:r>
+    </w:p>
+    <w:p>
+      <w:pPr>
+        <w:rPr>
+          <w:lang w:val="en-NZ"/>
+        </w:rPr>
+      </w:pPr>
+      <w:r>
+        <w:rPr>
+          <w:lang w:val="en-NZ"/>
+        </w:rPr>
+        <w:t>WorkshopAR was deployed in two different mobile that were given to the students, which meant that in practice only two students were interacting with the software at the same time. All the students had their own laptops and were working on them when not directing interacting in the observation activity.</w:t>
+      </w:r>
+    </w:p>
+    <w:p>
+      <w:pPr>
+        <w:rPr>
+          <w:lang w:val="en-NZ"/>
+        </w:rPr>
+      </w:pPr>
+    </w:p>
+    <w:p>
+      <w:pPr>
+        <w:rPr>
+          <w:lang w:val="en-NZ"/>
+        </w:rPr>
+      </w:pPr>
+    </w:p>
+    <w:p>
+      <w:pPr>
+        <w:rPr>
+          <w:lang w:val="en-NZ"/>
+        </w:rPr>
+      </w:pPr>
+    </w:p>
+    <w:p>
+      <w:pPr>
+        <w:rPr>
+          <w:lang w:val="en-NZ"/>
+        </w:rPr>
+      </w:pPr>
+      <w:r>
+        <w:rPr>
+          <w:lang w:val="en-NZ"/>
+        </w:rPr>
+        <w:lastRenderedPageBreak/>
         <w:t>6.4.3 Preliminary Analysis</w:t>
       </w:r>
     </w:p>
     <w:p>
       <w:pPr>
-        <w:pStyle w:val="Ttulo1"/>
-        <w:rPr>
-          <w:rFonts w:asciiTheme="majorHAnsi" w:hAnsiTheme="majorHAnsi" w:cstheme="majorHAnsi"/>
-          <w:sz w:val="24"/>
-          <w:szCs w:val="24"/>
-          <w:lang w:val="en-NZ"/>
-        </w:rPr>
-      </w:pPr>
-      <w:r>
-        <w:rPr>
-          <w:rFonts w:asciiTheme="majorHAnsi" w:hAnsiTheme="majorHAnsi" w:cstheme="majorHAnsi"/>
-          <w:sz w:val="24"/>
-          <w:szCs w:val="24"/>
+        <w:rPr>
+          <w:lang w:val="en-NZ"/>
+        </w:rPr>
+      </w:pPr>
+      <w:r>
+        <w:rPr>
           <w:lang w:val="en-NZ"/>
         </w:rPr>
         <w:t>6.5 Week 5 to 9: First Proposal and Poster Presentation</w:t>
@@ -4826,19 +5773,12 @@
     </w:p>
     <w:p>
       <w:pPr>
-        <w:pStyle w:val="Ttulo2"/>
-        <w:rPr>
-          <w:rFonts w:asciiTheme="majorHAnsi" w:hAnsiTheme="majorHAnsi" w:cstheme="majorHAnsi"/>
-          <w:sz w:val="24"/>
-          <w:szCs w:val="24"/>
-          <w:lang w:val="en-NZ"/>
-        </w:rPr>
-      </w:pPr>
-      <w:r>
-        <w:rPr>
-          <w:rFonts w:asciiTheme="majorHAnsi" w:hAnsiTheme="majorHAnsi" w:cstheme="majorHAnsi"/>
-          <w:sz w:val="24"/>
-          <w:szCs w:val="24"/>
+        <w:rPr>
+          <w:lang w:val="en-NZ"/>
+        </w:rPr>
+      </w:pPr>
+      <w:r>
+        <w:rPr>
           <w:lang w:val="en-NZ"/>
         </w:rPr>
         <w:t>6.5.1 General Observations</w:t>
@@ -4846,19 +5786,12 @@
     </w:p>
     <w:p>
       <w:pPr>
-        <w:pStyle w:val="Ttulo2"/>
-        <w:rPr>
-          <w:rFonts w:asciiTheme="majorHAnsi" w:hAnsiTheme="majorHAnsi" w:cstheme="majorHAnsi"/>
-          <w:sz w:val="24"/>
-          <w:szCs w:val="24"/>
-          <w:lang w:val="en-NZ"/>
-        </w:rPr>
-      </w:pPr>
-      <w:r>
-        <w:rPr>
-          <w:rFonts w:asciiTheme="majorHAnsi" w:hAnsiTheme="majorHAnsi" w:cstheme="majorHAnsi"/>
-          <w:sz w:val="24"/>
-          <w:szCs w:val="24"/>
+        <w:rPr>
+          <w:lang w:val="en-NZ"/>
+        </w:rPr>
+      </w:pPr>
+      <w:r>
+        <w:rPr>
           <w:lang w:val="en-NZ"/>
         </w:rPr>
         <w:t>6.5.2 Intervention with WorkshopAR</w:t>
@@ -4866,19 +5799,12 @@
     </w:p>
     <w:p>
       <w:pPr>
-        <w:pStyle w:val="Ttulo2"/>
-        <w:rPr>
-          <w:rFonts w:asciiTheme="majorHAnsi" w:hAnsiTheme="majorHAnsi" w:cstheme="majorHAnsi"/>
-          <w:sz w:val="24"/>
-          <w:szCs w:val="24"/>
-          <w:lang w:val="en-NZ"/>
-        </w:rPr>
-      </w:pPr>
-      <w:r>
-        <w:rPr>
-          <w:rFonts w:asciiTheme="majorHAnsi" w:hAnsiTheme="majorHAnsi" w:cstheme="majorHAnsi"/>
-          <w:sz w:val="24"/>
-          <w:szCs w:val="24"/>
+        <w:rPr>
+          <w:lang w:val="en-NZ"/>
+        </w:rPr>
+      </w:pPr>
+      <w:r>
+        <w:rPr>
           <w:lang w:val="en-NZ"/>
         </w:rPr>
         <w:t>6.5.3 Preliminary Analysis</w:t>
@@ -4886,19 +5812,12 @@
     </w:p>
     <w:p>
       <w:pPr>
-        <w:pStyle w:val="Ttulo1"/>
-        <w:rPr>
-          <w:rFonts w:asciiTheme="majorHAnsi" w:hAnsiTheme="majorHAnsi" w:cstheme="majorHAnsi"/>
-          <w:sz w:val="24"/>
-          <w:szCs w:val="24"/>
-          <w:lang w:val="en-NZ"/>
-        </w:rPr>
-      </w:pPr>
-      <w:r>
-        <w:rPr>
-          <w:rFonts w:asciiTheme="majorHAnsi" w:hAnsiTheme="majorHAnsi" w:cstheme="majorHAnsi"/>
-          <w:sz w:val="24"/>
-          <w:szCs w:val="24"/>
+        <w:rPr>
+          <w:lang w:val="en-NZ"/>
+        </w:rPr>
+      </w:pPr>
+      <w:r>
+        <w:rPr>
           <w:lang w:val="en-NZ"/>
         </w:rPr>
         <w:t>6.6 Weeks 10 to 13: First Client Report</w:t>
@@ -4906,19 +5825,12 @@
     </w:p>
     <w:p>
       <w:pPr>
-        <w:pStyle w:val="Ttulo2"/>
-        <w:rPr>
-          <w:rFonts w:asciiTheme="majorHAnsi" w:hAnsiTheme="majorHAnsi" w:cstheme="majorHAnsi"/>
-          <w:sz w:val="24"/>
-          <w:szCs w:val="24"/>
-          <w:lang w:val="en-NZ"/>
-        </w:rPr>
-      </w:pPr>
-      <w:r>
-        <w:rPr>
-          <w:rFonts w:asciiTheme="majorHAnsi" w:hAnsiTheme="majorHAnsi" w:cstheme="majorHAnsi"/>
-          <w:sz w:val="24"/>
-          <w:szCs w:val="24"/>
+        <w:rPr>
+          <w:lang w:val="en-NZ"/>
+        </w:rPr>
+      </w:pPr>
+      <w:r>
+        <w:rPr>
           <w:lang w:val="en-NZ"/>
         </w:rPr>
         <w:t>6.6.1 General Observations</w:t>
@@ -4926,19 +5838,12 @@
     </w:p>
     <w:p>
       <w:pPr>
-        <w:pStyle w:val="Ttulo2"/>
-        <w:rPr>
-          <w:rFonts w:asciiTheme="majorHAnsi" w:hAnsiTheme="majorHAnsi" w:cstheme="majorHAnsi"/>
-          <w:sz w:val="24"/>
-          <w:szCs w:val="24"/>
-          <w:lang w:val="en-NZ"/>
-        </w:rPr>
-      </w:pPr>
-      <w:r>
-        <w:rPr>
-          <w:rFonts w:asciiTheme="majorHAnsi" w:hAnsiTheme="majorHAnsi" w:cstheme="majorHAnsi"/>
-          <w:sz w:val="24"/>
-          <w:szCs w:val="24"/>
+        <w:rPr>
+          <w:lang w:val="en-NZ"/>
+        </w:rPr>
+      </w:pPr>
+      <w:r>
+        <w:rPr>
           <w:lang w:val="en-NZ"/>
         </w:rPr>
         <w:t>6.6.2 Intervention with WorkshopAR</w:t>
@@ -4946,19 +5851,12 @@
     </w:p>
     <w:p>
       <w:pPr>
-        <w:pStyle w:val="Ttulo2"/>
-        <w:rPr>
-          <w:rFonts w:asciiTheme="majorHAnsi" w:hAnsiTheme="majorHAnsi" w:cstheme="majorHAnsi"/>
-          <w:sz w:val="24"/>
-          <w:szCs w:val="24"/>
-          <w:lang w:val="en-NZ"/>
-        </w:rPr>
-      </w:pPr>
-      <w:r>
-        <w:rPr>
-          <w:rFonts w:asciiTheme="majorHAnsi" w:hAnsiTheme="majorHAnsi" w:cstheme="majorHAnsi"/>
-          <w:sz w:val="24"/>
-          <w:szCs w:val="24"/>
+        <w:rPr>
+          <w:lang w:val="en-NZ"/>
+        </w:rPr>
+      </w:pPr>
+      <w:r>
+        <w:rPr>
           <w:lang w:val="en-NZ"/>
         </w:rPr>
         <w:t>6.6.3 Preliminary Analysis</w:t>
@@ -4966,19 +5864,12 @@
     </w:p>
     <w:p>
       <w:pPr>
-        <w:pStyle w:val="Ttulo1"/>
-        <w:rPr>
-          <w:rFonts w:asciiTheme="majorHAnsi" w:hAnsiTheme="majorHAnsi" w:cstheme="majorHAnsi"/>
-          <w:sz w:val="24"/>
-          <w:szCs w:val="24"/>
-          <w:lang w:val="en-NZ"/>
-        </w:rPr>
-      </w:pPr>
-      <w:r>
-        <w:rPr>
-          <w:rFonts w:asciiTheme="majorHAnsi" w:hAnsiTheme="majorHAnsi" w:cstheme="majorHAnsi"/>
-          <w:sz w:val="24"/>
-          <w:szCs w:val="24"/>
+        <w:rPr>
+          <w:lang w:val="en-NZ"/>
+        </w:rPr>
+      </w:pPr>
+      <w:r>
+        <w:rPr>
           <w:lang w:val="en-NZ"/>
         </w:rPr>
         <w:t>6.7 Iterations over the semester break</w:t>
@@ -4986,19 +5877,12 @@
     </w:p>
     <w:p>
       <w:pPr>
-        <w:pStyle w:val="Ttulo1"/>
-        <w:rPr>
-          <w:rFonts w:asciiTheme="majorHAnsi" w:hAnsiTheme="majorHAnsi" w:cstheme="majorHAnsi"/>
-          <w:sz w:val="24"/>
-          <w:szCs w:val="24"/>
-          <w:lang w:val="en-NZ"/>
-        </w:rPr>
-      </w:pPr>
-      <w:r>
-        <w:rPr>
-          <w:rFonts w:asciiTheme="majorHAnsi" w:hAnsiTheme="majorHAnsi" w:cstheme="majorHAnsi"/>
-          <w:sz w:val="24"/>
-          <w:szCs w:val="24"/>
+        <w:rPr>
+          <w:lang w:val="en-NZ"/>
+        </w:rPr>
+      </w:pPr>
+      <w:r>
+        <w:rPr>
           <w:lang w:val="en-NZ"/>
         </w:rPr>
         <w:t>6.8 Weeks 14 to 20: Second Semester Workout</w:t>
@@ -5006,37 +5890,24 @@
     </w:p>
     <w:p>
       <w:pPr>
-        <w:pStyle w:val="Ttulo2"/>
-        <w:rPr>
-          <w:rFonts w:asciiTheme="majorHAnsi" w:hAnsiTheme="majorHAnsi" w:cstheme="majorHAnsi"/>
-          <w:sz w:val="24"/>
-          <w:szCs w:val="24"/>
-          <w:lang w:val="en-NZ"/>
-        </w:rPr>
-      </w:pPr>
-      <w:r>
-        <w:rPr>
-          <w:rFonts w:asciiTheme="majorHAnsi" w:hAnsiTheme="majorHAnsi" w:cstheme="majorHAnsi"/>
-          <w:sz w:val="24"/>
-          <w:szCs w:val="24"/>
+        <w:rPr>
+          <w:lang w:val="en-NZ"/>
+        </w:rPr>
+      </w:pPr>
+      <w:r>
+        <w:rPr>
           <w:lang w:val="en-NZ"/>
         </w:rPr>
         <w:t>6.</w:t>
       </w:r>
       <w:r>
         <w:rPr>
-          <w:rFonts w:asciiTheme="majorHAnsi" w:hAnsiTheme="majorHAnsi" w:cstheme="majorHAnsi"/>
-          <w:sz w:val="24"/>
-          <w:szCs w:val="24"/>
           <w:lang w:val="en-NZ"/>
         </w:rPr>
         <w:t>8</w:t>
       </w:r>
       <w:r>
         <w:rPr>
-          <w:rFonts w:asciiTheme="majorHAnsi" w:hAnsiTheme="majorHAnsi" w:cstheme="majorHAnsi"/>
-          <w:sz w:val="24"/>
-          <w:szCs w:val="24"/>
           <w:lang w:val="en-NZ"/>
         </w:rPr>
         <w:t>.1 General Observations</w:t>
@@ -5044,37 +5915,24 @@
     </w:p>
     <w:p>
       <w:pPr>
-        <w:pStyle w:val="Ttulo2"/>
-        <w:rPr>
-          <w:rFonts w:asciiTheme="majorHAnsi" w:hAnsiTheme="majorHAnsi" w:cstheme="majorHAnsi"/>
-          <w:sz w:val="24"/>
-          <w:szCs w:val="24"/>
-          <w:lang w:val="en-NZ"/>
-        </w:rPr>
-      </w:pPr>
-      <w:r>
-        <w:rPr>
-          <w:rFonts w:asciiTheme="majorHAnsi" w:hAnsiTheme="majorHAnsi" w:cstheme="majorHAnsi"/>
-          <w:sz w:val="24"/>
-          <w:szCs w:val="24"/>
+        <w:rPr>
+          <w:lang w:val="en-NZ"/>
+        </w:rPr>
+      </w:pPr>
+      <w:r>
+        <w:rPr>
           <w:lang w:val="en-NZ"/>
         </w:rPr>
         <w:t>6.</w:t>
       </w:r>
       <w:r>
         <w:rPr>
-          <w:rFonts w:asciiTheme="majorHAnsi" w:hAnsiTheme="majorHAnsi" w:cstheme="majorHAnsi"/>
-          <w:sz w:val="24"/>
-          <w:szCs w:val="24"/>
           <w:lang w:val="en-NZ"/>
         </w:rPr>
         <w:t>8</w:t>
       </w:r>
       <w:r>
         <w:rPr>
-          <w:rFonts w:asciiTheme="majorHAnsi" w:hAnsiTheme="majorHAnsi" w:cstheme="majorHAnsi"/>
-          <w:sz w:val="24"/>
-          <w:szCs w:val="24"/>
           <w:lang w:val="en-NZ"/>
         </w:rPr>
         <w:t>.2 Intervention with WorkshopAR</w:t>
@@ -5082,37 +5940,24 @@
     </w:p>
     <w:p>
       <w:pPr>
-        <w:pStyle w:val="Ttulo2"/>
-        <w:rPr>
-          <w:rFonts w:asciiTheme="majorHAnsi" w:hAnsiTheme="majorHAnsi" w:cstheme="majorHAnsi"/>
-          <w:sz w:val="24"/>
-          <w:szCs w:val="24"/>
-          <w:lang w:val="en-NZ"/>
-        </w:rPr>
-      </w:pPr>
-      <w:r>
-        <w:rPr>
-          <w:rFonts w:asciiTheme="majorHAnsi" w:hAnsiTheme="majorHAnsi" w:cstheme="majorHAnsi"/>
-          <w:sz w:val="24"/>
-          <w:szCs w:val="24"/>
+        <w:rPr>
+          <w:lang w:val="en-NZ"/>
+        </w:rPr>
+      </w:pPr>
+      <w:r>
+        <w:rPr>
           <w:lang w:val="en-NZ"/>
         </w:rPr>
         <w:t>6.</w:t>
       </w:r>
       <w:r>
         <w:rPr>
-          <w:rFonts w:asciiTheme="majorHAnsi" w:hAnsiTheme="majorHAnsi" w:cstheme="majorHAnsi"/>
-          <w:sz w:val="24"/>
-          <w:szCs w:val="24"/>
           <w:lang w:val="en-NZ"/>
         </w:rPr>
         <w:t>8</w:t>
       </w:r>
       <w:r>
         <w:rPr>
-          <w:rFonts w:asciiTheme="majorHAnsi" w:hAnsiTheme="majorHAnsi" w:cstheme="majorHAnsi"/>
-          <w:sz w:val="24"/>
-          <w:szCs w:val="24"/>
           <w:lang w:val="en-NZ"/>
         </w:rPr>
         <w:t>.3 Preliminary Analysis</w:t>
@@ -5120,19 +5965,12 @@
     </w:p>
     <w:p>
       <w:pPr>
-        <w:pStyle w:val="Ttulo1"/>
-        <w:rPr>
-          <w:rFonts w:asciiTheme="majorHAnsi" w:hAnsiTheme="majorHAnsi" w:cstheme="majorHAnsi"/>
-          <w:sz w:val="24"/>
-          <w:szCs w:val="24"/>
-          <w:lang w:val="en-NZ"/>
-        </w:rPr>
-      </w:pPr>
-      <w:r>
-        <w:rPr>
-          <w:rFonts w:asciiTheme="majorHAnsi" w:hAnsiTheme="majorHAnsi" w:cstheme="majorHAnsi"/>
-          <w:sz w:val="24"/>
-          <w:szCs w:val="24"/>
+        <w:rPr>
+          <w:lang w:val="en-NZ"/>
+        </w:rPr>
+      </w:pPr>
+      <w:r>
+        <w:rPr>
           <w:lang w:val="en-NZ"/>
         </w:rPr>
         <w:t>6.9 Analysis on Student’s Observations and Responses</w:t>
@@ -5140,19 +5978,12 @@
     </w:p>
     <w:p>
       <w:pPr>
-        <w:pStyle w:val="Ttulo1"/>
-        <w:rPr>
-          <w:rFonts w:asciiTheme="majorHAnsi" w:hAnsiTheme="majorHAnsi" w:cstheme="majorHAnsi"/>
-          <w:sz w:val="24"/>
-          <w:szCs w:val="24"/>
-          <w:lang w:val="en-NZ"/>
-        </w:rPr>
-      </w:pPr>
-      <w:r>
-        <w:rPr>
-          <w:rFonts w:asciiTheme="majorHAnsi" w:hAnsiTheme="majorHAnsi" w:cstheme="majorHAnsi"/>
-          <w:sz w:val="24"/>
-          <w:szCs w:val="24"/>
+        <w:rPr>
+          <w:lang w:val="en-NZ"/>
+        </w:rPr>
+      </w:pPr>
+      <w:r>
+        <w:rPr>
           <w:lang w:val="en-NZ"/>
         </w:rPr>
         <w:t>6.10 Analysis on Teaching Staff’s Observations and Responses</w:t>
@@ -5160,19 +5991,12 @@
     </w:p>
     <w:p>
       <w:pPr>
-        <w:pStyle w:val="Ttulo1"/>
-        <w:rPr>
-          <w:rFonts w:asciiTheme="majorHAnsi" w:hAnsiTheme="majorHAnsi" w:cstheme="majorHAnsi"/>
-          <w:sz w:val="24"/>
-          <w:szCs w:val="24"/>
-          <w:lang w:val="en-NZ"/>
-        </w:rPr>
-      </w:pPr>
-      <w:r>
-        <w:rPr>
-          <w:rFonts w:asciiTheme="majorHAnsi" w:hAnsiTheme="majorHAnsi" w:cstheme="majorHAnsi"/>
-          <w:sz w:val="24"/>
-          <w:szCs w:val="24"/>
+        <w:rPr>
+          <w:lang w:val="en-NZ"/>
+        </w:rPr>
+      </w:pPr>
+      <w:r>
+        <w:rPr>
           <w:lang w:val="en-NZ"/>
         </w:rPr>
         <w:t xml:space="preserve">6.11 Conclusions </w:t>
@@ -5181,29 +6005,20 @@
     <w:p>
       <w:pPr>
         <w:rPr>
-          <w:rFonts w:asciiTheme="majorHAnsi" w:hAnsiTheme="majorHAnsi" w:cstheme="majorHAnsi"/>
-          <w:sz w:val="24"/>
-          <w:szCs w:val="24"/>
-          <w:lang w:val="en-NZ"/>
-        </w:rPr>
-      </w:pPr>
-    </w:p>
-    <w:p>
-      <w:pPr>
-        <w:rPr>
-          <w:rFonts w:asciiTheme="majorHAnsi" w:hAnsiTheme="majorHAnsi" w:cstheme="majorHAnsi"/>
-          <w:sz w:val="24"/>
-          <w:szCs w:val="24"/>
-          <w:lang w:val="en-NZ"/>
-        </w:rPr>
-      </w:pPr>
-    </w:p>
-    <w:p>
-      <w:pPr>
-        <w:rPr>
-          <w:rFonts w:asciiTheme="majorHAnsi" w:hAnsiTheme="majorHAnsi" w:cstheme="majorHAnsi"/>
-          <w:sz w:val="24"/>
-          <w:szCs w:val="24"/>
+          <w:lang w:val="en-NZ"/>
+        </w:rPr>
+      </w:pPr>
+    </w:p>
+    <w:p>
+      <w:pPr>
+        <w:rPr>
+          <w:lang w:val="en-NZ"/>
+        </w:rPr>
+      </w:pPr>
+    </w:p>
+    <w:p>
+      <w:pPr>
+        <w:rPr>
           <w:lang w:val="en-NZ"/>
         </w:rPr>
       </w:pPr>
@@ -5334,6 +6149,232 @@
     </w:lvl>
   </w:abstractNum>
   <w:abstractNum w:abstractNumId="1" w15:restartNumberingAfterBreak="0">
+    <w:nsid w:val="1D1F74FC"/>
+    <w:multiLevelType w:val="hybridMultilevel"/>
+    <w:tmpl w:val="6FC0A9D0"/>
+    <w:lvl w:ilvl="0" w:tplc="240A0001">
+      <w:start w:val="1"/>
+      <w:numFmt w:val="bullet"/>
+      <w:lvlText w:val=""/>
+      <w:lvlJc w:val="left"/>
+      <w:pPr>
+        <w:ind w:left="720" w:hanging="360"/>
+      </w:pPr>
+      <w:rPr>
+        <w:rFonts w:ascii="Symbol" w:hAnsi="Symbol" w:hint="default"/>
+      </w:rPr>
+    </w:lvl>
+    <w:lvl w:ilvl="1" w:tplc="240A0003" w:tentative="1">
+      <w:start w:val="1"/>
+      <w:numFmt w:val="bullet"/>
+      <w:lvlText w:val="o"/>
+      <w:lvlJc w:val="left"/>
+      <w:pPr>
+        <w:ind w:left="1440" w:hanging="360"/>
+      </w:pPr>
+      <w:rPr>
+        <w:rFonts w:ascii="Courier New" w:hAnsi="Courier New" w:cs="Courier New" w:hint="default"/>
+      </w:rPr>
+    </w:lvl>
+    <w:lvl w:ilvl="2" w:tplc="240A0005" w:tentative="1">
+      <w:start w:val="1"/>
+      <w:numFmt w:val="bullet"/>
+      <w:lvlText w:val=""/>
+      <w:lvlJc w:val="left"/>
+      <w:pPr>
+        <w:ind w:left="2160" w:hanging="360"/>
+      </w:pPr>
+      <w:rPr>
+        <w:rFonts w:ascii="Wingdings" w:hAnsi="Wingdings" w:hint="default"/>
+      </w:rPr>
+    </w:lvl>
+    <w:lvl w:ilvl="3" w:tplc="240A0001" w:tentative="1">
+      <w:start w:val="1"/>
+      <w:numFmt w:val="bullet"/>
+      <w:lvlText w:val=""/>
+      <w:lvlJc w:val="left"/>
+      <w:pPr>
+        <w:ind w:left="2880" w:hanging="360"/>
+      </w:pPr>
+      <w:rPr>
+        <w:rFonts w:ascii="Symbol" w:hAnsi="Symbol" w:hint="default"/>
+      </w:rPr>
+    </w:lvl>
+    <w:lvl w:ilvl="4" w:tplc="240A0003" w:tentative="1">
+      <w:start w:val="1"/>
+      <w:numFmt w:val="bullet"/>
+      <w:lvlText w:val="o"/>
+      <w:lvlJc w:val="left"/>
+      <w:pPr>
+        <w:ind w:left="3600" w:hanging="360"/>
+      </w:pPr>
+      <w:rPr>
+        <w:rFonts w:ascii="Courier New" w:hAnsi="Courier New" w:cs="Courier New" w:hint="default"/>
+      </w:rPr>
+    </w:lvl>
+    <w:lvl w:ilvl="5" w:tplc="240A0005" w:tentative="1">
+      <w:start w:val="1"/>
+      <w:numFmt w:val="bullet"/>
+      <w:lvlText w:val=""/>
+      <w:lvlJc w:val="left"/>
+      <w:pPr>
+        <w:ind w:left="4320" w:hanging="360"/>
+      </w:pPr>
+      <w:rPr>
+        <w:rFonts w:ascii="Wingdings" w:hAnsi="Wingdings" w:hint="default"/>
+      </w:rPr>
+    </w:lvl>
+    <w:lvl w:ilvl="6" w:tplc="240A0001" w:tentative="1">
+      <w:start w:val="1"/>
+      <w:numFmt w:val="bullet"/>
+      <w:lvlText w:val=""/>
+      <w:lvlJc w:val="left"/>
+      <w:pPr>
+        <w:ind w:left="5040" w:hanging="360"/>
+      </w:pPr>
+      <w:rPr>
+        <w:rFonts w:ascii="Symbol" w:hAnsi="Symbol" w:hint="default"/>
+      </w:rPr>
+    </w:lvl>
+    <w:lvl w:ilvl="7" w:tplc="240A0003" w:tentative="1">
+      <w:start w:val="1"/>
+      <w:numFmt w:val="bullet"/>
+      <w:lvlText w:val="o"/>
+      <w:lvlJc w:val="left"/>
+      <w:pPr>
+        <w:ind w:left="5760" w:hanging="360"/>
+      </w:pPr>
+      <w:rPr>
+        <w:rFonts w:ascii="Courier New" w:hAnsi="Courier New" w:cs="Courier New" w:hint="default"/>
+      </w:rPr>
+    </w:lvl>
+    <w:lvl w:ilvl="8" w:tplc="240A0005" w:tentative="1">
+      <w:start w:val="1"/>
+      <w:numFmt w:val="bullet"/>
+      <w:lvlText w:val=""/>
+      <w:lvlJc w:val="left"/>
+      <w:pPr>
+        <w:ind w:left="6480" w:hanging="360"/>
+      </w:pPr>
+      <w:rPr>
+        <w:rFonts w:ascii="Wingdings" w:hAnsi="Wingdings" w:hint="default"/>
+      </w:rPr>
+    </w:lvl>
+  </w:abstractNum>
+  <w:abstractNum w:abstractNumId="2" w15:restartNumberingAfterBreak="0">
+    <w:nsid w:val="354F4453"/>
+    <w:multiLevelType w:val="hybridMultilevel"/>
+    <w:tmpl w:val="E474EDD4"/>
+    <w:lvl w:ilvl="0" w:tplc="240A0001">
+      <w:start w:val="1"/>
+      <w:numFmt w:val="bullet"/>
+      <w:lvlText w:val=""/>
+      <w:lvlJc w:val="left"/>
+      <w:pPr>
+        <w:ind w:left="720" w:hanging="360"/>
+      </w:pPr>
+      <w:rPr>
+        <w:rFonts w:ascii="Symbol" w:hAnsi="Symbol" w:hint="default"/>
+      </w:rPr>
+    </w:lvl>
+    <w:lvl w:ilvl="1" w:tplc="240A0003" w:tentative="1">
+      <w:start w:val="1"/>
+      <w:numFmt w:val="bullet"/>
+      <w:lvlText w:val="o"/>
+      <w:lvlJc w:val="left"/>
+      <w:pPr>
+        <w:ind w:left="1440" w:hanging="360"/>
+      </w:pPr>
+      <w:rPr>
+        <w:rFonts w:ascii="Courier New" w:hAnsi="Courier New" w:cs="Courier New" w:hint="default"/>
+      </w:rPr>
+    </w:lvl>
+    <w:lvl w:ilvl="2" w:tplc="240A0005" w:tentative="1">
+      <w:start w:val="1"/>
+      <w:numFmt w:val="bullet"/>
+      <w:lvlText w:val=""/>
+      <w:lvlJc w:val="left"/>
+      <w:pPr>
+        <w:ind w:left="2160" w:hanging="360"/>
+      </w:pPr>
+      <w:rPr>
+        <w:rFonts w:ascii="Wingdings" w:hAnsi="Wingdings" w:hint="default"/>
+      </w:rPr>
+    </w:lvl>
+    <w:lvl w:ilvl="3" w:tplc="240A0001" w:tentative="1">
+      <w:start w:val="1"/>
+      <w:numFmt w:val="bullet"/>
+      <w:lvlText w:val=""/>
+      <w:lvlJc w:val="left"/>
+      <w:pPr>
+        <w:ind w:left="2880" w:hanging="360"/>
+      </w:pPr>
+      <w:rPr>
+        <w:rFonts w:ascii="Symbol" w:hAnsi="Symbol" w:hint="default"/>
+      </w:rPr>
+    </w:lvl>
+    <w:lvl w:ilvl="4" w:tplc="240A0003" w:tentative="1">
+      <w:start w:val="1"/>
+      <w:numFmt w:val="bullet"/>
+      <w:lvlText w:val="o"/>
+      <w:lvlJc w:val="left"/>
+      <w:pPr>
+        <w:ind w:left="3600" w:hanging="360"/>
+      </w:pPr>
+      <w:rPr>
+        <w:rFonts w:ascii="Courier New" w:hAnsi="Courier New" w:cs="Courier New" w:hint="default"/>
+      </w:rPr>
+    </w:lvl>
+    <w:lvl w:ilvl="5" w:tplc="240A0005" w:tentative="1">
+      <w:start w:val="1"/>
+      <w:numFmt w:val="bullet"/>
+      <w:lvlText w:val=""/>
+      <w:lvlJc w:val="left"/>
+      <w:pPr>
+        <w:ind w:left="4320" w:hanging="360"/>
+      </w:pPr>
+      <w:rPr>
+        <w:rFonts w:ascii="Wingdings" w:hAnsi="Wingdings" w:hint="default"/>
+      </w:rPr>
+    </w:lvl>
+    <w:lvl w:ilvl="6" w:tplc="240A0001" w:tentative="1">
+      <w:start w:val="1"/>
+      <w:numFmt w:val="bullet"/>
+      <w:lvlText w:val=""/>
+      <w:lvlJc w:val="left"/>
+      <w:pPr>
+        <w:ind w:left="5040" w:hanging="360"/>
+      </w:pPr>
+      <w:rPr>
+        <w:rFonts w:ascii="Symbol" w:hAnsi="Symbol" w:hint="default"/>
+      </w:rPr>
+    </w:lvl>
+    <w:lvl w:ilvl="7" w:tplc="240A0003" w:tentative="1">
+      <w:start w:val="1"/>
+      <w:numFmt w:val="bullet"/>
+      <w:lvlText w:val="o"/>
+      <w:lvlJc w:val="left"/>
+      <w:pPr>
+        <w:ind w:left="5760" w:hanging="360"/>
+      </w:pPr>
+      <w:rPr>
+        <w:rFonts w:ascii="Courier New" w:hAnsi="Courier New" w:cs="Courier New" w:hint="default"/>
+      </w:rPr>
+    </w:lvl>
+    <w:lvl w:ilvl="8" w:tplc="240A0005" w:tentative="1">
+      <w:start w:val="1"/>
+      <w:numFmt w:val="bullet"/>
+      <w:lvlText w:val=""/>
+      <w:lvlJc w:val="left"/>
+      <w:pPr>
+        <w:ind w:left="6480" w:hanging="360"/>
+      </w:pPr>
+      <w:rPr>
+        <w:rFonts w:ascii="Wingdings" w:hAnsi="Wingdings" w:hint="default"/>
+      </w:rPr>
+    </w:lvl>
+  </w:abstractNum>
+  <w:abstractNum w:abstractNumId="3" w15:restartNumberingAfterBreak="0">
     <w:nsid w:val="36720225"/>
     <w:multiLevelType w:val="hybridMultilevel"/>
     <w:tmpl w:val="E5CEAEC4"/>
@@ -5446,7 +6487,233 @@
       </w:rPr>
     </w:lvl>
   </w:abstractNum>
-  <w:abstractNum w:abstractNumId="2" w15:restartNumberingAfterBreak="0">
+  <w:abstractNum w:abstractNumId="4" w15:restartNumberingAfterBreak="0">
+    <w:nsid w:val="457D7F16"/>
+    <w:multiLevelType w:val="hybridMultilevel"/>
+    <w:tmpl w:val="9A7AC840"/>
+    <w:lvl w:ilvl="0" w:tplc="240A0001">
+      <w:start w:val="1"/>
+      <w:numFmt w:val="bullet"/>
+      <w:lvlText w:val=""/>
+      <w:lvlJc w:val="left"/>
+      <w:pPr>
+        <w:ind w:left="720" w:hanging="360"/>
+      </w:pPr>
+      <w:rPr>
+        <w:rFonts w:ascii="Symbol" w:hAnsi="Symbol" w:hint="default"/>
+      </w:rPr>
+    </w:lvl>
+    <w:lvl w:ilvl="1" w:tplc="240A0003" w:tentative="1">
+      <w:start w:val="1"/>
+      <w:numFmt w:val="bullet"/>
+      <w:lvlText w:val="o"/>
+      <w:lvlJc w:val="left"/>
+      <w:pPr>
+        <w:ind w:left="1440" w:hanging="360"/>
+      </w:pPr>
+      <w:rPr>
+        <w:rFonts w:ascii="Courier New" w:hAnsi="Courier New" w:cs="Courier New" w:hint="default"/>
+      </w:rPr>
+    </w:lvl>
+    <w:lvl w:ilvl="2" w:tplc="240A0005" w:tentative="1">
+      <w:start w:val="1"/>
+      <w:numFmt w:val="bullet"/>
+      <w:lvlText w:val=""/>
+      <w:lvlJc w:val="left"/>
+      <w:pPr>
+        <w:ind w:left="2160" w:hanging="360"/>
+      </w:pPr>
+      <w:rPr>
+        <w:rFonts w:ascii="Wingdings" w:hAnsi="Wingdings" w:hint="default"/>
+      </w:rPr>
+    </w:lvl>
+    <w:lvl w:ilvl="3" w:tplc="240A0001" w:tentative="1">
+      <w:start w:val="1"/>
+      <w:numFmt w:val="bullet"/>
+      <w:lvlText w:val=""/>
+      <w:lvlJc w:val="left"/>
+      <w:pPr>
+        <w:ind w:left="2880" w:hanging="360"/>
+      </w:pPr>
+      <w:rPr>
+        <w:rFonts w:ascii="Symbol" w:hAnsi="Symbol" w:hint="default"/>
+      </w:rPr>
+    </w:lvl>
+    <w:lvl w:ilvl="4" w:tplc="240A0003" w:tentative="1">
+      <w:start w:val="1"/>
+      <w:numFmt w:val="bullet"/>
+      <w:lvlText w:val="o"/>
+      <w:lvlJc w:val="left"/>
+      <w:pPr>
+        <w:ind w:left="3600" w:hanging="360"/>
+      </w:pPr>
+      <w:rPr>
+        <w:rFonts w:ascii="Courier New" w:hAnsi="Courier New" w:cs="Courier New" w:hint="default"/>
+      </w:rPr>
+    </w:lvl>
+    <w:lvl w:ilvl="5" w:tplc="240A0005" w:tentative="1">
+      <w:start w:val="1"/>
+      <w:numFmt w:val="bullet"/>
+      <w:lvlText w:val=""/>
+      <w:lvlJc w:val="left"/>
+      <w:pPr>
+        <w:ind w:left="4320" w:hanging="360"/>
+      </w:pPr>
+      <w:rPr>
+        <w:rFonts w:ascii="Wingdings" w:hAnsi="Wingdings" w:hint="default"/>
+      </w:rPr>
+    </w:lvl>
+    <w:lvl w:ilvl="6" w:tplc="240A0001" w:tentative="1">
+      <w:start w:val="1"/>
+      <w:numFmt w:val="bullet"/>
+      <w:lvlText w:val=""/>
+      <w:lvlJc w:val="left"/>
+      <w:pPr>
+        <w:ind w:left="5040" w:hanging="360"/>
+      </w:pPr>
+      <w:rPr>
+        <w:rFonts w:ascii="Symbol" w:hAnsi="Symbol" w:hint="default"/>
+      </w:rPr>
+    </w:lvl>
+    <w:lvl w:ilvl="7" w:tplc="240A0003" w:tentative="1">
+      <w:start w:val="1"/>
+      <w:numFmt w:val="bullet"/>
+      <w:lvlText w:val="o"/>
+      <w:lvlJc w:val="left"/>
+      <w:pPr>
+        <w:ind w:left="5760" w:hanging="360"/>
+      </w:pPr>
+      <w:rPr>
+        <w:rFonts w:ascii="Courier New" w:hAnsi="Courier New" w:cs="Courier New" w:hint="default"/>
+      </w:rPr>
+    </w:lvl>
+    <w:lvl w:ilvl="8" w:tplc="240A0005" w:tentative="1">
+      <w:start w:val="1"/>
+      <w:numFmt w:val="bullet"/>
+      <w:lvlText w:val=""/>
+      <w:lvlJc w:val="left"/>
+      <w:pPr>
+        <w:ind w:left="6480" w:hanging="360"/>
+      </w:pPr>
+      <w:rPr>
+        <w:rFonts w:ascii="Wingdings" w:hAnsi="Wingdings" w:hint="default"/>
+      </w:rPr>
+    </w:lvl>
+  </w:abstractNum>
+  <w:abstractNum w:abstractNumId="5" w15:restartNumberingAfterBreak="0">
+    <w:nsid w:val="4AD5040C"/>
+    <w:multiLevelType w:val="hybridMultilevel"/>
+    <w:tmpl w:val="C6FC44A6"/>
+    <w:lvl w:ilvl="0" w:tplc="240A0001">
+      <w:start w:val="1"/>
+      <w:numFmt w:val="bullet"/>
+      <w:lvlText w:val=""/>
+      <w:lvlJc w:val="left"/>
+      <w:pPr>
+        <w:ind w:left="720" w:hanging="360"/>
+      </w:pPr>
+      <w:rPr>
+        <w:rFonts w:ascii="Symbol" w:hAnsi="Symbol" w:hint="default"/>
+      </w:rPr>
+    </w:lvl>
+    <w:lvl w:ilvl="1" w:tplc="240A0003" w:tentative="1">
+      <w:start w:val="1"/>
+      <w:numFmt w:val="bullet"/>
+      <w:lvlText w:val="o"/>
+      <w:lvlJc w:val="left"/>
+      <w:pPr>
+        <w:ind w:left="1440" w:hanging="360"/>
+      </w:pPr>
+      <w:rPr>
+        <w:rFonts w:ascii="Courier New" w:hAnsi="Courier New" w:cs="Courier New" w:hint="default"/>
+      </w:rPr>
+    </w:lvl>
+    <w:lvl w:ilvl="2" w:tplc="240A0005" w:tentative="1">
+      <w:start w:val="1"/>
+      <w:numFmt w:val="bullet"/>
+      <w:lvlText w:val=""/>
+      <w:lvlJc w:val="left"/>
+      <w:pPr>
+        <w:ind w:left="2160" w:hanging="360"/>
+      </w:pPr>
+      <w:rPr>
+        <w:rFonts w:ascii="Wingdings" w:hAnsi="Wingdings" w:hint="default"/>
+      </w:rPr>
+    </w:lvl>
+    <w:lvl w:ilvl="3" w:tplc="240A0001" w:tentative="1">
+      <w:start w:val="1"/>
+      <w:numFmt w:val="bullet"/>
+      <w:lvlText w:val=""/>
+      <w:lvlJc w:val="left"/>
+      <w:pPr>
+        <w:ind w:left="2880" w:hanging="360"/>
+      </w:pPr>
+      <w:rPr>
+        <w:rFonts w:ascii="Symbol" w:hAnsi="Symbol" w:hint="default"/>
+      </w:rPr>
+    </w:lvl>
+    <w:lvl w:ilvl="4" w:tplc="240A0003" w:tentative="1">
+      <w:start w:val="1"/>
+      <w:numFmt w:val="bullet"/>
+      <w:lvlText w:val="o"/>
+      <w:lvlJc w:val="left"/>
+      <w:pPr>
+        <w:ind w:left="3600" w:hanging="360"/>
+      </w:pPr>
+      <w:rPr>
+        <w:rFonts w:ascii="Courier New" w:hAnsi="Courier New" w:cs="Courier New" w:hint="default"/>
+      </w:rPr>
+    </w:lvl>
+    <w:lvl w:ilvl="5" w:tplc="240A0005" w:tentative="1">
+      <w:start w:val="1"/>
+      <w:numFmt w:val="bullet"/>
+      <w:lvlText w:val=""/>
+      <w:lvlJc w:val="left"/>
+      <w:pPr>
+        <w:ind w:left="4320" w:hanging="360"/>
+      </w:pPr>
+      <w:rPr>
+        <w:rFonts w:ascii="Wingdings" w:hAnsi="Wingdings" w:hint="default"/>
+      </w:rPr>
+    </w:lvl>
+    <w:lvl w:ilvl="6" w:tplc="240A0001" w:tentative="1">
+      <w:start w:val="1"/>
+      <w:numFmt w:val="bullet"/>
+      <w:lvlText w:val=""/>
+      <w:lvlJc w:val="left"/>
+      <w:pPr>
+        <w:ind w:left="5040" w:hanging="360"/>
+      </w:pPr>
+      <w:rPr>
+        <w:rFonts w:ascii="Symbol" w:hAnsi="Symbol" w:hint="default"/>
+      </w:rPr>
+    </w:lvl>
+    <w:lvl w:ilvl="7" w:tplc="240A0003" w:tentative="1">
+      <w:start w:val="1"/>
+      <w:numFmt w:val="bullet"/>
+      <w:lvlText w:val="o"/>
+      <w:lvlJc w:val="left"/>
+      <w:pPr>
+        <w:ind w:left="5760" w:hanging="360"/>
+      </w:pPr>
+      <w:rPr>
+        <w:rFonts w:ascii="Courier New" w:hAnsi="Courier New" w:cs="Courier New" w:hint="default"/>
+      </w:rPr>
+    </w:lvl>
+    <w:lvl w:ilvl="8" w:tplc="240A0005" w:tentative="1">
+      <w:start w:val="1"/>
+      <w:numFmt w:val="bullet"/>
+      <w:lvlText w:val=""/>
+      <w:lvlJc w:val="left"/>
+      <w:pPr>
+        <w:ind w:left="6480" w:hanging="360"/>
+      </w:pPr>
+      <w:rPr>
+        <w:rFonts w:ascii="Wingdings" w:hAnsi="Wingdings" w:hint="default"/>
+      </w:rPr>
+    </w:lvl>
+  </w:abstractNum>
+  <w:abstractNum w:abstractNumId="6" w15:restartNumberingAfterBreak="0">
     <w:nsid w:val="513B7EA1"/>
     <w:multiLevelType w:val="hybridMultilevel"/>
     <w:tmpl w:val="6B5C4A68"/>
@@ -5559,7 +6826,7 @@
       </w:rPr>
     </w:lvl>
   </w:abstractNum>
-  <w:abstractNum w:abstractNumId="3" w15:restartNumberingAfterBreak="0">
+  <w:abstractNum w:abstractNumId="7" w15:restartNumberingAfterBreak="0">
     <w:nsid w:val="58B14600"/>
     <w:multiLevelType w:val="hybridMultilevel"/>
     <w:tmpl w:val="433A6502"/>
@@ -5672,7 +6939,7 @@
       </w:rPr>
     </w:lvl>
   </w:abstractNum>
-  <w:abstractNum w:abstractNumId="4" w15:restartNumberingAfterBreak="0">
+  <w:abstractNum w:abstractNumId="8" w15:restartNumberingAfterBreak="0">
     <w:nsid w:val="5F436901"/>
     <w:multiLevelType w:val="hybridMultilevel"/>
     <w:tmpl w:val="4DE48B7C"/>
@@ -5785,7 +7052,7 @@
       </w:rPr>
     </w:lvl>
   </w:abstractNum>
-  <w:abstractNum w:abstractNumId="5" w15:restartNumberingAfterBreak="0">
+  <w:abstractNum w:abstractNumId="9" w15:restartNumberingAfterBreak="0">
     <w:nsid w:val="6B48065D"/>
     <w:multiLevelType w:val="hybridMultilevel"/>
     <w:tmpl w:val="9566E192"/>
@@ -5898,7 +7165,7 @@
       </w:rPr>
     </w:lvl>
   </w:abstractNum>
-  <w:abstractNum w:abstractNumId="6" w15:restartNumberingAfterBreak="0">
+  <w:abstractNum w:abstractNumId="10" w15:restartNumberingAfterBreak="0">
     <w:nsid w:val="6F1C43A0"/>
     <w:multiLevelType w:val="hybridMultilevel"/>
     <w:tmpl w:val="239205CC"/>
@@ -6011,7 +7278,7 @@
       </w:rPr>
     </w:lvl>
   </w:abstractNum>
-  <w:abstractNum w:abstractNumId="7" w15:restartNumberingAfterBreak="0">
+  <w:abstractNum w:abstractNumId="11" w15:restartNumberingAfterBreak="0">
     <w:nsid w:val="719B15A0"/>
     <w:multiLevelType w:val="hybridMultilevel"/>
     <w:tmpl w:val="8B6A06FC"/>
@@ -6124,7 +7391,7 @@
       </w:rPr>
     </w:lvl>
   </w:abstractNum>
-  <w:abstractNum w:abstractNumId="8" w15:restartNumberingAfterBreak="0">
+  <w:abstractNum w:abstractNumId="12" w15:restartNumberingAfterBreak="0">
     <w:nsid w:val="7760001C"/>
     <w:multiLevelType w:val="hybridMultilevel"/>
     <w:tmpl w:val="DA00D140"/>
@@ -6237,7 +7504,7 @@
       </w:rPr>
     </w:lvl>
   </w:abstractNum>
-  <w:abstractNum w:abstractNumId="9" w15:restartNumberingAfterBreak="0">
+  <w:abstractNum w:abstractNumId="13" w15:restartNumberingAfterBreak="0">
     <w:nsid w:val="7A944C52"/>
     <w:multiLevelType w:val="hybridMultilevel"/>
     <w:tmpl w:val="4DF8A4A6"/>
@@ -6350,7 +7617,7 @@
       </w:rPr>
     </w:lvl>
   </w:abstractNum>
-  <w:abstractNum w:abstractNumId="10" w15:restartNumberingAfterBreak="0">
+  <w:abstractNum w:abstractNumId="14" w15:restartNumberingAfterBreak="0">
     <w:nsid w:val="7BCE6F6B"/>
     <w:multiLevelType w:val="hybridMultilevel"/>
     <w:tmpl w:val="570004FA"/>
@@ -6436,38 +7703,139 @@
       </w:pPr>
     </w:lvl>
   </w:abstractNum>
+  <w:abstractNum w:abstractNumId="15" w15:restartNumberingAfterBreak="0">
+    <w:nsid w:val="7E3A58EC"/>
+    <w:multiLevelType w:val="hybridMultilevel"/>
+    <w:tmpl w:val="22AEB536"/>
+    <w:lvl w:ilvl="0" w:tplc="240A000F">
+      <w:start w:val="1"/>
+      <w:numFmt w:val="decimal"/>
+      <w:lvlText w:val="%1."/>
+      <w:lvlJc w:val="left"/>
+      <w:pPr>
+        <w:ind w:left="720" w:hanging="360"/>
+      </w:pPr>
+    </w:lvl>
+    <w:lvl w:ilvl="1" w:tplc="240A0019" w:tentative="1">
+      <w:start w:val="1"/>
+      <w:numFmt w:val="lowerLetter"/>
+      <w:lvlText w:val="%2."/>
+      <w:lvlJc w:val="left"/>
+      <w:pPr>
+        <w:ind w:left="1440" w:hanging="360"/>
+      </w:pPr>
+    </w:lvl>
+    <w:lvl w:ilvl="2" w:tplc="240A001B" w:tentative="1">
+      <w:start w:val="1"/>
+      <w:numFmt w:val="lowerRoman"/>
+      <w:lvlText w:val="%3."/>
+      <w:lvlJc w:val="right"/>
+      <w:pPr>
+        <w:ind w:left="2160" w:hanging="180"/>
+      </w:pPr>
+    </w:lvl>
+    <w:lvl w:ilvl="3" w:tplc="240A000F" w:tentative="1">
+      <w:start w:val="1"/>
+      <w:numFmt w:val="decimal"/>
+      <w:lvlText w:val="%4."/>
+      <w:lvlJc w:val="left"/>
+      <w:pPr>
+        <w:ind w:left="2880" w:hanging="360"/>
+      </w:pPr>
+    </w:lvl>
+    <w:lvl w:ilvl="4" w:tplc="240A0019" w:tentative="1">
+      <w:start w:val="1"/>
+      <w:numFmt w:val="lowerLetter"/>
+      <w:lvlText w:val="%5."/>
+      <w:lvlJc w:val="left"/>
+      <w:pPr>
+        <w:ind w:left="3600" w:hanging="360"/>
+      </w:pPr>
+    </w:lvl>
+    <w:lvl w:ilvl="5" w:tplc="240A001B" w:tentative="1">
+      <w:start w:val="1"/>
+      <w:numFmt w:val="lowerRoman"/>
+      <w:lvlText w:val="%6."/>
+      <w:lvlJc w:val="right"/>
+      <w:pPr>
+        <w:ind w:left="4320" w:hanging="180"/>
+      </w:pPr>
+    </w:lvl>
+    <w:lvl w:ilvl="6" w:tplc="240A000F" w:tentative="1">
+      <w:start w:val="1"/>
+      <w:numFmt w:val="decimal"/>
+      <w:lvlText w:val="%7."/>
+      <w:lvlJc w:val="left"/>
+      <w:pPr>
+        <w:ind w:left="5040" w:hanging="360"/>
+      </w:pPr>
+    </w:lvl>
+    <w:lvl w:ilvl="7" w:tplc="240A0019" w:tentative="1">
+      <w:start w:val="1"/>
+      <w:numFmt w:val="lowerLetter"/>
+      <w:lvlText w:val="%8."/>
+      <w:lvlJc w:val="left"/>
+      <w:pPr>
+        <w:ind w:left="5760" w:hanging="360"/>
+      </w:pPr>
+    </w:lvl>
+    <w:lvl w:ilvl="8" w:tplc="240A001B" w:tentative="1">
+      <w:start w:val="1"/>
+      <w:numFmt w:val="lowerRoman"/>
+      <w:lvlText w:val="%9."/>
+      <w:lvlJc w:val="right"/>
+      <w:pPr>
+        <w:ind w:left="6480" w:hanging="180"/>
+      </w:pPr>
+    </w:lvl>
+  </w:abstractNum>
   <w:num w:numId="1" w16cid:durableId="2052995577">
-    <w:abstractNumId w:val="3"/>
+    <w:abstractNumId w:val="7"/>
   </w:num>
   <w:num w:numId="2" w16cid:durableId="1068961126">
-    <w:abstractNumId w:val="2"/>
+    <w:abstractNumId w:val="6"/>
   </w:num>
   <w:num w:numId="3" w16cid:durableId="911352854">
-    <w:abstractNumId w:val="6"/>
+    <w:abstractNumId w:val="10"/>
   </w:num>
   <w:num w:numId="4" w16cid:durableId="315378784">
-    <w:abstractNumId w:val="8"/>
+    <w:abstractNumId w:val="12"/>
   </w:num>
   <w:num w:numId="5" w16cid:durableId="1158306522">
-    <w:abstractNumId w:val="7"/>
+    <w:abstractNumId w:val="11"/>
   </w:num>
   <w:num w:numId="6" w16cid:durableId="1288773938">
     <w:abstractNumId w:val="0"/>
   </w:num>
   <w:num w:numId="7" w16cid:durableId="1241210122">
+    <w:abstractNumId w:val="8"/>
+  </w:num>
+  <w:num w:numId="8" w16cid:durableId="1337925516">
+    <w:abstractNumId w:val="3"/>
+  </w:num>
+  <w:num w:numId="9" w16cid:durableId="44373224">
+    <w:abstractNumId w:val="13"/>
+  </w:num>
+  <w:num w:numId="10" w16cid:durableId="631861241">
+    <w:abstractNumId w:val="9"/>
+  </w:num>
+  <w:num w:numId="11" w16cid:durableId="642809573">
+    <w:abstractNumId w:val="14"/>
+  </w:num>
+  <w:num w:numId="12" w16cid:durableId="24183261">
+    <w:abstractNumId w:val="1"/>
+  </w:num>
+  <w:num w:numId="13" w16cid:durableId="1918586058">
+    <w:abstractNumId w:val="2"/>
+  </w:num>
+  <w:num w:numId="14" w16cid:durableId="1825195601">
     <w:abstractNumId w:val="4"/>
   </w:num>
-  <w:num w:numId="8" w16cid:durableId="1337925516">
-    <w:abstractNumId w:val="1"/>
+  <w:num w:numId="15" w16cid:durableId="836650204">
+    <w:abstractNumId w:val="15"/>
   </w:num>
-  <w:num w:numId="9" w16cid:durableId="44373224">
-    <w:abstractNumId w:val="9"/>
-  </w:num>
-  <w:num w:numId="10" w16cid:durableId="631861241">
+  <w:num w:numId="16" w16cid:durableId="1536699666">
     <w:abstractNumId w:val="5"/>
-  </w:num>
-  <w:num w:numId="11" w16cid:durableId="642809573">
-    <w:abstractNumId w:val="10"/>
   </w:num>
 </w:numbering>
 </file>

</xml_diff>

<commit_message>
Ch6 week 1 draft
</commit_message>
<xml_diff>
--- a/Draft/6 Case Study.docx
+++ b/Draft/6 Case Study.docx
@@ -5480,13 +5480,7 @@
         <w:rPr>
           <w:lang w:val="en-NZ"/>
         </w:rPr>
-        <w:t xml:space="preserve"> </w:t>
-      </w:r>
-      <w:r>
-        <w:rPr>
-          <w:lang w:val="en-NZ"/>
-        </w:rPr>
-        <w:t>No group was taking on the offer, basically because no group was working together outside of the classroom.</w:t>
+        <w:t xml:space="preserve"> No group was taking on the offer, basically because no group was working together outside of the classroom.</w:t>
       </w:r>
     </w:p>
     <w:p>
@@ -5729,20 +5723,12 @@
           <w:lang w:val="en-NZ"/>
         </w:rPr>
       </w:pPr>
-    </w:p>
-    <w:p>
-      <w:pPr>
-        <w:rPr>
-          <w:lang w:val="en-NZ"/>
-        </w:rPr>
-      </w:pPr>
-    </w:p>
-    <w:p>
-      <w:pPr>
-        <w:rPr>
-          <w:lang w:val="en-NZ"/>
-        </w:rPr>
-      </w:pPr>
+      <w:r>
+        <w:rPr>
+          <w:lang w:val="en-NZ"/>
+        </w:rPr>
+        <w:t>The first step was to create and configure the Room. On of the QS took the initiative to be the host and quickly moved through the technical steps all the way to the creation of the Workspace. Defining the session goal did not take a discussion at all, since it had been stablished before what the objective was, but it did prompt the question: What would happen if the goal had not been discussed earlier?</w:t>
+      </w:r>
     </w:p>
     <w:p>
       <w:pPr>
@@ -5755,6 +5741,240 @@
           <w:lang w:val="en-NZ"/>
         </w:rPr>
         <w:lastRenderedPageBreak/>
+        <w:t>The response was a bit vague</w:t>
+      </w:r>
+      <w:r>
+        <w:rPr>
+          <w:lang w:val="en-NZ"/>
+        </w:rPr>
+        <w:t>, the group had a clear idea of what was the work needed for the session, but it was not clear for them when they took the decision of dedicating the session to start working on the poster. The CM did mention that the poster was the next deliverable, so there was no need to discus what to do next, it was mandatory to work on the poster, and a mater of focusing on their own individual responsibilities.</w:t>
+      </w:r>
+    </w:p>
+    <w:p>
+      <w:pPr>
+        <w:rPr>
+          <w:lang w:val="en-NZ"/>
+        </w:rPr>
+      </w:pPr>
+      <w:r>
+        <w:rPr>
+          <w:lang w:val="en-NZ"/>
+        </w:rPr>
+        <w:t xml:space="preserve">The CM continued this line of though, proposing the scenario that if the lecturers expected a more step-by-step type of meetings, more formal approach to the group work, that would be his main responsibility, and it would be </w:t>
+      </w:r>
+      <w:r>
+        <w:rPr>
+          <w:lang w:val="en-NZ"/>
+        </w:rPr>
+        <w:t>clearer</w:t>
+      </w:r>
+      <w:r>
+        <w:rPr>
+          <w:lang w:val="en-NZ"/>
+        </w:rPr>
+        <w:t>, at least for his role, what to do in each session</w:t>
+      </w:r>
+      <w:r>
+        <w:rPr>
+          <w:lang w:val="en-NZ"/>
+        </w:rPr>
+        <w:t>. For now, he was feeling a little lost.</w:t>
+      </w:r>
+    </w:p>
+    <w:p>
+      <w:pPr>
+        <w:rPr>
+          <w:lang w:val="en-NZ"/>
+        </w:rPr>
+      </w:pPr>
+      <w:r>
+        <w:rPr>
+          <w:lang w:val="en-NZ"/>
+        </w:rPr>
+        <w:t>Figure 5 shows the space that was used for the couple of observations that took the groups apart form the rest of the classroom, like this one. The set-up of the table promoted a behaviour that had already been seen during the usability test: the student tried to create a workspace that fitted in the entire table, although it was not necessary, and was struggling with the controls and had to stand up and move around to try and cover the whole table. S</w:t>
+      </w:r>
+      <w:r>
+        <w:rPr>
+          <w:lang w:val="en-NZ"/>
+        </w:rPr>
+        <w:t>he</w:t>
+      </w:r>
+      <w:r>
+        <w:rPr>
+          <w:lang w:val="en-NZ"/>
+        </w:rPr>
+        <w:t xml:space="preserve"> was not happy with the result and asked to restart the process to create a better workspace.</w:t>
+      </w:r>
+    </w:p>
+    <w:p>
+      <w:pPr>
+        <w:jc w:val="center"/>
+        <w:rPr>
+          <w:lang w:val="en-NZ"/>
+        </w:rPr>
+      </w:pPr>
+      <w:r>
+        <w:rPr>
+          <w:lang w:val="en-NZ"/>
+        </w:rPr>
+        <w:t>Figure 5</w:t>
+      </w:r>
+    </w:p>
+    <w:p>
+      <w:pPr>
+        <w:jc w:val="both"/>
+        <w:rPr>
+          <w:lang w:val="en-NZ"/>
+        </w:rPr>
+      </w:pPr>
+      <w:r>
+        <w:rPr>
+          <w:lang w:val="en-NZ"/>
+        </w:rPr>
+        <w:t>While repeating the creation of the Room, the student commented that probably the CM should be the one in charge of the configuration process and handed the mobile to him so he could do it. The situation worthed an intervening question: Should the same person always be the host? How would they organise the group to create and configure the Room?</w:t>
+      </w:r>
+    </w:p>
+    <w:p>
+      <w:pPr>
+        <w:jc w:val="both"/>
+        <w:rPr>
+          <w:lang w:val="en-NZ"/>
+        </w:rPr>
+      </w:pPr>
+      <w:r>
+        <w:rPr>
+          <w:lang w:val="en-NZ"/>
+        </w:rPr>
+        <w:t>In the beginning they proposed that it would make more sense if someone had that fixed responsibility, but found little reasons for keeping that idea when following the discussion further, arguing that “making” the Room should be a fast process and the first person to arrive to the classroom should do it, the same way that person would take a table for the group to work during the day. It was an easier approach.</w:t>
+      </w:r>
+    </w:p>
+    <w:p>
+      <w:pPr>
+        <w:jc w:val="both"/>
+        <w:rPr>
+          <w:lang w:val="en-NZ"/>
+        </w:rPr>
+      </w:pPr>
+      <w:r>
+        <w:rPr>
+          <w:lang w:val="en-NZ"/>
+        </w:rPr>
+        <w:t>The interactions with the User Anchors were simpler. They showed that the students liked the idea of the anchor, they specially found amusing the “goofy” look that the gaze gave to the whole anchor, and suggested more elements of customization beside colour, like text, shapes or animations.</w:t>
+      </w:r>
+      <w:r>
+        <w:rPr>
+          <w:lang w:val="en-NZ"/>
+        </w:rPr>
+        <w:t xml:space="preserve"> They also found the functionality better suited for the first two weeks, when it was more common to need information of someone like his name or role, but found it rather useless now that they knew each other and had other means of getting in contact if needed.</w:t>
+      </w:r>
+    </w:p>
+    <w:p>
+      <w:pPr>
+        <w:jc w:val="both"/>
+        <w:rPr>
+          <w:lang w:val="en-NZ"/>
+        </w:rPr>
+      </w:pPr>
+      <w:r>
+        <w:rPr>
+          <w:lang w:val="en-NZ"/>
+        </w:rPr>
+        <w:t>After these interactions the students continued to work by themselves, with two important observations to mention:</w:t>
+      </w:r>
+    </w:p>
+    <w:p>
+      <w:pPr>
+        <w:jc w:val="both"/>
+        <w:rPr>
+          <w:lang w:val="en-NZ"/>
+        </w:rPr>
+      </w:pPr>
+      <w:r>
+        <w:rPr>
+          <w:lang w:val="en-NZ"/>
+        </w:rPr>
+        <w:t>First, when setting themselves up to start working, the CE noticed that, based on the goal they had stablished in WorkshopAR of working on the poster, he was getting the realization that he had a lot of holes in his understanding of what he should be doing for the poster. A series of conversation inside the group took place, mostly using the information found in the LMS to try and help the CE, but it was not enough, and they needed the help of a TA or the lecturers.</w:t>
+      </w:r>
+    </w:p>
+    <w:p>
+      <w:pPr>
+        <w:jc w:val="both"/>
+        <w:rPr>
+          <w:lang w:val="en-NZ"/>
+        </w:rPr>
+      </w:pPr>
+      <w:r>
+        <w:rPr>
+          <w:lang w:val="en-NZ"/>
+        </w:rPr>
+        <w:t xml:space="preserve">The disadvantages of taking the group from the main room for observation were piling up. It was necessary to search for a TA and ask her to check on the group for the CE to be able to </w:t>
+      </w:r>
+      <w:r>
+        <w:rPr>
+          <w:lang w:val="en-NZ"/>
+        </w:rPr>
+        <w:lastRenderedPageBreak/>
+        <w:t xml:space="preserve">keep working, and then the group had to scramble from </w:t>
+      </w:r>
+      <w:r>
+        <w:rPr>
+          <w:lang w:val="en-NZ"/>
+        </w:rPr>
+        <w:t>the</w:t>
+      </w:r>
+      <w:r>
+        <w:rPr>
+          <w:lang w:val="en-NZ"/>
+        </w:rPr>
+        <w:t xml:space="preserve"> </w:t>
+      </w:r>
+      <w:r>
+        <w:rPr>
+          <w:lang w:val="en-NZ"/>
+        </w:rPr>
+        <w:t>place</w:t>
+      </w:r>
+      <w:r>
+        <w:rPr>
+          <w:lang w:val="en-NZ"/>
+        </w:rPr>
+        <w:t xml:space="preserve"> because a workshop had started and they had not heard the instruction.</w:t>
+      </w:r>
+    </w:p>
+    <w:p>
+      <w:pPr>
+        <w:rPr>
+          <w:lang w:val="en-NZ"/>
+        </w:rPr>
+      </w:pPr>
+      <w:r>
+        <w:rPr>
+          <w:lang w:val="en-NZ"/>
+        </w:rPr>
+        <w:t>During this situation if was possible to notice the second observation, the work done by the students was very individual. They were working together physically, often sharing comments, but in the end each one was concentrated in their one work. The CE need to clarify his doubts about the same poster all the others were working on because none of his teammates shared his role nor had a clear idea of what the CE needed to focus on for the poster.</w:t>
+      </w:r>
+      <w:r>
+        <w:rPr>
+          <w:lang w:val="en-NZ"/>
+        </w:rPr>
+        <w:t xml:space="preserve"> The only exception was the two QS students. They were constantly chatting to each other and sharing their screens to discuss what each of them had done, but then arrived at a different question: how different should be each of their works? They were the same role working on the same project and with the same information and decisions taken in group, how possible was to distinguish one poster from the other?</w:t>
+      </w:r>
+    </w:p>
+    <w:p>
+      <w:pPr>
+        <w:pStyle w:val="Ttulo2"/>
+        <w:rPr>
+          <w:sz w:val="24"/>
+          <w:szCs w:val="24"/>
+          <w:lang w:val="en-NZ"/>
+        </w:rPr>
+      </w:pPr>
+      <w:r>
+        <w:rPr>
+          <w:sz w:val="24"/>
+          <w:szCs w:val="24"/>
+          <w:lang w:val="en-NZ"/>
+        </w:rPr>
         <w:t>6.4.3 Preliminary Analysis</w:t>
       </w:r>
     </w:p>
@@ -5768,6 +5988,62 @@
         <w:rPr>
           <w:lang w:val="en-NZ"/>
         </w:rPr>
+        <w:t>The first four weeks of work were a period of contextualization and realization. Students were prepared to tackle a course that was known to be complex, and the first concern of many of them was to untangle the complexity and start working on the project as soon as possible.</w:t>
+      </w:r>
+    </w:p>
+    <w:p>
+      <w:pPr>
+        <w:rPr>
+          <w:lang w:val="en-NZ"/>
+        </w:rPr>
+      </w:pPr>
+      <w:r>
+        <w:rPr>
+          <w:lang w:val="en-NZ"/>
+        </w:rPr>
+        <w:t xml:space="preserve">The first issue for the students, one that the teaching staff had to quickly acknowledge, was accessibility to information, about the project and the deliverables. The information was present in the LMS but muddied and tangled in between links and tons of external material. </w:t>
+      </w:r>
+      <w:r>
+        <w:rPr>
+          <w:lang w:val="en-NZ"/>
+        </w:rPr>
+        <w:t>It required the students to organize themselves a lot around what was their plan, what information was missing and how to ask for that information. Activities like the QA sessions and the constant access to the TA staff helped the students to clarify quickly any doubts, and it was noticed during the interactions with Team B that going to the structure that WorkshopAR was proposing, especially for the assignation of goals and tasks</w:t>
+      </w:r>
+      <w:r>
+        <w:rPr>
+          <w:lang w:val="en-NZ"/>
+        </w:rPr>
+        <w:t>, helped to promote and focus the discussion about those issues, not so much to organize those elements that the students were already aware of, but to highlight all the activities that still were unclear or had not been discussed enough. That was a very good behaviour observed promoted by the application and aligned with the learning design proposed.</w:t>
+      </w:r>
+    </w:p>
+    <w:p>
+      <w:pPr>
+        <w:rPr>
+          <w:lang w:val="en-NZ"/>
+        </w:rPr>
+      </w:pPr>
+      <w:r>
+        <w:rPr>
+          <w:lang w:val="en-NZ"/>
+        </w:rPr>
+        <w:t>It was a good introduction of the idea of WorkshopAR, the observation protocol needed polish and further adjustments, but that was also part of the objectives stablished for the first weeks, and it was good that major issued were identified early. The main functionality of WorkshopAR was understood by the students but its immediate value for the project was not really seen. The following section will analyse the biggest blocks of observation with the students and how WorkshopAR found an interesting role in the work process of the groups that was not part of the initial design proposal.</w:t>
+      </w:r>
+    </w:p>
+    <w:p>
+      <w:pPr>
+        <w:pStyle w:val="Ttulo1"/>
+        <w:rPr>
+          <w:sz w:val="22"/>
+          <w:szCs w:val="22"/>
+          <w:lang w:val="en-NZ"/>
+        </w:rPr>
+      </w:pPr>
+      <w:r>
+        <w:rPr>
+          <w:sz w:val="22"/>
+          <w:szCs w:val="22"/>
+          <w:lang w:val="en-NZ"/>
+        </w:rPr>
         <w:t>6.5 Week 5 to 9: First Proposal and Poster Presentation</w:t>
       </w:r>
     </w:p>
@@ -5820,6 +6096,7 @@
         <w:rPr>
           <w:lang w:val="en-NZ"/>
         </w:rPr>
+        <w:lastRenderedPageBreak/>
         <w:t>6.6 Weeks 10 to 13: First Client Report</w:t>
       </w:r>
     </w:p>

</xml_diff>

<commit_message>
Working on Ch6 week 2 draft
</commit_message>
<xml_diff>
--- a/Draft/6 Case Study.docx
+++ b/Draft/6 Case Study.docx
@@ -1,10 +1,10 @@
 
 <file path=word/document.xml><?xml version="1.0" encoding="utf-8"?>
-<w:document xmlns:wpc="http://schemas.microsoft.com/office/word/2010/wordprocessingCanvas" xmlns:cx="http://schemas.microsoft.com/office/drawing/2014/chartex" xmlns:cx1="http://schemas.microsoft.com/office/drawing/2015/9/8/chartex" xmlns:cx2="http://schemas.microsoft.com/office/drawing/2015/10/21/chartex" xmlns:cx3="http://schemas.microsoft.com/office/drawing/2016/5/9/chartex" xmlns:cx4="http://schemas.microsoft.com/office/drawing/2016/5/10/chartex" xmlns:cx5="http://schemas.microsoft.com/office/drawing/2016/5/11/chartex" xmlns:cx6="http://schemas.microsoft.com/office/drawing/2016/5/12/chartex" xmlns:cx7="http://schemas.microsoft.com/office/drawing/2016/5/13/chartex" xmlns:cx8="http://schemas.microsoft.com/office/drawing/2016/5/14/chartex" xmlns:mc="http://schemas.openxmlformats.org/markup-compatibility/2006" xmlns:aink="http://schemas.microsoft.com/office/drawing/2016/ink" xmlns:am3d="http://schemas.microsoft.com/office/drawing/2017/model3d" xmlns:o="urn:schemas-microsoft-com:office:office" xmlns:oel="http://schemas.microsoft.com/office/2019/extlst" xmlns:r="http://schemas.openxmlformats.org/officeDocument/2006/relationships" xmlns:m="http://schemas.openxmlformats.org/officeDocument/2006/math" xmlns:v="urn:schemas-microsoft-com:vml" xmlns:wp14="http://schemas.microsoft.com/office/word/2010/wordprocessingDrawing" xmlns:wp="http://schemas.openxmlformats.org/drawingml/2006/wordprocessingDrawing" xmlns:w10="urn:schemas-microsoft-com:office:word" xmlns:w="http://schemas.openxmlformats.org/wordprocessingml/2006/main" xmlns:w14="http://schemas.microsoft.com/office/word/2010/wordml" xmlns:w15="http://schemas.microsoft.com/office/word/2012/wordml" xmlns:w16cex="http://schemas.microsoft.com/office/word/2018/wordml/cex" xmlns:w16cid="http://schemas.microsoft.com/office/word/2016/wordml/cid" xmlns:w16="http://schemas.microsoft.com/office/word/2018/wordml" xmlns:w16du="http://schemas.microsoft.com/office/word/2023/wordml/word16du" xmlns:w16sdtdh="http://schemas.microsoft.com/office/word/2020/wordml/sdtdatahash" xmlns:w16sdtfl="http://schemas.microsoft.com/office/word/2024/wordml/sdtformatlock" xmlns:w16se="http://schemas.microsoft.com/office/word/2015/wordml/symex" xmlns:wpg="http://schemas.microsoft.com/office/word/2010/wordprocessingGroup" xmlns:wpi="http://schemas.microsoft.com/office/word/2010/wordprocessingInk" xmlns:wne="http://schemas.microsoft.com/office/word/2006/wordml" xmlns:wps="http://schemas.microsoft.com/office/word/2010/wordprocessingShape" mc:Ignorable="w14 w15 w16se w16cid w16 w16cex w16sdtdh w16sdtfl w16du wp14">
+<w:document xmlns:wpc="http://schemas.microsoft.com/office/word/2010/wordprocessingCanvas" xmlns:cx="http://schemas.microsoft.com/office/drawing/2014/chartex" xmlns:cx1="http://schemas.microsoft.com/office/drawing/2015/9/8/chartex" xmlns:cx2="http://schemas.microsoft.com/office/drawing/2015/10/21/chartex" xmlns:cx3="http://schemas.microsoft.com/office/drawing/2016/5/9/chartex" xmlns:cx4="http://schemas.microsoft.com/office/drawing/2016/5/10/chartex" xmlns:cx5="http://schemas.microsoft.com/office/drawing/2016/5/11/chartex" xmlns:cx6="http://schemas.microsoft.com/office/drawing/2016/5/12/chartex" xmlns:cx7="http://schemas.microsoft.com/office/drawing/2016/5/13/chartex" xmlns:cx8="http://schemas.microsoft.com/office/drawing/2016/5/14/chartex" xmlns:mc="http://schemas.openxmlformats.org/markup-compatibility/2006" xmlns:aink="http://schemas.microsoft.com/office/drawing/2016/ink" xmlns:am3d="http://schemas.microsoft.com/office/drawing/2017/model3d" xmlns:o="urn:schemas-microsoft-com:office:office" xmlns:r="http://schemas.openxmlformats.org/officeDocument/2006/relationships" xmlns:m="http://schemas.openxmlformats.org/officeDocument/2006/math" xmlns:v="urn:schemas-microsoft-com:vml" xmlns:wp14="http://schemas.microsoft.com/office/word/2010/wordprocessingDrawing" xmlns:wp="http://schemas.openxmlformats.org/drawingml/2006/wordprocessingDrawing" xmlns:w10="urn:schemas-microsoft-com:office:word" xmlns:w="http://schemas.openxmlformats.org/wordprocessingml/2006/main" xmlns:w14="http://schemas.microsoft.com/office/word/2010/wordml" xmlns:w15="http://schemas.microsoft.com/office/word/2012/wordml" xmlns:w16cex="http://schemas.microsoft.com/office/word/2018/wordml/cex" xmlns:w16cid="http://schemas.microsoft.com/office/word/2016/wordml/cid" xmlns:w16="http://schemas.microsoft.com/office/word/2018/wordml" xmlns:w16sdtdh="http://schemas.microsoft.com/office/word/2020/wordml/sdtdatahash" xmlns:w16se="http://schemas.microsoft.com/office/word/2015/wordml/symex" xmlns:wpg="http://schemas.microsoft.com/office/word/2010/wordprocessingGroup" xmlns:wpi="http://schemas.microsoft.com/office/word/2010/wordprocessingInk" xmlns:wne="http://schemas.microsoft.com/office/word/2006/wordml" xmlns:wps="http://schemas.microsoft.com/office/word/2010/wordprocessingShape" mc:Ignorable="w14 w15 w16se w16cid w16 w16cex w16sdtdh wp14">
   <w:body>
     <w:p>
       <w:pPr>
-        <w:pStyle w:val="Ttulo"/>
+        <w:pStyle w:val="Title"/>
         <w:rPr>
           <w:rFonts w:asciiTheme="majorHAnsi" w:hAnsiTheme="majorHAnsi" w:cstheme="majorHAnsi"/>
           <w:sz w:val="24"/>
@@ -264,7 +264,7 @@
     </w:p>
     <w:p>
       <w:pPr>
-        <w:pStyle w:val="Ttulo1"/>
+        <w:pStyle w:val="Heading1"/>
         <w:rPr>
           <w:rFonts w:asciiTheme="majorHAnsi" w:hAnsiTheme="majorHAnsi" w:cstheme="majorHAnsi"/>
           <w:sz w:val="24"/>
@@ -387,7 +387,7 @@
     </w:p>
     <w:p>
       <w:pPr>
-        <w:pStyle w:val="Prrafodelista"/>
+        <w:pStyle w:val="ListParagraph"/>
         <w:numPr>
           <w:ilvl w:val="0"/>
           <w:numId w:val="5"/>
@@ -411,7 +411,7 @@
     </w:p>
     <w:p>
       <w:pPr>
-        <w:pStyle w:val="Prrafodelista"/>
+        <w:pStyle w:val="ListParagraph"/>
         <w:numPr>
           <w:ilvl w:val="0"/>
           <w:numId w:val="5"/>
@@ -435,7 +435,7 @@
     </w:p>
     <w:p>
       <w:pPr>
-        <w:pStyle w:val="Prrafodelista"/>
+        <w:pStyle w:val="ListParagraph"/>
         <w:numPr>
           <w:ilvl w:val="0"/>
           <w:numId w:val="5"/>
@@ -461,7 +461,7 @@
     </w:p>
     <w:p>
       <w:pPr>
-        <w:pStyle w:val="Prrafodelista"/>
+        <w:pStyle w:val="ListParagraph"/>
         <w:numPr>
           <w:ilvl w:val="0"/>
           <w:numId w:val="5"/>
@@ -485,7 +485,7 @@
     </w:p>
     <w:p>
       <w:pPr>
-        <w:pStyle w:val="Prrafodelista"/>
+        <w:pStyle w:val="ListParagraph"/>
         <w:numPr>
           <w:ilvl w:val="0"/>
           <w:numId w:val="5"/>
@@ -509,7 +509,7 @@
     </w:p>
     <w:p>
       <w:pPr>
-        <w:pStyle w:val="Prrafodelista"/>
+        <w:pStyle w:val="ListParagraph"/>
         <w:numPr>
           <w:ilvl w:val="0"/>
           <w:numId w:val="5"/>
@@ -599,7 +599,7 @@
     </w:p>
     <w:p>
       <w:pPr>
-        <w:pStyle w:val="Prrafodelista"/>
+        <w:pStyle w:val="ListParagraph"/>
         <w:numPr>
           <w:ilvl w:val="0"/>
           <w:numId w:val="7"/>
@@ -623,7 +623,7 @@
     </w:p>
     <w:p>
       <w:pPr>
-        <w:pStyle w:val="Prrafodelista"/>
+        <w:pStyle w:val="ListParagraph"/>
         <w:numPr>
           <w:ilvl w:val="0"/>
           <w:numId w:val="7"/>
@@ -667,7 +667,7 @@
     </w:p>
     <w:p>
       <w:pPr>
-        <w:pStyle w:val="Prrafodelista"/>
+        <w:pStyle w:val="ListParagraph"/>
         <w:numPr>
           <w:ilvl w:val="0"/>
           <w:numId w:val="7"/>
@@ -692,7 +692,7 @@
     </w:p>
     <w:p>
       <w:pPr>
-        <w:pStyle w:val="Prrafodelista"/>
+        <w:pStyle w:val="ListParagraph"/>
         <w:numPr>
           <w:ilvl w:val="0"/>
           <w:numId w:val="7"/>
@@ -711,95 +711,35 @@
           <w:szCs w:val="24"/>
           <w:lang w:val="en-NZ"/>
         </w:rPr>
-        <w:t xml:space="preserve">Requirements and proposals from other stakeholders like </w:t>
-      </w:r>
-      <w:proofErr w:type="gramStart"/>
-      <w:r>
-        <w:rPr>
-          <w:rFonts w:asciiTheme="majorHAnsi" w:hAnsiTheme="majorHAnsi" w:cstheme="majorHAnsi"/>
-          <w:sz w:val="24"/>
-          <w:szCs w:val="24"/>
-          <w:lang w:val="en-NZ"/>
-        </w:rPr>
-        <w:t>local residents</w:t>
-      </w:r>
-      <w:proofErr w:type="gramEnd"/>
-      <w:r>
-        <w:rPr>
-          <w:rFonts w:asciiTheme="majorHAnsi" w:hAnsiTheme="majorHAnsi" w:cstheme="majorHAnsi"/>
-          <w:sz w:val="24"/>
-          <w:szCs w:val="24"/>
-          <w:lang w:val="en-NZ"/>
-        </w:rPr>
-        <w:t xml:space="preserve"> and the government.</w:t>
-      </w:r>
-    </w:p>
-    <w:p>
-      <w:pPr>
-        <w:rPr>
-          <w:rFonts w:asciiTheme="majorHAnsi" w:hAnsiTheme="majorHAnsi" w:cstheme="majorHAnsi"/>
-          <w:sz w:val="24"/>
-          <w:szCs w:val="24"/>
-          <w:lang w:val="en-NZ"/>
-        </w:rPr>
-      </w:pPr>
-      <w:r>
-        <w:rPr>
-          <w:rFonts w:asciiTheme="majorHAnsi" w:hAnsiTheme="majorHAnsi" w:cstheme="majorHAnsi"/>
-          <w:sz w:val="24"/>
-          <w:szCs w:val="24"/>
-          <w:lang w:val="en-NZ"/>
-        </w:rPr>
-        <w:t xml:space="preserve">The fictional client firm would be represented by several experts, most of them part of the faculty but not directly part of the teaching staff, but that where available to answer questions about their requirements </w:t>
-      </w:r>
-      <w:proofErr w:type="gramStart"/>
-      <w:r>
-        <w:rPr>
-          <w:rFonts w:asciiTheme="majorHAnsi" w:hAnsiTheme="majorHAnsi" w:cstheme="majorHAnsi"/>
-          <w:sz w:val="24"/>
-          <w:szCs w:val="24"/>
-          <w:lang w:val="en-NZ"/>
-        </w:rPr>
-        <w:t>and also</w:t>
-      </w:r>
-      <w:proofErr w:type="gramEnd"/>
-      <w:r>
-        <w:rPr>
-          <w:rFonts w:asciiTheme="majorHAnsi" w:hAnsiTheme="majorHAnsi" w:cstheme="majorHAnsi"/>
-          <w:sz w:val="24"/>
-          <w:szCs w:val="24"/>
-          <w:lang w:val="en-NZ"/>
-        </w:rPr>
-        <w:t xml:space="preserve"> about the work expected from each of the four roles present in the course.</w:t>
-      </w:r>
-      <w:r>
-        <w:rPr>
-          <w:rFonts w:asciiTheme="majorHAnsi" w:hAnsiTheme="majorHAnsi" w:cstheme="majorHAnsi"/>
-          <w:sz w:val="24"/>
-          <w:szCs w:val="24"/>
-          <w:lang w:val="en-NZ"/>
-        </w:rPr>
-        <w:t xml:space="preserve"> Additionally, each group would act as a task team in charge of the design and surveillance of the development of the project. ENBU 79X/89X acts as the capstone for four different programs, and each group had at least one representative of each role: Architectural Engineer, Construction Engineer, Construction Manager and Quantity Surveyor. The group was expected to coordinate efforts to create a coherent proposal for the development project, while fulfilling specific tasks and deliveries specific for each role. Finally, the group </w:t>
-      </w:r>
-      <w:proofErr w:type="gramStart"/>
-      <w:r>
-        <w:rPr>
-          <w:rFonts w:asciiTheme="majorHAnsi" w:hAnsiTheme="majorHAnsi" w:cstheme="majorHAnsi"/>
-          <w:sz w:val="24"/>
-          <w:szCs w:val="24"/>
-          <w:lang w:val="en-NZ"/>
-        </w:rPr>
-        <w:t>as a whole had</w:t>
-      </w:r>
-      <w:proofErr w:type="gramEnd"/>
-      <w:r>
-        <w:rPr>
-          <w:rFonts w:asciiTheme="majorHAnsi" w:hAnsiTheme="majorHAnsi" w:cstheme="majorHAnsi"/>
-          <w:sz w:val="24"/>
-          <w:szCs w:val="24"/>
-          <w:lang w:val="en-NZ"/>
-        </w:rPr>
-        <w:t xml:space="preserve"> to create weekly and milestone reports to the client, creating a summary document meant to explain the current state of the project in a way that tackles the different profiles that the fictional client firm was representing</w:t>
+        <w:t>Requirements and proposals from other stakeholders like local residents and the government.</w:t>
+      </w:r>
+    </w:p>
+    <w:p>
+      <w:pPr>
+        <w:rPr>
+          <w:rFonts w:asciiTheme="majorHAnsi" w:hAnsiTheme="majorHAnsi" w:cstheme="majorHAnsi"/>
+          <w:sz w:val="24"/>
+          <w:szCs w:val="24"/>
+          <w:lang w:val="en-NZ"/>
+        </w:rPr>
+      </w:pPr>
+      <w:r>
+        <w:rPr>
+          <w:rFonts w:asciiTheme="majorHAnsi" w:hAnsiTheme="majorHAnsi" w:cstheme="majorHAnsi"/>
+          <w:sz w:val="24"/>
+          <w:szCs w:val="24"/>
+          <w:lang w:val="en-NZ"/>
+        </w:rPr>
+        <w:t>The fictional client firm would be represented by several experts, most of them part of the faculty but not directly part of the teaching staff, but that where available to answer questions about their requirements and also about the work expected from each of the four roles present in the course.</w:t>
+      </w:r>
+      <w:r>
+        <w:rPr>
+          <w:rFonts w:asciiTheme="majorHAnsi" w:hAnsiTheme="majorHAnsi" w:cstheme="majorHAnsi"/>
+          <w:sz w:val="24"/>
+          <w:szCs w:val="24"/>
+          <w:lang w:val="en-NZ"/>
+        </w:rPr>
+        <w:t xml:space="preserve"> Additionally, each group would act as a task team in charge of the design and surveillance of the development of the project. ENBU 79X/89X acts as the capstone for four different programs, and each group had at least one representative of each role: Architectural Engineer, Construction Engineer, Construction Manager and Quantity Surveyor. The group was expected to coordinate efforts to create a coherent proposal for the development project, while fulfilling specific tasks and deliveries specific for each role. Finally, the group as a whole had to create weekly and milestone reports to the client, creating a summary document meant to explain the current state of the project in a way that tackles the different profiles that the fictional client firm was representing</w:t>
       </w:r>
       <w:r>
         <w:rPr>
@@ -865,27 +805,7 @@
           <w:szCs w:val="24"/>
           <w:lang w:val="en-NZ"/>
         </w:rPr>
-        <w:t xml:space="preserve">The final methodological implementation of the course is the open work sessions, which represent </w:t>
-      </w:r>
-      <w:proofErr w:type="gramStart"/>
-      <w:r>
-        <w:rPr>
-          <w:rFonts w:asciiTheme="majorHAnsi" w:hAnsiTheme="majorHAnsi" w:cstheme="majorHAnsi"/>
-          <w:sz w:val="24"/>
-          <w:szCs w:val="24"/>
-          <w:lang w:val="en-NZ"/>
-        </w:rPr>
-        <w:t>the majority of</w:t>
-      </w:r>
-      <w:proofErr w:type="gramEnd"/>
-      <w:r>
-        <w:rPr>
-          <w:rFonts w:asciiTheme="majorHAnsi" w:hAnsiTheme="majorHAnsi" w:cstheme="majorHAnsi"/>
-          <w:sz w:val="24"/>
-          <w:szCs w:val="24"/>
-          <w:lang w:val="en-NZ"/>
-        </w:rPr>
-        <w:t xml:space="preserve"> the time spend by the students in the course. As the name suggest, they are open in nature, allowing the students to use the time in the classroom (about two sessions of 1 hour per week, depending on the length of other activities) to meet with their group or with other students to organize their work and progress towards the competition of the different deliverables. These sessions also allowed the students to have direct access to the teaching staff and a somewhat reliable access to their peers, specially to the students fulfilling the role of Architectural Engineers, that had to be shared among several groups.</w:t>
+        <w:t>The final methodological implementation of the course is the open work sessions, which represent the majority of the time spend by the students in the course. As the name suggest, they are open in nature, allowing the students to use the time in the classroom (about two sessions of 1 hour per week, depending on the length of other activities) to meet with their group or with other students to organize their work and progress towards the competition of the different deliverables. These sessions also allowed the students to have direct access to the teaching staff and a somewhat reliable access to their peers, specially to the students fulfilling the role of Architectural Engineers, that had to be shared among several groups.</w:t>
       </w:r>
     </w:p>
     <w:p>
@@ -925,27 +845,7 @@
           <w:szCs w:val="24"/>
           <w:lang w:val="en-NZ"/>
         </w:rPr>
-        <w:t xml:space="preserve"> as a group, but each student presents at the end his own oral presentation and final client report to be marked. The main assessment tools are the oral presentations and the final client report. The presentations consist </w:t>
-      </w:r>
-      <w:proofErr w:type="gramStart"/>
-      <w:r>
-        <w:rPr>
-          <w:rFonts w:asciiTheme="majorHAnsi" w:hAnsiTheme="majorHAnsi" w:cstheme="majorHAnsi"/>
-          <w:sz w:val="24"/>
-          <w:szCs w:val="24"/>
-          <w:lang w:val="en-NZ"/>
-        </w:rPr>
-        <w:t>on</w:t>
-      </w:r>
-      <w:proofErr w:type="gramEnd"/>
-      <w:r>
-        <w:rPr>
-          <w:rFonts w:asciiTheme="majorHAnsi" w:hAnsiTheme="majorHAnsi" w:cstheme="majorHAnsi"/>
-          <w:sz w:val="24"/>
-          <w:szCs w:val="24"/>
-          <w:lang w:val="en-NZ"/>
-        </w:rPr>
-        <w:t xml:space="preserve"> short 5-minute presentations about the overall proposal of the group for the project, the current state of development and the personal contributions of the students </w:t>
+        <w:t xml:space="preserve"> as a group, but each student presents at the end his own oral presentation and final client report to be marked. The main assessment tools are the oral presentations and the final client report. The presentations consist on short 5-minute presentations about the overall proposal of the group for the project, the current state of development and the personal contributions of the students </w:t>
       </w:r>
       <w:proofErr w:type="spellStart"/>
       <w:r>
@@ -1056,27 +956,7 @@
           <w:szCs w:val="24"/>
           <w:lang w:val="en-NZ"/>
         </w:rPr>
-        <w:t xml:space="preserve"> The final report was marked, and consisted </w:t>
-      </w:r>
-      <w:proofErr w:type="gramStart"/>
-      <w:r>
-        <w:rPr>
-          <w:rFonts w:asciiTheme="majorHAnsi" w:hAnsiTheme="majorHAnsi" w:cstheme="majorHAnsi"/>
-          <w:sz w:val="24"/>
-          <w:szCs w:val="24"/>
-          <w:lang w:val="en-NZ"/>
-        </w:rPr>
-        <w:t>on</w:t>
-      </w:r>
-      <w:proofErr w:type="gramEnd"/>
-      <w:r>
-        <w:rPr>
-          <w:rFonts w:asciiTheme="majorHAnsi" w:hAnsiTheme="majorHAnsi" w:cstheme="majorHAnsi"/>
-          <w:sz w:val="24"/>
-          <w:szCs w:val="24"/>
-          <w:lang w:val="en-NZ"/>
-        </w:rPr>
-        <w:t xml:space="preserve"> a quick summary of the personal contributions of each student in the project, as well as a reflection of the work done by the group, the problems found and the steps taken to solve them.</w:t>
+        <w:t xml:space="preserve"> The final report was marked, and consisted on a quick summary of the personal contributions of each student in the project, as well as a reflection of the work done by the group, the problems found and the steps taken to solve them.</w:t>
       </w:r>
     </w:p>
     <w:p>
@@ -1109,7 +989,7 @@
     </w:p>
     <w:p>
       <w:pPr>
-        <w:pStyle w:val="Prrafodelista"/>
+        <w:pStyle w:val="ListParagraph"/>
         <w:numPr>
           <w:ilvl w:val="0"/>
           <w:numId w:val="8"/>
@@ -1128,32 +1008,12 @@
           <w:szCs w:val="24"/>
           <w:lang w:val="en-NZ"/>
         </w:rPr>
-        <w:t xml:space="preserve">An architectural design for a building complex that </w:t>
-      </w:r>
-      <w:proofErr w:type="gramStart"/>
-      <w:r>
-        <w:rPr>
-          <w:rFonts w:asciiTheme="majorHAnsi" w:hAnsiTheme="majorHAnsi" w:cstheme="majorHAnsi"/>
-          <w:sz w:val="24"/>
-          <w:szCs w:val="24"/>
-          <w:lang w:val="en-NZ"/>
-        </w:rPr>
-        <w:t>takes into account</w:t>
-      </w:r>
-      <w:proofErr w:type="gramEnd"/>
-      <w:r>
-        <w:rPr>
-          <w:rFonts w:asciiTheme="majorHAnsi" w:hAnsiTheme="majorHAnsi" w:cstheme="majorHAnsi"/>
-          <w:sz w:val="24"/>
-          <w:szCs w:val="24"/>
-          <w:lang w:val="en-NZ"/>
-        </w:rPr>
-        <w:t xml:space="preserve"> the geotechnical data of the construction site, the functional necessities of the project and the complications and peculiarities found in the selected site.</w:t>
-      </w:r>
-    </w:p>
-    <w:p>
-      <w:pPr>
-        <w:pStyle w:val="Prrafodelista"/>
+        <w:t>An architectural design for a building complex that takes into account the geotechnical data of the construction site, the functional necessities of the project and the complications and peculiarities found in the selected site.</w:t>
+      </w:r>
+    </w:p>
+    <w:p>
+      <w:pPr>
+        <w:pStyle w:val="ListParagraph"/>
         <w:numPr>
           <w:ilvl w:val="0"/>
           <w:numId w:val="8"/>
@@ -1177,7 +1037,7 @@
     </w:p>
     <w:p>
       <w:pPr>
-        <w:pStyle w:val="Prrafodelista"/>
+        <w:pStyle w:val="ListParagraph"/>
         <w:numPr>
           <w:ilvl w:val="0"/>
           <w:numId w:val="8"/>
@@ -1201,7 +1061,7 @@
     </w:p>
     <w:p>
       <w:pPr>
-        <w:pStyle w:val="Prrafodelista"/>
+        <w:pStyle w:val="ListParagraph"/>
         <w:numPr>
           <w:ilvl w:val="0"/>
           <w:numId w:val="8"/>
@@ -1381,7 +1241,7 @@
     </w:p>
     <w:p>
       <w:pPr>
-        <w:pStyle w:val="Ttulo1"/>
+        <w:pStyle w:val="Heading1"/>
         <w:rPr>
           <w:rFonts w:asciiTheme="majorHAnsi" w:hAnsiTheme="majorHAnsi" w:cstheme="majorHAnsi"/>
           <w:sz w:val="24"/>
@@ -1545,27 +1405,7 @@
           <w:szCs w:val="24"/>
           <w:lang w:val="en-NZ"/>
         </w:rPr>
-        <w:t xml:space="preserve">For this learning objective it is also interesting to observe the types of collaboration being used by the students as described by Salmons (2019), and if WorkshopAR was promoting or helping in the development of a particular form of collaboration. In general, the digital space created by WorkshopAR would facilitate activities of co-creation, by allowing the testing and record of ideas for the architectural design, </w:t>
-      </w:r>
-      <w:proofErr w:type="gramStart"/>
-      <w:r>
-        <w:rPr>
-          <w:rFonts w:asciiTheme="majorHAnsi" w:hAnsiTheme="majorHAnsi" w:cstheme="majorHAnsi"/>
-          <w:sz w:val="24"/>
-          <w:szCs w:val="24"/>
-          <w:lang w:val="en-NZ"/>
-        </w:rPr>
-        <w:t>and also</w:t>
-      </w:r>
-      <w:proofErr w:type="gramEnd"/>
-      <w:r>
-        <w:rPr>
-          <w:rFonts w:asciiTheme="majorHAnsi" w:hAnsiTheme="majorHAnsi" w:cstheme="majorHAnsi"/>
-          <w:sz w:val="24"/>
-          <w:szCs w:val="24"/>
-          <w:lang w:val="en-NZ"/>
-        </w:rPr>
-        <w:t xml:space="preserve"> transfer activities, by offering visuals that can be used to explain concepts, decisions or design proposals.</w:t>
+        <w:t>For this learning objective it is also interesting to observe the types of collaboration being used by the students as described by Salmons (2019), and if WorkshopAR was promoting or helping in the development of a particular form of collaboration. In general, the digital space created by WorkshopAR would facilitate activities of co-creation, by allowing the testing and record of ideas for the architectural design, and also transfer activities, by offering visuals that can be used to explain concepts, decisions or design proposals.</w:t>
       </w:r>
     </w:p>
     <w:p>
@@ -1649,16 +1489,7 @@
           <w:szCs w:val="24"/>
           <w:lang w:val="en-NZ"/>
         </w:rPr>
-        <w:t>do</w:t>
-      </w:r>
-      <w:r>
-        <w:rPr>
-          <w:rFonts w:asciiTheme="majorHAnsi" w:hAnsiTheme="majorHAnsi" w:cstheme="majorHAnsi"/>
-          <w:sz w:val="24"/>
-          <w:szCs w:val="24"/>
-          <w:lang w:val="en-NZ"/>
-        </w:rPr>
-        <w:t>es</w:t>
+        <w:t>does</w:t>
       </w:r>
       <w:r>
         <w:rPr>
@@ -1807,7 +1638,7 @@
     </w:p>
     <w:p>
       <w:pPr>
-        <w:pStyle w:val="Descripcin"/>
+        <w:pStyle w:val="Caption"/>
         <w:jc w:val="center"/>
         <w:rPr>
           <w:lang w:val="en-NZ"/>
@@ -1888,7 +1719,7 @@
     </w:p>
     <w:p>
       <w:pPr>
-        <w:pStyle w:val="Prrafodelista"/>
+        <w:pStyle w:val="ListParagraph"/>
         <w:numPr>
           <w:ilvl w:val="0"/>
           <w:numId w:val="9"/>
@@ -1912,7 +1743,7 @@
     </w:p>
     <w:p>
       <w:pPr>
-        <w:pStyle w:val="Prrafodelista"/>
+        <w:pStyle w:val="ListParagraph"/>
         <w:numPr>
           <w:ilvl w:val="0"/>
           <w:numId w:val="9"/>
@@ -2036,7 +1867,7 @@
           <w:szCs w:val="24"/>
           <w:lang w:val="en-NZ"/>
         </w:rPr>
-        <w:t xml:space="preserve"> et al., 2016 and Granado-</w:t>
+        <w:t xml:space="preserve"> et al., 2016 and </w:t>
       </w:r>
       <w:proofErr w:type="spellStart"/>
       <w:r>
@@ -2046,7 +1877,7 @@
           <w:szCs w:val="24"/>
           <w:lang w:val="en-NZ"/>
         </w:rPr>
-        <w:t>Alcón</w:t>
+        <w:t>Granado-Alcón</w:t>
       </w:r>
       <w:proofErr w:type="spellEnd"/>
       <w:r>
@@ -2147,7 +1978,7 @@
     </w:p>
     <w:p>
       <w:pPr>
-        <w:pStyle w:val="Ttulo1"/>
+        <w:pStyle w:val="Heading1"/>
         <w:rPr>
           <w:rFonts w:asciiTheme="majorHAnsi" w:hAnsiTheme="majorHAnsi" w:cstheme="majorHAnsi"/>
           <w:sz w:val="24"/>
@@ -2223,7 +2054,7 @@
     </w:p>
     <w:p>
       <w:pPr>
-        <w:pStyle w:val="Ttulo2"/>
+        <w:pStyle w:val="Heading2"/>
         <w:rPr>
           <w:rFonts w:asciiTheme="majorHAnsi" w:hAnsiTheme="majorHAnsi" w:cstheme="majorHAnsi"/>
           <w:sz w:val="24"/>
@@ -2356,7 +2187,7 @@
     </w:p>
     <w:p>
       <w:pPr>
-        <w:pStyle w:val="Ttulo2"/>
+        <w:pStyle w:val="Heading2"/>
         <w:rPr>
           <w:rFonts w:asciiTheme="majorHAnsi" w:hAnsiTheme="majorHAnsi" w:cstheme="majorHAnsi"/>
           <w:sz w:val="24"/>
@@ -2500,7 +2331,7 @@
     </w:p>
     <w:p>
       <w:pPr>
-        <w:pStyle w:val="Prrafodelista"/>
+        <w:pStyle w:val="ListParagraph"/>
         <w:numPr>
           <w:ilvl w:val="0"/>
           <w:numId w:val="1"/>
@@ -2524,7 +2355,7 @@
     </w:p>
     <w:p>
       <w:pPr>
-        <w:pStyle w:val="Prrafodelista"/>
+        <w:pStyle w:val="ListParagraph"/>
         <w:numPr>
           <w:ilvl w:val="0"/>
           <w:numId w:val="1"/>
@@ -2562,27 +2393,7 @@
           <w:szCs w:val="24"/>
           <w:lang w:val="en-NZ"/>
         </w:rPr>
-        <w:t xml:space="preserve">These guidelines stablished that the </w:t>
-      </w:r>
-      <w:proofErr w:type="gramStart"/>
-      <w:r>
-        <w:rPr>
-          <w:rFonts w:asciiTheme="majorHAnsi" w:hAnsiTheme="majorHAnsi" w:cstheme="majorHAnsi"/>
-          <w:sz w:val="24"/>
-          <w:szCs w:val="24"/>
-          <w:lang w:val="en-NZ"/>
-        </w:rPr>
-        <w:t>main focus</w:t>
-      </w:r>
-      <w:proofErr w:type="gramEnd"/>
-      <w:r>
-        <w:rPr>
-          <w:rFonts w:asciiTheme="majorHAnsi" w:hAnsiTheme="majorHAnsi" w:cstheme="majorHAnsi"/>
-          <w:sz w:val="24"/>
-          <w:szCs w:val="24"/>
-          <w:lang w:val="en-NZ"/>
-        </w:rPr>
-        <w:t xml:space="preserve"> for the teaching staff during the observations was to identify and characterize the relationship created with the students. It was also used to identify how collaboration was being taught and enforced, and if there </w:t>
+        <w:t xml:space="preserve">These guidelines stablished that the main focus for the teaching staff during the observations was to identify and characterize the relationship created with the students. It was also used to identify how collaboration was being taught and enforced, and if there </w:t>
       </w:r>
       <w:r>
         <w:rPr>
@@ -2717,7 +2528,7 @@
     </w:p>
     <w:p>
       <w:pPr>
-        <w:pStyle w:val="Prrafodelista"/>
+        <w:pStyle w:val="ListParagraph"/>
         <w:numPr>
           <w:ilvl w:val="0"/>
           <w:numId w:val="2"/>
@@ -2741,7 +2552,7 @@
     </w:p>
     <w:p>
       <w:pPr>
-        <w:pStyle w:val="Prrafodelista"/>
+        <w:pStyle w:val="ListParagraph"/>
         <w:numPr>
           <w:ilvl w:val="0"/>
           <w:numId w:val="2"/>
@@ -2765,7 +2576,7 @@
     </w:p>
     <w:p>
       <w:pPr>
-        <w:pStyle w:val="Prrafodelista"/>
+        <w:pStyle w:val="ListParagraph"/>
         <w:numPr>
           <w:ilvl w:val="0"/>
           <w:numId w:val="2"/>
@@ -2808,7 +2619,7 @@
     </w:p>
     <w:p>
       <w:pPr>
-        <w:pStyle w:val="Prrafodelista"/>
+        <w:pStyle w:val="ListParagraph"/>
         <w:numPr>
           <w:ilvl w:val="0"/>
           <w:numId w:val="3"/>
@@ -2832,7 +2643,7 @@
     </w:p>
     <w:p>
       <w:pPr>
-        <w:pStyle w:val="Prrafodelista"/>
+        <w:pStyle w:val="ListParagraph"/>
         <w:numPr>
           <w:ilvl w:val="0"/>
           <w:numId w:val="3"/>
@@ -2856,7 +2667,7 @@
     </w:p>
     <w:p>
       <w:pPr>
-        <w:pStyle w:val="Prrafodelista"/>
+        <w:pStyle w:val="ListParagraph"/>
         <w:numPr>
           <w:ilvl w:val="0"/>
           <w:numId w:val="3"/>
@@ -2899,7 +2710,7 @@
     </w:p>
     <w:p>
       <w:pPr>
-        <w:pStyle w:val="Prrafodelista"/>
+        <w:pStyle w:val="ListParagraph"/>
         <w:numPr>
           <w:ilvl w:val="0"/>
           <w:numId w:val="4"/>
@@ -2923,7 +2734,7 @@
     </w:p>
     <w:p>
       <w:pPr>
-        <w:pStyle w:val="Prrafodelista"/>
+        <w:pStyle w:val="ListParagraph"/>
         <w:numPr>
           <w:ilvl w:val="0"/>
           <w:numId w:val="4"/>
@@ -2947,7 +2758,7 @@
     </w:p>
     <w:p>
       <w:pPr>
-        <w:pStyle w:val="Prrafodelista"/>
+        <w:pStyle w:val="ListParagraph"/>
         <w:numPr>
           <w:ilvl w:val="0"/>
           <w:numId w:val="4"/>
@@ -2989,7 +2800,7 @@
     </w:p>
     <w:p>
       <w:pPr>
-        <w:pStyle w:val="Prrafodelista"/>
+        <w:pStyle w:val="ListParagraph"/>
         <w:numPr>
           <w:ilvl w:val="0"/>
           <w:numId w:val="4"/>
@@ -3032,7 +2843,7 @@
     </w:p>
     <w:p>
       <w:pPr>
-        <w:pStyle w:val="Ttulo2"/>
+        <w:pStyle w:val="Heading2"/>
         <w:rPr>
           <w:rFonts w:asciiTheme="majorHAnsi" w:hAnsiTheme="majorHAnsi" w:cstheme="majorHAnsi"/>
           <w:sz w:val="24"/>
@@ -3085,7 +2896,27 @@
           <w:szCs w:val="24"/>
           <w:lang w:val="en-NZ"/>
         </w:rPr>
-        <w:t xml:space="preserve"> feel about their own collaboration skills and how the course was helping them to develop or improve those skills. Annex 2 of this document shows the script used for each interview.</w:t>
+        <w:t xml:space="preserve"> feel about their own collaboration skills and how the course was helping them to develop or improve those </w:t>
+      </w:r>
+      <w:proofErr w:type="gramStart"/>
+      <w:r>
+        <w:rPr>
+          <w:rFonts w:asciiTheme="majorHAnsi" w:hAnsiTheme="majorHAnsi" w:cstheme="majorHAnsi"/>
+          <w:sz w:val="24"/>
+          <w:szCs w:val="24"/>
+          <w:lang w:val="en-NZ"/>
+        </w:rPr>
+        <w:t>skills.</w:t>
+      </w:r>
+      <w:proofErr w:type="gramEnd"/>
+      <w:r>
+        <w:rPr>
+          <w:rFonts w:asciiTheme="majorHAnsi" w:hAnsiTheme="majorHAnsi" w:cstheme="majorHAnsi"/>
+          <w:sz w:val="24"/>
+          <w:szCs w:val="24"/>
+          <w:lang w:val="en-NZ"/>
+        </w:rPr>
+        <w:t xml:space="preserve"> Annex 2 of this document shows the script used for each interview.</w:t>
       </w:r>
     </w:p>
     <w:p>
@@ -3247,7 +3078,7 @@
     </w:p>
     <w:p>
       <w:pPr>
-        <w:pStyle w:val="Ttulo1"/>
+        <w:pStyle w:val="Heading1"/>
         <w:rPr>
           <w:rFonts w:asciiTheme="majorHAnsi" w:hAnsiTheme="majorHAnsi" w:cstheme="majorHAnsi"/>
           <w:sz w:val="24"/>
@@ -3293,7 +3124,7 @@
     </w:p>
     <w:p>
       <w:pPr>
-        <w:pStyle w:val="Ttulo2"/>
+        <w:pStyle w:val="Heading2"/>
         <w:rPr>
           <w:rFonts w:asciiTheme="majorHAnsi" w:hAnsiTheme="majorHAnsi" w:cstheme="majorHAnsi"/>
           <w:sz w:val="24"/>
@@ -3414,7 +3245,7 @@
     </w:p>
     <w:p>
       <w:pPr>
-        <w:pStyle w:val="Descripcin"/>
+        <w:pStyle w:val="Caption"/>
         <w:jc w:val="center"/>
         <w:rPr>
           <w:lang w:val="en-NZ"/>
@@ -3597,12 +3428,52 @@
           <w:szCs w:val="24"/>
           <w:lang w:val="en-NZ"/>
         </w:rPr>
-        <w:t>, which Table 1 shows in its Te Reo and English versions.</w:t>
-      </w:r>
-    </w:p>
-    <w:p>
-      <w:pPr>
-        <w:pStyle w:val="Descripcin"/>
+        <w:t xml:space="preserve">, which Table 1 shows in its </w:t>
+      </w:r>
+      <w:proofErr w:type="spellStart"/>
+      <w:r>
+        <w:rPr>
+          <w:rFonts w:asciiTheme="majorHAnsi" w:hAnsiTheme="majorHAnsi" w:cstheme="majorHAnsi"/>
+          <w:sz w:val="24"/>
+          <w:szCs w:val="24"/>
+          <w:lang w:val="en-NZ"/>
+        </w:rPr>
+        <w:t>Te</w:t>
+      </w:r>
+      <w:proofErr w:type="spellEnd"/>
+      <w:r>
+        <w:rPr>
+          <w:rFonts w:asciiTheme="majorHAnsi" w:hAnsiTheme="majorHAnsi" w:cstheme="majorHAnsi"/>
+          <w:sz w:val="24"/>
+          <w:szCs w:val="24"/>
+          <w:lang w:val="en-NZ"/>
+        </w:rPr>
+        <w:t xml:space="preserve"> </w:t>
+      </w:r>
+      <w:proofErr w:type="spellStart"/>
+      <w:r>
+        <w:rPr>
+          <w:rFonts w:asciiTheme="majorHAnsi" w:hAnsiTheme="majorHAnsi" w:cstheme="majorHAnsi"/>
+          <w:sz w:val="24"/>
+          <w:szCs w:val="24"/>
+          <w:lang w:val="en-NZ"/>
+        </w:rPr>
+        <w:t>Reo</w:t>
+      </w:r>
+      <w:proofErr w:type="spellEnd"/>
+      <w:r>
+        <w:rPr>
+          <w:rFonts w:asciiTheme="majorHAnsi" w:hAnsiTheme="majorHAnsi" w:cstheme="majorHAnsi"/>
+          <w:sz w:val="24"/>
+          <w:szCs w:val="24"/>
+          <w:lang w:val="en-NZ"/>
+        </w:rPr>
+        <w:t xml:space="preserve"> and English versions.</w:t>
+      </w:r>
+    </w:p>
+    <w:p>
+      <w:pPr>
+        <w:pStyle w:val="Caption"/>
         <w:keepNext/>
         <w:jc w:val="center"/>
         <w:rPr>
@@ -3655,7 +3526,7 @@
     </w:p>
     <w:tbl>
       <w:tblPr>
-        <w:tblStyle w:val="Tablanormal2"/>
+        <w:tblStyle w:val="PlainTable2"/>
         <w:tblW w:w="0" w:type="auto"/>
         <w:tblLook w:val="04A0" w:firstRow="1" w:lastRow="0" w:firstColumn="1" w:lastColumn="0" w:noHBand="0" w:noVBand="1"/>
       </w:tblPr>
@@ -3682,6 +3553,7 @@
                 <w:lang w:val="en-NZ"/>
               </w:rPr>
             </w:pPr>
+            <w:proofErr w:type="spellStart"/>
             <w:r>
               <w:rPr>
                 <w:rFonts w:asciiTheme="majorHAnsi" w:hAnsiTheme="majorHAnsi" w:cstheme="majorHAnsi"/>
@@ -3689,8 +3561,29 @@
                 <w:szCs w:val="24"/>
                 <w:lang w:val="en-NZ"/>
               </w:rPr>
-              <w:t>Te Reo</w:t>
+              <w:t>Te</w:t>
             </w:r>
+            <w:proofErr w:type="spellEnd"/>
+            <w:r>
+              <w:rPr>
+                <w:rFonts w:asciiTheme="majorHAnsi" w:hAnsiTheme="majorHAnsi" w:cstheme="majorHAnsi"/>
+                <w:sz w:val="24"/>
+                <w:szCs w:val="24"/>
+                <w:lang w:val="en-NZ"/>
+              </w:rPr>
+              <w:t xml:space="preserve"> </w:t>
+            </w:r>
+            <w:proofErr w:type="spellStart"/>
+            <w:r>
+              <w:rPr>
+                <w:rFonts w:asciiTheme="majorHAnsi" w:hAnsiTheme="majorHAnsi" w:cstheme="majorHAnsi"/>
+                <w:sz w:val="24"/>
+                <w:szCs w:val="24"/>
+                <w:lang w:val="en-NZ"/>
+              </w:rPr>
+              <w:t>Reo</w:t>
+            </w:r>
+            <w:proofErr w:type="spellEnd"/>
           </w:p>
         </w:tc>
         <w:tc>
@@ -3766,7 +3659,27 @@
                 <w:szCs w:val="24"/>
                 <w:lang w:val="en-NZ"/>
               </w:rPr>
-              <w:t>Mauri tū.</w:t>
+              <w:t xml:space="preserve">Mauri </w:t>
+            </w:r>
+            <w:proofErr w:type="spellStart"/>
+            <w:r>
+              <w:rPr>
+                <w:rFonts w:asciiTheme="majorHAnsi" w:hAnsiTheme="majorHAnsi" w:cstheme="majorHAnsi"/>
+                <w:sz w:val="24"/>
+                <w:szCs w:val="24"/>
+                <w:lang w:val="en-NZ"/>
+              </w:rPr>
+              <w:t>tū</w:t>
+            </w:r>
+            <w:proofErr w:type="spellEnd"/>
+            <w:r>
+              <w:rPr>
+                <w:rFonts w:asciiTheme="majorHAnsi" w:hAnsiTheme="majorHAnsi" w:cstheme="majorHAnsi"/>
+                <w:sz w:val="24"/>
+                <w:szCs w:val="24"/>
+                <w:lang w:val="en-NZ"/>
+              </w:rPr>
+              <w:t>.</w:t>
             </w:r>
           </w:p>
           <w:p>
@@ -3786,7 +3699,47 @@
                 <w:szCs w:val="24"/>
                 <w:lang w:val="en-NZ"/>
               </w:rPr>
-              <w:t>Mauri ora ki a tātou.</w:t>
+              <w:t xml:space="preserve">Mauri </w:t>
+            </w:r>
+            <w:proofErr w:type="spellStart"/>
+            <w:r>
+              <w:rPr>
+                <w:rFonts w:asciiTheme="majorHAnsi" w:hAnsiTheme="majorHAnsi" w:cstheme="majorHAnsi"/>
+                <w:sz w:val="24"/>
+                <w:szCs w:val="24"/>
+                <w:lang w:val="en-NZ"/>
+              </w:rPr>
+              <w:t>ora</w:t>
+            </w:r>
+            <w:proofErr w:type="spellEnd"/>
+            <w:r>
+              <w:rPr>
+                <w:rFonts w:asciiTheme="majorHAnsi" w:hAnsiTheme="majorHAnsi" w:cstheme="majorHAnsi"/>
+                <w:sz w:val="24"/>
+                <w:szCs w:val="24"/>
+                <w:lang w:val="en-NZ"/>
+              </w:rPr>
+              <w:t xml:space="preserve"> ki a </w:t>
+            </w:r>
+            <w:proofErr w:type="spellStart"/>
+            <w:r>
+              <w:rPr>
+                <w:rFonts w:asciiTheme="majorHAnsi" w:hAnsiTheme="majorHAnsi" w:cstheme="majorHAnsi"/>
+                <w:sz w:val="24"/>
+                <w:szCs w:val="24"/>
+                <w:lang w:val="en-NZ"/>
+              </w:rPr>
+              <w:t>tātou</w:t>
+            </w:r>
+            <w:proofErr w:type="spellEnd"/>
+            <w:r>
+              <w:rPr>
+                <w:rFonts w:asciiTheme="majorHAnsi" w:hAnsiTheme="majorHAnsi" w:cstheme="majorHAnsi"/>
+                <w:sz w:val="24"/>
+                <w:szCs w:val="24"/>
+                <w:lang w:val="en-NZ"/>
+              </w:rPr>
+              <w:t>.</w:t>
             </w:r>
           </w:p>
           <w:p>
@@ -3796,7 +3749,7 @@
                 <w:rFonts w:asciiTheme="majorHAnsi" w:hAnsiTheme="majorHAnsi" w:cstheme="majorHAnsi"/>
                 <w:sz w:val="24"/>
                 <w:szCs w:val="24"/>
-                <w:lang w:val="es-CO"/>
+                <w:lang w:val="en-NZ"/>
               </w:rPr>
             </w:pPr>
             <w:proofErr w:type="spellStart"/>
@@ -3805,7 +3758,7 @@
                 <w:rFonts w:asciiTheme="majorHAnsi" w:hAnsiTheme="majorHAnsi" w:cstheme="majorHAnsi"/>
                 <w:sz w:val="24"/>
                 <w:szCs w:val="24"/>
-                <w:lang w:val="es-CO"/>
+                <w:lang w:val="en-NZ"/>
               </w:rPr>
               <w:t>Haumi</w:t>
             </w:r>
@@ -3815,7 +3768,7 @@
                 <w:rFonts w:asciiTheme="majorHAnsi" w:hAnsiTheme="majorHAnsi" w:cstheme="majorHAnsi"/>
                 <w:sz w:val="24"/>
                 <w:szCs w:val="24"/>
-                <w:lang w:val="es-CO"/>
+                <w:lang w:val="en-NZ"/>
               </w:rPr>
               <w:t xml:space="preserve"> e, Hui e! </w:t>
             </w:r>
@@ -3825,7 +3778,7 @@
                 <w:rFonts w:asciiTheme="majorHAnsi" w:hAnsiTheme="majorHAnsi" w:cstheme="majorHAnsi"/>
                 <w:sz w:val="24"/>
                 <w:szCs w:val="24"/>
-                <w:lang w:val="es-CO"/>
+                <w:lang w:val="en-NZ"/>
               </w:rPr>
               <w:t>Tāiki</w:t>
             </w:r>
@@ -3835,7 +3788,7 @@
                 <w:rFonts w:asciiTheme="majorHAnsi" w:hAnsiTheme="majorHAnsi" w:cstheme="majorHAnsi"/>
                 <w:sz w:val="24"/>
                 <w:szCs w:val="24"/>
-                <w:lang w:val="es-CO"/>
+                <w:lang w:val="en-NZ"/>
               </w:rPr>
               <w:t xml:space="preserve"> e!</w:t>
             </w:r>
@@ -3863,27 +3816,7 @@
                 <w:szCs w:val="24"/>
                 <w:lang w:val="en-NZ"/>
               </w:rPr>
-              <w:t xml:space="preserve">Life force </w:t>
-            </w:r>
-            <w:proofErr w:type="gramStart"/>
-            <w:r>
-              <w:rPr>
-                <w:rFonts w:asciiTheme="majorHAnsi" w:hAnsiTheme="majorHAnsi" w:cstheme="majorHAnsi"/>
-                <w:sz w:val="24"/>
-                <w:szCs w:val="24"/>
-                <w:lang w:val="en-NZ"/>
-              </w:rPr>
-              <w:t>awaken</w:t>
-            </w:r>
-            <w:proofErr w:type="gramEnd"/>
-            <w:r>
-              <w:rPr>
-                <w:rFonts w:asciiTheme="majorHAnsi" w:hAnsiTheme="majorHAnsi" w:cstheme="majorHAnsi"/>
-                <w:sz w:val="24"/>
-                <w:szCs w:val="24"/>
-                <w:lang w:val="en-NZ"/>
-              </w:rPr>
-              <w:t>.</w:t>
+              <w:t>Life force awaken.</w:t>
             </w:r>
           </w:p>
           <w:p>
@@ -3925,7 +3858,27 @@
                 <w:szCs w:val="24"/>
                 <w:lang w:val="en-NZ"/>
               </w:rPr>
-              <w:t>Life force all wellness, good health for all.</w:t>
+              <w:t xml:space="preserve">Life </w:t>
+            </w:r>
+            <w:proofErr w:type="gramStart"/>
+            <w:r>
+              <w:rPr>
+                <w:rFonts w:asciiTheme="majorHAnsi" w:hAnsiTheme="majorHAnsi" w:cstheme="majorHAnsi"/>
+                <w:sz w:val="24"/>
+                <w:szCs w:val="24"/>
+                <w:lang w:val="en-NZ"/>
+              </w:rPr>
+              <w:t>force</w:t>
+            </w:r>
+            <w:proofErr w:type="gramEnd"/>
+            <w:r>
+              <w:rPr>
+                <w:rFonts w:asciiTheme="majorHAnsi" w:hAnsiTheme="majorHAnsi" w:cstheme="majorHAnsi"/>
+                <w:sz w:val="24"/>
+                <w:szCs w:val="24"/>
+                <w:lang w:val="en-NZ"/>
+              </w:rPr>
+              <w:t xml:space="preserve"> all wellness, good health for all.</w:t>
             </w:r>
           </w:p>
           <w:p>
@@ -4113,7 +4066,7 @@
     </w:p>
     <w:p>
       <w:pPr>
-        <w:pStyle w:val="Prrafodelista"/>
+        <w:pStyle w:val="ListParagraph"/>
         <w:numPr>
           <w:ilvl w:val="0"/>
           <w:numId w:val="10"/>
@@ -4137,7 +4090,7 @@
     </w:p>
     <w:p>
       <w:pPr>
-        <w:pStyle w:val="Prrafodelista"/>
+        <w:pStyle w:val="ListParagraph"/>
         <w:numPr>
           <w:ilvl w:val="0"/>
           <w:numId w:val="10"/>
@@ -4161,7 +4114,7 @@
     </w:p>
     <w:p>
       <w:pPr>
-        <w:pStyle w:val="Prrafodelista"/>
+        <w:pStyle w:val="ListParagraph"/>
         <w:numPr>
           <w:ilvl w:val="0"/>
           <w:numId w:val="10"/>
@@ -4204,7 +4157,7 @@
     </w:p>
     <w:p>
       <w:pPr>
-        <w:pStyle w:val="Prrafodelista"/>
+        <w:pStyle w:val="ListParagraph"/>
         <w:numPr>
           <w:ilvl w:val="0"/>
           <w:numId w:val="11"/>
@@ -4228,7 +4181,7 @@
     </w:p>
     <w:p>
       <w:pPr>
-        <w:pStyle w:val="Prrafodelista"/>
+        <w:pStyle w:val="ListParagraph"/>
         <w:numPr>
           <w:ilvl w:val="0"/>
           <w:numId w:val="11"/>
@@ -4455,7 +4408,7 @@
     </w:p>
     <w:p>
       <w:pPr>
-        <w:pStyle w:val="Descripcin"/>
+        <w:pStyle w:val="Caption"/>
         <w:jc w:val="center"/>
         <w:rPr>
           <w:rFonts w:asciiTheme="majorHAnsi" w:hAnsiTheme="majorHAnsi" w:cstheme="majorHAnsi"/>
@@ -4529,7 +4482,7 @@
     </w:p>
     <w:p>
       <w:pPr>
-        <w:pStyle w:val="Ttulo3"/>
+        <w:pStyle w:val="Heading3"/>
         <w:rPr>
           <w:rFonts w:asciiTheme="majorHAnsi" w:hAnsiTheme="majorHAnsi" w:cstheme="majorHAnsi"/>
           <w:sz w:val="24"/>
@@ -4576,7 +4529,7 @@
     </w:p>
     <w:p>
       <w:pPr>
-        <w:pStyle w:val="Prrafodelista"/>
+        <w:pStyle w:val="ListParagraph"/>
         <w:numPr>
           <w:ilvl w:val="0"/>
           <w:numId w:val="12"/>
@@ -4594,7 +4547,7 @@
     </w:p>
     <w:p>
       <w:pPr>
-        <w:pStyle w:val="Prrafodelista"/>
+        <w:pStyle w:val="ListParagraph"/>
         <w:numPr>
           <w:ilvl w:val="0"/>
           <w:numId w:val="12"/>
@@ -4612,7 +4565,7 @@
     </w:p>
     <w:p>
       <w:pPr>
-        <w:pStyle w:val="Prrafodelista"/>
+        <w:pStyle w:val="ListParagraph"/>
         <w:numPr>
           <w:ilvl w:val="0"/>
           <w:numId w:val="12"/>
@@ -4630,7 +4583,7 @@
     </w:p>
     <w:p>
       <w:pPr>
-        <w:pStyle w:val="Prrafodelista"/>
+        <w:pStyle w:val="ListParagraph"/>
         <w:numPr>
           <w:ilvl w:val="0"/>
           <w:numId w:val="12"/>
@@ -4808,7 +4761,7 @@
     </w:p>
     <w:p>
       <w:pPr>
-        <w:pStyle w:val="Prrafodelista"/>
+        <w:pStyle w:val="ListParagraph"/>
         <w:numPr>
           <w:ilvl w:val="0"/>
           <w:numId w:val="13"/>
@@ -4826,7 +4779,7 @@
     </w:p>
     <w:p>
       <w:pPr>
-        <w:pStyle w:val="Prrafodelista"/>
+        <w:pStyle w:val="ListParagraph"/>
         <w:numPr>
           <w:ilvl w:val="0"/>
           <w:numId w:val="13"/>
@@ -4874,7 +4827,7 @@
     </w:p>
     <w:p>
       <w:pPr>
-        <w:pStyle w:val="Prrafodelista"/>
+        <w:pStyle w:val="ListParagraph"/>
         <w:numPr>
           <w:ilvl w:val="0"/>
           <w:numId w:val="13"/>
@@ -4892,7 +4845,7 @@
     </w:p>
     <w:p>
       <w:pPr>
-        <w:pStyle w:val="Ttulo3"/>
+        <w:pStyle w:val="Heading3"/>
         <w:rPr>
           <w:sz w:val="22"/>
           <w:szCs w:val="22"/>
@@ -5036,7 +4989,7 @@
     </w:p>
     <w:p>
       <w:pPr>
-        <w:pStyle w:val="Descripcin"/>
+        <w:pStyle w:val="Caption"/>
         <w:jc w:val="center"/>
         <w:rPr>
           <w:lang w:val="en-NZ"/>
@@ -5178,7 +5131,7 @@
     </w:p>
     <w:p>
       <w:pPr>
-        <w:pStyle w:val="Ttulo2"/>
+        <w:pStyle w:val="Heading2"/>
         <w:rPr>
           <w:sz w:val="22"/>
           <w:szCs w:val="22"/>
@@ -5235,21 +5188,7 @@
         <w:rPr>
           <w:lang w:val="en-NZ"/>
         </w:rPr>
-        <w:t xml:space="preserve"> </w:t>
-      </w:r>
-      <w:proofErr w:type="gramStart"/>
-      <w:r>
-        <w:rPr>
-          <w:lang w:val="en-NZ"/>
-        </w:rPr>
-        <w:t>all of</w:t>
-      </w:r>
-      <w:proofErr w:type="gramEnd"/>
-      <w:r>
-        <w:rPr>
-          <w:lang w:val="en-NZ"/>
-        </w:rPr>
-        <w:t xml:space="preserve"> the activities that could be classified as part of the first </w:t>
+        <w:t xml:space="preserve"> all of the activities that could be classified as part of the first </w:t>
       </w:r>
       <w:r>
         <w:rPr>
@@ -5261,7 +5200,21 @@
         <w:rPr>
           <w:lang w:val="en-NZ"/>
         </w:rPr>
-        <w:t xml:space="preserve"> and consolidation stage of groupwork (Lowe &amp; Herranen, 1982</w:t>
+        <w:t xml:space="preserve"> and consolidation stage of groupwork (Lowe &amp; </w:t>
+      </w:r>
+      <w:proofErr w:type="spellStart"/>
+      <w:r>
+        <w:rPr>
+          <w:lang w:val="en-NZ"/>
+        </w:rPr>
+        <w:t>Herranen</w:t>
+      </w:r>
+      <w:proofErr w:type="spellEnd"/>
+      <w:r>
+        <w:rPr>
+          <w:lang w:val="en-NZ"/>
+        </w:rPr>
+        <w:t>, 1982</w:t>
       </w:r>
       <w:r>
         <w:rPr>
@@ -5272,7 +5225,7 @@
     </w:p>
     <w:p>
       <w:pPr>
-        <w:pStyle w:val="Ttulo3"/>
+        <w:pStyle w:val="Heading3"/>
         <w:rPr>
           <w:sz w:val="22"/>
           <w:szCs w:val="22"/>
@@ -5348,7 +5301,21 @@
         <w:rPr>
           <w:lang w:val="en-NZ"/>
         </w:rPr>
-        <w:t xml:space="preserve"> were a part of as a reference, very few knew each other, and even if they did, the was a high chance the were not in the same group</w:t>
+        <w:t xml:space="preserve"> were a part of as a reference, very few knew each other, and even if they did, the was a high chance </w:t>
+      </w:r>
+      <w:proofErr w:type="spellStart"/>
+      <w:r>
+        <w:rPr>
+          <w:lang w:val="en-NZ"/>
+        </w:rPr>
+        <w:t>the</w:t>
+      </w:r>
+      <w:proofErr w:type="spellEnd"/>
+      <w:r>
+        <w:rPr>
+          <w:lang w:val="en-NZ"/>
+        </w:rPr>
+        <w:t xml:space="preserve"> were not in the same group</w:t>
       </w:r>
       <w:r>
         <w:rPr>
@@ -5430,7 +5397,21 @@
         <w:rPr>
           <w:lang w:val="en-NZ"/>
         </w:rPr>
-        <w:t>. On of the students even commented that she did some “stalking” of one of her company ions in social media to see who she was working with. It was not until the activities in the first week that students started to realise the need for a more direct form of communication since most of the work was being done face-to-face and in the classroom.</w:t>
+        <w:t xml:space="preserve">. </w:t>
+      </w:r>
+      <w:proofErr w:type="spellStart"/>
+      <w:r>
+        <w:rPr>
+          <w:lang w:val="en-NZ"/>
+        </w:rPr>
+        <w:t>On</w:t>
+      </w:r>
+      <w:proofErr w:type="spellEnd"/>
+      <w:r>
+        <w:rPr>
+          <w:lang w:val="en-NZ"/>
+        </w:rPr>
+        <w:t xml:space="preserve"> of the students even commented that she did some “stalking” of one of her company ions in social media to see who she was working with. It was not until the activities in the first week that students started to realise the need for a more direct form of communication since most of the work was being done face-to-face and in the classroom.</w:t>
       </w:r>
     </w:p>
     <w:p>
@@ -5448,7 +5429,7 @@
     </w:p>
     <w:p>
       <w:pPr>
-        <w:pStyle w:val="Ttulo3"/>
+        <w:pStyle w:val="Heading3"/>
         <w:rPr>
           <w:sz w:val="22"/>
           <w:szCs w:val="22"/>
@@ -5498,7 +5479,7 @@
     </w:p>
     <w:p>
       <w:pPr>
-        <w:pStyle w:val="Prrafodelista"/>
+        <w:pStyle w:val="ListParagraph"/>
         <w:numPr>
           <w:ilvl w:val="0"/>
           <w:numId w:val="14"/>
@@ -5516,7 +5497,7 @@
     </w:p>
     <w:p>
       <w:pPr>
-        <w:pStyle w:val="Prrafodelista"/>
+        <w:pStyle w:val="ListParagraph"/>
         <w:numPr>
           <w:ilvl w:val="0"/>
           <w:numId w:val="14"/>
@@ -5535,7 +5516,7 @@
     </w:p>
     <w:p>
       <w:pPr>
-        <w:pStyle w:val="Prrafodelista"/>
+        <w:pStyle w:val="ListParagraph"/>
         <w:numPr>
           <w:ilvl w:val="0"/>
           <w:numId w:val="14"/>
@@ -5559,7 +5540,7 @@
     </w:p>
     <w:p>
       <w:pPr>
-        <w:pStyle w:val="Prrafodelista"/>
+        <w:pStyle w:val="ListParagraph"/>
         <w:numPr>
           <w:ilvl w:val="0"/>
           <w:numId w:val="14"/>
@@ -5590,7 +5571,7 @@
     </w:p>
     <w:p>
       <w:pPr>
-        <w:pStyle w:val="Prrafodelista"/>
+        <w:pStyle w:val="ListParagraph"/>
         <w:numPr>
           <w:ilvl w:val="0"/>
           <w:numId w:val="15"/>
@@ -5608,7 +5589,7 @@
     </w:p>
     <w:p>
       <w:pPr>
-        <w:pStyle w:val="Prrafodelista"/>
+        <w:pStyle w:val="ListParagraph"/>
         <w:numPr>
           <w:ilvl w:val="0"/>
           <w:numId w:val="15"/>
@@ -5626,7 +5607,7 @@
     </w:p>
     <w:p>
       <w:pPr>
-        <w:pStyle w:val="Prrafodelista"/>
+        <w:pStyle w:val="ListParagraph"/>
         <w:numPr>
           <w:ilvl w:val="0"/>
           <w:numId w:val="15"/>
@@ -5670,7 +5651,7 @@
     </w:p>
     <w:p>
       <w:pPr>
-        <w:pStyle w:val="Prrafodelista"/>
+        <w:pStyle w:val="ListParagraph"/>
         <w:numPr>
           <w:ilvl w:val="0"/>
           <w:numId w:val="16"/>
@@ -5688,7 +5669,7 @@
     </w:p>
     <w:p>
       <w:pPr>
-        <w:pStyle w:val="Prrafodelista"/>
+        <w:pStyle w:val="ListParagraph"/>
         <w:numPr>
           <w:ilvl w:val="0"/>
           <w:numId w:val="16"/>
@@ -5727,7 +5708,19 @@
         <w:rPr>
           <w:lang w:val="en-NZ"/>
         </w:rPr>
-        <w:t>The first step was to create and configure the Room. On of the QS took the initiative to be the host and quickly moved through the technical steps all the way to the creation of the Workspace. Defining the session goal did not take a discussion at all, since it had been stablished before what the objective was, but it did prompt the question: What would happen if the goal had not been discussed earlier?</w:t>
+        <w:t xml:space="preserve">The first step was to create and configure the Room. </w:t>
+      </w:r>
+      <w:r>
+        <w:rPr>
+          <w:lang w:val="en-NZ"/>
+        </w:rPr>
+        <w:t>One</w:t>
+      </w:r>
+      <w:r>
+        <w:rPr>
+          <w:lang w:val="en-NZ"/>
+        </w:rPr>
+        <w:t xml:space="preserve"> of the QS took the initiative to be the host and quickly moved through the technical steps all the way to the creation of the Workspace. Defining the session goal did not take a discussion at all, since it had been stablished before what the objective was, but it did prompt the question: What would happen if the goal had not been discussed earlier?</w:t>
       </w:r>
     </w:p>
     <w:p>
@@ -5741,13 +5734,43 @@
           <w:lang w:val="en-NZ"/>
         </w:rPr>
         <w:lastRenderedPageBreak/>
-        <w:t>The response was a bit vague</w:t>
-      </w:r>
-      <w:r>
-        <w:rPr>
-          <w:lang w:val="en-NZ"/>
-        </w:rPr>
-        <w:t>, the group had a clear idea of what was the work needed for the session, but it was not clear for them when they took the decision of dedicating the session to start working on the poster. The CM did mention that the poster was the next deliverable, so there was no need to discus what to do next, it was mandatory to work on the poster, and a mater of focusing on their own individual responsibilities.</w:t>
+        <w:t xml:space="preserve">The response was a bit </w:t>
+      </w:r>
+      <w:r>
+        <w:rPr>
+          <w:lang w:val="en-NZ"/>
+        </w:rPr>
+        <w:t>vague;</w:t>
+      </w:r>
+      <w:r>
+        <w:rPr>
+          <w:lang w:val="en-NZ"/>
+        </w:rPr>
+        <w:t xml:space="preserve"> the group had a clear idea of what was the work needed for the session, but it was not clear for them when they took the decision of dedicating the session to start working on the poster. The CM did mention that the poster was the next deliverable, so there was no need to </w:t>
+      </w:r>
+      <w:r>
+        <w:rPr>
+          <w:lang w:val="en-NZ"/>
+        </w:rPr>
+        <w:t>discuss</w:t>
+      </w:r>
+      <w:r>
+        <w:rPr>
+          <w:lang w:val="en-NZ"/>
+        </w:rPr>
+        <w:t xml:space="preserve"> what to do next, it was mandatory to work on the poster, and a </w:t>
+      </w:r>
+      <w:r>
+        <w:rPr>
+          <w:lang w:val="en-NZ"/>
+        </w:rPr>
+        <w:t>matter</w:t>
+      </w:r>
+      <w:r>
+        <w:rPr>
+          <w:lang w:val="en-NZ"/>
+        </w:rPr>
+        <w:t xml:space="preserve"> of focusing on their own individual responsibilities.</w:t>
       </w:r>
     </w:p>
     <w:p>
@@ -5791,7 +5814,21 @@
         <w:rPr>
           <w:lang w:val="en-NZ"/>
         </w:rPr>
-        <w:t>Figure 5 shows the space that was used for the couple of observations that took the groups apart form the rest of the classroom, like this one. The set-up of the table promoted a behaviour that had already been seen during the usability test: the student tried to create a workspace that fitted in the entire table, although it was not necessary, and was struggling with the controls and had to stand up and move around to try and cover the whole table. S</w:t>
+        <w:t xml:space="preserve">Figure 5 shows the space that was used for the couple of observations that took the groups apart </w:t>
+      </w:r>
+      <w:proofErr w:type="spellStart"/>
+      <w:r>
+        <w:rPr>
+          <w:lang w:val="en-NZ"/>
+        </w:rPr>
+        <w:t>form</w:t>
+      </w:r>
+      <w:proofErr w:type="spellEnd"/>
+      <w:r>
+        <w:rPr>
+          <w:lang w:val="en-NZ"/>
+        </w:rPr>
+        <w:t xml:space="preserve"> the rest of the classroom, like this one. The set-up of the table promoted a behaviour that had already been seen during the usability test: the student tried to create a workspace that fitted in the entire table, although it was not necessary, and was struggling with the controls and had to stand up and move around to try and cover the whole table. S</w:t>
       </w:r>
       <w:r>
         <w:rPr>
@@ -5808,6 +5845,7 @@
     </w:p>
     <w:p>
       <w:pPr>
+        <w:keepNext/>
         <w:jc w:val="center"/>
         <w:rPr>
           <w:lang w:val="en-NZ"/>
@@ -5815,28 +5853,138 @@
       </w:pPr>
       <w:r>
         <w:rPr>
-          <w:lang w:val="en-NZ"/>
-        </w:rPr>
-        <w:t>Figure 5</w:t>
-      </w:r>
-    </w:p>
-    <w:p>
-      <w:pPr>
-        <w:jc w:val="both"/>
-        <w:rPr>
-          <w:lang w:val="en-NZ"/>
-        </w:rPr>
-      </w:pPr>
-      <w:r>
-        <w:rPr>
-          <w:lang w:val="en-NZ"/>
-        </w:rPr>
-        <w:t>While repeating the creation of the Room, the student commented that probably the CM should be the one in charge of the configuration process and handed the mobile to him so he could do it. The situation worthed an intervening question: Should the same person always be the host? How would they organise the group to create and configure the Room?</w:t>
-      </w:r>
-    </w:p>
-    <w:p>
-      <w:pPr>
-        <w:jc w:val="both"/>
+          <w:noProof/>
+          <w:lang w:val="en-NZ"/>
+        </w:rPr>
+        <w:drawing>
+          <wp:inline distT="0" distB="0" distL="0" distR="0" wp14:anchorId="7D199E07" wp14:editId="76874071">
+            <wp:extent cx="4127348" cy="3095625"/>
+            <wp:effectExtent l="0" t="0" r="6985" b="0"/>
+            <wp:docPr id="3" name="Picture 3"/>
+            <wp:cNvGraphicFramePr>
+              <a:graphicFrameLocks xmlns:a="http://schemas.openxmlformats.org/drawingml/2006/main" noChangeAspect="1"/>
+            </wp:cNvGraphicFramePr>
+            <a:graphic xmlns:a="http://schemas.openxmlformats.org/drawingml/2006/main">
+              <a:graphicData uri="http://schemas.openxmlformats.org/drawingml/2006/picture">
+                <pic:pic xmlns:pic="http://schemas.openxmlformats.org/drawingml/2006/picture">
+                  <pic:nvPicPr>
+                    <pic:cNvPr id="0" name="Picture 1"/>
+                    <pic:cNvPicPr>
+                      <a:picLocks noChangeAspect="1" noChangeArrowheads="1"/>
+                    </pic:cNvPicPr>
+                  </pic:nvPicPr>
+                  <pic:blipFill>
+                    <a:blip r:embed="rId9" cstate="print">
+                      <a:extLst>
+                        <a:ext uri="{28A0092B-C50C-407E-A947-70E740481C1C}">
+                          <a14:useLocalDpi xmlns:a14="http://schemas.microsoft.com/office/drawing/2010/main" val="0"/>
+                        </a:ext>
+                      </a:extLst>
+                    </a:blip>
+                    <a:srcRect/>
+                    <a:stretch>
+                      <a:fillRect/>
+                    </a:stretch>
+                  </pic:blipFill>
+                  <pic:spPr bwMode="auto">
+                    <a:xfrm>
+                      <a:off x="0" y="0"/>
+                      <a:ext cx="4130381" cy="3097900"/>
+                    </a:xfrm>
+                    <a:prstGeom prst="rect">
+                      <a:avLst/>
+                    </a:prstGeom>
+                    <a:noFill/>
+                    <a:ln>
+                      <a:noFill/>
+                    </a:ln>
+                  </pic:spPr>
+                </pic:pic>
+              </a:graphicData>
+            </a:graphic>
+          </wp:inline>
+        </w:drawing>
+      </w:r>
+    </w:p>
+    <w:p>
+      <w:pPr>
+        <w:pStyle w:val="Caption"/>
+        <w:jc w:val="center"/>
+        <w:rPr>
+          <w:lang w:val="en-NZ"/>
+        </w:rPr>
+      </w:pPr>
+      <w:r>
+        <w:rPr>
+          <w:lang w:val="en-NZ"/>
+        </w:rPr>
+        <w:t xml:space="preserve">Figure </w:t>
+      </w:r>
+      <w:r>
+        <w:rPr>
+          <w:lang w:val="en-NZ"/>
+        </w:rPr>
+        <w:fldChar w:fldCharType="begin"/>
+      </w:r>
+      <w:r>
+        <w:rPr>
+          <w:lang w:val="en-NZ"/>
+        </w:rPr>
+        <w:instrText xml:space="preserve"> SEQ Figure \* ARABIC </w:instrText>
+      </w:r>
+      <w:r>
+        <w:rPr>
+          <w:lang w:val="en-NZ"/>
+        </w:rPr>
+        <w:fldChar w:fldCharType="separate"/>
+      </w:r>
+      <w:r>
+        <w:rPr>
+          <w:noProof/>
+          <w:lang w:val="en-NZ"/>
+        </w:rPr>
+        <w:t>5</w:t>
+      </w:r>
+      <w:r>
+        <w:rPr>
+          <w:lang w:val="en-NZ"/>
+        </w:rPr>
+        <w:fldChar w:fldCharType="end"/>
+      </w:r>
+      <w:r>
+        <w:rPr>
+          <w:lang w:val="en-NZ"/>
+        </w:rPr>
+        <w:t xml:space="preserve"> Initial Space for Observations of WorkshopAR</w:t>
+      </w:r>
+    </w:p>
+    <w:p>
+      <w:pPr>
+        <w:rPr>
+          <w:lang w:val="en-NZ"/>
+        </w:rPr>
+      </w:pPr>
+      <w:r>
+        <w:rPr>
+          <w:lang w:val="en-NZ"/>
+        </w:rPr>
+        <w:t xml:space="preserve">While repeating the creation of the Room, the student commented that probably the CM should be the one in charge of the configuration process and handed the mobile to him so he could do it. The situation </w:t>
+      </w:r>
+      <w:r>
+        <w:rPr>
+          <w:lang w:val="en-NZ"/>
+        </w:rPr>
+        <w:t>prompted</w:t>
+      </w:r>
+      <w:r>
+        <w:rPr>
+          <w:lang w:val="en-NZ"/>
+        </w:rPr>
+        <w:t xml:space="preserve"> an intervening question: Should the same person always be the host? How would they organise the group to create and configure the Room?</w:t>
+      </w:r>
+    </w:p>
+    <w:p>
+      <w:pPr>
         <w:rPr>
           <w:lang w:val="en-NZ"/>
         </w:rPr>
@@ -5850,15 +5998,15 @@
     </w:p>
     <w:p>
       <w:pPr>
-        <w:jc w:val="both"/>
-        <w:rPr>
-          <w:lang w:val="en-NZ"/>
-        </w:rPr>
-      </w:pPr>
-      <w:r>
-        <w:rPr>
-          <w:lang w:val="en-NZ"/>
-        </w:rPr>
+        <w:rPr>
+          <w:lang w:val="en-NZ"/>
+        </w:rPr>
+      </w:pPr>
+      <w:r>
+        <w:rPr>
+          <w:lang w:val="en-NZ"/>
+        </w:rPr>
+        <w:lastRenderedPageBreak/>
         <w:t>The interactions with the User Anchors were simpler. They showed that the students liked the idea of the anchor, they specially found amusing the “goofy” look that the gaze gave to the whole anchor, and suggested more elements of customization beside colour, like text, shapes or animations.</w:t>
       </w:r>
       <w:r>
@@ -5870,7 +6018,6 @@
     </w:p>
     <w:p>
       <w:pPr>
-        <w:jc w:val="both"/>
         <w:rPr>
           <w:lang w:val="en-NZ"/>
         </w:rPr>
@@ -5884,7 +6031,6 @@
     </w:p>
     <w:p>
       <w:pPr>
-        <w:jc w:val="both"/>
         <w:rPr>
           <w:lang w:val="en-NZ"/>
         </w:rPr>
@@ -5898,29 +6044,201 @@
     </w:p>
     <w:p>
       <w:pPr>
-        <w:jc w:val="both"/>
-        <w:rPr>
-          <w:lang w:val="en-NZ"/>
-        </w:rPr>
-      </w:pPr>
-      <w:r>
-        <w:rPr>
-          <w:lang w:val="en-NZ"/>
-        </w:rPr>
-        <w:t xml:space="preserve">The disadvantages of taking the group from the main room for observation were piling up. It was necessary to search for a TA and ask her to check on the group for the CE to be able to </w:t>
+        <w:rPr>
+          <w:lang w:val="en-NZ"/>
+        </w:rPr>
+      </w:pPr>
+      <w:r>
+        <w:rPr>
+          <w:lang w:val="en-NZ"/>
+        </w:rPr>
+        <w:t xml:space="preserve">The disadvantages of taking the group from the main room for observation were piling up. It was necessary to search for a TA and ask her to check on the group for the CE to be able to keep working, and then the group had to scramble from </w:t>
+      </w:r>
+      <w:r>
+        <w:rPr>
+          <w:lang w:val="en-NZ"/>
+        </w:rPr>
+        <w:t>the</w:t>
+      </w:r>
+      <w:r>
+        <w:rPr>
+          <w:lang w:val="en-NZ"/>
+        </w:rPr>
+        <w:t xml:space="preserve"> </w:t>
+      </w:r>
+      <w:r>
+        <w:rPr>
+          <w:lang w:val="en-NZ"/>
+        </w:rPr>
+        <w:t>place</w:t>
+      </w:r>
+      <w:r>
+        <w:rPr>
+          <w:lang w:val="en-NZ"/>
+        </w:rPr>
+        <w:t xml:space="preserve"> because a workshop had started and they had not heard the instruction.</w:t>
+      </w:r>
+    </w:p>
+    <w:p>
+      <w:pPr>
+        <w:rPr>
+          <w:lang w:val="en-NZ"/>
+        </w:rPr>
+      </w:pPr>
+      <w:r>
+        <w:rPr>
+          <w:lang w:val="en-NZ"/>
+        </w:rPr>
+        <w:t>During this situation if was possible to notice the second observation, the work done by the students was very individual. They were working together physically, often sharing comments, but in the end each one was concentrated in their one work. The CE need to clarify his doubts about the same poster all the others were working on because none of his teammates shared his role nor had a clear idea of what the CE needed to focus on for the poster.</w:t>
+      </w:r>
+      <w:r>
+        <w:rPr>
+          <w:lang w:val="en-NZ"/>
+        </w:rPr>
+        <w:t xml:space="preserve"> The only exception was the two QS students. They were constantly chatting to each other and sharing their screens to discuss what each of them had done, but then arrived at a different question: how different should be each of their works? They were the same role working on the same project and with the same information and decisions taken in group, how possible was to distinguish one poster from the other?</w:t>
+      </w:r>
+    </w:p>
+    <w:p>
+      <w:pPr>
+        <w:pStyle w:val="Heading2"/>
+        <w:rPr>
+          <w:sz w:val="24"/>
+          <w:szCs w:val="24"/>
+          <w:lang w:val="en-NZ"/>
+        </w:rPr>
+      </w:pPr>
+      <w:r>
+        <w:rPr>
+          <w:sz w:val="24"/>
+          <w:szCs w:val="24"/>
+          <w:lang w:val="en-NZ"/>
+        </w:rPr>
+        <w:t>6.4.3 Preliminary Analysis</w:t>
+      </w:r>
+    </w:p>
+    <w:p>
+      <w:pPr>
+        <w:rPr>
+          <w:lang w:val="en-NZ"/>
+        </w:rPr>
+      </w:pPr>
+      <w:r>
+        <w:rPr>
+          <w:lang w:val="en-NZ"/>
+        </w:rPr>
+        <w:t>The first four weeks of work were a period of contextualization and realization. Students were prepared to tackle a course that was known to be complex, and the first concern of many of them was to untangle the complexity and start working on the project as soon as possible.</w:t>
+      </w:r>
+    </w:p>
+    <w:p>
+      <w:pPr>
+        <w:rPr>
+          <w:lang w:val="en-NZ"/>
+        </w:rPr>
+      </w:pPr>
+      <w:r>
+        <w:rPr>
+          <w:lang w:val="en-NZ"/>
+        </w:rPr>
+        <w:t xml:space="preserve">The first issue for the students, one that the teaching staff had to quickly acknowledge, was accessibility to information, about the project and the deliverables. The information was present in the LMS but muddied and tangled in between links and tons of external material. </w:t>
+      </w:r>
+      <w:r>
+        <w:rPr>
+          <w:lang w:val="en-NZ"/>
+        </w:rPr>
+        <w:t>It required the students to organize themselves a lot around what was their plan, what information was missing and how to ask for that information. Activities like the QA sessions and the constant access to the TA staff helped the students to clarify quickly any doubts, and it was noticed during the interactions with Team B that going to the structure that WorkshopAR was proposing, especially for the assignation of goals and tasks</w:t>
+      </w:r>
+      <w:r>
+        <w:rPr>
+          <w:lang w:val="en-NZ"/>
+        </w:rPr>
+        <w:t xml:space="preserve">, helped to </w:t>
       </w:r>
       <w:r>
         <w:rPr>
           <w:lang w:val="en-NZ"/>
         </w:rPr>
         <w:lastRenderedPageBreak/>
-        <w:t xml:space="preserve">keep working, and then the group had to scramble from </w:t>
-      </w:r>
-      <w:r>
-        <w:rPr>
-          <w:lang w:val="en-NZ"/>
-        </w:rPr>
-        <w:t>the</w:t>
+        <w:t>promote and focus the discussion about those issues, not so much to organize those elements that the students were already aware of, but to highlight all the activities that still were unclear or had not been discussed enough. That was a very good behaviour observed promoted by the application and aligned with the learning design proposed.</w:t>
+      </w:r>
+    </w:p>
+    <w:p>
+      <w:pPr>
+        <w:rPr>
+          <w:lang w:val="en-NZ"/>
+        </w:rPr>
+      </w:pPr>
+      <w:r>
+        <w:rPr>
+          <w:lang w:val="en-NZ"/>
+        </w:rPr>
+        <w:t>It was a good introduction of the idea of WorkshopAR, the observation protocol needed polish and further adjustments, but that was also part of the objectives stablished for the first weeks, and it was good that major issued were identified early. The main functionality of WorkshopAR was understood by the students but its immediate value for the project was not really seen.</w:t>
+      </w:r>
+      <w:r>
+        <w:rPr>
+          <w:lang w:val="en-NZ"/>
+        </w:rPr>
+        <w:t xml:space="preserve"> The main point of comparison so far between the approach with WorkshopAR and any other observation is more related to how students were creating relationships by using the available technology. It was observed that most groups did not think too much at first about the in-person communication needed to work, and were first concerned to stablish points of communication asynchronous in nature (WhatsApp, Teams, Facebook). This was echoed by the direct responses of the students in the observations using WorkshopAR.</w:t>
+      </w:r>
+    </w:p>
+    <w:p>
+      <w:pPr>
+        <w:rPr>
+          <w:lang w:val="en-NZ"/>
+        </w:rPr>
+      </w:pPr>
+      <w:r>
+        <w:rPr>
+          <w:lang w:val="en-NZ"/>
+        </w:rPr>
+        <w:t xml:space="preserve">Students commented that they </w:t>
+      </w:r>
+      <w:r>
+        <w:rPr>
+          <w:lang w:val="en-NZ"/>
+        </w:rPr>
+        <w:t>prefer</w:t>
+      </w:r>
+      <w:r>
+        <w:rPr>
+          <w:lang w:val="en-NZ"/>
+        </w:rPr>
+        <w:t xml:space="preserve"> to first stablish a relation through social media and communication tech and then step </w:t>
+      </w:r>
+      <w:r>
+        <w:rPr>
+          <w:lang w:val="en-NZ"/>
+        </w:rPr>
+        <w:t>i</w:t>
+      </w:r>
+      <w:r>
+        <w:rPr>
+          <w:lang w:val="en-NZ"/>
+        </w:rPr>
+        <w:t xml:space="preserve">nto </w:t>
+      </w:r>
+      <w:r>
+        <w:rPr>
+          <w:lang w:val="en-NZ"/>
+        </w:rPr>
+        <w:t>face-to-face</w:t>
+      </w:r>
+      <w:r>
+        <w:rPr>
+          <w:lang w:val="en-NZ"/>
+        </w:rPr>
+        <w:t xml:space="preserve"> work </w:t>
+      </w:r>
+      <w:r>
+        <w:rPr>
+          <w:lang w:val="en-NZ"/>
+        </w:rPr>
+        <w:t>for more complex tasks</w:t>
+      </w:r>
+      <w:r>
+        <w:rPr>
+          <w:lang w:val="en-NZ"/>
+        </w:rPr>
+        <w:t>. A quick analysis of works like</w:t>
       </w:r>
       <w:r>
         <w:rPr>
@@ -5928,110 +6246,61 @@
         </w:rPr>
         <w:t xml:space="preserve"> </w:t>
       </w:r>
-      <w:r>
-        <w:rPr>
-          <w:lang w:val="en-NZ"/>
-        </w:rPr>
-        <w:t>place</w:t>
-      </w:r>
-      <w:r>
-        <w:rPr>
-          <w:lang w:val="en-NZ"/>
-        </w:rPr>
-        <w:t xml:space="preserve"> because a workshop had started and they had not heard the instruction.</w:t>
-      </w:r>
-    </w:p>
-    <w:p>
-      <w:pPr>
-        <w:rPr>
-          <w:lang w:val="en-NZ"/>
-        </w:rPr>
-      </w:pPr>
-      <w:r>
-        <w:rPr>
-          <w:lang w:val="en-NZ"/>
-        </w:rPr>
-        <w:t>During this situation if was possible to notice the second observation, the work done by the students was very individual. They were working together physically, often sharing comments, but in the end each one was concentrated in their one work. The CE need to clarify his doubts about the same poster all the others were working on because none of his teammates shared his role nor had a clear idea of what the CE needed to focus on for the poster.</w:t>
-      </w:r>
-      <w:r>
-        <w:rPr>
-          <w:lang w:val="en-NZ"/>
-        </w:rPr>
-        <w:t xml:space="preserve"> The only exception was the two QS students. They were constantly chatting to each other and sharing their screens to discuss what each of them had done, but then arrived at a different question: how different should be each of their works? They were the same role working on the same project and with the same information and decisions taken in group, how possible was to distinguish one poster from the other?</w:t>
-      </w:r>
-    </w:p>
-    <w:p>
-      <w:pPr>
-        <w:pStyle w:val="Ttulo2"/>
-        <w:rPr>
-          <w:sz w:val="24"/>
-          <w:szCs w:val="24"/>
-          <w:lang w:val="en-NZ"/>
-        </w:rPr>
-      </w:pPr>
-      <w:r>
-        <w:rPr>
-          <w:sz w:val="24"/>
-          <w:szCs w:val="24"/>
-          <w:lang w:val="en-NZ"/>
-        </w:rPr>
-        <w:t>6.4.3 Preliminary Analysis</w:t>
-      </w:r>
-    </w:p>
-    <w:p>
-      <w:pPr>
-        <w:rPr>
-          <w:lang w:val="en-NZ"/>
-        </w:rPr>
-      </w:pPr>
-      <w:r>
-        <w:rPr>
-          <w:lang w:val="en-NZ"/>
-        </w:rPr>
-        <w:t>The first four weeks of work were a period of contextualization and realization. Students were prepared to tackle a course that was known to be complex, and the first concern of many of them was to untangle the complexity and start working on the project as soon as possible.</w:t>
-      </w:r>
-    </w:p>
-    <w:p>
-      <w:pPr>
-        <w:rPr>
-          <w:lang w:val="en-NZ"/>
-        </w:rPr>
-      </w:pPr>
-      <w:r>
-        <w:rPr>
-          <w:lang w:val="en-NZ"/>
-        </w:rPr>
-        <w:t xml:space="preserve">The first issue for the students, one that the teaching staff had to quickly acknowledge, was accessibility to information, about the project and the deliverables. The information was present in the LMS but muddied and tangled in between links and tons of external material. </w:t>
-      </w:r>
-      <w:r>
-        <w:rPr>
-          <w:lang w:val="en-NZ"/>
-        </w:rPr>
-        <w:t>It required the students to organize themselves a lot around what was their plan, what information was missing and how to ask for that information. Activities like the QA sessions and the constant access to the TA staff helped the students to clarify quickly any doubts, and it was noticed during the interactions with Team B that going to the structure that WorkshopAR was proposing, especially for the assignation of goals and tasks</w:t>
-      </w:r>
-      <w:r>
-        <w:rPr>
-          <w:lang w:val="en-NZ"/>
-        </w:rPr>
-        <w:t>, helped to promote and focus the discussion about those issues, not so much to organize those elements that the students were already aware of, but to highlight all the activities that still were unclear or had not been discussed enough. That was a very good behaviour observed promoted by the application and aligned with the learning design proposed.</w:t>
-      </w:r>
-    </w:p>
-    <w:p>
-      <w:pPr>
-        <w:rPr>
-          <w:lang w:val="en-NZ"/>
-        </w:rPr>
-      </w:pPr>
-      <w:r>
-        <w:rPr>
-          <w:lang w:val="en-NZ"/>
-        </w:rPr>
-        <w:t>It was a good introduction of the idea of WorkshopAR, the observation protocol needed polish and further adjustments, but that was also part of the objectives stablished for the first weeks, and it was good that major issued were identified early. The main functionality of WorkshopAR was understood by the students but its immediate value for the project was not really seen. The following section will analyse the biggest blocks of observation with the students and how WorkshopAR found an interesting role in the work process of the groups that was not part of the initial design proposal.</w:t>
-      </w:r>
-    </w:p>
-    <w:p>
-      <w:pPr>
-        <w:pStyle w:val="Ttulo1"/>
+      <w:proofErr w:type="gramStart"/>
+      <w:r>
+        <w:rPr>
+          <w:lang w:val="en-NZ"/>
+        </w:rPr>
+        <w:t>An</w:t>
+      </w:r>
+      <w:proofErr w:type="gramEnd"/>
+      <w:r>
+        <w:rPr>
+          <w:lang w:val="en-NZ"/>
+        </w:rPr>
+        <w:t xml:space="preserve"> &amp; Frick</w:t>
+      </w:r>
+      <w:r>
+        <w:rPr>
+          <w:lang w:val="en-NZ"/>
+        </w:rPr>
+        <w:t xml:space="preserve"> (</w:t>
+      </w:r>
+      <w:r>
+        <w:rPr>
+          <w:lang w:val="en-NZ"/>
+        </w:rPr>
+        <w:t>2006)</w:t>
+      </w:r>
+      <w:r>
+        <w:rPr>
+          <w:lang w:val="en-NZ"/>
+        </w:rPr>
+        <w:t xml:space="preserve"> and Robinson &amp; Hans (2012) give some validity to this idea, showing that students prefer quick, simple communication via their preferred apps, but appreciated more face-to-face work for more complex work</w:t>
+      </w:r>
+      <w:r>
+        <w:rPr>
+          <w:lang w:val="en-NZ"/>
+        </w:rPr>
+        <w:t xml:space="preserve"> and the structure that WorkshopAR was proposing rather than communication and social interactions.</w:t>
+      </w:r>
+    </w:p>
+    <w:p>
+      <w:pPr>
+        <w:rPr>
+          <w:lang w:val="en-NZ"/>
+        </w:rPr>
+      </w:pPr>
+      <w:r>
+        <w:rPr>
+          <w:lang w:val="en-NZ"/>
+        </w:rPr>
+        <w:t>The following section will analyse the biggest blocks of observation with the students and how WorkshopAR found an interesting role in the work process of the groups that was not part of the initial design proposal.</w:t>
+      </w:r>
+    </w:p>
+    <w:p>
+      <w:pPr>
+        <w:pStyle w:val="Heading1"/>
         <w:rPr>
           <w:sz w:val="22"/>
           <w:szCs w:val="22"/>
@@ -6057,6 +6326,154 @@
         <w:rPr>
           <w:lang w:val="en-NZ"/>
         </w:rPr>
+        <w:t>The work done by the students all the way to week 9 was focused in one single activity: the first poster presentation. This activity was individual, each student had 5 min to present his poster to the teaching staff and peers in a general academical poster presentation setting. Nonetheless, there was a series of key point that required group coordination to fulfil and that were common to everyone:</w:t>
+      </w:r>
+    </w:p>
+    <w:p>
+      <w:pPr>
+        <w:pStyle w:val="ListParagraph"/>
+        <w:numPr>
+          <w:ilvl w:val="0"/>
+          <w:numId w:val="17"/>
+        </w:numPr>
+        <w:rPr>
+          <w:lang w:val="en-NZ"/>
+        </w:rPr>
+      </w:pPr>
+      <w:r>
+        <w:rPr>
+          <w:lang w:val="en-NZ"/>
+        </w:rPr>
+        <w:t xml:space="preserve">Each group was associated with the one of the three AE working on the course, which meant that each group had to work with one </w:t>
+      </w:r>
+      <w:r>
+        <w:rPr>
+          <w:lang w:val="en-NZ"/>
+        </w:rPr>
+        <w:t>of the design proposals created by the AE students.</w:t>
+      </w:r>
+    </w:p>
+    <w:p>
+      <w:pPr>
+        <w:pStyle w:val="ListParagraph"/>
+        <w:numPr>
+          <w:ilvl w:val="0"/>
+          <w:numId w:val="17"/>
+        </w:numPr>
+        <w:rPr>
+          <w:lang w:val="en-NZ"/>
+        </w:rPr>
+      </w:pPr>
+      <w:r>
+        <w:rPr>
+          <w:lang w:val="en-NZ"/>
+        </w:rPr>
+        <w:t>Each group had to take a communal decision of the main or signature material to be use for construction (timber, concrete, etc.) a base the construction project proposal on that decision.</w:t>
+      </w:r>
+    </w:p>
+    <w:p>
+      <w:pPr>
+        <w:pStyle w:val="ListParagraph"/>
+        <w:numPr>
+          <w:ilvl w:val="0"/>
+          <w:numId w:val="17"/>
+        </w:numPr>
+        <w:rPr>
+          <w:lang w:val="en-NZ"/>
+        </w:rPr>
+      </w:pPr>
+      <w:r>
+        <w:rPr>
+          <w:lang w:val="en-NZ"/>
+        </w:rPr>
+        <w:t>All groups had the same major topics that need to be present in the poster and that would be the main indicators of quality and progress: a design proposal, an analysis of the contextual factor of the project (legal, ecological and the community) and a preliminary analysis of costs.</w:t>
+      </w:r>
+    </w:p>
+    <w:p>
+      <w:pPr>
+        <w:rPr>
+          <w:lang w:val="en-NZ"/>
+        </w:rPr>
+      </w:pPr>
+      <w:r>
+        <w:rPr>
+          <w:lang w:val="en-NZ"/>
+        </w:rPr>
+        <w:t xml:space="preserve">To fulfil these criteria, information had to constantly flow from the AE, </w:t>
+      </w:r>
+      <w:r>
+        <w:rPr>
+          <w:lang w:val="en-NZ"/>
+        </w:rPr>
+        <w:t>who</w:t>
+      </w:r>
+      <w:r>
+        <w:rPr>
+          <w:lang w:val="en-NZ"/>
+        </w:rPr>
+        <w:t xml:space="preserve"> originally</w:t>
+      </w:r>
+      <w:r>
+        <w:rPr>
+          <w:lang w:val="en-NZ"/>
+        </w:rPr>
+        <w:t xml:space="preserve"> proposed the design, to the CE and QS who had to analyse the proposal and propose a </w:t>
+      </w:r>
+      <w:r>
+        <w:rPr>
+          <w:lang w:val="en-NZ"/>
+        </w:rPr>
+        <w:lastRenderedPageBreak/>
+        <w:t>construction plan, which often required going back to the AE to clarify elements about the design or to offer feedback about the feasibility or viability of some aspect of the design.</w:t>
+      </w:r>
+    </w:p>
+    <w:p>
+      <w:pPr>
+        <w:rPr>
+          <w:lang w:val="en-NZ"/>
+        </w:rPr>
+      </w:pPr>
+      <w:r>
+        <w:rPr>
+          <w:lang w:val="en-NZ"/>
+        </w:rPr>
+        <w:t>Managing this flow of information was the major challenge front he students at this stage, and constituted the biggest instance of collaborative work observed in the course. AE, CE and QS had clear goals, and once the issues of coordination and communication were solved, students could work steadily towards their own poster. CM, on the other hand, had a hard time understanding their role in the group, and what was expected of them in the poster.</w:t>
+      </w:r>
+    </w:p>
+    <w:p>
+      <w:pPr>
+        <w:rPr>
+          <w:lang w:val="en-NZ"/>
+        </w:rPr>
+      </w:pPr>
+      <w:r>
+        <w:rPr>
+          <w:lang w:val="en-NZ"/>
+        </w:rPr>
+        <w:t>The bulk of the observations for this section consisted in that: how different groups solved (or failed to solve)</w:t>
+      </w:r>
+      <w:r>
+        <w:rPr>
+          <w:lang w:val="en-NZ"/>
+        </w:rPr>
+        <w:t xml:space="preserve"> the information flow issues, how much they collaborated inside and outside the group to finish their individual work and how WorkshopAR was introduced to try and help in those steps.</w:t>
+      </w:r>
+    </w:p>
+    <w:p>
+      <w:pPr>
+        <w:pStyle w:val="Heading2"/>
+        <w:rPr>
+          <w:sz w:val="22"/>
+          <w:szCs w:val="22"/>
+          <w:lang w:val="en-NZ"/>
+        </w:rPr>
+      </w:pPr>
+      <w:r>
+        <w:rPr>
+          <w:sz w:val="22"/>
+          <w:szCs w:val="22"/>
+          <w:lang w:val="en-NZ"/>
+        </w:rPr>
         <w:t>6.5.1 General Observations</w:t>
       </w:r>
     </w:p>
@@ -6070,6 +6487,513 @@
         <w:rPr>
           <w:lang w:val="en-NZ"/>
         </w:rPr>
+        <w:t>By the beginning of week 5 it was already possible to start analysing the information reported by the students in the bi-weekly report. This activity also offered a good baseline to analyse the overall progress of the groups and common issues or circumstances affecting the groups.</w:t>
+      </w:r>
+      <w:r>
+        <w:rPr>
+          <w:lang w:val="en-NZ"/>
+        </w:rPr>
+        <w:t xml:space="preserve"> This activity was not marked, so it was not surprising that only some groups summited the report, with the number decreasing every passing week. The activity offered only a small sample of the work done in all groups and the data was probably skewed towards the groups diligent enough to submit the report, but it nonetheless managed to capture the two major states which was possible to find in the progress of a group:</w:t>
+      </w:r>
+    </w:p>
+    <w:p>
+      <w:pPr>
+        <w:pStyle w:val="ListParagraph"/>
+        <w:numPr>
+          <w:ilvl w:val="0"/>
+          <w:numId w:val="18"/>
+        </w:numPr>
+        <w:rPr>
+          <w:lang w:val="en-NZ"/>
+        </w:rPr>
+      </w:pPr>
+      <w:r>
+        <w:rPr>
+          <w:lang w:val="en-NZ"/>
+        </w:rPr>
+        <w:t>Groups that collected all the information needed and were reporting progress in different areas, often evidenced by a detailed cost proposal.</w:t>
+      </w:r>
+    </w:p>
+    <w:p>
+      <w:pPr>
+        <w:pStyle w:val="ListParagraph"/>
+        <w:numPr>
+          <w:ilvl w:val="0"/>
+          <w:numId w:val="18"/>
+        </w:numPr>
+        <w:rPr>
+          <w:lang w:val="en-NZ"/>
+        </w:rPr>
+      </w:pPr>
+      <w:r>
+        <w:rPr>
+          <w:lang w:val="en-NZ"/>
+        </w:rPr>
+        <w:t>Groups that had not been able to communicate well, and had not gathered enough information to show substantial progress.</w:t>
+      </w:r>
+    </w:p>
+    <w:p>
+      <w:pPr>
+        <w:rPr>
+          <w:lang w:val="en-NZ"/>
+        </w:rPr>
+      </w:pPr>
+      <w:r>
+        <w:rPr>
+          <w:lang w:val="en-NZ"/>
+        </w:rPr>
+        <w:t>Figure 6 shows a comparison between to bi-weekly repost, exemplifying these two observations. It also shows how some groups struggled to understand the idea of the value proposition, either not keeping it consistent through the different reports or by providing information that was not related to the value proposition, and that later was evidenced as a poor exposition of this element in the final design proposal.</w:t>
+      </w:r>
+    </w:p>
+    <w:p>
+      <w:pPr>
+        <w:keepNext/>
+        <w:jc w:val="center"/>
+        <w:rPr>
+          <w:lang w:val="en-NZ"/>
+        </w:rPr>
+      </w:pPr>
+      <w:r>
+        <w:rPr>
+          <w:noProof/>
+          <w:lang w:val="en-NZ"/>
+        </w:rPr>
+        <w:lastRenderedPageBreak/>
+        <w:drawing>
+          <wp:inline distT="0" distB="0" distL="0" distR="0" wp14:anchorId="063A7A8F" wp14:editId="212DD19B">
+            <wp:extent cx="2847975" cy="4047300"/>
+            <wp:effectExtent l="0" t="0" r="0" b="0"/>
+            <wp:docPr id="4" name="Picture 4"/>
+            <wp:cNvGraphicFramePr>
+              <a:graphicFrameLocks xmlns:a="http://schemas.openxmlformats.org/drawingml/2006/main" noChangeAspect="1"/>
+            </wp:cNvGraphicFramePr>
+            <a:graphic xmlns:a="http://schemas.openxmlformats.org/drawingml/2006/main">
+              <a:graphicData uri="http://schemas.openxmlformats.org/drawingml/2006/picture">
+                <pic:pic xmlns:pic="http://schemas.openxmlformats.org/drawingml/2006/picture">
+                  <pic:nvPicPr>
+                    <pic:cNvPr id="0" name="Picture 3"/>
+                    <pic:cNvPicPr>
+                      <a:picLocks noChangeAspect="1" noChangeArrowheads="1"/>
+                    </pic:cNvPicPr>
+                  </pic:nvPicPr>
+                  <pic:blipFill>
+                    <a:blip r:embed="rId10">
+                      <a:extLst>
+                        <a:ext uri="{28A0092B-C50C-407E-A947-70E740481C1C}">
+                          <a14:useLocalDpi xmlns:a14="http://schemas.microsoft.com/office/drawing/2010/main" val="0"/>
+                        </a:ext>
+                      </a:extLst>
+                    </a:blip>
+                    <a:srcRect/>
+                    <a:stretch>
+                      <a:fillRect/>
+                    </a:stretch>
+                  </pic:blipFill>
+                  <pic:spPr bwMode="auto">
+                    <a:xfrm>
+                      <a:off x="0" y="0"/>
+                      <a:ext cx="2858904" cy="4062831"/>
+                    </a:xfrm>
+                    <a:prstGeom prst="rect">
+                      <a:avLst/>
+                    </a:prstGeom>
+                    <a:noFill/>
+                    <a:ln>
+                      <a:noFill/>
+                    </a:ln>
+                  </pic:spPr>
+                </pic:pic>
+              </a:graphicData>
+            </a:graphic>
+          </wp:inline>
+        </w:drawing>
+      </w:r>
+      <w:r>
+        <w:rPr>
+          <w:lang w:val="en-NZ"/>
+        </w:rPr>
+        <w:t xml:space="preserve"> </w:t>
+      </w:r>
+      <w:r>
+        <w:rPr>
+          <w:noProof/>
+          <w:lang w:val="en-NZ"/>
+        </w:rPr>
+        <w:drawing>
+          <wp:inline distT="0" distB="0" distL="0" distR="0" wp14:anchorId="21651168" wp14:editId="491486E5">
+            <wp:extent cx="2726690" cy="4028252"/>
+            <wp:effectExtent l="0" t="0" r="0" b="0"/>
+            <wp:docPr id="5" name="Picture 5"/>
+            <wp:cNvGraphicFramePr>
+              <a:graphicFrameLocks xmlns:a="http://schemas.openxmlformats.org/drawingml/2006/main" noChangeAspect="1"/>
+            </wp:cNvGraphicFramePr>
+            <a:graphic xmlns:a="http://schemas.openxmlformats.org/drawingml/2006/main">
+              <a:graphicData uri="http://schemas.openxmlformats.org/drawingml/2006/picture">
+                <pic:pic xmlns:pic="http://schemas.openxmlformats.org/drawingml/2006/picture">
+                  <pic:nvPicPr>
+                    <pic:cNvPr id="0" name="Picture 5"/>
+                    <pic:cNvPicPr>
+                      <a:picLocks noChangeAspect="1" noChangeArrowheads="1"/>
+                    </pic:cNvPicPr>
+                  </pic:nvPicPr>
+                  <pic:blipFill>
+                    <a:blip r:embed="rId11" cstate="print">
+                      <a:extLst>
+                        <a:ext uri="{28A0092B-C50C-407E-A947-70E740481C1C}">
+                          <a14:useLocalDpi xmlns:a14="http://schemas.microsoft.com/office/drawing/2010/main" val="0"/>
+                        </a:ext>
+                      </a:extLst>
+                    </a:blip>
+                    <a:srcRect/>
+                    <a:stretch>
+                      <a:fillRect/>
+                    </a:stretch>
+                  </pic:blipFill>
+                  <pic:spPr bwMode="auto">
+                    <a:xfrm>
+                      <a:off x="0" y="0"/>
+                      <a:ext cx="2754492" cy="4069326"/>
+                    </a:xfrm>
+                    <a:prstGeom prst="rect">
+                      <a:avLst/>
+                    </a:prstGeom>
+                    <a:noFill/>
+                    <a:ln>
+                      <a:noFill/>
+                    </a:ln>
+                  </pic:spPr>
+                </pic:pic>
+              </a:graphicData>
+            </a:graphic>
+          </wp:inline>
+        </w:drawing>
+      </w:r>
+    </w:p>
+    <w:p>
+      <w:pPr>
+        <w:pStyle w:val="Caption"/>
+        <w:jc w:val="center"/>
+        <w:rPr>
+          <w:lang w:val="en-NZ"/>
+        </w:rPr>
+      </w:pPr>
+      <w:r>
+        <w:rPr>
+          <w:lang w:val="en-NZ"/>
+        </w:rPr>
+        <w:t xml:space="preserve">Figure </w:t>
+      </w:r>
+      <w:r>
+        <w:rPr>
+          <w:lang w:val="en-NZ"/>
+        </w:rPr>
+        <w:fldChar w:fldCharType="begin"/>
+      </w:r>
+      <w:r>
+        <w:rPr>
+          <w:lang w:val="en-NZ"/>
+        </w:rPr>
+        <w:instrText xml:space="preserve"> SEQ Figure \* ARABIC </w:instrText>
+      </w:r>
+      <w:r>
+        <w:rPr>
+          <w:lang w:val="en-NZ"/>
+        </w:rPr>
+        <w:fldChar w:fldCharType="separate"/>
+      </w:r>
+      <w:r>
+        <w:rPr>
+          <w:noProof/>
+          <w:lang w:val="en-NZ"/>
+        </w:rPr>
+        <w:t>6</w:t>
+      </w:r>
+      <w:r>
+        <w:rPr>
+          <w:lang w:val="en-NZ"/>
+        </w:rPr>
+        <w:fldChar w:fldCharType="end"/>
+      </w:r>
+      <w:r>
+        <w:rPr>
+          <w:lang w:val="en-NZ"/>
+        </w:rPr>
+        <w:t xml:space="preserve"> A Good (left) and Bad (right) example of a bi-weekly report</w:t>
+      </w:r>
+    </w:p>
+    <w:p>
+      <w:pPr>
+        <w:rPr>
+          <w:lang w:val="en-NZ"/>
+        </w:rPr>
+      </w:pPr>
+      <w:r>
+        <w:rPr>
+          <w:lang w:val="en-NZ"/>
+        </w:rPr>
+        <w:t xml:space="preserve">General observations </w:t>
+      </w:r>
+      <w:r>
+        <w:rPr>
+          <w:lang w:val="en-NZ"/>
+        </w:rPr>
+        <w:t xml:space="preserve">during the classroom time </w:t>
+      </w:r>
+      <w:r>
+        <w:rPr>
+          <w:lang w:val="en-NZ"/>
+        </w:rPr>
+        <w:t>also evidenced this division between groups, and it was not that easy to find a group that was in a more intermediate situation. The group either was reporting several issues with communication between the roles and lacking in substantial progress towards week 6, or had stablished a good dynamic between all the members of the group and were working towards finishing their poster and receiving early feedback of their work as will be shown in the following recounts.</w:t>
+      </w:r>
+    </w:p>
+    <w:p>
+      <w:pPr>
+        <w:pStyle w:val="Heading3"/>
+        <w:rPr>
+          <w:sz w:val="22"/>
+          <w:szCs w:val="22"/>
+          <w:lang w:val="en-NZ"/>
+        </w:rPr>
+      </w:pPr>
+      <w:r>
+        <w:rPr>
+          <w:sz w:val="22"/>
+          <w:szCs w:val="22"/>
+          <w:lang w:val="en-NZ"/>
+        </w:rPr>
+        <w:t>6.5.1.1 A Bad Example: Team C</w:t>
+      </w:r>
+    </w:p>
+    <w:p>
+      <w:pPr>
+        <w:rPr>
+          <w:lang w:val="en-NZ"/>
+        </w:rPr>
+      </w:pPr>
+      <w:r>
+        <w:rPr>
+          <w:lang w:val="en-NZ"/>
+        </w:rPr>
+        <w:t>During this session Team C was represented only by two people, bot in the role of QS. By their own assessment, they were having a lot of problems finishing their individual posters mainly because they had no concrete information that could be translated into a cost calculation (the main objective of the QS at this point). Their main objective for the day was to compare their work and advance in the creation of the poster.</w:t>
+      </w:r>
+    </w:p>
+    <w:p>
+      <w:pPr>
+        <w:rPr>
+          <w:lang w:val="en-NZ"/>
+        </w:rPr>
+      </w:pPr>
+      <w:r>
+        <w:rPr>
+          <w:lang w:val="en-NZ"/>
+        </w:rPr>
+        <w:t>When asked to elaborate a little bit more on why they though they were having so much problems completing their work, the answer was fast an</w:t>
+      </w:r>
+      <w:r>
+        <w:rPr>
+          <w:lang w:val="en-NZ"/>
+        </w:rPr>
+        <w:t>d</w:t>
+      </w:r>
+      <w:r>
+        <w:rPr>
+          <w:lang w:val="en-NZ"/>
+        </w:rPr>
+        <w:t xml:space="preserve"> clear: they had had very little contact with the rest of the team in the last weeks. They identified that the was little contact in class for working, the only time the group was all in the classroom being the very first session, and that the rest of the communication was done vi</w:t>
+      </w:r>
+      <w:r>
+        <w:rPr>
+          <w:lang w:val="en-NZ"/>
+        </w:rPr>
+        <w:t>a Teams. They described the communication as broken, because there was always missing information or a lot of uncertainty when asking anything through the group chat. Information was also always last minute, and they had seen each other having to wait with about gaining any progress because there was no response from one or more members of the team.</w:t>
+      </w:r>
+    </w:p>
+    <w:p>
+      <w:pPr>
+        <w:rPr>
+          <w:lang w:val="en-NZ"/>
+        </w:rPr>
+      </w:pPr>
+      <w:r>
+        <w:rPr>
+          <w:lang w:val="en-NZ"/>
+        </w:rPr>
+        <w:lastRenderedPageBreak/>
+        <w:t xml:space="preserve">Team C also showed an interesting behaviour that was likely a product of the communal space used for the open work sessions. Groups had a lot of interactions between each other, and information did not only flow vertically between the different roles, but also horizontally between the different groups. A work around that a lot of groups was using for the limited </w:t>
+      </w:r>
+      <w:r>
+        <w:rPr>
+          <w:lang w:val="en-NZ"/>
+        </w:rPr>
+        <w:t>access to the AE was to obtain information or get answers to common question from the roles of other groups who had already access that information or had figured out an answer to the problem that could be adapted or directly copied in another group. Since Team C had only two members present, they were working near another group and interacting mainly with their CE, since their own CE had never appeared in class and the students themselves reported to had never seen their CE in person.</w:t>
+      </w:r>
+    </w:p>
+    <w:p>
+      <w:pPr>
+        <w:rPr>
+          <w:lang w:val="en-NZ"/>
+        </w:rPr>
+      </w:pPr>
+      <w:r>
+        <w:rPr>
+          <w:lang w:val="en-NZ"/>
+        </w:rPr>
+        <w:t xml:space="preserve">The situation was not the best for the group, but the students had managed to use several workarounds to get the information needed and progress with their work. The structure of the project also allowed them to focus on their individual assignments </w:t>
+      </w:r>
+      <w:r>
+        <w:rPr>
+          <w:lang w:val="en-NZ"/>
+        </w:rPr>
+        <w:t>and</w:t>
+      </w:r>
+      <w:r>
+        <w:rPr>
+          <w:lang w:val="en-NZ"/>
+        </w:rPr>
+        <w:t xml:space="preserve"> don’t worry to much about the lack of group cohesion, to the point that they were not very concerned about the work of their teammates</w:t>
+      </w:r>
+      <w:r>
+        <w:rPr>
+          <w:lang w:val="en-NZ"/>
+        </w:rPr>
+        <w:t>. It was a situation that eliminated some of the stress for individual students but that ran in contradiction with the objective of the project-based approach.</w:t>
+      </w:r>
+    </w:p>
+    <w:p>
+      <w:pPr>
+        <w:pStyle w:val="Heading3"/>
+        <w:rPr>
+          <w:sz w:val="22"/>
+          <w:szCs w:val="22"/>
+          <w:lang w:val="en-NZ"/>
+        </w:rPr>
+      </w:pPr>
+      <w:r>
+        <w:rPr>
+          <w:sz w:val="22"/>
+          <w:szCs w:val="22"/>
+          <w:lang w:val="en-NZ"/>
+        </w:rPr>
+        <w:t>6.5.1.2 A Good Example: Team D</w:t>
+      </w:r>
+    </w:p>
+    <w:p>
+      <w:pPr>
+        <w:rPr>
+          <w:lang w:val="en-NZ"/>
+        </w:rPr>
+      </w:pPr>
+      <w:r>
+        <w:rPr>
+          <w:lang w:val="en-NZ"/>
+        </w:rPr>
+        <w:t>During the observation Team D was conformed by a CM, a QS, a CE and one of the AE was also directly working with them, since they have taken the opportunity to search him and work near him to clarify a lot of questions.</w:t>
+      </w:r>
+    </w:p>
+    <w:p>
+      <w:pPr>
+        <w:rPr>
+          <w:lang w:val="en-NZ"/>
+        </w:rPr>
+      </w:pPr>
+      <w:r>
+        <w:rPr>
+          <w:lang w:val="en-NZ"/>
+        </w:rPr>
+        <w:t xml:space="preserve">The CE was the most interested in working next to the AE, since he needed clarification about some of the technical aspects of the design, and ended up working more next to him rather than with his group. That did not mean that the rest of the group was not participating, it was possible to observe that every time the CE had some new </w:t>
+      </w:r>
+      <w:r>
+        <w:rPr>
+          <w:lang w:val="en-NZ"/>
+        </w:rPr>
+        <w:t>information</w:t>
+      </w:r>
+      <w:r>
+        <w:rPr>
+          <w:lang w:val="en-NZ"/>
+        </w:rPr>
+        <w:t xml:space="preserve">., the CM and the QS would compare notes, and if it were some </w:t>
+      </w:r>
+      <w:r>
+        <w:rPr>
+          <w:lang w:val="en-NZ"/>
+        </w:rPr>
+        <w:t>questions</w:t>
+      </w:r>
+      <w:r>
+        <w:rPr>
+          <w:lang w:val="en-NZ"/>
+        </w:rPr>
+        <w:t>, the CE would go back to the AE and would try to find a quick answer, then everyone would go back and work in their own laptops. Communication was short and to the point</w:t>
+      </w:r>
+      <w:r>
+        <w:rPr>
+          <w:lang w:val="en-NZ"/>
+        </w:rPr>
+        <w:t>, collaboration was actually minimal, but it was efficient, and the QS directly commented that she had finished the biggest portion of her work during that session.</w:t>
+      </w:r>
+    </w:p>
+    <w:p>
+      <w:pPr>
+        <w:rPr>
+          <w:lang w:val="en-NZ"/>
+        </w:rPr>
+      </w:pPr>
+      <w:r>
+        <w:rPr>
+          <w:lang w:val="en-NZ"/>
+        </w:rPr>
+        <w:t>The horizontal flow of information was also seen in here, the lecturers would encourage the students to use some of the tables in the room so that all Qs or all CM would tack with each other and could clarify doubts about the deliveries, since those were the roles that evidenced the biggest amounts of communication problems in the bi-weekly reports. The students did not used those tables that much, but it would be come to see students going from one group to another with their tables or laptops asking questions or interchanging information.</w:t>
+      </w:r>
+    </w:p>
+    <w:p>
+      <w:pPr>
+        <w:rPr>
+          <w:lang w:val="en-NZ"/>
+        </w:rPr>
+      </w:pPr>
+      <w:r>
+        <w:rPr>
+          <w:lang w:val="en-NZ"/>
+        </w:rPr>
+        <w:t>A final observation of note was on the tools used to share information and to produce the material needed for the project. Everyone had their own laptop or working tablet. It was simple not feasible to not have a digital device to use as a workstation during the session, and if someone arrived to the classroom just to quickly check with their group or to be present during the opening discussion with the lecturers, they would quickly leave the room to work by their own. This was evidenced by the discrepancy between the students at the end of the session and those who signed the initial assistance sheet.</w:t>
+      </w:r>
+    </w:p>
+    <w:p>
+      <w:pPr>
+        <w:rPr>
+          <w:lang w:val="en-NZ"/>
+        </w:rPr>
+      </w:pPr>
+      <w:r>
+        <w:rPr>
+          <w:lang w:val="en-NZ"/>
+        </w:rPr>
+        <w:t xml:space="preserve"> </w:t>
+      </w:r>
+    </w:p>
+    <w:p>
+      <w:pPr>
+        <w:rPr>
+          <w:lang w:val="en-NZ"/>
+        </w:rPr>
+      </w:pPr>
+    </w:p>
+    <w:p>
+      <w:pPr>
+        <w:pStyle w:val="Heading2"/>
+        <w:rPr>
+          <w:sz w:val="22"/>
+          <w:szCs w:val="22"/>
+          <w:lang w:val="en-NZ"/>
+        </w:rPr>
+      </w:pPr>
+      <w:r>
+        <w:rPr>
+          <w:sz w:val="22"/>
+          <w:szCs w:val="22"/>
+          <w:lang w:val="en-NZ"/>
+        </w:rPr>
         <w:t>6.5.2 Intervention with WorkshopAR</w:t>
       </w:r>
     </w:p>
@@ -6079,6 +7003,13 @@
           <w:lang w:val="en-NZ"/>
         </w:rPr>
       </w:pPr>
+    </w:p>
+    <w:p>
+      <w:pPr>
+        <w:rPr>
+          <w:lang w:val="en-NZ"/>
+        </w:rPr>
+      </w:pPr>
       <w:r>
         <w:rPr>
           <w:lang w:val="en-NZ"/>
@@ -6096,7 +7027,6 @@
         <w:rPr>
           <w:lang w:val="en-NZ"/>
         </w:rPr>
-        <w:lastRenderedPageBreak/>
         <w:t>6.6 Weeks 10 to 13: First Client Report</w:t>
       </w:r>
     </w:p>
@@ -6311,8 +7241,121 @@
 </file>
 
 <file path=word/numbering.xml><?xml version="1.0" encoding="utf-8"?>
-<w:numbering xmlns:wpc="http://schemas.microsoft.com/office/word/2010/wordprocessingCanvas" xmlns:cx="http://schemas.microsoft.com/office/drawing/2014/chartex" xmlns:cx1="http://schemas.microsoft.com/office/drawing/2015/9/8/chartex" xmlns:cx2="http://schemas.microsoft.com/office/drawing/2015/10/21/chartex" xmlns:cx3="http://schemas.microsoft.com/office/drawing/2016/5/9/chartex" xmlns:cx4="http://schemas.microsoft.com/office/drawing/2016/5/10/chartex" xmlns:cx5="http://schemas.microsoft.com/office/drawing/2016/5/11/chartex" xmlns:cx6="http://schemas.microsoft.com/office/drawing/2016/5/12/chartex" xmlns:cx7="http://schemas.microsoft.com/office/drawing/2016/5/13/chartex" xmlns:cx8="http://schemas.microsoft.com/office/drawing/2016/5/14/chartex" xmlns:mc="http://schemas.openxmlformats.org/markup-compatibility/2006" xmlns:aink="http://schemas.microsoft.com/office/drawing/2016/ink" xmlns:am3d="http://schemas.microsoft.com/office/drawing/2017/model3d" xmlns:o="urn:schemas-microsoft-com:office:office" xmlns:oel="http://schemas.microsoft.com/office/2019/extlst" xmlns:r="http://schemas.openxmlformats.org/officeDocument/2006/relationships" xmlns:m="http://schemas.openxmlformats.org/officeDocument/2006/math" xmlns:v="urn:schemas-microsoft-com:vml" xmlns:wp14="http://schemas.microsoft.com/office/word/2010/wordprocessingDrawing" xmlns:wp="http://schemas.openxmlformats.org/drawingml/2006/wordprocessingDrawing" xmlns:w10="urn:schemas-microsoft-com:office:word" xmlns:w="http://schemas.openxmlformats.org/wordprocessingml/2006/main" xmlns:w14="http://schemas.microsoft.com/office/word/2010/wordml" xmlns:w15="http://schemas.microsoft.com/office/word/2012/wordml" xmlns:w16cex="http://schemas.microsoft.com/office/word/2018/wordml/cex" xmlns:w16cid="http://schemas.microsoft.com/office/word/2016/wordml/cid" xmlns:w16="http://schemas.microsoft.com/office/word/2018/wordml" xmlns:w16du="http://schemas.microsoft.com/office/word/2023/wordml/word16du" xmlns:w16sdtdh="http://schemas.microsoft.com/office/word/2020/wordml/sdtdatahash" xmlns:w16sdtfl="http://schemas.microsoft.com/office/word/2024/wordml/sdtformatlock" xmlns:w16se="http://schemas.microsoft.com/office/word/2015/wordml/symex" xmlns:wpg="http://schemas.microsoft.com/office/word/2010/wordprocessingGroup" xmlns:wpi="http://schemas.microsoft.com/office/word/2010/wordprocessingInk" xmlns:wne="http://schemas.microsoft.com/office/word/2006/wordml" xmlns:wps="http://schemas.microsoft.com/office/word/2010/wordprocessingShape" mc:Ignorable="w14 w15 w16se w16cid w16 w16cex w16sdtdh w16sdtfl w16du wp14">
+<w:numbering xmlns:wpc="http://schemas.microsoft.com/office/word/2010/wordprocessingCanvas" xmlns:cx="http://schemas.microsoft.com/office/drawing/2014/chartex" xmlns:cx1="http://schemas.microsoft.com/office/drawing/2015/9/8/chartex" xmlns:cx2="http://schemas.microsoft.com/office/drawing/2015/10/21/chartex" xmlns:cx3="http://schemas.microsoft.com/office/drawing/2016/5/9/chartex" xmlns:cx4="http://schemas.microsoft.com/office/drawing/2016/5/10/chartex" xmlns:cx5="http://schemas.microsoft.com/office/drawing/2016/5/11/chartex" xmlns:cx6="http://schemas.microsoft.com/office/drawing/2016/5/12/chartex" xmlns:cx7="http://schemas.microsoft.com/office/drawing/2016/5/13/chartex" xmlns:cx8="http://schemas.microsoft.com/office/drawing/2016/5/14/chartex" xmlns:mc="http://schemas.openxmlformats.org/markup-compatibility/2006" xmlns:aink="http://schemas.microsoft.com/office/drawing/2016/ink" xmlns:am3d="http://schemas.microsoft.com/office/drawing/2017/model3d" xmlns:o="urn:schemas-microsoft-com:office:office" xmlns:r="http://schemas.openxmlformats.org/officeDocument/2006/relationships" xmlns:m="http://schemas.openxmlformats.org/officeDocument/2006/math" xmlns:v="urn:schemas-microsoft-com:vml" xmlns:wp14="http://schemas.microsoft.com/office/word/2010/wordprocessingDrawing" xmlns:wp="http://schemas.openxmlformats.org/drawingml/2006/wordprocessingDrawing" xmlns:w10="urn:schemas-microsoft-com:office:word" xmlns:w="http://schemas.openxmlformats.org/wordprocessingml/2006/main" xmlns:w14="http://schemas.microsoft.com/office/word/2010/wordml" xmlns:w15="http://schemas.microsoft.com/office/word/2012/wordml" xmlns:w16cex="http://schemas.microsoft.com/office/word/2018/wordml/cex" xmlns:w16cid="http://schemas.microsoft.com/office/word/2016/wordml/cid" xmlns:w16="http://schemas.microsoft.com/office/word/2018/wordml" xmlns:w16sdtdh="http://schemas.microsoft.com/office/word/2020/wordml/sdtdatahash" xmlns:w16se="http://schemas.microsoft.com/office/word/2015/wordml/symex" xmlns:wpg="http://schemas.microsoft.com/office/word/2010/wordprocessingGroup" xmlns:wpi="http://schemas.microsoft.com/office/word/2010/wordprocessingInk" xmlns:wne="http://schemas.microsoft.com/office/word/2006/wordml" xmlns:wps="http://schemas.microsoft.com/office/word/2010/wordprocessingShape" mc:Ignorable="w14 w15 w16se w16cid w16 w16cex w16sdtdh wp14">
   <w:abstractNum w:abstractNumId="0" w15:restartNumberingAfterBreak="0">
+    <w:nsid w:val="11D01384"/>
+    <w:multiLevelType w:val="hybridMultilevel"/>
+    <w:tmpl w:val="A22E6ECE"/>
+    <w:lvl w:ilvl="0" w:tplc="14090001">
+      <w:start w:val="1"/>
+      <w:numFmt w:val="bullet"/>
+      <w:lvlText w:val=""/>
+      <w:lvlJc w:val="left"/>
+      <w:pPr>
+        <w:ind w:left="720" w:hanging="360"/>
+      </w:pPr>
+      <w:rPr>
+        <w:rFonts w:ascii="Symbol" w:hAnsi="Symbol" w:hint="default"/>
+      </w:rPr>
+    </w:lvl>
+    <w:lvl w:ilvl="1" w:tplc="14090003" w:tentative="1">
+      <w:start w:val="1"/>
+      <w:numFmt w:val="bullet"/>
+      <w:lvlText w:val="o"/>
+      <w:lvlJc w:val="left"/>
+      <w:pPr>
+        <w:ind w:left="1440" w:hanging="360"/>
+      </w:pPr>
+      <w:rPr>
+        <w:rFonts w:ascii="Courier New" w:hAnsi="Courier New" w:cs="Courier New" w:hint="default"/>
+      </w:rPr>
+    </w:lvl>
+    <w:lvl w:ilvl="2" w:tplc="14090005" w:tentative="1">
+      <w:start w:val="1"/>
+      <w:numFmt w:val="bullet"/>
+      <w:lvlText w:val=""/>
+      <w:lvlJc w:val="left"/>
+      <w:pPr>
+        <w:ind w:left="2160" w:hanging="360"/>
+      </w:pPr>
+      <w:rPr>
+        <w:rFonts w:ascii="Wingdings" w:hAnsi="Wingdings" w:hint="default"/>
+      </w:rPr>
+    </w:lvl>
+    <w:lvl w:ilvl="3" w:tplc="14090001" w:tentative="1">
+      <w:start w:val="1"/>
+      <w:numFmt w:val="bullet"/>
+      <w:lvlText w:val=""/>
+      <w:lvlJc w:val="left"/>
+      <w:pPr>
+        <w:ind w:left="2880" w:hanging="360"/>
+      </w:pPr>
+      <w:rPr>
+        <w:rFonts w:ascii="Symbol" w:hAnsi="Symbol" w:hint="default"/>
+      </w:rPr>
+    </w:lvl>
+    <w:lvl w:ilvl="4" w:tplc="14090003" w:tentative="1">
+      <w:start w:val="1"/>
+      <w:numFmt w:val="bullet"/>
+      <w:lvlText w:val="o"/>
+      <w:lvlJc w:val="left"/>
+      <w:pPr>
+        <w:ind w:left="3600" w:hanging="360"/>
+      </w:pPr>
+      <w:rPr>
+        <w:rFonts w:ascii="Courier New" w:hAnsi="Courier New" w:cs="Courier New" w:hint="default"/>
+      </w:rPr>
+    </w:lvl>
+    <w:lvl w:ilvl="5" w:tplc="14090005" w:tentative="1">
+      <w:start w:val="1"/>
+      <w:numFmt w:val="bullet"/>
+      <w:lvlText w:val=""/>
+      <w:lvlJc w:val="left"/>
+      <w:pPr>
+        <w:ind w:left="4320" w:hanging="360"/>
+      </w:pPr>
+      <w:rPr>
+        <w:rFonts w:ascii="Wingdings" w:hAnsi="Wingdings" w:hint="default"/>
+      </w:rPr>
+    </w:lvl>
+    <w:lvl w:ilvl="6" w:tplc="14090001" w:tentative="1">
+      <w:start w:val="1"/>
+      <w:numFmt w:val="bullet"/>
+      <w:lvlText w:val=""/>
+      <w:lvlJc w:val="left"/>
+      <w:pPr>
+        <w:ind w:left="5040" w:hanging="360"/>
+      </w:pPr>
+      <w:rPr>
+        <w:rFonts w:ascii="Symbol" w:hAnsi="Symbol" w:hint="default"/>
+      </w:rPr>
+    </w:lvl>
+    <w:lvl w:ilvl="7" w:tplc="14090003" w:tentative="1">
+      <w:start w:val="1"/>
+      <w:numFmt w:val="bullet"/>
+      <w:lvlText w:val="o"/>
+      <w:lvlJc w:val="left"/>
+      <w:pPr>
+        <w:ind w:left="5760" w:hanging="360"/>
+      </w:pPr>
+      <w:rPr>
+        <w:rFonts w:ascii="Courier New" w:hAnsi="Courier New" w:cs="Courier New" w:hint="default"/>
+      </w:rPr>
+    </w:lvl>
+    <w:lvl w:ilvl="8" w:tplc="14090005" w:tentative="1">
+      <w:start w:val="1"/>
+      <w:numFmt w:val="bullet"/>
+      <w:lvlText w:val=""/>
+      <w:lvlJc w:val="left"/>
+      <w:pPr>
+        <w:ind w:left="6480" w:hanging="360"/>
+      </w:pPr>
+      <w:rPr>
+        <w:rFonts w:ascii="Wingdings" w:hAnsi="Wingdings" w:hint="default"/>
+      </w:rPr>
+    </w:lvl>
+  </w:abstractNum>
+  <w:abstractNum w:abstractNumId="1" w15:restartNumberingAfterBreak="0">
     <w:nsid w:val="164346F4"/>
     <w:multiLevelType w:val="hybridMultilevel"/>
     <w:tmpl w:val="6E0C3D10"/>
@@ -6425,7 +7468,7 @@
       </w:rPr>
     </w:lvl>
   </w:abstractNum>
-  <w:abstractNum w:abstractNumId="1" w15:restartNumberingAfterBreak="0">
+  <w:abstractNum w:abstractNumId="2" w15:restartNumberingAfterBreak="0">
     <w:nsid w:val="1D1F74FC"/>
     <w:multiLevelType w:val="hybridMultilevel"/>
     <w:tmpl w:val="6FC0A9D0"/>
@@ -6538,7 +7581,7 @@
       </w:rPr>
     </w:lvl>
   </w:abstractNum>
-  <w:abstractNum w:abstractNumId="2" w15:restartNumberingAfterBreak="0">
+  <w:abstractNum w:abstractNumId="3" w15:restartNumberingAfterBreak="0">
     <w:nsid w:val="354F4453"/>
     <w:multiLevelType w:val="hybridMultilevel"/>
     <w:tmpl w:val="E474EDD4"/>
@@ -6651,7 +7694,7 @@
       </w:rPr>
     </w:lvl>
   </w:abstractNum>
-  <w:abstractNum w:abstractNumId="3" w15:restartNumberingAfterBreak="0">
+  <w:abstractNum w:abstractNumId="4" w15:restartNumberingAfterBreak="0">
     <w:nsid w:val="36720225"/>
     <w:multiLevelType w:val="hybridMultilevel"/>
     <w:tmpl w:val="E5CEAEC4"/>
@@ -6764,7 +7807,7 @@
       </w:rPr>
     </w:lvl>
   </w:abstractNum>
-  <w:abstractNum w:abstractNumId="4" w15:restartNumberingAfterBreak="0">
+  <w:abstractNum w:abstractNumId="5" w15:restartNumberingAfterBreak="0">
     <w:nsid w:val="457D7F16"/>
     <w:multiLevelType w:val="hybridMultilevel"/>
     <w:tmpl w:val="9A7AC840"/>
@@ -6877,7 +7920,7 @@
       </w:rPr>
     </w:lvl>
   </w:abstractNum>
-  <w:abstractNum w:abstractNumId="5" w15:restartNumberingAfterBreak="0">
+  <w:abstractNum w:abstractNumId="6" w15:restartNumberingAfterBreak="0">
     <w:nsid w:val="4AD5040C"/>
     <w:multiLevelType w:val="hybridMultilevel"/>
     <w:tmpl w:val="C6FC44A6"/>
@@ -6990,7 +8033,7 @@
       </w:rPr>
     </w:lvl>
   </w:abstractNum>
-  <w:abstractNum w:abstractNumId="6" w15:restartNumberingAfterBreak="0">
+  <w:abstractNum w:abstractNumId="7" w15:restartNumberingAfterBreak="0">
     <w:nsid w:val="513B7EA1"/>
     <w:multiLevelType w:val="hybridMultilevel"/>
     <w:tmpl w:val="6B5C4A68"/>
@@ -7103,7 +8146,7 @@
       </w:rPr>
     </w:lvl>
   </w:abstractNum>
-  <w:abstractNum w:abstractNumId="7" w15:restartNumberingAfterBreak="0">
+  <w:abstractNum w:abstractNumId="8" w15:restartNumberingAfterBreak="0">
     <w:nsid w:val="58B14600"/>
     <w:multiLevelType w:val="hybridMultilevel"/>
     <w:tmpl w:val="433A6502"/>
@@ -7216,7 +8259,7 @@
       </w:rPr>
     </w:lvl>
   </w:abstractNum>
-  <w:abstractNum w:abstractNumId="8" w15:restartNumberingAfterBreak="0">
+  <w:abstractNum w:abstractNumId="9" w15:restartNumberingAfterBreak="0">
     <w:nsid w:val="5F436901"/>
     <w:multiLevelType w:val="hybridMultilevel"/>
     <w:tmpl w:val="4DE48B7C"/>
@@ -7329,7 +8372,7 @@
       </w:rPr>
     </w:lvl>
   </w:abstractNum>
-  <w:abstractNum w:abstractNumId="9" w15:restartNumberingAfterBreak="0">
+  <w:abstractNum w:abstractNumId="10" w15:restartNumberingAfterBreak="0">
     <w:nsid w:val="6B48065D"/>
     <w:multiLevelType w:val="hybridMultilevel"/>
     <w:tmpl w:val="9566E192"/>
@@ -7442,7 +8485,7 @@
       </w:rPr>
     </w:lvl>
   </w:abstractNum>
-  <w:abstractNum w:abstractNumId="10" w15:restartNumberingAfterBreak="0">
+  <w:abstractNum w:abstractNumId="11" w15:restartNumberingAfterBreak="0">
     <w:nsid w:val="6F1C43A0"/>
     <w:multiLevelType w:val="hybridMultilevel"/>
     <w:tmpl w:val="239205CC"/>
@@ -7555,7 +8598,7 @@
       </w:rPr>
     </w:lvl>
   </w:abstractNum>
-  <w:abstractNum w:abstractNumId="11" w15:restartNumberingAfterBreak="0">
+  <w:abstractNum w:abstractNumId="12" w15:restartNumberingAfterBreak="0">
     <w:nsid w:val="719B15A0"/>
     <w:multiLevelType w:val="hybridMultilevel"/>
     <w:tmpl w:val="8B6A06FC"/>
@@ -7668,7 +8711,7 @@
       </w:rPr>
     </w:lvl>
   </w:abstractNum>
-  <w:abstractNum w:abstractNumId="12" w15:restartNumberingAfterBreak="0">
+  <w:abstractNum w:abstractNumId="13" w15:restartNumberingAfterBreak="0">
     <w:nsid w:val="7760001C"/>
     <w:multiLevelType w:val="hybridMultilevel"/>
     <w:tmpl w:val="DA00D140"/>
@@ -7781,7 +8824,120 @@
       </w:rPr>
     </w:lvl>
   </w:abstractNum>
-  <w:abstractNum w:abstractNumId="13" w15:restartNumberingAfterBreak="0">
+  <w:abstractNum w:abstractNumId="14" w15:restartNumberingAfterBreak="0">
+    <w:nsid w:val="79EA563B"/>
+    <w:multiLevelType w:val="hybridMultilevel"/>
+    <w:tmpl w:val="CA0EF45A"/>
+    <w:lvl w:ilvl="0" w:tplc="14090001">
+      <w:start w:val="1"/>
+      <w:numFmt w:val="bullet"/>
+      <w:lvlText w:val=""/>
+      <w:lvlJc w:val="left"/>
+      <w:pPr>
+        <w:ind w:left="720" w:hanging="360"/>
+      </w:pPr>
+      <w:rPr>
+        <w:rFonts w:ascii="Symbol" w:hAnsi="Symbol" w:hint="default"/>
+      </w:rPr>
+    </w:lvl>
+    <w:lvl w:ilvl="1" w:tplc="14090003" w:tentative="1">
+      <w:start w:val="1"/>
+      <w:numFmt w:val="bullet"/>
+      <w:lvlText w:val="o"/>
+      <w:lvlJc w:val="left"/>
+      <w:pPr>
+        <w:ind w:left="1440" w:hanging="360"/>
+      </w:pPr>
+      <w:rPr>
+        <w:rFonts w:ascii="Courier New" w:hAnsi="Courier New" w:cs="Courier New" w:hint="default"/>
+      </w:rPr>
+    </w:lvl>
+    <w:lvl w:ilvl="2" w:tplc="14090005" w:tentative="1">
+      <w:start w:val="1"/>
+      <w:numFmt w:val="bullet"/>
+      <w:lvlText w:val=""/>
+      <w:lvlJc w:val="left"/>
+      <w:pPr>
+        <w:ind w:left="2160" w:hanging="360"/>
+      </w:pPr>
+      <w:rPr>
+        <w:rFonts w:ascii="Wingdings" w:hAnsi="Wingdings" w:hint="default"/>
+      </w:rPr>
+    </w:lvl>
+    <w:lvl w:ilvl="3" w:tplc="14090001" w:tentative="1">
+      <w:start w:val="1"/>
+      <w:numFmt w:val="bullet"/>
+      <w:lvlText w:val=""/>
+      <w:lvlJc w:val="left"/>
+      <w:pPr>
+        <w:ind w:left="2880" w:hanging="360"/>
+      </w:pPr>
+      <w:rPr>
+        <w:rFonts w:ascii="Symbol" w:hAnsi="Symbol" w:hint="default"/>
+      </w:rPr>
+    </w:lvl>
+    <w:lvl w:ilvl="4" w:tplc="14090003" w:tentative="1">
+      <w:start w:val="1"/>
+      <w:numFmt w:val="bullet"/>
+      <w:lvlText w:val="o"/>
+      <w:lvlJc w:val="left"/>
+      <w:pPr>
+        <w:ind w:left="3600" w:hanging="360"/>
+      </w:pPr>
+      <w:rPr>
+        <w:rFonts w:ascii="Courier New" w:hAnsi="Courier New" w:cs="Courier New" w:hint="default"/>
+      </w:rPr>
+    </w:lvl>
+    <w:lvl w:ilvl="5" w:tplc="14090005" w:tentative="1">
+      <w:start w:val="1"/>
+      <w:numFmt w:val="bullet"/>
+      <w:lvlText w:val=""/>
+      <w:lvlJc w:val="left"/>
+      <w:pPr>
+        <w:ind w:left="4320" w:hanging="360"/>
+      </w:pPr>
+      <w:rPr>
+        <w:rFonts w:ascii="Wingdings" w:hAnsi="Wingdings" w:hint="default"/>
+      </w:rPr>
+    </w:lvl>
+    <w:lvl w:ilvl="6" w:tplc="14090001" w:tentative="1">
+      <w:start w:val="1"/>
+      <w:numFmt w:val="bullet"/>
+      <w:lvlText w:val=""/>
+      <w:lvlJc w:val="left"/>
+      <w:pPr>
+        <w:ind w:left="5040" w:hanging="360"/>
+      </w:pPr>
+      <w:rPr>
+        <w:rFonts w:ascii="Symbol" w:hAnsi="Symbol" w:hint="default"/>
+      </w:rPr>
+    </w:lvl>
+    <w:lvl w:ilvl="7" w:tplc="14090003" w:tentative="1">
+      <w:start w:val="1"/>
+      <w:numFmt w:val="bullet"/>
+      <w:lvlText w:val="o"/>
+      <w:lvlJc w:val="left"/>
+      <w:pPr>
+        <w:ind w:left="5760" w:hanging="360"/>
+      </w:pPr>
+      <w:rPr>
+        <w:rFonts w:ascii="Courier New" w:hAnsi="Courier New" w:cs="Courier New" w:hint="default"/>
+      </w:rPr>
+    </w:lvl>
+    <w:lvl w:ilvl="8" w:tplc="14090005" w:tentative="1">
+      <w:start w:val="1"/>
+      <w:numFmt w:val="bullet"/>
+      <w:lvlText w:val=""/>
+      <w:lvlJc w:val="left"/>
+      <w:pPr>
+        <w:ind w:left="6480" w:hanging="360"/>
+      </w:pPr>
+      <w:rPr>
+        <w:rFonts w:ascii="Wingdings" w:hAnsi="Wingdings" w:hint="default"/>
+      </w:rPr>
+    </w:lvl>
+  </w:abstractNum>
+  <w:abstractNum w:abstractNumId="15" w15:restartNumberingAfterBreak="0">
     <w:nsid w:val="7A944C52"/>
     <w:multiLevelType w:val="hybridMultilevel"/>
     <w:tmpl w:val="4DF8A4A6"/>
@@ -7894,7 +9050,7 @@
       </w:rPr>
     </w:lvl>
   </w:abstractNum>
-  <w:abstractNum w:abstractNumId="14" w15:restartNumberingAfterBreak="0">
+  <w:abstractNum w:abstractNumId="16" w15:restartNumberingAfterBreak="0">
     <w:nsid w:val="7BCE6F6B"/>
     <w:multiLevelType w:val="hybridMultilevel"/>
     <w:tmpl w:val="570004FA"/>
@@ -7980,7 +9136,7 @@
       </w:pPr>
     </w:lvl>
   </w:abstractNum>
-  <w:abstractNum w:abstractNumId="15" w15:restartNumberingAfterBreak="0">
+  <w:abstractNum w:abstractNumId="17" w15:restartNumberingAfterBreak="0">
     <w:nsid w:val="7E3A58EC"/>
     <w:multiLevelType w:val="hybridMultilevel"/>
     <w:tmpl w:val="22AEB536"/>
@@ -8066,59 +9222,65 @@
       </w:pPr>
     </w:lvl>
   </w:abstractNum>
-  <w:num w:numId="1" w16cid:durableId="2052995577">
+  <w:num w:numId="1">
+    <w:abstractNumId w:val="8"/>
+  </w:num>
+  <w:num w:numId="2">
     <w:abstractNumId w:val="7"/>
   </w:num>
-  <w:num w:numId="2" w16cid:durableId="1068961126">
+  <w:num w:numId="3">
+    <w:abstractNumId w:val="11"/>
+  </w:num>
+  <w:num w:numId="4">
+    <w:abstractNumId w:val="13"/>
+  </w:num>
+  <w:num w:numId="5">
+    <w:abstractNumId w:val="12"/>
+  </w:num>
+  <w:num w:numId="6">
+    <w:abstractNumId w:val="1"/>
+  </w:num>
+  <w:num w:numId="7">
+    <w:abstractNumId w:val="9"/>
+  </w:num>
+  <w:num w:numId="8">
+    <w:abstractNumId w:val="4"/>
+  </w:num>
+  <w:num w:numId="9">
+    <w:abstractNumId w:val="15"/>
+  </w:num>
+  <w:num w:numId="10">
+    <w:abstractNumId w:val="10"/>
+  </w:num>
+  <w:num w:numId="11">
+    <w:abstractNumId w:val="16"/>
+  </w:num>
+  <w:num w:numId="12">
+    <w:abstractNumId w:val="2"/>
+  </w:num>
+  <w:num w:numId="13">
+    <w:abstractNumId w:val="3"/>
+  </w:num>
+  <w:num w:numId="14">
+    <w:abstractNumId w:val="5"/>
+  </w:num>
+  <w:num w:numId="15">
+    <w:abstractNumId w:val="17"/>
+  </w:num>
+  <w:num w:numId="16">
     <w:abstractNumId w:val="6"/>
   </w:num>
-  <w:num w:numId="3" w16cid:durableId="911352854">
-    <w:abstractNumId w:val="10"/>
-  </w:num>
-  <w:num w:numId="4" w16cid:durableId="315378784">
-    <w:abstractNumId w:val="12"/>
-  </w:num>
-  <w:num w:numId="5" w16cid:durableId="1158306522">
-    <w:abstractNumId w:val="11"/>
-  </w:num>
-  <w:num w:numId="6" w16cid:durableId="1288773938">
+  <w:num w:numId="17">
     <w:abstractNumId w:val="0"/>
   </w:num>
-  <w:num w:numId="7" w16cid:durableId="1241210122">
-    <w:abstractNumId w:val="8"/>
-  </w:num>
-  <w:num w:numId="8" w16cid:durableId="1337925516">
-    <w:abstractNumId w:val="3"/>
-  </w:num>
-  <w:num w:numId="9" w16cid:durableId="44373224">
-    <w:abstractNumId w:val="13"/>
-  </w:num>
-  <w:num w:numId="10" w16cid:durableId="631861241">
-    <w:abstractNumId w:val="9"/>
-  </w:num>
-  <w:num w:numId="11" w16cid:durableId="642809573">
+  <w:num w:numId="18">
     <w:abstractNumId w:val="14"/>
-  </w:num>
-  <w:num w:numId="12" w16cid:durableId="24183261">
-    <w:abstractNumId w:val="1"/>
-  </w:num>
-  <w:num w:numId="13" w16cid:durableId="1918586058">
-    <w:abstractNumId w:val="2"/>
-  </w:num>
-  <w:num w:numId="14" w16cid:durableId="1825195601">
-    <w:abstractNumId w:val="4"/>
-  </w:num>
-  <w:num w:numId="15" w16cid:durableId="836650204">
-    <w:abstractNumId w:val="15"/>
-  </w:num>
-  <w:num w:numId="16" w16cid:durableId="1536699666">
-    <w:abstractNumId w:val="5"/>
   </w:num>
 </w:numbering>
 </file>
 
 <file path=word/styles.xml><?xml version="1.0" encoding="utf-8"?>
-<w:styles xmlns:mc="http://schemas.openxmlformats.org/markup-compatibility/2006" xmlns:r="http://schemas.openxmlformats.org/officeDocument/2006/relationships" xmlns:w="http://schemas.openxmlformats.org/wordprocessingml/2006/main" xmlns:w14="http://schemas.microsoft.com/office/word/2010/wordml" xmlns:w15="http://schemas.microsoft.com/office/word/2012/wordml" xmlns:w16cex="http://schemas.microsoft.com/office/word/2018/wordml/cex" xmlns:w16cid="http://schemas.microsoft.com/office/word/2016/wordml/cid" xmlns:w16="http://schemas.microsoft.com/office/word/2018/wordml" xmlns:w16du="http://schemas.microsoft.com/office/word/2023/wordml/word16du" xmlns:w16sdtdh="http://schemas.microsoft.com/office/word/2020/wordml/sdtdatahash" xmlns:w16sdtfl="http://schemas.microsoft.com/office/word/2024/wordml/sdtformatlock" xmlns:w16se="http://schemas.microsoft.com/office/word/2015/wordml/symex" mc:Ignorable="w14 w15 w16se w16cid w16 w16cex w16sdtdh w16sdtfl w16du">
+<w:styles xmlns:mc="http://schemas.openxmlformats.org/markup-compatibility/2006" xmlns:r="http://schemas.openxmlformats.org/officeDocument/2006/relationships" xmlns:w="http://schemas.openxmlformats.org/wordprocessingml/2006/main" xmlns:w14="http://schemas.microsoft.com/office/word/2010/wordml" xmlns:w15="http://schemas.microsoft.com/office/word/2012/wordml" xmlns:w16cex="http://schemas.microsoft.com/office/word/2018/wordml/cex" xmlns:w16cid="http://schemas.microsoft.com/office/word/2016/wordml/cid" xmlns:w16="http://schemas.microsoft.com/office/word/2018/wordml" xmlns:w16sdtdh="http://schemas.microsoft.com/office/word/2020/wordml/sdtdatahash" xmlns:w16se="http://schemas.microsoft.com/office/word/2015/wordml/symex" mc:Ignorable="w14 w15 w16se w16cid w16 w16cex w16sdtdh">
   <w:docDefaults>
     <w:rPrDefault>
       <w:rPr>
@@ -8516,7 +9678,7 @@
     <w:name w:val="Normal"/>
     <w:qFormat/>
   </w:style>
-  <w:style w:type="paragraph" w:styleId="Ttulo1">
+  <w:style w:type="paragraph" w:styleId="Heading1">
     <w:name w:val="heading 1"/>
     <w:basedOn w:val="Normal"/>
     <w:next w:val="Normal"/>
@@ -8533,7 +9695,7 @@
       <w:szCs w:val="40"/>
     </w:rPr>
   </w:style>
-  <w:style w:type="paragraph" w:styleId="Ttulo2">
+  <w:style w:type="paragraph" w:styleId="Heading2">
     <w:name w:val="heading 2"/>
     <w:basedOn w:val="Normal"/>
     <w:next w:val="Normal"/>
@@ -8551,7 +9713,7 @@
       <w:szCs w:val="32"/>
     </w:rPr>
   </w:style>
-  <w:style w:type="paragraph" w:styleId="Ttulo3">
+  <w:style w:type="paragraph" w:styleId="Heading3">
     <w:name w:val="heading 3"/>
     <w:basedOn w:val="Normal"/>
     <w:next w:val="Normal"/>
@@ -8570,7 +9732,7 @@
       <w:szCs w:val="28"/>
     </w:rPr>
   </w:style>
-  <w:style w:type="paragraph" w:styleId="Ttulo4">
+  <w:style w:type="paragraph" w:styleId="Heading4">
     <w:name w:val="heading 4"/>
     <w:basedOn w:val="Normal"/>
     <w:next w:val="Normal"/>
@@ -8590,7 +9752,7 @@
       <w:szCs w:val="24"/>
     </w:rPr>
   </w:style>
-  <w:style w:type="paragraph" w:styleId="Ttulo5">
+  <w:style w:type="paragraph" w:styleId="Heading5">
     <w:name w:val="heading 5"/>
     <w:basedOn w:val="Normal"/>
     <w:next w:val="Normal"/>
@@ -8608,7 +9770,7 @@
       <w:color w:val="666666"/>
     </w:rPr>
   </w:style>
-  <w:style w:type="paragraph" w:styleId="Ttulo6">
+  <w:style w:type="paragraph" w:styleId="Heading6">
     <w:name w:val="heading 6"/>
     <w:basedOn w:val="Normal"/>
     <w:next w:val="Normal"/>
@@ -8627,13 +9789,13 @@
       <w:color w:val="666666"/>
     </w:rPr>
   </w:style>
-  <w:style w:type="character" w:default="1" w:styleId="Fuentedeprrafopredeter">
+  <w:style w:type="character" w:default="1" w:styleId="DefaultParagraphFont">
     <w:name w:val="Default Paragraph Font"/>
     <w:uiPriority w:val="1"/>
     <w:semiHidden/>
     <w:unhideWhenUsed/>
   </w:style>
-  <w:style w:type="table" w:default="1" w:styleId="Tablanormal">
+  <w:style w:type="table" w:default="1" w:styleId="TableNormal">
     <w:name w:val="Normal Table"/>
     <w:uiPriority w:val="99"/>
     <w:semiHidden/>
@@ -8648,13 +9810,13 @@
       </w:tblCellMar>
     </w:tblPr>
   </w:style>
-  <w:style w:type="numbering" w:default="1" w:styleId="Sinlista">
+  <w:style w:type="numbering" w:default="1" w:styleId="NoList">
     <w:name w:val="No List"/>
     <w:uiPriority w:val="99"/>
     <w:semiHidden/>
     <w:unhideWhenUsed/>
   </w:style>
-  <w:style w:type="paragraph" w:styleId="Ttulo">
+  <w:style w:type="paragraph" w:styleId="Title">
     <w:name w:val="Title"/>
     <w:basedOn w:val="Normal"/>
     <w:next w:val="Normal"/>
@@ -8670,7 +9832,7 @@
       <w:szCs w:val="52"/>
     </w:rPr>
   </w:style>
-  <w:style w:type="paragraph" w:styleId="Subttulo">
+  <w:style w:type="paragraph" w:styleId="Subtitle">
     <w:name w:val="Subtitle"/>
     <w:basedOn w:val="Normal"/>
     <w:next w:val="Normal"/>
@@ -8687,7 +9849,7 @@
       <w:szCs w:val="30"/>
     </w:rPr>
   </w:style>
-  <w:style w:type="paragraph" w:styleId="Prrafodelista">
+  <w:style w:type="paragraph" w:styleId="ListParagraph">
     <w:name w:val="List Paragraph"/>
     <w:basedOn w:val="Normal"/>
     <w:uiPriority w:val="34"/>
@@ -8698,7 +9860,7 @@
       <w:contextualSpacing/>
     </w:pPr>
   </w:style>
-  <w:style w:type="paragraph" w:styleId="Descripcin">
+  <w:style w:type="paragraph" w:styleId="Caption">
     <w:name w:val="caption"/>
     <w:basedOn w:val="Normal"/>
     <w:next w:val="Normal"/>
@@ -8717,9 +9879,9 @@
       <w:szCs w:val="18"/>
     </w:rPr>
   </w:style>
-  <w:style w:type="table" w:styleId="Tablaconcuadrcula">
+  <w:style w:type="table" w:styleId="TableGrid">
     <w:name w:val="Table Grid"/>
-    <w:basedOn w:val="Tablanormal"/>
+    <w:basedOn w:val="TableNormal"/>
     <w:uiPriority w:val="39"/>
     <w:rsid w:val="00C3546B"/>
     <w:pPr>
@@ -8736,9 +9898,9 @@
       </w:tblBorders>
     </w:tblPr>
   </w:style>
-  <w:style w:type="table" w:styleId="Tablanormal2">
+  <w:style w:type="table" w:styleId="PlainTable2">
     <w:name w:val="Plain Table 2"/>
-    <w:basedOn w:val="Tablanormal"/>
+    <w:basedOn w:val="TableNormal"/>
     <w:uiPriority w:val="42"/>
     <w:rsid w:val="00522EB9"/>
     <w:pPr>

</xml_diff>

<commit_message>
Ch 5 week 3
</commit_message>
<xml_diff>
--- a/Draft/6 Case Study.docx
+++ b/Draft/6 Case Study.docx
@@ -642,27 +642,7 @@
           <w:szCs w:val="24"/>
           <w:lang w:val="en-NZ"/>
         </w:rPr>
-        <w:t xml:space="preserve">Cultural, </w:t>
-      </w:r>
-      <w:proofErr w:type="spellStart"/>
-      <w:r>
-        <w:rPr>
-          <w:rFonts w:asciiTheme="majorHAnsi" w:hAnsiTheme="majorHAnsi" w:cstheme="majorHAnsi"/>
-          <w:sz w:val="24"/>
-          <w:szCs w:val="24"/>
-          <w:lang w:val="en-NZ"/>
-        </w:rPr>
-        <w:t>economical</w:t>
-      </w:r>
-      <w:proofErr w:type="spellEnd"/>
-      <w:r>
-        <w:rPr>
-          <w:rFonts w:asciiTheme="majorHAnsi" w:hAnsiTheme="majorHAnsi" w:cstheme="majorHAnsi"/>
-          <w:sz w:val="24"/>
-          <w:szCs w:val="24"/>
-          <w:lang w:val="en-NZ"/>
-        </w:rPr>
-        <w:t xml:space="preserve"> and social factors of the zone where the terrain was located.</w:t>
+        <w:t>Cultural, economical and social factors of the zone where the terrain was located.</w:t>
       </w:r>
     </w:p>
     <w:p>
@@ -711,95 +691,35 @@
           <w:szCs w:val="24"/>
           <w:lang w:val="en-NZ"/>
         </w:rPr>
-        <w:t xml:space="preserve">Requirements and proposals from other stakeholders like </w:t>
-      </w:r>
-      <w:proofErr w:type="gramStart"/>
-      <w:r>
-        <w:rPr>
-          <w:rFonts w:asciiTheme="majorHAnsi" w:hAnsiTheme="majorHAnsi" w:cstheme="majorHAnsi"/>
-          <w:sz w:val="24"/>
-          <w:szCs w:val="24"/>
-          <w:lang w:val="en-NZ"/>
-        </w:rPr>
-        <w:t>local residents</w:t>
-      </w:r>
-      <w:proofErr w:type="gramEnd"/>
-      <w:r>
-        <w:rPr>
-          <w:rFonts w:asciiTheme="majorHAnsi" w:hAnsiTheme="majorHAnsi" w:cstheme="majorHAnsi"/>
-          <w:sz w:val="24"/>
-          <w:szCs w:val="24"/>
-          <w:lang w:val="en-NZ"/>
-        </w:rPr>
-        <w:t xml:space="preserve"> and the government.</w:t>
-      </w:r>
-    </w:p>
-    <w:p>
-      <w:pPr>
-        <w:rPr>
-          <w:rFonts w:asciiTheme="majorHAnsi" w:hAnsiTheme="majorHAnsi" w:cstheme="majorHAnsi"/>
-          <w:sz w:val="24"/>
-          <w:szCs w:val="24"/>
-          <w:lang w:val="en-NZ"/>
-        </w:rPr>
-      </w:pPr>
-      <w:r>
-        <w:rPr>
-          <w:rFonts w:asciiTheme="majorHAnsi" w:hAnsiTheme="majorHAnsi" w:cstheme="majorHAnsi"/>
-          <w:sz w:val="24"/>
-          <w:szCs w:val="24"/>
-          <w:lang w:val="en-NZ"/>
-        </w:rPr>
-        <w:t xml:space="preserve">The fictional client firm would be represented by several experts, most of them part of the faculty but not directly part of the teaching staff, but that where available to answer questions about their requirements </w:t>
-      </w:r>
-      <w:proofErr w:type="gramStart"/>
-      <w:r>
-        <w:rPr>
-          <w:rFonts w:asciiTheme="majorHAnsi" w:hAnsiTheme="majorHAnsi" w:cstheme="majorHAnsi"/>
-          <w:sz w:val="24"/>
-          <w:szCs w:val="24"/>
-          <w:lang w:val="en-NZ"/>
-        </w:rPr>
-        <w:t>and also</w:t>
-      </w:r>
-      <w:proofErr w:type="gramEnd"/>
-      <w:r>
-        <w:rPr>
-          <w:rFonts w:asciiTheme="majorHAnsi" w:hAnsiTheme="majorHAnsi" w:cstheme="majorHAnsi"/>
-          <w:sz w:val="24"/>
-          <w:szCs w:val="24"/>
-          <w:lang w:val="en-NZ"/>
-        </w:rPr>
-        <w:t xml:space="preserve"> about the work expected from each of the four roles present in the course.</w:t>
-      </w:r>
-      <w:r>
-        <w:rPr>
-          <w:rFonts w:asciiTheme="majorHAnsi" w:hAnsiTheme="majorHAnsi" w:cstheme="majorHAnsi"/>
-          <w:sz w:val="24"/>
-          <w:szCs w:val="24"/>
-          <w:lang w:val="en-NZ"/>
-        </w:rPr>
-        <w:t xml:space="preserve"> Additionally, each group would act as a task team in charge of the design and surveillance of the development of the project. ENBU 79X/89X acts as the capstone for four different programs, and each group had at least one representative of each role: Architectural Engineer, Construction Engineer, Construction Manager and Quantity Surveyor. The group was expected to coordinate efforts to create a coherent proposal for the development project, while fulfilling specific tasks and deliveries specific for each role. Finally, the group </w:t>
-      </w:r>
-      <w:proofErr w:type="gramStart"/>
-      <w:r>
-        <w:rPr>
-          <w:rFonts w:asciiTheme="majorHAnsi" w:hAnsiTheme="majorHAnsi" w:cstheme="majorHAnsi"/>
-          <w:sz w:val="24"/>
-          <w:szCs w:val="24"/>
-          <w:lang w:val="en-NZ"/>
-        </w:rPr>
-        <w:t>as a whole had</w:t>
-      </w:r>
-      <w:proofErr w:type="gramEnd"/>
-      <w:r>
-        <w:rPr>
-          <w:rFonts w:asciiTheme="majorHAnsi" w:hAnsiTheme="majorHAnsi" w:cstheme="majorHAnsi"/>
-          <w:sz w:val="24"/>
-          <w:szCs w:val="24"/>
-          <w:lang w:val="en-NZ"/>
-        </w:rPr>
-        <w:t xml:space="preserve"> to create weekly and milestone reports to the client, creating a summary document meant to explain the current state of the project in a way that tackles the different profiles that the fictional client firm was representing</w:t>
+        <w:t>Requirements and proposals from other stakeholders like local residents and the government.</w:t>
+      </w:r>
+    </w:p>
+    <w:p>
+      <w:pPr>
+        <w:rPr>
+          <w:rFonts w:asciiTheme="majorHAnsi" w:hAnsiTheme="majorHAnsi" w:cstheme="majorHAnsi"/>
+          <w:sz w:val="24"/>
+          <w:szCs w:val="24"/>
+          <w:lang w:val="en-NZ"/>
+        </w:rPr>
+      </w:pPr>
+      <w:r>
+        <w:rPr>
+          <w:rFonts w:asciiTheme="majorHAnsi" w:hAnsiTheme="majorHAnsi" w:cstheme="majorHAnsi"/>
+          <w:sz w:val="24"/>
+          <w:szCs w:val="24"/>
+          <w:lang w:val="en-NZ"/>
+        </w:rPr>
+        <w:t>The fictional client firm would be represented by several experts, most of them part of the faculty but not directly part of the teaching staff, but that where available to answer questions about their requirements and also about the work expected from each of the four roles present in the course.</w:t>
+      </w:r>
+      <w:r>
+        <w:rPr>
+          <w:rFonts w:asciiTheme="majorHAnsi" w:hAnsiTheme="majorHAnsi" w:cstheme="majorHAnsi"/>
+          <w:sz w:val="24"/>
+          <w:szCs w:val="24"/>
+          <w:lang w:val="en-NZ"/>
+        </w:rPr>
+        <w:t xml:space="preserve"> Additionally, each group would act as a task team in charge of the design and surveillance of the development of the project. ENBU 79X/89X acts as the capstone for four different programs, and each group had at least one representative of each role: Architectural Engineer, Construction Engineer, Construction Manager and Quantity Surveyor. The group was expected to coordinate efforts to create a coherent proposal for the development project, while fulfilling specific tasks and deliveries specific for each role. Finally, the group as a whole had to create weekly and milestone reports to the client, creating a summary document meant to explain the current state of the project in a way that tackles the different profiles that the fictional client firm was representing</w:t>
       </w:r>
       <w:r>
         <w:rPr>
@@ -865,27 +785,7 @@
           <w:szCs w:val="24"/>
           <w:lang w:val="en-NZ"/>
         </w:rPr>
-        <w:t xml:space="preserve">The final methodological implementation of the course is the open work sessions, which represent </w:t>
-      </w:r>
-      <w:proofErr w:type="gramStart"/>
-      <w:r>
-        <w:rPr>
-          <w:rFonts w:asciiTheme="majorHAnsi" w:hAnsiTheme="majorHAnsi" w:cstheme="majorHAnsi"/>
-          <w:sz w:val="24"/>
-          <w:szCs w:val="24"/>
-          <w:lang w:val="en-NZ"/>
-        </w:rPr>
-        <w:t>the majority of</w:t>
-      </w:r>
-      <w:proofErr w:type="gramEnd"/>
-      <w:r>
-        <w:rPr>
-          <w:rFonts w:asciiTheme="majorHAnsi" w:hAnsiTheme="majorHAnsi" w:cstheme="majorHAnsi"/>
-          <w:sz w:val="24"/>
-          <w:szCs w:val="24"/>
-          <w:lang w:val="en-NZ"/>
-        </w:rPr>
-        <w:t xml:space="preserve"> the time spend by the students in the course. As the name suggest, they are open in nature, allowing the students to use the time in the classroom (about two sessions of 1 hour per week, depending on the length of other activities) to meet with their group or with other students to organize their work and progress towards the competition of the different deliverables. These sessions also allowed the students to have direct access to the teaching staff and a somewhat reliable access to their peers, specially to the students fulfilling the role of Architectural Engineers, that had to be shared among several groups.</w:t>
+        <w:t>The final methodological implementation of the course is the open work sessions, which represent the majority of the time spend by the students in the course. As the name suggest, they are open in nature, allowing the students to use the time in the classroom (about two sessions of 1 hour per week, depending on the length of other activities) to meet with their group or with other students to organize their work and progress towards the competition of the different deliverables. These sessions also allowed the students to have direct access to the teaching staff and a somewhat reliable access to their peers, specially to the students fulfilling the role of Architectural Engineers, that had to be shared among several groups.</w:t>
       </w:r>
     </w:p>
     <w:p>
@@ -905,67 +805,7 @@
           <w:lang w:val="en-NZ"/>
         </w:rPr>
         <w:lastRenderedPageBreak/>
-        <w:t xml:space="preserve">Assessment of the course is completely individual. Deliverables and the whole solution proposal to the project are </w:t>
-      </w:r>
-      <w:proofErr w:type="spellStart"/>
-      <w:r>
-        <w:rPr>
-          <w:rFonts w:asciiTheme="majorHAnsi" w:hAnsiTheme="majorHAnsi" w:cstheme="majorHAnsi"/>
-          <w:sz w:val="24"/>
-          <w:szCs w:val="24"/>
-          <w:lang w:val="en-NZ"/>
-        </w:rPr>
-        <w:t>build</w:t>
-      </w:r>
-      <w:proofErr w:type="spellEnd"/>
-      <w:r>
-        <w:rPr>
-          <w:rFonts w:asciiTheme="majorHAnsi" w:hAnsiTheme="majorHAnsi" w:cstheme="majorHAnsi"/>
-          <w:sz w:val="24"/>
-          <w:szCs w:val="24"/>
-          <w:lang w:val="en-NZ"/>
-        </w:rPr>
-        <w:t xml:space="preserve"> as a group, but each student presents at the end his own oral presentation and final client report to be marked. The main assessment tools are the oral presentations and the final client report. The presentations consist </w:t>
-      </w:r>
-      <w:proofErr w:type="gramStart"/>
-      <w:r>
-        <w:rPr>
-          <w:rFonts w:asciiTheme="majorHAnsi" w:hAnsiTheme="majorHAnsi" w:cstheme="majorHAnsi"/>
-          <w:sz w:val="24"/>
-          <w:szCs w:val="24"/>
-          <w:lang w:val="en-NZ"/>
-        </w:rPr>
-        <w:t>on</w:t>
-      </w:r>
-      <w:proofErr w:type="gramEnd"/>
-      <w:r>
-        <w:rPr>
-          <w:rFonts w:asciiTheme="majorHAnsi" w:hAnsiTheme="majorHAnsi" w:cstheme="majorHAnsi"/>
-          <w:sz w:val="24"/>
-          <w:szCs w:val="24"/>
-          <w:lang w:val="en-NZ"/>
-        </w:rPr>
-        <w:t xml:space="preserve"> short 5-minute presentations about the overall proposal of the group for the project, the current state of development and the personal contributions of the students </w:t>
-      </w:r>
-      <w:proofErr w:type="spellStart"/>
-      <w:r>
-        <w:rPr>
-          <w:rFonts w:asciiTheme="majorHAnsi" w:hAnsiTheme="majorHAnsi" w:cstheme="majorHAnsi"/>
-          <w:sz w:val="24"/>
-          <w:szCs w:val="24"/>
-          <w:lang w:val="en-NZ"/>
-        </w:rPr>
-        <w:t>n</w:t>
-      </w:r>
-      <w:proofErr w:type="spellEnd"/>
-      <w:r>
-        <w:rPr>
-          <w:rFonts w:asciiTheme="majorHAnsi" w:hAnsiTheme="majorHAnsi" w:cstheme="majorHAnsi"/>
-          <w:sz w:val="24"/>
-          <w:szCs w:val="24"/>
-          <w:lang w:val="en-NZ"/>
-        </w:rPr>
-        <w:t xml:space="preserve"> the construction of that proposal. There were two oral presentations along the course, one focused on the architectural design and the other on the final proposal.</w:t>
+        <w:t>Assessment of the course is completely individual. Deliverables and the whole solution proposal to the project are build as a group, but each student presents at the end his own oral presentation and final client report to be marked. The main assessment tools are the oral presentations and the final client report. The presentations consist on short 5-minute presentations about the overall proposal of the group for the project, the current state of development and the personal contributions of the students n the construction of that proposal. There were two oral presentations along the course, one focused on the architectural design and the other on the final proposal.</w:t>
       </w:r>
     </w:p>
     <w:p>
@@ -1056,27 +896,7 @@
           <w:szCs w:val="24"/>
           <w:lang w:val="en-NZ"/>
         </w:rPr>
-        <w:t xml:space="preserve"> The final report was marked, and consisted </w:t>
-      </w:r>
-      <w:proofErr w:type="gramStart"/>
-      <w:r>
-        <w:rPr>
-          <w:rFonts w:asciiTheme="majorHAnsi" w:hAnsiTheme="majorHAnsi" w:cstheme="majorHAnsi"/>
-          <w:sz w:val="24"/>
-          <w:szCs w:val="24"/>
-          <w:lang w:val="en-NZ"/>
-        </w:rPr>
-        <w:t>on</w:t>
-      </w:r>
-      <w:proofErr w:type="gramEnd"/>
-      <w:r>
-        <w:rPr>
-          <w:rFonts w:asciiTheme="majorHAnsi" w:hAnsiTheme="majorHAnsi" w:cstheme="majorHAnsi"/>
-          <w:sz w:val="24"/>
-          <w:szCs w:val="24"/>
-          <w:lang w:val="en-NZ"/>
-        </w:rPr>
-        <w:t xml:space="preserve"> a quick summary of the personal contributions of each student in the project, as well as a reflection of the work done by the group, the problems found and the steps taken to solve them.</w:t>
+        <w:t xml:space="preserve"> The final report was marked, and consisted on a quick summary of the personal contributions of each student in the project, as well as a reflection of the work done by the group, the problems found and the steps taken to solve them.</w:t>
       </w:r>
     </w:p>
     <w:p>
@@ -1128,27 +948,7 @@
           <w:szCs w:val="24"/>
           <w:lang w:val="en-NZ"/>
         </w:rPr>
-        <w:t xml:space="preserve">An architectural design for a building complex that </w:t>
-      </w:r>
-      <w:proofErr w:type="gramStart"/>
-      <w:r>
-        <w:rPr>
-          <w:rFonts w:asciiTheme="majorHAnsi" w:hAnsiTheme="majorHAnsi" w:cstheme="majorHAnsi"/>
-          <w:sz w:val="24"/>
-          <w:szCs w:val="24"/>
-          <w:lang w:val="en-NZ"/>
-        </w:rPr>
-        <w:t>takes into account</w:t>
-      </w:r>
-      <w:proofErr w:type="gramEnd"/>
-      <w:r>
-        <w:rPr>
-          <w:rFonts w:asciiTheme="majorHAnsi" w:hAnsiTheme="majorHAnsi" w:cstheme="majorHAnsi"/>
-          <w:sz w:val="24"/>
-          <w:szCs w:val="24"/>
-          <w:lang w:val="en-NZ"/>
-        </w:rPr>
-        <w:t xml:space="preserve"> the geotechnical data of the construction site, the functional necessities of the project and the complications and peculiarities found in the selected site.</w:t>
+        <w:t>An architectural design for a building complex that takes into account the geotechnical data of the construction site, the functional necessities of the project and the complications and peculiarities found in the selected site.</w:t>
       </w:r>
     </w:p>
     <w:p>
@@ -1545,27 +1345,7 @@
           <w:szCs w:val="24"/>
           <w:lang w:val="en-NZ"/>
         </w:rPr>
-        <w:t xml:space="preserve">For this learning objective it is also interesting to observe the types of collaboration being used by the students as described by Salmons (2019), and if WorkshopAR was promoting or helping in the development of a particular form of collaboration. In general, the digital space created by WorkshopAR would facilitate activities of co-creation, by allowing the testing and record of ideas for the architectural design, </w:t>
-      </w:r>
-      <w:proofErr w:type="gramStart"/>
-      <w:r>
-        <w:rPr>
-          <w:rFonts w:asciiTheme="majorHAnsi" w:hAnsiTheme="majorHAnsi" w:cstheme="majorHAnsi"/>
-          <w:sz w:val="24"/>
-          <w:szCs w:val="24"/>
-          <w:lang w:val="en-NZ"/>
-        </w:rPr>
-        <w:t>and also</w:t>
-      </w:r>
-      <w:proofErr w:type="gramEnd"/>
-      <w:r>
-        <w:rPr>
-          <w:rFonts w:asciiTheme="majorHAnsi" w:hAnsiTheme="majorHAnsi" w:cstheme="majorHAnsi"/>
-          <w:sz w:val="24"/>
-          <w:szCs w:val="24"/>
-          <w:lang w:val="en-NZ"/>
-        </w:rPr>
-        <w:t xml:space="preserve"> transfer activities, by offering visuals that can be used to explain concepts, decisions or design proposals.</w:t>
+        <w:t>For this learning objective it is also interesting to observe the types of collaboration being used by the students as described by Salmons (2019), and if WorkshopAR was promoting or helping in the development of a particular form of collaboration. In general, the digital space created by WorkshopAR would facilitate activities of co-creation, by allowing the testing and record of ideas for the architectural design, and also transfer activities, by offering visuals that can be used to explain concepts, decisions or design proposals.</w:t>
       </w:r>
     </w:p>
     <w:p>
@@ -1941,27 +1721,7 @@
           <w:szCs w:val="24"/>
           <w:lang w:val="en-NZ"/>
         </w:rPr>
-        <w:t>Issues of power imbalance are inherent to any social activity (</w:t>
-      </w:r>
-      <w:proofErr w:type="spellStart"/>
-      <w:r>
-        <w:rPr>
-          <w:rFonts w:asciiTheme="majorHAnsi" w:hAnsiTheme="majorHAnsi" w:cstheme="majorHAnsi"/>
-          <w:sz w:val="24"/>
-          <w:szCs w:val="24"/>
-          <w:lang w:val="en-NZ"/>
-        </w:rPr>
-        <w:t>Essabar</w:t>
-      </w:r>
-      <w:proofErr w:type="spellEnd"/>
-      <w:r>
-        <w:rPr>
-          <w:rFonts w:asciiTheme="majorHAnsi" w:hAnsiTheme="majorHAnsi" w:cstheme="majorHAnsi"/>
-          <w:sz w:val="24"/>
-          <w:szCs w:val="24"/>
-          <w:lang w:val="en-NZ"/>
-        </w:rPr>
-        <w:t xml:space="preserve"> et. </w:t>
+        <w:t xml:space="preserve">Issues of power imbalance are inherent to any social activity (Essabar et. </w:t>
       </w:r>
       <w:r>
         <w:rPr>
@@ -2007,67 +1767,7 @@
           <w:szCs w:val="24"/>
           <w:lang w:val="en-NZ"/>
         </w:rPr>
-        <w:t>Knowledge flow in project-based approaches is also an issue that have been discussed in the past (</w:t>
-      </w:r>
-      <w:proofErr w:type="spellStart"/>
-      <w:r>
-        <w:rPr>
-          <w:rFonts w:asciiTheme="majorHAnsi" w:hAnsiTheme="majorHAnsi" w:cstheme="majorHAnsi"/>
-          <w:sz w:val="24"/>
-          <w:szCs w:val="24"/>
-          <w:lang w:val="en-NZ"/>
-        </w:rPr>
-        <w:t>Kogtikov</w:t>
-      </w:r>
-      <w:proofErr w:type="spellEnd"/>
-      <w:r>
-        <w:rPr>
-          <w:rFonts w:asciiTheme="majorHAnsi" w:hAnsiTheme="majorHAnsi" w:cstheme="majorHAnsi"/>
-          <w:sz w:val="24"/>
-          <w:szCs w:val="24"/>
-          <w:lang w:val="en-NZ"/>
-        </w:rPr>
-        <w:t xml:space="preserve"> et al., 2016 and Granado-</w:t>
-      </w:r>
-      <w:proofErr w:type="spellStart"/>
-      <w:r>
-        <w:rPr>
-          <w:rFonts w:asciiTheme="majorHAnsi" w:hAnsiTheme="majorHAnsi" w:cstheme="majorHAnsi"/>
-          <w:sz w:val="24"/>
-          <w:szCs w:val="24"/>
-          <w:lang w:val="en-NZ"/>
-        </w:rPr>
-        <w:t>Alcón</w:t>
-      </w:r>
-      <w:proofErr w:type="spellEnd"/>
-      <w:r>
-        <w:rPr>
-          <w:rFonts w:asciiTheme="majorHAnsi" w:hAnsiTheme="majorHAnsi" w:cstheme="majorHAnsi"/>
-          <w:sz w:val="24"/>
-          <w:szCs w:val="24"/>
-          <w:lang w:val="en-NZ"/>
-        </w:rPr>
-        <w:t xml:space="preserve"> et al., 2020 and </w:t>
-      </w:r>
-      <w:proofErr w:type="spellStart"/>
-      <w:r>
-        <w:rPr>
-          <w:rFonts w:asciiTheme="majorHAnsi" w:hAnsiTheme="majorHAnsi" w:cstheme="majorHAnsi"/>
-          <w:sz w:val="24"/>
-          <w:szCs w:val="24"/>
-          <w:lang w:val="en-NZ"/>
-        </w:rPr>
-        <w:t>Shpeizer</w:t>
-      </w:r>
-      <w:proofErr w:type="spellEnd"/>
-      <w:r>
-        <w:rPr>
-          <w:rFonts w:asciiTheme="majorHAnsi" w:hAnsiTheme="majorHAnsi" w:cstheme="majorHAnsi"/>
-          <w:sz w:val="24"/>
-          <w:szCs w:val="24"/>
-          <w:lang w:val="en-NZ"/>
-        </w:rPr>
-        <w:t xml:space="preserve">, 2019). A possible barrier for any group in the curse could be to have issues </w:t>
+        <w:t xml:space="preserve">Knowledge flow in project-based approaches is also an issue that have been discussed in the past (Kogtikov et al., 2016 and Granado-Alcón et al., 2020 and Shpeizer, 2019). A possible barrier for any group in the curse could be to have issues </w:t>
       </w:r>
       <w:r>
         <w:rPr>
@@ -3586,27 +3286,7 @@
           <w:szCs w:val="24"/>
           <w:lang w:val="en-NZ"/>
         </w:rPr>
-        <w:t xml:space="preserve">, which Table 1 shows in its </w:t>
-      </w:r>
-      <w:proofErr w:type="spellStart"/>
-      <w:r>
-        <w:rPr>
-          <w:rFonts w:asciiTheme="majorHAnsi" w:hAnsiTheme="majorHAnsi" w:cstheme="majorHAnsi"/>
-          <w:sz w:val="24"/>
-          <w:szCs w:val="24"/>
-          <w:lang w:val="en-NZ"/>
-        </w:rPr>
-        <w:t>Te</w:t>
-      </w:r>
-      <w:proofErr w:type="spellEnd"/>
-      <w:r>
-        <w:rPr>
-          <w:rFonts w:asciiTheme="majorHAnsi" w:hAnsiTheme="majorHAnsi" w:cstheme="majorHAnsi"/>
-          <w:sz w:val="24"/>
-          <w:szCs w:val="24"/>
-          <w:lang w:val="en-NZ"/>
-        </w:rPr>
-        <w:t xml:space="preserve"> Reo and English versions.</w:t>
+        <w:t>, which Table 1 shows in its Te Reo and English versions.</w:t>
       </w:r>
     </w:p>
     <w:p>
@@ -3691,7 +3371,6 @@
                 <w:lang w:val="en-NZ"/>
               </w:rPr>
             </w:pPr>
-            <w:proofErr w:type="spellStart"/>
             <w:r>
               <w:rPr>
                 <w:rFonts w:asciiTheme="majorHAnsi" w:hAnsiTheme="majorHAnsi" w:cstheme="majorHAnsi"/>
@@ -3699,17 +3378,7 @@
                 <w:szCs w:val="24"/>
                 <w:lang w:val="en-NZ"/>
               </w:rPr>
-              <w:t>Te</w:t>
-            </w:r>
-            <w:proofErr w:type="spellEnd"/>
-            <w:r>
-              <w:rPr>
-                <w:rFonts w:asciiTheme="majorHAnsi" w:hAnsiTheme="majorHAnsi" w:cstheme="majorHAnsi"/>
-                <w:sz w:val="24"/>
-                <w:szCs w:val="24"/>
-                <w:lang w:val="en-NZ"/>
-              </w:rPr>
-              <w:t xml:space="preserve"> Reo</w:t>
+              <w:t>Te Reo</w:t>
             </w:r>
           </w:p>
         </w:tc>
@@ -3786,27 +3455,7 @@
                 <w:szCs w:val="24"/>
                 <w:lang w:val="en-NZ"/>
               </w:rPr>
-              <w:t xml:space="preserve">Mauri </w:t>
-            </w:r>
-            <w:proofErr w:type="spellStart"/>
-            <w:r>
-              <w:rPr>
-                <w:rFonts w:asciiTheme="majorHAnsi" w:hAnsiTheme="majorHAnsi" w:cstheme="majorHAnsi"/>
-                <w:sz w:val="24"/>
-                <w:szCs w:val="24"/>
-                <w:lang w:val="en-NZ"/>
-              </w:rPr>
-              <w:t>tū</w:t>
-            </w:r>
-            <w:proofErr w:type="spellEnd"/>
-            <w:r>
-              <w:rPr>
-                <w:rFonts w:asciiTheme="majorHAnsi" w:hAnsiTheme="majorHAnsi" w:cstheme="majorHAnsi"/>
-                <w:sz w:val="24"/>
-                <w:szCs w:val="24"/>
-                <w:lang w:val="en-NZ"/>
-              </w:rPr>
-              <w:t>.</w:t>
+              <w:t>Mauri tū.</w:t>
             </w:r>
           </w:p>
           <w:p>
@@ -3826,27 +3475,7 @@
                 <w:szCs w:val="24"/>
                 <w:lang w:val="en-NZ"/>
               </w:rPr>
-              <w:t xml:space="preserve">Mauri ora ki a </w:t>
-            </w:r>
-            <w:proofErr w:type="spellStart"/>
-            <w:r>
-              <w:rPr>
-                <w:rFonts w:asciiTheme="majorHAnsi" w:hAnsiTheme="majorHAnsi" w:cstheme="majorHAnsi"/>
-                <w:sz w:val="24"/>
-                <w:szCs w:val="24"/>
-                <w:lang w:val="en-NZ"/>
-              </w:rPr>
-              <w:t>tātou</w:t>
-            </w:r>
-            <w:proofErr w:type="spellEnd"/>
-            <w:r>
-              <w:rPr>
-                <w:rFonts w:asciiTheme="majorHAnsi" w:hAnsiTheme="majorHAnsi" w:cstheme="majorHAnsi"/>
-                <w:sz w:val="24"/>
-                <w:szCs w:val="24"/>
-                <w:lang w:val="en-NZ"/>
-              </w:rPr>
-              <w:t>.</w:t>
+              <w:t>Mauri ora ki a tātou.</w:t>
             </w:r>
           </w:p>
           <w:p>
@@ -3859,7 +3488,6 @@
                 <w:lang w:val="en-NZ"/>
               </w:rPr>
             </w:pPr>
-            <w:proofErr w:type="spellStart"/>
             <w:r>
               <w:rPr>
                 <w:rFonts w:asciiTheme="majorHAnsi" w:hAnsiTheme="majorHAnsi" w:cstheme="majorHAnsi"/>
@@ -3867,37 +3495,7 @@
                 <w:szCs w:val="24"/>
                 <w:lang w:val="en-NZ"/>
               </w:rPr>
-              <w:t>Haumi</w:t>
-            </w:r>
-            <w:proofErr w:type="spellEnd"/>
-            <w:r>
-              <w:rPr>
-                <w:rFonts w:asciiTheme="majorHAnsi" w:hAnsiTheme="majorHAnsi" w:cstheme="majorHAnsi"/>
-                <w:sz w:val="24"/>
-                <w:szCs w:val="24"/>
-                <w:lang w:val="en-NZ"/>
-              </w:rPr>
-              <w:t xml:space="preserve"> e, Hui e! </w:t>
-            </w:r>
-            <w:proofErr w:type="spellStart"/>
-            <w:r>
-              <w:rPr>
-                <w:rFonts w:asciiTheme="majorHAnsi" w:hAnsiTheme="majorHAnsi" w:cstheme="majorHAnsi"/>
-                <w:sz w:val="24"/>
-                <w:szCs w:val="24"/>
-                <w:lang w:val="en-NZ"/>
-              </w:rPr>
-              <w:t>Tāiki</w:t>
-            </w:r>
-            <w:proofErr w:type="spellEnd"/>
-            <w:r>
-              <w:rPr>
-                <w:rFonts w:asciiTheme="majorHAnsi" w:hAnsiTheme="majorHAnsi" w:cstheme="majorHAnsi"/>
-                <w:sz w:val="24"/>
-                <w:szCs w:val="24"/>
-                <w:lang w:val="en-NZ"/>
-              </w:rPr>
-              <w:t xml:space="preserve"> e!</w:t>
+              <w:t>Haumi e, Hui e! Tāiki e!</w:t>
             </w:r>
           </w:p>
         </w:tc>
@@ -3923,27 +3521,7 @@
                 <w:szCs w:val="24"/>
                 <w:lang w:val="en-NZ"/>
               </w:rPr>
-              <w:t xml:space="preserve">Life force </w:t>
-            </w:r>
-            <w:proofErr w:type="gramStart"/>
-            <w:r>
-              <w:rPr>
-                <w:rFonts w:asciiTheme="majorHAnsi" w:hAnsiTheme="majorHAnsi" w:cstheme="majorHAnsi"/>
-                <w:sz w:val="24"/>
-                <w:szCs w:val="24"/>
-                <w:lang w:val="en-NZ"/>
-              </w:rPr>
-              <w:t>awaken</w:t>
-            </w:r>
-            <w:proofErr w:type="gramEnd"/>
-            <w:r>
-              <w:rPr>
-                <w:rFonts w:asciiTheme="majorHAnsi" w:hAnsiTheme="majorHAnsi" w:cstheme="majorHAnsi"/>
-                <w:sz w:val="24"/>
-                <w:szCs w:val="24"/>
-                <w:lang w:val="en-NZ"/>
-              </w:rPr>
-              <w:t>.</w:t>
+              <w:t>Life force awaken.</w:t>
             </w:r>
           </w:p>
           <w:p>
@@ -3964,27 +3542,7 @@
                 <w:szCs w:val="24"/>
                 <w:lang w:val="en-NZ"/>
               </w:rPr>
-              <w:t xml:space="preserve">Life force </w:t>
-            </w:r>
-            <w:proofErr w:type="gramStart"/>
-            <w:r>
-              <w:rPr>
-                <w:rFonts w:asciiTheme="majorHAnsi" w:hAnsiTheme="majorHAnsi" w:cstheme="majorHAnsi"/>
-                <w:sz w:val="24"/>
-                <w:szCs w:val="24"/>
-                <w:lang w:val="en-NZ"/>
-              </w:rPr>
-              <w:t>stand</w:t>
-            </w:r>
-            <w:proofErr w:type="gramEnd"/>
-            <w:r>
-              <w:rPr>
-                <w:rFonts w:asciiTheme="majorHAnsi" w:hAnsiTheme="majorHAnsi" w:cstheme="majorHAnsi"/>
-                <w:sz w:val="24"/>
-                <w:szCs w:val="24"/>
-                <w:lang w:val="en-NZ"/>
-              </w:rPr>
-              <w:t xml:space="preserve"> tall.</w:t>
+              <w:t>Life force stand tall.</w:t>
             </w:r>
           </w:p>
           <w:p>
@@ -4005,27 +3563,7 @@
                 <w:szCs w:val="24"/>
                 <w:lang w:val="en-NZ"/>
               </w:rPr>
-              <w:t xml:space="preserve">Life </w:t>
-            </w:r>
-            <w:proofErr w:type="gramStart"/>
-            <w:r>
-              <w:rPr>
-                <w:rFonts w:asciiTheme="majorHAnsi" w:hAnsiTheme="majorHAnsi" w:cstheme="majorHAnsi"/>
-                <w:sz w:val="24"/>
-                <w:szCs w:val="24"/>
-                <w:lang w:val="en-NZ"/>
-              </w:rPr>
-              <w:t>force</w:t>
-            </w:r>
-            <w:proofErr w:type="gramEnd"/>
-            <w:r>
-              <w:rPr>
-                <w:rFonts w:asciiTheme="majorHAnsi" w:hAnsiTheme="majorHAnsi" w:cstheme="majorHAnsi"/>
-                <w:sz w:val="24"/>
-                <w:szCs w:val="24"/>
-                <w:lang w:val="en-NZ"/>
-              </w:rPr>
-              <w:t xml:space="preserve"> all wellness, good health for all.</w:t>
+              <w:t>Life force all wellness, good health for all.</w:t>
             </w:r>
           </w:p>
           <w:p>
@@ -4039,7 +3577,6 @@
                 <w:lang w:val="en-NZ"/>
               </w:rPr>
             </w:pPr>
-            <w:proofErr w:type="gramStart"/>
             <w:r>
               <w:rPr>
                 <w:rFonts w:asciiTheme="majorHAnsi" w:hAnsiTheme="majorHAnsi" w:cstheme="majorHAnsi"/>
@@ -4047,17 +3584,7 @@
                 <w:szCs w:val="24"/>
                 <w:lang w:val="en-NZ"/>
               </w:rPr>
-              <w:t>Join together</w:t>
-            </w:r>
-            <w:proofErr w:type="gramEnd"/>
-            <w:r>
-              <w:rPr>
-                <w:rFonts w:asciiTheme="majorHAnsi" w:hAnsiTheme="majorHAnsi" w:cstheme="majorHAnsi"/>
-                <w:sz w:val="24"/>
-                <w:szCs w:val="24"/>
-                <w:lang w:val="en-NZ"/>
-              </w:rPr>
-              <w:t>, unite, the group is ready to progress for the purpose of coming together.</w:t>
+              <w:t>Join together, unite, the group is ready to progress for the purpose of coming together.</w:t>
             </w:r>
           </w:p>
         </w:tc>
@@ -5346,21 +4873,7 @@
         <w:rPr>
           <w:lang w:val="en-NZ"/>
         </w:rPr>
-        <w:t xml:space="preserve"> </w:t>
-      </w:r>
-      <w:proofErr w:type="gramStart"/>
-      <w:r>
-        <w:rPr>
-          <w:lang w:val="en-NZ"/>
-        </w:rPr>
-        <w:t>all of</w:t>
-      </w:r>
-      <w:proofErr w:type="gramEnd"/>
-      <w:r>
-        <w:rPr>
-          <w:lang w:val="en-NZ"/>
-        </w:rPr>
-        <w:t xml:space="preserve"> the activities that could be classified as part of the first </w:t>
+        <w:t xml:space="preserve"> all of the activities that could be classified as part of the first </w:t>
       </w:r>
       <w:r>
         <w:rPr>
@@ -5459,21 +4972,7 @@
         <w:rPr>
           <w:lang w:val="en-NZ"/>
         </w:rPr>
-        <w:t xml:space="preserve"> were a part of as a reference, very few knew each other, and even if they did, the was a high chance </w:t>
-      </w:r>
-      <w:proofErr w:type="spellStart"/>
-      <w:r>
-        <w:rPr>
-          <w:lang w:val="en-NZ"/>
-        </w:rPr>
-        <w:t>the</w:t>
-      </w:r>
-      <w:proofErr w:type="spellEnd"/>
-      <w:r>
-        <w:rPr>
-          <w:lang w:val="en-NZ"/>
-        </w:rPr>
-        <w:t xml:space="preserve"> were not in the same group</w:t>
+        <w:t xml:space="preserve"> were a part of as a reference, very few knew each other, and even if they did, the was a high chance the were not in the same group</w:t>
       </w:r>
       <w:r>
         <w:rPr>
@@ -6398,21 +5897,7 @@
         <w:rPr>
           <w:lang w:val="en-NZ"/>
         </w:rPr>
-        <w:t xml:space="preserve"> </w:t>
-      </w:r>
-      <w:proofErr w:type="gramStart"/>
-      <w:r>
-        <w:rPr>
-          <w:lang w:val="en-NZ"/>
-        </w:rPr>
-        <w:t>An</w:t>
-      </w:r>
-      <w:proofErr w:type="gramEnd"/>
-      <w:r>
-        <w:rPr>
-          <w:lang w:val="en-NZ"/>
-        </w:rPr>
-        <w:t xml:space="preserve"> &amp; Frick (2006) and Robinson &amp; Hans (2012) give some validity to this idea, showing that students prefer quick, simple communication via their preferred apps, but appreciated more face-to-face work for more complex work</w:t>
+        <w:t xml:space="preserve"> An &amp; Frick (2006) and Robinson &amp; Hans (2012) give some validity to this idea, showing that students prefer quick, simple communication via their preferred apps, but appreciated more face-to-face work for more complex work</w:t>
       </w:r>
       <w:r>
         <w:rPr>
@@ -7082,21 +6567,7 @@
         <w:rPr>
           <w:lang w:val="en-NZ"/>
         </w:rPr>
-        <w:t xml:space="preserve"> don’t worry </w:t>
-      </w:r>
-      <w:proofErr w:type="spellStart"/>
-      <w:r>
-        <w:rPr>
-          <w:lang w:val="en-NZ"/>
-        </w:rPr>
-        <w:t>to</w:t>
-      </w:r>
-      <w:proofErr w:type="spellEnd"/>
-      <w:r>
-        <w:rPr>
-          <w:lang w:val="en-NZ"/>
-        </w:rPr>
-        <w:t xml:space="preserve"> much about the lack of group cohesion, to the point that they were not very concerned about the work of their teammates</w:t>
+        <w:t xml:space="preserve"> don’t worry to much about the lack of group cohesion, to the point that they were not very concerned about the work of their teammates</w:t>
       </w:r>
       <w:r>
         <w:rPr>
@@ -7228,14 +6699,12 @@
         </w:rPr>
         <w:t xml:space="preserve">A final observation of note was on the tools used to share information and to produce the material needed for the project. Everyone had their own laptop or working tablet. It was simple not feasible to not have a digital device to use as a workstation during the session, and if someone arrived </w:t>
       </w:r>
-      <w:proofErr w:type="gramStart"/>
-      <w:r>
-        <w:rPr>
-          <w:lang w:val="en-NZ"/>
-        </w:rPr>
-        <w:t>to</w:t>
-      </w:r>
-      <w:proofErr w:type="gramEnd"/>
+      <w:r>
+        <w:rPr>
+          <w:lang w:val="en-NZ"/>
+        </w:rPr>
+        <w:t>at</w:t>
+      </w:r>
       <w:r>
         <w:rPr>
           <w:lang w:val="en-NZ"/>
@@ -8346,23 +7815,7 @@
                 <w:color w:val="000000"/>
                 <w:lang w:val="en-NZ" w:eastAsia="es-CO"/>
               </w:rPr>
-              <w:t xml:space="preserve">The group did not </w:t>
-            </w:r>
-            <w:r>
-              <w:rPr>
-                <w:rFonts w:ascii="Aptos Narrow" w:eastAsia="Times New Roman" w:hAnsi="Aptos Narrow" w:cs="Times New Roman"/>
-                <w:color w:val="000000"/>
-                <w:lang w:val="en-NZ" w:eastAsia="es-CO"/>
-              </w:rPr>
-              <w:t>report</w:t>
-            </w:r>
-            <w:r>
-              <w:rPr>
-                <w:rFonts w:ascii="Aptos Narrow" w:eastAsia="Times New Roman" w:hAnsi="Aptos Narrow" w:cs="Times New Roman"/>
-                <w:color w:val="000000"/>
-                <w:lang w:val="en-NZ" w:eastAsia="es-CO"/>
-              </w:rPr>
-              <w:t xml:space="preserve"> any value proposition in the report</w:t>
+              <w:t>The group did not report any value proposition in the report</w:t>
             </w:r>
           </w:p>
         </w:tc>
@@ -8486,23 +7939,7 @@
                 <w:color w:val="000000"/>
                 <w:lang w:val="en-NZ" w:eastAsia="es-CO"/>
               </w:rPr>
-              <w:t xml:space="preserve">The value proposition keeps changing </w:t>
-            </w:r>
-            <w:r>
-              <w:rPr>
-                <w:rFonts w:ascii="Aptos Narrow" w:eastAsia="Times New Roman" w:hAnsi="Aptos Narrow" w:cs="Times New Roman"/>
-                <w:color w:val="000000"/>
-                <w:lang w:val="en-NZ" w:eastAsia="es-CO"/>
-              </w:rPr>
-              <w:t>without</w:t>
-            </w:r>
-            <w:r>
-              <w:rPr>
-                <w:rFonts w:ascii="Aptos Narrow" w:eastAsia="Times New Roman" w:hAnsi="Aptos Narrow" w:cs="Times New Roman"/>
-                <w:color w:val="000000"/>
-                <w:lang w:val="en-NZ" w:eastAsia="es-CO"/>
-              </w:rPr>
-              <w:t xml:space="preserve"> a proper or valid reason</w:t>
+              <w:t>The value proposition keeps changing without a proper or valid reason</w:t>
             </w:r>
           </w:p>
         </w:tc>
@@ -8719,23 +8156,7 @@
                 <w:color w:val="000000"/>
                 <w:lang w:val="en-NZ" w:eastAsia="es-CO"/>
               </w:rPr>
-              <w:t xml:space="preserve">The VP only considers the </w:t>
-            </w:r>
-            <w:r>
-              <w:rPr>
-                <w:rFonts w:ascii="Aptos Narrow" w:eastAsia="Times New Roman" w:hAnsi="Aptos Narrow" w:cs="Times New Roman"/>
-                <w:color w:val="000000"/>
-                <w:lang w:val="en-NZ" w:eastAsia="es-CO"/>
-              </w:rPr>
-              <w:t>immediate</w:t>
-            </w:r>
-            <w:r>
-              <w:rPr>
-                <w:rFonts w:ascii="Aptos Narrow" w:eastAsia="Times New Roman" w:hAnsi="Aptos Narrow" w:cs="Times New Roman"/>
-                <w:color w:val="000000"/>
-                <w:lang w:val="en-NZ" w:eastAsia="es-CO"/>
-              </w:rPr>
-              <w:t xml:space="preserve"> week</w:t>
+              <w:t>The VP only considers the immediate week</w:t>
             </w:r>
           </w:p>
         </w:tc>
@@ -8890,23 +8311,7 @@
                 <w:color w:val="000000"/>
                 <w:lang w:val="en-NZ" w:eastAsia="es-CO"/>
               </w:rPr>
-              <w:t xml:space="preserve">The group change a good value proposition to reflect some </w:t>
-            </w:r>
-            <w:r>
-              <w:rPr>
-                <w:rFonts w:ascii="Aptos Narrow" w:eastAsia="Times New Roman" w:hAnsi="Aptos Narrow" w:cs="Times New Roman"/>
-                <w:color w:val="000000"/>
-                <w:lang w:val="en-NZ" w:eastAsia="es-CO"/>
-              </w:rPr>
-              <w:t>decision</w:t>
-            </w:r>
-            <w:r>
-              <w:rPr>
-                <w:rFonts w:ascii="Aptos Narrow" w:eastAsia="Times New Roman" w:hAnsi="Aptos Narrow" w:cs="Times New Roman"/>
-                <w:color w:val="000000"/>
-                <w:lang w:val="en-NZ" w:eastAsia="es-CO"/>
-              </w:rPr>
-              <w:t xml:space="preserve"> or change in the vision of the project</w:t>
+              <w:t>The group change a good value proposition to reflect some decision or change in the vision of the project</w:t>
             </w:r>
           </w:p>
         </w:tc>
@@ -9163,31 +8568,7 @@
                 <w:color w:val="000000"/>
                 <w:lang w:val="en-NZ" w:eastAsia="es-CO"/>
               </w:rPr>
-              <w:t xml:space="preserve">The chart reported is too simple or only considers the </w:t>
-            </w:r>
-            <w:r>
-              <w:rPr>
-                <w:rFonts w:ascii="Aptos Narrow" w:eastAsia="Times New Roman" w:hAnsi="Aptos Narrow" w:cs="Times New Roman"/>
-                <w:color w:val="000000"/>
-                <w:lang w:val="en-NZ" w:eastAsia="es-CO"/>
-              </w:rPr>
-              <w:t>immediate</w:t>
-            </w:r>
-            <w:r>
-              <w:rPr>
-                <w:rFonts w:ascii="Aptos Narrow" w:eastAsia="Times New Roman" w:hAnsi="Aptos Narrow" w:cs="Times New Roman"/>
-                <w:color w:val="000000"/>
-                <w:lang w:val="en-NZ" w:eastAsia="es-CO"/>
-              </w:rPr>
-              <w:t xml:space="preserve"> </w:t>
-            </w:r>
-            <w:r>
-              <w:rPr>
-                <w:rFonts w:ascii="Aptos Narrow" w:eastAsia="Times New Roman" w:hAnsi="Aptos Narrow" w:cs="Times New Roman"/>
-                <w:color w:val="000000"/>
-                <w:lang w:val="en-NZ" w:eastAsia="es-CO"/>
-              </w:rPr>
-              <w:t>timeframe</w:t>
+              <w:t>The chart reported is too simple or only considers the immediate timeframe</w:t>
             </w:r>
           </w:p>
         </w:tc>
@@ -10042,15 +9423,7 @@
                 <w:color w:val="000000"/>
                 <w:lang w:val="en-NZ" w:eastAsia="es-CO"/>
               </w:rPr>
-              <w:t xml:space="preserve">Team members </w:t>
-            </w:r>
-            <w:r>
-              <w:rPr>
-                <w:rFonts w:ascii="Aptos Narrow" w:eastAsia="Times New Roman" w:hAnsi="Aptos Narrow" w:cs="Times New Roman"/>
-                <w:color w:val="000000"/>
-                <w:lang w:val="en-NZ" w:eastAsia="es-CO"/>
-              </w:rPr>
-              <w:t>disappeared</w:t>
+              <w:t>Team members disappeared</w:t>
             </w:r>
           </w:p>
         </w:tc>
@@ -10081,31 +9454,7 @@
                 <w:color w:val="000000"/>
                 <w:lang w:val="en-NZ" w:eastAsia="es-CO"/>
               </w:rPr>
-              <w:t>The group</w:t>
-            </w:r>
-            <w:r>
-              <w:rPr>
-                <w:rFonts w:ascii="Aptos Narrow" w:eastAsia="Times New Roman" w:hAnsi="Aptos Narrow" w:cs="Times New Roman"/>
-                <w:color w:val="000000"/>
-                <w:lang w:val="en-NZ" w:eastAsia="es-CO"/>
-              </w:rPr>
-              <w:t xml:space="preserve"> reports that one or more </w:t>
-            </w:r>
-            <w:r>
-              <w:rPr>
-                <w:rFonts w:ascii="Aptos Narrow" w:eastAsia="Times New Roman" w:hAnsi="Aptos Narrow" w:cs="Times New Roman"/>
-                <w:color w:val="000000"/>
-                <w:lang w:val="en-NZ" w:eastAsia="es-CO"/>
-              </w:rPr>
-              <w:t>members</w:t>
-            </w:r>
-            <w:r>
-              <w:rPr>
-                <w:rFonts w:ascii="Aptos Narrow" w:eastAsia="Times New Roman" w:hAnsi="Aptos Narrow" w:cs="Times New Roman"/>
-                <w:color w:val="000000"/>
-                <w:lang w:val="en-NZ" w:eastAsia="es-CO"/>
-              </w:rPr>
-              <w:t xml:space="preserve"> have not been in contact or have not been responding to communication</w:t>
+              <w:t>The group reports that one or more members have not been in contact or have not been responding to communication</w:t>
             </w:r>
           </w:p>
         </w:tc>
@@ -10477,23 +9826,7 @@
                 <w:color w:val="000000"/>
                 <w:lang w:val="en-NZ" w:eastAsia="es-CO"/>
               </w:rPr>
-              <w:t xml:space="preserve">The group reports not being able to </w:t>
-            </w:r>
-            <w:r>
-              <w:rPr>
-                <w:rFonts w:ascii="Aptos Narrow" w:eastAsia="Times New Roman" w:hAnsi="Aptos Narrow" w:cs="Times New Roman"/>
-                <w:color w:val="000000"/>
-                <w:lang w:val="en-NZ" w:eastAsia="es-CO"/>
-              </w:rPr>
-              <w:t>decide</w:t>
-            </w:r>
-            <w:r>
-              <w:rPr>
-                <w:rFonts w:ascii="Aptos Narrow" w:eastAsia="Times New Roman" w:hAnsi="Aptos Narrow" w:cs="Times New Roman"/>
-                <w:color w:val="000000"/>
-                <w:lang w:val="en-NZ" w:eastAsia="es-CO"/>
-              </w:rPr>
-              <w:t xml:space="preserve"> about the construction material</w:t>
+              <w:t>The group reports not being able to decide about the construction material</w:t>
             </w:r>
           </w:p>
         </w:tc>
@@ -10586,15 +9919,7 @@
                 <w:color w:val="000000"/>
                 <w:lang w:val="en-NZ" w:eastAsia="es-CO"/>
               </w:rPr>
-              <w:t xml:space="preserve">No first contact with a team </w:t>
-            </w:r>
-            <w:r>
-              <w:rPr>
-                <w:rFonts w:ascii="Aptos Narrow" w:eastAsia="Times New Roman" w:hAnsi="Aptos Narrow" w:cs="Times New Roman"/>
-                <w:color w:val="000000"/>
-                <w:lang w:val="en-NZ" w:eastAsia="es-CO"/>
-              </w:rPr>
-              <w:t>member</w:t>
+              <w:t>No first contact with a team member</w:t>
             </w:r>
           </w:p>
         </w:tc>
@@ -10625,31 +9950,7 @@
                 <w:color w:val="000000"/>
                 <w:lang w:val="en-NZ" w:eastAsia="es-CO"/>
               </w:rPr>
-              <w:t xml:space="preserve">The group reports they have not been able to contact one or more team members for the </w:t>
-            </w:r>
-            <w:r>
-              <w:rPr>
-                <w:rFonts w:ascii="Aptos Narrow" w:eastAsia="Times New Roman" w:hAnsi="Aptos Narrow" w:cs="Times New Roman"/>
-                <w:color w:val="000000"/>
-                <w:lang w:val="en-NZ" w:eastAsia="es-CO"/>
-              </w:rPr>
-              <w:t>first</w:t>
-            </w:r>
-            <w:r>
-              <w:rPr>
-                <w:rFonts w:ascii="Aptos Narrow" w:eastAsia="Times New Roman" w:hAnsi="Aptos Narrow" w:cs="Times New Roman"/>
-                <w:color w:val="000000"/>
-                <w:lang w:val="en-NZ" w:eastAsia="es-CO"/>
-              </w:rPr>
-              <w:t xml:space="preserve"> </w:t>
-            </w:r>
-            <w:r>
-              <w:rPr>
-                <w:rFonts w:ascii="Aptos Narrow" w:eastAsia="Times New Roman" w:hAnsi="Aptos Narrow" w:cs="Times New Roman"/>
-                <w:color w:val="000000"/>
-                <w:lang w:val="en-NZ" w:eastAsia="es-CO"/>
-              </w:rPr>
-              <w:t>time</w:t>
+              <w:t>The group reports they have not been able to contact one or more team members for the first time</w:t>
             </w:r>
           </w:p>
         </w:tc>
@@ -10773,23 +10074,7 @@
                 <w:color w:val="000000"/>
                 <w:lang w:val="en-NZ" w:eastAsia="es-CO"/>
               </w:rPr>
-              <w:t xml:space="preserve">The group reports a lack of </w:t>
-            </w:r>
-            <w:r>
-              <w:rPr>
-                <w:rFonts w:ascii="Aptos Narrow" w:eastAsia="Times New Roman" w:hAnsi="Aptos Narrow" w:cs="Times New Roman"/>
-                <w:color w:val="000000"/>
-                <w:lang w:val="en-NZ" w:eastAsia="es-CO"/>
-              </w:rPr>
-              <w:t>communication</w:t>
-            </w:r>
-            <w:r>
-              <w:rPr>
-                <w:rFonts w:ascii="Aptos Narrow" w:eastAsia="Times New Roman" w:hAnsi="Aptos Narrow" w:cs="Times New Roman"/>
-                <w:color w:val="000000"/>
-                <w:lang w:val="en-NZ" w:eastAsia="es-CO"/>
-              </w:rPr>
-              <w:t xml:space="preserve"> from the AE or any other role</w:t>
+              <w:t>The group reports a lack of communication from the AE or any other role</w:t>
             </w:r>
           </w:p>
         </w:tc>
@@ -11046,23 +10331,7 @@
                 <w:color w:val="000000"/>
                 <w:lang w:val="en-NZ" w:eastAsia="es-CO"/>
               </w:rPr>
-              <w:t xml:space="preserve">The group reports that </w:t>
-            </w:r>
-            <w:r>
-              <w:rPr>
-                <w:rFonts w:ascii="Aptos Narrow" w:eastAsia="Times New Roman" w:hAnsi="Aptos Narrow" w:cs="Times New Roman"/>
-                <w:color w:val="000000"/>
-                <w:lang w:val="en-NZ" w:eastAsia="es-CO"/>
-              </w:rPr>
-              <w:t>they were</w:t>
-            </w:r>
-            <w:r>
-              <w:rPr>
-                <w:rFonts w:ascii="Aptos Narrow" w:eastAsia="Times New Roman" w:hAnsi="Aptos Narrow" w:cs="Times New Roman"/>
-                <w:color w:val="000000"/>
-                <w:lang w:val="en-NZ" w:eastAsia="es-CO"/>
-              </w:rPr>
-              <w:t xml:space="preserve"> in contact with the AE during the classroom session</w:t>
+              <w:t>The group reports that they were in contact with the AE during the classroom session</w:t>
             </w:r>
           </w:p>
         </w:tc>
@@ -11186,23 +10455,7 @@
                 <w:color w:val="000000"/>
                 <w:lang w:val="en-NZ" w:eastAsia="es-CO"/>
               </w:rPr>
-              <w:t xml:space="preserve">The group reports that </w:t>
-            </w:r>
-            <w:r>
-              <w:rPr>
-                <w:rFonts w:ascii="Aptos Narrow" w:eastAsia="Times New Roman" w:hAnsi="Aptos Narrow" w:cs="Times New Roman"/>
-                <w:color w:val="000000"/>
-                <w:lang w:val="en-NZ" w:eastAsia="es-CO"/>
-              </w:rPr>
-              <w:t>they were</w:t>
-            </w:r>
-            <w:r>
-              <w:rPr>
-                <w:rFonts w:ascii="Aptos Narrow" w:eastAsia="Times New Roman" w:hAnsi="Aptos Narrow" w:cs="Times New Roman"/>
-                <w:color w:val="000000"/>
-                <w:lang w:val="en-NZ" w:eastAsia="es-CO"/>
-              </w:rPr>
-              <w:t xml:space="preserve"> in contact with a TA or the lecturers during the classroom session</w:t>
+              <w:t>The group reports that they were in contact with a TA or the lecturers during the classroom session</w:t>
             </w:r>
           </w:p>
         </w:tc>
@@ -11295,31 +10548,7 @@
                 <w:color w:val="000000"/>
                 <w:lang w:val="en-NZ" w:eastAsia="es-CO"/>
               </w:rPr>
-              <w:t xml:space="preserve">Asking lecturer to </w:t>
-            </w:r>
-            <w:r>
-              <w:rPr>
-                <w:rFonts w:ascii="Aptos Narrow" w:eastAsia="Times New Roman" w:hAnsi="Aptos Narrow" w:cs="Times New Roman"/>
-                <w:color w:val="000000"/>
-                <w:lang w:val="en-NZ" w:eastAsia="es-CO"/>
-              </w:rPr>
-              <w:t>intervene</w:t>
-            </w:r>
-            <w:r>
-              <w:rPr>
-                <w:rFonts w:ascii="Aptos Narrow" w:eastAsia="Times New Roman" w:hAnsi="Aptos Narrow" w:cs="Times New Roman"/>
-                <w:color w:val="000000"/>
-                <w:lang w:val="en-NZ" w:eastAsia="es-CO"/>
-              </w:rPr>
-              <w:t xml:space="preserve"> with a </w:t>
-            </w:r>
-            <w:r>
-              <w:rPr>
-                <w:rFonts w:ascii="Aptos Narrow" w:eastAsia="Times New Roman" w:hAnsi="Aptos Narrow" w:cs="Times New Roman"/>
-                <w:color w:val="000000"/>
-                <w:lang w:val="en-NZ" w:eastAsia="es-CO"/>
-              </w:rPr>
-              <w:t>student</w:t>
+              <w:t>Asking lecturer to intervene with a student</w:t>
             </w:r>
           </w:p>
         </w:tc>
@@ -11474,23 +10703,7 @@
                 <w:color w:val="000000"/>
                 <w:lang w:val="en-NZ" w:eastAsia="es-CO"/>
               </w:rPr>
-              <w:t xml:space="preserve">The group has been </w:t>
-            </w:r>
-            <w:r>
-              <w:rPr>
-                <w:rFonts w:ascii="Aptos Narrow" w:eastAsia="Times New Roman" w:hAnsi="Aptos Narrow" w:cs="Times New Roman"/>
-                <w:color w:val="000000"/>
-                <w:lang w:val="en-NZ" w:eastAsia="es-CO"/>
-              </w:rPr>
-              <w:t>reorganized,</w:t>
-            </w:r>
-            <w:r>
-              <w:rPr>
-                <w:rFonts w:ascii="Aptos Narrow" w:eastAsia="Times New Roman" w:hAnsi="Aptos Narrow" w:cs="Times New Roman"/>
-                <w:color w:val="000000"/>
-                <w:lang w:val="en-NZ" w:eastAsia="es-CO"/>
-              </w:rPr>
-              <w:t xml:space="preserve"> or a team member has left</w:t>
+              <w:t>The group has been reorganized, or a team member has left</w:t>
             </w:r>
           </w:p>
         </w:tc>
@@ -11583,23 +10796,7 @@
                 <w:color w:val="000000"/>
                 <w:lang w:val="en-NZ" w:eastAsia="es-CO"/>
               </w:rPr>
-              <w:t xml:space="preserve">Working with the </w:t>
-            </w:r>
-            <w:r>
-              <w:rPr>
-                <w:rFonts w:ascii="Aptos Narrow" w:eastAsia="Times New Roman" w:hAnsi="Aptos Narrow" w:cs="Times New Roman"/>
-                <w:color w:val="000000"/>
-                <w:lang w:val="en-NZ" w:eastAsia="es-CO"/>
-              </w:rPr>
-              <w:t>available</w:t>
-            </w:r>
-            <w:r>
-              <w:rPr>
-                <w:rFonts w:ascii="Aptos Narrow" w:eastAsia="Times New Roman" w:hAnsi="Aptos Narrow" w:cs="Times New Roman"/>
-                <w:color w:val="000000"/>
-                <w:lang w:val="en-NZ" w:eastAsia="es-CO"/>
-              </w:rPr>
-              <w:t xml:space="preserve"> information</w:t>
+              <w:t>Working with the available information</w:t>
             </w:r>
           </w:p>
         </w:tc>
@@ -11630,55 +10827,7 @@
                 <w:color w:val="000000"/>
                 <w:lang w:val="en-NZ" w:eastAsia="es-CO"/>
               </w:rPr>
-              <w:t xml:space="preserve">The group reports that </w:t>
-            </w:r>
-            <w:r>
-              <w:rPr>
-                <w:rFonts w:ascii="Aptos Narrow" w:eastAsia="Times New Roman" w:hAnsi="Aptos Narrow" w:cs="Times New Roman"/>
-                <w:color w:val="000000"/>
-                <w:lang w:val="en-NZ" w:eastAsia="es-CO"/>
-              </w:rPr>
-              <w:t>they are</w:t>
-            </w:r>
-            <w:r>
-              <w:rPr>
-                <w:rFonts w:ascii="Aptos Narrow" w:eastAsia="Times New Roman" w:hAnsi="Aptos Narrow" w:cs="Times New Roman"/>
-                <w:color w:val="000000"/>
-                <w:lang w:val="en-NZ" w:eastAsia="es-CO"/>
-              </w:rPr>
-              <w:t xml:space="preserve"> giving up on reaching someone and </w:t>
-            </w:r>
-            <w:r>
-              <w:rPr>
-                <w:rFonts w:ascii="Aptos Narrow" w:eastAsia="Times New Roman" w:hAnsi="Aptos Narrow" w:cs="Times New Roman"/>
-                <w:color w:val="000000"/>
-                <w:lang w:val="en-NZ" w:eastAsia="es-CO"/>
-              </w:rPr>
-              <w:t>they are</w:t>
-            </w:r>
-            <w:r>
-              <w:rPr>
-                <w:rFonts w:ascii="Aptos Narrow" w:eastAsia="Times New Roman" w:hAnsi="Aptos Narrow" w:cs="Times New Roman"/>
-                <w:color w:val="000000"/>
-                <w:lang w:val="en-NZ" w:eastAsia="es-CO"/>
-              </w:rPr>
-              <w:t xml:space="preserve"> working with the </w:t>
-            </w:r>
-            <w:r>
-              <w:rPr>
-                <w:rFonts w:ascii="Aptos Narrow" w:eastAsia="Times New Roman" w:hAnsi="Aptos Narrow" w:cs="Times New Roman"/>
-                <w:color w:val="000000"/>
-                <w:lang w:val="en-NZ" w:eastAsia="es-CO"/>
-              </w:rPr>
-              <w:t>available</w:t>
-            </w:r>
-            <w:r>
-              <w:rPr>
-                <w:rFonts w:ascii="Aptos Narrow" w:eastAsia="Times New Roman" w:hAnsi="Aptos Narrow" w:cs="Times New Roman"/>
-                <w:color w:val="000000"/>
-                <w:lang w:val="en-NZ" w:eastAsia="es-CO"/>
-              </w:rPr>
-              <w:t xml:space="preserve"> resources</w:t>
+              <w:t>The group reports that they are giving up on reaching someone and they are working with the available resources</w:t>
             </w:r>
           </w:p>
         </w:tc>
@@ -11803,19 +10952,11 @@
         </w:rPr>
         <w:t xml:space="preserve"> the tool with some other </w:t>
       </w:r>
-      <w:proofErr w:type="gramStart"/>
-      <w:r>
-        <w:rPr>
-          <w:lang w:val="en-NZ"/>
-        </w:rPr>
-        <w:t>application</w:t>
-      </w:r>
-      <w:proofErr w:type="gramEnd"/>
-      <w:r>
-        <w:rPr>
-          <w:lang w:val="en-NZ"/>
-        </w:rPr>
-        <w:t xml:space="preserve"> </w:t>
+      <w:r>
+        <w:rPr>
+          <w:lang w:val="en-NZ"/>
+        </w:rPr>
+        <w:t xml:space="preserve">application </w:t>
       </w:r>
       <w:r>
         <w:rPr>
@@ -12169,24 +11310,33 @@
     </w:p>
     <w:p>
       <w:pPr>
-        <w:rPr>
-          <w:lang w:val="en-NZ"/>
-        </w:rPr>
-      </w:pPr>
-      <w:r>
-        <w:rPr>
+        <w:pStyle w:val="Ttulo1"/>
+        <w:rPr>
+          <w:sz w:val="22"/>
+          <w:szCs w:val="22"/>
+          <w:lang w:val="en-NZ"/>
+        </w:rPr>
+      </w:pPr>
+      <w:r>
+        <w:rPr>
+          <w:sz w:val="22"/>
+          <w:szCs w:val="22"/>
           <w:lang w:val="en-NZ"/>
         </w:rPr>
         <w:t xml:space="preserve">6.6 Weeks 10 to 13: </w:t>
       </w:r>
       <w:r>
         <w:rPr>
+          <w:sz w:val="22"/>
+          <w:szCs w:val="22"/>
           <w:lang w:val="en-NZ"/>
         </w:rPr>
         <w:t>Interim</w:t>
       </w:r>
       <w:r>
         <w:rPr>
+          <w:sz w:val="22"/>
+          <w:szCs w:val="22"/>
           <w:lang w:val="en-NZ"/>
         </w:rPr>
         <w:t xml:space="preserve"> Client Report</w:t>
@@ -12202,36 +11352,67 @@
         <w:rPr>
           <w:lang w:val="en-NZ"/>
         </w:rPr>
-        <w:t>Reticence to use phones on the classroom</w:t>
-      </w:r>
-    </w:p>
-    <w:p>
-      <w:pPr>
-        <w:rPr>
-          <w:lang w:val="en-NZ"/>
-        </w:rPr>
-      </w:pPr>
-      <w:r>
-        <w:rPr>
-          <w:lang w:val="en-NZ"/>
-        </w:rPr>
-        <w:t>Fallback to very individual work</w:t>
-      </w:r>
-      <w:r>
-        <w:rPr>
-          <w:lang w:val="en-NZ"/>
-        </w:rPr>
-        <w:t>, suited for quick conversation not structured collaboration</w:t>
-      </w:r>
-    </w:p>
-    <w:p>
-      <w:pPr>
-        <w:rPr>
-          <w:lang w:val="en-NZ"/>
-        </w:rPr>
-      </w:pPr>
-      <w:r>
-        <w:rPr>
+        <w:t>The final stretch before the end of the semester was focused on the interim client report, a document that each role had to submit to the client summarizing the most important decisions taken by the group and the progress so far in the development of the project.</w:t>
+      </w:r>
+    </w:p>
+    <w:p>
+      <w:pPr>
+        <w:rPr>
+          <w:lang w:val="en-NZ"/>
+        </w:rPr>
+      </w:pPr>
+      <w:r>
+        <w:rPr>
+          <w:lang w:val="en-NZ"/>
+        </w:rPr>
+        <w:t>Although the poster presentation was at the end an individual task, an important collaborative effort was needed to build the proposal and fulfil all the requirements in the marking criteria. In contrast, the report had minimal collaborative elements, and the situation was quickly reflected by the way the groups approached their work in comparison to previous weeks.</w:t>
+      </w:r>
+    </w:p>
+    <w:p>
+      <w:pPr>
+        <w:rPr>
+          <w:lang w:val="en-NZ"/>
+        </w:rPr>
+      </w:pPr>
+      <w:r>
+        <w:rPr>
+          <w:lang w:val="en-NZ"/>
+        </w:rPr>
+        <w:t>There was a substantial clash with the objectives proposed for the intervention for this final section of the semester. It was not as easy to observe in the classroom the interactions between students nor the use of the Play Models function as intended in the beginning, but it was not a complete loss.</w:t>
+      </w:r>
+    </w:p>
+    <w:p>
+      <w:pPr>
+        <w:rPr>
+          <w:lang w:val="en-NZ"/>
+        </w:rPr>
+      </w:pPr>
+      <w:r>
+        <w:rPr>
+          <w:lang w:val="en-NZ"/>
+        </w:rPr>
+        <w:t xml:space="preserve">The extra time acquired was used to extend the development time planned for the second iteration, and with the help of some of the students that were still consistently showing </w:t>
+      </w:r>
+      <w:r>
+        <w:rPr>
+          <w:lang w:val="en-NZ"/>
+        </w:rPr>
+        <w:t>to the classroom sessions and working as a group, it was possible to discover other scenarios in which WorkshopAR could be integrated better with the work of the students.</w:t>
+      </w:r>
+    </w:p>
+    <w:p>
+      <w:pPr>
+        <w:pStyle w:val="Ttulo2"/>
+        <w:rPr>
+          <w:sz w:val="22"/>
+          <w:szCs w:val="22"/>
+          <w:lang w:val="en-NZ"/>
+        </w:rPr>
+      </w:pPr>
+      <w:r>
+        <w:rPr>
+          <w:sz w:val="22"/>
+          <w:szCs w:val="22"/>
           <w:lang w:val="en-NZ"/>
         </w:rPr>
         <w:t>6.6.1 General Observations</w:t>
@@ -12247,6 +11428,418 @@
         <w:rPr>
           <w:lang w:val="en-NZ"/>
         </w:rPr>
+        <w:t>Besides all the activities organized during the workshop slots to facilitate the communication between students and help groups with the organization of their work, some extra time was given to the students and several of the due dates were moved more space to achieve progress, specially to those groups that initially struggled to get in contact with the AE and had to delay their work waiting for the design proposal or the technical specifications.</w:t>
+      </w:r>
+    </w:p>
+    <w:p>
+      <w:pPr>
+        <w:rPr>
+          <w:lang w:val="en-NZ"/>
+        </w:rPr>
+      </w:pPr>
+      <w:r>
+        <w:rPr>
+          <w:lang w:val="en-NZ"/>
+        </w:rPr>
+        <w:t xml:space="preserve">This extended all the official work for the course to thirteen weeks and promoted a big division between the groups: those that were trying to catch up by using the extra time and those that all but finished the work needed for the semester and were not really in need of the space during the classroom session. This was easily evidenced by the dip on </w:t>
+      </w:r>
+      <w:r>
+        <w:rPr>
+          <w:lang w:val="en-NZ"/>
+        </w:rPr>
+        <w:t xml:space="preserve">the </w:t>
+      </w:r>
+      <w:r>
+        <w:rPr>
+          <w:lang w:val="en-NZ"/>
+        </w:rPr>
+        <w:t>students’ assistance.</w:t>
+      </w:r>
+    </w:p>
+    <w:p>
+      <w:pPr>
+        <w:rPr>
+          <w:lang w:val="en-NZ"/>
+        </w:rPr>
+      </w:pPr>
+      <w:r>
+        <w:rPr>
+          <w:lang w:val="en-NZ"/>
+        </w:rPr>
+        <w:t xml:space="preserve">The general observations for these weeks are easy to summarise: those that were not trying to finish all the missing work for the poster assignment were working on finishing or polishing the interim report. Team D helped a lot during this time, as they were far ahead in their work </w:t>
+      </w:r>
+      <w:r>
+        <w:rPr>
+          <w:lang w:val="en-NZ"/>
+        </w:rPr>
+        <w:lastRenderedPageBreak/>
+        <w:t>and found useful to keep working in the classroom since that mean that they were free to work on something else the rest of the week. The classroom was less chaotic, and work was more layback for all the observations in comparison to the previous weeks, as Figure 9 curiously shows.</w:t>
+      </w:r>
+    </w:p>
+    <w:p>
+      <w:pPr>
+        <w:keepNext/>
+        <w:jc w:val="center"/>
+        <w:rPr>
+          <w:lang w:val="en-NZ"/>
+        </w:rPr>
+      </w:pPr>
+      <w:r>
+        <w:rPr>
+          <w:noProof/>
+          <w:lang w:val="en-NZ"/>
+        </w:rPr>
+        <w:drawing>
+          <wp:inline distT="0" distB="0" distL="0" distR="0" wp14:anchorId="03D20692" wp14:editId="0A1B9474">
+            <wp:extent cx="4724400" cy="2627748"/>
+            <wp:effectExtent l="0" t="0" r="0" b="1270"/>
+            <wp:docPr id="1835459612" name="Imagen 1"/>
+            <wp:cNvGraphicFramePr>
+              <a:graphicFrameLocks xmlns:a="http://schemas.openxmlformats.org/drawingml/2006/main" noChangeAspect="1"/>
+            </wp:cNvGraphicFramePr>
+            <a:graphic xmlns:a="http://schemas.openxmlformats.org/drawingml/2006/main">
+              <a:graphicData uri="http://schemas.openxmlformats.org/drawingml/2006/picture">
+                <pic:pic xmlns:pic="http://schemas.openxmlformats.org/drawingml/2006/picture">
+                  <pic:nvPicPr>
+                    <pic:cNvPr id="0" name="Picture 1"/>
+                    <pic:cNvPicPr>
+                      <a:picLocks noChangeAspect="1" noChangeArrowheads="1"/>
+                    </pic:cNvPicPr>
+                  </pic:nvPicPr>
+                  <pic:blipFill>
+                    <a:blip r:embed="rId17" cstate="print">
+                      <a:extLst>
+                        <a:ext uri="{28A0092B-C50C-407E-A947-70E740481C1C}">
+                          <a14:useLocalDpi xmlns:a14="http://schemas.microsoft.com/office/drawing/2010/main" val="0"/>
+                        </a:ext>
+                      </a:extLst>
+                    </a:blip>
+                    <a:srcRect/>
+                    <a:stretch>
+                      <a:fillRect/>
+                    </a:stretch>
+                  </pic:blipFill>
+                  <pic:spPr bwMode="auto">
+                    <a:xfrm>
+                      <a:off x="0" y="0"/>
+                      <a:ext cx="4732464" cy="2632233"/>
+                    </a:xfrm>
+                    <a:prstGeom prst="rect">
+                      <a:avLst/>
+                    </a:prstGeom>
+                    <a:noFill/>
+                    <a:ln>
+                      <a:noFill/>
+                    </a:ln>
+                  </pic:spPr>
+                </pic:pic>
+              </a:graphicData>
+            </a:graphic>
+          </wp:inline>
+        </w:drawing>
+      </w:r>
+    </w:p>
+    <w:p>
+      <w:pPr>
+        <w:pStyle w:val="Descripcin"/>
+        <w:jc w:val="center"/>
+        <w:rPr>
+          <w:lang w:val="en-NZ"/>
+        </w:rPr>
+      </w:pPr>
+      <w:r>
+        <w:rPr>
+          <w:lang w:val="en-NZ"/>
+        </w:rPr>
+        <w:t xml:space="preserve">Figure </w:t>
+      </w:r>
+      <w:r>
+        <w:rPr>
+          <w:lang w:val="en-NZ"/>
+        </w:rPr>
+        <w:fldChar w:fldCharType="begin"/>
+      </w:r>
+      <w:r>
+        <w:rPr>
+          <w:lang w:val="en-NZ"/>
+        </w:rPr>
+        <w:instrText xml:space="preserve"> SEQ Figure \* ARABIC </w:instrText>
+      </w:r>
+      <w:r>
+        <w:rPr>
+          <w:lang w:val="en-NZ"/>
+        </w:rPr>
+        <w:fldChar w:fldCharType="separate"/>
+      </w:r>
+      <w:r>
+        <w:rPr>
+          <w:noProof/>
+          <w:lang w:val="en-NZ"/>
+        </w:rPr>
+        <w:t>9</w:t>
+      </w:r>
+      <w:r>
+        <w:rPr>
+          <w:lang w:val="en-NZ"/>
+        </w:rPr>
+        <w:fldChar w:fldCharType="end"/>
+      </w:r>
+      <w:r>
+        <w:rPr>
+          <w:lang w:val="en-NZ"/>
+        </w:rPr>
+        <w:t xml:space="preserve"> Focus on Individual Work </w:t>
+      </w:r>
+      <w:r>
+        <w:rPr>
+          <w:lang w:val="en-NZ"/>
+        </w:rPr>
+        <w:t>D</w:t>
+      </w:r>
+      <w:r>
+        <w:rPr>
+          <w:lang w:val="en-NZ"/>
+        </w:rPr>
+        <w:t>uring the Group Sessions</w:t>
+      </w:r>
+    </w:p>
+    <w:p>
+      <w:pPr>
+        <w:rPr>
+          <w:lang w:val="en-NZ"/>
+        </w:rPr>
+      </w:pPr>
+      <w:r>
+        <w:rPr>
+          <w:lang w:val="en-NZ"/>
+        </w:rPr>
+        <w:t xml:space="preserve">There was minimal communication between them, mostly idle chat, they were </w:t>
+      </w:r>
+      <w:r>
+        <w:rPr>
+          <w:lang w:val="en-NZ"/>
+        </w:rPr>
+        <w:t xml:space="preserve">all </w:t>
+      </w:r>
+      <w:r>
+        <w:rPr>
+          <w:lang w:val="en-NZ"/>
+        </w:rPr>
+        <w:t>focused on their own work and were gathered as a group in the same table mostly out of routine. When asked why they had seated in such a peculiar way they laugh because they had not realised they were all on the same side of the table, and they were only searching for the closest power outlets.</w:t>
+      </w:r>
+    </w:p>
+    <w:p>
+      <w:pPr>
+        <w:rPr>
+          <w:lang w:val="en-NZ"/>
+        </w:rPr>
+      </w:pPr>
+      <w:r>
+        <w:rPr>
+          <w:lang w:val="en-NZ"/>
+        </w:rPr>
+        <w:t xml:space="preserve">It was necessary to make more direct questions to understand better their </w:t>
+      </w:r>
+      <w:r>
+        <w:rPr>
+          <w:lang w:val="en-NZ"/>
+        </w:rPr>
+        <w:t>work</w:t>
+      </w:r>
+      <w:r>
+        <w:rPr>
+          <w:lang w:val="en-NZ"/>
+        </w:rPr>
+        <w:t xml:space="preserve"> and their plan for the session. The idea, as explained in the description of the interim report present on the LMS, was to gather the information and feedback received from the poster presentation and work in a report as a group, and then extract the sections relevant for each role for the individual submissions.</w:t>
+      </w:r>
+    </w:p>
+    <w:p>
+      <w:pPr>
+        <w:rPr>
+          <w:lang w:val="en-NZ"/>
+        </w:rPr>
+      </w:pPr>
+      <w:r>
+        <w:rPr>
+          <w:lang w:val="en-NZ"/>
+        </w:rPr>
+        <w:t>The group confessed that they were not working like that at all</w:t>
+      </w:r>
+      <w:r>
+        <w:rPr>
+          <w:lang w:val="en-NZ"/>
+        </w:rPr>
+        <w:t>, and although they were all working in the report, each students had its own objectives and was moving at his own pace</w:t>
+      </w:r>
+      <w:r>
+        <w:rPr>
+          <w:lang w:val="en-NZ"/>
+        </w:rPr>
+        <w:t>.</w:t>
+      </w:r>
+      <w:r>
+        <w:rPr>
+          <w:lang w:val="en-NZ"/>
+        </w:rPr>
+        <w:t xml:space="preserve"> They had sought feedback from one another a couple of times, but they were mostly working alone. The </w:t>
+      </w:r>
+      <w:r>
+        <w:rPr>
+          <w:lang w:val="en-NZ"/>
+        </w:rPr>
+        <w:t>main</w:t>
+      </w:r>
+      <w:r>
+        <w:rPr>
+          <w:lang w:val="en-NZ"/>
+        </w:rPr>
+        <w:t xml:space="preserve"> reason to </w:t>
+      </w:r>
+      <w:r>
+        <w:rPr>
+          <w:lang w:val="en-NZ"/>
+        </w:rPr>
+        <w:t>keep</w:t>
+      </w:r>
+      <w:r>
+        <w:rPr>
+          <w:lang w:val="en-NZ"/>
+        </w:rPr>
+        <w:t xml:space="preserve"> coming to the classroom was to have easy access to the lecturers if needed, and they did talk with the TA team a couple of </w:t>
+      </w:r>
+      <w:r>
+        <w:rPr>
+          <w:lang w:val="en-NZ"/>
+        </w:rPr>
+        <w:t>times</w:t>
+      </w:r>
+      <w:r>
+        <w:rPr>
+          <w:lang w:val="en-NZ"/>
+        </w:rPr>
+        <w:t xml:space="preserve"> during the observations</w:t>
+      </w:r>
+      <w:r>
+        <w:rPr>
+          <w:lang w:val="en-NZ"/>
+        </w:rPr>
+        <w:t>, mostly seeking quick feedback on the current state of the report.</w:t>
+      </w:r>
+    </w:p>
+    <w:p>
+      <w:pPr>
+        <w:rPr>
+          <w:lang w:val="en-NZ"/>
+        </w:rPr>
+      </w:pPr>
+      <w:r>
+        <w:rPr>
+          <w:lang w:val="en-NZ"/>
+        </w:rPr>
+        <w:t>The group also helped in identifying why the collaborative work has fallen of so much. Mainly it was because t</w:t>
+      </w:r>
+      <w:r>
+        <w:rPr>
+          <w:lang w:val="en-NZ"/>
+        </w:rPr>
+        <w:t xml:space="preserve">he biggest source of information that needed collaborative input was already done with the </w:t>
+      </w:r>
+      <w:r>
+        <w:rPr>
+          <w:lang w:val="en-NZ"/>
+        </w:rPr>
+        <w:t>poster;</w:t>
+      </w:r>
+      <w:r>
+        <w:rPr>
+          <w:lang w:val="en-NZ"/>
+        </w:rPr>
+        <w:t xml:space="preserve"> they just </w:t>
+      </w:r>
+      <w:r>
+        <w:rPr>
+          <w:lang w:val="en-NZ"/>
+        </w:rPr>
+        <w:t>needed</w:t>
+      </w:r>
+      <w:r>
+        <w:rPr>
+          <w:lang w:val="en-NZ"/>
+        </w:rPr>
+        <w:t xml:space="preserve"> to refer to each individual presentation</w:t>
+      </w:r>
+      <w:r>
+        <w:rPr>
+          <w:lang w:val="en-NZ"/>
+        </w:rPr>
+        <w:t xml:space="preserve">, </w:t>
+      </w:r>
+      <w:r>
+        <w:rPr>
+          <w:lang w:val="en-NZ"/>
+        </w:rPr>
+        <w:t xml:space="preserve">already tailored to their respective roles. The other big input for the activity was the feedback given by the teaching staff and other peers during the presentations in weeks 8 and 9, which </w:t>
+      </w:r>
+      <w:r>
+        <w:rPr>
+          <w:lang w:val="en-NZ"/>
+        </w:rPr>
+        <w:t>was</w:t>
+      </w:r>
+      <w:r>
+        <w:rPr>
+          <w:lang w:val="en-NZ"/>
+        </w:rPr>
+        <w:t xml:space="preserve"> also gathered individually. The group analysed that they had worked very well for the poster presentation, the group was </w:t>
+      </w:r>
+      <w:r>
+        <w:rPr>
+          <w:lang w:val="en-NZ"/>
+        </w:rPr>
+        <w:t>coordinated,</w:t>
+      </w:r>
+      <w:r>
+        <w:rPr>
+          <w:lang w:val="en-NZ"/>
+        </w:rPr>
+        <w:t xml:space="preserve"> and the result were very good, so they felt confident they could work individually to finish the report</w:t>
+      </w:r>
+      <w:r>
+        <w:rPr>
+          <w:lang w:val="en-NZ"/>
+        </w:rPr>
+        <w:t>.</w:t>
+      </w:r>
+    </w:p>
+    <w:p>
+      <w:pPr>
+        <w:rPr>
+          <w:lang w:val="en-NZ"/>
+        </w:rPr>
+      </w:pPr>
+    </w:p>
+    <w:p>
+      <w:pPr>
+        <w:rPr>
+          <w:lang w:val="en-NZ"/>
+        </w:rPr>
+      </w:pPr>
+    </w:p>
+    <w:p>
+      <w:pPr>
+        <w:pStyle w:val="Ttulo2"/>
+        <w:rPr>
+          <w:sz w:val="22"/>
+          <w:szCs w:val="22"/>
+          <w:lang w:val="en-NZ"/>
+        </w:rPr>
+      </w:pPr>
+      <w:r>
+        <w:rPr>
+          <w:sz w:val="22"/>
+          <w:szCs w:val="22"/>
+          <w:lang w:val="en-NZ"/>
+        </w:rPr>
         <w:t>6.6.2 Intervention with WorkshopAR</w:t>
       </w:r>
     </w:p>
@@ -12260,6 +11853,123 @@
         <w:rPr>
           <w:lang w:val="en-NZ"/>
         </w:rPr>
+        <w:t>Team D offered their participation for two different observations. Both had the objective of testing more scenarios for the Play Models and to explore was to integrate the function better with the work of the course. Since Team D was already familiar with WorkshopAR and with the general objective of the research, it was useful to hear ideas from the group about what could be changed, improved or added to WorkshopAR. More than ideas, they identified two main issues they considered were making hard to integrate more WorkshopAR with their work:</w:t>
+      </w:r>
+    </w:p>
+    <w:p>
+      <w:pPr>
+        <w:pStyle w:val="Prrafodelista"/>
+        <w:numPr>
+          <w:ilvl w:val="0"/>
+          <w:numId w:val="21"/>
+        </w:numPr>
+        <w:rPr>
+          <w:lang w:val="en-NZ"/>
+        </w:rPr>
+      </w:pPr>
+      <w:r>
+        <w:rPr>
+          <w:lang w:val="en-NZ"/>
+        </w:rPr>
+        <w:t>They would need to juggle work on the computer and on the phone. It was good to have access to the Room created in AR, but they would have to constantly leap from the phone to the computer to do something with the activities being done in WorkshopAR.</w:t>
+      </w:r>
+    </w:p>
+    <w:p>
+      <w:pPr>
+        <w:pStyle w:val="Prrafodelista"/>
+        <w:numPr>
+          <w:ilvl w:val="0"/>
+          <w:numId w:val="21"/>
+        </w:numPr>
+        <w:rPr>
+          <w:lang w:val="en-NZ"/>
+        </w:rPr>
+      </w:pPr>
+      <w:r>
+        <w:rPr>
+          <w:lang w:val="en-NZ"/>
+        </w:rPr>
+        <w:t>It was odd to them that there was s much emphasis on working with their phone. Some of them were actively trying to reduce their screen time with the phone and the classroom sessions were and ideal place to leave the phone aside and focus on work. Using the phone as the main tool for working with the group felt like running in the opposite direction of what they were trying to achieve.</w:t>
+      </w:r>
+    </w:p>
+    <w:p>
+      <w:pPr>
+        <w:rPr>
+          <w:lang w:val="en-NZ"/>
+        </w:rPr>
+      </w:pPr>
+      <w:r>
+        <w:rPr>
+          <w:lang w:val="en-NZ"/>
+        </w:rPr>
+        <w:t>During those two observation</w:t>
+      </w:r>
+      <w:r>
+        <w:rPr>
+          <w:lang w:val="en-NZ"/>
+        </w:rPr>
+        <w:t>s</w:t>
+      </w:r>
+      <w:r>
+        <w:rPr>
+          <w:lang w:val="en-NZ"/>
+        </w:rPr>
+        <w:t xml:space="preserve"> it was possible to run through the main functionalities of WorkshopAR again, from the room configuration to the to quick mock-up interactions with the Play Models, the annotations and the </w:t>
+      </w:r>
+      <w:r>
+        <w:rPr>
+          <w:lang w:val="en-NZ"/>
+        </w:rPr>
+        <w:t>debate features, these last two in a more complete state by now, which allowed for better feedback about the user experience.</w:t>
+      </w:r>
+    </w:p>
+    <w:p>
+      <w:pPr>
+        <w:rPr>
+          <w:lang w:val="en-NZ"/>
+        </w:rPr>
+      </w:pPr>
+      <w:r>
+        <w:rPr>
+          <w:lang w:val="en-NZ"/>
+        </w:rPr>
+        <w:t>It was possible to reiterate several of the points that had already been observed: the student acting as host acquired the responsibility of leading the activity despite not really having more responsibilities after the configuration, and the interface of the debate tool was prompting the students to propose more elements than the ones needed for the debates. Issues with the technical aspects of the implementation, like a constant drift of the AR visualisation whenever focus of the marker was lost was also mentioned and related to that earlier point about needed to hop constantly from the phone to another device like the computer.</w:t>
+      </w:r>
+    </w:p>
+    <w:p>
+      <w:pPr>
+        <w:rPr>
+          <w:lang w:val="en-NZ"/>
+        </w:rPr>
+      </w:pPr>
+      <w:r>
+        <w:rPr>
+          <w:lang w:val="en-NZ"/>
+        </w:rPr>
+        <w:t>When asked which of al the functionalities they just had tested, they considered offered the most valuable for their group work, the answer was unanimous: the debate tool was easier and quick to use, and they were resonating a lot with the emoji-like visuals used to represent the answers without needed text. The annotations was a close second if it was possible to have a more consisted view of the AR scene</w:t>
+      </w:r>
+      <w:r>
+        <w:rPr>
+          <w:lang w:val="en-NZ"/>
+        </w:rPr>
+        <w:t xml:space="preserve"> and if it was possible to extend its use beyond just text.</w:t>
+      </w:r>
+    </w:p>
+    <w:p>
+      <w:pPr>
+        <w:pStyle w:val="Ttulo2"/>
+        <w:rPr>
+          <w:sz w:val="22"/>
+          <w:szCs w:val="22"/>
+          <w:lang w:val="en-NZ"/>
+        </w:rPr>
+      </w:pPr>
+      <w:r>
+        <w:rPr>
+          <w:sz w:val="22"/>
+          <w:szCs w:val="22"/>
+          <w:lang w:val="en-NZ"/>
+        </w:rPr>
         <w:t>6.6.3 Preliminary Analysis</w:t>
       </w:r>
     </w:p>
@@ -12273,6 +11983,331 @@
         <w:rPr>
           <w:lang w:val="en-NZ"/>
         </w:rPr>
+        <w:t xml:space="preserve">There was a strong contrast between the work done for the poster presentation and the interim report. The teaching staff commented that it was not exactly the intended outcome. The instructions did aske for a first version of the report to be worked collaboratively, but the </w:t>
+      </w:r>
+      <w:r>
+        <w:rPr>
+          <w:lang w:val="en-NZ"/>
+        </w:rPr>
+        <w:lastRenderedPageBreak/>
+        <w:t>reality was that there was no need to doit, al the resources were ready for each student individually, a situation that exemplified very well that collaborative work was not a natural occurrence and it had to be properly designed</w:t>
+      </w:r>
+      <w:r>
+        <w:rPr>
+          <w:lang w:val="en-NZ"/>
+        </w:rPr>
+        <w:t>. The teaching staff was very satisfied with the results obtained for the poster, and the observations did corroborate very interesting instances of collaborative work and collaborative learning, as they had been described in previous sections.</w:t>
+      </w:r>
+    </w:p>
+    <w:p>
+      <w:pPr>
+        <w:rPr>
+          <w:lang w:val="en-NZ"/>
+        </w:rPr>
+      </w:pPr>
+      <w:r>
+        <w:rPr>
+          <w:lang w:val="en-NZ"/>
+        </w:rPr>
+        <w:t>For WorkshopAR and the overall intervention in collaborative learning, it was also possible to line up some interesting preliminary results, either positive, negative or in need of work for the next semester.</w:t>
+      </w:r>
+    </w:p>
+    <w:p>
+      <w:pPr>
+        <w:rPr>
+          <w:lang w:val="en-NZ"/>
+        </w:rPr>
+      </w:pPr>
+      <w:r>
+        <w:rPr>
+          <w:lang w:val="en-NZ"/>
+        </w:rPr>
+        <w:t>Two main positive outcomes so far observed in the work with students:</w:t>
+      </w:r>
+    </w:p>
+    <w:p>
+      <w:pPr>
+        <w:pStyle w:val="Prrafodelista"/>
+        <w:numPr>
+          <w:ilvl w:val="0"/>
+          <w:numId w:val="22"/>
+        </w:numPr>
+        <w:rPr>
+          <w:lang w:val="en-NZ"/>
+        </w:rPr>
+      </w:pPr>
+      <w:r>
+        <w:rPr>
+          <w:lang w:val="en-NZ"/>
+        </w:rPr>
+        <w:t>The structure promoted by WorkshopAR was helping the students to be more conscious of how they were managing their activities as a group. The students started to frame their work in terms of goals, tasks and responsibilities once introduced to those concepts.</w:t>
+      </w:r>
+    </w:p>
+    <w:p>
+      <w:pPr>
+        <w:pStyle w:val="Prrafodelista"/>
+        <w:numPr>
+          <w:ilvl w:val="0"/>
+          <w:numId w:val="22"/>
+        </w:numPr>
+        <w:rPr>
+          <w:lang w:val="en-NZ"/>
+        </w:rPr>
+      </w:pPr>
+      <w:r>
+        <w:rPr>
+          <w:lang w:val="en-NZ"/>
+        </w:rPr>
+        <w:t>Several of the visual elements used to augment the space used for work were creating the intended result of group cohesion and added meaning. Students recognized the value “starting the work session” by joining the room, and it was possible to observe students giving extra meaning to spaces like walls or tables using annotations or conveying extra meaning to a conversation using the debates and the visual elements added to the responses.</w:t>
+      </w:r>
+    </w:p>
+    <w:p>
+      <w:pPr>
+        <w:rPr>
+          <w:lang w:val="en-NZ"/>
+        </w:rPr>
+      </w:pPr>
+      <w:r>
+        <w:rPr>
+          <w:lang w:val="en-NZ"/>
+        </w:rPr>
+        <w:t xml:space="preserve">It was also possible to </w:t>
+      </w:r>
+      <w:r>
+        <w:rPr>
+          <w:lang w:val="en-NZ"/>
+        </w:rPr>
+        <w:t>identify</w:t>
+      </w:r>
+      <w:r>
+        <w:rPr>
+          <w:lang w:val="en-NZ"/>
+        </w:rPr>
+        <w:t xml:space="preserve"> several negative elements </w:t>
+      </w:r>
+      <w:r>
+        <w:rPr>
+          <w:lang w:val="en-NZ"/>
+        </w:rPr>
+        <w:t xml:space="preserve">either promoted by the WorkshopAR or that were never considered during the design stage. Some of </w:t>
+      </w:r>
+      <w:r>
+        <w:rPr>
+          <w:lang w:val="en-NZ"/>
+        </w:rPr>
+        <w:t>these elements</w:t>
+      </w:r>
+      <w:r>
+        <w:rPr>
+          <w:lang w:val="en-NZ"/>
+        </w:rPr>
+        <w:t xml:space="preserve"> are</w:t>
+      </w:r>
+      <w:r>
+        <w:rPr>
+          <w:lang w:val="en-NZ"/>
+        </w:rPr>
+        <w:t xml:space="preserve"> </w:t>
+      </w:r>
+      <w:r>
+        <w:rPr>
+          <w:lang w:val="en-NZ"/>
+        </w:rPr>
+        <w:t>e</w:t>
+      </w:r>
+      <w:r>
+        <w:rPr>
+          <w:lang w:val="en-NZ"/>
+        </w:rPr>
+        <w:t>specially</w:t>
+      </w:r>
+      <w:r>
+        <w:rPr>
+          <w:lang w:val="en-NZ"/>
+        </w:rPr>
+        <w:t xml:space="preserve"> relevant</w:t>
+      </w:r>
+      <w:r>
+        <w:rPr>
+          <w:lang w:val="en-NZ"/>
+        </w:rPr>
+        <w:t xml:space="preserve"> because they were directly mentioned by the students</w:t>
+      </w:r>
+      <w:r>
+        <w:rPr>
+          <w:lang w:val="en-NZ"/>
+        </w:rPr>
+        <w:t xml:space="preserve"> </w:t>
+      </w:r>
+      <w:r>
+        <w:rPr>
+          <w:lang w:val="en-NZ"/>
+        </w:rPr>
+        <w:t>and not only observed:</w:t>
+      </w:r>
+    </w:p>
+    <w:p>
+      <w:pPr>
+        <w:pStyle w:val="Prrafodelista"/>
+        <w:numPr>
+          <w:ilvl w:val="0"/>
+          <w:numId w:val="23"/>
+        </w:numPr>
+        <w:rPr>
+          <w:lang w:val="en-NZ"/>
+        </w:rPr>
+      </w:pPr>
+      <w:r>
+        <w:rPr>
+          <w:lang w:val="en-NZ"/>
+        </w:rPr>
+        <w:t>It was uncomfortable and very unpractical to keep jumping from the computer to the phone, and the tool was not exactly built to be constantly put in suspension. A lot of time was used just setting up WorkshopAR.</w:t>
+      </w:r>
+    </w:p>
+    <w:p>
+      <w:pPr>
+        <w:pStyle w:val="Prrafodelista"/>
+        <w:numPr>
+          <w:ilvl w:val="0"/>
+          <w:numId w:val="23"/>
+        </w:numPr>
+        <w:rPr>
+          <w:lang w:val="en-NZ"/>
+        </w:rPr>
+      </w:pPr>
+      <w:r>
+        <w:rPr>
+          <w:lang w:val="en-NZ"/>
+        </w:rPr>
+        <w:t>Students preferred quick and easy interactions between them. Long conversations and long debates were simply not happening.</w:t>
+      </w:r>
+    </w:p>
+    <w:p>
+      <w:pPr>
+        <w:pStyle w:val="Prrafodelista"/>
+        <w:numPr>
+          <w:ilvl w:val="0"/>
+          <w:numId w:val="23"/>
+        </w:numPr>
+        <w:rPr>
+          <w:lang w:val="en-NZ"/>
+        </w:rPr>
+      </w:pPr>
+      <w:r>
+        <w:rPr>
+          <w:lang w:val="en-NZ"/>
+        </w:rPr>
+        <w:t>The project was big and had several moving parts. A lot of work was done during the classroom sessions but there was a lot of collaborative effort also happening outside. There was no way to coordinate the things done outside WorkshopAR with the things done with it.</w:t>
+      </w:r>
+    </w:p>
+    <w:p>
+      <w:pPr>
+        <w:rPr>
+          <w:lang w:val="en-NZ"/>
+        </w:rPr>
+      </w:pPr>
+      <w:r>
+        <w:rPr>
+          <w:lang w:val="en-NZ"/>
+        </w:rPr>
+        <w:t xml:space="preserve">Finally, there were some aspects of the current experience that could be iterated on during the semester break </w:t>
+      </w:r>
+      <w:r>
+        <w:rPr>
+          <w:lang w:val="en-NZ"/>
+        </w:rPr>
+        <w:t>to</w:t>
+      </w:r>
+      <w:r>
+        <w:rPr>
+          <w:lang w:val="en-NZ"/>
+        </w:rPr>
+        <w:t xml:space="preserve"> get a better response from the students or to explore some aspects of the collaborative learning process that were not taken into consideration during the design phase:</w:t>
+      </w:r>
+    </w:p>
+    <w:p>
+      <w:pPr>
+        <w:pStyle w:val="Prrafodelista"/>
+        <w:numPr>
+          <w:ilvl w:val="0"/>
+          <w:numId w:val="24"/>
+        </w:numPr>
+        <w:rPr>
+          <w:lang w:val="en-NZ"/>
+        </w:rPr>
+      </w:pPr>
+      <w:r>
+        <w:rPr>
+          <w:lang w:val="en-NZ"/>
+        </w:rPr>
+        <w:t>The students were resonating the most with the quick interactions present in the annotations and debate functionalities, and it could be possible to expanded them to promote more activities of that kind during the work sessions.</w:t>
+      </w:r>
+    </w:p>
+    <w:p>
+      <w:pPr>
+        <w:pStyle w:val="Prrafodelista"/>
+        <w:numPr>
+          <w:ilvl w:val="0"/>
+          <w:numId w:val="24"/>
+        </w:numPr>
+        <w:rPr>
+          <w:lang w:val="en-NZ"/>
+        </w:rPr>
+      </w:pPr>
+      <w:r>
+        <w:rPr>
+          <w:lang w:val="en-NZ"/>
+        </w:rPr>
+        <w:t>Create a setting in which the phone was seen more as a work tool and not a distraction.</w:t>
+      </w:r>
+    </w:p>
+    <w:p>
+      <w:pPr>
+        <w:pStyle w:val="Prrafodelista"/>
+        <w:numPr>
+          <w:ilvl w:val="0"/>
+          <w:numId w:val="24"/>
+        </w:numPr>
+        <w:rPr>
+          <w:lang w:val="en-NZ"/>
+        </w:rPr>
+      </w:pPr>
+      <w:r>
+        <w:rPr>
+          <w:lang w:val="en-NZ"/>
+        </w:rPr>
+        <w:lastRenderedPageBreak/>
+        <w:t>Means to configure the amount of structure enforced by WorkshopAR to accommodate those group that did not need that much guidance or were already familiar with the workflow promoted by the software.</w:t>
+      </w:r>
+    </w:p>
+    <w:p>
+      <w:pPr>
+        <w:rPr>
+          <w:lang w:val="en-NZ"/>
+        </w:rPr>
+      </w:pPr>
+      <w:r>
+        <w:rPr>
+          <w:lang w:val="en-NZ"/>
+        </w:rPr>
+        <w:t>This analysis helped to organize and focus the work needed during the semester break, to proposed clear objectives for the second iteration of development and to prepare the second round of observations to tackle the issues and opportunities found during the first semester.</w:t>
+      </w:r>
+    </w:p>
+    <w:p>
+      <w:pPr>
+        <w:pStyle w:val="Ttulo1"/>
+        <w:rPr>
+          <w:sz w:val="22"/>
+          <w:szCs w:val="22"/>
+          <w:lang w:val="en-NZ"/>
+        </w:rPr>
+      </w:pPr>
+      <w:r>
+        <w:rPr>
+          <w:sz w:val="22"/>
+          <w:szCs w:val="22"/>
+          <w:lang w:val="en-NZ"/>
+        </w:rPr>
         <w:t>6.7 Iterations over the semester break</w:t>
       </w:r>
     </w:p>
@@ -12300,6 +12335,32 @@
           <w:lang w:val="en-NZ"/>
         </w:rPr>
         <w:t>Capitalize on the annotation and the debates</w:t>
+      </w:r>
+    </w:p>
+    <w:p>
+      <w:pPr>
+        <w:rPr>
+          <w:lang w:val="en-NZ"/>
+        </w:rPr>
+      </w:pPr>
+      <w:r>
+        <w:rPr>
+          <w:lang w:val="en-NZ"/>
+        </w:rPr>
+        <w:t>Changes to the format proposed by the lecturers</w:t>
+      </w:r>
+    </w:p>
+    <w:p>
+      <w:pPr>
+        <w:rPr>
+          <w:lang w:val="en-NZ"/>
+        </w:rPr>
+      </w:pPr>
+      <w:r>
+        <w:rPr>
+          <w:lang w:val="en-NZ"/>
+        </w:rPr>
+        <w:t>Interview with AE and how dissonant was the work of the CM</w:t>
       </w:r>
     </w:p>
     <w:p>
@@ -13130,6 +13191,119 @@
     </w:lvl>
   </w:abstractNum>
   <w:abstractNum w:abstractNumId="5" w15:restartNumberingAfterBreak="0">
+    <w:nsid w:val="2A832CEB"/>
+    <w:multiLevelType w:val="hybridMultilevel"/>
+    <w:tmpl w:val="D95C5B8A"/>
+    <w:lvl w:ilvl="0" w:tplc="240A0001">
+      <w:start w:val="1"/>
+      <w:numFmt w:val="bullet"/>
+      <w:lvlText w:val=""/>
+      <w:lvlJc w:val="left"/>
+      <w:pPr>
+        <w:ind w:left="780" w:hanging="360"/>
+      </w:pPr>
+      <w:rPr>
+        <w:rFonts w:ascii="Symbol" w:hAnsi="Symbol" w:hint="default"/>
+      </w:rPr>
+    </w:lvl>
+    <w:lvl w:ilvl="1" w:tplc="240A0003" w:tentative="1">
+      <w:start w:val="1"/>
+      <w:numFmt w:val="bullet"/>
+      <w:lvlText w:val="o"/>
+      <w:lvlJc w:val="left"/>
+      <w:pPr>
+        <w:ind w:left="1500" w:hanging="360"/>
+      </w:pPr>
+      <w:rPr>
+        <w:rFonts w:ascii="Courier New" w:hAnsi="Courier New" w:cs="Courier New" w:hint="default"/>
+      </w:rPr>
+    </w:lvl>
+    <w:lvl w:ilvl="2" w:tplc="240A0005" w:tentative="1">
+      <w:start w:val="1"/>
+      <w:numFmt w:val="bullet"/>
+      <w:lvlText w:val=""/>
+      <w:lvlJc w:val="left"/>
+      <w:pPr>
+        <w:ind w:left="2220" w:hanging="360"/>
+      </w:pPr>
+      <w:rPr>
+        <w:rFonts w:ascii="Wingdings" w:hAnsi="Wingdings" w:hint="default"/>
+      </w:rPr>
+    </w:lvl>
+    <w:lvl w:ilvl="3" w:tplc="240A0001" w:tentative="1">
+      <w:start w:val="1"/>
+      <w:numFmt w:val="bullet"/>
+      <w:lvlText w:val=""/>
+      <w:lvlJc w:val="left"/>
+      <w:pPr>
+        <w:ind w:left="2940" w:hanging="360"/>
+      </w:pPr>
+      <w:rPr>
+        <w:rFonts w:ascii="Symbol" w:hAnsi="Symbol" w:hint="default"/>
+      </w:rPr>
+    </w:lvl>
+    <w:lvl w:ilvl="4" w:tplc="240A0003" w:tentative="1">
+      <w:start w:val="1"/>
+      <w:numFmt w:val="bullet"/>
+      <w:lvlText w:val="o"/>
+      <w:lvlJc w:val="left"/>
+      <w:pPr>
+        <w:ind w:left="3660" w:hanging="360"/>
+      </w:pPr>
+      <w:rPr>
+        <w:rFonts w:ascii="Courier New" w:hAnsi="Courier New" w:cs="Courier New" w:hint="default"/>
+      </w:rPr>
+    </w:lvl>
+    <w:lvl w:ilvl="5" w:tplc="240A0005" w:tentative="1">
+      <w:start w:val="1"/>
+      <w:numFmt w:val="bullet"/>
+      <w:lvlText w:val=""/>
+      <w:lvlJc w:val="left"/>
+      <w:pPr>
+        <w:ind w:left="4380" w:hanging="360"/>
+      </w:pPr>
+      <w:rPr>
+        <w:rFonts w:ascii="Wingdings" w:hAnsi="Wingdings" w:hint="default"/>
+      </w:rPr>
+    </w:lvl>
+    <w:lvl w:ilvl="6" w:tplc="240A0001" w:tentative="1">
+      <w:start w:val="1"/>
+      <w:numFmt w:val="bullet"/>
+      <w:lvlText w:val=""/>
+      <w:lvlJc w:val="left"/>
+      <w:pPr>
+        <w:ind w:left="5100" w:hanging="360"/>
+      </w:pPr>
+      <w:rPr>
+        <w:rFonts w:ascii="Symbol" w:hAnsi="Symbol" w:hint="default"/>
+      </w:rPr>
+    </w:lvl>
+    <w:lvl w:ilvl="7" w:tplc="240A0003" w:tentative="1">
+      <w:start w:val="1"/>
+      <w:numFmt w:val="bullet"/>
+      <w:lvlText w:val="o"/>
+      <w:lvlJc w:val="left"/>
+      <w:pPr>
+        <w:ind w:left="5820" w:hanging="360"/>
+      </w:pPr>
+      <w:rPr>
+        <w:rFonts w:ascii="Courier New" w:hAnsi="Courier New" w:cs="Courier New" w:hint="default"/>
+      </w:rPr>
+    </w:lvl>
+    <w:lvl w:ilvl="8" w:tplc="240A0005" w:tentative="1">
+      <w:start w:val="1"/>
+      <w:numFmt w:val="bullet"/>
+      <w:lvlText w:val=""/>
+      <w:lvlJc w:val="left"/>
+      <w:pPr>
+        <w:ind w:left="6540" w:hanging="360"/>
+      </w:pPr>
+      <w:rPr>
+        <w:rFonts w:ascii="Wingdings" w:hAnsi="Wingdings" w:hint="default"/>
+      </w:rPr>
+    </w:lvl>
+  </w:abstractNum>
+  <w:abstractNum w:abstractNumId="6" w15:restartNumberingAfterBreak="0">
     <w:nsid w:val="354F4453"/>
     <w:multiLevelType w:val="hybridMultilevel"/>
     <w:tmpl w:val="E474EDD4"/>
@@ -13242,7 +13416,7 @@
       </w:rPr>
     </w:lvl>
   </w:abstractNum>
-  <w:abstractNum w:abstractNumId="6" w15:restartNumberingAfterBreak="0">
+  <w:abstractNum w:abstractNumId="7" w15:restartNumberingAfterBreak="0">
     <w:nsid w:val="36720225"/>
     <w:multiLevelType w:val="hybridMultilevel"/>
     <w:tmpl w:val="E5CEAEC4"/>
@@ -13355,7 +13529,120 @@
       </w:rPr>
     </w:lvl>
   </w:abstractNum>
-  <w:abstractNum w:abstractNumId="7" w15:restartNumberingAfterBreak="0">
+  <w:abstractNum w:abstractNumId="8" w15:restartNumberingAfterBreak="0">
+    <w:nsid w:val="3B2426D6"/>
+    <w:multiLevelType w:val="hybridMultilevel"/>
+    <w:tmpl w:val="2A94FC48"/>
+    <w:lvl w:ilvl="0" w:tplc="240A0001">
+      <w:start w:val="1"/>
+      <w:numFmt w:val="bullet"/>
+      <w:lvlText w:val=""/>
+      <w:lvlJc w:val="left"/>
+      <w:pPr>
+        <w:ind w:left="720" w:hanging="360"/>
+      </w:pPr>
+      <w:rPr>
+        <w:rFonts w:ascii="Symbol" w:hAnsi="Symbol" w:hint="default"/>
+      </w:rPr>
+    </w:lvl>
+    <w:lvl w:ilvl="1" w:tplc="240A0003" w:tentative="1">
+      <w:start w:val="1"/>
+      <w:numFmt w:val="bullet"/>
+      <w:lvlText w:val="o"/>
+      <w:lvlJc w:val="left"/>
+      <w:pPr>
+        <w:ind w:left="1440" w:hanging="360"/>
+      </w:pPr>
+      <w:rPr>
+        <w:rFonts w:ascii="Courier New" w:hAnsi="Courier New" w:cs="Courier New" w:hint="default"/>
+      </w:rPr>
+    </w:lvl>
+    <w:lvl w:ilvl="2" w:tplc="240A0005" w:tentative="1">
+      <w:start w:val="1"/>
+      <w:numFmt w:val="bullet"/>
+      <w:lvlText w:val=""/>
+      <w:lvlJc w:val="left"/>
+      <w:pPr>
+        <w:ind w:left="2160" w:hanging="360"/>
+      </w:pPr>
+      <w:rPr>
+        <w:rFonts w:ascii="Wingdings" w:hAnsi="Wingdings" w:hint="default"/>
+      </w:rPr>
+    </w:lvl>
+    <w:lvl w:ilvl="3" w:tplc="240A0001" w:tentative="1">
+      <w:start w:val="1"/>
+      <w:numFmt w:val="bullet"/>
+      <w:lvlText w:val=""/>
+      <w:lvlJc w:val="left"/>
+      <w:pPr>
+        <w:ind w:left="2880" w:hanging="360"/>
+      </w:pPr>
+      <w:rPr>
+        <w:rFonts w:ascii="Symbol" w:hAnsi="Symbol" w:hint="default"/>
+      </w:rPr>
+    </w:lvl>
+    <w:lvl w:ilvl="4" w:tplc="240A0003" w:tentative="1">
+      <w:start w:val="1"/>
+      <w:numFmt w:val="bullet"/>
+      <w:lvlText w:val="o"/>
+      <w:lvlJc w:val="left"/>
+      <w:pPr>
+        <w:ind w:left="3600" w:hanging="360"/>
+      </w:pPr>
+      <w:rPr>
+        <w:rFonts w:ascii="Courier New" w:hAnsi="Courier New" w:cs="Courier New" w:hint="default"/>
+      </w:rPr>
+    </w:lvl>
+    <w:lvl w:ilvl="5" w:tplc="240A0005" w:tentative="1">
+      <w:start w:val="1"/>
+      <w:numFmt w:val="bullet"/>
+      <w:lvlText w:val=""/>
+      <w:lvlJc w:val="left"/>
+      <w:pPr>
+        <w:ind w:left="4320" w:hanging="360"/>
+      </w:pPr>
+      <w:rPr>
+        <w:rFonts w:ascii="Wingdings" w:hAnsi="Wingdings" w:hint="default"/>
+      </w:rPr>
+    </w:lvl>
+    <w:lvl w:ilvl="6" w:tplc="240A0001" w:tentative="1">
+      <w:start w:val="1"/>
+      <w:numFmt w:val="bullet"/>
+      <w:lvlText w:val=""/>
+      <w:lvlJc w:val="left"/>
+      <w:pPr>
+        <w:ind w:left="5040" w:hanging="360"/>
+      </w:pPr>
+      <w:rPr>
+        <w:rFonts w:ascii="Symbol" w:hAnsi="Symbol" w:hint="default"/>
+      </w:rPr>
+    </w:lvl>
+    <w:lvl w:ilvl="7" w:tplc="240A0003" w:tentative="1">
+      <w:start w:val="1"/>
+      <w:numFmt w:val="bullet"/>
+      <w:lvlText w:val="o"/>
+      <w:lvlJc w:val="left"/>
+      <w:pPr>
+        <w:ind w:left="5760" w:hanging="360"/>
+      </w:pPr>
+      <w:rPr>
+        <w:rFonts w:ascii="Courier New" w:hAnsi="Courier New" w:cs="Courier New" w:hint="default"/>
+      </w:rPr>
+    </w:lvl>
+    <w:lvl w:ilvl="8" w:tplc="240A0005" w:tentative="1">
+      <w:start w:val="1"/>
+      <w:numFmt w:val="bullet"/>
+      <w:lvlText w:val=""/>
+      <w:lvlJc w:val="left"/>
+      <w:pPr>
+        <w:ind w:left="6480" w:hanging="360"/>
+      </w:pPr>
+      <w:rPr>
+        <w:rFonts w:ascii="Wingdings" w:hAnsi="Wingdings" w:hint="default"/>
+      </w:rPr>
+    </w:lvl>
+  </w:abstractNum>
+  <w:abstractNum w:abstractNumId="9" w15:restartNumberingAfterBreak="0">
     <w:nsid w:val="457D7F16"/>
     <w:multiLevelType w:val="hybridMultilevel"/>
     <w:tmpl w:val="9A7AC840"/>
@@ -13468,7 +13755,7 @@
       </w:rPr>
     </w:lvl>
   </w:abstractNum>
-  <w:abstractNum w:abstractNumId="8" w15:restartNumberingAfterBreak="0">
+  <w:abstractNum w:abstractNumId="10" w15:restartNumberingAfterBreak="0">
     <w:nsid w:val="4AD5040C"/>
     <w:multiLevelType w:val="hybridMultilevel"/>
     <w:tmpl w:val="C6FC44A6"/>
@@ -13581,7 +13868,7 @@
       </w:rPr>
     </w:lvl>
   </w:abstractNum>
-  <w:abstractNum w:abstractNumId="9" w15:restartNumberingAfterBreak="0">
+  <w:abstractNum w:abstractNumId="11" w15:restartNumberingAfterBreak="0">
     <w:nsid w:val="513B7EA1"/>
     <w:multiLevelType w:val="hybridMultilevel"/>
     <w:tmpl w:val="6B5C4A68"/>
@@ -13694,7 +13981,7 @@
       </w:rPr>
     </w:lvl>
   </w:abstractNum>
-  <w:abstractNum w:abstractNumId="10" w15:restartNumberingAfterBreak="0">
+  <w:abstractNum w:abstractNumId="12" w15:restartNumberingAfterBreak="0">
     <w:nsid w:val="58B14600"/>
     <w:multiLevelType w:val="hybridMultilevel"/>
     <w:tmpl w:val="433A6502"/>
@@ -13807,7 +14094,7 @@
       </w:rPr>
     </w:lvl>
   </w:abstractNum>
-  <w:abstractNum w:abstractNumId="11" w15:restartNumberingAfterBreak="0">
+  <w:abstractNum w:abstractNumId="13" w15:restartNumberingAfterBreak="0">
     <w:nsid w:val="5F436901"/>
     <w:multiLevelType w:val="hybridMultilevel"/>
     <w:tmpl w:val="4DE48B7C"/>
@@ -13920,7 +14207,7 @@
       </w:rPr>
     </w:lvl>
   </w:abstractNum>
-  <w:abstractNum w:abstractNumId="12" w15:restartNumberingAfterBreak="0">
+  <w:abstractNum w:abstractNumId="14" w15:restartNumberingAfterBreak="0">
     <w:nsid w:val="6B48065D"/>
     <w:multiLevelType w:val="hybridMultilevel"/>
     <w:tmpl w:val="9566E192"/>
@@ -14033,7 +14320,120 @@
       </w:rPr>
     </w:lvl>
   </w:abstractNum>
-  <w:abstractNum w:abstractNumId="13" w15:restartNumberingAfterBreak="0">
+  <w:abstractNum w:abstractNumId="15" w15:restartNumberingAfterBreak="0">
+    <w:nsid w:val="6F0D1C0D"/>
+    <w:multiLevelType w:val="hybridMultilevel"/>
+    <w:tmpl w:val="AA8C2E28"/>
+    <w:lvl w:ilvl="0" w:tplc="240A0001">
+      <w:start w:val="1"/>
+      <w:numFmt w:val="bullet"/>
+      <w:lvlText w:val=""/>
+      <w:lvlJc w:val="left"/>
+      <w:pPr>
+        <w:ind w:left="720" w:hanging="360"/>
+      </w:pPr>
+      <w:rPr>
+        <w:rFonts w:ascii="Symbol" w:hAnsi="Symbol" w:hint="default"/>
+      </w:rPr>
+    </w:lvl>
+    <w:lvl w:ilvl="1" w:tplc="240A0003" w:tentative="1">
+      <w:start w:val="1"/>
+      <w:numFmt w:val="bullet"/>
+      <w:lvlText w:val="o"/>
+      <w:lvlJc w:val="left"/>
+      <w:pPr>
+        <w:ind w:left="1440" w:hanging="360"/>
+      </w:pPr>
+      <w:rPr>
+        <w:rFonts w:ascii="Courier New" w:hAnsi="Courier New" w:cs="Courier New" w:hint="default"/>
+      </w:rPr>
+    </w:lvl>
+    <w:lvl w:ilvl="2" w:tplc="240A0005" w:tentative="1">
+      <w:start w:val="1"/>
+      <w:numFmt w:val="bullet"/>
+      <w:lvlText w:val=""/>
+      <w:lvlJc w:val="left"/>
+      <w:pPr>
+        <w:ind w:left="2160" w:hanging="360"/>
+      </w:pPr>
+      <w:rPr>
+        <w:rFonts w:ascii="Wingdings" w:hAnsi="Wingdings" w:hint="default"/>
+      </w:rPr>
+    </w:lvl>
+    <w:lvl w:ilvl="3" w:tplc="240A0001" w:tentative="1">
+      <w:start w:val="1"/>
+      <w:numFmt w:val="bullet"/>
+      <w:lvlText w:val=""/>
+      <w:lvlJc w:val="left"/>
+      <w:pPr>
+        <w:ind w:left="2880" w:hanging="360"/>
+      </w:pPr>
+      <w:rPr>
+        <w:rFonts w:ascii="Symbol" w:hAnsi="Symbol" w:hint="default"/>
+      </w:rPr>
+    </w:lvl>
+    <w:lvl w:ilvl="4" w:tplc="240A0003" w:tentative="1">
+      <w:start w:val="1"/>
+      <w:numFmt w:val="bullet"/>
+      <w:lvlText w:val="o"/>
+      <w:lvlJc w:val="left"/>
+      <w:pPr>
+        <w:ind w:left="3600" w:hanging="360"/>
+      </w:pPr>
+      <w:rPr>
+        <w:rFonts w:ascii="Courier New" w:hAnsi="Courier New" w:cs="Courier New" w:hint="default"/>
+      </w:rPr>
+    </w:lvl>
+    <w:lvl w:ilvl="5" w:tplc="240A0005" w:tentative="1">
+      <w:start w:val="1"/>
+      <w:numFmt w:val="bullet"/>
+      <w:lvlText w:val=""/>
+      <w:lvlJc w:val="left"/>
+      <w:pPr>
+        <w:ind w:left="4320" w:hanging="360"/>
+      </w:pPr>
+      <w:rPr>
+        <w:rFonts w:ascii="Wingdings" w:hAnsi="Wingdings" w:hint="default"/>
+      </w:rPr>
+    </w:lvl>
+    <w:lvl w:ilvl="6" w:tplc="240A0001" w:tentative="1">
+      <w:start w:val="1"/>
+      <w:numFmt w:val="bullet"/>
+      <w:lvlText w:val=""/>
+      <w:lvlJc w:val="left"/>
+      <w:pPr>
+        <w:ind w:left="5040" w:hanging="360"/>
+      </w:pPr>
+      <w:rPr>
+        <w:rFonts w:ascii="Symbol" w:hAnsi="Symbol" w:hint="default"/>
+      </w:rPr>
+    </w:lvl>
+    <w:lvl w:ilvl="7" w:tplc="240A0003" w:tentative="1">
+      <w:start w:val="1"/>
+      <w:numFmt w:val="bullet"/>
+      <w:lvlText w:val="o"/>
+      <w:lvlJc w:val="left"/>
+      <w:pPr>
+        <w:ind w:left="5760" w:hanging="360"/>
+      </w:pPr>
+      <w:rPr>
+        <w:rFonts w:ascii="Courier New" w:hAnsi="Courier New" w:cs="Courier New" w:hint="default"/>
+      </w:rPr>
+    </w:lvl>
+    <w:lvl w:ilvl="8" w:tplc="240A0005" w:tentative="1">
+      <w:start w:val="1"/>
+      <w:numFmt w:val="bullet"/>
+      <w:lvlText w:val=""/>
+      <w:lvlJc w:val="left"/>
+      <w:pPr>
+        <w:ind w:left="6480" w:hanging="360"/>
+      </w:pPr>
+      <w:rPr>
+        <w:rFonts w:ascii="Wingdings" w:hAnsi="Wingdings" w:hint="default"/>
+      </w:rPr>
+    </w:lvl>
+  </w:abstractNum>
+  <w:abstractNum w:abstractNumId="16" w15:restartNumberingAfterBreak="0">
     <w:nsid w:val="6F1C43A0"/>
     <w:multiLevelType w:val="hybridMultilevel"/>
     <w:tmpl w:val="239205CC"/>
@@ -14146,7 +14546,7 @@
       </w:rPr>
     </w:lvl>
   </w:abstractNum>
-  <w:abstractNum w:abstractNumId="14" w15:restartNumberingAfterBreak="0">
+  <w:abstractNum w:abstractNumId="17" w15:restartNumberingAfterBreak="0">
     <w:nsid w:val="719B15A0"/>
     <w:multiLevelType w:val="hybridMultilevel"/>
     <w:tmpl w:val="8B6A06FC"/>
@@ -14259,7 +14659,120 @@
       </w:rPr>
     </w:lvl>
   </w:abstractNum>
-  <w:abstractNum w:abstractNumId="15" w15:restartNumberingAfterBreak="0">
+  <w:abstractNum w:abstractNumId="18" w15:restartNumberingAfterBreak="0">
+    <w:nsid w:val="72836320"/>
+    <w:multiLevelType w:val="hybridMultilevel"/>
+    <w:tmpl w:val="F918B9CE"/>
+    <w:lvl w:ilvl="0" w:tplc="240A0001">
+      <w:start w:val="1"/>
+      <w:numFmt w:val="bullet"/>
+      <w:lvlText w:val=""/>
+      <w:lvlJc w:val="left"/>
+      <w:pPr>
+        <w:ind w:left="720" w:hanging="360"/>
+      </w:pPr>
+      <w:rPr>
+        <w:rFonts w:ascii="Symbol" w:hAnsi="Symbol" w:hint="default"/>
+      </w:rPr>
+    </w:lvl>
+    <w:lvl w:ilvl="1" w:tplc="240A0003" w:tentative="1">
+      <w:start w:val="1"/>
+      <w:numFmt w:val="bullet"/>
+      <w:lvlText w:val="o"/>
+      <w:lvlJc w:val="left"/>
+      <w:pPr>
+        <w:ind w:left="1440" w:hanging="360"/>
+      </w:pPr>
+      <w:rPr>
+        <w:rFonts w:ascii="Courier New" w:hAnsi="Courier New" w:cs="Courier New" w:hint="default"/>
+      </w:rPr>
+    </w:lvl>
+    <w:lvl w:ilvl="2" w:tplc="240A0005" w:tentative="1">
+      <w:start w:val="1"/>
+      <w:numFmt w:val="bullet"/>
+      <w:lvlText w:val=""/>
+      <w:lvlJc w:val="left"/>
+      <w:pPr>
+        <w:ind w:left="2160" w:hanging="360"/>
+      </w:pPr>
+      <w:rPr>
+        <w:rFonts w:ascii="Wingdings" w:hAnsi="Wingdings" w:hint="default"/>
+      </w:rPr>
+    </w:lvl>
+    <w:lvl w:ilvl="3" w:tplc="240A0001" w:tentative="1">
+      <w:start w:val="1"/>
+      <w:numFmt w:val="bullet"/>
+      <w:lvlText w:val=""/>
+      <w:lvlJc w:val="left"/>
+      <w:pPr>
+        <w:ind w:left="2880" w:hanging="360"/>
+      </w:pPr>
+      <w:rPr>
+        <w:rFonts w:ascii="Symbol" w:hAnsi="Symbol" w:hint="default"/>
+      </w:rPr>
+    </w:lvl>
+    <w:lvl w:ilvl="4" w:tplc="240A0003" w:tentative="1">
+      <w:start w:val="1"/>
+      <w:numFmt w:val="bullet"/>
+      <w:lvlText w:val="o"/>
+      <w:lvlJc w:val="left"/>
+      <w:pPr>
+        <w:ind w:left="3600" w:hanging="360"/>
+      </w:pPr>
+      <w:rPr>
+        <w:rFonts w:ascii="Courier New" w:hAnsi="Courier New" w:cs="Courier New" w:hint="default"/>
+      </w:rPr>
+    </w:lvl>
+    <w:lvl w:ilvl="5" w:tplc="240A0005" w:tentative="1">
+      <w:start w:val="1"/>
+      <w:numFmt w:val="bullet"/>
+      <w:lvlText w:val=""/>
+      <w:lvlJc w:val="left"/>
+      <w:pPr>
+        <w:ind w:left="4320" w:hanging="360"/>
+      </w:pPr>
+      <w:rPr>
+        <w:rFonts w:ascii="Wingdings" w:hAnsi="Wingdings" w:hint="default"/>
+      </w:rPr>
+    </w:lvl>
+    <w:lvl w:ilvl="6" w:tplc="240A0001" w:tentative="1">
+      <w:start w:val="1"/>
+      <w:numFmt w:val="bullet"/>
+      <w:lvlText w:val=""/>
+      <w:lvlJc w:val="left"/>
+      <w:pPr>
+        <w:ind w:left="5040" w:hanging="360"/>
+      </w:pPr>
+      <w:rPr>
+        <w:rFonts w:ascii="Symbol" w:hAnsi="Symbol" w:hint="default"/>
+      </w:rPr>
+    </w:lvl>
+    <w:lvl w:ilvl="7" w:tplc="240A0003" w:tentative="1">
+      <w:start w:val="1"/>
+      <w:numFmt w:val="bullet"/>
+      <w:lvlText w:val="o"/>
+      <w:lvlJc w:val="left"/>
+      <w:pPr>
+        <w:ind w:left="5760" w:hanging="360"/>
+      </w:pPr>
+      <w:rPr>
+        <w:rFonts w:ascii="Courier New" w:hAnsi="Courier New" w:cs="Courier New" w:hint="default"/>
+      </w:rPr>
+    </w:lvl>
+    <w:lvl w:ilvl="8" w:tplc="240A0005" w:tentative="1">
+      <w:start w:val="1"/>
+      <w:numFmt w:val="bullet"/>
+      <w:lvlText w:val=""/>
+      <w:lvlJc w:val="left"/>
+      <w:pPr>
+        <w:ind w:left="6480" w:hanging="360"/>
+      </w:pPr>
+      <w:rPr>
+        <w:rFonts w:ascii="Wingdings" w:hAnsi="Wingdings" w:hint="default"/>
+      </w:rPr>
+    </w:lvl>
+  </w:abstractNum>
+  <w:abstractNum w:abstractNumId="19" w15:restartNumberingAfterBreak="0">
     <w:nsid w:val="7760001C"/>
     <w:multiLevelType w:val="hybridMultilevel"/>
     <w:tmpl w:val="DA00D140"/>
@@ -14372,7 +14885,7 @@
       </w:rPr>
     </w:lvl>
   </w:abstractNum>
-  <w:abstractNum w:abstractNumId="16" w15:restartNumberingAfterBreak="0">
+  <w:abstractNum w:abstractNumId="20" w15:restartNumberingAfterBreak="0">
     <w:nsid w:val="79EA563B"/>
     <w:multiLevelType w:val="hybridMultilevel"/>
     <w:tmpl w:val="CA0EF45A"/>
@@ -14485,7 +14998,7 @@
       </w:rPr>
     </w:lvl>
   </w:abstractNum>
-  <w:abstractNum w:abstractNumId="17" w15:restartNumberingAfterBreak="0">
+  <w:abstractNum w:abstractNumId="21" w15:restartNumberingAfterBreak="0">
     <w:nsid w:val="7A944C52"/>
     <w:multiLevelType w:val="hybridMultilevel"/>
     <w:tmpl w:val="4DF8A4A6"/>
@@ -14598,7 +15111,7 @@
       </w:rPr>
     </w:lvl>
   </w:abstractNum>
-  <w:abstractNum w:abstractNumId="18" w15:restartNumberingAfterBreak="0">
+  <w:abstractNum w:abstractNumId="22" w15:restartNumberingAfterBreak="0">
     <w:nsid w:val="7BCE6F6B"/>
     <w:multiLevelType w:val="hybridMultilevel"/>
     <w:tmpl w:val="570004FA"/>
@@ -14684,7 +15197,7 @@
       </w:pPr>
     </w:lvl>
   </w:abstractNum>
-  <w:abstractNum w:abstractNumId="19" w15:restartNumberingAfterBreak="0">
+  <w:abstractNum w:abstractNumId="23" w15:restartNumberingAfterBreak="0">
     <w:nsid w:val="7E3A58EC"/>
     <w:multiLevelType w:val="hybridMultilevel"/>
     <w:tmpl w:val="22AEB536"/>
@@ -14771,64 +15284,76 @@
     </w:lvl>
   </w:abstractNum>
   <w:num w:numId="1" w16cid:durableId="1235050477">
-    <w:abstractNumId w:val="10"/>
+    <w:abstractNumId w:val="12"/>
   </w:num>
   <w:num w:numId="2" w16cid:durableId="2067873167">
-    <w:abstractNumId w:val="9"/>
+    <w:abstractNumId w:val="11"/>
   </w:num>
   <w:num w:numId="3" w16cid:durableId="115414037">
-    <w:abstractNumId w:val="13"/>
+    <w:abstractNumId w:val="16"/>
   </w:num>
   <w:num w:numId="4" w16cid:durableId="349600162">
-    <w:abstractNumId w:val="15"/>
+    <w:abstractNumId w:val="19"/>
   </w:num>
   <w:num w:numId="5" w16cid:durableId="1248734338">
-    <w:abstractNumId w:val="14"/>
+    <w:abstractNumId w:val="17"/>
   </w:num>
   <w:num w:numId="6" w16cid:durableId="2015641317">
     <w:abstractNumId w:val="2"/>
   </w:num>
   <w:num w:numId="7" w16cid:durableId="231624906">
-    <w:abstractNumId w:val="11"/>
+    <w:abstractNumId w:val="13"/>
   </w:num>
   <w:num w:numId="8" w16cid:durableId="263420750">
-    <w:abstractNumId w:val="6"/>
+    <w:abstractNumId w:val="7"/>
   </w:num>
   <w:num w:numId="9" w16cid:durableId="2124612063">
-    <w:abstractNumId w:val="17"/>
+    <w:abstractNumId w:val="21"/>
   </w:num>
   <w:num w:numId="10" w16cid:durableId="159079337">
-    <w:abstractNumId w:val="12"/>
+    <w:abstractNumId w:val="14"/>
   </w:num>
   <w:num w:numId="11" w16cid:durableId="790443612">
-    <w:abstractNumId w:val="18"/>
+    <w:abstractNumId w:val="22"/>
   </w:num>
   <w:num w:numId="12" w16cid:durableId="942110906">
     <w:abstractNumId w:val="3"/>
   </w:num>
   <w:num w:numId="13" w16cid:durableId="2012368028">
-    <w:abstractNumId w:val="5"/>
+    <w:abstractNumId w:val="6"/>
   </w:num>
   <w:num w:numId="14" w16cid:durableId="1862934538">
-    <w:abstractNumId w:val="7"/>
+    <w:abstractNumId w:val="9"/>
   </w:num>
   <w:num w:numId="15" w16cid:durableId="1813401887">
-    <w:abstractNumId w:val="19"/>
+    <w:abstractNumId w:val="23"/>
   </w:num>
   <w:num w:numId="16" w16cid:durableId="1095636371">
-    <w:abstractNumId w:val="8"/>
+    <w:abstractNumId w:val="10"/>
   </w:num>
   <w:num w:numId="17" w16cid:durableId="319358279">
     <w:abstractNumId w:val="1"/>
   </w:num>
   <w:num w:numId="18" w16cid:durableId="1069112579">
-    <w:abstractNumId w:val="16"/>
+    <w:abstractNumId w:val="20"/>
   </w:num>
   <w:num w:numId="19" w16cid:durableId="1954433259">
     <w:abstractNumId w:val="4"/>
   </w:num>
   <w:num w:numId="20" w16cid:durableId="518356576">
     <w:abstractNumId w:val="0"/>
+  </w:num>
+  <w:num w:numId="21" w16cid:durableId="210772246">
+    <w:abstractNumId w:val="18"/>
+  </w:num>
+  <w:num w:numId="22" w16cid:durableId="1576282488">
+    <w:abstractNumId w:val="5"/>
+  </w:num>
+  <w:num w:numId="23" w16cid:durableId="666174723">
+    <w:abstractNumId w:val="15"/>
+  </w:num>
+  <w:num w:numId="24" w16cid:durableId="1915116904">
+    <w:abstractNumId w:val="8"/>
   </w:num>
 </w:numbering>
 </file>

</xml_diff>

<commit_message>
Ch 6 semester break draft
</commit_message>
<xml_diff>
--- a/Draft/6 Case Study.docx
+++ b/Draft/6 Case Study.docx
@@ -3485,7 +3485,7 @@
                 <w:rFonts w:asciiTheme="majorHAnsi" w:hAnsiTheme="majorHAnsi" w:cstheme="majorHAnsi"/>
                 <w:sz w:val="24"/>
                 <w:szCs w:val="24"/>
-                <w:lang w:val="en-NZ"/>
+                <w:lang w:val="es-CO"/>
               </w:rPr>
             </w:pPr>
             <w:r>
@@ -3493,7 +3493,7 @@
                 <w:rFonts w:asciiTheme="majorHAnsi" w:hAnsiTheme="majorHAnsi" w:cstheme="majorHAnsi"/>
                 <w:sz w:val="24"/>
                 <w:szCs w:val="24"/>
-                <w:lang w:val="en-NZ"/>
+                <w:lang w:val="es-CO"/>
               </w:rPr>
               <w:t>Haumi e, Hui e! Tāiki e!</w:t>
             </w:r>
@@ -11914,7 +11914,19 @@
         <w:rPr>
           <w:lang w:val="en-NZ"/>
         </w:rPr>
-        <w:t xml:space="preserve"> it was possible to run through the main functionalities of WorkshopAR again, from the room configuration to the to quick mock-up interactions with the Play Models, the annotations and the </w:t>
+        <w:t xml:space="preserve"> it was possible to run through the main functionalities of WorkshopAR again, from the room configuration to</w:t>
+      </w:r>
+      <w:r>
+        <w:rPr>
+          <w:lang w:val="en-NZ"/>
+        </w:rPr>
+        <w:t xml:space="preserve"> </w:t>
+      </w:r>
+      <w:r>
+        <w:rPr>
+          <w:lang w:val="en-NZ"/>
+        </w:rPr>
+        <w:t xml:space="preserve">quick mock-up interactions with the Play Models, the annotations and the </w:t>
       </w:r>
       <w:r>
         <w:rPr>
@@ -11983,14 +11995,38 @@
         <w:rPr>
           <w:lang w:val="en-NZ"/>
         </w:rPr>
-        <w:t xml:space="preserve">There was a strong contrast between the work done for the poster presentation and the interim report. The teaching staff commented that it was not exactly the intended outcome. The instructions did aske for a first version of the report to be worked collaboratively, but the </w:t>
+        <w:t xml:space="preserve">There was a strong contrast between the work done for the poster presentation and the interim report. The teaching staff commented that it was not exactly the intended outcome. The instructions did </w:t>
+      </w:r>
+      <w:r>
+        <w:rPr>
+          <w:lang w:val="en-NZ"/>
+        </w:rPr>
+        <w:t>ask</w:t>
+      </w:r>
+      <w:r>
+        <w:rPr>
+          <w:lang w:val="en-NZ"/>
+        </w:rPr>
+        <w:t xml:space="preserve"> for a first version of the report to be worked collaboratively, but the </w:t>
       </w:r>
       <w:r>
         <w:rPr>
           <w:lang w:val="en-NZ"/>
         </w:rPr>
         <w:lastRenderedPageBreak/>
-        <w:t>reality was that there was no need to doit, al the resources were ready for each student individually, a situation that exemplified very well that collaborative work was not a natural occurrence and it had to be properly designed</w:t>
+        <w:t xml:space="preserve">reality was that there was no need to doit, </w:t>
+      </w:r>
+      <w:r>
+        <w:rPr>
+          <w:lang w:val="en-NZ"/>
+        </w:rPr>
+        <w:t>all</w:t>
+      </w:r>
+      <w:r>
+        <w:rPr>
+          <w:lang w:val="en-NZ"/>
+        </w:rPr>
+        <w:t xml:space="preserve"> the resources were ready for each student individually, a situation that exemplified very well that collaborative work was not a natural occurrence and it had to be properly designed</w:t>
       </w:r>
       <w:r>
         <w:rPr>
@@ -12321,56 +12357,440 @@
         <w:rPr>
           <w:lang w:val="en-NZ"/>
         </w:rPr>
-        <w:t>Problems with using WAR with another tech</w:t>
-      </w:r>
-    </w:p>
-    <w:p>
-      <w:pPr>
-        <w:rPr>
-          <w:lang w:val="en-NZ"/>
-        </w:rPr>
-      </w:pPr>
-      <w:r>
-        <w:rPr>
-          <w:lang w:val="en-NZ"/>
-        </w:rPr>
-        <w:t>Capitalize on the annotation and the debates</w:t>
-      </w:r>
-    </w:p>
-    <w:p>
-      <w:pPr>
-        <w:rPr>
-          <w:lang w:val="en-NZ"/>
-        </w:rPr>
-      </w:pPr>
-      <w:r>
-        <w:rPr>
-          <w:lang w:val="en-NZ"/>
-        </w:rPr>
-        <w:t>Changes to the format proposed by the lecturers</w:t>
-      </w:r>
-    </w:p>
-    <w:p>
-      <w:pPr>
-        <w:rPr>
-          <w:lang w:val="en-NZ"/>
-        </w:rPr>
-      </w:pPr>
-      <w:r>
-        <w:rPr>
-          <w:lang w:val="en-NZ"/>
-        </w:rPr>
-        <w:t>Interview with AE and how dissonant was the work of the CM</w:t>
-      </w:r>
-    </w:p>
-    <w:p>
-      <w:pPr>
-        <w:rPr>
-          <w:lang w:val="en-NZ"/>
-        </w:rPr>
-      </w:pPr>
-      <w:r>
-        <w:rPr>
+        <w:t>At the end of the first semester of the course the students had worked in understanding the requirements of the construction development scenario proposed to them, the build an architectural design based on the technical and social context of the project and communicated their ideas to the client, received feedback of their work and iterated over their design for the next semester.</w:t>
+      </w:r>
+    </w:p>
+    <w:p>
+      <w:pPr>
+        <w:rPr>
+          <w:lang w:val="en-NZ"/>
+        </w:rPr>
+      </w:pPr>
+      <w:r>
+        <w:rPr>
+          <w:lang w:val="en-NZ"/>
+        </w:rPr>
+        <w:t>During the activities done for the course, the students were able to demonstrate:</w:t>
+      </w:r>
+    </w:p>
+    <w:p>
+      <w:pPr>
+        <w:pStyle w:val="Prrafodelista"/>
+        <w:numPr>
+          <w:ilvl w:val="0"/>
+          <w:numId w:val="25"/>
+        </w:numPr>
+        <w:rPr>
+          <w:lang w:val="en-NZ"/>
+        </w:rPr>
+      </w:pPr>
+      <w:r>
+        <w:rPr>
+          <w:lang w:val="en-NZ"/>
+        </w:rPr>
+        <w:t>Organization in the structure of their work so that information could be gathered, distributed and discussed to make decisions and develop the proposal.</w:t>
+      </w:r>
+    </w:p>
+    <w:p>
+      <w:pPr>
+        <w:pStyle w:val="Prrafodelista"/>
+        <w:numPr>
+          <w:ilvl w:val="0"/>
+          <w:numId w:val="25"/>
+        </w:numPr>
+        <w:rPr>
+          <w:lang w:val="en-NZ"/>
+        </w:rPr>
+      </w:pPr>
+      <w:r>
+        <w:rPr>
+          <w:lang w:val="en-NZ"/>
+        </w:rPr>
+        <w:t>A communal understanding of the problem and the proposal used to present a coherent solution to the client.</w:t>
+      </w:r>
+    </w:p>
+    <w:p>
+      <w:pPr>
+        <w:pStyle w:val="Prrafodelista"/>
+        <w:numPr>
+          <w:ilvl w:val="0"/>
+          <w:numId w:val="25"/>
+        </w:numPr>
+        <w:rPr>
+          <w:lang w:val="en-NZ"/>
+        </w:rPr>
+      </w:pPr>
+      <w:r>
+        <w:rPr>
+          <w:lang w:val="en-NZ"/>
+        </w:rPr>
+        <w:t>Mechanisms to organize the group, manage conflict and respond to external issues.</w:t>
+      </w:r>
+    </w:p>
+    <w:p>
+      <w:pPr>
+        <w:rPr>
+          <w:lang w:val="en-NZ"/>
+        </w:rPr>
+      </w:pPr>
+      <w:r>
+        <w:rPr>
+          <w:lang w:val="en-NZ"/>
+        </w:rPr>
+        <w:t xml:space="preserve">As part of the activities of the course it was possible to gradually introduce the use of WorkshopAR to support these instances of collaborative learning, and despite some mishaps in timing and approach, it was possible to identify aspects of the software created that promoted the </w:t>
+      </w:r>
+      <w:r>
+        <w:rPr>
+          <w:lang w:val="en-NZ"/>
+        </w:rPr>
+        <w:t>most</w:t>
+      </w:r>
+      <w:r>
+        <w:rPr>
+          <w:lang w:val="en-NZ"/>
+        </w:rPr>
+        <w:t xml:space="preserve"> </w:t>
+      </w:r>
+      <w:r>
+        <w:rPr>
+          <w:lang w:val="en-NZ"/>
+        </w:rPr>
+        <w:t>positive</w:t>
+      </w:r>
+      <w:r>
+        <w:rPr>
+          <w:lang w:val="en-NZ"/>
+        </w:rPr>
+        <w:t xml:space="preserve"> behaviours</w:t>
+      </w:r>
+      <w:r>
+        <w:rPr>
+          <w:lang w:val="en-NZ"/>
+        </w:rPr>
+        <w:t>, that integrated the best with the work of the group or that incited the most positive response on the students:</w:t>
+      </w:r>
+    </w:p>
+    <w:p>
+      <w:pPr>
+        <w:pStyle w:val="Prrafodelista"/>
+        <w:numPr>
+          <w:ilvl w:val="0"/>
+          <w:numId w:val="26"/>
+        </w:numPr>
+        <w:rPr>
+          <w:lang w:val="en-NZ"/>
+        </w:rPr>
+      </w:pPr>
+      <w:r>
+        <w:rPr>
+          <w:lang w:val="en-NZ"/>
+        </w:rPr>
+        <w:t>The visual structure to organize the work session and other activities like brainstorming or debates.</w:t>
+      </w:r>
+    </w:p>
+    <w:p>
+      <w:pPr>
+        <w:pStyle w:val="Prrafodelista"/>
+        <w:numPr>
+          <w:ilvl w:val="0"/>
+          <w:numId w:val="26"/>
+        </w:numPr>
+        <w:rPr>
+          <w:lang w:val="en-NZ"/>
+        </w:rPr>
+      </w:pPr>
+      <w:r>
+        <w:rPr>
+          <w:lang w:val="en-NZ"/>
+        </w:rPr>
+        <w:t>The communications features present in the annotations and debate tools.</w:t>
+      </w:r>
+    </w:p>
+    <w:p>
+      <w:pPr>
+        <w:rPr>
+          <w:lang w:val="en-NZ"/>
+        </w:rPr>
+      </w:pPr>
+      <w:r>
+        <w:rPr>
+          <w:lang w:val="en-NZ"/>
+        </w:rPr>
+        <w:t xml:space="preserve">The semester break was used to work on those functionalities the most so </w:t>
+      </w:r>
+      <w:r>
+        <w:rPr>
+          <w:lang w:val="en-NZ"/>
+        </w:rPr>
+        <w:t>variations</w:t>
+      </w:r>
+      <w:r>
+        <w:rPr>
+          <w:lang w:val="en-NZ"/>
+        </w:rPr>
+        <w:t xml:space="preserve"> of different ideas could be tested during the second semester. It was of special interest to explore the idea of offering the students means to configure the level of structure implemented by the software, as well as to expand the use of visual elements in the annotations and debates tools to promote more social activities around them. Sections 5.2.3.3 and 5.2.3.4 detail the development of those features.</w:t>
+      </w:r>
+    </w:p>
+    <w:p>
+      <w:pPr>
+        <w:rPr>
+          <w:lang w:val="en-NZ"/>
+        </w:rPr>
+      </w:pPr>
+      <w:r>
+        <w:rPr>
+          <w:lang w:val="en-NZ"/>
+        </w:rPr>
+        <w:t>It was also an opportunity to acknowledge some of the biggest issues the students found with the use of WorkshopAR, namely, trying to ease the process of hopping from the computer to the phone and the reticence several students had to keep using their phone in what could be considered a work environment.</w:t>
+      </w:r>
+    </w:p>
+    <w:p>
+      <w:pPr>
+        <w:rPr>
+          <w:lang w:val="en-NZ"/>
+        </w:rPr>
+      </w:pPr>
+      <w:r>
+        <w:rPr>
+          <w:lang w:val="en-NZ"/>
+        </w:rPr>
+        <w:t xml:space="preserve">The proposed solution was to use a set of rigged arm holders to keep the point of view of the phone fixed, but still allowing some manoeuvrability. The plan was to offer a way to keep the phone active during the activity </w:t>
+      </w:r>
+      <w:r>
+        <w:rPr>
+          <w:lang w:val="en-NZ"/>
+        </w:rPr>
+        <w:t>and</w:t>
+      </w:r>
+      <w:r>
+        <w:rPr>
+          <w:lang w:val="en-NZ"/>
+        </w:rPr>
+        <w:t xml:space="preserve"> </w:t>
+      </w:r>
+      <w:r>
+        <w:rPr>
+          <w:lang w:val="en-NZ"/>
+        </w:rPr>
+        <w:t xml:space="preserve">for it </w:t>
+      </w:r>
+      <w:r>
+        <w:rPr>
+          <w:lang w:val="en-NZ"/>
+        </w:rPr>
+        <w:t>to ac</w:t>
+      </w:r>
+      <w:r>
+        <w:rPr>
+          <w:lang w:val="en-NZ"/>
+        </w:rPr>
+        <w:t>t</w:t>
+      </w:r>
+      <w:r>
+        <w:rPr>
+          <w:lang w:val="en-NZ"/>
+        </w:rPr>
+        <w:t xml:space="preserve"> </w:t>
+      </w:r>
+      <w:r>
+        <w:rPr>
+          <w:lang w:val="en-NZ"/>
+        </w:rPr>
+        <w:t>like</w:t>
+      </w:r>
+      <w:r>
+        <w:rPr>
+          <w:lang w:val="en-NZ"/>
+        </w:rPr>
+        <w:t xml:space="preserve"> a second screen to be used along the </w:t>
+      </w:r>
+      <w:r>
+        <w:rPr>
+          <w:lang w:val="en-NZ"/>
+        </w:rPr>
+        <w:lastRenderedPageBreak/>
+        <w:t xml:space="preserve">computers, </w:t>
+      </w:r>
+      <w:r>
+        <w:rPr>
+          <w:lang w:val="en-NZ"/>
+        </w:rPr>
+        <w:t>all in</w:t>
+      </w:r>
+      <w:r>
+        <w:rPr>
+          <w:lang w:val="en-NZ"/>
+        </w:rPr>
+        <w:t xml:space="preserve"> hope o</w:t>
+      </w:r>
+      <w:r>
+        <w:rPr>
+          <w:lang w:val="en-NZ"/>
+        </w:rPr>
+        <w:t>f</w:t>
+      </w:r>
+      <w:r>
+        <w:rPr>
+          <w:lang w:val="en-NZ"/>
+        </w:rPr>
+        <w:t xml:space="preserve"> giving the whole set up a more “serious” look that would </w:t>
+      </w:r>
+      <w:r>
+        <w:rPr>
+          <w:lang w:val="en-NZ"/>
+        </w:rPr>
+        <w:t>encourage</w:t>
+      </w:r>
+      <w:r>
+        <w:rPr>
+          <w:lang w:val="en-NZ"/>
+        </w:rPr>
+        <w:t xml:space="preserve"> the use of the phone in a more positive way.</w:t>
+      </w:r>
+      <w:r>
+        <w:rPr>
+          <w:lang w:val="en-NZ"/>
+        </w:rPr>
+        <w:t xml:space="preserve"> Section 5.2.4.1 details more this idea.</w:t>
+      </w:r>
+    </w:p>
+    <w:p>
+      <w:pPr>
+        <w:rPr>
+          <w:lang w:val="en-NZ"/>
+        </w:rPr>
+      </w:pPr>
+      <w:r>
+        <w:rPr>
+          <w:lang w:val="en-NZ"/>
+        </w:rPr>
+        <w:t>The teaching staff also used the break period to adjust several aspects of the course that were noticed to be causing problems among the students. There were two main concerns that were detected in varied degrees among all the groups:</w:t>
+      </w:r>
+    </w:p>
+    <w:p>
+      <w:pPr>
+        <w:pStyle w:val="Prrafodelista"/>
+        <w:numPr>
+          <w:ilvl w:val="0"/>
+          <w:numId w:val="27"/>
+        </w:numPr>
+        <w:rPr>
+          <w:lang w:val="en-NZ"/>
+        </w:rPr>
+      </w:pPr>
+      <w:r>
+        <w:rPr>
+          <w:lang w:val="en-NZ"/>
+        </w:rPr>
+        <w:t>It was difficult to access the information needed to develop the project. It was detected the most wen students were trying to understand the specific requirements of each role for the activities of the project and the extend or scope in which they wad to work. These questions came from almost all students several times during the semester, despite the information being present in the LMS, but apparently it was not clear or difficult to find.</w:t>
+      </w:r>
+    </w:p>
+    <w:p>
+      <w:pPr>
+        <w:pStyle w:val="Prrafodelista"/>
+        <w:numPr>
+          <w:ilvl w:val="0"/>
+          <w:numId w:val="27"/>
+        </w:numPr>
+        <w:rPr>
+          <w:lang w:val="en-NZ"/>
+        </w:rPr>
+      </w:pPr>
+      <w:r>
+        <w:rPr>
+          <w:lang w:val="en-NZ"/>
+        </w:rPr>
+        <w:t>The role of the CM was having problems being part of the workflow in almost all groups. Even after clarifying the scope of the project, it was not clear what should be the focus of their work and what to report in the posters or the interim report. A somewhat similar scenario happened to the AE, that had a very clear and intensive goal at the beginning of the project, but after the proposal was finished, it was not clear what should be the next step of their work.</w:t>
+      </w:r>
+    </w:p>
+    <w:p>
+      <w:pPr>
+        <w:rPr>
+          <w:lang w:val="en-NZ"/>
+        </w:rPr>
+      </w:pPr>
+      <w:r>
+        <w:rPr>
+          <w:lang w:val="en-NZ"/>
+        </w:rPr>
+        <w:t xml:space="preserve">The teaching team dedicated a considerable effort to restructure the LMS so each role could </w:t>
+      </w:r>
+      <w:r>
+        <w:rPr>
+          <w:lang w:val="en-NZ"/>
+        </w:rPr>
+        <w:t>navigate</w:t>
+      </w:r>
+      <w:r>
+        <w:rPr>
+          <w:lang w:val="en-NZ"/>
+        </w:rPr>
+        <w:t xml:space="preserve"> better the extensive documentation of the project and find relevant information about their work and the marking criteria of each </w:t>
+      </w:r>
+      <w:r>
+        <w:rPr>
+          <w:lang w:val="en-NZ"/>
+        </w:rPr>
+        <w:t>deliverable</w:t>
+      </w:r>
+      <w:r>
+        <w:rPr>
+          <w:lang w:val="en-NZ"/>
+        </w:rPr>
+        <w:t>. The team also decided to enforce more the use of the public forum provided by the LMS</w:t>
+      </w:r>
+      <w:r>
+        <w:rPr>
+          <w:lang w:val="en-NZ"/>
+        </w:rPr>
+        <w:t>, adding a lot of information, questions and answers in different conversations thread that the students were encouraged to use instead of waiting for the classroom session to get in contact with the lecturers or other students.</w:t>
+      </w:r>
+    </w:p>
+    <w:p>
+      <w:pPr>
+        <w:rPr>
+          <w:lang w:val="en-NZ"/>
+        </w:rPr>
+      </w:pPr>
+      <w:r>
+        <w:rPr>
+          <w:lang w:val="en-NZ"/>
+        </w:rPr>
+        <w:t xml:space="preserve">Issues with the balance of work between the different roles, as well as some aspect of how the simulation experience with the “client”, were acknowledge and discussed but needed more time and work for a solution with more complex changes to be </w:t>
+      </w:r>
+      <w:r>
+        <w:rPr>
+          <w:lang w:val="en-NZ"/>
+        </w:rPr>
+        <w:t>implemented and were postponed for the next cohort of the course. Some of the ideas related to this topic will be discussed in section 6.10.</w:t>
+      </w:r>
+    </w:p>
+    <w:p>
+      <w:pPr>
+        <w:rPr>
+          <w:lang w:val="en-NZ"/>
+        </w:rPr>
+      </w:pPr>
+      <w:r>
+        <w:rPr>
+          <w:lang w:val="en-NZ"/>
+        </w:rPr>
+        <w:t>Both the learning and technical fronts in the development of the course and the research used the time in the semester break to adjust approaches and test new proposals for the next semester and the last stage of observations, as will be discussed in next section.</w:t>
+      </w:r>
+    </w:p>
+    <w:p>
+      <w:pPr>
+        <w:pStyle w:val="Ttulo1"/>
+        <w:rPr>
+          <w:sz w:val="22"/>
+          <w:szCs w:val="22"/>
+          <w:lang w:val="en-NZ"/>
+        </w:rPr>
+      </w:pPr>
+      <w:r>
+        <w:rPr>
+          <w:sz w:val="22"/>
+          <w:szCs w:val="22"/>
           <w:lang w:val="en-NZ"/>
         </w:rPr>
         <w:t>6.8 Weeks 14 to 20: Second Semester Workout</w:t>
@@ -12386,42 +12806,142 @@
         <w:rPr>
           <w:lang w:val="en-NZ"/>
         </w:rPr>
-        <w:t>Test the arm rigs, failed</w:t>
-      </w:r>
-    </w:p>
-    <w:p>
-      <w:pPr>
-        <w:rPr>
-          <w:lang w:val="en-NZ"/>
-        </w:rPr>
-      </w:pPr>
-      <w:r>
-        <w:rPr>
-          <w:lang w:val="en-NZ"/>
-        </w:rPr>
-        <w:t>Test the emotes, win</w:t>
-      </w:r>
-    </w:p>
-    <w:p>
-      <w:pPr>
-        <w:rPr>
-          <w:lang w:val="en-NZ"/>
-        </w:rPr>
-      </w:pPr>
-      <w:r>
-        <w:rPr>
+        <w:t xml:space="preserve">This las section of the observations will encompass all the work done during the second semester. The more general view of </w:t>
+      </w:r>
+      <w:r>
+        <w:rPr>
+          <w:lang w:val="en-NZ"/>
+        </w:rPr>
+        <w:t>the</w:t>
+      </w:r>
+      <w:r>
+        <w:rPr>
+          <w:lang w:val="en-NZ"/>
+        </w:rPr>
+        <w:t xml:space="preserve"> activities of the students during this second workout is due to a couple of factors:</w:t>
+      </w:r>
+    </w:p>
+    <w:p>
+      <w:pPr>
+        <w:pStyle w:val="Prrafodelista"/>
+        <w:numPr>
+          <w:ilvl w:val="0"/>
+          <w:numId w:val="28"/>
+        </w:numPr>
+        <w:rPr>
+          <w:lang w:val="en-NZ"/>
+        </w:rPr>
+      </w:pPr>
+      <w:r>
+        <w:rPr>
+          <w:lang w:val="en-NZ"/>
+        </w:rPr>
+        <w:t xml:space="preserve">The activities proposed for </w:t>
+      </w:r>
+      <w:r>
+        <w:rPr>
+          <w:lang w:val="en-NZ"/>
+        </w:rPr>
+        <w:t>the groups, now on track B, were exactly de same, a poster and a final client report, this time aimed a presenting a refined final design proposal for the project.</w:t>
+      </w:r>
+    </w:p>
+    <w:p>
+      <w:pPr>
+        <w:pStyle w:val="Prrafodelista"/>
+        <w:numPr>
+          <w:ilvl w:val="0"/>
+          <w:numId w:val="28"/>
+        </w:numPr>
+        <w:rPr>
+          <w:lang w:val="en-NZ"/>
+        </w:rPr>
+      </w:pPr>
+      <w:r>
+        <w:rPr>
+          <w:lang w:val="en-NZ"/>
+        </w:rPr>
+        <w:lastRenderedPageBreak/>
+        <w:t>Of the 12 weeks of work for the semester, only 6 were observed, those dedicated to the work on the poster presentation since it was the activity that demonstrated the most collaborative work.</w:t>
+      </w:r>
+    </w:p>
+    <w:p>
+      <w:pPr>
+        <w:pStyle w:val="Prrafodelista"/>
+        <w:numPr>
+          <w:ilvl w:val="0"/>
+          <w:numId w:val="28"/>
+        </w:numPr>
+        <w:rPr>
+          <w:lang w:val="en-NZ"/>
+        </w:rPr>
+      </w:pPr>
+      <w:r>
+        <w:rPr>
+          <w:lang w:val="en-NZ"/>
+        </w:rPr>
+        <w:t>The observations were even more focused, with the specific objective of testing the changes made to the physical disposition of the tool and to the annotations and debate features.</w:t>
+      </w:r>
+    </w:p>
+    <w:p>
+      <w:pPr>
+        <w:rPr>
+          <w:lang w:val="en-NZ"/>
+        </w:rPr>
+      </w:pPr>
+      <w:r>
+        <w:rPr>
+          <w:lang w:val="en-NZ"/>
+        </w:rPr>
+        <w:t xml:space="preserve">Besides the changes made to the presentation of information in the LMS, the structure of the course was </w:t>
+      </w:r>
+      <w:r>
+        <w:rPr>
+          <w:lang w:val="en-NZ"/>
+        </w:rPr>
+        <w:t>the same</w:t>
+      </w:r>
+      <w:r>
+        <w:rPr>
+          <w:lang w:val="en-NZ"/>
+        </w:rPr>
+        <w:t xml:space="preserve">, the groups were firmly stablished by then and the overall objective of the project was clear. </w:t>
+      </w:r>
+      <w:r>
+        <w:rPr>
+          <w:lang w:val="en-NZ"/>
+        </w:rPr>
+        <w:t>The biggest change on the dynamics of the classroom session was on the TA team and the procedure implemented for the students to seek information about the project, as will be described in the next section.</w:t>
+      </w:r>
+    </w:p>
+    <w:p>
+      <w:pPr>
+        <w:pStyle w:val="Ttulo2"/>
+        <w:rPr>
+          <w:sz w:val="22"/>
+          <w:szCs w:val="22"/>
+          <w:lang w:val="en-NZ"/>
+        </w:rPr>
+      </w:pPr>
+      <w:r>
+        <w:rPr>
+          <w:sz w:val="22"/>
+          <w:szCs w:val="22"/>
           <w:lang w:val="en-NZ"/>
         </w:rPr>
         <w:t>6.</w:t>
       </w:r>
       <w:r>
         <w:rPr>
+          <w:sz w:val="22"/>
+          <w:szCs w:val="22"/>
           <w:lang w:val="en-NZ"/>
         </w:rPr>
         <w:t>8</w:t>
       </w:r>
       <w:r>
         <w:rPr>
+          <w:sz w:val="22"/>
+          <w:szCs w:val="22"/>
           <w:lang w:val="en-NZ"/>
         </w:rPr>
         <w:t>.1 General Observations</w:t>
@@ -12437,16 +12957,342 @@
         <w:rPr>
           <w:lang w:val="en-NZ"/>
         </w:rPr>
+        <w:t>The first other of the day for all the groups starting now the track B of the course was to understand the new mechanisms proposed to facilitate the flow of information from the teaching staff and from other students.</w:t>
+      </w:r>
+    </w:p>
+    <w:p>
+      <w:pPr>
+        <w:rPr>
+          <w:lang w:val="en-NZ"/>
+        </w:rPr>
+      </w:pPr>
+      <w:r>
+        <w:rPr>
+          <w:lang w:val="en-NZ"/>
+        </w:rPr>
+        <w:t>The first change was on the structure of the TA group. Despite being it an interesting mechanic to have all the TA at disposition to help during the classroom sessions, it also meant that the teaching staff had to also coordinate with the TA team all the information of the course and the answers that were given to the students about different aspects of the project. Despite the benefits of having a lot of TA helping in the classroom, the confusion created by contradictory answers from different TA was not helping the students to progress in their project efficiently. The TA would now rotate in each session, and the students would have to work with the specialties that were present in the classroom in any given session. Less flexibility for the students more much easier to administrate for the teaching staff.</w:t>
+      </w:r>
+    </w:p>
+    <w:p>
+      <w:pPr>
+        <w:rPr>
+          <w:lang w:val="en-NZ"/>
+        </w:rPr>
+      </w:pPr>
+      <w:r>
+        <w:rPr>
+          <w:lang w:val="en-NZ"/>
+        </w:rPr>
+        <w:t>To support the lack of TA present for this second semester, the students the strongly encouraged to use the forum tool in the LMS to keep information flowing from the teaching staff and more importantly, from the students themselves. During the following weeks it was possible to see the lecturers and the TA redirecting the students to the forum every time a question was asked, specially those related to technical information about the project. Another interesting activity was to encourage the students to write a question they just asked in the forum. The teaching staff would provide an answer through the forum instead of doing it directly, enforcing the use of the tool.</w:t>
+      </w:r>
+    </w:p>
+    <w:p>
+      <w:pPr>
+        <w:rPr>
+          <w:lang w:val="en-NZ"/>
+        </w:rPr>
+      </w:pPr>
+      <w:r>
+        <w:rPr>
+          <w:lang w:val="en-NZ"/>
+        </w:rPr>
+        <w:t>It was interesting to observe that the forum was growing little by little, and that the students were using it to communicate with other groups, with the teaching staff and creating a communal repository of knowledge, albeit in a bit forced manner. It was an interesting approach to the use of a forum tool that was observed to be failing in the previous semester, mainly because the students saw no value in it</w:t>
+      </w:r>
+      <w:r>
+        <w:rPr>
+          <w:lang w:val="en-NZ"/>
+        </w:rPr>
+        <w:t>, but now it was strongly integrated to their workflow</w:t>
+      </w:r>
+      <w:r>
+        <w:rPr>
+          <w:lang w:val="en-NZ"/>
+        </w:rPr>
+        <w:t>.</w:t>
+      </w:r>
+    </w:p>
+    <w:p>
+      <w:pPr>
+        <w:rPr>
+          <w:lang w:val="en-NZ"/>
+        </w:rPr>
+      </w:pPr>
+      <w:r>
+        <w:rPr>
+          <w:lang w:val="en-NZ"/>
+        </w:rPr>
+        <w:t>It was possible to regain contact with Team D during the second semester, and it was valuable to take the opportunity to test most of the new approaches of WorkshopAR with them since that had experience with the previous versions of the tool and new the context of the research the best.</w:t>
+      </w:r>
+      <w:r>
+        <w:rPr>
+          <w:lang w:val="en-NZ"/>
+        </w:rPr>
+        <w:t xml:space="preserve"> They also serve as a good example of the </w:t>
+      </w:r>
+      <w:r>
+        <w:rPr>
+          <w:lang w:val="en-NZ"/>
+        </w:rPr>
+        <w:t xml:space="preserve">noticeable distinction </w:t>
+      </w:r>
+      <w:r>
+        <w:rPr>
+          <w:lang w:val="en-NZ"/>
+        </w:rPr>
+        <w:lastRenderedPageBreak/>
+        <w:t>between groups that had formed in the course and that was described in section 6.6.1. Some groups had a good head start from the previous semester and the work done to create the refinement of the project was not as intensive as in the first 10 weeks of observations. On the other hand, some groups had to reform, keep working with less team members or basically start with a new proposal creating two distinct scenarios of work in the classroom.</w:t>
+      </w:r>
+    </w:p>
+    <w:p>
+      <w:pPr>
+        <w:rPr>
+          <w:lang w:val="en-US"/>
+        </w:rPr>
+      </w:pPr>
+      <w:r>
+        <w:rPr>
+          <w:lang w:val="en-US"/>
+        </w:rPr>
+        <w:t>Team D had obtained v</w:t>
+      </w:r>
+      <w:r>
+        <w:rPr>
+          <w:lang w:val="en-US"/>
+        </w:rPr>
+        <w:t>ery good results in the previous semester, and they were a little bit complacent with their work</w:t>
+      </w:r>
+      <w:r>
+        <w:rPr>
+          <w:lang w:val="en-US"/>
+        </w:rPr>
+        <w:t>.</w:t>
+      </w:r>
+      <w:r>
+        <w:rPr>
+          <w:lang w:val="en-US"/>
+        </w:rPr>
+        <w:t xml:space="preserve"> The general observations described for week 10 to 13 remained present </w:t>
+      </w:r>
+      <w:r>
+        <w:rPr>
+          <w:lang w:val="en-US"/>
+        </w:rPr>
+        <w:t>throughout</w:t>
+      </w:r>
+      <w:r>
+        <w:rPr>
+          <w:lang w:val="en-US"/>
+        </w:rPr>
+        <w:t xml:space="preserve"> the new semester: collaboration was minimal because the intensity of the work was also down, and they kept coming to the classroom because it was the best place to advance in their work throughout the week</w:t>
+      </w:r>
+      <w:r>
+        <w:rPr>
+          <w:lang w:val="en-US"/>
+        </w:rPr>
+        <w:t>.</w:t>
+      </w:r>
+      <w:r>
+        <w:rPr>
+          <w:lang w:val="en-US"/>
+        </w:rPr>
+        <w:t xml:space="preserve"> </w:t>
+      </w:r>
+      <w:r>
+        <w:rPr>
+          <w:lang w:val="en-US"/>
+        </w:rPr>
+        <w:t>It</w:t>
+      </w:r>
+      <w:r>
+        <w:rPr>
+          <w:lang w:val="en-US"/>
+        </w:rPr>
+        <w:t xml:space="preserve"> could also be added that this semester was also the last semester for many of the students, which saw this project as the very last effort before graduation</w:t>
+      </w:r>
+      <w:r>
+        <w:rPr>
+          <w:lang w:val="en-US"/>
+        </w:rPr>
+        <w:t xml:space="preserve"> and just wanted to get over it.</w:t>
+      </w:r>
+    </w:p>
+    <w:p>
+      <w:pPr>
+        <w:rPr>
+          <w:lang w:val="en-US"/>
+        </w:rPr>
+      </w:pPr>
+      <w:r>
+        <w:rPr>
+          <w:lang w:val="en-US"/>
+        </w:rPr>
+        <w:t>Team E</w:t>
+      </w:r>
+      <w:r>
+        <w:rPr>
+          <w:lang w:val="en-US"/>
+        </w:rPr>
+        <w:t xml:space="preserve"> offered an i</w:t>
+      </w:r>
+      <w:r>
+        <w:rPr>
+          <w:lang w:val="en-US"/>
+        </w:rPr>
+        <w:t>nteresting contrast.</w:t>
+      </w:r>
+      <w:r>
+        <w:rPr>
+          <w:lang w:val="en-US"/>
+        </w:rPr>
+        <w:t xml:space="preserve"> </w:t>
+      </w:r>
+      <w:r>
+        <w:rPr>
+          <w:lang w:val="en-US"/>
+        </w:rPr>
+        <w:t>First,</w:t>
+      </w:r>
+      <w:r>
+        <w:rPr>
+          <w:lang w:val="en-US"/>
+        </w:rPr>
+        <w:t xml:space="preserve"> they will be </w:t>
+      </w:r>
+      <w:r>
+        <w:rPr>
+          <w:lang w:val="en-US"/>
+        </w:rPr>
+        <w:t>referred to</w:t>
+      </w:r>
+      <w:r>
+        <w:rPr>
+          <w:lang w:val="en-US"/>
+        </w:rPr>
+        <w:t xml:space="preserve"> as Team E just for simplicity, because the observation took place when several students were working together with the aid of one of the </w:t>
+      </w:r>
+      <w:r>
+        <w:rPr>
+          <w:lang w:val="en-US"/>
+        </w:rPr>
+        <w:t>lectures</w:t>
+      </w:r>
+      <w:r>
+        <w:rPr>
+          <w:lang w:val="en-US"/>
+        </w:rPr>
+        <w:t xml:space="preserve">, but they were not necessarily from the same group. In fact, some </w:t>
+      </w:r>
+      <w:r>
+        <w:rPr>
+          <w:lang w:val="en-US"/>
+        </w:rPr>
+        <w:t>members of Team B were present there. They commented that they had a lot of communication problems towards the end of the poster presentation principally because a lot of the members never showed up for class. At the end, the two members present try their best to gather as much information as possible and later coordinate with the rest of the group via teams. It was not ideal, but it was what worked best for them.</w:t>
+      </w:r>
+    </w:p>
+    <w:p>
+      <w:pPr>
+        <w:rPr>
+          <w:lang w:val="en-US"/>
+        </w:rPr>
+      </w:pPr>
+      <w:r>
+        <w:rPr>
+          <w:lang w:val="en-US"/>
+        </w:rPr>
+        <w:t xml:space="preserve"> </w:t>
+      </w:r>
+      <w:r>
+        <w:rPr>
+          <w:lang w:val="en-US"/>
+        </w:rPr>
+        <w:t xml:space="preserve">As with Team D, the work in Tem E consisted mostly </w:t>
+      </w:r>
+      <w:r>
+        <w:rPr>
+          <w:lang w:val="en-US"/>
+        </w:rPr>
+        <w:t>of</w:t>
+      </w:r>
+      <w:r>
+        <w:rPr>
+          <w:lang w:val="en-US"/>
+        </w:rPr>
+        <w:t xml:space="preserve"> individual work using computers and the direct help of the lecturer, that was giving feedback to the students and making some conversation to lead the students to think a bit more </w:t>
+      </w:r>
+      <w:r>
+        <w:rPr>
+          <w:lang w:val="en-US"/>
+        </w:rPr>
+        <w:t>critical</w:t>
+      </w:r>
+      <w:r>
+        <w:rPr>
+          <w:lang w:val="en-US"/>
+        </w:rPr>
+        <w:t xml:space="preserve"> about the work they were doing.</w:t>
+      </w:r>
+      <w:r>
+        <w:rPr>
+          <w:lang w:val="en-US"/>
+        </w:rPr>
+        <w:t xml:space="preserve"> </w:t>
+      </w:r>
+    </w:p>
+    <w:p>
+      <w:pPr>
+        <w:rPr>
+          <w:lang w:val="en-US"/>
+        </w:rPr>
+      </w:pPr>
+      <w:r>
+        <w:rPr>
+          <w:lang w:val="en-US"/>
+        </w:rPr>
+        <w:t>Although information was flowing between the students, especially between groups that were farther behind the development of their project, the work of the students had turn out more individual and the groups were mostly linked by the architectural design they were working on rather than the need for collaborations. It was also possible to evidence this situation be looking at the lack of assistance from the students to the classroom sessions, since there was not much value any more to be present in the session. Even the teaching staff concentrated more on the students that had started in Track A, and who were experiencing right now the same initial frenzy observed with track B the previous semester.</w:t>
+      </w:r>
+    </w:p>
+    <w:p>
+      <w:pPr>
+        <w:rPr>
+          <w:lang w:val="en-US"/>
+        </w:rPr>
+      </w:pPr>
+      <w:r>
+        <w:rPr>
+          <w:lang w:val="en-US"/>
+        </w:rPr>
+        <w:t>The situation was very similar to what was observed during the last weeks of the previous semester, and for the activities with WorkshopAR, there were less opportunities for more extensive discussions as the ones found previously, but it was possible to gather some interesting responses to the changes made to the approach with the tool, as detailed in the next section.</w:t>
+      </w:r>
+    </w:p>
+    <w:p>
+      <w:pPr>
+        <w:pStyle w:val="Ttulo2"/>
+        <w:rPr>
+          <w:sz w:val="22"/>
+          <w:szCs w:val="22"/>
+          <w:lang w:val="en-NZ"/>
+        </w:rPr>
+      </w:pPr>
+      <w:r>
+        <w:rPr>
+          <w:sz w:val="22"/>
+          <w:szCs w:val="22"/>
+          <w:lang w:val="en-NZ"/>
+        </w:rPr>
         <w:t>6.</w:t>
       </w:r>
       <w:r>
         <w:rPr>
+          <w:sz w:val="22"/>
+          <w:szCs w:val="22"/>
           <w:lang w:val="en-NZ"/>
         </w:rPr>
         <w:t>8</w:t>
       </w:r>
       <w:r>
         <w:rPr>
+          <w:sz w:val="22"/>
+          <w:szCs w:val="22"/>
           <w:lang w:val="en-NZ"/>
         </w:rPr>
         <w:t>.2 Intervention with WorkshopAR</w:t>
@@ -12462,6 +13308,32 @@
         <w:rPr>
           <w:lang w:val="en-NZ"/>
         </w:rPr>
+        <w:t>6.8.2.1 Set up with the clamp arms</w:t>
+      </w:r>
+    </w:p>
+    <w:p>
+      <w:pPr>
+        <w:rPr>
+          <w:lang w:val="en-NZ"/>
+        </w:rPr>
+      </w:pPr>
+      <w:r>
+        <w:rPr>
+          <w:lang w:val="en-NZ"/>
+        </w:rPr>
+        <w:t>6.8.2.2 unstructured workflow and emotes</w:t>
+      </w:r>
+    </w:p>
+    <w:p>
+      <w:pPr>
+        <w:rPr>
+          <w:lang w:val="en-NZ"/>
+        </w:rPr>
+      </w:pPr>
+      <w:r>
+        <w:rPr>
+          <w:lang w:val="en-NZ"/>
+        </w:rPr>
         <w:t>6.</w:t>
       </w:r>
       <w:r>
@@ -12487,6 +13359,20 @@
         <w:rPr>
           <w:lang w:val="en-NZ"/>
         </w:rPr>
+        <w:lastRenderedPageBreak/>
+        <w:t>Using the forum a form of community registry, the basis of a CoP</w:t>
+      </w:r>
+    </w:p>
+    <w:p>
+      <w:pPr>
+        <w:rPr>
+          <w:lang w:val="en-NZ"/>
+        </w:rPr>
+      </w:pPr>
+      <w:r>
+        <w:rPr>
+          <w:lang w:val="en-NZ"/>
+        </w:rPr>
         <w:t>6.9 Analysis on Student’s Observations and Responses</w:t>
       </w:r>
     </w:p>
@@ -12501,6 +13387,32 @@
           <w:lang w:val="en-NZ"/>
         </w:rPr>
         <w:t>6.10 Analysis on Teaching Staff’s Observations and Responses</w:t>
+      </w:r>
+    </w:p>
+    <w:p>
+      <w:pPr>
+        <w:rPr>
+          <w:lang w:val="en-NZ"/>
+        </w:rPr>
+      </w:pPr>
+      <w:r>
+        <w:rPr>
+          <w:lang w:val="en-NZ"/>
+        </w:rPr>
+        <w:t>Requirements of the course being taught earlier</w:t>
+      </w:r>
+    </w:p>
+    <w:p>
+      <w:pPr>
+        <w:rPr>
+          <w:lang w:val="en-NZ"/>
+        </w:rPr>
+      </w:pPr>
+      <w:r>
+        <w:rPr>
+          <w:lang w:val="en-NZ"/>
+        </w:rPr>
+        <w:t>Adjust the simulation aspect</w:t>
       </w:r>
     </w:p>
     <w:p>
@@ -12653,6 +13565,119 @@
 <file path=word/numbering.xml><?xml version="1.0" encoding="utf-8"?>
 <w:numbering xmlns:wpc="http://schemas.microsoft.com/office/word/2010/wordprocessingCanvas" xmlns:cx="http://schemas.microsoft.com/office/drawing/2014/chartex" xmlns:cx1="http://schemas.microsoft.com/office/drawing/2015/9/8/chartex" xmlns:cx2="http://schemas.microsoft.com/office/drawing/2015/10/21/chartex" xmlns:cx3="http://schemas.microsoft.com/office/drawing/2016/5/9/chartex" xmlns:cx4="http://schemas.microsoft.com/office/drawing/2016/5/10/chartex" xmlns:cx5="http://schemas.microsoft.com/office/drawing/2016/5/11/chartex" xmlns:cx6="http://schemas.microsoft.com/office/drawing/2016/5/12/chartex" xmlns:cx7="http://schemas.microsoft.com/office/drawing/2016/5/13/chartex" xmlns:cx8="http://schemas.microsoft.com/office/drawing/2016/5/14/chartex" xmlns:mc="http://schemas.openxmlformats.org/markup-compatibility/2006" xmlns:aink="http://schemas.microsoft.com/office/drawing/2016/ink" xmlns:am3d="http://schemas.microsoft.com/office/drawing/2017/model3d" xmlns:o="urn:schemas-microsoft-com:office:office" xmlns:oel="http://schemas.microsoft.com/office/2019/extlst" xmlns:r="http://schemas.openxmlformats.org/officeDocument/2006/relationships" xmlns:m="http://schemas.openxmlformats.org/officeDocument/2006/math" xmlns:v="urn:schemas-microsoft-com:vml" xmlns:wp14="http://schemas.microsoft.com/office/word/2010/wordprocessingDrawing" xmlns:wp="http://schemas.openxmlformats.org/drawingml/2006/wordprocessingDrawing" xmlns:w10="urn:schemas-microsoft-com:office:word" xmlns:w="http://schemas.openxmlformats.org/wordprocessingml/2006/main" xmlns:w14="http://schemas.microsoft.com/office/word/2010/wordml" xmlns:w15="http://schemas.microsoft.com/office/word/2012/wordml" xmlns:w16cex="http://schemas.microsoft.com/office/word/2018/wordml/cex" xmlns:w16cid="http://schemas.microsoft.com/office/word/2016/wordml/cid" xmlns:w16="http://schemas.microsoft.com/office/word/2018/wordml" xmlns:w16du="http://schemas.microsoft.com/office/word/2023/wordml/word16du" xmlns:w16sdtdh="http://schemas.microsoft.com/office/word/2020/wordml/sdtdatahash" xmlns:w16sdtfl="http://schemas.microsoft.com/office/word/2024/wordml/sdtformatlock" xmlns:w16se="http://schemas.microsoft.com/office/word/2015/wordml/symex" xmlns:wpg="http://schemas.microsoft.com/office/word/2010/wordprocessingGroup" xmlns:wpi="http://schemas.microsoft.com/office/word/2010/wordprocessingInk" xmlns:wne="http://schemas.microsoft.com/office/word/2006/wordml" xmlns:wps="http://schemas.microsoft.com/office/word/2010/wordprocessingShape" mc:Ignorable="w14 w15 w16se w16cid w16 w16cex w16sdtdh w16sdtfl w16du wp14">
   <w:abstractNum w:abstractNumId="0" w15:restartNumberingAfterBreak="0">
+    <w:nsid w:val="008B0165"/>
+    <w:multiLevelType w:val="hybridMultilevel"/>
+    <w:tmpl w:val="3D880C02"/>
+    <w:lvl w:ilvl="0" w:tplc="240A0001">
+      <w:start w:val="1"/>
+      <w:numFmt w:val="bullet"/>
+      <w:lvlText w:val=""/>
+      <w:lvlJc w:val="left"/>
+      <w:pPr>
+        <w:ind w:left="720" w:hanging="360"/>
+      </w:pPr>
+      <w:rPr>
+        <w:rFonts w:ascii="Symbol" w:hAnsi="Symbol" w:hint="default"/>
+      </w:rPr>
+    </w:lvl>
+    <w:lvl w:ilvl="1" w:tplc="240A0003" w:tentative="1">
+      <w:start w:val="1"/>
+      <w:numFmt w:val="bullet"/>
+      <w:lvlText w:val="o"/>
+      <w:lvlJc w:val="left"/>
+      <w:pPr>
+        <w:ind w:left="1440" w:hanging="360"/>
+      </w:pPr>
+      <w:rPr>
+        <w:rFonts w:ascii="Courier New" w:hAnsi="Courier New" w:cs="Courier New" w:hint="default"/>
+      </w:rPr>
+    </w:lvl>
+    <w:lvl w:ilvl="2" w:tplc="240A0005" w:tentative="1">
+      <w:start w:val="1"/>
+      <w:numFmt w:val="bullet"/>
+      <w:lvlText w:val=""/>
+      <w:lvlJc w:val="left"/>
+      <w:pPr>
+        <w:ind w:left="2160" w:hanging="360"/>
+      </w:pPr>
+      <w:rPr>
+        <w:rFonts w:ascii="Wingdings" w:hAnsi="Wingdings" w:hint="default"/>
+      </w:rPr>
+    </w:lvl>
+    <w:lvl w:ilvl="3" w:tplc="240A0001" w:tentative="1">
+      <w:start w:val="1"/>
+      <w:numFmt w:val="bullet"/>
+      <w:lvlText w:val=""/>
+      <w:lvlJc w:val="left"/>
+      <w:pPr>
+        <w:ind w:left="2880" w:hanging="360"/>
+      </w:pPr>
+      <w:rPr>
+        <w:rFonts w:ascii="Symbol" w:hAnsi="Symbol" w:hint="default"/>
+      </w:rPr>
+    </w:lvl>
+    <w:lvl w:ilvl="4" w:tplc="240A0003" w:tentative="1">
+      <w:start w:val="1"/>
+      <w:numFmt w:val="bullet"/>
+      <w:lvlText w:val="o"/>
+      <w:lvlJc w:val="left"/>
+      <w:pPr>
+        <w:ind w:left="3600" w:hanging="360"/>
+      </w:pPr>
+      <w:rPr>
+        <w:rFonts w:ascii="Courier New" w:hAnsi="Courier New" w:cs="Courier New" w:hint="default"/>
+      </w:rPr>
+    </w:lvl>
+    <w:lvl w:ilvl="5" w:tplc="240A0005" w:tentative="1">
+      <w:start w:val="1"/>
+      <w:numFmt w:val="bullet"/>
+      <w:lvlText w:val=""/>
+      <w:lvlJc w:val="left"/>
+      <w:pPr>
+        <w:ind w:left="4320" w:hanging="360"/>
+      </w:pPr>
+      <w:rPr>
+        <w:rFonts w:ascii="Wingdings" w:hAnsi="Wingdings" w:hint="default"/>
+      </w:rPr>
+    </w:lvl>
+    <w:lvl w:ilvl="6" w:tplc="240A0001" w:tentative="1">
+      <w:start w:val="1"/>
+      <w:numFmt w:val="bullet"/>
+      <w:lvlText w:val=""/>
+      <w:lvlJc w:val="left"/>
+      <w:pPr>
+        <w:ind w:left="5040" w:hanging="360"/>
+      </w:pPr>
+      <w:rPr>
+        <w:rFonts w:ascii="Symbol" w:hAnsi="Symbol" w:hint="default"/>
+      </w:rPr>
+    </w:lvl>
+    <w:lvl w:ilvl="7" w:tplc="240A0003" w:tentative="1">
+      <w:start w:val="1"/>
+      <w:numFmt w:val="bullet"/>
+      <w:lvlText w:val="o"/>
+      <w:lvlJc w:val="left"/>
+      <w:pPr>
+        <w:ind w:left="5760" w:hanging="360"/>
+      </w:pPr>
+      <w:rPr>
+        <w:rFonts w:ascii="Courier New" w:hAnsi="Courier New" w:cs="Courier New" w:hint="default"/>
+      </w:rPr>
+    </w:lvl>
+    <w:lvl w:ilvl="8" w:tplc="240A0005" w:tentative="1">
+      <w:start w:val="1"/>
+      <w:numFmt w:val="bullet"/>
+      <w:lvlText w:val=""/>
+      <w:lvlJc w:val="left"/>
+      <w:pPr>
+        <w:ind w:left="6480" w:hanging="360"/>
+      </w:pPr>
+      <w:rPr>
+        <w:rFonts w:ascii="Wingdings" w:hAnsi="Wingdings" w:hint="default"/>
+      </w:rPr>
+    </w:lvl>
+  </w:abstractNum>
+  <w:abstractNum w:abstractNumId="1" w15:restartNumberingAfterBreak="0">
     <w:nsid w:val="04694CC9"/>
     <w:multiLevelType w:val="hybridMultilevel"/>
     <w:tmpl w:val="23E20010"/>
@@ -12738,7 +13763,7 @@
       </w:pPr>
     </w:lvl>
   </w:abstractNum>
-  <w:abstractNum w:abstractNumId="1" w15:restartNumberingAfterBreak="0">
+  <w:abstractNum w:abstractNumId="2" w15:restartNumberingAfterBreak="0">
     <w:nsid w:val="11D01384"/>
     <w:multiLevelType w:val="hybridMultilevel"/>
     <w:tmpl w:val="A22E6ECE"/>
@@ -12851,7 +13876,120 @@
       </w:rPr>
     </w:lvl>
   </w:abstractNum>
-  <w:abstractNum w:abstractNumId="2" w15:restartNumberingAfterBreak="0">
+  <w:abstractNum w:abstractNumId="3" w15:restartNumberingAfterBreak="0">
+    <w:nsid w:val="12921473"/>
+    <w:multiLevelType w:val="hybridMultilevel"/>
+    <w:tmpl w:val="85243DF4"/>
+    <w:lvl w:ilvl="0" w:tplc="240A0001">
+      <w:start w:val="1"/>
+      <w:numFmt w:val="bullet"/>
+      <w:lvlText w:val=""/>
+      <w:lvlJc w:val="left"/>
+      <w:pPr>
+        <w:ind w:left="720" w:hanging="360"/>
+      </w:pPr>
+      <w:rPr>
+        <w:rFonts w:ascii="Symbol" w:hAnsi="Symbol" w:hint="default"/>
+      </w:rPr>
+    </w:lvl>
+    <w:lvl w:ilvl="1" w:tplc="240A0003" w:tentative="1">
+      <w:start w:val="1"/>
+      <w:numFmt w:val="bullet"/>
+      <w:lvlText w:val="o"/>
+      <w:lvlJc w:val="left"/>
+      <w:pPr>
+        <w:ind w:left="1440" w:hanging="360"/>
+      </w:pPr>
+      <w:rPr>
+        <w:rFonts w:ascii="Courier New" w:hAnsi="Courier New" w:cs="Courier New" w:hint="default"/>
+      </w:rPr>
+    </w:lvl>
+    <w:lvl w:ilvl="2" w:tplc="240A0005" w:tentative="1">
+      <w:start w:val="1"/>
+      <w:numFmt w:val="bullet"/>
+      <w:lvlText w:val=""/>
+      <w:lvlJc w:val="left"/>
+      <w:pPr>
+        <w:ind w:left="2160" w:hanging="360"/>
+      </w:pPr>
+      <w:rPr>
+        <w:rFonts w:ascii="Wingdings" w:hAnsi="Wingdings" w:hint="default"/>
+      </w:rPr>
+    </w:lvl>
+    <w:lvl w:ilvl="3" w:tplc="240A0001" w:tentative="1">
+      <w:start w:val="1"/>
+      <w:numFmt w:val="bullet"/>
+      <w:lvlText w:val=""/>
+      <w:lvlJc w:val="left"/>
+      <w:pPr>
+        <w:ind w:left="2880" w:hanging="360"/>
+      </w:pPr>
+      <w:rPr>
+        <w:rFonts w:ascii="Symbol" w:hAnsi="Symbol" w:hint="default"/>
+      </w:rPr>
+    </w:lvl>
+    <w:lvl w:ilvl="4" w:tplc="240A0003" w:tentative="1">
+      <w:start w:val="1"/>
+      <w:numFmt w:val="bullet"/>
+      <w:lvlText w:val="o"/>
+      <w:lvlJc w:val="left"/>
+      <w:pPr>
+        <w:ind w:left="3600" w:hanging="360"/>
+      </w:pPr>
+      <w:rPr>
+        <w:rFonts w:ascii="Courier New" w:hAnsi="Courier New" w:cs="Courier New" w:hint="default"/>
+      </w:rPr>
+    </w:lvl>
+    <w:lvl w:ilvl="5" w:tplc="240A0005" w:tentative="1">
+      <w:start w:val="1"/>
+      <w:numFmt w:val="bullet"/>
+      <w:lvlText w:val=""/>
+      <w:lvlJc w:val="left"/>
+      <w:pPr>
+        <w:ind w:left="4320" w:hanging="360"/>
+      </w:pPr>
+      <w:rPr>
+        <w:rFonts w:ascii="Wingdings" w:hAnsi="Wingdings" w:hint="default"/>
+      </w:rPr>
+    </w:lvl>
+    <w:lvl w:ilvl="6" w:tplc="240A0001" w:tentative="1">
+      <w:start w:val="1"/>
+      <w:numFmt w:val="bullet"/>
+      <w:lvlText w:val=""/>
+      <w:lvlJc w:val="left"/>
+      <w:pPr>
+        <w:ind w:left="5040" w:hanging="360"/>
+      </w:pPr>
+      <w:rPr>
+        <w:rFonts w:ascii="Symbol" w:hAnsi="Symbol" w:hint="default"/>
+      </w:rPr>
+    </w:lvl>
+    <w:lvl w:ilvl="7" w:tplc="240A0003" w:tentative="1">
+      <w:start w:val="1"/>
+      <w:numFmt w:val="bullet"/>
+      <w:lvlText w:val="o"/>
+      <w:lvlJc w:val="left"/>
+      <w:pPr>
+        <w:ind w:left="5760" w:hanging="360"/>
+      </w:pPr>
+      <w:rPr>
+        <w:rFonts w:ascii="Courier New" w:hAnsi="Courier New" w:cs="Courier New" w:hint="default"/>
+      </w:rPr>
+    </w:lvl>
+    <w:lvl w:ilvl="8" w:tplc="240A0005" w:tentative="1">
+      <w:start w:val="1"/>
+      <w:numFmt w:val="bullet"/>
+      <w:lvlText w:val=""/>
+      <w:lvlJc w:val="left"/>
+      <w:pPr>
+        <w:ind w:left="6480" w:hanging="360"/>
+      </w:pPr>
+      <w:rPr>
+        <w:rFonts w:ascii="Wingdings" w:hAnsi="Wingdings" w:hint="default"/>
+      </w:rPr>
+    </w:lvl>
+  </w:abstractNum>
+  <w:abstractNum w:abstractNumId="4" w15:restartNumberingAfterBreak="0">
     <w:nsid w:val="164346F4"/>
     <w:multiLevelType w:val="hybridMultilevel"/>
     <w:tmpl w:val="6E0C3D10"/>
@@ -12964,7 +14102,7 @@
       </w:rPr>
     </w:lvl>
   </w:abstractNum>
-  <w:abstractNum w:abstractNumId="3" w15:restartNumberingAfterBreak="0">
+  <w:abstractNum w:abstractNumId="5" w15:restartNumberingAfterBreak="0">
     <w:nsid w:val="1D1F74FC"/>
     <w:multiLevelType w:val="hybridMultilevel"/>
     <w:tmpl w:val="6FC0A9D0"/>
@@ -13077,7 +14215,7 @@
       </w:rPr>
     </w:lvl>
   </w:abstractNum>
-  <w:abstractNum w:abstractNumId="4" w15:restartNumberingAfterBreak="0">
+  <w:abstractNum w:abstractNumId="6" w15:restartNumberingAfterBreak="0">
     <w:nsid w:val="28B0261C"/>
     <w:multiLevelType w:val="hybridMultilevel"/>
     <w:tmpl w:val="77347DC0"/>
@@ -13190,7 +14328,7 @@
       </w:rPr>
     </w:lvl>
   </w:abstractNum>
-  <w:abstractNum w:abstractNumId="5" w15:restartNumberingAfterBreak="0">
+  <w:abstractNum w:abstractNumId="7" w15:restartNumberingAfterBreak="0">
     <w:nsid w:val="2A832CEB"/>
     <w:multiLevelType w:val="hybridMultilevel"/>
     <w:tmpl w:val="D95C5B8A"/>
@@ -13303,7 +14441,7 @@
       </w:rPr>
     </w:lvl>
   </w:abstractNum>
-  <w:abstractNum w:abstractNumId="6" w15:restartNumberingAfterBreak="0">
+  <w:abstractNum w:abstractNumId="8" w15:restartNumberingAfterBreak="0">
     <w:nsid w:val="354F4453"/>
     <w:multiLevelType w:val="hybridMultilevel"/>
     <w:tmpl w:val="E474EDD4"/>
@@ -13416,7 +14554,7 @@
       </w:rPr>
     </w:lvl>
   </w:abstractNum>
-  <w:abstractNum w:abstractNumId="7" w15:restartNumberingAfterBreak="0">
+  <w:abstractNum w:abstractNumId="9" w15:restartNumberingAfterBreak="0">
     <w:nsid w:val="36720225"/>
     <w:multiLevelType w:val="hybridMultilevel"/>
     <w:tmpl w:val="E5CEAEC4"/>
@@ -13529,7 +14667,7 @@
       </w:rPr>
     </w:lvl>
   </w:abstractNum>
-  <w:abstractNum w:abstractNumId="8" w15:restartNumberingAfterBreak="0">
+  <w:abstractNum w:abstractNumId="10" w15:restartNumberingAfterBreak="0">
     <w:nsid w:val="3B2426D6"/>
     <w:multiLevelType w:val="hybridMultilevel"/>
     <w:tmpl w:val="2A94FC48"/>
@@ -13642,7 +14780,120 @@
       </w:rPr>
     </w:lvl>
   </w:abstractNum>
-  <w:abstractNum w:abstractNumId="9" w15:restartNumberingAfterBreak="0">
+  <w:abstractNum w:abstractNumId="11" w15:restartNumberingAfterBreak="0">
+    <w:nsid w:val="4298740D"/>
+    <w:multiLevelType w:val="hybridMultilevel"/>
+    <w:tmpl w:val="DA5464BE"/>
+    <w:lvl w:ilvl="0" w:tplc="240A0001">
+      <w:start w:val="1"/>
+      <w:numFmt w:val="bullet"/>
+      <w:lvlText w:val=""/>
+      <w:lvlJc w:val="left"/>
+      <w:pPr>
+        <w:ind w:left="720" w:hanging="360"/>
+      </w:pPr>
+      <w:rPr>
+        <w:rFonts w:ascii="Symbol" w:hAnsi="Symbol" w:hint="default"/>
+      </w:rPr>
+    </w:lvl>
+    <w:lvl w:ilvl="1" w:tplc="240A0003" w:tentative="1">
+      <w:start w:val="1"/>
+      <w:numFmt w:val="bullet"/>
+      <w:lvlText w:val="o"/>
+      <w:lvlJc w:val="left"/>
+      <w:pPr>
+        <w:ind w:left="1440" w:hanging="360"/>
+      </w:pPr>
+      <w:rPr>
+        <w:rFonts w:ascii="Courier New" w:hAnsi="Courier New" w:cs="Courier New" w:hint="default"/>
+      </w:rPr>
+    </w:lvl>
+    <w:lvl w:ilvl="2" w:tplc="240A0005" w:tentative="1">
+      <w:start w:val="1"/>
+      <w:numFmt w:val="bullet"/>
+      <w:lvlText w:val=""/>
+      <w:lvlJc w:val="left"/>
+      <w:pPr>
+        <w:ind w:left="2160" w:hanging="360"/>
+      </w:pPr>
+      <w:rPr>
+        <w:rFonts w:ascii="Wingdings" w:hAnsi="Wingdings" w:hint="default"/>
+      </w:rPr>
+    </w:lvl>
+    <w:lvl w:ilvl="3" w:tplc="240A0001" w:tentative="1">
+      <w:start w:val="1"/>
+      <w:numFmt w:val="bullet"/>
+      <w:lvlText w:val=""/>
+      <w:lvlJc w:val="left"/>
+      <w:pPr>
+        <w:ind w:left="2880" w:hanging="360"/>
+      </w:pPr>
+      <w:rPr>
+        <w:rFonts w:ascii="Symbol" w:hAnsi="Symbol" w:hint="default"/>
+      </w:rPr>
+    </w:lvl>
+    <w:lvl w:ilvl="4" w:tplc="240A0003" w:tentative="1">
+      <w:start w:val="1"/>
+      <w:numFmt w:val="bullet"/>
+      <w:lvlText w:val="o"/>
+      <w:lvlJc w:val="left"/>
+      <w:pPr>
+        <w:ind w:left="3600" w:hanging="360"/>
+      </w:pPr>
+      <w:rPr>
+        <w:rFonts w:ascii="Courier New" w:hAnsi="Courier New" w:cs="Courier New" w:hint="default"/>
+      </w:rPr>
+    </w:lvl>
+    <w:lvl w:ilvl="5" w:tplc="240A0005" w:tentative="1">
+      <w:start w:val="1"/>
+      <w:numFmt w:val="bullet"/>
+      <w:lvlText w:val=""/>
+      <w:lvlJc w:val="left"/>
+      <w:pPr>
+        <w:ind w:left="4320" w:hanging="360"/>
+      </w:pPr>
+      <w:rPr>
+        <w:rFonts w:ascii="Wingdings" w:hAnsi="Wingdings" w:hint="default"/>
+      </w:rPr>
+    </w:lvl>
+    <w:lvl w:ilvl="6" w:tplc="240A0001" w:tentative="1">
+      <w:start w:val="1"/>
+      <w:numFmt w:val="bullet"/>
+      <w:lvlText w:val=""/>
+      <w:lvlJc w:val="left"/>
+      <w:pPr>
+        <w:ind w:left="5040" w:hanging="360"/>
+      </w:pPr>
+      <w:rPr>
+        <w:rFonts w:ascii="Symbol" w:hAnsi="Symbol" w:hint="default"/>
+      </w:rPr>
+    </w:lvl>
+    <w:lvl w:ilvl="7" w:tplc="240A0003" w:tentative="1">
+      <w:start w:val="1"/>
+      <w:numFmt w:val="bullet"/>
+      <w:lvlText w:val="o"/>
+      <w:lvlJc w:val="left"/>
+      <w:pPr>
+        <w:ind w:left="5760" w:hanging="360"/>
+      </w:pPr>
+      <w:rPr>
+        <w:rFonts w:ascii="Courier New" w:hAnsi="Courier New" w:cs="Courier New" w:hint="default"/>
+      </w:rPr>
+    </w:lvl>
+    <w:lvl w:ilvl="8" w:tplc="240A0005" w:tentative="1">
+      <w:start w:val="1"/>
+      <w:numFmt w:val="bullet"/>
+      <w:lvlText w:val=""/>
+      <w:lvlJc w:val="left"/>
+      <w:pPr>
+        <w:ind w:left="6480" w:hanging="360"/>
+      </w:pPr>
+      <w:rPr>
+        <w:rFonts w:ascii="Wingdings" w:hAnsi="Wingdings" w:hint="default"/>
+      </w:rPr>
+    </w:lvl>
+  </w:abstractNum>
+  <w:abstractNum w:abstractNumId="12" w15:restartNumberingAfterBreak="0">
     <w:nsid w:val="457D7F16"/>
     <w:multiLevelType w:val="hybridMultilevel"/>
     <w:tmpl w:val="9A7AC840"/>
@@ -13755,7 +15006,7 @@
       </w:rPr>
     </w:lvl>
   </w:abstractNum>
-  <w:abstractNum w:abstractNumId="10" w15:restartNumberingAfterBreak="0">
+  <w:abstractNum w:abstractNumId="13" w15:restartNumberingAfterBreak="0">
     <w:nsid w:val="4AD5040C"/>
     <w:multiLevelType w:val="hybridMultilevel"/>
     <w:tmpl w:val="C6FC44A6"/>
@@ -13868,7 +15119,120 @@
       </w:rPr>
     </w:lvl>
   </w:abstractNum>
-  <w:abstractNum w:abstractNumId="11" w15:restartNumberingAfterBreak="0">
+  <w:abstractNum w:abstractNumId="14" w15:restartNumberingAfterBreak="0">
+    <w:nsid w:val="4B30465F"/>
+    <w:multiLevelType w:val="hybridMultilevel"/>
+    <w:tmpl w:val="D23CF962"/>
+    <w:lvl w:ilvl="0" w:tplc="240A0001">
+      <w:start w:val="1"/>
+      <w:numFmt w:val="bullet"/>
+      <w:lvlText w:val=""/>
+      <w:lvlJc w:val="left"/>
+      <w:pPr>
+        <w:ind w:left="720" w:hanging="360"/>
+      </w:pPr>
+      <w:rPr>
+        <w:rFonts w:ascii="Symbol" w:hAnsi="Symbol" w:hint="default"/>
+      </w:rPr>
+    </w:lvl>
+    <w:lvl w:ilvl="1" w:tplc="240A0003" w:tentative="1">
+      <w:start w:val="1"/>
+      <w:numFmt w:val="bullet"/>
+      <w:lvlText w:val="o"/>
+      <w:lvlJc w:val="left"/>
+      <w:pPr>
+        <w:ind w:left="1440" w:hanging="360"/>
+      </w:pPr>
+      <w:rPr>
+        <w:rFonts w:ascii="Courier New" w:hAnsi="Courier New" w:cs="Courier New" w:hint="default"/>
+      </w:rPr>
+    </w:lvl>
+    <w:lvl w:ilvl="2" w:tplc="240A0005" w:tentative="1">
+      <w:start w:val="1"/>
+      <w:numFmt w:val="bullet"/>
+      <w:lvlText w:val=""/>
+      <w:lvlJc w:val="left"/>
+      <w:pPr>
+        <w:ind w:left="2160" w:hanging="360"/>
+      </w:pPr>
+      <w:rPr>
+        <w:rFonts w:ascii="Wingdings" w:hAnsi="Wingdings" w:hint="default"/>
+      </w:rPr>
+    </w:lvl>
+    <w:lvl w:ilvl="3" w:tplc="240A0001" w:tentative="1">
+      <w:start w:val="1"/>
+      <w:numFmt w:val="bullet"/>
+      <w:lvlText w:val=""/>
+      <w:lvlJc w:val="left"/>
+      <w:pPr>
+        <w:ind w:left="2880" w:hanging="360"/>
+      </w:pPr>
+      <w:rPr>
+        <w:rFonts w:ascii="Symbol" w:hAnsi="Symbol" w:hint="default"/>
+      </w:rPr>
+    </w:lvl>
+    <w:lvl w:ilvl="4" w:tplc="240A0003" w:tentative="1">
+      <w:start w:val="1"/>
+      <w:numFmt w:val="bullet"/>
+      <w:lvlText w:val="o"/>
+      <w:lvlJc w:val="left"/>
+      <w:pPr>
+        <w:ind w:left="3600" w:hanging="360"/>
+      </w:pPr>
+      <w:rPr>
+        <w:rFonts w:ascii="Courier New" w:hAnsi="Courier New" w:cs="Courier New" w:hint="default"/>
+      </w:rPr>
+    </w:lvl>
+    <w:lvl w:ilvl="5" w:tplc="240A0005" w:tentative="1">
+      <w:start w:val="1"/>
+      <w:numFmt w:val="bullet"/>
+      <w:lvlText w:val=""/>
+      <w:lvlJc w:val="left"/>
+      <w:pPr>
+        <w:ind w:left="4320" w:hanging="360"/>
+      </w:pPr>
+      <w:rPr>
+        <w:rFonts w:ascii="Wingdings" w:hAnsi="Wingdings" w:hint="default"/>
+      </w:rPr>
+    </w:lvl>
+    <w:lvl w:ilvl="6" w:tplc="240A0001" w:tentative="1">
+      <w:start w:val="1"/>
+      <w:numFmt w:val="bullet"/>
+      <w:lvlText w:val=""/>
+      <w:lvlJc w:val="left"/>
+      <w:pPr>
+        <w:ind w:left="5040" w:hanging="360"/>
+      </w:pPr>
+      <w:rPr>
+        <w:rFonts w:ascii="Symbol" w:hAnsi="Symbol" w:hint="default"/>
+      </w:rPr>
+    </w:lvl>
+    <w:lvl w:ilvl="7" w:tplc="240A0003" w:tentative="1">
+      <w:start w:val="1"/>
+      <w:numFmt w:val="bullet"/>
+      <w:lvlText w:val="o"/>
+      <w:lvlJc w:val="left"/>
+      <w:pPr>
+        <w:ind w:left="5760" w:hanging="360"/>
+      </w:pPr>
+      <w:rPr>
+        <w:rFonts w:ascii="Courier New" w:hAnsi="Courier New" w:cs="Courier New" w:hint="default"/>
+      </w:rPr>
+    </w:lvl>
+    <w:lvl w:ilvl="8" w:tplc="240A0005" w:tentative="1">
+      <w:start w:val="1"/>
+      <w:numFmt w:val="bullet"/>
+      <w:lvlText w:val=""/>
+      <w:lvlJc w:val="left"/>
+      <w:pPr>
+        <w:ind w:left="6480" w:hanging="360"/>
+      </w:pPr>
+      <w:rPr>
+        <w:rFonts w:ascii="Wingdings" w:hAnsi="Wingdings" w:hint="default"/>
+      </w:rPr>
+    </w:lvl>
+  </w:abstractNum>
+  <w:abstractNum w:abstractNumId="15" w15:restartNumberingAfterBreak="0">
     <w:nsid w:val="513B7EA1"/>
     <w:multiLevelType w:val="hybridMultilevel"/>
     <w:tmpl w:val="6B5C4A68"/>
@@ -13981,7 +15345,7 @@
       </w:rPr>
     </w:lvl>
   </w:abstractNum>
-  <w:abstractNum w:abstractNumId="12" w15:restartNumberingAfterBreak="0">
+  <w:abstractNum w:abstractNumId="16" w15:restartNumberingAfterBreak="0">
     <w:nsid w:val="58B14600"/>
     <w:multiLevelType w:val="hybridMultilevel"/>
     <w:tmpl w:val="433A6502"/>
@@ -14094,7 +15458,7 @@
       </w:rPr>
     </w:lvl>
   </w:abstractNum>
-  <w:abstractNum w:abstractNumId="13" w15:restartNumberingAfterBreak="0">
+  <w:abstractNum w:abstractNumId="17" w15:restartNumberingAfterBreak="0">
     <w:nsid w:val="5F436901"/>
     <w:multiLevelType w:val="hybridMultilevel"/>
     <w:tmpl w:val="4DE48B7C"/>
@@ -14207,7 +15571,7 @@
       </w:rPr>
     </w:lvl>
   </w:abstractNum>
-  <w:abstractNum w:abstractNumId="14" w15:restartNumberingAfterBreak="0">
+  <w:abstractNum w:abstractNumId="18" w15:restartNumberingAfterBreak="0">
     <w:nsid w:val="6B48065D"/>
     <w:multiLevelType w:val="hybridMultilevel"/>
     <w:tmpl w:val="9566E192"/>
@@ -14320,7 +15684,7 @@
       </w:rPr>
     </w:lvl>
   </w:abstractNum>
-  <w:abstractNum w:abstractNumId="15" w15:restartNumberingAfterBreak="0">
+  <w:abstractNum w:abstractNumId="19" w15:restartNumberingAfterBreak="0">
     <w:nsid w:val="6F0D1C0D"/>
     <w:multiLevelType w:val="hybridMultilevel"/>
     <w:tmpl w:val="AA8C2E28"/>
@@ -14433,7 +15797,7 @@
       </w:rPr>
     </w:lvl>
   </w:abstractNum>
-  <w:abstractNum w:abstractNumId="16" w15:restartNumberingAfterBreak="0">
+  <w:abstractNum w:abstractNumId="20" w15:restartNumberingAfterBreak="0">
     <w:nsid w:val="6F1C43A0"/>
     <w:multiLevelType w:val="hybridMultilevel"/>
     <w:tmpl w:val="239205CC"/>
@@ -14546,7 +15910,7 @@
       </w:rPr>
     </w:lvl>
   </w:abstractNum>
-  <w:abstractNum w:abstractNumId="17" w15:restartNumberingAfterBreak="0">
+  <w:abstractNum w:abstractNumId="21" w15:restartNumberingAfterBreak="0">
     <w:nsid w:val="719B15A0"/>
     <w:multiLevelType w:val="hybridMultilevel"/>
     <w:tmpl w:val="8B6A06FC"/>
@@ -14659,7 +16023,7 @@
       </w:rPr>
     </w:lvl>
   </w:abstractNum>
-  <w:abstractNum w:abstractNumId="18" w15:restartNumberingAfterBreak="0">
+  <w:abstractNum w:abstractNumId="22" w15:restartNumberingAfterBreak="0">
     <w:nsid w:val="72836320"/>
     <w:multiLevelType w:val="hybridMultilevel"/>
     <w:tmpl w:val="F918B9CE"/>
@@ -14772,7 +16136,7 @@
       </w:rPr>
     </w:lvl>
   </w:abstractNum>
-  <w:abstractNum w:abstractNumId="19" w15:restartNumberingAfterBreak="0">
+  <w:abstractNum w:abstractNumId="23" w15:restartNumberingAfterBreak="0">
     <w:nsid w:val="7760001C"/>
     <w:multiLevelType w:val="hybridMultilevel"/>
     <w:tmpl w:val="DA00D140"/>
@@ -14885,7 +16249,7 @@
       </w:rPr>
     </w:lvl>
   </w:abstractNum>
-  <w:abstractNum w:abstractNumId="20" w15:restartNumberingAfterBreak="0">
+  <w:abstractNum w:abstractNumId="24" w15:restartNumberingAfterBreak="0">
     <w:nsid w:val="79EA563B"/>
     <w:multiLevelType w:val="hybridMultilevel"/>
     <w:tmpl w:val="CA0EF45A"/>
@@ -14998,7 +16362,7 @@
       </w:rPr>
     </w:lvl>
   </w:abstractNum>
-  <w:abstractNum w:abstractNumId="21" w15:restartNumberingAfterBreak="0">
+  <w:abstractNum w:abstractNumId="25" w15:restartNumberingAfterBreak="0">
     <w:nsid w:val="7A944C52"/>
     <w:multiLevelType w:val="hybridMultilevel"/>
     <w:tmpl w:val="4DF8A4A6"/>
@@ -15111,7 +16475,7 @@
       </w:rPr>
     </w:lvl>
   </w:abstractNum>
-  <w:abstractNum w:abstractNumId="22" w15:restartNumberingAfterBreak="0">
+  <w:abstractNum w:abstractNumId="26" w15:restartNumberingAfterBreak="0">
     <w:nsid w:val="7BCE6F6B"/>
     <w:multiLevelType w:val="hybridMultilevel"/>
     <w:tmpl w:val="570004FA"/>
@@ -15197,7 +16561,7 @@
       </w:pPr>
     </w:lvl>
   </w:abstractNum>
-  <w:abstractNum w:abstractNumId="23" w15:restartNumberingAfterBreak="0">
+  <w:abstractNum w:abstractNumId="27" w15:restartNumberingAfterBreak="0">
     <w:nsid w:val="7E3A58EC"/>
     <w:multiLevelType w:val="hybridMultilevel"/>
     <w:tmpl w:val="22AEB536"/>
@@ -15284,76 +16648,88 @@
     </w:lvl>
   </w:abstractNum>
   <w:num w:numId="1" w16cid:durableId="1235050477">
+    <w:abstractNumId w:val="16"/>
+  </w:num>
+  <w:num w:numId="2" w16cid:durableId="2067873167">
+    <w:abstractNumId w:val="15"/>
+  </w:num>
+  <w:num w:numId="3" w16cid:durableId="115414037">
+    <w:abstractNumId w:val="20"/>
+  </w:num>
+  <w:num w:numId="4" w16cid:durableId="349600162">
+    <w:abstractNumId w:val="23"/>
+  </w:num>
+  <w:num w:numId="5" w16cid:durableId="1248734338">
+    <w:abstractNumId w:val="21"/>
+  </w:num>
+  <w:num w:numId="6" w16cid:durableId="2015641317">
+    <w:abstractNumId w:val="4"/>
+  </w:num>
+  <w:num w:numId="7" w16cid:durableId="231624906">
+    <w:abstractNumId w:val="17"/>
+  </w:num>
+  <w:num w:numId="8" w16cid:durableId="263420750">
+    <w:abstractNumId w:val="9"/>
+  </w:num>
+  <w:num w:numId="9" w16cid:durableId="2124612063">
+    <w:abstractNumId w:val="25"/>
+  </w:num>
+  <w:num w:numId="10" w16cid:durableId="159079337">
+    <w:abstractNumId w:val="18"/>
+  </w:num>
+  <w:num w:numId="11" w16cid:durableId="790443612">
+    <w:abstractNumId w:val="26"/>
+  </w:num>
+  <w:num w:numId="12" w16cid:durableId="942110906">
+    <w:abstractNumId w:val="5"/>
+  </w:num>
+  <w:num w:numId="13" w16cid:durableId="2012368028">
+    <w:abstractNumId w:val="8"/>
+  </w:num>
+  <w:num w:numId="14" w16cid:durableId="1862934538">
     <w:abstractNumId w:val="12"/>
   </w:num>
-  <w:num w:numId="2" w16cid:durableId="2067873167">
+  <w:num w:numId="15" w16cid:durableId="1813401887">
+    <w:abstractNumId w:val="27"/>
+  </w:num>
+  <w:num w:numId="16" w16cid:durableId="1095636371">
+    <w:abstractNumId w:val="13"/>
+  </w:num>
+  <w:num w:numId="17" w16cid:durableId="319358279">
+    <w:abstractNumId w:val="2"/>
+  </w:num>
+  <w:num w:numId="18" w16cid:durableId="1069112579">
+    <w:abstractNumId w:val="24"/>
+  </w:num>
+  <w:num w:numId="19" w16cid:durableId="1954433259">
+    <w:abstractNumId w:val="6"/>
+  </w:num>
+  <w:num w:numId="20" w16cid:durableId="518356576">
+    <w:abstractNumId w:val="1"/>
+  </w:num>
+  <w:num w:numId="21" w16cid:durableId="210772246">
+    <w:abstractNumId w:val="22"/>
+  </w:num>
+  <w:num w:numId="22" w16cid:durableId="1576282488">
+    <w:abstractNumId w:val="7"/>
+  </w:num>
+  <w:num w:numId="23" w16cid:durableId="666174723">
+    <w:abstractNumId w:val="19"/>
+  </w:num>
+  <w:num w:numId="24" w16cid:durableId="1915116904">
+    <w:abstractNumId w:val="10"/>
+  </w:num>
+  <w:num w:numId="25" w16cid:durableId="1706367474">
+    <w:abstractNumId w:val="0"/>
+  </w:num>
+  <w:num w:numId="26" w16cid:durableId="955864911">
     <w:abstractNumId w:val="11"/>
   </w:num>
-  <w:num w:numId="3" w16cid:durableId="115414037">
-    <w:abstractNumId w:val="16"/>
-  </w:num>
-  <w:num w:numId="4" w16cid:durableId="349600162">
-    <w:abstractNumId w:val="19"/>
-  </w:num>
-  <w:num w:numId="5" w16cid:durableId="1248734338">
-    <w:abstractNumId w:val="17"/>
-  </w:num>
-  <w:num w:numId="6" w16cid:durableId="2015641317">
-    <w:abstractNumId w:val="2"/>
-  </w:num>
-  <w:num w:numId="7" w16cid:durableId="231624906">
-    <w:abstractNumId w:val="13"/>
-  </w:num>
-  <w:num w:numId="8" w16cid:durableId="263420750">
-    <w:abstractNumId w:val="7"/>
-  </w:num>
-  <w:num w:numId="9" w16cid:durableId="2124612063">
-    <w:abstractNumId w:val="21"/>
-  </w:num>
-  <w:num w:numId="10" w16cid:durableId="159079337">
+  <w:num w:numId="27" w16cid:durableId="920335174">
     <w:abstractNumId w:val="14"/>
   </w:num>
-  <w:num w:numId="11" w16cid:durableId="790443612">
-    <w:abstractNumId w:val="22"/>
-  </w:num>
-  <w:num w:numId="12" w16cid:durableId="942110906">
+  <w:num w:numId="28" w16cid:durableId="699822444">
     <w:abstractNumId w:val="3"/>
-  </w:num>
-  <w:num w:numId="13" w16cid:durableId="2012368028">
-    <w:abstractNumId w:val="6"/>
-  </w:num>
-  <w:num w:numId="14" w16cid:durableId="1862934538">
-    <w:abstractNumId w:val="9"/>
-  </w:num>
-  <w:num w:numId="15" w16cid:durableId="1813401887">
-    <w:abstractNumId w:val="23"/>
-  </w:num>
-  <w:num w:numId="16" w16cid:durableId="1095636371">
-    <w:abstractNumId w:val="10"/>
-  </w:num>
-  <w:num w:numId="17" w16cid:durableId="319358279">
-    <w:abstractNumId w:val="1"/>
-  </w:num>
-  <w:num w:numId="18" w16cid:durableId="1069112579">
-    <w:abstractNumId w:val="20"/>
-  </w:num>
-  <w:num w:numId="19" w16cid:durableId="1954433259">
-    <w:abstractNumId w:val="4"/>
-  </w:num>
-  <w:num w:numId="20" w16cid:durableId="518356576">
-    <w:abstractNumId w:val="0"/>
-  </w:num>
-  <w:num w:numId="21" w16cid:durableId="210772246">
-    <w:abstractNumId w:val="18"/>
-  </w:num>
-  <w:num w:numId="22" w16cid:durableId="1576282488">
-    <w:abstractNumId w:val="5"/>
-  </w:num>
-  <w:num w:numId="23" w16cid:durableId="666174723">
-    <w:abstractNumId w:val="15"/>
-  </w:num>
-  <w:num w:numId="24" w16cid:durableId="1915116904">
-    <w:abstractNumId w:val="8"/>
   </w:num>
 </w:numbering>
 </file>

</xml_diff>

<commit_message>
ch6 week 4 draft
</commit_message>
<xml_diff>
--- a/Draft/6 Case Study.docx
+++ b/Draft/6 Case Study.docx
@@ -12983,7 +12983,19 @@
         <w:rPr>
           <w:lang w:val="en-NZ"/>
         </w:rPr>
-        <w:t>To support the lack of TA present for this second semester, the students the strongly encouraged to use the forum tool in the LMS to keep information flowing from the teaching staff and more importantly, from the students themselves. During the following weeks it was possible to see the lecturers and the TA redirecting the students to the forum every time a question was asked, specially those related to technical information about the project. Another interesting activity was to encourage the students to write a question they just asked in the forum. The teaching staff would provide an answer through the forum instead of doing it directly, enforcing the use of the tool.</w:t>
+        <w:t xml:space="preserve">To support the lack of TA present for this second semester, the students the strongly encouraged to use the forum tool in the LMS to keep information flowing from the teaching staff and more importantly, from the students themselves. During the following weeks it was possible to see the lecturers and the TA redirecting the students to the forum every time a question was asked, </w:t>
+      </w:r>
+      <w:r>
+        <w:rPr>
+          <w:lang w:val="en-NZ"/>
+        </w:rPr>
+        <w:t>especially</w:t>
+      </w:r>
+      <w:r>
+        <w:rPr>
+          <w:lang w:val="en-NZ"/>
+        </w:rPr>
+        <w:t xml:space="preserve"> those related to technical information about the project. Another interesting activity was to encourage the students to write a question they just asked in the forum. The teaching staff would provide an answer through the forum instead of doing it directly, enforcing the use of the tool.</w:t>
       </w:r>
     </w:p>
     <w:p>
@@ -13308,6 +13320,50 @@
         <w:rPr>
           <w:lang w:val="en-NZ"/>
         </w:rPr>
+        <w:t xml:space="preserve">The observations that took place with teams D and E had the same objectives in mind: test the clamp arm set up and the adjustments to the social communication tools added to the annotations and debate tools. Other features of WorkshopAR also undertook some adjustments that had been tested more thoroughly during the unstructured testing stages, </w:t>
+      </w:r>
+      <w:r>
+        <w:rPr>
+          <w:lang w:val="en-NZ"/>
+        </w:rPr>
+        <w:lastRenderedPageBreak/>
+        <w:t>and it was considered more interesting for the observations to focus on the changes mentioned initially.</w:t>
+      </w:r>
+    </w:p>
+    <w:p>
+      <w:pPr>
+        <w:rPr>
+          <w:lang w:val="en-NZ"/>
+        </w:rPr>
+      </w:pPr>
+      <w:r>
+        <w:rPr>
+          <w:lang w:val="en-NZ"/>
+        </w:rPr>
+        <w:t>The process followed for Team E was slightly different since they had a quick tour of WorkshopAR, and their general response to those features did not add much to what had already been documented in previous sections.</w:t>
+      </w:r>
+      <w:r>
+        <w:rPr>
+          <w:lang w:val="en-NZ"/>
+        </w:rPr>
+        <w:t xml:space="preserve"> Team D recognized several of the changes done to the original proposal, which also included an updated UI look, so their response was very positive in general and highlighted the fact that several of the aspects that had been discussed previously had been acknowledged. Regrettably, it was not possible to get much data from Team E since they barely explored those initial aspects of the tool and moved almost immediately to the activities with the debate feature. It did not help either that team E was several different groups on the same table, so the setting was not really comparable to the initial observations and there was not much structured work happening between them.</w:t>
+      </w:r>
+    </w:p>
+    <w:p>
+      <w:pPr>
+        <w:pStyle w:val="Ttulo3"/>
+        <w:rPr>
+          <w:sz w:val="22"/>
+          <w:szCs w:val="22"/>
+          <w:lang w:val="en-NZ"/>
+        </w:rPr>
+      </w:pPr>
+      <w:r>
+        <w:rPr>
+          <w:sz w:val="22"/>
+          <w:szCs w:val="22"/>
+          <w:lang w:val="en-NZ"/>
+        </w:rPr>
         <w:t>6.8.2.1 Set up with the clamp arms</w:t>
       </w:r>
     </w:p>
@@ -13321,29 +13377,593 @@
         <w:rPr>
           <w:lang w:val="en-NZ"/>
         </w:rPr>
-        <w:t>6.8.2.2 unstructured workflow and emotes</w:t>
-      </w:r>
-    </w:p>
-    <w:p>
-      <w:pPr>
-        <w:rPr>
-          <w:lang w:val="en-NZ"/>
-        </w:rPr>
-      </w:pPr>
-      <w:r>
-        <w:rPr>
+        <w:t xml:space="preserve">The idea using the clam arms was mostly aimed at exploring different ideas on how the phone could be used in the classroom in a way that could be used as an enhancement and not a distraction (interesting studies analysing this same problem in other contexts and through different perspectives can be found in </w:t>
+      </w:r>
+      <w:r>
+        <w:rPr>
+          <w:lang w:val="en-NZ"/>
+        </w:rPr>
+        <w:t>Forsling</w:t>
+      </w:r>
+      <w:r>
+        <w:rPr>
+          <w:lang w:val="en-NZ"/>
+        </w:rPr>
+        <w:t xml:space="preserve"> (</w:t>
+      </w:r>
+      <w:r>
+        <w:rPr>
+          <w:lang w:val="en-NZ"/>
+        </w:rPr>
+        <w:t>2023)</w:t>
+      </w:r>
+      <w:r>
+        <w:rPr>
+          <w:lang w:val="en-NZ"/>
+        </w:rPr>
+        <w:t xml:space="preserve">, </w:t>
+      </w:r>
+      <w:r>
+        <w:rPr>
+          <w:lang w:val="en-NZ"/>
+        </w:rPr>
+        <w:t>Flanigan et al.</w:t>
+      </w:r>
+      <w:r>
+        <w:rPr>
+          <w:lang w:val="en-NZ"/>
+        </w:rPr>
+        <w:t xml:space="preserve"> (</w:t>
+      </w:r>
+      <w:r>
+        <w:rPr>
+          <w:lang w:val="en-NZ"/>
+        </w:rPr>
+        <w:t>2023)</w:t>
+      </w:r>
+      <w:r>
+        <w:rPr>
+          <w:lang w:val="en-NZ"/>
+        </w:rPr>
+        <w:t xml:space="preserve">, </w:t>
+      </w:r>
+      <w:r>
+        <w:rPr>
+          <w:lang w:val="en-NZ"/>
+        </w:rPr>
+        <w:t>Fälth &amp; Selenius</w:t>
+      </w:r>
+      <w:r>
+        <w:rPr>
+          <w:lang w:val="en-NZ"/>
+        </w:rPr>
+        <w:t xml:space="preserve"> (</w:t>
+      </w:r>
+      <w:r>
+        <w:rPr>
+          <w:lang w:val="en-NZ"/>
+        </w:rPr>
+        <w:t>2024)</w:t>
+      </w:r>
+      <w:r>
+        <w:rPr>
+          <w:lang w:val="en-NZ"/>
+        </w:rPr>
+        <w:t xml:space="preserve"> and </w:t>
+      </w:r>
+      <w:r>
+        <w:rPr>
+          <w:lang w:val="en-NZ"/>
+        </w:rPr>
+        <w:t>Consoli et al.</w:t>
+      </w:r>
+      <w:r>
+        <w:rPr>
+          <w:lang w:val="en-NZ"/>
+        </w:rPr>
+        <w:t xml:space="preserve"> (</w:t>
+      </w:r>
+      <w:r>
+        <w:rPr>
+          <w:lang w:val="en-NZ"/>
+        </w:rPr>
+        <w:t>2025)</w:t>
+      </w:r>
+      <w:r>
+        <w:rPr>
+          <w:lang w:val="en-NZ"/>
+        </w:rPr>
+        <w:t>)</w:t>
+      </w:r>
+      <w:r>
+        <w:rPr>
+          <w:lang w:val="en-NZ"/>
+        </w:rPr>
+        <w:t>. The idea was also strongly linked to the way students had been observed to work for the Industry Project group, letting them set up in a table with their equipment where they could work during the classroom session, had access to the teaching staff and to all the other activities in the classroom.</w:t>
+      </w:r>
+    </w:p>
+    <w:p>
+      <w:pPr>
+        <w:rPr>
+          <w:lang w:val="en-NZ"/>
+        </w:rPr>
+      </w:pPr>
+      <w:r>
+        <w:rPr>
+          <w:lang w:val="en-NZ"/>
+        </w:rPr>
+        <w:t xml:space="preserve">Section </w:t>
+      </w:r>
+      <w:r>
+        <w:rPr>
+          <w:lang w:val="en-NZ"/>
+        </w:rPr>
+        <w:t>5.2.4.1</w:t>
+      </w:r>
+      <w:r>
+        <w:rPr>
+          <w:lang w:val="en-NZ"/>
+        </w:rPr>
+        <w:t xml:space="preserve"> gives more details of the implementation of the idea and the interaction design done around it. During the observations, several problems were found with the setup, mostly at the usability level:</w:t>
+      </w:r>
+    </w:p>
+    <w:p>
+      <w:pPr>
+        <w:pStyle w:val="Prrafodelista"/>
+        <w:numPr>
+          <w:ilvl w:val="0"/>
+          <w:numId w:val="29"/>
+        </w:numPr>
+        <w:rPr>
+          <w:lang w:val="en-NZ"/>
+        </w:rPr>
+      </w:pPr>
+      <w:r>
+        <w:rPr>
+          <w:lang w:val="en-NZ"/>
+        </w:rPr>
+        <w:t>It was a very setup-intensive process, and it required access to a lot of resources like the clamp arms, a table and enough time in the work session for the whole ordeal to be worth of the time expended.</w:t>
+      </w:r>
+    </w:p>
+    <w:p>
+      <w:pPr>
+        <w:pStyle w:val="Prrafodelista"/>
+        <w:numPr>
+          <w:ilvl w:val="0"/>
+          <w:numId w:val="29"/>
+        </w:numPr>
+        <w:rPr>
+          <w:lang w:val="en-NZ"/>
+        </w:rPr>
+      </w:pPr>
+      <w:r>
+        <w:rPr>
+          <w:lang w:val="en-NZ"/>
+        </w:rPr>
+        <w:t>It eliminated the flexibility of creating a room in any space the group found available, running in contradiction with one of the core design principles of the tool.</w:t>
+      </w:r>
+    </w:p>
+    <w:p>
+      <w:pPr>
+        <w:pStyle w:val="Prrafodelista"/>
+        <w:numPr>
+          <w:ilvl w:val="0"/>
+          <w:numId w:val="29"/>
+        </w:numPr>
+        <w:rPr>
+          <w:lang w:val="en-NZ"/>
+        </w:rPr>
+      </w:pPr>
+      <w:r>
+        <w:rPr>
+          <w:lang w:val="en-NZ"/>
+        </w:rPr>
+        <w:t>It gave too much emphasis to the phone, which was also in contradiction with the initial premise of the solution.</w:t>
+      </w:r>
+    </w:p>
+    <w:p>
+      <w:pPr>
+        <w:rPr>
+          <w:lang w:val="en-NZ"/>
+        </w:rPr>
+      </w:pPr>
+      <w:r>
+        <w:rPr>
+          <w:lang w:val="en-NZ"/>
+        </w:rPr>
+        <w:t>Team E offered the most positive remarks to the idea, comparing the setup to a streaming rig used to create content in a professional way</w:t>
+      </w:r>
+      <w:r>
+        <w:rPr>
+          <w:lang w:val="en-NZ"/>
+        </w:rPr>
+        <w:t>. That comment prompted a conversation about having access to a space that already provided the set up and can be used to work in a hot desk fashion, like how some creative labs work in faculties like design or art. The setup could be adapted to be a laboratory for digital collaborative work with all the resources ready for the students. It was an interesting comparison that came from conversation with the students, and although it would run in contradiction with the premise of a flexible room for the group and the BYOD philosophy, it could be the basis for a future exploration of the idea.</w:t>
+      </w:r>
+    </w:p>
+    <w:p>
+      <w:pPr>
+        <w:rPr>
+          <w:lang w:val="en-NZ"/>
+        </w:rPr>
+      </w:pPr>
+      <w:r>
+        <w:rPr>
+          <w:lang w:val="en-NZ"/>
+        </w:rPr>
+        <w:t xml:space="preserve">Team D was more critical of the clam arms setup. In was possible to run with them the whole configuration process and test most of the functionalities of WorkshopAR while using the setup. The most telling observation was that they quickly removed the phone from the </w:t>
+      </w:r>
+      <w:r>
+        <w:rPr>
+          <w:lang w:val="en-NZ"/>
+        </w:rPr>
+        <w:lastRenderedPageBreak/>
+        <w:t>clamps to make the process easier, giving a strong impression that the idea was not a very practical solution.</w:t>
+      </w:r>
+    </w:p>
+    <w:p>
+      <w:pPr>
+        <w:rPr>
+          <w:lang w:val="en-NZ"/>
+        </w:rPr>
+      </w:pPr>
+      <w:r>
+        <w:rPr>
+          <w:lang w:val="en-NZ"/>
+        </w:rPr>
+        <w:t>The clamp arms setup tried to give the interactions of the students with the phone a better position inside the activity more in line with the working mindset the group wanted to follow. Some students saw the potential in the setup to create that working space, but some other still felt that they were playing with their phones. Some other, in contrast, felt annoyed that they were losing access to their phone and using it only for work, and not for other activities.</w:t>
+      </w:r>
+    </w:p>
+    <w:p>
+      <w:pPr>
+        <w:rPr>
+          <w:lang w:val="en-NZ"/>
+        </w:rPr>
+      </w:pPr>
+      <w:r>
+        <w:rPr>
+          <w:lang w:val="en-NZ"/>
+        </w:rPr>
+        <w:t xml:space="preserve">This is a situation in which it is difficult to find a solution that accommodates every perspective, and </w:t>
+      </w:r>
+      <w:r>
+        <w:rPr>
+          <w:lang w:val="en-NZ"/>
+        </w:rPr>
+        <w:t>with any proposal at</w:t>
+      </w:r>
+      <w:r>
+        <w:rPr>
+          <w:lang w:val="en-NZ"/>
+        </w:rPr>
+        <w:t xml:space="preserve"> the end</w:t>
+      </w:r>
+      <w:r>
+        <w:rPr>
+          <w:lang w:val="en-NZ"/>
+        </w:rPr>
+        <w:t xml:space="preserve"> someone will feel alienated. A stationary setup using non-smartphone mobile platform like tablets could create an interesting solution like the setups used for application using AR as an assistance tool like </w:t>
+      </w:r>
+      <w:r>
+        <w:rPr>
+          <w:lang w:val="en-NZ"/>
+        </w:rPr>
+        <w:t>Barbieri et al.</w:t>
+      </w:r>
+      <w:r>
+        <w:rPr>
+          <w:lang w:val="en-NZ"/>
+        </w:rPr>
+        <w:t xml:space="preserve"> (</w:t>
+      </w:r>
+      <w:r>
+        <w:rPr>
+          <w:lang w:val="en-NZ"/>
+        </w:rPr>
+        <w:t>2025)</w:t>
+      </w:r>
+      <w:r>
+        <w:rPr>
+          <w:lang w:val="en-NZ"/>
+        </w:rPr>
+        <w:t xml:space="preserve"> or </w:t>
+      </w:r>
+      <w:r>
+        <w:rPr>
+          <w:lang w:val="en-NZ"/>
+        </w:rPr>
+        <w:t>Ma et al.</w:t>
+      </w:r>
+      <w:r>
+        <w:rPr>
+          <w:lang w:val="en-NZ"/>
+        </w:rPr>
+        <w:t xml:space="preserve"> (</w:t>
+      </w:r>
+      <w:r>
+        <w:rPr>
+          <w:lang w:val="en-NZ"/>
+        </w:rPr>
+        <w:t>2026)</w:t>
+      </w:r>
+      <w:r>
+        <w:rPr>
+          <w:lang w:val="en-NZ"/>
+        </w:rPr>
+        <w:t xml:space="preserve"> could be explored in the future.</w:t>
+      </w:r>
+    </w:p>
+    <w:p>
+      <w:pPr>
+        <w:pStyle w:val="Ttulo3"/>
+        <w:rPr>
+          <w:sz w:val="22"/>
+          <w:szCs w:val="22"/>
+          <w:lang w:val="en-NZ"/>
+        </w:rPr>
+      </w:pPr>
+      <w:r>
+        <w:rPr>
+          <w:sz w:val="22"/>
+          <w:szCs w:val="22"/>
+          <w:lang w:val="en-NZ"/>
+        </w:rPr>
+        <w:t xml:space="preserve">6.8.2.2 </w:t>
+      </w:r>
+      <w:r>
+        <w:rPr>
+          <w:sz w:val="22"/>
+          <w:szCs w:val="22"/>
+          <w:lang w:val="en-NZ"/>
+        </w:rPr>
+        <w:t>Communication Features and Emotes</w:t>
+      </w:r>
+    </w:p>
+    <w:p>
+      <w:pPr>
+        <w:rPr>
+          <w:lang w:val="en-NZ"/>
+        </w:rPr>
+      </w:pPr>
+      <w:r>
+        <w:rPr>
+          <w:lang w:val="en-NZ"/>
+        </w:rPr>
+        <w:t>Based on the comments and reactions of the students and the participants in the unstructured tests, it was identified that the visual used to quickly convey information in the debate feature could also be used by the students in other context, allowing the more freedom and flexibility to the communication features provided by WorkshopAR.</w:t>
+      </w:r>
+    </w:p>
+    <w:p>
+      <w:pPr>
+        <w:rPr>
+          <w:lang w:val="en-NZ"/>
+        </w:rPr>
+      </w:pPr>
+      <w:r>
+        <w:rPr>
+          <w:lang w:val="en-NZ"/>
+        </w:rPr>
+        <w:t>It</w:t>
+      </w:r>
+      <w:r>
+        <w:rPr>
+          <w:lang w:val="en-NZ"/>
+        </w:rPr>
+        <w:t xml:space="preserve"> was possible to implement the same type of visual to the annotation features, and the </w:t>
+      </w:r>
+      <w:r>
+        <w:rPr>
+          <w:lang w:val="en-NZ"/>
+        </w:rPr>
+        <w:t>unstructured</w:t>
+      </w:r>
+      <w:r>
+        <w:rPr>
+          <w:lang w:val="en-NZ"/>
+        </w:rPr>
+        <w:t xml:space="preserve"> configuration of the debates also allowed for a free flow of conversation in which the students could access the visuals meant initially for the responses. Originally, the visuals were meant to </w:t>
+      </w:r>
+      <w:r>
+        <w:rPr>
+          <w:lang w:val="en-NZ"/>
+        </w:rPr>
+        <w:t>quickly</w:t>
+      </w:r>
+      <w:r>
+        <w:rPr>
+          <w:lang w:val="en-NZ"/>
+        </w:rPr>
+        <w:t xml:space="preserve"> convey information like yes, no or an option in a multi</w:t>
+      </w:r>
+      <w:r>
+        <w:rPr>
+          <w:lang w:val="en-NZ"/>
+        </w:rPr>
+        <w:t>-o</w:t>
+      </w:r>
+      <w:r>
+        <w:rPr>
+          <w:lang w:val="en-NZ"/>
+        </w:rPr>
+        <w:t xml:space="preserve">ption question, but students commented that the responses reminded them of the </w:t>
+      </w:r>
+      <w:r>
+        <w:rPr>
+          <w:lang w:val="en-NZ"/>
+        </w:rPr>
+        <w:t>emojis</w:t>
+      </w:r>
+      <w:r>
+        <w:rPr>
+          <w:lang w:val="en-NZ"/>
+        </w:rPr>
+        <w:t xml:space="preserve"> use in text messages, prompting the idea of </w:t>
+      </w:r>
+      <w:r>
+        <w:rPr>
+          <w:lang w:val="en-NZ"/>
+        </w:rPr>
+        <w:t>using</w:t>
+      </w:r>
+      <w:r>
+        <w:rPr>
+          <w:lang w:val="en-NZ"/>
+        </w:rPr>
+        <w:t xml:space="preserve"> “floating” emojis that could add some context or connotation to a conversation, and be quickly </w:t>
+      </w:r>
+      <w:r>
+        <w:rPr>
+          <w:lang w:val="en-NZ"/>
+        </w:rPr>
+        <w:t>added to the conversation</w:t>
+      </w:r>
+      <w:r>
+        <w:rPr>
+          <w:lang w:val="en-NZ"/>
+        </w:rPr>
+        <w:t xml:space="preserve"> </w:t>
+      </w:r>
+      <w:r>
+        <w:rPr>
+          <w:lang w:val="en-NZ"/>
+        </w:rPr>
+        <w:t xml:space="preserve">and checked by others </w:t>
+      </w:r>
+      <w:r>
+        <w:rPr>
+          <w:lang w:val="en-NZ"/>
+        </w:rPr>
+        <w:t>through the app.</w:t>
+      </w:r>
+    </w:p>
+    <w:p>
+      <w:pPr>
+        <w:rPr>
+          <w:lang w:val="en-NZ"/>
+        </w:rPr>
+      </w:pPr>
+      <w:r>
+        <w:rPr>
+          <w:lang w:val="en-NZ"/>
+        </w:rPr>
+        <w:t xml:space="preserve">The idea was tested in two different scenarios. The first one offered a more structured activity using highly structured question in the debate tool and waiting for the participants to provide answers </w:t>
+      </w:r>
+      <w:r>
+        <w:rPr>
+          <w:lang w:val="en-NZ"/>
+        </w:rPr>
+        <w:t>through</w:t>
+      </w:r>
+      <w:r>
+        <w:rPr>
+          <w:lang w:val="en-NZ"/>
+        </w:rPr>
+        <w:t xml:space="preserve"> the tool. The initial idea was to provide an opportunity for a real discussion to take place among the students, but neither Team D </w:t>
+      </w:r>
+      <w:r>
+        <w:rPr>
+          <w:lang w:val="en-NZ"/>
+        </w:rPr>
+        <w:t>nor</w:t>
+      </w:r>
+      <w:r>
+        <w:rPr>
+          <w:lang w:val="en-NZ"/>
+        </w:rPr>
+        <w:t xml:space="preserve"> E engaged significantly in that way</w:t>
+      </w:r>
+      <w:r>
+        <w:rPr>
+          <w:lang w:val="en-NZ"/>
+        </w:rPr>
+        <w:t xml:space="preserve">, interacting briefly only through mock-up question about the progress of the project or technical aspects of the design without much substance in them. Observer behaviours in both teams were similar: some student preferred more textual answers while other chose the more visual version, with no strong observable tendency for one option or the other. The graphical cues offered by the app like colours and symbols were easily understood, students could read the information quickly and react to the information communicated by their peers without a problem. Technically it was a sound implementation, but it was not possible to observe any substantial behaviour with the current approach to work that both teams had during the classroom session </w:t>
+      </w:r>
+      <w:r>
+        <w:rPr>
+          <w:lang w:val="en-NZ"/>
+        </w:rPr>
+        <w:t>where</w:t>
+      </w:r>
+      <w:r>
+        <w:rPr>
+          <w:lang w:val="en-NZ"/>
+        </w:rPr>
+        <w:t xml:space="preserve"> observations took place.</w:t>
+      </w:r>
+    </w:p>
+    <w:p>
+      <w:pPr>
+        <w:rPr>
+          <w:lang w:val="en-NZ"/>
+        </w:rPr>
+      </w:pPr>
+      <w:r>
+        <w:rPr>
+          <w:lang w:val="en-NZ"/>
+        </w:rPr>
+        <w:t xml:space="preserve">The second scenario was more open and used the unstructured version of the debate function to let the students openly talk and discuss things during their normal work session. This setup prompted more conversation than the previous scenario, student tested more the unstructured questions and the beginning and also started to be more playful with the activity, proposing question unrelated to the project and more humorous uses of the emotes, </w:t>
+      </w:r>
+      <w:r>
+        <w:rPr>
+          <w:lang w:val="en-NZ"/>
+        </w:rPr>
+        <w:lastRenderedPageBreak/>
+        <w:t>taking advantage of the visuals provided to give a stronger emotional context to whatever was the centre of discussion.</w:t>
+      </w:r>
+    </w:p>
+    <w:p>
+      <w:pPr>
+        <w:rPr>
+          <w:lang w:val="en-NZ"/>
+        </w:rPr>
+      </w:pPr>
+      <w:r>
+        <w:rPr>
+          <w:lang w:val="en-NZ"/>
+        </w:rPr>
+        <w:t>Team D found the free conversation very enticing, and it was interesting to see, after the activity itself was already over, that the group was coming back to the tool to show their reactions to a comment or a situation during their work. Most of those conversations were unrelated to their work and played more for fun than for actual communication, but it was telling that the tool was used to properly convey meaning and was able to be integrated rather naturally into the actions of the students.</w:t>
+      </w:r>
+    </w:p>
+    <w:p>
+      <w:pPr>
+        <w:rPr>
+          <w:lang w:val="en-NZ"/>
+        </w:rPr>
+      </w:pPr>
+      <w:r>
+        <w:rPr>
+          <w:lang w:val="en-NZ"/>
+        </w:rPr>
+        <w:t>Team E on the other hand did not show an instance of such natural use of the tool, but in general they were not speaking between them at all. The mood of the session was more relaxed with Team D than with Team E, which also promoted a better environment for casual conversation and a more playful attitude, which seemed to be the better context for the use of the tool.</w:t>
+      </w:r>
+    </w:p>
+    <w:p>
+      <w:pPr>
+        <w:pStyle w:val="Ttulo2"/>
+        <w:rPr>
+          <w:sz w:val="22"/>
+          <w:szCs w:val="22"/>
+          <w:lang w:val="en-NZ"/>
+        </w:rPr>
+      </w:pPr>
+      <w:r>
+        <w:rPr>
+          <w:sz w:val="22"/>
+          <w:szCs w:val="22"/>
           <w:lang w:val="en-NZ"/>
         </w:rPr>
         <w:t>6.</w:t>
       </w:r>
       <w:r>
         <w:rPr>
+          <w:sz w:val="22"/>
+          <w:szCs w:val="22"/>
           <w:lang w:val="en-NZ"/>
         </w:rPr>
         <w:t>8</w:t>
       </w:r>
       <w:r>
         <w:rPr>
+          <w:sz w:val="22"/>
+          <w:szCs w:val="22"/>
           <w:lang w:val="en-NZ"/>
         </w:rPr>
         <w:t>.3 Preliminary Analysis</w:t>
@@ -13359,18 +13979,224 @@
         <w:rPr>
           <w:lang w:val="en-NZ"/>
         </w:rPr>
+        <w:t xml:space="preserve">These set of weeks represented the end of the observation stage, and based on the previous preliminary processes of analysis, it is possible to summarize some of the </w:t>
+      </w:r>
+      <w:r>
+        <w:rPr>
+          <w:lang w:val="en-NZ"/>
+        </w:rPr>
+        <w:t>most important themes extracted from the observations gathered:</w:t>
+      </w:r>
+    </w:p>
+    <w:p>
+      <w:pPr>
+        <w:pStyle w:val="Prrafodelista"/>
+        <w:numPr>
+          <w:ilvl w:val="0"/>
+          <w:numId w:val="30"/>
+        </w:numPr>
+        <w:rPr>
+          <w:lang w:val="en-NZ"/>
+        </w:rPr>
+      </w:pPr>
+      <w:r>
+        <w:rPr>
+          <w:lang w:val="en-NZ"/>
+        </w:rPr>
+        <w:t>The dynamics observer for any group would determine if they preferred a more structured approach to teamwork, needing more guidance from the available teaching staff and using more the tools provided by WorkshopAR to help them in the first steps of consolidating the group.</w:t>
+      </w:r>
+    </w:p>
+    <w:p>
+      <w:pPr>
+        <w:pStyle w:val="Prrafodelista"/>
+        <w:numPr>
+          <w:ilvl w:val="0"/>
+          <w:numId w:val="30"/>
+        </w:numPr>
+        <w:rPr>
+          <w:lang w:val="en-NZ"/>
+        </w:rPr>
+      </w:pPr>
+      <w:r>
+        <w:rPr>
+          <w:lang w:val="en-NZ"/>
+        </w:rPr>
+        <w:t>Better stablished groups would prefer a more flexible approach to the activity, relying in the mechanisms they themselves had build and finding any external intervention, either the lecturers or the use of WorkshopAR, more as a hindrance than an actual help.</w:t>
+      </w:r>
+    </w:p>
+    <w:p>
+      <w:pPr>
+        <w:pStyle w:val="Prrafodelista"/>
+        <w:numPr>
+          <w:ilvl w:val="0"/>
+          <w:numId w:val="30"/>
+        </w:numPr>
+        <w:rPr>
+          <w:lang w:val="en-NZ"/>
+        </w:rPr>
+      </w:pPr>
+      <w:r>
+        <w:rPr>
+          <w:lang w:val="en-NZ"/>
+        </w:rPr>
+        <w:t>In either case, the need for structure would be greater at the beginning and would fade towards the end of the group, either because the mechanisms for groupwork are clear or because the tool is not helping in creating of reinforcing those mechanisms</w:t>
+      </w:r>
+    </w:p>
+    <w:p>
+      <w:pPr>
+        <w:pStyle w:val="Prrafodelista"/>
+        <w:numPr>
+          <w:ilvl w:val="0"/>
+          <w:numId w:val="30"/>
+        </w:numPr>
+        <w:rPr>
+          <w:lang w:val="en-NZ"/>
+        </w:rPr>
+      </w:pPr>
+      <w:r>
+        <w:rPr>
+          <w:lang w:val="en-NZ"/>
+        </w:rPr>
+        <w:t>Digital tools need to be able to adapt and connect to the environment they live in. All students have their own set of tools and favourite channels of communication than often collide with any other alternative or even with the official channels proposed by the course.</w:t>
+      </w:r>
+    </w:p>
+    <w:p>
+      <w:pPr>
+        <w:pStyle w:val="Prrafodelista"/>
+        <w:numPr>
+          <w:ilvl w:val="0"/>
+          <w:numId w:val="30"/>
+        </w:numPr>
+        <w:rPr>
+          <w:lang w:val="en-NZ"/>
+        </w:rPr>
+      </w:pPr>
+      <w:r>
+        <w:rPr>
+          <w:lang w:val="en-NZ"/>
+        </w:rPr>
+        <w:t>Visual communication is a powerful tool to promote all sort of behaviours. Activities related to the organization of ideas, communication between peers and teaching staff, backlog of activities and the contextual meaning of a conversation were all using some form of visual aide, and students resonated the most with WorkshopAR when they found those visual elements to interact with.</w:t>
+      </w:r>
+    </w:p>
+    <w:p>
+      <w:pPr>
+        <w:pStyle w:val="Prrafodelista"/>
+        <w:numPr>
+          <w:ilvl w:val="0"/>
+          <w:numId w:val="30"/>
+        </w:numPr>
+        <w:rPr>
+          <w:lang w:val="en-NZ"/>
+        </w:rPr>
+      </w:pPr>
+      <w:r>
+        <w:rPr>
+          <w:lang w:val="en-NZ"/>
+        </w:rPr>
+        <w:t xml:space="preserve">The relationship people build with their phones is complex and varied, and a solution that seeks to use these types of mobile environments will find obstacles in all possible side of possible responses. What seams to be a working approach to this problem is to stick to a design that is clear for the students and enforce it through different aspects of the learning environment. The approach the teaching staff took </w:t>
+      </w:r>
+      <w:r>
+        <w:rPr>
+          <w:lang w:val="en-NZ"/>
+        </w:rPr>
         <w:lastRenderedPageBreak/>
-        <w:t>Using the forum a form of community registry, the basis of a CoP</w:t>
-      </w:r>
-    </w:p>
-    <w:p>
-      <w:pPr>
-        <w:rPr>
-          <w:lang w:val="en-NZ"/>
-        </w:rPr>
-      </w:pPr>
-      <w:r>
-        <w:rPr>
+        <w:t>for the implementation of the public forums in the LMS of the course is a good example of this approach.</w:t>
+      </w:r>
+    </w:p>
+    <w:p>
+      <w:pPr>
+        <w:rPr>
+          <w:lang w:val="en-NZ"/>
+        </w:rPr>
+      </w:pPr>
+      <w:r>
+        <w:rPr>
+          <w:lang w:val="en-NZ"/>
+        </w:rPr>
+        <w:t>Through the development of the course, it was possible to observe first hand different students approaching the necessities of collaboration in very different ways. A lot of the observations mirrored what was found in literature previously and reinforced the idea that collaborative work must be nurtured and teach for it to be effective as a teaching tool. Industry Project offered an interesting environment to build the skills necessary for a healthy teamwork experience. The course particularly excels at creating opportunities for students to analyse a problem, identify needed resources and formulate a plan to build a solution. Some students thrived more in this process individually, but it was clear that a group approach was better suited to provide a successful plan. If there is something where the course was lacking was in making these scenarios for the development of collaborative more explicit to the students and not relying completely in a self-exploratory method that could derive in several student repeatedly bashing a wall, as was described in section 2.1.4.</w:t>
+      </w:r>
+    </w:p>
+    <w:p>
+      <w:pPr>
+        <w:rPr>
+          <w:lang w:val="en-NZ"/>
+        </w:rPr>
+      </w:pPr>
+      <w:r>
+        <w:rPr>
+          <w:lang w:val="en-NZ"/>
+        </w:rPr>
+        <w:t xml:space="preserve">The involvement of WorkshopAR in these scenarios had its ups and lows. </w:t>
+      </w:r>
+      <w:r>
+        <w:rPr>
+          <w:lang w:val="en-NZ"/>
+        </w:rPr>
+        <w:t>A summary</w:t>
+      </w:r>
+      <w:r>
+        <w:rPr>
+          <w:lang w:val="en-NZ"/>
+        </w:rPr>
+        <w:t xml:space="preserve"> f the whole experience could be as follows: WorkshopAR succeeded at initiating discussions and reflections around the dynamics a team could be using to manage their collaborative effort, both failed integrating into the actual mechanisms that the students implemented to </w:t>
+      </w:r>
+      <w:r>
+        <w:rPr>
+          <w:lang w:val="en-NZ"/>
+        </w:rPr>
+        <w:t>fulfil</w:t>
+      </w:r>
+      <w:r>
+        <w:rPr>
+          <w:lang w:val="en-NZ"/>
+        </w:rPr>
+        <w:t xml:space="preserve"> their tasks. It was a good conversation </w:t>
+      </w:r>
+      <w:r>
+        <w:rPr>
+          <w:lang w:val="en-NZ"/>
+        </w:rPr>
+        <w:t>starter,</w:t>
+      </w:r>
+      <w:r>
+        <w:rPr>
+          <w:lang w:val="en-NZ"/>
+        </w:rPr>
+        <w:t xml:space="preserve"> b</w:t>
+      </w:r>
+      <w:r>
+        <w:rPr>
+          <w:lang w:val="en-NZ"/>
+        </w:rPr>
+        <w:t>ut it needs more iterations to offer a real implementation.</w:t>
+      </w:r>
+    </w:p>
+    <w:p>
+      <w:pPr>
+        <w:rPr>
+          <w:lang w:val="en-NZ"/>
+        </w:rPr>
+      </w:pPr>
+      <w:r>
+        <w:rPr>
+          <w:lang w:val="en-NZ"/>
+        </w:rPr>
+        <w:t>The following sections will complement the points previously explained by painting a more specific view of both the teaching staff and the students of how the course developed and how different key aspects of collaborative work and collaborative learning were perceived, and will be compared to the behaviours observed around the student’s work and the use of WorkshopAR to better construct a conclusion and identify the lessons that could be extracted from the case study.</w:t>
+      </w:r>
+    </w:p>
+    <w:p>
+      <w:pPr>
+        <w:pStyle w:val="Ttulo1"/>
+        <w:rPr>
+          <w:sz w:val="22"/>
+          <w:szCs w:val="22"/>
+          <w:lang w:val="en-NZ"/>
+        </w:rPr>
+      </w:pPr>
+      <w:r>
+        <w:rPr>
+          <w:sz w:val="22"/>
+          <w:szCs w:val="22"/>
           <w:lang w:val="en-NZ"/>
         </w:rPr>
         <w:t>6.9 Analysis on Student’s Observations and Responses</w:t>
@@ -13386,6 +14212,108 @@
         <w:rPr>
           <w:lang w:val="en-NZ"/>
         </w:rPr>
+        <w:t>Explain questionnaire</w:t>
+      </w:r>
+    </w:p>
+    <w:p>
+      <w:pPr>
+        <w:rPr>
+          <w:lang w:val="en-NZ"/>
+        </w:rPr>
+      </w:pPr>
+      <w:r>
+        <w:rPr>
+          <w:lang w:val="en-NZ"/>
+        </w:rPr>
+        <w:t>Explain codebook</w:t>
+      </w:r>
+    </w:p>
+    <w:p>
+      <w:pPr>
+        <w:rPr>
+          <w:lang w:val="en-NZ"/>
+        </w:rPr>
+      </w:pPr>
+      <w:r>
+        <w:rPr>
+          <w:lang w:val="en-NZ"/>
+        </w:rPr>
+        <w:tab/>
+        <w:t>Huge impact of first week issues or success</w:t>
+      </w:r>
+    </w:p>
+    <w:p>
+      <w:pPr>
+        <w:rPr>
+          <w:lang w:val="en-NZ"/>
+        </w:rPr>
+      </w:pPr>
+      <w:r>
+        <w:rPr>
+          <w:lang w:val="en-NZ"/>
+        </w:rPr>
+        <w:tab/>
+        <w:t>Collaboration inertia (activities were in the end individual)</w:t>
+      </w:r>
+    </w:p>
+    <w:p>
+      <w:pPr>
+        <w:rPr>
+          <w:lang w:val="en-NZ"/>
+        </w:rPr>
+      </w:pPr>
+      <w:r>
+        <w:rPr>
+          <w:lang w:val="en-NZ"/>
+        </w:rPr>
+        <w:tab/>
+        <w:t>Managing all the communication tools</w:t>
+      </w:r>
+    </w:p>
+    <w:p>
+      <w:pPr>
+        <w:rPr>
+          <w:lang w:val="en-NZ"/>
+        </w:rPr>
+      </w:pPr>
+      <w:r>
+        <w:rPr>
+          <w:lang w:val="en-NZ"/>
+        </w:rPr>
+        <w:tab/>
+        <w:t>No real presence of WAR</w:t>
+      </w:r>
+      <w:r>
+        <w:rPr>
+          <w:lang w:val="en-NZ"/>
+        </w:rPr>
+        <w:t>, but mention of exploring new tools</w:t>
+      </w:r>
+    </w:p>
+    <w:p>
+      <w:pPr>
+        <w:rPr>
+          <w:lang w:val="en-NZ"/>
+        </w:rPr>
+      </w:pPr>
+      <w:r>
+        <w:rPr>
+          <w:lang w:val="en-NZ"/>
+        </w:rPr>
+        <w:tab/>
+        <w:t>Learning vs producing</w:t>
+      </w:r>
+    </w:p>
+    <w:p>
+      <w:pPr>
+        <w:rPr>
+          <w:lang w:val="en-NZ"/>
+        </w:rPr>
+      </w:pPr>
+      <w:r>
+        <w:rPr>
+          <w:lang w:val="en-NZ"/>
+        </w:rPr>
         <w:t>6.10 Analysis on Teaching Staff’s Observations and Responses</w:t>
       </w:r>
     </w:p>
@@ -13399,20 +14327,77 @@
         <w:rPr>
           <w:lang w:val="en-NZ"/>
         </w:rPr>
-        <w:t>Requirements of the course being taught earlier</w:t>
-      </w:r>
-    </w:p>
-    <w:p>
-      <w:pPr>
-        <w:rPr>
-          <w:lang w:val="en-NZ"/>
-        </w:rPr>
-      </w:pPr>
-      <w:r>
-        <w:rPr>
-          <w:lang w:val="en-NZ"/>
-        </w:rPr>
-        <w:t>Adjust the simulation aspect</w:t>
+        <w:t>Explain questionnaire</w:t>
+      </w:r>
+    </w:p>
+    <w:p>
+      <w:pPr>
+        <w:rPr>
+          <w:lang w:val="en-NZ"/>
+        </w:rPr>
+      </w:pPr>
+      <w:r>
+        <w:rPr>
+          <w:lang w:val="en-NZ"/>
+        </w:rPr>
+        <w:t>Explain codebook</w:t>
+      </w:r>
+    </w:p>
+    <w:p>
+      <w:pPr>
+        <w:rPr>
+          <w:lang w:val="en-NZ"/>
+        </w:rPr>
+      </w:pPr>
+      <w:r>
+        <w:rPr>
+          <w:lang w:val="en-NZ"/>
+        </w:rPr>
+        <w:lastRenderedPageBreak/>
+        <w:tab/>
+        <w:t>Lean on the simulacrum for better professional objectives</w:t>
+      </w:r>
+    </w:p>
+    <w:p>
+      <w:pPr>
+        <w:rPr>
+          <w:lang w:val="en-NZ"/>
+        </w:rPr>
+      </w:pPr>
+      <w:r>
+        <w:rPr>
+          <w:lang w:val="en-NZ"/>
+        </w:rPr>
+        <w:tab/>
+        <w:t>Academical readiness of the students for the learning goals (when to teach everything)</w:t>
+      </w:r>
+    </w:p>
+    <w:p>
+      <w:pPr>
+        <w:rPr>
+          <w:lang w:val="en-NZ"/>
+        </w:rPr>
+      </w:pPr>
+      <w:r>
+        <w:rPr>
+          <w:lang w:val="en-NZ"/>
+        </w:rPr>
+        <w:tab/>
+        <w:t>Asses the product or asses the work</w:t>
+      </w:r>
+    </w:p>
+    <w:p>
+      <w:pPr>
+        <w:ind w:firstLine="720"/>
+        <w:rPr>
+          <w:lang w:val="en-NZ"/>
+        </w:rPr>
+      </w:pPr>
+      <w:r>
+        <w:rPr>
+          <w:lang w:val="en-NZ"/>
+        </w:rPr>
+        <w:t>Explore all the tools, whatever the students needs</w:t>
       </w:r>
     </w:p>
     <w:p>
@@ -13764,6 +14749,119 @@
     </w:lvl>
   </w:abstractNum>
   <w:abstractNum w:abstractNumId="2" w15:restartNumberingAfterBreak="0">
+    <w:nsid w:val="096D46CB"/>
+    <w:multiLevelType w:val="hybridMultilevel"/>
+    <w:tmpl w:val="573862F2"/>
+    <w:lvl w:ilvl="0" w:tplc="240A0001">
+      <w:start w:val="1"/>
+      <w:numFmt w:val="bullet"/>
+      <w:lvlText w:val=""/>
+      <w:lvlJc w:val="left"/>
+      <w:pPr>
+        <w:ind w:left="720" w:hanging="360"/>
+      </w:pPr>
+      <w:rPr>
+        <w:rFonts w:ascii="Symbol" w:hAnsi="Symbol" w:hint="default"/>
+      </w:rPr>
+    </w:lvl>
+    <w:lvl w:ilvl="1" w:tplc="240A0003" w:tentative="1">
+      <w:start w:val="1"/>
+      <w:numFmt w:val="bullet"/>
+      <w:lvlText w:val="o"/>
+      <w:lvlJc w:val="left"/>
+      <w:pPr>
+        <w:ind w:left="1440" w:hanging="360"/>
+      </w:pPr>
+      <w:rPr>
+        <w:rFonts w:ascii="Courier New" w:hAnsi="Courier New" w:cs="Courier New" w:hint="default"/>
+      </w:rPr>
+    </w:lvl>
+    <w:lvl w:ilvl="2" w:tplc="240A0005" w:tentative="1">
+      <w:start w:val="1"/>
+      <w:numFmt w:val="bullet"/>
+      <w:lvlText w:val=""/>
+      <w:lvlJc w:val="left"/>
+      <w:pPr>
+        <w:ind w:left="2160" w:hanging="360"/>
+      </w:pPr>
+      <w:rPr>
+        <w:rFonts w:ascii="Wingdings" w:hAnsi="Wingdings" w:hint="default"/>
+      </w:rPr>
+    </w:lvl>
+    <w:lvl w:ilvl="3" w:tplc="240A0001" w:tentative="1">
+      <w:start w:val="1"/>
+      <w:numFmt w:val="bullet"/>
+      <w:lvlText w:val=""/>
+      <w:lvlJc w:val="left"/>
+      <w:pPr>
+        <w:ind w:left="2880" w:hanging="360"/>
+      </w:pPr>
+      <w:rPr>
+        <w:rFonts w:ascii="Symbol" w:hAnsi="Symbol" w:hint="default"/>
+      </w:rPr>
+    </w:lvl>
+    <w:lvl w:ilvl="4" w:tplc="240A0003" w:tentative="1">
+      <w:start w:val="1"/>
+      <w:numFmt w:val="bullet"/>
+      <w:lvlText w:val="o"/>
+      <w:lvlJc w:val="left"/>
+      <w:pPr>
+        <w:ind w:left="3600" w:hanging="360"/>
+      </w:pPr>
+      <w:rPr>
+        <w:rFonts w:ascii="Courier New" w:hAnsi="Courier New" w:cs="Courier New" w:hint="default"/>
+      </w:rPr>
+    </w:lvl>
+    <w:lvl w:ilvl="5" w:tplc="240A0005" w:tentative="1">
+      <w:start w:val="1"/>
+      <w:numFmt w:val="bullet"/>
+      <w:lvlText w:val=""/>
+      <w:lvlJc w:val="left"/>
+      <w:pPr>
+        <w:ind w:left="4320" w:hanging="360"/>
+      </w:pPr>
+      <w:rPr>
+        <w:rFonts w:ascii="Wingdings" w:hAnsi="Wingdings" w:hint="default"/>
+      </w:rPr>
+    </w:lvl>
+    <w:lvl w:ilvl="6" w:tplc="240A0001" w:tentative="1">
+      <w:start w:val="1"/>
+      <w:numFmt w:val="bullet"/>
+      <w:lvlText w:val=""/>
+      <w:lvlJc w:val="left"/>
+      <w:pPr>
+        <w:ind w:left="5040" w:hanging="360"/>
+      </w:pPr>
+      <w:rPr>
+        <w:rFonts w:ascii="Symbol" w:hAnsi="Symbol" w:hint="default"/>
+      </w:rPr>
+    </w:lvl>
+    <w:lvl w:ilvl="7" w:tplc="240A0003" w:tentative="1">
+      <w:start w:val="1"/>
+      <w:numFmt w:val="bullet"/>
+      <w:lvlText w:val="o"/>
+      <w:lvlJc w:val="left"/>
+      <w:pPr>
+        <w:ind w:left="5760" w:hanging="360"/>
+      </w:pPr>
+      <w:rPr>
+        <w:rFonts w:ascii="Courier New" w:hAnsi="Courier New" w:cs="Courier New" w:hint="default"/>
+      </w:rPr>
+    </w:lvl>
+    <w:lvl w:ilvl="8" w:tplc="240A0005" w:tentative="1">
+      <w:start w:val="1"/>
+      <w:numFmt w:val="bullet"/>
+      <w:lvlText w:val=""/>
+      <w:lvlJc w:val="left"/>
+      <w:pPr>
+        <w:ind w:left="6480" w:hanging="360"/>
+      </w:pPr>
+      <w:rPr>
+        <w:rFonts w:ascii="Wingdings" w:hAnsi="Wingdings" w:hint="default"/>
+      </w:rPr>
+    </w:lvl>
+  </w:abstractNum>
+  <w:abstractNum w:abstractNumId="3" w15:restartNumberingAfterBreak="0">
     <w:nsid w:val="11D01384"/>
     <w:multiLevelType w:val="hybridMultilevel"/>
     <w:tmpl w:val="A22E6ECE"/>
@@ -13876,7 +14974,7 @@
       </w:rPr>
     </w:lvl>
   </w:abstractNum>
-  <w:abstractNum w:abstractNumId="3" w15:restartNumberingAfterBreak="0">
+  <w:abstractNum w:abstractNumId="4" w15:restartNumberingAfterBreak="0">
     <w:nsid w:val="12921473"/>
     <w:multiLevelType w:val="hybridMultilevel"/>
     <w:tmpl w:val="85243DF4"/>
@@ -13989,7 +15087,7 @@
       </w:rPr>
     </w:lvl>
   </w:abstractNum>
-  <w:abstractNum w:abstractNumId="4" w15:restartNumberingAfterBreak="0">
+  <w:abstractNum w:abstractNumId="5" w15:restartNumberingAfterBreak="0">
     <w:nsid w:val="164346F4"/>
     <w:multiLevelType w:val="hybridMultilevel"/>
     <w:tmpl w:val="6E0C3D10"/>
@@ -14102,7 +15200,7 @@
       </w:rPr>
     </w:lvl>
   </w:abstractNum>
-  <w:abstractNum w:abstractNumId="5" w15:restartNumberingAfterBreak="0">
+  <w:abstractNum w:abstractNumId="6" w15:restartNumberingAfterBreak="0">
     <w:nsid w:val="1D1F74FC"/>
     <w:multiLevelType w:val="hybridMultilevel"/>
     <w:tmpl w:val="6FC0A9D0"/>
@@ -14215,7 +15313,7 @@
       </w:rPr>
     </w:lvl>
   </w:abstractNum>
-  <w:abstractNum w:abstractNumId="6" w15:restartNumberingAfterBreak="0">
+  <w:abstractNum w:abstractNumId="7" w15:restartNumberingAfterBreak="0">
     <w:nsid w:val="28B0261C"/>
     <w:multiLevelType w:val="hybridMultilevel"/>
     <w:tmpl w:val="77347DC0"/>
@@ -14328,7 +15426,7 @@
       </w:rPr>
     </w:lvl>
   </w:abstractNum>
-  <w:abstractNum w:abstractNumId="7" w15:restartNumberingAfterBreak="0">
+  <w:abstractNum w:abstractNumId="8" w15:restartNumberingAfterBreak="0">
     <w:nsid w:val="2A832CEB"/>
     <w:multiLevelType w:val="hybridMultilevel"/>
     <w:tmpl w:val="D95C5B8A"/>
@@ -14441,7 +15539,7 @@
       </w:rPr>
     </w:lvl>
   </w:abstractNum>
-  <w:abstractNum w:abstractNumId="8" w15:restartNumberingAfterBreak="0">
+  <w:abstractNum w:abstractNumId="9" w15:restartNumberingAfterBreak="0">
     <w:nsid w:val="354F4453"/>
     <w:multiLevelType w:val="hybridMultilevel"/>
     <w:tmpl w:val="E474EDD4"/>
@@ -14554,7 +15652,7 @@
       </w:rPr>
     </w:lvl>
   </w:abstractNum>
-  <w:abstractNum w:abstractNumId="9" w15:restartNumberingAfterBreak="0">
+  <w:abstractNum w:abstractNumId="10" w15:restartNumberingAfterBreak="0">
     <w:nsid w:val="36720225"/>
     <w:multiLevelType w:val="hybridMultilevel"/>
     <w:tmpl w:val="E5CEAEC4"/>
@@ -14667,7 +15765,7 @@
       </w:rPr>
     </w:lvl>
   </w:abstractNum>
-  <w:abstractNum w:abstractNumId="10" w15:restartNumberingAfterBreak="0">
+  <w:abstractNum w:abstractNumId="11" w15:restartNumberingAfterBreak="0">
     <w:nsid w:val="3B2426D6"/>
     <w:multiLevelType w:val="hybridMultilevel"/>
     <w:tmpl w:val="2A94FC48"/>
@@ -14780,7 +15878,7 @@
       </w:rPr>
     </w:lvl>
   </w:abstractNum>
-  <w:abstractNum w:abstractNumId="11" w15:restartNumberingAfterBreak="0">
+  <w:abstractNum w:abstractNumId="12" w15:restartNumberingAfterBreak="0">
     <w:nsid w:val="4298740D"/>
     <w:multiLevelType w:val="hybridMultilevel"/>
     <w:tmpl w:val="DA5464BE"/>
@@ -14893,7 +15991,7 @@
       </w:rPr>
     </w:lvl>
   </w:abstractNum>
-  <w:abstractNum w:abstractNumId="12" w15:restartNumberingAfterBreak="0">
+  <w:abstractNum w:abstractNumId="13" w15:restartNumberingAfterBreak="0">
     <w:nsid w:val="457D7F16"/>
     <w:multiLevelType w:val="hybridMultilevel"/>
     <w:tmpl w:val="9A7AC840"/>
@@ -15006,7 +16104,120 @@
       </w:rPr>
     </w:lvl>
   </w:abstractNum>
-  <w:abstractNum w:abstractNumId="13" w15:restartNumberingAfterBreak="0">
+  <w:abstractNum w:abstractNumId="14" w15:restartNumberingAfterBreak="0">
+    <w:nsid w:val="486B6B9C"/>
+    <w:multiLevelType w:val="hybridMultilevel"/>
+    <w:tmpl w:val="FB7EB15C"/>
+    <w:lvl w:ilvl="0" w:tplc="240A0001">
+      <w:start w:val="1"/>
+      <w:numFmt w:val="bullet"/>
+      <w:lvlText w:val=""/>
+      <w:lvlJc w:val="left"/>
+      <w:pPr>
+        <w:ind w:left="780" w:hanging="360"/>
+      </w:pPr>
+      <w:rPr>
+        <w:rFonts w:ascii="Symbol" w:hAnsi="Symbol" w:hint="default"/>
+      </w:rPr>
+    </w:lvl>
+    <w:lvl w:ilvl="1" w:tplc="240A0003" w:tentative="1">
+      <w:start w:val="1"/>
+      <w:numFmt w:val="bullet"/>
+      <w:lvlText w:val="o"/>
+      <w:lvlJc w:val="left"/>
+      <w:pPr>
+        <w:ind w:left="1500" w:hanging="360"/>
+      </w:pPr>
+      <w:rPr>
+        <w:rFonts w:ascii="Courier New" w:hAnsi="Courier New" w:cs="Courier New" w:hint="default"/>
+      </w:rPr>
+    </w:lvl>
+    <w:lvl w:ilvl="2" w:tplc="240A0005" w:tentative="1">
+      <w:start w:val="1"/>
+      <w:numFmt w:val="bullet"/>
+      <w:lvlText w:val=""/>
+      <w:lvlJc w:val="left"/>
+      <w:pPr>
+        <w:ind w:left="2220" w:hanging="360"/>
+      </w:pPr>
+      <w:rPr>
+        <w:rFonts w:ascii="Wingdings" w:hAnsi="Wingdings" w:hint="default"/>
+      </w:rPr>
+    </w:lvl>
+    <w:lvl w:ilvl="3" w:tplc="240A0001" w:tentative="1">
+      <w:start w:val="1"/>
+      <w:numFmt w:val="bullet"/>
+      <w:lvlText w:val=""/>
+      <w:lvlJc w:val="left"/>
+      <w:pPr>
+        <w:ind w:left="2940" w:hanging="360"/>
+      </w:pPr>
+      <w:rPr>
+        <w:rFonts w:ascii="Symbol" w:hAnsi="Symbol" w:hint="default"/>
+      </w:rPr>
+    </w:lvl>
+    <w:lvl w:ilvl="4" w:tplc="240A0003" w:tentative="1">
+      <w:start w:val="1"/>
+      <w:numFmt w:val="bullet"/>
+      <w:lvlText w:val="o"/>
+      <w:lvlJc w:val="left"/>
+      <w:pPr>
+        <w:ind w:left="3660" w:hanging="360"/>
+      </w:pPr>
+      <w:rPr>
+        <w:rFonts w:ascii="Courier New" w:hAnsi="Courier New" w:cs="Courier New" w:hint="default"/>
+      </w:rPr>
+    </w:lvl>
+    <w:lvl w:ilvl="5" w:tplc="240A0005" w:tentative="1">
+      <w:start w:val="1"/>
+      <w:numFmt w:val="bullet"/>
+      <w:lvlText w:val=""/>
+      <w:lvlJc w:val="left"/>
+      <w:pPr>
+        <w:ind w:left="4380" w:hanging="360"/>
+      </w:pPr>
+      <w:rPr>
+        <w:rFonts w:ascii="Wingdings" w:hAnsi="Wingdings" w:hint="default"/>
+      </w:rPr>
+    </w:lvl>
+    <w:lvl w:ilvl="6" w:tplc="240A0001" w:tentative="1">
+      <w:start w:val="1"/>
+      <w:numFmt w:val="bullet"/>
+      <w:lvlText w:val=""/>
+      <w:lvlJc w:val="left"/>
+      <w:pPr>
+        <w:ind w:left="5100" w:hanging="360"/>
+      </w:pPr>
+      <w:rPr>
+        <w:rFonts w:ascii="Symbol" w:hAnsi="Symbol" w:hint="default"/>
+      </w:rPr>
+    </w:lvl>
+    <w:lvl w:ilvl="7" w:tplc="240A0003" w:tentative="1">
+      <w:start w:val="1"/>
+      <w:numFmt w:val="bullet"/>
+      <w:lvlText w:val="o"/>
+      <w:lvlJc w:val="left"/>
+      <w:pPr>
+        <w:ind w:left="5820" w:hanging="360"/>
+      </w:pPr>
+      <w:rPr>
+        <w:rFonts w:ascii="Courier New" w:hAnsi="Courier New" w:cs="Courier New" w:hint="default"/>
+      </w:rPr>
+    </w:lvl>
+    <w:lvl w:ilvl="8" w:tplc="240A0005" w:tentative="1">
+      <w:start w:val="1"/>
+      <w:numFmt w:val="bullet"/>
+      <w:lvlText w:val=""/>
+      <w:lvlJc w:val="left"/>
+      <w:pPr>
+        <w:ind w:left="6540" w:hanging="360"/>
+      </w:pPr>
+      <w:rPr>
+        <w:rFonts w:ascii="Wingdings" w:hAnsi="Wingdings" w:hint="default"/>
+      </w:rPr>
+    </w:lvl>
+  </w:abstractNum>
+  <w:abstractNum w:abstractNumId="15" w15:restartNumberingAfterBreak="0">
     <w:nsid w:val="4AD5040C"/>
     <w:multiLevelType w:val="hybridMultilevel"/>
     <w:tmpl w:val="C6FC44A6"/>
@@ -15119,7 +16330,7 @@
       </w:rPr>
     </w:lvl>
   </w:abstractNum>
-  <w:abstractNum w:abstractNumId="14" w15:restartNumberingAfterBreak="0">
+  <w:abstractNum w:abstractNumId="16" w15:restartNumberingAfterBreak="0">
     <w:nsid w:val="4B30465F"/>
     <w:multiLevelType w:val="hybridMultilevel"/>
     <w:tmpl w:val="D23CF962"/>
@@ -15232,7 +16443,7 @@
       </w:rPr>
     </w:lvl>
   </w:abstractNum>
-  <w:abstractNum w:abstractNumId="15" w15:restartNumberingAfterBreak="0">
+  <w:abstractNum w:abstractNumId="17" w15:restartNumberingAfterBreak="0">
     <w:nsid w:val="513B7EA1"/>
     <w:multiLevelType w:val="hybridMultilevel"/>
     <w:tmpl w:val="6B5C4A68"/>
@@ -15345,7 +16556,7 @@
       </w:rPr>
     </w:lvl>
   </w:abstractNum>
-  <w:abstractNum w:abstractNumId="16" w15:restartNumberingAfterBreak="0">
+  <w:abstractNum w:abstractNumId="18" w15:restartNumberingAfterBreak="0">
     <w:nsid w:val="58B14600"/>
     <w:multiLevelType w:val="hybridMultilevel"/>
     <w:tmpl w:val="433A6502"/>
@@ -15458,7 +16669,7 @@
       </w:rPr>
     </w:lvl>
   </w:abstractNum>
-  <w:abstractNum w:abstractNumId="17" w15:restartNumberingAfterBreak="0">
+  <w:abstractNum w:abstractNumId="19" w15:restartNumberingAfterBreak="0">
     <w:nsid w:val="5F436901"/>
     <w:multiLevelType w:val="hybridMultilevel"/>
     <w:tmpl w:val="4DE48B7C"/>
@@ -15571,7 +16782,7 @@
       </w:rPr>
     </w:lvl>
   </w:abstractNum>
-  <w:abstractNum w:abstractNumId="18" w15:restartNumberingAfterBreak="0">
+  <w:abstractNum w:abstractNumId="20" w15:restartNumberingAfterBreak="0">
     <w:nsid w:val="6B48065D"/>
     <w:multiLevelType w:val="hybridMultilevel"/>
     <w:tmpl w:val="9566E192"/>
@@ -15684,7 +16895,7 @@
       </w:rPr>
     </w:lvl>
   </w:abstractNum>
-  <w:abstractNum w:abstractNumId="19" w15:restartNumberingAfterBreak="0">
+  <w:abstractNum w:abstractNumId="21" w15:restartNumberingAfterBreak="0">
     <w:nsid w:val="6F0D1C0D"/>
     <w:multiLevelType w:val="hybridMultilevel"/>
     <w:tmpl w:val="AA8C2E28"/>
@@ -15797,7 +17008,7 @@
       </w:rPr>
     </w:lvl>
   </w:abstractNum>
-  <w:abstractNum w:abstractNumId="20" w15:restartNumberingAfterBreak="0">
+  <w:abstractNum w:abstractNumId="22" w15:restartNumberingAfterBreak="0">
     <w:nsid w:val="6F1C43A0"/>
     <w:multiLevelType w:val="hybridMultilevel"/>
     <w:tmpl w:val="239205CC"/>
@@ -15910,7 +17121,7 @@
       </w:rPr>
     </w:lvl>
   </w:abstractNum>
-  <w:abstractNum w:abstractNumId="21" w15:restartNumberingAfterBreak="0">
+  <w:abstractNum w:abstractNumId="23" w15:restartNumberingAfterBreak="0">
     <w:nsid w:val="719B15A0"/>
     <w:multiLevelType w:val="hybridMultilevel"/>
     <w:tmpl w:val="8B6A06FC"/>
@@ -16023,7 +17234,7 @@
       </w:rPr>
     </w:lvl>
   </w:abstractNum>
-  <w:abstractNum w:abstractNumId="22" w15:restartNumberingAfterBreak="0">
+  <w:abstractNum w:abstractNumId="24" w15:restartNumberingAfterBreak="0">
     <w:nsid w:val="72836320"/>
     <w:multiLevelType w:val="hybridMultilevel"/>
     <w:tmpl w:val="F918B9CE"/>
@@ -16136,7 +17347,7 @@
       </w:rPr>
     </w:lvl>
   </w:abstractNum>
-  <w:abstractNum w:abstractNumId="23" w15:restartNumberingAfterBreak="0">
+  <w:abstractNum w:abstractNumId="25" w15:restartNumberingAfterBreak="0">
     <w:nsid w:val="7760001C"/>
     <w:multiLevelType w:val="hybridMultilevel"/>
     <w:tmpl w:val="DA00D140"/>
@@ -16249,7 +17460,7 @@
       </w:rPr>
     </w:lvl>
   </w:abstractNum>
-  <w:abstractNum w:abstractNumId="24" w15:restartNumberingAfterBreak="0">
+  <w:abstractNum w:abstractNumId="26" w15:restartNumberingAfterBreak="0">
     <w:nsid w:val="79EA563B"/>
     <w:multiLevelType w:val="hybridMultilevel"/>
     <w:tmpl w:val="CA0EF45A"/>
@@ -16362,7 +17573,7 @@
       </w:rPr>
     </w:lvl>
   </w:abstractNum>
-  <w:abstractNum w:abstractNumId="25" w15:restartNumberingAfterBreak="0">
+  <w:abstractNum w:abstractNumId="27" w15:restartNumberingAfterBreak="0">
     <w:nsid w:val="7A944C52"/>
     <w:multiLevelType w:val="hybridMultilevel"/>
     <w:tmpl w:val="4DF8A4A6"/>
@@ -16475,7 +17686,7 @@
       </w:rPr>
     </w:lvl>
   </w:abstractNum>
-  <w:abstractNum w:abstractNumId="26" w15:restartNumberingAfterBreak="0">
+  <w:abstractNum w:abstractNumId="28" w15:restartNumberingAfterBreak="0">
     <w:nsid w:val="7BCE6F6B"/>
     <w:multiLevelType w:val="hybridMultilevel"/>
     <w:tmpl w:val="570004FA"/>
@@ -16561,7 +17772,7 @@
       </w:pPr>
     </w:lvl>
   </w:abstractNum>
-  <w:abstractNum w:abstractNumId="27" w15:restartNumberingAfterBreak="0">
+  <w:abstractNum w:abstractNumId="29" w15:restartNumberingAfterBreak="0">
     <w:nsid w:val="7E3A58EC"/>
     <w:multiLevelType w:val="hybridMultilevel"/>
     <w:tmpl w:val="22AEB536"/>
@@ -16648,88 +17859,94 @@
     </w:lvl>
   </w:abstractNum>
   <w:num w:numId="1" w16cid:durableId="1235050477">
-    <w:abstractNumId w:val="16"/>
+    <w:abstractNumId w:val="18"/>
   </w:num>
   <w:num w:numId="2" w16cid:durableId="2067873167">
+    <w:abstractNumId w:val="17"/>
+  </w:num>
+  <w:num w:numId="3" w16cid:durableId="115414037">
+    <w:abstractNumId w:val="22"/>
+  </w:num>
+  <w:num w:numId="4" w16cid:durableId="349600162">
+    <w:abstractNumId w:val="25"/>
+  </w:num>
+  <w:num w:numId="5" w16cid:durableId="1248734338">
+    <w:abstractNumId w:val="23"/>
+  </w:num>
+  <w:num w:numId="6" w16cid:durableId="2015641317">
+    <w:abstractNumId w:val="5"/>
+  </w:num>
+  <w:num w:numId="7" w16cid:durableId="231624906">
+    <w:abstractNumId w:val="19"/>
+  </w:num>
+  <w:num w:numId="8" w16cid:durableId="263420750">
+    <w:abstractNumId w:val="10"/>
+  </w:num>
+  <w:num w:numId="9" w16cid:durableId="2124612063">
+    <w:abstractNumId w:val="27"/>
+  </w:num>
+  <w:num w:numId="10" w16cid:durableId="159079337">
+    <w:abstractNumId w:val="20"/>
+  </w:num>
+  <w:num w:numId="11" w16cid:durableId="790443612">
+    <w:abstractNumId w:val="28"/>
+  </w:num>
+  <w:num w:numId="12" w16cid:durableId="942110906">
+    <w:abstractNumId w:val="6"/>
+  </w:num>
+  <w:num w:numId="13" w16cid:durableId="2012368028">
+    <w:abstractNumId w:val="9"/>
+  </w:num>
+  <w:num w:numId="14" w16cid:durableId="1862934538">
+    <w:abstractNumId w:val="13"/>
+  </w:num>
+  <w:num w:numId="15" w16cid:durableId="1813401887">
+    <w:abstractNumId w:val="29"/>
+  </w:num>
+  <w:num w:numId="16" w16cid:durableId="1095636371">
     <w:abstractNumId w:val="15"/>
   </w:num>
-  <w:num w:numId="3" w16cid:durableId="115414037">
-    <w:abstractNumId w:val="20"/>
+  <w:num w:numId="17" w16cid:durableId="319358279">
+    <w:abstractNumId w:val="3"/>
   </w:num>
-  <w:num w:numId="4" w16cid:durableId="349600162">
-    <w:abstractNumId w:val="23"/>
-  </w:num>
-  <w:num w:numId="5" w16cid:durableId="1248734338">
-    <w:abstractNumId w:val="21"/>
-  </w:num>
-  <w:num w:numId="6" w16cid:durableId="2015641317">
-    <w:abstractNumId w:val="4"/>
-  </w:num>
-  <w:num w:numId="7" w16cid:durableId="231624906">
-    <w:abstractNumId w:val="17"/>
-  </w:num>
-  <w:num w:numId="8" w16cid:durableId="263420750">
-    <w:abstractNumId w:val="9"/>
-  </w:num>
-  <w:num w:numId="9" w16cid:durableId="2124612063">
-    <w:abstractNumId w:val="25"/>
-  </w:num>
-  <w:num w:numId="10" w16cid:durableId="159079337">
-    <w:abstractNumId w:val="18"/>
-  </w:num>
-  <w:num w:numId="11" w16cid:durableId="790443612">
+  <w:num w:numId="18" w16cid:durableId="1069112579">
     <w:abstractNumId w:val="26"/>
   </w:num>
-  <w:num w:numId="12" w16cid:durableId="942110906">
-    <w:abstractNumId w:val="5"/>
-  </w:num>
-  <w:num w:numId="13" w16cid:durableId="2012368028">
-    <w:abstractNumId w:val="8"/>
-  </w:num>
-  <w:num w:numId="14" w16cid:durableId="1862934538">
-    <w:abstractNumId w:val="12"/>
-  </w:num>
-  <w:num w:numId="15" w16cid:durableId="1813401887">
-    <w:abstractNumId w:val="27"/>
-  </w:num>
-  <w:num w:numId="16" w16cid:durableId="1095636371">
-    <w:abstractNumId w:val="13"/>
-  </w:num>
-  <w:num w:numId="17" w16cid:durableId="319358279">
-    <w:abstractNumId w:val="2"/>
-  </w:num>
-  <w:num w:numId="18" w16cid:durableId="1069112579">
-    <w:abstractNumId w:val="24"/>
-  </w:num>
   <w:num w:numId="19" w16cid:durableId="1954433259">
-    <w:abstractNumId w:val="6"/>
+    <w:abstractNumId w:val="7"/>
   </w:num>
   <w:num w:numId="20" w16cid:durableId="518356576">
     <w:abstractNumId w:val="1"/>
   </w:num>
   <w:num w:numId="21" w16cid:durableId="210772246">
-    <w:abstractNumId w:val="22"/>
+    <w:abstractNumId w:val="24"/>
   </w:num>
   <w:num w:numId="22" w16cid:durableId="1576282488">
-    <w:abstractNumId w:val="7"/>
+    <w:abstractNumId w:val="8"/>
   </w:num>
   <w:num w:numId="23" w16cid:durableId="666174723">
-    <w:abstractNumId w:val="19"/>
+    <w:abstractNumId w:val="21"/>
   </w:num>
   <w:num w:numId="24" w16cid:durableId="1915116904">
-    <w:abstractNumId w:val="10"/>
+    <w:abstractNumId w:val="11"/>
   </w:num>
   <w:num w:numId="25" w16cid:durableId="1706367474">
     <w:abstractNumId w:val="0"/>
   </w:num>
   <w:num w:numId="26" w16cid:durableId="955864911">
-    <w:abstractNumId w:val="11"/>
+    <w:abstractNumId w:val="12"/>
   </w:num>
   <w:num w:numId="27" w16cid:durableId="920335174">
-    <w:abstractNumId w:val="14"/>
+    <w:abstractNumId w:val="16"/>
   </w:num>
   <w:num w:numId="28" w16cid:durableId="699822444">
-    <w:abstractNumId w:val="3"/>
+    <w:abstractNumId w:val="4"/>
+  </w:num>
+  <w:num w:numId="29" w16cid:durableId="76481322">
+    <w:abstractNumId w:val="2"/>
+  </w:num>
+  <w:num w:numId="30" w16cid:durableId="1867867080">
+    <w:abstractNumId w:val="14"/>
   </w:num>
 </w:numbering>
 </file>

</xml_diff>

<commit_message>
Working on Ch 4 Second revision
</commit_message>
<xml_diff>
--- a/Draft/6 Case Study.docx
+++ b/Draft/6 Case Study.docx
@@ -14411,6 +14411,32 @@
           <w:lang w:val="en-NZ"/>
         </w:rPr>
         <w:t>6.11 Conclusions</w:t>
+      </w:r>
+    </w:p>
+    <w:p>
+      <w:pPr>
+        <w:rPr>
+          <w:lang w:val="en-NZ"/>
+        </w:rPr>
+      </w:pPr>
+      <w:r>
+        <w:rPr>
+          <w:lang w:val="en-NZ"/>
+        </w:rPr>
+        <w:t>Acknowledge the observation objectives</w:t>
+      </w:r>
+    </w:p>
+    <w:p>
+      <w:pPr>
+        <w:rPr>
+          <w:lang w:val="en-NZ"/>
+        </w:rPr>
+      </w:pPr>
+      <w:r>
+        <w:rPr>
+          <w:lang w:val="en-NZ"/>
+        </w:rPr>
+        <w:t>Acknowledge the scenarios</w:t>
       </w:r>
     </w:p>
     <w:p>

</xml_diff>

<commit_message>
finished ch6, pending conclusions storaged in win pc
</commit_message>
<xml_diff>
--- a/Draft/6 Case Study.docx
+++ b/Draft/6 Case Study.docx
@@ -73,31 +73,34 @@
         <w:rPr>
           <w:lang w:val="en-NZ"/>
         </w:rPr>
-        <w:t xml:space="preserve">Sections 6.2 </w:t>
-      </w:r>
-      <w:r>
-        <w:rPr>
-          <w:lang w:val="en-NZ"/>
-        </w:rPr>
-        <w:t>will describe in detail the protocol followed for the observation proccess while s</w:t>
-      </w:r>
-      <w:r>
-        <w:rPr>
-          <w:lang w:val="en-NZ"/>
-        </w:rPr>
-        <w:t>ections 6.</w:t>
-      </w:r>
-      <w:r>
-        <w:rPr>
-          <w:lang w:val="en-NZ"/>
-        </w:rPr>
-        <w:t>3</w:t>
-      </w:r>
-      <w:r>
-        <w:rPr>
-          <w:lang w:val="en-NZ"/>
-        </w:rPr>
-        <w:t xml:space="preserve"> to 6.</w:t>
+        <w:t>Sections 6.2 will describe in detail the protocol followed for the observation proccess while sections 6.3 to 6.</w:t>
+      </w:r>
+      <w:r>
+        <w:rPr>
+          <w:lang w:val="en-NZ"/>
+        </w:rPr>
+        <w:t>6</w:t>
+      </w:r>
+      <w:r>
+        <w:rPr>
+          <w:lang w:val="en-NZ"/>
+        </w:rPr>
+        <w:t xml:space="preserve"> will present the main content of the case study, recounting the development of the course through 20 weeks of observations. The structure of the case allowed to organize the data in four major milestones, first described within the point of view of the course, followed by the intervention done with WorkshopAR, allowing for preliminary analysis and reflection for each milestone.</w:t>
+      </w:r>
+    </w:p>
+    <w:p>
+      <w:pPr>
+        <w:pStyle w:val="Normal"/>
+        <w:jc w:val="both"/>
+        <w:rPr>
+          <w:lang w:val="en-NZ"/>
+        </w:rPr>
+      </w:pPr>
+      <w:r>
+        <w:rPr>
+          <w:lang w:val="en-NZ"/>
+        </w:rPr>
+        <w:t>Finally, section 6.</w:t>
       </w:r>
       <w:r>
         <w:rPr>
@@ -109,7 +112,45 @@
         <w:rPr>
           <w:lang w:val="en-NZ"/>
         </w:rPr>
-        <w:t xml:space="preserve"> will present the main content of the case study, recounting the development of the course through 20 weeks of observations. The structure of the case allowed to organize the data in four major milestones, first described within the point of view of the course, followed by the intervention done with WorkshopAR, allowing for preliminary analysis and reflection for each milestone.</w:t>
+        <w:t xml:space="preserve"> and 6.</w:t>
+      </w:r>
+      <w:r>
+        <w:rPr>
+          <w:lang w:val="en-NZ"/>
+        </w:rPr>
+        <w:t>8</w:t>
+      </w:r>
+      <w:r>
+        <w:rPr>
+          <w:lang w:val="en-NZ"/>
+        </w:rPr>
+        <w:t xml:space="preserve"> will offer a description and analysis of the overall experience from the point of view of the students and the teaching staff based on the data obtained from the complementary research instruments such as interviews and questionnaires. Followed by the final conclusions stated in section 6.</w:t>
+      </w:r>
+      <w:r>
+        <w:rPr>
+          <w:lang w:val="en-NZ"/>
+        </w:rPr>
+        <w:t>9</w:t>
+      </w:r>
+      <w:r>
+        <w:rPr>
+          <w:lang w:val="en-NZ"/>
+        </w:rPr>
+        <w:t>.</w:t>
+      </w:r>
+    </w:p>
+    <w:p>
+      <w:pPr>
+        <w:pStyle w:val="Heading1"/>
+        <w:rPr>
+          <w:lang w:val="en-NZ"/>
+        </w:rPr>
+      </w:pPr>
+      <w:r>
+        <w:rPr>
+          <w:lang w:val="en-NZ"/>
+        </w:rPr>
+        <w:t>6.1 Description and Design of ENBU 79X/89X Industry Project</w:t>
       </w:r>
     </w:p>
     <w:p>
@@ -124,57 +165,7 @@
         <w:rPr>
           <w:lang w:val="en-NZ"/>
         </w:rPr>
-        <w:t>Finally, section 6.</w:t>
-      </w:r>
-      <w:r>
-        <w:rPr>
-          <w:lang w:val="en-NZ"/>
-        </w:rPr>
-        <w:t>8</w:t>
-      </w:r>
-      <w:r>
-        <w:rPr>
-          <w:lang w:val="en-NZ"/>
-        </w:rPr>
-        <w:t xml:space="preserve"> and 6.</w:t>
-      </w:r>
-      <w:r>
-        <w:rPr>
-          <w:lang w:val="en-NZ"/>
-        </w:rPr>
-        <w:t>9</w:t>
-      </w:r>
-      <w:r>
-        <w:rPr>
-          <w:lang w:val="en-NZ"/>
-        </w:rPr>
-        <w:t xml:space="preserve"> will offer a description and analysis of the overall experience from the point of view of the students and the teaching staff based on the data obtained from the complementary research instruments such as interviews and questionnaires. Followed by the final conclusions stated in section 6.1</w:t>
-      </w:r>
-      <w:r>
-        <w:rPr>
-          <w:lang w:val="en-NZ"/>
-        </w:rPr>
-        <w:t>0</w:t>
-      </w:r>
-      <w:r>
-        <w:rPr>
-          <w:lang w:val="en-NZ"/>
-        </w:rPr>
-        <w:t>.</w:t>
-      </w:r>
-    </w:p>
-    <w:p>
-      <w:pPr>
-        <w:pStyle w:val="Heading1"/>
-        <w:rPr>
-          <w:lang w:val="en-NZ"/>
-        </w:rPr>
-      </w:pPr>
-      <w:r>
-        <w:rPr>
-          <w:lang w:val="en-NZ"/>
-        </w:rPr>
-        <w:t>6.1 Description and Design of ENBU 79X/89X Industry Project</w:t>
+        <w:t>Industry Project is a last year course offered by the school of Built Environments at the Auckland University of Technology. The course offers students of the Architectural Design, Construction Engineering, Construction Management and Quantity Surveillance programs the opportunity to experience a multidisciplinary project that emulates the procedures and circumstances often found in the construction industry.</w:t>
       </w:r>
     </w:p>
     <w:p>
@@ -189,7 +180,7 @@
         <w:rPr>
           <w:lang w:val="en-NZ"/>
         </w:rPr>
-        <w:t>Industry Project is a last year course offered by the school of Built Environments at the Auckland University of Technology. The course offers students of the Architectural Design, Construction Engineering, Construction Management and Quantity Surveillance programs the opportunity to experience a multidisciplinary project that emulates the procedures and circumstances often found in the construction industry.</w:t>
+        <w:t>Simulation is one of the key components behind the design of the course. Acting as a capstone course for several of the programs that conforms the school of Built Environments, the main goal is to expose the students to many of the scenarios and procedures commonly found in a construction project, while emulating several of the roles and tasks that need to be present in an architectural design or construction management firm.</w:t>
       </w:r>
     </w:p>
     <w:p>
@@ -204,34 +195,7 @@
         <w:rPr>
           <w:lang w:val="en-NZ"/>
         </w:rPr>
-        <w:t>Simulation is one of the key components behind the design of the course. Acting as a capstone course for several of the programs that conforms the school of Built Environments, the main goal is to expose the students to many of the scenarios and procedures commonly found in a construction project, while emulating several of the roles and tasks that need to be present in an architectural design or construction management firm.</w:t>
-      </w:r>
-    </w:p>
-    <w:p>
-      <w:pPr>
-        <w:pStyle w:val="Normal"/>
-        <w:jc w:val="both"/>
-        <w:rPr>
-          <w:lang w:val="en-NZ"/>
-        </w:rPr>
-      </w:pPr>
-      <w:r>
-        <w:rPr>
-          <w:lang w:val="en-NZ"/>
-        </w:rPr>
-        <w:t xml:space="preserve">The course covers little to no material, relying instead on the information </w:t>
-      </w:r>
-      <w:r>
-        <w:rPr>
-          <w:lang w:val="en-NZ"/>
-        </w:rPr>
-        <w:t>presented</w:t>
-      </w:r>
-      <w:r>
-        <w:rPr>
-          <w:lang w:val="en-NZ"/>
-        </w:rPr>
-        <w:t xml:space="preserve"> in previous years. The learning goals focus more on providing a hands-on experience through challenges and scenarios that could be found in real life projects, promoting the development of the skills necessary for the design, communication and planification of a solution, as stated by the course goals:</w:t>
+        <w:t>The course covers little to no material, relying instead on the information presented in previous years. The learning goals focus more on providing a hands-on experience through challenges and scenarios that could be found in real life projects, promoting the development of the skills necessary for the design, communication and planification of a solution, as stated by the course goals:</w:t>
       </w:r>
     </w:p>
     <w:p>
@@ -678,19 +642,7 @@
         <w:rPr>
           <w:lang w:val="en-NZ"/>
         </w:rPr>
-        <w:t>6.</w:t>
-      </w:r>
-      <w:r>
-        <w:rPr>
-          <w:lang w:val="en-NZ"/>
-        </w:rPr>
-        <w:t>2</w:t>
-      </w:r>
-      <w:r>
-        <w:rPr>
-          <w:lang w:val="en-NZ"/>
-        </w:rPr>
-        <w:t xml:space="preserve"> Protocol</w:t>
+        <w:t>6.2 Protocol</w:t>
       </w:r>
     </w:p>
     <w:p>
@@ -719,19 +671,7 @@
         <w:rPr>
           <w:lang w:val="en-NZ"/>
         </w:rPr>
-        <w:t>6.</w:t>
-      </w:r>
-      <w:r>
-        <w:rPr>
-          <w:lang w:val="en-NZ"/>
-        </w:rPr>
-        <w:t>2</w:t>
-      </w:r>
-      <w:r>
-        <w:rPr>
-          <w:lang w:val="en-NZ"/>
-        </w:rPr>
-        <w:t>.1 Physical Documentation</w:t>
+        <w:t>6.2.1 Physical Documentation</w:t>
       </w:r>
     </w:p>
     <w:p>
@@ -790,19 +730,7 @@
         <w:rPr>
           <w:lang w:val="en-NZ"/>
         </w:rPr>
-        <w:t>6.</w:t>
-      </w:r>
-      <w:r>
-        <w:rPr>
-          <w:lang w:val="en-NZ"/>
-        </w:rPr>
-        <w:t>2</w:t>
-      </w:r>
-      <w:r>
-        <w:rPr>
-          <w:lang w:val="en-NZ"/>
-        </w:rPr>
-        <w:t>.2 Classroom Observations</w:t>
+        <w:t>6.2.2 Classroom Observations</w:t>
       </w:r>
     </w:p>
     <w:p>
@@ -1209,19 +1137,7 @@
         <w:rPr>
           <w:lang w:val="en-NZ"/>
         </w:rPr>
-        <w:t>6.</w:t>
-      </w:r>
-      <w:r>
-        <w:rPr>
-          <w:lang w:val="en-NZ"/>
-        </w:rPr>
-        <w:t>2</w:t>
-      </w:r>
-      <w:r>
-        <w:rPr>
-          <w:lang w:val="en-NZ"/>
-        </w:rPr>
-        <w:t>.3 Unstructured Interviews</w:t>
+        <w:t>6.2.3 Unstructured Interviews</w:t>
       </w:r>
     </w:p>
     <w:p>
@@ -1310,19 +1226,7 @@
         <w:rPr>
           <w:lang w:val="en-NZ"/>
         </w:rPr>
-        <w:t>6.</w:t>
-      </w:r>
-      <w:r>
-        <w:rPr>
-          <w:lang w:val="en-NZ"/>
-        </w:rPr>
-        <w:t>3</w:t>
-      </w:r>
-      <w:r>
-        <w:rPr>
-          <w:lang w:val="en-NZ"/>
-        </w:rPr>
-        <w:t xml:space="preserve"> Weeks 1 to 4: Team Consolidation</w:t>
+        <w:t>6.3 Weeks 1 to 4: Team Consolidation</w:t>
       </w:r>
     </w:p>
     <w:p>
@@ -1366,19 +1270,7 @@
         <w:rPr>
           <w:lang w:val="en-NZ"/>
         </w:rPr>
-        <w:t>6.</w:t>
-      </w:r>
-      <w:r>
-        <w:rPr>
-          <w:lang w:val="en-NZ"/>
-        </w:rPr>
-        <w:t>3</w:t>
-      </w:r>
-      <w:r>
-        <w:rPr>
-          <w:lang w:val="en-NZ"/>
-        </w:rPr>
-        <w:t>.1 General Observations</w:t>
+        <w:t>6.3.1 General Observations</w:t>
       </w:r>
     </w:p>
     <w:p>
@@ -1393,19 +1285,7 @@
         <w:rPr>
           <w:lang w:val="en-NZ"/>
         </w:rPr>
-        <w:t>Classroom sessions took place on Friday’s morning across two big arrangeable lecture rooms, needed to accommodate the close to eighty students enrolled. The space provided several tables that could be moved, separated, or merged to create different configurations, ideal for the dynamic groupwork that the course was relying the most on. The rooms also enabled the constant flow of people and activities present in one session, as described in section 6.</w:t>
-      </w:r>
-      <w:r>
-        <w:rPr>
-          <w:lang w:val="en-NZ"/>
-        </w:rPr>
-        <w:t>2</w:t>
-      </w:r>
-      <w:r>
-        <w:rPr>
-          <w:lang w:val="en-NZ"/>
-        </w:rPr>
-        <w:t>, and provided ample space for each group to work comfortable using their personal equipment.</w:t>
+        <w:t>Classroom sessions took place on Friday’s morning across two big arrangeable lecture rooms, needed to accommodate the close to eighty students enrolled. The space provided several tables that could be moved, separated, or merged to create different configurations, ideal for the dynamic groupwork that the course was relying the most on. The rooms also enabled the constant flow of people and activities present in one session, as described in section 6.2, and provided ample space for each group to work comfortable using their personal equipment.</w:t>
       </w:r>
     </w:p>
     <w:p>
@@ -1609,6 +1489,7 @@
             <w:pPr>
               <w:pStyle w:val="Normal"/>
               <w:widowControl/>
+              <w:suppressAutoHyphens w:val="true"/>
               <w:spacing w:lineRule="auto" w:line="240" w:before="0" w:after="0"/>
               <w:jc w:val="center"/>
               <w:rPr>
@@ -1641,6 +1522,7 @@
             <w:pPr>
               <w:pStyle w:val="Normal"/>
               <w:widowControl/>
+              <w:suppressAutoHyphens w:val="true"/>
               <w:spacing w:lineRule="auto" w:line="240" w:before="0" w:after="0"/>
               <w:jc w:val="center"/>
               <w:cnfStyle w:val="100000000000" w:firstRow="1" w:lastRow="0" w:firstColumn="0" w:lastColumn="0" w:oddVBand="0" w:evenVBand="0" w:oddHBand="0" w:evenHBand="0" w:firstRowFirstColumn="0" w:firstRowLastColumn="0" w:lastRowFirstColumn="0" w:lastRowLastColumn="0"/>
@@ -1680,6 +1562,7 @@
             <w:pPr>
               <w:pStyle w:val="Normal"/>
               <w:widowControl/>
+              <w:suppressAutoHyphens w:val="true"/>
               <w:spacing w:lineRule="auto" w:line="240" w:before="0" w:after="0"/>
               <w:jc w:val="center"/>
               <w:rPr>
@@ -1706,6 +1589,7 @@
             <w:pPr>
               <w:pStyle w:val="Normal"/>
               <w:widowControl/>
+              <w:suppressAutoHyphens w:val="true"/>
               <w:spacing w:lineRule="auto" w:line="240" w:before="0" w:after="0"/>
               <w:jc w:val="center"/>
               <w:rPr>
@@ -1732,6 +1616,7 @@
             <w:pPr>
               <w:pStyle w:val="Normal"/>
               <w:widowControl/>
+              <w:suppressAutoHyphens w:val="true"/>
               <w:spacing w:lineRule="auto" w:line="240" w:before="0" w:after="0"/>
               <w:jc w:val="center"/>
               <w:rPr>
@@ -1758,6 +1643,7 @@
             <w:pPr>
               <w:pStyle w:val="Normal"/>
               <w:widowControl/>
+              <w:suppressAutoHyphens w:val="true"/>
               <w:spacing w:lineRule="auto" w:line="240" w:before="0" w:after="0"/>
               <w:jc w:val="center"/>
               <w:rPr>
@@ -1790,6 +1676,7 @@
             <w:pPr>
               <w:pStyle w:val="Normal"/>
               <w:widowControl/>
+              <w:suppressAutoHyphens w:val="true"/>
               <w:spacing w:lineRule="auto" w:line="240" w:before="0" w:after="0"/>
               <w:jc w:val="center"/>
               <w:cnfStyle w:val="000000100000" w:firstRow="0" w:lastRow="0" w:firstColumn="0" w:lastColumn="0" w:oddVBand="0" w:evenVBand="0" w:oddHBand="1" w:evenHBand="0" w:firstRowFirstColumn="0" w:firstRowLastColumn="0" w:lastRowFirstColumn="0" w:lastRowLastColumn="0"/>
@@ -1815,6 +1702,7 @@
             <w:pPr>
               <w:pStyle w:val="Normal"/>
               <w:widowControl/>
+              <w:suppressAutoHyphens w:val="true"/>
               <w:spacing w:lineRule="auto" w:line="240" w:before="0" w:after="0"/>
               <w:jc w:val="center"/>
               <w:cnfStyle w:val="000000100000" w:firstRow="0" w:lastRow="0" w:firstColumn="0" w:lastColumn="0" w:oddVBand="0" w:evenVBand="0" w:oddHBand="1" w:evenHBand="0" w:firstRowFirstColumn="0" w:firstRowLastColumn="0" w:lastRowFirstColumn="0" w:lastRowLastColumn="0"/>
@@ -1840,6 +1728,7 @@
             <w:pPr>
               <w:pStyle w:val="Normal"/>
               <w:widowControl/>
+              <w:suppressAutoHyphens w:val="true"/>
               <w:spacing w:lineRule="auto" w:line="240" w:before="0" w:after="0"/>
               <w:jc w:val="center"/>
               <w:cnfStyle w:val="000000100000" w:firstRow="0" w:lastRow="0" w:firstColumn="0" w:lastColumn="0" w:oddVBand="0" w:evenVBand="0" w:oddHBand="1" w:evenHBand="0" w:firstRowFirstColumn="0" w:firstRowLastColumn="0" w:lastRowFirstColumn="0" w:lastRowLastColumn="0"/>
@@ -1865,6 +1754,7 @@
             <w:pPr>
               <w:pStyle w:val="Normal"/>
               <w:widowControl/>
+              <w:suppressAutoHyphens w:val="true"/>
               <w:spacing w:lineRule="auto" w:line="240" w:before="0" w:after="0"/>
               <w:jc w:val="center"/>
               <w:cnfStyle w:val="000000100000" w:firstRow="0" w:lastRow="0" w:firstColumn="0" w:lastColumn="0" w:oddVBand="0" w:evenVBand="0" w:oddHBand="1" w:evenHBand="0" w:firstRowFirstColumn="0" w:firstRowLastColumn="0" w:lastRowFirstColumn="0" w:lastRowLastColumn="0"/>
@@ -2237,19 +2127,7 @@
         <w:rPr>
           <w:lang w:val="en-NZ"/>
         </w:rPr>
-        <w:t>6.</w:t>
-      </w:r>
-      <w:r>
-        <w:rPr>
-          <w:lang w:val="en-NZ"/>
-        </w:rPr>
-        <w:t>3</w:t>
-      </w:r>
-      <w:r>
-        <w:rPr>
-          <w:lang w:val="en-NZ"/>
-        </w:rPr>
-        <w:t>.1.1 First Bonding Exercise</w:t>
+        <w:t>6.3.1.1 First Bonding Exercise</w:t>
       </w:r>
     </w:p>
     <w:p>
@@ -2298,19 +2176,7 @@
         <w:rPr>
           <w:lang w:val="en-NZ"/>
         </w:rPr>
-        <w:t>Identify possible option</w:t>
-      </w:r>
-      <w:r>
-        <w:rPr>
-          <w:lang w:val="en-NZ"/>
-        </w:rPr>
-        <w:t>s</w:t>
-      </w:r>
-      <w:r>
-        <w:rPr>
-          <w:lang w:val="en-NZ"/>
-        </w:rPr>
-        <w:t xml:space="preserve"> to solve a problem.</w:t>
+        <w:t>Identify possible options to solve a problem.</w:t>
       </w:r>
     </w:p>
     <w:p>
@@ -2543,19 +2409,7 @@
         <w:rPr>
           <w:lang w:val="en-NZ"/>
         </w:rPr>
-        <w:t>6.</w:t>
-      </w:r>
-      <w:r>
-        <w:rPr>
-          <w:lang w:val="en-NZ"/>
-        </w:rPr>
-        <w:t>3</w:t>
-      </w:r>
-      <w:r>
-        <w:rPr>
-          <w:lang w:val="en-NZ"/>
-        </w:rPr>
-        <w:t>.1.2 QA Round Session</w:t>
+        <w:t>6.3.1.2 QA Round Session</w:t>
       </w:r>
     </w:p>
     <w:p>
@@ -2775,7 +2629,19 @@
         <w:rPr>
           <w:lang w:val="en-NZ"/>
         </w:rPr>
-        <w:t>6.4.2 Intervention with WorkshopAR</w:t>
+        <w:t>6.</w:t>
+      </w:r>
+      <w:r>
+        <w:rPr>
+          <w:lang w:val="en-NZ"/>
+        </w:rPr>
+        <w:t>3</w:t>
+      </w:r>
+      <w:r>
+        <w:rPr>
+          <w:lang w:val="en-NZ"/>
+        </w:rPr>
+        <w:t>.2 Intervention with WorkshopAR</w:t>
       </w:r>
     </w:p>
     <w:p>
@@ -2847,7 +2713,19 @@
         <w:rPr>
           <w:lang w:val="en-NZ"/>
         </w:rPr>
-        <w:t>6.4.2.1 Consolidation Stage</w:t>
+        <w:t>6.</w:t>
+      </w:r>
+      <w:r>
+        <w:rPr>
+          <w:lang w:val="en-NZ"/>
+        </w:rPr>
+        <w:t>3</w:t>
+      </w:r>
+      <w:r>
+        <w:rPr>
+          <w:lang w:val="en-NZ"/>
+        </w:rPr>
+        <w:t>.2.1 Consolidation Stage</w:t>
       </w:r>
     </w:p>
     <w:p>
@@ -2951,7 +2829,19 @@
         <w:rPr>
           <w:lang w:val="en-NZ"/>
         </w:rPr>
-        <w:t>6.4.2.2 First Open Work Session</w:t>
+        <w:t>6.</w:t>
+      </w:r>
+      <w:r>
+        <w:rPr>
+          <w:lang w:val="en-NZ"/>
+        </w:rPr>
+        <w:t>3</w:t>
+      </w:r>
+      <w:r>
+        <w:rPr>
+          <w:lang w:val="en-NZ"/>
+        </w:rPr>
+        <w:t>.2.2 First Open Work Session</w:t>
       </w:r>
     </w:p>
     <w:p>
@@ -2966,22 +2856,13 @@
         <w:rPr>
           <w:lang w:val="en-NZ"/>
         </w:rPr>
-        <w:t>Towards the fourth week of work, it had become clear that the original methodology proposed for the observations had to be altered. The observation plan stated that students who wanted to participate in the study could contact the researcher to schedule a work session, they could have access to a space for the group and take all the time they needed for the activity. No group was taking on the offer, basically because no group was working together outside of the classroom.</w:t>
-      </w:r>
-    </w:p>
-    <w:p>
-      <w:pPr>
-        <w:pStyle w:val="Normal"/>
-        <w:jc w:val="both"/>
-        <w:rPr>
-          <w:lang w:val="en-NZ"/>
-        </w:rPr>
-      </w:pPr>
-      <w:r>
-        <w:rPr>
-          <w:lang w:val="en-NZ"/>
-        </w:rPr>
-        <w:t>Each weekly session had at minimum one hour of open work for the groups, with some weeks being dedicated completely to open sessions. Students quickly found that they could gather in the classroom, organise the work needed for the week and assign individual tasks to be completed outside the classroom, relying on communication tools for quick questions and catch-ups. Since no group was working outside the classroom, the observations using WorkshopAR had to take place during the weekly sessions, which forced some changes to the protocol:</w:t>
+        <w:t>Regarding the weekly work of the course, s</w:t>
+      </w:r>
+      <w:r>
+        <w:rPr>
+          <w:lang w:val="en-NZ"/>
+        </w:rPr>
+        <w:t>tudents quickly found that they could gather in the classroom, organise the work needed for the week and assign individual tasks to be completed outside the classroom, relying on communication tools for quick questions and catch-ups. Since no group was working outside the classroom, the observations using WorkshopAR had to take place during the weekly sessions, which forced some changes to the protocol:</w:t>
       </w:r>
     </w:p>
     <w:p>
@@ -3212,7 +3093,19 @@
         <w:rPr>
           <w:lang w:val="en-NZ"/>
         </w:rPr>
-        <w:t>WorkshopAR was deployed in two different smartphone and given to the students, which meant that in practice only two students were interacting with the software at the same time. All the students had their own laptops and were working on them when not directly interacting in the observation activity.</w:t>
+        <w:t>WorkshopAR was deployed in two different smartphone</w:t>
+      </w:r>
+      <w:r>
+        <w:rPr>
+          <w:lang w:val="en-NZ"/>
+        </w:rPr>
+        <w:t>s</w:t>
+      </w:r>
+      <w:r>
+        <w:rPr>
+          <w:lang w:val="en-NZ"/>
+        </w:rPr>
+        <w:t xml:space="preserve"> and given to the students, which meant that in practice only two students were interacting with the software at the same time. All the students had their own laptops and were working on them when not directly interacting in the observation activity.</w:t>
       </w:r>
     </w:p>
     <w:p>
@@ -3350,306 +3243,315 @@
       </w:r>
       <w:r>
         <w:rPr>
+          <w:rFonts w:cs="Calibri" w:ascii="Calibri" w:hAnsi="Calibri"/>
+          <w:sz w:val="24"/>
+          <w:szCs w:val="24"/>
+          <w:lang w:val="en-NZ"/>
+        </w:rPr>
+        <w:fldChar w:fldCharType="begin"/>
+      </w:r>
+      <w:r>
+        <w:rPr>
+          <w:sz w:val="24"/>
+          <w:szCs w:val="24"/>
+          <w:rFonts w:cs="Calibri" w:ascii="Calibri" w:hAnsi="Calibri"/>
+          <w:lang w:val="en-NZ"/>
+        </w:rPr>
+        <w:instrText xml:space="preserve"> SEQ Figure \* ARABIC </w:instrText>
+      </w:r>
+      <w:r>
+        <w:rPr>
+          <w:sz w:val="24"/>
+          <w:szCs w:val="24"/>
+          <w:rFonts w:cs="Calibri" w:ascii="Calibri" w:hAnsi="Calibri"/>
+          <w:lang w:val="en-NZ"/>
+        </w:rPr>
+        <w:fldChar w:fldCharType="separate"/>
+      </w:r>
+      <w:r>
+        <w:rPr>
+          <w:sz w:val="24"/>
+          <w:szCs w:val="24"/>
+          <w:rFonts w:cs="Calibri" w:ascii="Calibri" w:hAnsi="Calibri"/>
+          <w:lang w:val="en-NZ"/>
+        </w:rPr>
+        <w:t>4</w:t>
+      </w:r>
+      <w:r>
+        <w:rPr>
+          <w:sz w:val="24"/>
+          <w:szCs w:val="24"/>
+          <w:rFonts w:cs="Calibri" w:ascii="Calibri" w:hAnsi="Calibri"/>
+          <w:lang w:val="en-NZ"/>
+        </w:rPr>
+        <w:fldChar w:fldCharType="end"/>
+      </w:r>
+      <w:r>
+        <w:rPr>
           <w:rFonts w:cs="Calibri" w:ascii="Calibri" w:hAnsi="Calibri" w:asciiTheme="majorHAnsi" w:cstheme="majorHAnsi" w:hAnsiTheme="majorHAnsi"/>
           <w:sz w:val="24"/>
           <w:szCs w:val="24"/>
           <w:lang w:val="en-NZ"/>
         </w:rPr>
-        <w:fldChar w:fldCharType="begin"/>
-      </w:r>
-      <w:r>
-        <w:rPr>
-          <w:sz w:val="24"/>
-          <w:szCs w:val="24"/>
-          <w:rFonts w:cs="Calibri" w:ascii="Calibri" w:hAnsi="Calibri"/>
-          <w:lang w:val="en-NZ"/>
-        </w:rPr>
-        <w:instrText xml:space="preserve"> SEQ Figure \* ARABIC </w:instrText>
-      </w:r>
-      <w:r>
-        <w:rPr>
-          <w:sz w:val="24"/>
-          <w:szCs w:val="24"/>
-          <w:rFonts w:cs="Calibri" w:ascii="Calibri" w:hAnsi="Calibri"/>
-          <w:lang w:val="en-NZ"/>
-        </w:rPr>
-        <w:fldChar w:fldCharType="separate"/>
-      </w:r>
-      <w:r>
-        <w:rPr>
-          <w:sz w:val="24"/>
-          <w:szCs w:val="24"/>
-          <w:rFonts w:cs="Calibri" w:ascii="Calibri" w:hAnsi="Calibri"/>
+        <w:t xml:space="preserve"> Initial Space for Observations of WorkshopAR</w:t>
+      </w:r>
+    </w:p>
+    <w:p>
+      <w:pPr>
+        <w:pStyle w:val="Normal"/>
+        <w:jc w:val="both"/>
+        <w:rPr>
+          <w:lang w:val="en-NZ"/>
+        </w:rPr>
+      </w:pPr>
+      <w:r>
+        <w:rPr>
+          <w:lang w:val="en-NZ"/>
+        </w:rPr>
+        <w:t>While repeating the creation of the Digital Room, the student commented that the CM should be the one in charge of the configuration process and handed the mobile to him so he could do it. The situation prompted an intervening question: Should the same person always be the host? How would they organise the group to create and configure the Digital Room?</w:t>
+      </w:r>
+    </w:p>
+    <w:p>
+      <w:pPr>
+        <w:pStyle w:val="Normal"/>
+        <w:jc w:val="both"/>
+        <w:rPr>
+          <w:lang w:val="en-NZ"/>
+        </w:rPr>
+      </w:pPr>
+      <w:r>
+        <w:rPr>
+          <w:lang w:val="en-NZ"/>
+        </w:rPr>
+        <w:t>First, they proposed that it would make more sense if someone had that fixed responsibility but found little reasons to keep that idea when following the discussion further. They argued that “making” the Digital Room should be a fast process and that the first person to arrive to the classroom should do it. This approach was easier and would make the configuration time needed for the use of WorkshopAR shorter.</w:t>
+      </w:r>
+    </w:p>
+    <w:p>
+      <w:pPr>
+        <w:pStyle w:val="Normal"/>
+        <w:jc w:val="both"/>
+        <w:rPr>
+          <w:lang w:val="en-NZ"/>
+        </w:rPr>
+      </w:pPr>
+      <w:r>
+        <w:rPr>
+          <w:lang w:val="en-NZ"/>
+        </w:rPr>
+        <w:t>The interactions with the User Anchors also promoted some discussions about the use of the tool in the activities planned for the session. The students liked the idea of the User Anchor, they specially found amusing the “goofy” look that the gaze gave to the whole visual, and suggested more elements of customization beside colour, like text, shapes, or animations. They also mentioned that the functionality fitted better the first two weeks of the course, when it was more common to need information about someone, like a name or a role, and was easier to fit the playfulness that the feature was promoting. For the work that the group was doing now, the feature was rather useless, since they already knew each other and had other means of getting in contact if needed.</w:t>
+      </w:r>
+    </w:p>
+    <w:p>
+      <w:pPr>
+        <w:pStyle w:val="Normal"/>
+        <w:jc w:val="both"/>
+        <w:rPr>
+          <w:lang w:val="en-NZ"/>
+        </w:rPr>
+      </w:pPr>
+      <w:r>
+        <w:rPr>
+          <w:lang w:val="en-NZ"/>
+        </w:rPr>
+        <w:t>Other two important observations to mention that were not necessarily linked to the use of WorkshopAR:</w:t>
+      </w:r>
+    </w:p>
+    <w:p>
+      <w:pPr>
+        <w:pStyle w:val="Normal"/>
+        <w:jc w:val="both"/>
+        <w:rPr>
+          <w:lang w:val="en-NZ"/>
+        </w:rPr>
+      </w:pPr>
+      <w:r>
+        <w:rPr>
+          <w:lang w:val="en-NZ"/>
+        </w:rPr>
+        <w:t>First, when setting themselves up to start working, the CE noticed that, based on the goal they had stablished of working on the poster, he had a lot of holes in his understanding of what he should be doing for the activity. The group tried to use the information found in the LMS to clarify the situation, but it was not enough, and a TA had to intervene.</w:t>
+      </w:r>
+    </w:p>
+    <w:p>
+      <w:pPr>
+        <w:pStyle w:val="Normal"/>
+        <w:jc w:val="both"/>
+        <w:rPr>
+          <w:lang w:val="en-NZ"/>
+        </w:rPr>
+      </w:pPr>
+      <w:r>
+        <w:rPr>
+          <w:lang w:val="en-NZ"/>
+        </w:rPr>
+        <w:t>The disadvantages of taking the group from the main room for the observations were piling up. It was necessary to search for a TA and ask her to check on the group for the CE to be able to keep working, and then the group had to scramble from the place because a workshop had started and they had not heard the new instruction.</w:t>
+      </w:r>
+    </w:p>
+    <w:p>
+      <w:pPr>
+        <w:pStyle w:val="Normal"/>
+        <w:jc w:val="both"/>
+        <w:rPr>
+          <w:lang w:val="en-NZ"/>
+        </w:rPr>
+      </w:pPr>
+      <w:r>
+        <w:rPr>
+          <w:lang w:val="en-NZ"/>
+        </w:rPr>
+        <w:t>The second observation was that the work done by the students was very individual in nature. They were working together physically, often sharing comments and information, but in the end each one concentrated in their own work. The CE needed to clarify his doubts about the same poster all the others were working on, but because none of his teammates shared his role, they did not have a clear idea either of what the CE should be doing.</w:t>
+      </w:r>
+    </w:p>
+    <w:p>
+      <w:pPr>
+        <w:pStyle w:val="Heading3"/>
+        <w:rPr>
+          <w:lang w:val="en-NZ"/>
+        </w:rPr>
+      </w:pPr>
+      <w:r>
+        <w:rPr>
+          <w:lang w:val="en-NZ"/>
+        </w:rPr>
+        <w:t>6.</w:t>
+      </w:r>
+      <w:r>
+        <w:rPr>
+          <w:lang w:val="en-NZ"/>
+        </w:rPr>
+        <w:t>3</w:t>
+      </w:r>
+      <w:r>
+        <w:rPr>
+          <w:lang w:val="en-NZ"/>
+        </w:rPr>
+        <w:t>.3 Preliminary Analysis</w:t>
+      </w:r>
+    </w:p>
+    <w:p>
+      <w:pPr>
+        <w:pStyle w:val="Normal"/>
+        <w:jc w:val="both"/>
+        <w:rPr>
+          <w:lang w:val="en-NZ"/>
+        </w:rPr>
+      </w:pPr>
+      <w:r>
+        <w:rPr>
+          <w:lang w:val="en-NZ"/>
+        </w:rPr>
+        <w:t>The first four weeks of work were a period of contextualisation and adjustments. Students were prepared to tackle a course that was known to be complex, and their first concern was to untangle the complexity and start working on the project as soon as possible.</w:t>
+      </w:r>
+    </w:p>
+    <w:p>
+      <w:pPr>
+        <w:pStyle w:val="Normal"/>
+        <w:jc w:val="both"/>
+        <w:rPr>
+          <w:lang w:val="en-NZ"/>
+        </w:rPr>
+      </w:pPr>
+      <w:r>
+        <w:rPr>
+          <w:lang w:val="en-NZ"/>
+        </w:rPr>
+        <w:t>The first issue that the students found, one that the teaching staff had to quickly acknowledge, was a limited access to information. The LMS was obscuring the requirements of the project in between links and tons of external material, and the teaching staff had to explain and repeat several times the same information. Activities like the QA sessions and the constant access to the TA staff helped the students to clarify any doubts, but those were resources that only the groups consistently attending the classroom session had access to.</w:t>
+      </w:r>
+    </w:p>
+    <w:p>
+      <w:pPr>
+        <w:pStyle w:val="Normal"/>
+        <w:jc w:val="both"/>
+        <w:rPr>
+          <w:lang w:val="en-NZ"/>
+        </w:rPr>
+      </w:pPr>
+      <w:r>
+        <w:rPr>
+          <w:lang w:val="en-NZ"/>
+        </w:rPr>
+        <w:t>The interactions with Team B showed that using the structure that WorkshopAR was proposing, especially for the assignation of goals and tasks, helped to incorporate those elements to the the organization of the team. It was especially useful when the goals were not clear or had not been discussed enough. That was an exceptionally good behaviour promoted by the application and aligned with the learning design proposed.</w:t>
+      </w:r>
+    </w:p>
+    <w:p>
+      <w:pPr>
+        <w:pStyle w:val="Normal"/>
+        <w:jc w:val="both"/>
+        <w:rPr>
+          <w:lang w:val="en-NZ"/>
+        </w:rPr>
+      </w:pPr>
+      <w:r>
+        <w:rPr>
+          <w:lang w:val="en-NZ"/>
+        </w:rPr>
+        <w:t xml:space="preserve">The main functionality of WorkshopAR was understood by the students but its immediate value for the project was not really seen. The main point of comparison so far between WorkshopAR and what other groups were doing was the creation of relationships by using the available technology. It was observed that most groups did not think too much at first about the in-person communication needed to work and were first concerned to stablish points of communication that are asynchronous in nature (WhatsApp, Teams, Facebook). </w:t>
+      </w:r>
+    </w:p>
+    <w:p>
+      <w:pPr>
+        <w:pStyle w:val="Normal"/>
+        <w:jc w:val="both"/>
+        <w:rPr>
+          <w:lang w:val="en-NZ"/>
+        </w:rPr>
+      </w:pPr>
+      <w:r>
+        <w:rPr>
+          <w:lang w:val="en-NZ"/>
+        </w:rPr>
+        <w:t xml:space="preserve">Students commented that they preferred to first stablish a relation through social media and communication technologies and then step into face-to-face work for more complex tasks. A quick analysis of works like </w:t>
+      </w:r>
+      <w:r>
+        <w:rPr>
+          <w:rStyle w:val="CitaCar"/>
+          <w:lang w:val="en-NZ"/>
+        </w:rPr>
+        <w:t>An &amp; Frick (2006)</w:t>
+      </w:r>
+      <w:r>
+        <w:rPr>
+          <w:lang w:val="en-NZ"/>
+        </w:rPr>
+        <w:t xml:space="preserve"> and </w:t>
+      </w:r>
+      <w:r>
+        <w:rPr>
+          <w:rStyle w:val="CitaCar"/>
+          <w:lang w:val="en-NZ"/>
+        </w:rPr>
+        <w:t>Robinson &amp; Hans (2012)</w:t>
+      </w:r>
+      <w:r>
+        <w:rPr>
+          <w:lang w:val="en-NZ"/>
+        </w:rPr>
+        <w:t xml:space="preserve"> give some validity to this idea, showing that students prefer quick, simple communication via their preferred apps, but appreciated more face-to-face work for more complex work.</w:t>
+      </w:r>
+    </w:p>
+    <w:p>
+      <w:pPr>
+        <w:pStyle w:val="Heading1"/>
+        <w:rPr>
+          <w:lang w:val="en-NZ"/>
+        </w:rPr>
+      </w:pPr>
+      <w:r>
+        <w:rPr>
+          <w:lang w:val="en-NZ"/>
+        </w:rPr>
+        <w:t>6.</w:t>
+      </w:r>
+      <w:r>
+        <w:rPr>
           <w:lang w:val="en-NZ"/>
         </w:rPr>
         <w:t>4</w:t>
       </w:r>
       <w:r>
         <w:rPr>
-          <w:sz w:val="24"/>
-          <w:szCs w:val="24"/>
-          <w:rFonts w:cs="Calibri" w:ascii="Calibri" w:hAnsi="Calibri"/>
-          <w:lang w:val="en-NZ"/>
-        </w:rPr>
-        <w:fldChar w:fldCharType="end"/>
-      </w:r>
-      <w:r>
-        <w:rPr>
-          <w:rFonts w:cs="Calibri" w:ascii="Calibri" w:hAnsi="Calibri" w:asciiTheme="majorHAnsi" w:cstheme="majorHAnsi" w:hAnsiTheme="majorHAnsi"/>
-          <w:sz w:val="24"/>
-          <w:szCs w:val="24"/>
-          <w:lang w:val="en-NZ"/>
-        </w:rPr>
-        <w:t xml:space="preserve"> Initial Space for Observations of WorkshopAR</w:t>
-      </w:r>
-    </w:p>
-    <w:p>
-      <w:pPr>
-        <w:pStyle w:val="Normal"/>
-        <w:jc w:val="both"/>
-        <w:rPr>
-          <w:lang w:val="en-NZ"/>
-        </w:rPr>
-      </w:pPr>
-      <w:r>
-        <w:rPr>
-          <w:lang w:val="en-NZ"/>
-        </w:rPr>
-        <w:t>While repeating the creation of the Digital Room, the student commented that the CM should be the one in charge of the configuration process and handed the mobile to him so he could do it. The situation prompted an intervening question: Should the same person always be the host? How would they organise the group to create and configure the Digital Room?</w:t>
-      </w:r>
-    </w:p>
-    <w:p>
-      <w:pPr>
-        <w:pStyle w:val="Normal"/>
-        <w:jc w:val="both"/>
-        <w:rPr>
-          <w:lang w:val="en-NZ"/>
-        </w:rPr>
-      </w:pPr>
-      <w:r>
-        <w:rPr>
-          <w:lang w:val="en-NZ"/>
-        </w:rPr>
-        <w:t>First, they proposed that it would make more sense if someone had that fixed responsibility but found little reasons to keep that idea when following the discussion further. They argued that “making” the Digital Room should be a fast process and that the first person to arrive to the classroom should do it. This approach was easier and would make the configuration time needed for the use of WorkshopAR shorter.</w:t>
-      </w:r>
-    </w:p>
-    <w:p>
-      <w:pPr>
-        <w:pStyle w:val="Normal"/>
-        <w:jc w:val="both"/>
-        <w:rPr>
-          <w:lang w:val="en-NZ"/>
-        </w:rPr>
-      </w:pPr>
-      <w:r>
-        <w:rPr>
-          <w:lang w:val="en-NZ"/>
-        </w:rPr>
-        <w:t>The interactions with the User Anchors also promoted some discussions about the use of the tool in the activities planned for the session. The students liked the idea of the User Anchor, they specially found amusing the “goofy” look that the gaze gave to the whole visual, and suggested more elements of customization beside colour, like text, shapes, or animations. They also mentioned that the functionality fitted better the first two weeks of the course, when it was more common to need information about someone, like a name or a role, and was easier to fit the playfulness that the feature was promoting. For the work that the group was doing now, the feature was rather useless, since they already knew each other and had other means of getting in contact if needed.</w:t>
-      </w:r>
-    </w:p>
-    <w:p>
-      <w:pPr>
-        <w:pStyle w:val="Normal"/>
-        <w:jc w:val="both"/>
-        <w:rPr>
-          <w:lang w:val="en-NZ"/>
-        </w:rPr>
-      </w:pPr>
-      <w:r>
-        <w:rPr>
-          <w:lang w:val="en-NZ"/>
-        </w:rPr>
-        <w:t>Other two important observations to mention that were not necessarily linked to the use of WorkshopAR:</w:t>
-      </w:r>
-    </w:p>
-    <w:p>
-      <w:pPr>
-        <w:pStyle w:val="Normal"/>
-        <w:jc w:val="both"/>
-        <w:rPr>
-          <w:lang w:val="en-NZ"/>
-        </w:rPr>
-      </w:pPr>
-      <w:r>
-        <w:rPr>
-          <w:lang w:val="en-NZ"/>
-        </w:rPr>
-        <w:t>First, when setting themselves up to start working, the CE noticed that, based on the goal they had stablished of working on the poster, he had a lot of holes in his understanding of what he should be doing for the activity. The group tried to use the information found in the LMS to clarify the situation, but it was not enough, and a TA had to intervene.</w:t>
-      </w:r>
-    </w:p>
-    <w:p>
-      <w:pPr>
-        <w:pStyle w:val="Normal"/>
-        <w:jc w:val="both"/>
-        <w:rPr>
-          <w:lang w:val="en-NZ"/>
-        </w:rPr>
-      </w:pPr>
-      <w:r>
-        <w:rPr>
-          <w:lang w:val="en-NZ"/>
-        </w:rPr>
-        <w:t>The disadvantages of taking the group from the main room for the observations were piling up. It was necessary to search for a TA and ask her to check on the group for the CE to be able to keep working, and then the group had to scramble from the place because a workshop had started and they had not heard the new instruction.</w:t>
-      </w:r>
-    </w:p>
-    <w:p>
-      <w:pPr>
-        <w:pStyle w:val="Normal"/>
-        <w:jc w:val="both"/>
-        <w:rPr>
-          <w:lang w:val="en-NZ"/>
-        </w:rPr>
-      </w:pPr>
-      <w:r>
-        <w:rPr>
-          <w:lang w:val="en-NZ"/>
-        </w:rPr>
-        <w:t>The second observation was that the work done by the students was very individual in nature. They were working together physically, often sharing comments and information, but in the end each one concentrated in their own work. The CE needed to clarify his doubts about the same poster all the others were working on, but because none of his teammates shared his role, they did not have a clear idea either of what the CE should be doing.</w:t>
-      </w:r>
-    </w:p>
-    <w:p>
-      <w:pPr>
-        <w:pStyle w:val="Heading3"/>
-        <w:rPr>
-          <w:lang w:val="en-NZ"/>
-        </w:rPr>
-      </w:pPr>
-      <w:r>
-        <w:rPr>
-          <w:lang w:val="en-NZ"/>
-        </w:rPr>
-        <w:t>6.4.3 Preliminary Analysis</w:t>
-      </w:r>
-    </w:p>
-    <w:p>
-      <w:pPr>
-        <w:pStyle w:val="Normal"/>
-        <w:jc w:val="both"/>
-        <w:rPr>
-          <w:lang w:val="en-NZ"/>
-        </w:rPr>
-      </w:pPr>
-      <w:r>
-        <w:rPr>
-          <w:lang w:val="en-NZ"/>
-        </w:rPr>
-        <w:t>The first four weeks of work were a period of contextualisation and adjustments. Students were prepared to tackle a course that was known to be complex, and their first concern was to untangle the complexity and start working on the project as soon as possible.</w:t>
-      </w:r>
-    </w:p>
-    <w:p>
-      <w:pPr>
-        <w:pStyle w:val="Normal"/>
-        <w:jc w:val="both"/>
-        <w:rPr>
-          <w:lang w:val="en-NZ"/>
-        </w:rPr>
-      </w:pPr>
-      <w:r>
-        <w:rPr>
-          <w:lang w:val="en-NZ"/>
-        </w:rPr>
-        <w:t>The first issue that the students found, one that the teaching staff had to quickly acknowledge, was a limited access to information. The LMS was obscuring the requirements of the project in between links and tons of external material, and the teaching staff had to explain and repeat several times the same information. Activities like the QA sessions and the constant access to the TA staff helped the students to clarify any doubts, but those were resources that only the groups consistently attending the classroom session had access to.</w:t>
-      </w:r>
-    </w:p>
-    <w:p>
-      <w:pPr>
-        <w:pStyle w:val="Normal"/>
-        <w:jc w:val="both"/>
-        <w:rPr>
-          <w:lang w:val="en-NZ"/>
-        </w:rPr>
-      </w:pPr>
-      <w:r>
-        <w:rPr>
-          <w:lang w:val="en-NZ"/>
-        </w:rPr>
-        <w:t>The interactions with Team B showed that using the structure that WorkshopAR was proposing, especially for the assignation of goals and tasks, helped to incorporate those elements to the the organization of the team. It was especially useful when the goals were not clear or had not been discussed enough. That was an exceptionally good behaviour promoted by the application and aligned with the learning design proposed.</w:t>
-      </w:r>
-    </w:p>
-    <w:p>
-      <w:pPr>
-        <w:pStyle w:val="Normal"/>
-        <w:jc w:val="both"/>
-        <w:rPr>
-          <w:lang w:val="en-NZ"/>
-        </w:rPr>
-      </w:pPr>
-      <w:r>
-        <w:rPr>
-          <w:lang w:val="en-NZ"/>
-        </w:rPr>
-        <w:t xml:space="preserve">The observation protocol had to be adjusted, but that was part of the objectives established for the first weeks. It was good that a major issue was identified early and that there was time to propose a solution. </w:t>
-      </w:r>
-    </w:p>
-    <w:p>
-      <w:pPr>
-        <w:pStyle w:val="Normal"/>
-        <w:jc w:val="both"/>
-        <w:rPr>
-          <w:lang w:val="en-NZ"/>
-        </w:rPr>
-      </w:pPr>
-      <w:r>
-        <w:rPr>
-          <w:lang w:val="en-NZ"/>
-        </w:rPr>
-        <w:t xml:space="preserve">The main functionality of WorkshopAR was understood by the students but its immediate value for the project was not really seen. The main point of comparison so far between WorkshopAR and what other groups were doing was the creation of relationships by using the available technology. It was observed that most groups did not think too much at first about the in-person communication needed to work and were first concerned to stablish points of communication that are asynchronous in nature (WhatsApp, Teams, Facebook). </w:t>
-      </w:r>
-    </w:p>
-    <w:p>
-      <w:pPr>
-        <w:pStyle w:val="Normal"/>
-        <w:jc w:val="both"/>
-        <w:rPr>
-          <w:lang w:val="en-NZ"/>
-        </w:rPr>
-      </w:pPr>
-      <w:r>
-        <w:rPr>
-          <w:lang w:val="en-NZ"/>
-        </w:rPr>
-        <w:t xml:space="preserve">Students commented that they preferred to first stablish a relation through social media and communication technologies and then step into face-to-face work for more complex tasks. A quick analysis of works like </w:t>
-      </w:r>
-      <w:r>
-        <w:rPr>
-          <w:rStyle w:val="CitaCar"/>
-          <w:lang w:val="en-NZ"/>
-        </w:rPr>
-        <w:t>An &amp; Frick (2006)</w:t>
-      </w:r>
-      <w:r>
-        <w:rPr>
-          <w:lang w:val="en-NZ"/>
-        </w:rPr>
-        <w:t xml:space="preserve"> and </w:t>
-      </w:r>
-      <w:r>
-        <w:rPr>
-          <w:rStyle w:val="CitaCar"/>
-          <w:lang w:val="en-NZ"/>
-        </w:rPr>
-        <w:t>Robinson &amp; Hans (2012)</w:t>
-      </w:r>
-      <w:r>
-        <w:rPr>
-          <w:lang w:val="en-NZ"/>
-        </w:rPr>
-        <w:t xml:space="preserve"> give some validity to this idea, showing that students prefer quick, simple communication via their preferred apps, but appreciated more face-to-face work for more complex work.</w:t>
-      </w:r>
-    </w:p>
-    <w:p>
-      <w:pPr>
-        <w:pStyle w:val="Heading1"/>
-        <w:rPr>
-          <w:lang w:val="en-NZ"/>
-        </w:rPr>
-      </w:pPr>
-      <w:r>
-        <w:rPr>
-          <w:lang w:val="en-NZ"/>
-        </w:rPr>
-        <w:t>6.5 Week 5 to 9: Poster Presentation</w:t>
+          <w:lang w:val="en-NZ"/>
+        </w:rPr>
+        <w:t xml:space="preserve"> Week 5 to 9: Poster Presentation</w:t>
       </w:r>
     </w:p>
     <w:p>
@@ -3780,7 +3682,19 @@
         <w:rPr>
           <w:lang w:val="en-NZ"/>
         </w:rPr>
-        <w:t>6.5.1 General Observations</w:t>
+        <w:t>6.</w:t>
+      </w:r>
+      <w:r>
+        <w:rPr>
+          <w:lang w:val="en-NZ"/>
+        </w:rPr>
+        <w:t>4</w:t>
+      </w:r>
+      <w:r>
+        <w:rPr>
+          <w:lang w:val="en-NZ"/>
+        </w:rPr>
+        <w:t>.1 General Observations</w:t>
       </w:r>
     </w:p>
     <w:p>
@@ -3975,56 +3889,56 @@
       </w:r>
       <w:r>
         <w:rPr>
+          <w:rFonts w:cs="Calibri" w:ascii="Calibri" w:hAnsi="Calibri"/>
+          <w:sz w:val="24"/>
+          <w:szCs w:val="24"/>
+          <w:lang w:val="en-NZ"/>
+        </w:rPr>
+        <w:fldChar w:fldCharType="begin"/>
+      </w:r>
+      <w:r>
+        <w:rPr>
+          <w:sz w:val="24"/>
+          <w:szCs w:val="24"/>
+          <w:rFonts w:cs="Calibri" w:ascii="Calibri" w:hAnsi="Calibri"/>
+          <w:lang w:val="en-NZ"/>
+        </w:rPr>
+        <w:instrText xml:space="preserve"> SEQ Figure \* ARABIC </w:instrText>
+      </w:r>
+      <w:r>
+        <w:rPr>
+          <w:sz w:val="24"/>
+          <w:szCs w:val="24"/>
+          <w:rFonts w:cs="Calibri" w:ascii="Calibri" w:hAnsi="Calibri"/>
+          <w:lang w:val="en-NZ"/>
+        </w:rPr>
+        <w:fldChar w:fldCharType="separate"/>
+      </w:r>
+      <w:r>
+        <w:rPr>
+          <w:sz w:val="24"/>
+          <w:szCs w:val="24"/>
+          <w:rFonts w:cs="Calibri" w:ascii="Calibri" w:hAnsi="Calibri"/>
+          <w:lang w:val="en-NZ"/>
+        </w:rPr>
+        <w:t>5</w:t>
+      </w:r>
+      <w:r>
+        <w:rPr>
+          <w:sz w:val="24"/>
+          <w:szCs w:val="24"/>
+          <w:rFonts w:cs="Calibri" w:ascii="Calibri" w:hAnsi="Calibri"/>
+          <w:lang w:val="en-NZ"/>
+        </w:rPr>
+        <w:fldChar w:fldCharType="end"/>
+      </w:r>
+      <w:r>
+        <w:rPr>
           <w:rFonts w:cs="Calibri" w:ascii="Calibri" w:hAnsi="Calibri" w:asciiTheme="majorHAnsi" w:cstheme="majorHAnsi" w:hAnsiTheme="majorHAnsi"/>
           <w:sz w:val="24"/>
           <w:szCs w:val="24"/>
           <w:lang w:val="en-NZ"/>
         </w:rPr>
-        <w:fldChar w:fldCharType="begin"/>
-      </w:r>
-      <w:r>
-        <w:rPr>
-          <w:sz w:val="24"/>
-          <w:szCs w:val="24"/>
-          <w:rFonts w:cs="Calibri" w:ascii="Calibri" w:hAnsi="Calibri"/>
-          <w:lang w:val="en-NZ"/>
-        </w:rPr>
-        <w:instrText xml:space="preserve"> SEQ Figure \* ARABIC </w:instrText>
-      </w:r>
-      <w:r>
-        <w:rPr>
-          <w:sz w:val="24"/>
-          <w:szCs w:val="24"/>
-          <w:rFonts w:cs="Calibri" w:ascii="Calibri" w:hAnsi="Calibri"/>
-          <w:lang w:val="en-NZ"/>
-        </w:rPr>
-        <w:fldChar w:fldCharType="separate"/>
-      </w:r>
-      <w:r>
-        <w:rPr>
-          <w:sz w:val="24"/>
-          <w:szCs w:val="24"/>
-          <w:rFonts w:cs="Calibri" w:ascii="Calibri" w:hAnsi="Calibri"/>
-          <w:lang w:val="en-NZ"/>
-        </w:rPr>
-        <w:t>5</w:t>
-      </w:r>
-      <w:r>
-        <w:rPr>
-          <w:sz w:val="24"/>
-          <w:szCs w:val="24"/>
-          <w:rFonts w:cs="Calibri" w:ascii="Calibri" w:hAnsi="Calibri"/>
-          <w:lang w:val="en-NZ"/>
-        </w:rPr>
-        <w:fldChar w:fldCharType="end"/>
-      </w:r>
-      <w:r>
-        <w:rPr>
-          <w:rFonts w:cs="Calibri" w:ascii="Calibri" w:hAnsi="Calibri" w:asciiTheme="majorHAnsi" w:cstheme="majorHAnsi" w:hAnsiTheme="majorHAnsi"/>
-          <w:sz w:val="24"/>
-          <w:szCs w:val="24"/>
-          <w:lang w:val="en-NZ"/>
-        </w:rPr>
         <w:t xml:space="preserve"> A Good (left) and Bad (right) example of a biweekly report.</w:t>
       </w:r>
     </w:p>
@@ -4054,7 +3968,19 @@
         <w:rPr>
           <w:lang w:val="en-NZ"/>
         </w:rPr>
-        <w:t>6.5.1.1 A Bad Example: Team C</w:t>
+        <w:t>6.</w:t>
+      </w:r>
+      <w:r>
+        <w:rPr>
+          <w:lang w:val="en-NZ"/>
+        </w:rPr>
+        <w:t>4</w:t>
+      </w:r>
+      <w:r>
+        <w:rPr>
+          <w:lang w:val="en-NZ"/>
+        </w:rPr>
+        <w:t>.1.1 A Bad Example: Team C</w:t>
       </w:r>
     </w:p>
     <w:p>
@@ -4143,7 +4069,19 @@
         <w:rPr>
           <w:lang w:val="en-NZ"/>
         </w:rPr>
-        <w:t>6.5.1.2 A Good Example: Team D</w:t>
+        <w:t>6.</w:t>
+      </w:r>
+      <w:r>
+        <w:rPr>
+          <w:lang w:val="en-NZ"/>
+        </w:rPr>
+        <w:t>4</w:t>
+      </w:r>
+      <w:r>
+        <w:rPr>
+          <w:lang w:val="en-NZ"/>
+        </w:rPr>
+        <w:t>.1.2 A Good Example: Team D</w:t>
       </w:r>
     </w:p>
     <w:p>
@@ -4202,7 +4140,19 @@
         <w:rPr>
           <w:lang w:val="en-NZ"/>
         </w:rPr>
-        <w:t>6.5.2 Intervention with WorkshopAR</w:t>
+        <w:t>6.</w:t>
+      </w:r>
+      <w:r>
+        <w:rPr>
+          <w:lang w:val="en-NZ"/>
+        </w:rPr>
+        <w:t>4</w:t>
+      </w:r>
+      <w:r>
+        <w:rPr>
+          <w:lang w:val="en-NZ"/>
+        </w:rPr>
+        <w:t>.2 Intervention with WorkshopAR</w:t>
       </w:r>
     </w:p>
     <w:p>
@@ -4318,7 +4268,19 @@
         <w:rPr>
           <w:lang w:val="en-NZ"/>
         </w:rPr>
-        <w:t>6.5.2.1 Annotations and Debate Features</w:t>
+        <w:t>6.</w:t>
+      </w:r>
+      <w:r>
+        <w:rPr>
+          <w:lang w:val="en-NZ"/>
+        </w:rPr>
+        <w:t>4</w:t>
+      </w:r>
+      <w:r>
+        <w:rPr>
+          <w:lang w:val="en-NZ"/>
+        </w:rPr>
+        <w:t>.2.1 Annotations and Debate Features</w:t>
       </w:r>
     </w:p>
     <w:p>
@@ -4484,49 +4446,330 @@
       </w:r>
       <w:r>
         <w:rPr>
+          <w:rFonts w:cs="Calibri" w:ascii="Calibri" w:hAnsi="Calibri"/>
+          <w:sz w:val="24"/>
+          <w:szCs w:val="24"/>
+          <w:lang w:val="en-NZ"/>
+        </w:rPr>
+        <w:fldChar w:fldCharType="begin"/>
+      </w:r>
+      <w:r>
+        <w:rPr>
+          <w:sz w:val="24"/>
+          <w:szCs w:val="24"/>
+          <w:rFonts w:cs="Calibri" w:ascii="Calibri" w:hAnsi="Calibri"/>
+          <w:lang w:val="en-NZ"/>
+        </w:rPr>
+        <w:instrText xml:space="preserve"> SEQ Figure \* ARABIC </w:instrText>
+      </w:r>
+      <w:r>
+        <w:rPr>
+          <w:sz w:val="24"/>
+          <w:szCs w:val="24"/>
+          <w:rFonts w:cs="Calibri" w:ascii="Calibri" w:hAnsi="Calibri"/>
+          <w:lang w:val="en-NZ"/>
+        </w:rPr>
+        <w:fldChar w:fldCharType="separate"/>
+      </w:r>
+      <w:r>
+        <w:rPr>
+          <w:sz w:val="24"/>
+          <w:szCs w:val="24"/>
+          <w:rFonts w:cs="Calibri" w:ascii="Calibri" w:hAnsi="Calibri"/>
+          <w:lang w:val="en-NZ"/>
+        </w:rPr>
+        <w:t>6</w:t>
+      </w:r>
+      <w:r>
+        <w:rPr>
+          <w:sz w:val="24"/>
+          <w:szCs w:val="24"/>
+          <w:rFonts w:cs="Calibri" w:ascii="Calibri" w:hAnsi="Calibri"/>
+          <w:lang w:val="en-NZ"/>
+        </w:rPr>
+        <w:fldChar w:fldCharType="end"/>
+      </w:r>
+      <w:r>
+        <w:rPr>
           <w:rFonts w:cs="Calibri" w:ascii="Calibri" w:hAnsi="Calibri" w:asciiTheme="majorHAnsi" w:cstheme="majorHAnsi" w:hAnsiTheme="majorHAnsi"/>
           <w:sz w:val="24"/>
           <w:szCs w:val="24"/>
           <w:lang w:val="en-NZ"/>
         </w:rPr>
-        <w:fldChar w:fldCharType="begin"/>
-      </w:r>
-      <w:r>
-        <w:rPr>
+        <w:t xml:space="preserve"> Group D Working on the Room Configuration</w:t>
+      </w:r>
+    </w:p>
+    <w:p>
+      <w:pPr>
+        <w:pStyle w:val="Normal"/>
+        <w:jc w:val="both"/>
+        <w:rPr>
+          <w:lang w:val="en-NZ"/>
+        </w:rPr>
+      </w:pPr>
+      <w:r>
+        <w:rPr>
+          <w:lang w:val="en-NZ"/>
+        </w:rPr>
+        <w:t>The debate feature behaved completely opposite in both groups. Team C did not have the need of using such a feature, since there was only two of them. They argued that such a tool would make sense only for big teams, ten or more people, where it was possible to not know someone or for the necessity to manage the chaos of so many people trying to decide something.</w:t>
+      </w:r>
+    </w:p>
+    <w:p>
+      <w:pPr>
+        <w:pStyle w:val="Normal"/>
+        <w:jc w:val="both"/>
+        <w:rPr>
+          <w:lang w:val="en-NZ"/>
+        </w:rPr>
+      </w:pPr>
+      <w:r>
+        <w:rPr>
+          <w:lang w:val="en-NZ"/>
+        </w:rPr>
+        <w:t>In contrast, the debate feature resonated the most with Team D. During the session they had to take decisions regarding the construction material and some changes needed to the design. While testing and exploring the functionality they even recreated a previous discussion about the selected construction material. Upon seeing that they had four slots for the vote options, the AE commented if it was worthy to discuss the addition of a third material. The other students, panickily, responded with a big no, considering all the work they had already done with the original decision.</w:t>
+      </w:r>
+    </w:p>
+    <w:p>
+      <w:pPr>
+        <w:pStyle w:val="Normal"/>
+        <w:jc w:val="both"/>
+        <w:rPr>
+          <w:lang w:val="en-NZ"/>
+        </w:rPr>
+      </w:pPr>
+      <w:r>
+        <w:rPr>
+          <w:lang w:val="en-NZ"/>
+        </w:rPr>
+        <w:t>It was good that the tool promoted a deeper thought about the options of the debate and helped to flesh out the discussion, but it also showed that the users felt obligated to configure all the options available, even if it was not necessary. This pointed to the need of tweaking the configuration of the debate. In the same line, it was discussed that the configuration was taking too long for just simple questions that could be just asked aloud to the group, echoing the comment of Team C that such a feature could be better use in a bigger and newer team in needed of more control and management.</w:t>
+      </w:r>
+    </w:p>
+    <w:p>
+      <w:pPr>
+        <w:pStyle w:val="Heading3"/>
+        <w:rPr>
+          <w:lang w:val="en-NZ"/>
+        </w:rPr>
+      </w:pPr>
+      <w:r>
+        <w:rPr>
+          <w:lang w:val="en-NZ"/>
+        </w:rPr>
+        <w:t>6.</w:t>
+      </w:r>
+      <w:r>
+        <w:rPr>
+          <w:lang w:val="en-NZ"/>
+        </w:rPr>
+        <w:t>4</w:t>
+      </w:r>
+      <w:r>
+        <w:rPr>
+          <w:lang w:val="en-NZ"/>
+        </w:rPr>
+        <w:t>.2.2 Play Models</w:t>
+      </w:r>
+    </w:p>
+    <w:p>
+      <w:pPr>
+        <w:pStyle w:val="Normal"/>
+        <w:jc w:val="both"/>
+        <w:rPr>
+          <w:lang w:val="en-NZ"/>
+        </w:rPr>
+      </w:pPr>
+      <w:r>
+        <w:rPr>
+          <w:lang w:val="en-NZ"/>
+        </w:rPr>
+        <w:t>As mentioned earlier, Team C barely interacted with other features beside the annotations. They tested the interaction with play models, enough to offer some data about the controls and how the improved control scheme was causing less problems in comparison to what was observed during the unstructured test. The group commented little about the tool and could not relate the feature with their current work, as other students did in the past when interested in a functionality.</w:t>
+      </w:r>
+    </w:p>
+    <w:p>
+      <w:pPr>
+        <w:pStyle w:val="Normal"/>
+        <w:jc w:val="both"/>
+        <w:rPr>
+          <w:lang w:val="en-NZ"/>
+        </w:rPr>
+      </w:pPr>
+      <w:r>
+        <w:rPr>
+          <w:lang w:val="en-NZ"/>
+        </w:rPr>
+        <w:t>Team D offered a more telling interaction with the Play Models. The students tried for longer the actions related to the control scheme of the feature. They spent the most time positioning different models around the space and sharing the interaction with their companions. They even took turns to interact with this feature the most.</w:t>
+      </w:r>
+    </w:p>
+    <w:p>
+      <w:pPr>
+        <w:pStyle w:val="Normal"/>
+        <w:jc w:val="both"/>
+        <w:rPr>
+          <w:lang w:val="en-NZ"/>
+        </w:rPr>
+      </w:pPr>
+      <w:r>
+        <w:rPr>
+          <w:lang w:val="en-NZ"/>
+        </w:rPr>
+        <w:t>It was possible to gather a lot of information about the interaction design, the UI, and the way to signal the protocol for shared models, as explored in section 5.2.1.3. The experience was not flawless, but the idea was clear to the students, and it was easy to identify and plan the needed adjustments that could be implemented for the second iteration. The observations about how the tool integrated with the activities of the project was not as good.</w:t>
+      </w:r>
+    </w:p>
+    <w:p>
+      <w:pPr>
+        <w:pStyle w:val="Normal"/>
+        <w:jc w:val="both"/>
+        <w:rPr>
+          <w:lang w:val="en-NZ"/>
+        </w:rPr>
+      </w:pPr>
+      <w:r>
+        <w:rPr>
+          <w:lang w:val="en-NZ"/>
+        </w:rPr>
+        <w:t>This observation was a unique opportunity sin</w:t>
+      </w:r>
+      <w:r>
+        <w:rPr>
+          <w:lang w:val="en-NZ"/>
+        </w:rPr>
+        <w:t>ce</w:t>
+      </w:r>
+      <w:r>
+        <w:rPr>
+          <w:lang w:val="en-NZ"/>
+        </w:rPr>
+        <w:t xml:space="preserve"> both an AE and a CE were present in the session, the two roles that could benefit the most from the play models. Additionally, the group was communicating and understanding information about the architectural design, one of the intended use cases for the feature. The situation was perfect and yet there was a lot of issues.</w:t>
+      </w:r>
+    </w:p>
+    <w:p>
+      <w:pPr>
+        <w:pStyle w:val="Normal"/>
+        <w:jc w:val="both"/>
+        <w:rPr>
+          <w:lang w:val="en-NZ"/>
+        </w:rPr>
+      </w:pPr>
+      <w:r>
+        <w:rPr>
+          <w:lang w:val="en-NZ"/>
+        </w:rPr>
+        <w:t>The first problem was that the tools the AE and the CE already used to create the architectural design were better suited to work on changes and faster to show the results. Both students, when testing the tool, remarked that the play models could fit in the very initial discussion about the design, while gathering and drafting ideas, but once the work started seriously, it was more productive to work and discuss over Sketch Up or AutoCAD. The AE also mentioned how much of a problem it is to get accustomed to a different control scheme when working in these types of 3D environments, and he personally would hate to jump from working with his mouse in the laptop to trying some touchscreen control in the phone.</w:t>
+      </w:r>
+    </w:p>
+    <w:p>
+      <w:pPr>
+        <w:pStyle w:val="Normal"/>
+        <w:jc w:val="both"/>
+        <w:rPr>
+          <w:lang w:val="en-NZ"/>
+        </w:rPr>
+      </w:pPr>
+      <w:r>
+        <w:rPr>
+          <w:lang w:val="en-NZ"/>
+        </w:rPr>
+        <w:t>The second problem was just time itself. The concept of comparing the play models to actually playing with Lego blocks was mentioned several times and prompted the idea that the feature would work very well with a playful attitude, when there was not yet a clear idea of what to do and the group is mostly on a brainstorming activity. Once the ideation phase was done, it was important to move faster through the creation of actual material. The AE also remarked that, with the configuration of groups that the course had right now, it would be very difficult for him to recreate that ideation process with every group, which prompted him to just work alone and communicate his ideas in a faster way.</w:t>
+      </w:r>
+    </w:p>
+    <w:p>
+      <w:pPr>
+        <w:pStyle w:val="Normal"/>
+        <w:jc w:val="both"/>
+        <w:rPr>
+          <w:lang w:val="en-NZ"/>
+        </w:rPr>
+      </w:pPr>
+      <w:r>
+        <w:rPr>
+          <w:lang w:val="en-NZ"/>
+        </w:rPr>
+        <w:t>The other students mirrored these ideas too. Being able to use the models to quicky visualise an idea or to communicate a design could work when there was not yet a technical specification. Even with the possibility of integrating technical models into the tool, the conversation simply flowed faster and better by quickly discussing things over their laptops and transmitting information and questions over instant messaging.</w:t>
+      </w:r>
+    </w:p>
+    <w:p>
+      <w:pPr>
+        <w:pStyle w:val="Normal"/>
+        <w:jc w:val="both"/>
+        <w:rPr>
+          <w:lang w:val="en-NZ"/>
+        </w:rPr>
+      </w:pPr>
+      <w:r>
+        <w:rPr>
+          <w:lang w:val="en-NZ"/>
+        </w:rPr>
+        <w:t>The area they though could bring the most potential for a feature like the play models, especially if an external render could be integrated with the tool, would be in communications with the client and the final presentation of their work, like with the poster presentation they were working on now. They mentioned it would be an extra layer of complexity for the presentation but would be an interesting and rather flashy tool to communicate the technical ideas of the project to the client in a way that would offer an advantage over a poster or a written report.</w:t>
+      </w:r>
+    </w:p>
+    <w:p>
+      <w:pPr>
+        <w:pStyle w:val="Heading2"/>
+        <w:rPr>
+          <w:lang w:val="en-NZ"/>
+        </w:rPr>
+      </w:pPr>
+      <w:r>
+        <w:rPr>
+          <w:lang w:val="en-NZ"/>
+        </w:rPr>
+        <w:t>6.</w:t>
+      </w:r>
+      <w:r>
+        <w:rPr>
+          <w:lang w:val="en-NZ"/>
+        </w:rPr>
+        <w:t>4</w:t>
+      </w:r>
+      <w:r>
+        <w:rPr>
+          <w:lang w:val="en-NZ"/>
+        </w:rPr>
+        <w:t>.3 Preliminary Analysis</w:t>
+      </w:r>
+    </w:p>
+    <w:p>
+      <w:pPr>
+        <w:pStyle w:val="Normal"/>
+        <w:jc w:val="both"/>
+        <w:rPr>
+          <w:lang w:val="en-NZ"/>
+        </w:rPr>
+      </w:pPr>
+      <w:r>
+        <w:rPr>
+          <w:lang w:val="en-NZ"/>
+        </w:rPr>
+        <w:t>The work done for the poster presentation represented the biggest instance in the course in which all the elements of collaborative work were present: students had to pool their resources and agreed on a solution. Work was interdependent, required planification, communication and coordination. Groups that were having a better time progressing with the project were those that manage to stablish a clear line of communication, learned to work with the needs and strengths of their team, were able to take decisions fast and incorporate feedback when received. Groups having problems with the course where those that had a problem looking beyond the individual tasks required of each role, had poor or non-existent channels of communication and were not using the spaces in the classroom to organize and check the status of their work.</w:t>
+      </w:r>
+    </w:p>
+    <w:p>
+      <w:pPr>
+        <w:pStyle w:val="Normal"/>
+        <w:jc w:val="both"/>
+        <w:rPr>
+          <w:lang w:val="en-NZ"/>
+        </w:rPr>
+      </w:pPr>
+      <w:r>
+        <w:rPr>
+          <w:lang w:val="en-NZ"/>
+        </w:rPr>
+        <w:t>The biweekly reports were an interesting window into the dynamics of many of the groups, common themes emerged in the reports and were linked to all the other observations in the classroom. Table 1 shows the codebook created to analyse the content of the biweekly reports. This analysis helped in identifying poor communication and lack of information about the project as the main conflict among groups. Confusion about the content of the deliverables and the technical specifications were present in all groups, but those that reported a clear organization of their work and took time to use the open work sessions to access the teaching staff, the TA team or even other groups managed to go beyond the administrative problems and reported consistent progress.</w:t>
+      </w:r>
+    </w:p>
+    <w:p>
+      <w:pPr>
+        <w:pStyle w:val="Caption"/>
+        <w:keepNext w:val="true"/>
+        <w:jc w:val="center"/>
+        <w:rPr>
+          <w:rFonts w:ascii="Calibri" w:hAnsi="Calibri" w:cs="Calibri" w:asciiTheme="majorHAnsi" w:cstheme="majorHAnsi" w:hAnsiTheme="majorHAnsi"/>
           <w:sz w:val="24"/>
           <w:szCs w:val="24"/>
-          <w:rFonts w:cs="Calibri" w:ascii="Calibri" w:hAnsi="Calibri"/>
-          <w:lang w:val="en-NZ"/>
-        </w:rPr>
-        <w:instrText xml:space="preserve"> SEQ Figure \* ARABIC </w:instrText>
-      </w:r>
-      <w:r>
-        <w:rPr>
-          <w:sz w:val="24"/>
-          <w:szCs w:val="24"/>
-          <w:rFonts w:cs="Calibri" w:ascii="Calibri" w:hAnsi="Calibri"/>
-          <w:lang w:val="en-NZ"/>
-        </w:rPr>
-        <w:fldChar w:fldCharType="separate"/>
-      </w:r>
-      <w:r>
-        <w:rPr>
-          <w:sz w:val="24"/>
-          <w:szCs w:val="24"/>
-          <w:rFonts w:cs="Calibri" w:ascii="Calibri" w:hAnsi="Calibri"/>
-          <w:lang w:val="en-NZ"/>
-        </w:rPr>
-        <w:t>6</w:t>
-      </w:r>
-      <w:r>
-        <w:rPr>
-          <w:sz w:val="24"/>
-          <w:szCs w:val="24"/>
-          <w:rFonts w:cs="Calibri" w:ascii="Calibri" w:hAnsi="Calibri"/>
-          <w:lang w:val="en-NZ"/>
-        </w:rPr>
-        <w:fldChar w:fldCharType="end"/>
-      </w:r>
+          <w:lang w:val="en-NZ"/>
+        </w:rPr>
+      </w:pPr>
       <w:r>
         <w:rPr>
           <w:rFonts w:cs="Calibri" w:ascii="Calibri" w:hAnsi="Calibri" w:asciiTheme="majorHAnsi" w:cstheme="majorHAnsi" w:hAnsiTheme="majorHAnsi"/>
@@ -4534,256 +4777,11 @@
           <w:szCs w:val="24"/>
           <w:lang w:val="en-NZ"/>
         </w:rPr>
-        <w:t xml:space="preserve"> Group D Working on the Room Configuration</w:t>
-      </w:r>
-    </w:p>
-    <w:p>
-      <w:pPr>
-        <w:pStyle w:val="Normal"/>
-        <w:jc w:val="both"/>
-        <w:rPr>
-          <w:lang w:val="en-NZ"/>
-        </w:rPr>
-      </w:pPr>
-      <w:r>
-        <w:rPr>
-          <w:lang w:val="en-NZ"/>
-        </w:rPr>
-        <w:t>The debate feature behaved completely opposite in both groups. Team C did not have the need of using such a feature, since there was only two of them. They argued that such a tool would make sense only for big teams, ten or more people, where it was possible to not know someone or for the necessity to manage the chaos of so many people trying to decide something.</w:t>
-      </w:r>
-    </w:p>
-    <w:p>
-      <w:pPr>
-        <w:pStyle w:val="Normal"/>
-        <w:jc w:val="both"/>
-        <w:rPr>
-          <w:lang w:val="en-NZ"/>
-        </w:rPr>
-      </w:pPr>
-      <w:r>
-        <w:rPr>
-          <w:lang w:val="en-NZ"/>
-        </w:rPr>
-        <w:t>In contrast, the debate feature resonated the most with Team D. During the session they had to take decisions regarding the construction material and some changes needed to the design. While testing and exploring the functionality they even recreated a previous discussion about the selected construction material. Upon seeing that they had four slots for the vote options, the AE commented if it was worthy to discuss the addition of a third material. The other students, panickily, responded with a big no, considering all the work they had already done with the original decision.</w:t>
-      </w:r>
-    </w:p>
-    <w:p>
-      <w:pPr>
-        <w:pStyle w:val="Normal"/>
-        <w:jc w:val="both"/>
-        <w:rPr>
-          <w:lang w:val="en-NZ"/>
-        </w:rPr>
-      </w:pPr>
-      <w:r>
-        <w:rPr>
-          <w:lang w:val="en-NZ"/>
-        </w:rPr>
-        <w:t>It was good that the tool promoted a deeper thought about the options of the debate and helped to flesh out the discussion, but it also showed that the users felt obligated to configure all the options available, even if it was not necessary. This pointed to the need of tweaking the configuration of the debate. In the same line, it was discussed that the configuration was taking too long for just simple questions that could be just asked aloud to the group, echoing the comment of Team C that such a feature could be better use in a bigger and newer team in needed of more control and management.</w:t>
-      </w:r>
-    </w:p>
-    <w:p>
-      <w:pPr>
-        <w:pStyle w:val="Heading3"/>
-        <w:rPr>
-          <w:lang w:val="en-NZ"/>
-        </w:rPr>
-      </w:pPr>
-      <w:r>
-        <w:rPr>
-          <w:lang w:val="en-NZ"/>
-        </w:rPr>
-        <w:t>6.5.2.2 Play Models</w:t>
-      </w:r>
-    </w:p>
-    <w:p>
-      <w:pPr>
-        <w:pStyle w:val="Normal"/>
-        <w:jc w:val="both"/>
-        <w:rPr>
-          <w:lang w:val="en-NZ"/>
-        </w:rPr>
-      </w:pPr>
-      <w:r>
-        <w:rPr>
-          <w:lang w:val="en-NZ"/>
-        </w:rPr>
-        <w:t>As mentioned earlier, Team C barely interacted with other features beside the annotations. They tested the interaction with play models, enough to offer some data about the controls and how the improved control scheme was causing less problems in comparison to what was observed during the unstructured test. The group commented little about the tool and could not relate the feature with their current work, as other students did in the past when interested in a functionality.</w:t>
-      </w:r>
-    </w:p>
-    <w:p>
-      <w:pPr>
-        <w:pStyle w:val="Normal"/>
-        <w:jc w:val="both"/>
-        <w:rPr>
-          <w:lang w:val="en-NZ"/>
-        </w:rPr>
-      </w:pPr>
-      <w:r>
-        <w:rPr>
-          <w:lang w:val="en-NZ"/>
-        </w:rPr>
-        <w:t>Team D offered a more telling interaction with the Play Models. The students tried for longer the actions related to the control scheme of the feature. They spent the most time positioning different models around the space and sharing the interaction with their companions. They even took turns to interact with this feature the most.</w:t>
-      </w:r>
-    </w:p>
-    <w:p>
-      <w:pPr>
-        <w:pStyle w:val="Normal"/>
-        <w:jc w:val="both"/>
-        <w:rPr>
-          <w:lang w:val="en-NZ"/>
-        </w:rPr>
-      </w:pPr>
-      <w:r>
-        <w:rPr>
-          <w:lang w:val="en-NZ"/>
-        </w:rPr>
-        <w:t>It was possible to gather a lot of information about the interaction design, the UI, and the way to signal the protocol for shared models, as explored in section 5.2.1.3. The experience was not flawless, but the idea was clear to the students, and it was easy to identify and plan the needed adjustments that could be implemented for the second iteration. The observations about how the tool integrated with the activities of the project was not as good.</w:t>
-      </w:r>
-    </w:p>
-    <w:p>
-      <w:pPr>
-        <w:pStyle w:val="Normal"/>
-        <w:jc w:val="both"/>
-        <w:rPr>
-          <w:lang w:val="en-NZ"/>
-        </w:rPr>
-      </w:pPr>
-      <w:r>
-        <w:rPr>
-          <w:lang w:val="en-NZ"/>
-        </w:rPr>
-        <w:t>This observation was a unique opportunity sin both an AE and a CE were present in the session, the two roles that could benefit the most from the play models. Additionally, the group was communicating and understanding information about the architectural design, one of the intended use cases for the feature. The situation was perfect and yet there was a lot of issues.</w:t>
-      </w:r>
-    </w:p>
-    <w:p>
-      <w:pPr>
-        <w:pStyle w:val="Normal"/>
-        <w:jc w:val="both"/>
-        <w:rPr>
-          <w:lang w:val="en-NZ"/>
-        </w:rPr>
-      </w:pPr>
-      <w:r>
-        <w:rPr>
-          <w:lang w:val="en-NZ"/>
-        </w:rPr>
-        <w:t>The first problem was that the tools the AE and the CE already used to create the architectural design were better suited to work on changes and faster to show the results. Both students, when testing the tool, remarked that the play models could fit in the very initial discussion about the design, while gathering and drafting ideas, but once the work started seriously, it was more productive to work and discuss over Sketch Up or AutoCAD. The AE also mentioned how much of a problem it is to get accustomed to a different control scheme when working in these types of 3D environments, and he personally would hate to jump from working with his mouse in the laptop to trying some touchscreen control in the phone.</w:t>
-      </w:r>
-    </w:p>
-    <w:p>
-      <w:pPr>
-        <w:pStyle w:val="Normal"/>
-        <w:jc w:val="both"/>
-        <w:rPr>
-          <w:lang w:val="en-NZ"/>
-        </w:rPr>
-      </w:pPr>
-      <w:r>
-        <w:rPr>
-          <w:lang w:val="en-NZ"/>
-        </w:rPr>
-        <w:t>The second problem was just time itself. The concept of comparing the play models to actually playing with Lego blocks was mentioned several times and prompted the idea that the feature would works very well with a playful attitude, when there was not yet a clear idea of what to do and the group is mostly on a brainstorming activity. Once the ideation phase was done, it was important to move faster through the creation of actual material. The AE also remarked that, with the configuration of groups that the course had right now, it would be very difficult for him to recreate that ideation process with every group, which prompted him to just work alone and communicate his ideas in a faster way.</w:t>
-      </w:r>
-    </w:p>
-    <w:p>
-      <w:pPr>
-        <w:pStyle w:val="Normal"/>
-        <w:jc w:val="both"/>
-        <w:rPr>
-          <w:lang w:val="en-NZ"/>
-        </w:rPr>
-      </w:pPr>
-      <w:r>
-        <w:rPr>
-          <w:lang w:val="en-NZ"/>
-        </w:rPr>
-        <w:t>The other students mirrored these ideas too. Being able to use the models to quicky visualise an idea or to communicate a design could work when there was not yet a technical specification. Even with the possibility of integrating technical models into the tool, the conversation simply flowed faster and better by quickly discussing things over their laptops and transmitting information and questions over instant messaging.</w:t>
-      </w:r>
-    </w:p>
-    <w:p>
-      <w:pPr>
-        <w:pStyle w:val="Normal"/>
-        <w:jc w:val="both"/>
-        <w:rPr>
-          <w:lang w:val="en-NZ"/>
-        </w:rPr>
-      </w:pPr>
-      <w:r>
-        <w:rPr>
-          <w:lang w:val="en-NZ"/>
-        </w:rPr>
-        <w:t>The area they though could bring the most potential for a feature like the play models, especially if an external render could be integrated with the tool, would be in communications with the client and the final presentation of their work, like with the poster presentation they were working on now. They mentioned it would be an extra layer of complexity for the presentation but would be an interesting and rather flashy tool to communicate the technical ideas of the project to the client in a way that would offer an advantage over a poster or a written report.</w:t>
-      </w:r>
-    </w:p>
-    <w:p>
-      <w:pPr>
-        <w:pStyle w:val="Heading2"/>
-        <w:rPr>
-          <w:lang w:val="en-NZ"/>
-        </w:rPr>
-      </w:pPr>
-      <w:r>
-        <w:rPr>
-          <w:lang w:val="en-NZ"/>
-        </w:rPr>
-        <w:t>6.5.3 Preliminary Analysis</w:t>
-      </w:r>
-    </w:p>
-    <w:p>
-      <w:pPr>
-        <w:pStyle w:val="Normal"/>
-        <w:jc w:val="both"/>
-        <w:rPr>
-          <w:lang w:val="en-NZ"/>
-        </w:rPr>
-      </w:pPr>
-      <w:r>
-        <w:rPr>
-          <w:lang w:val="en-NZ"/>
-        </w:rPr>
-        <w:t>The work done for the poster presentation represented the biggest instance in the course in which all the elements of collaborative work were present: students had to pool their resources and agreed on a solution. Work was interdependent, required planification, communication and coordination. Groups that were having a better time progressing with the project were those that manage to stablish a clear line of communication, learned to work with the needs and strengths of their team, were able to take decisions fast and incorporate feedback when received. Groups having problems with the course where those that had a problem looking beyond the individual tasks required of each role, had poor or non-existent channels of communication and were not using the spaces in the classroom to organize and check the status of their work.</w:t>
-      </w:r>
-    </w:p>
-    <w:p>
-      <w:pPr>
-        <w:pStyle w:val="Normal"/>
-        <w:jc w:val="both"/>
-        <w:rPr>
-          <w:lang w:val="en-NZ"/>
-        </w:rPr>
-      </w:pPr>
-      <w:r>
-        <w:rPr>
-          <w:lang w:val="en-NZ"/>
-        </w:rPr>
-        <w:t>The biweekly reports were an interesting window into the dynamics of many of the groups, common themes emerged in the reports and were linked to all the other observations in the classroom. Table 1 shows the codebook created to analyse the content of the biweekly reports. This analysis helped in identifying poor communication and lack of information about the project as the main conflict among groups. Confusion about the content of the deliverables and the technical specifications were present in all groups, but those that reported a clear organization of their work and took time to use the open work sessions to access the teaching staff, the TA team or even other groups managed to go beyond the administrative problems and reported consistent progress.</w:t>
-      </w:r>
-    </w:p>
-    <w:p>
-      <w:pPr>
-        <w:pStyle w:val="Caption"/>
-        <w:keepNext w:val="true"/>
-        <w:jc w:val="center"/>
-        <w:rPr>
-          <w:rFonts w:ascii="Calibri" w:hAnsi="Calibri" w:cs="Calibri" w:asciiTheme="majorHAnsi" w:cstheme="majorHAnsi" w:hAnsiTheme="majorHAnsi"/>
-          <w:sz w:val="24"/>
-          <w:szCs w:val="24"/>
-          <w:lang w:val="en-NZ"/>
-        </w:rPr>
-      </w:pPr>
-      <w:r>
-        <w:rPr>
-          <w:rFonts w:cs="Calibri" w:ascii="Calibri" w:hAnsi="Calibri" w:asciiTheme="majorHAnsi" w:cstheme="majorHAnsi" w:hAnsiTheme="majorHAnsi"/>
-          <w:sz w:val="24"/>
-          <w:szCs w:val="24"/>
-          <w:lang w:val="en-NZ"/>
-        </w:rPr>
         <w:t xml:space="preserve">Table </w:t>
       </w:r>
       <w:r>
         <w:rPr>
-          <w:rFonts w:cs="Calibri" w:ascii="Calibri" w:hAnsi="Calibri" w:asciiTheme="majorHAnsi" w:cstheme="majorHAnsi" w:hAnsiTheme="majorHAnsi"/>
+          <w:rFonts w:cs="Calibri" w:ascii="Calibri" w:hAnsi="Calibri"/>
           <w:sz w:val="24"/>
           <w:szCs w:val="24"/>
           <w:lang w:val="en-NZ"/>
@@ -8410,17 +8408,16 @@
         <w:pStyle w:val="Normal"/>
         <w:jc w:val="both"/>
         <w:rPr>
-          <w:rFonts w:ascii="Calibri" w:hAnsi="Calibri" w:cs="Calibri" w:asciiTheme="majorHAnsi" w:cstheme="majorHAnsi" w:hAnsiTheme="majorHAnsi"/>
-          <w:sz w:val="24"/>
-          <w:szCs w:val="24"/>
-          <w:lang w:val="en-NZ"/>
-        </w:rPr>
-      </w:pPr>
-      <w:r>
-        <w:rPr>
-          <w:rFonts w:cs="Calibri" w:ascii="Calibri" w:hAnsi="Calibri" w:asciiTheme="majorHAnsi" w:cstheme="majorHAnsi" w:hAnsiTheme="majorHAnsi"/>
-          <w:sz w:val="24"/>
-          <w:szCs w:val="24"/>
+          <w:rFonts w:ascii="Arial" w:hAnsi="Arial"/>
+          <w:sz w:val="22"/>
+          <w:szCs w:val="22"/>
+        </w:rPr>
+      </w:pPr>
+      <w:r>
+        <w:rPr>
+          <w:rFonts w:cs="Calibri" w:ascii="Arial" w:hAnsi="Arial" w:cstheme="majorHAnsi"/>
+          <w:sz w:val="22"/>
+          <w:szCs w:val="22"/>
           <w:lang w:val="en-NZ"/>
         </w:rPr>
         <w:t>The most telling evidence that WorkshopAR was having an influence over the work of a group, was when the students related or compared the software to an activity they were already doing or using some other application.</w:t>
@@ -8546,7 +8543,7 @@
       </w:r>
       <w:r>
         <w:rPr>
-          <w:rFonts w:cs="Calibri" w:ascii="Calibri" w:hAnsi="Calibri" w:asciiTheme="majorHAnsi" w:cstheme="majorHAnsi" w:hAnsiTheme="majorHAnsi"/>
+          <w:rFonts w:cs="Calibri" w:ascii="Calibri" w:hAnsi="Calibri"/>
           <w:sz w:val="24"/>
           <w:szCs w:val="24"/>
           <w:lang w:val="en-NZ"/>
@@ -8683,7 +8680,13 @@
         <w:rPr>
           <w:lang w:val="en-NZ"/>
         </w:rPr>
-        <w:t>Some relevant themes started to appear in these preliminary analyses that were related to how students were supporting their teamwork with different approaches inside and outside the classroom. Elements like easy to reach-out channels, QA sessions, and shared repositories contrasted with other channels that were seeing no use at all, like the public forums in the LMS. For WorkshopAR it was starting to be apparent that students were not so open to a work app but resonated the most with the idea of a social space, one that was meant to be inside the classroom.</w:t>
+        <w:t>It</w:t>
+      </w:r>
+      <w:r>
+        <w:rPr>
+          <w:lang w:val="en-NZ"/>
+        </w:rPr>
+        <w:t xml:space="preserve"> was starting to be apparent that students were not so open to a work app but resonated the most with the idea of a social space, one that was meant to be inside the classroom.</w:t>
       </w:r>
     </w:p>
     <w:p>
@@ -8697,7 +8700,19 @@
         <w:rPr>
           <w:lang w:val="en-NZ"/>
         </w:rPr>
-        <w:t>6.6 Weeks 10 to 13: Interim Client Report</w:t>
+        <w:t>6.</w:t>
+      </w:r>
+      <w:r>
+        <w:rPr>
+          <w:lang w:val="en-NZ"/>
+        </w:rPr>
+        <w:t>5</w:t>
+      </w:r>
+      <w:r>
+        <w:rPr>
+          <w:lang w:val="en-NZ"/>
+        </w:rPr>
+        <w:t xml:space="preserve"> Weeks 10 to 13: Interim Client Report</w:t>
       </w:r>
     </w:p>
     <w:p>
@@ -8771,7 +8786,19 @@
         <w:rPr>
           <w:lang w:val="en-NZ"/>
         </w:rPr>
-        <w:t>6.6.1 General Observations</w:t>
+        <w:t>6.</w:t>
+      </w:r>
+      <w:r>
+        <w:rPr>
+          <w:lang w:val="en-NZ"/>
+        </w:rPr>
+        <w:t>5</w:t>
+      </w:r>
+      <w:r>
+        <w:rPr>
+          <w:lang w:val="en-NZ"/>
+        </w:rPr>
+        <w:t>.1 General Observations</w:t>
       </w:r>
     </w:p>
     <w:p>
@@ -8879,56 +8906,56 @@
       </w:r>
       <w:r>
         <w:rPr>
+          <w:rFonts w:cs="Calibri" w:ascii="Calibri" w:hAnsi="Calibri"/>
+          <w:sz w:val="24"/>
+          <w:szCs w:val="24"/>
+          <w:lang w:val="en-NZ"/>
+        </w:rPr>
+        <w:fldChar w:fldCharType="begin"/>
+      </w:r>
+      <w:r>
+        <w:rPr>
+          <w:sz w:val="24"/>
+          <w:szCs w:val="24"/>
+          <w:rFonts w:cs="Calibri" w:ascii="Calibri" w:hAnsi="Calibri"/>
+          <w:lang w:val="en-NZ"/>
+        </w:rPr>
+        <w:instrText xml:space="preserve"> SEQ Figure \* ARABIC </w:instrText>
+      </w:r>
+      <w:r>
+        <w:rPr>
+          <w:sz w:val="24"/>
+          <w:szCs w:val="24"/>
+          <w:rFonts w:cs="Calibri" w:ascii="Calibri" w:hAnsi="Calibri"/>
+          <w:lang w:val="en-NZ"/>
+        </w:rPr>
+        <w:fldChar w:fldCharType="separate"/>
+      </w:r>
+      <w:r>
+        <w:rPr>
+          <w:sz w:val="24"/>
+          <w:szCs w:val="24"/>
+          <w:rFonts w:cs="Calibri" w:ascii="Calibri" w:hAnsi="Calibri"/>
+          <w:lang w:val="en-NZ"/>
+        </w:rPr>
+        <w:t>8</w:t>
+      </w:r>
+      <w:r>
+        <w:rPr>
+          <w:sz w:val="24"/>
+          <w:szCs w:val="24"/>
+          <w:rFonts w:cs="Calibri" w:ascii="Calibri" w:hAnsi="Calibri"/>
+          <w:lang w:val="en-NZ"/>
+        </w:rPr>
+        <w:fldChar w:fldCharType="end"/>
+      </w:r>
+      <w:r>
+        <w:rPr>
           <w:rFonts w:cs="Calibri" w:ascii="Calibri" w:hAnsi="Calibri" w:asciiTheme="majorHAnsi" w:cstheme="majorHAnsi" w:hAnsiTheme="majorHAnsi"/>
           <w:sz w:val="24"/>
           <w:szCs w:val="24"/>
           <w:lang w:val="en-NZ"/>
         </w:rPr>
-        <w:fldChar w:fldCharType="begin"/>
-      </w:r>
-      <w:r>
-        <w:rPr>
-          <w:sz w:val="24"/>
-          <w:szCs w:val="24"/>
-          <w:rFonts w:cs="Calibri" w:ascii="Calibri" w:hAnsi="Calibri"/>
-          <w:lang w:val="en-NZ"/>
-        </w:rPr>
-        <w:instrText xml:space="preserve"> SEQ Figure \* ARABIC </w:instrText>
-      </w:r>
-      <w:r>
-        <w:rPr>
-          <w:sz w:val="24"/>
-          <w:szCs w:val="24"/>
-          <w:rFonts w:cs="Calibri" w:ascii="Calibri" w:hAnsi="Calibri"/>
-          <w:lang w:val="en-NZ"/>
-        </w:rPr>
-        <w:fldChar w:fldCharType="separate"/>
-      </w:r>
-      <w:r>
-        <w:rPr>
-          <w:sz w:val="24"/>
-          <w:szCs w:val="24"/>
-          <w:rFonts w:cs="Calibri" w:ascii="Calibri" w:hAnsi="Calibri"/>
-          <w:lang w:val="en-NZ"/>
-        </w:rPr>
-        <w:t>8</w:t>
-      </w:r>
-      <w:r>
-        <w:rPr>
-          <w:sz w:val="24"/>
-          <w:szCs w:val="24"/>
-          <w:rFonts w:cs="Calibri" w:ascii="Calibri" w:hAnsi="Calibri"/>
-          <w:lang w:val="en-NZ"/>
-        </w:rPr>
-        <w:fldChar w:fldCharType="end"/>
-      </w:r>
-      <w:r>
-        <w:rPr>
-          <w:rFonts w:cs="Calibri" w:ascii="Calibri" w:hAnsi="Calibri" w:asciiTheme="majorHAnsi" w:cstheme="majorHAnsi" w:hAnsiTheme="majorHAnsi"/>
-          <w:sz w:val="24"/>
-          <w:szCs w:val="24"/>
-          <w:lang w:val="en-NZ"/>
-        </w:rPr>
         <w:t xml:space="preserve"> Focus on Individual Work During the Group Sessions</w:t>
       </w:r>
     </w:p>
@@ -9003,7 +9030,19 @@
         <w:rPr>
           <w:lang w:val="en-NZ"/>
         </w:rPr>
-        <w:t>6.6.2 Intervention with WorkshopAR</w:t>
+        <w:t>6.</w:t>
+      </w:r>
+      <w:r>
+        <w:rPr>
+          <w:lang w:val="en-NZ"/>
+        </w:rPr>
+        <w:t>5</w:t>
+      </w:r>
+      <w:r>
+        <w:rPr>
+          <w:lang w:val="en-NZ"/>
+        </w:rPr>
+        <w:t>.2 Intervention with WorkshopAR</w:t>
       </w:r>
     </w:p>
     <w:p>
@@ -9115,7 +9154,19 @@
         <w:rPr>
           <w:lang w:val="en-NZ"/>
         </w:rPr>
-        <w:t>6.6.3 Preliminary Analysis</w:t>
+        <w:t>6.</w:t>
+      </w:r>
+      <w:r>
+        <w:rPr>
+          <w:lang w:val="en-NZ"/>
+        </w:rPr>
+        <w:t>5</w:t>
+      </w:r>
+      <w:r>
+        <w:rPr>
+          <w:lang w:val="en-NZ"/>
+        </w:rPr>
+        <w:t>.3 Preliminary Analysis</w:t>
       </w:r>
     </w:p>
     <w:p>
@@ -9371,7 +9422,19 @@
         <w:rPr>
           <w:lang w:val="en-NZ"/>
         </w:rPr>
-        <w:t>6.7 Iterations over the semester break</w:t>
+        <w:t>6.</w:t>
+      </w:r>
+      <w:r>
+        <w:rPr>
+          <w:lang w:val="en-NZ"/>
+        </w:rPr>
+        <w:t>6</w:t>
+      </w:r>
+      <w:r>
+        <w:rPr>
+          <w:lang w:val="en-NZ"/>
+        </w:rPr>
+        <w:t xml:space="preserve"> Weeks 14 to 20: Second Semester Workout</w:t>
       </w:r>
     </w:p>
     <w:p>
@@ -9386,22 +9449,7 @@
         <w:rPr>
           <w:lang w:val="en-NZ"/>
         </w:rPr>
-        <w:t>At the end of the first semester of the course the students had worked in understanding the requirements of the construction development scenario proposed to them, they built an architectural design based on the technical and social context of the project and communicated their ideas to the client, received feedback of their work and iterated over their design for the next semester.</w:t>
-      </w:r>
-    </w:p>
-    <w:p>
-      <w:pPr>
-        <w:pStyle w:val="Normal"/>
-        <w:jc w:val="both"/>
-        <w:rPr>
-          <w:lang w:val="en-NZ"/>
-        </w:rPr>
-      </w:pPr>
-      <w:r>
-        <w:rPr>
-          <w:lang w:val="en-NZ"/>
-        </w:rPr>
-        <w:t>During the activities done for the course, the students were able to demonstrate:</w:t>
+        <w:t>This last section of observations will encompass all the work done during the second semester. The more general view of the activities of the students during this second workout is due to a couple of factors:</w:t>
       </w:r>
     </w:p>
     <w:p>
@@ -9420,7 +9468,7 @@
         <w:rPr>
           <w:lang w:val="en-NZ"/>
         </w:rPr>
-        <w:t>Organisation in the structure of their work so that information could be gathered, distributed and discussed to make decisions and develop the proposal.</w:t>
+        <w:t>The activities proposed for the groups were the same as in the previous semester, a poster, and a final client report. This time the aim was to refine the design of the project.</w:t>
       </w:r>
     </w:p>
     <w:p>
@@ -9439,7 +9487,7 @@
         <w:rPr>
           <w:lang w:val="en-NZ"/>
         </w:rPr>
-        <w:t>A communal understanding of the problem used to present a coherent solution to the client.</w:t>
+        <w:t>Of the twelve weeks of work for the semester, only six were observed, those dedicated to the work on the poster presentation since it was the activity that demonstrated the most collaborative work the previous semester.</w:t>
       </w:r>
     </w:p>
     <w:p>
@@ -9458,7 +9506,7 @@
         <w:rPr>
           <w:lang w:val="en-NZ"/>
         </w:rPr>
-        <w:t>Mechanisms to organise the group, manage conflict and respond to external issues.</w:t>
+        <w:t>The observations were even more focused, with the specific objective of evaluating the changes made to the physical disposition of the tool and to the annotations and debate features.</w:t>
       </w:r>
     </w:p>
     <w:p>
@@ -9473,7 +9521,307 @@
         <w:rPr>
           <w:lang w:val="en-NZ"/>
         </w:rPr>
-        <w:t>WorkshopAR was gradually introduced to support these instances of collaborative learning, and despite some mishaps in timing and approach, the software promoted positive behaviours that integrated the best with the work of the group or that incited the most positive response on the students by using:</w:t>
+        <w:t>Besides the changes made to the presentation of information in the LMS, the structure of the course was the same, the groups were firmly stablished by then and the overall objective of the project was clear. The biggest change on the dynamics of the classroom session was on the TA team and the procedure implemented for the students to seek information about the project, as will be described in the next section.</w:t>
+      </w:r>
+    </w:p>
+    <w:p>
+      <w:pPr>
+        <w:pStyle w:val="Heading2"/>
+        <w:rPr>
+          <w:lang w:val="en-NZ"/>
+        </w:rPr>
+      </w:pPr>
+      <w:r>
+        <w:rPr>
+          <w:lang w:val="en-NZ"/>
+        </w:rPr>
+        <w:t>6.</w:t>
+      </w:r>
+      <w:r>
+        <w:rPr>
+          <w:lang w:val="en-NZ"/>
+        </w:rPr>
+        <w:t>6</w:t>
+      </w:r>
+      <w:r>
+        <w:rPr>
+          <w:lang w:val="en-NZ"/>
+        </w:rPr>
+        <w:t>.1 General Observations</w:t>
+      </w:r>
+    </w:p>
+    <w:p>
+      <w:pPr>
+        <w:pStyle w:val="Normal"/>
+        <w:jc w:val="both"/>
+        <w:rPr>
+          <w:lang w:val="en-NZ"/>
+        </w:rPr>
+      </w:pPr>
+      <w:r>
+        <w:rPr>
+          <w:lang w:val="en-NZ"/>
+        </w:rPr>
+        <w:t>The first substantial change on the structure of the course was on the role of the TA group. Despite being an interesting mechanic to have all the TAs at disposition of the students during the classroom sessions, it also meant that the teaching staff had to also coordinate with the TA team all the information and the answers that were given to the students about different aspects of the project. Despite the benefits of having many TAs helping in the classroom, the confusion created by contradictory answers was not helping the students to progress in their project efficiently. The TA group would now rotate in each session, and the students would have to work with the specialties that were present in the classroom in any given session. Less flexibility for the students but easier to administrate for the teaching staff.</w:t>
+      </w:r>
+    </w:p>
+    <w:p>
+      <w:pPr>
+        <w:pStyle w:val="Normal"/>
+        <w:jc w:val="both"/>
+        <w:rPr>
+          <w:lang w:val="en-NZ"/>
+        </w:rPr>
+      </w:pPr>
+      <w:r>
+        <w:rPr>
+          <w:lang w:val="en-NZ"/>
+        </w:rPr>
+        <w:t>To support the lack of TAs present for this second semester, the students were strongly encouraged to use the forum tool in the LMS to keep information flowing from the teaching staff and from the students themselves. During the following weeks it was possible to see the lecturers and the TA redirecting the students to the forum every time they asked a question, especially those related to technical information about the project. Another interesting activity was to encourage the students to write a question they just asked in the forum. The teaching staff would provide an answer through the forum instead of doing it directly, enforcing the use of the tool.</w:t>
+      </w:r>
+    </w:p>
+    <w:p>
+      <w:pPr>
+        <w:pStyle w:val="Normal"/>
+        <w:jc w:val="both"/>
+        <w:rPr>
+          <w:lang w:val="en-NZ"/>
+        </w:rPr>
+      </w:pPr>
+      <w:r>
+        <w:rPr>
+          <w:lang w:val="en-NZ"/>
+        </w:rPr>
+        <w:t>It was interesting to observe that the forum was growing little by little, and that the students were using it to communicate with other groups, with the teaching staff and creating a communal repository of knowledge, albeit in a bit forced manner. It was an interesting approach to the use of a forum tool that was observed to be failing in the previous semester, mainly because the students saw no value in it, but now it was strongly integrated to their workflow.</w:t>
+      </w:r>
+    </w:p>
+    <w:p>
+      <w:pPr>
+        <w:pStyle w:val="Normal"/>
+        <w:jc w:val="both"/>
+        <w:rPr>
+          <w:lang w:val="en-NZ"/>
+        </w:rPr>
+      </w:pPr>
+      <w:r>
+        <w:rPr>
+          <w:lang w:val="en-NZ"/>
+        </w:rPr>
+        <w:t>Team D was also the protagonist during the second semester, it was valuable to have the opportunity to test most of the new approaches of WorkshopAR with them since they had experience with the previous versions of the tool and were familiar with the context of the research.</w:t>
+      </w:r>
+    </w:p>
+    <w:p>
+      <w:pPr>
+        <w:pStyle w:val="Normal"/>
+        <w:jc w:val="both"/>
+        <w:rPr>
+          <w:lang w:val="en-NZ"/>
+        </w:rPr>
+      </w:pPr>
+      <w:r>
+        <w:rPr>
+          <w:lang w:val="en-NZ"/>
+        </w:rPr>
+        <w:t>The distinction between groups that had formed during the previous semester and that was described in section 6.6.1 was also noticeable during the second semester. Some groups, like Team D, had a good head start from the previous semester and their work focused more on refining the project. On the other hand, other groups had to reform, keep working with less team members or start with a new proposal, creating a more intense scenario for their work.</w:t>
+      </w:r>
+    </w:p>
+    <w:p>
+      <w:pPr>
+        <w:pStyle w:val="Normal"/>
+        <w:jc w:val="both"/>
+        <w:rPr>
+          <w:lang w:val="en-NZ"/>
+        </w:rPr>
+      </w:pPr>
+      <w:r>
+        <w:rPr>
+          <w:lang w:val="en-NZ"/>
+        </w:rPr>
+        <w:t>Team D obtained very good results in the previous semester, and they were a bit complacent with their work. The general observations described for weeks ten to thirteen remained present throughout the new semester: collaboration was minimal because the intensity of the work was also down, and they kept coming to the classroom because it was the best place to advance in their work throughout the week. It could also be added that this semester was also the last for many of the students, which saw this project as the very last effort before graduation and just wanted to get over with it.</w:t>
+      </w:r>
+    </w:p>
+    <w:p>
+      <w:pPr>
+        <w:pStyle w:val="Normal"/>
+        <w:jc w:val="both"/>
+        <w:rPr>
+          <w:lang w:val="en-NZ"/>
+        </w:rPr>
+      </w:pPr>
+      <w:r>
+        <w:rPr>
+          <w:lang w:val="en-NZ"/>
+        </w:rPr>
+        <w:t>Team E offered an interesting contrast. First, they will be referred as Team E just for simplicity, because the observation took place when several students were working together with the aid of one of the lecture</w:t>
+      </w:r>
+      <w:r>
+        <w:rPr>
+          <w:lang w:val="en-NZ"/>
+        </w:rPr>
+        <w:t>r</w:t>
+      </w:r>
+      <w:r>
+        <w:rPr>
+          <w:lang w:val="en-NZ"/>
+        </w:rPr>
+        <w:t>s, but they were not necessarily from the same group. In fact, some members of Team B were present there. They commented that they had a lot of communication problems towards the end of the poster presentation principally because a lot of the members never showed up for class. At the end, the two members present tried their best to gather as much information as possible to later coordinate with the rest of the group via instant messaging. It was not ideal, but it was the process that worked best for them.</w:t>
+      </w:r>
+    </w:p>
+    <w:p>
+      <w:pPr>
+        <w:pStyle w:val="Normal"/>
+        <w:jc w:val="both"/>
+        <w:rPr>
+          <w:lang w:val="en-NZ"/>
+        </w:rPr>
+      </w:pPr>
+      <w:r>
+        <w:rPr>
+          <w:lang w:val="en-NZ"/>
+        </w:rPr>
+        <w:t xml:space="preserve">As with Team D, the work in Tem E consisted mostly of individual efforts using computers and the direct help of the lecturer, who was giving feedback to the students and making some conversation to help them think more critically about the tasks they were doing. </w:t>
+      </w:r>
+    </w:p>
+    <w:p>
+      <w:pPr>
+        <w:pStyle w:val="Normal"/>
+        <w:jc w:val="both"/>
+        <w:rPr>
+          <w:lang w:val="en-NZ"/>
+        </w:rPr>
+      </w:pPr>
+      <w:r>
+        <w:rPr>
+          <w:lang w:val="en-NZ"/>
+        </w:rPr>
+        <w:t>Although information was flowing better between the students, the work observed turned out more individual since the groups were mostly linked by the architectural design they were working on in the previous semester rather than by the need for collaboration. There was not much value any more to be present in the classroom session, therefore, assistance was very low.</w:t>
+      </w:r>
+    </w:p>
+    <w:p>
+      <w:pPr>
+        <w:pStyle w:val="Normal"/>
+        <w:jc w:val="both"/>
+        <w:rPr>
+          <w:lang w:val="en-NZ"/>
+        </w:rPr>
+      </w:pPr>
+      <w:r>
+        <w:rPr>
+          <w:lang w:val="en-NZ"/>
+        </w:rPr>
+        <w:t>The situation was similar to what was observed during the last weeks of the previous semester, and for the activities with WorkshopAR, there were less opportunities for more extensive discussions as the ones found previously, but it was possible to gather some interesting responses to the changes made to the approach with the tool, as detailed in the next section.</w:t>
+      </w:r>
+    </w:p>
+    <w:p>
+      <w:pPr>
+        <w:pStyle w:val="Heading2"/>
+        <w:rPr>
+          <w:lang w:val="en-NZ"/>
+        </w:rPr>
+      </w:pPr>
+      <w:r>
+        <w:rPr>
+          <w:lang w:val="en-NZ"/>
+        </w:rPr>
+        <w:t>6.</w:t>
+      </w:r>
+      <w:r>
+        <w:rPr>
+          <w:lang w:val="en-NZ"/>
+        </w:rPr>
+        <w:t>6</w:t>
+      </w:r>
+      <w:r>
+        <w:rPr>
+          <w:lang w:val="en-NZ"/>
+        </w:rPr>
+        <w:t>.2 Intervention with WorkshopAR</w:t>
+      </w:r>
+    </w:p>
+    <w:p>
+      <w:pPr>
+        <w:pStyle w:val="Normal"/>
+        <w:jc w:val="both"/>
+        <w:rPr>
+          <w:lang w:val="en-NZ"/>
+        </w:rPr>
+      </w:pPr>
+      <w:r>
+        <w:rPr>
+          <w:lang w:val="en-NZ"/>
+        </w:rPr>
+        <w:t>The observations with Teams D and E had the same objectives in mind: test the clamp arm set up and the adjustments to the social communication tools added to the annotations and debate tools. Other features of WorkshopAR also undertook some adjustments that had been tested more thoroughly during the unstructured testing stages, and it was considered more interesting for the observations to focus on the changes mentioned initially.</w:t>
+      </w:r>
+    </w:p>
+    <w:p>
+      <w:pPr>
+        <w:pStyle w:val="Normal"/>
+        <w:jc w:val="both"/>
+        <w:rPr>
+          <w:lang w:val="en-NZ"/>
+        </w:rPr>
+      </w:pPr>
+      <w:r>
+        <w:rPr>
+          <w:lang w:val="en-NZ"/>
+        </w:rPr>
+        <w:t>The process followed for Team E was slightly different since they needed a quick tour of WorkshopAR. Their general response to those initial features did not add much to what had already been documented in previous sections. Team D recognized the changes done to the original proposal, which also included an updated UI look, so their response was very positive in general and highlighted the fact that the tool was evolving based on what had been discussed previously with them.</w:t>
+      </w:r>
+    </w:p>
+    <w:p>
+      <w:pPr>
+        <w:pStyle w:val="Heading3"/>
+        <w:rPr>
+          <w:lang w:val="en-NZ"/>
+        </w:rPr>
+      </w:pPr>
+      <w:r>
+        <w:rPr>
+          <w:lang w:val="en-NZ"/>
+        </w:rPr>
+        <w:t>6.</w:t>
+      </w:r>
+      <w:r>
+        <w:rPr>
+          <w:lang w:val="en-NZ"/>
+        </w:rPr>
+        <w:t>6</w:t>
+      </w:r>
+      <w:r>
+        <w:rPr>
+          <w:lang w:val="en-NZ"/>
+        </w:rPr>
+        <w:t>.2.1 Set up with the clamp arms</w:t>
+      </w:r>
+    </w:p>
+    <w:p>
+      <w:pPr>
+        <w:pStyle w:val="Normal"/>
+        <w:jc w:val="both"/>
+        <w:rPr>
+          <w:lang w:val="en-NZ"/>
+        </w:rPr>
+      </w:pPr>
+      <w:r>
+        <w:rPr>
+          <w:lang w:val="en-NZ"/>
+        </w:rPr>
+        <w:t>The idea with the clamp arms was aimed at exploring how the phone could be used in the classroom in a way that was seen as an enhancement and not a distraction. Studies analysing this same problem in other contexts and through different perspectives can be found in Forsling (2023), Flanigan et al. (2023), Fälth &amp; Selenius (2024) and Consoli et al. (2025). The idea was also strongly linked to the way students had been observed to work for the Industry Project group, setting up a table with the equipment they were using to work during the classroom session. They had access to the teaching staff and to all the other activities in the classroom without the need to take down the setup.</w:t>
+      </w:r>
+    </w:p>
+    <w:p>
+      <w:pPr>
+        <w:pStyle w:val="Normal"/>
+        <w:jc w:val="both"/>
+        <w:rPr>
+          <w:lang w:val="en-NZ"/>
+        </w:rPr>
+      </w:pPr>
+      <w:r>
+        <w:rPr>
+          <w:lang w:val="en-NZ"/>
+        </w:rPr>
+        <w:t>Section 5.2.4.1 gives more details of the implementation of this idea and the interaction design done around it. During the observations, some problems were found with the setup, mostly at the usability level:</w:t>
       </w:r>
     </w:p>
     <w:p>
@@ -9492,7 +9840,7 @@
         <w:rPr>
           <w:lang w:val="en-NZ"/>
         </w:rPr>
-        <w:t>Visual structure to organize the work session and other activities like brainstorming or debates.</w:t>
+        <w:t>The setup was a very intensive process, and it required access to a lot of resources like the clamp arms, a table and enough time in the work session for the whole ordeal to be worth of the time expended.</w:t>
       </w:r>
     </w:p>
     <w:p>
@@ -9511,7 +9859,26 @@
         <w:rPr>
           <w:lang w:val="en-NZ"/>
         </w:rPr>
-        <w:t>Communication features present in the annotations and debate tools.</w:t>
+        <w:t>It eliminated the flexibility of creating a room in any space the group found available, running in contradiction with one of the core design principles of the tool.</w:t>
+      </w:r>
+    </w:p>
+    <w:p>
+      <w:pPr>
+        <w:pStyle w:val="ListParagraph"/>
+        <w:numPr>
+          <w:ilvl w:val="0"/>
+          <w:numId w:val="24"/>
+        </w:numPr>
+        <w:jc w:val="both"/>
+        <w:rPr>
+          <w:lang w:val="en-NZ"/>
+        </w:rPr>
+      </w:pPr>
+      <w:r>
+        <w:rPr>
+          <w:lang w:val="en-NZ"/>
+        </w:rPr>
+        <w:t>It gave too much emphasis to the phone, which was also in contradiction with the initial premise of the solution.</w:t>
       </w:r>
     </w:p>
     <w:p>
@@ -9526,7 +9893,7 @@
         <w:rPr>
           <w:lang w:val="en-NZ"/>
         </w:rPr>
-        <w:t>The semester break was used to work on those functionalities the most so variations of different ideas could be tested during the second semester. It was of special interest to explore the idea of offering the students means to configure the level of structure implemented by the software, as well as to expand the use of visual elements in the annotations and debates tools to promote more social activities around them. Sections 5.2.3.3 and 5.2.3.4 detail the development of those features.</w:t>
+        <w:t>Team E offered the most positive remarks to the idea, comparing the setup to a streaming rig used to create content in a professional way. That comment prompted a conversation about having access to a space that already provided the setup and that could be used to work in a hot desk fashion, like how some creative labs work in faculties like design or art. The setup could be adapted to be a laboratory for digital collaborative work, offering all the resources needed for the students. It was an interesting comparison that came from conversations with the students, and although it would run in contradiction with the premise of a flexible room for the group and the BYOD philosophy, it could be the basis for a future exploration of the idea.</w:t>
       </w:r>
     </w:p>
     <w:p>
@@ -9541,7 +9908,7 @@
         <w:rPr>
           <w:lang w:val="en-NZ"/>
         </w:rPr>
-        <w:t>It was also an opportunity to acknowledge some of the biggest issues the students found with the use of WorkshopAR, namely, trying to ease the process of hopping from the computer to the phone and the reticence several students had to use their phone in what could be considered a work environment.</w:t>
+        <w:t>Team D was more critical of the setup with the clamp arms. In was possible to run the whole configuration process of WorkshopAR with the team and retest the functionalities while using the setup. The most telling observation was that the students quickly removed the phone from the clamps to make the process easier, giving a strong impression that the idea was not a practical solution.</w:t>
       </w:r>
     </w:p>
     <w:p>
@@ -9556,7 +9923,7 @@
         <w:rPr>
           <w:lang w:val="en-NZ"/>
         </w:rPr>
-        <w:t>The proposed solution was to use a set of clamp arm holders to keep the point of view of the phone fixed, but still allowing some manoeuvrability. The plan was to offer a way to keep the phone active during the session, acting like a second screen to be used along the computers, all in hope of giving the whole set up a more “serious” look that would encourage the use of the phone in a more positive way. Section 5.2.4.1 details more this idea.</w:t>
+        <w:t>The clamp arms setup tried to give the interactions with the phone a better position inside the activity, more in line with the working mindset the group wanted to follow. Some students saw the potential in the setup to create that working space, but others still felt that they were playing with their phones. A third group felt annoyed that they were losing access to their phone and using it only for work, and not for other activities, which was in direct contrapositions to all the other attitudes seen before.</w:t>
       </w:r>
     </w:p>
     <w:p>
@@ -9571,7 +9938,179 @@
         <w:rPr>
           <w:lang w:val="en-NZ"/>
         </w:rPr>
-        <w:t>The teaching staff also used the break period to adjust aspects of the course that were causing problems among the students. There were two main concerns that were detected in varied degrees among all the groups:</w:t>
+        <w:t>This is a situation in which it is difficult to find a solution that accommodates every perspective, and with any proposal, at the end someone will feel alienated. A stationary setup using non-smartphone mobile platform like tablets could create an interesting solution using AR. Projects using this idea to provide an assistance tool in diverse scenarios can be found in Barbieri et al. (2025) or Ma et al. (2026).</w:t>
+      </w:r>
+    </w:p>
+    <w:p>
+      <w:pPr>
+        <w:pStyle w:val="Heading3"/>
+        <w:rPr>
+          <w:lang w:val="en-NZ"/>
+        </w:rPr>
+      </w:pPr>
+      <w:r>
+        <w:rPr>
+          <w:lang w:val="en-NZ"/>
+        </w:rPr>
+        <w:t>6.</w:t>
+      </w:r>
+      <w:r>
+        <w:rPr>
+          <w:lang w:val="en-NZ"/>
+        </w:rPr>
+        <w:t>6</w:t>
+      </w:r>
+      <w:r>
+        <w:rPr>
+          <w:lang w:val="en-NZ"/>
+        </w:rPr>
+        <w:t>.2.2 Communication Features and Emotes</w:t>
+      </w:r>
+    </w:p>
+    <w:p>
+      <w:pPr>
+        <w:pStyle w:val="Normal"/>
+        <w:jc w:val="both"/>
+        <w:rPr>
+          <w:lang w:val="en-NZ"/>
+        </w:rPr>
+      </w:pPr>
+      <w:r>
+        <w:rPr>
+          <w:lang w:val="en-NZ"/>
+        </w:rPr>
+        <w:t>Based on the comments and reactions of the students, as well as the participants in the unstructured tests, it was identified that the visuals used to quickly convey information in the debate feature could be used by the students in other contexts, creating more freedom and flexibility in the communication features provided by WorkshopAR.</w:t>
+      </w:r>
+    </w:p>
+    <w:p>
+      <w:pPr>
+        <w:pStyle w:val="Normal"/>
+        <w:jc w:val="both"/>
+        <w:rPr>
+          <w:lang w:val="en-NZ"/>
+        </w:rPr>
+      </w:pPr>
+      <w:r>
+        <w:rPr>
+          <w:lang w:val="en-NZ"/>
+        </w:rPr>
+        <w:t>The same type of visuals was implemented in the annotation feature, and the unstructured configuration of the debates also allowed for a free flow of conversations that had access to the visuals meant initially for the responses. Originally, the visuals were used to convey information like yes, no or an option in a multi-option question, but students commented that the responses reminded them of the emojis use in text messages, prompting the idea of using “floating” emojis that could add some context or connotation to a conversation.</w:t>
+      </w:r>
+    </w:p>
+    <w:p>
+      <w:pPr>
+        <w:pStyle w:val="Normal"/>
+        <w:jc w:val="both"/>
+        <w:rPr>
+          <w:lang w:val="en-NZ"/>
+        </w:rPr>
+      </w:pPr>
+      <w:r>
+        <w:rPr>
+          <w:lang w:val="en-NZ"/>
+        </w:rPr>
+        <w:t>The idea was tested in two different scenarios. The first one offered a more conventional activity using highly structured questions in the debate tool and waiting for the participants to provide answers through the tool. The idea was to provide an opportunity for a real discussion to take place among the students, but neither Team D nor E engaged significantly in that way. They interacted briefly only through mock-up questions about the progress of the project or technical aspects of the design without much substance in them.</w:t>
+      </w:r>
+    </w:p>
+    <w:p>
+      <w:pPr>
+        <w:pStyle w:val="Normal"/>
+        <w:jc w:val="both"/>
+        <w:rPr>
+          <w:lang w:val="en-NZ"/>
+        </w:rPr>
+      </w:pPr>
+      <w:r>
+        <w:rPr>
+          <w:lang w:val="en-NZ"/>
+        </w:rPr>
+        <w:t>Observed behaviours in both teams were similar: some students preferred more textual answers while other chose the more visual version, with no strong observable tendency for one option or the other. The graphical cues offered by the app like colours and symbols were easily understood, students could read the information quickly and react to the information communicated by their peers without a problem. Technically it was a sound implementation, but it was not possible to observe any substantial behaviour with the current approach to work that both teams had during the classroom session.</w:t>
+      </w:r>
+    </w:p>
+    <w:p>
+      <w:pPr>
+        <w:pStyle w:val="Normal"/>
+        <w:jc w:val="both"/>
+        <w:rPr>
+          <w:lang w:val="en-NZ"/>
+        </w:rPr>
+      </w:pPr>
+      <w:r>
+        <w:rPr>
+          <w:lang w:val="en-NZ"/>
+        </w:rPr>
+        <w:t>The second scenario was more open and used the unstructured version of the debate function to let the students openly talk and discuss things during the work session. This setup prompted more conversation than the previous scenario, student tested more the unstructured questions and also started to be more playful with the activity, proposing question unrelated to the project and more humorous uses of the emotes, taking advantage of the visuals provided to give a stronger emotional context to whatever was the centre of discussion.</w:t>
+      </w:r>
+    </w:p>
+    <w:p>
+      <w:pPr>
+        <w:pStyle w:val="Normal"/>
+        <w:jc w:val="both"/>
+        <w:rPr>
+          <w:lang w:val="en-NZ"/>
+        </w:rPr>
+      </w:pPr>
+      <w:r>
+        <w:rPr>
+          <w:lang w:val="en-NZ"/>
+        </w:rPr>
+        <w:t>Team D found the free conversation very enticing, and it was interesting to see, after the activity itself was already over, that the group was coming back to the tool to show their reactions to a comment or a situation during their work. Most of those conversations were unrelated to the project and played more for fun than for actual communication, but it was telling that the tool was used to properly convey meaning and was able to be integrated naturally into the actions of the students.</w:t>
+      </w:r>
+    </w:p>
+    <w:p>
+      <w:pPr>
+        <w:pStyle w:val="Normal"/>
+        <w:jc w:val="both"/>
+        <w:rPr>
+          <w:lang w:val="en-NZ"/>
+        </w:rPr>
+      </w:pPr>
+      <w:r>
+        <w:rPr>
+          <w:lang w:val="en-NZ"/>
+        </w:rPr>
+        <w:t>Team E on the other hand did not show any instance of such natural use of the tool, but in general they were not speaking between them at all. The mood of the session was more relaxed with Team D than with Team E, which also promoted a better environment for casual conversation and a more playful attitude, which seemed to be the better context for the use of the tool.</w:t>
+      </w:r>
+    </w:p>
+    <w:p>
+      <w:pPr>
+        <w:pStyle w:val="Heading2"/>
+        <w:rPr>
+          <w:lang w:val="en-NZ"/>
+        </w:rPr>
+      </w:pPr>
+      <w:r>
+        <w:rPr>
+          <w:lang w:val="en-NZ"/>
+        </w:rPr>
+        <w:t>6.</w:t>
+      </w:r>
+      <w:r>
+        <w:rPr>
+          <w:lang w:val="en-NZ"/>
+        </w:rPr>
+        <w:t>6</w:t>
+      </w:r>
+      <w:r>
+        <w:rPr>
+          <w:lang w:val="en-NZ"/>
+        </w:rPr>
+        <w:t>.3 Preliminary Analysis</w:t>
+      </w:r>
+    </w:p>
+    <w:p>
+      <w:pPr>
+        <w:pStyle w:val="Normal"/>
+        <w:jc w:val="both"/>
+        <w:rPr>
+          <w:lang w:val="en-NZ"/>
+        </w:rPr>
+      </w:pPr>
+      <w:r>
+        <w:rPr>
+          <w:lang w:val="en-NZ"/>
+        </w:rPr>
+        <w:t>These weeks represented the end of the observation stage, and based on the previous preliminary processes of analysis, it is possible to summarize some of the most important themes extracted from the observations gathered:</w:t>
       </w:r>
     </w:p>
     <w:p>
@@ -9590,7 +10129,7 @@
         <w:rPr>
           <w:lang w:val="en-NZ"/>
         </w:rPr>
-        <w:t>It was difficult to access the information needed to develop the project. It happened the most when students were trying to understand the specific requirements of each role for the activities of the project. These questions came from all students in different points throughout the semester, despite the information being present in the LMS. It was not clear or difficult to find.</w:t>
+        <w:t>The dynamics observer for any group would determine if they preferred a more structured approach to teamwork, needing more guidance from the available teaching staff and using more the tools provided by WorkshopAR to help them in the first steps of consolidating the group.</w:t>
       </w:r>
     </w:p>
     <w:p>
@@ -9609,66 +10148,7 @@
         <w:rPr>
           <w:lang w:val="en-NZ"/>
         </w:rPr>
-        <w:t>The role of the CM did not have a clear part in the workflow proposed for the project. Even after clarifying the scope of the project, it was not clear what should be the focus of their work and what to report in the posters or the interim report. A similar scenario happened to the AE, who had a clear and intensive goal at the beginning of the project, but after the proposal was finished, it was not clear what should be the next step of their work.</w:t>
-      </w:r>
-    </w:p>
-    <w:p>
-      <w:pPr>
-        <w:pStyle w:val="Normal"/>
-        <w:jc w:val="both"/>
-        <w:rPr>
-          <w:lang w:val="en-NZ"/>
-        </w:rPr>
-      </w:pPr>
-      <w:r>
-        <w:rPr>
-          <w:lang w:val="en-NZ"/>
-        </w:rPr>
-        <w:t>The teaching team dedicated a considerable effort to restructure the LMS so each role could navigate better the extensive documentation of the project and find relevant information about their work and the marking criteria of each deliverable. The team also decided to enforce more the use of the public forum provided by the LMS, adding all the information, questions and answers gathered during the QA sessions. The students were encouraged to use the forum instead of waiting for the classroom session to contact the lecturers or other students.</w:t>
-      </w:r>
-    </w:p>
-    <w:p>
-      <w:pPr>
-        <w:pStyle w:val="Normal"/>
-        <w:jc w:val="both"/>
-        <w:rPr>
-          <w:lang w:val="en-NZ"/>
-        </w:rPr>
-      </w:pPr>
-      <w:r>
-        <w:rPr>
-          <w:lang w:val="en-NZ"/>
-        </w:rPr>
-        <w:t>Issues with the balance of work between the different roles, as well as some aspect of how the simulation experience with the “client”, were acknowledge and discussed, but needed more time and work for a solution with more complex changes to be implemented and were postponed for the next cohort of the course. Some of the ideas related to this topic will be discussed in section 6.10.</w:t>
-      </w:r>
-    </w:p>
-    <w:p>
-      <w:pPr>
-        <w:pStyle w:val="Heading1"/>
-        <w:rPr>
-          <w:lang w:val="en-NZ"/>
-        </w:rPr>
-      </w:pPr>
-      <w:r>
-        <w:rPr>
-          <w:lang w:val="en-NZ"/>
-        </w:rPr>
-        <w:t>6.8 Weeks 14 to 20: Second Semester Workout</w:t>
-      </w:r>
-    </w:p>
-    <w:p>
-      <w:pPr>
-        <w:pStyle w:val="Normal"/>
-        <w:jc w:val="both"/>
-        <w:rPr>
-          <w:lang w:val="en-NZ"/>
-        </w:rPr>
-      </w:pPr>
-      <w:r>
-        <w:rPr>
-          <w:lang w:val="en-NZ"/>
-        </w:rPr>
-        <w:t>This last section of observations will encompass all the work done during the second semester. The more general view of the activities of the students during this second workout is due to a couple of factors:</w:t>
+        <w:t>Better stablished groups would prefer a more flexible approach to the activity, relying in the mechanisms they themselves had built and finding any external intervention, either the lecturers or the use of WorkshopAR, more as a hindrance than an actual help.</w:t>
       </w:r>
     </w:p>
     <w:p>
@@ -9676,7 +10156,7 @@
         <w:pStyle w:val="ListParagraph"/>
         <w:numPr>
           <w:ilvl w:val="0"/>
-          <w:numId w:val="26"/>
+          <w:numId w:val="25"/>
         </w:numPr>
         <w:jc w:val="both"/>
         <w:rPr>
@@ -9687,7 +10167,7 @@
         <w:rPr>
           <w:lang w:val="en-NZ"/>
         </w:rPr>
-        <w:t>The activities proposed for the groups were the same as in the previous semester, a poster, and a final client report. This time the aim was to refine the design of the project.</w:t>
+        <w:t>In either case, the need for structure would be greater at the beginning and would fade towards the end of the project, either because the mechanisms for groupwork are clear or because the tool is not helping in creating of reinforcing those mechanisms.</w:t>
       </w:r>
     </w:p>
     <w:p>
@@ -9695,7 +10175,7 @@
         <w:pStyle w:val="ListParagraph"/>
         <w:numPr>
           <w:ilvl w:val="0"/>
-          <w:numId w:val="26"/>
+          <w:numId w:val="25"/>
         </w:numPr>
         <w:jc w:val="both"/>
         <w:rPr>
@@ -9706,7 +10186,7 @@
         <w:rPr>
           <w:lang w:val="en-NZ"/>
         </w:rPr>
-        <w:t>Of the twelve weeks of work for the semester, only six were observed, those dedicated to the work on the poster presentation since it was the activity that demonstrated the most collaborative work the previous semester.</w:t>
+        <w:t>Digital tools need to be able to adapt and connect to the environment they live in. All students have their own set of tools and favourite channels of communication than often collide with any other alternative or even with the official channels proposed by the course.</w:t>
       </w:r>
     </w:p>
     <w:p>
@@ -9714,7 +10194,7 @@
         <w:pStyle w:val="ListParagraph"/>
         <w:numPr>
           <w:ilvl w:val="0"/>
-          <w:numId w:val="26"/>
+          <w:numId w:val="25"/>
         </w:numPr>
         <w:jc w:val="both"/>
         <w:rPr>
@@ -9725,7 +10205,7 @@
         <w:rPr>
           <w:lang w:val="en-NZ"/>
         </w:rPr>
-        <w:t>The observations were even more focused, with the specific objective of evaluating the changes made to the physical disposition of the tool and to the annotations and debate features.</w:t>
+        <w:t>Visual communication is a powerful tool to promote all sort of behaviours. Activities related to the organization of ideas, communication between peers and teaching staff, backlog of activities and the contextual meaning of a conversation were all using some form of visual aide, and students resonated the most with WorkshopAR when they found those visual elements to interact with.</w:t>
       </w:r>
     </w:p>
     <w:p>
@@ -9740,21 +10220,7 @@
         <w:rPr>
           <w:lang w:val="en-NZ"/>
         </w:rPr>
-        <w:t>Besides the changes made to the presentation of information in the LMS, the structure of the course was the same, the groups were firmly stablished by then and the overall objective of the project was clear. The biggest change on the dynamics of the classroom session was on the TA team and the procedure implemented for the students to seek information about the project, as will be described in the next section.</w:t>
-      </w:r>
-    </w:p>
-    <w:p>
-      <w:pPr>
-        <w:pStyle w:val="Heading2"/>
-        <w:rPr>
-          <w:lang w:val="en-NZ"/>
-        </w:rPr>
-      </w:pPr>
-      <w:r>
-        <w:rPr>
-          <w:lang w:val="en-NZ"/>
-        </w:rPr>
-        <w:t>6.8.1 General Observations</w:t>
+        <w:t>The involvement of WorkshopAR in these scenarios had its ups and lows. A summary of the whole experience could be as follows: WorkshopAR succeeded at initiating discussions and reflections around the dynamics a team could be using to manage their collaborative effort, both failed at integrating into the actual mechanisms that the students implemented to fulfil their tasks. WorkshopAR was a good conversation starter, but it needs more iterations to offer a real implementation.</w:t>
       </w:r>
     </w:p>
     <w:p>
@@ -9769,634 +10235,6 @@
         <w:rPr>
           <w:lang w:val="en-NZ"/>
         </w:rPr>
-        <w:t>The first substantial change on the structure of the course was on the role of the TA group. Despite being an interesting mechanic to have all the TAs at disposition of the students during the classroom sessions, it also meant that the teaching staff had to also coordinate with the TA team all the information and the answers that were given to the students about different aspects of the project. Despite the benefits of having many TAs helping in the classroom, the confusion created by contradictory answers was not helping the students to progress in their project efficiently. The TA group would now rotate in each session, and the students would have to work with the specialties that were present in the classroom in any given session. Less flexibility for the students but easier to administrate for the teaching staff.</w:t>
-      </w:r>
-    </w:p>
-    <w:p>
-      <w:pPr>
-        <w:pStyle w:val="Normal"/>
-        <w:jc w:val="both"/>
-        <w:rPr>
-          <w:lang w:val="en-NZ"/>
-        </w:rPr>
-      </w:pPr>
-      <w:r>
-        <w:rPr>
-          <w:lang w:val="en-NZ"/>
-        </w:rPr>
-        <w:t>To support the lack of TAs present for this second semester, the students were strongly encouraged to use the forum tool in the LMS to keep information flowing from the teaching staff and from the students themselves. During the following weeks it was possible to see the lecturers and the TA redirecting the students to the forum every time they asked a question, especially those related to technical information about the project. Another interesting activity was to encourage the students to write a question they just asked in the forum. The teaching staff would provide an answer through the forum instead of doing it directly, enforcing the use of the tool.</w:t>
-      </w:r>
-    </w:p>
-    <w:p>
-      <w:pPr>
-        <w:pStyle w:val="Normal"/>
-        <w:jc w:val="both"/>
-        <w:rPr>
-          <w:lang w:val="en-NZ"/>
-        </w:rPr>
-      </w:pPr>
-      <w:r>
-        <w:rPr>
-          <w:lang w:val="en-NZ"/>
-        </w:rPr>
-        <w:t>It was interesting to observe that the forum was growing little by little, and that the students were using it to communicate with other groups, with the teaching staff and creating a communal repository of knowledge, albeit in a bit forced manner. It was an interesting approach to the use of a forum tool that was observed to be failing in the previous semester, mainly because the students saw no value in it, but now it was strongly integrated to their workflow.</w:t>
-      </w:r>
-    </w:p>
-    <w:p>
-      <w:pPr>
-        <w:pStyle w:val="Normal"/>
-        <w:jc w:val="both"/>
-        <w:rPr>
-          <w:lang w:val="en-NZ"/>
-        </w:rPr>
-      </w:pPr>
-      <w:r>
-        <w:rPr>
-          <w:lang w:val="en-NZ"/>
-        </w:rPr>
-        <w:t>Team D was also the protagonist during the second semester, it was valuable to have the opportunity to test most of the new approaches of WorkshopAR with them since they had experience with the previous versions of the tool and were familiar with the context of the research.</w:t>
-      </w:r>
-    </w:p>
-    <w:p>
-      <w:pPr>
-        <w:pStyle w:val="Normal"/>
-        <w:jc w:val="both"/>
-        <w:rPr>
-          <w:lang w:val="en-NZ"/>
-        </w:rPr>
-      </w:pPr>
-      <w:r>
-        <w:rPr>
-          <w:lang w:val="en-NZ"/>
-        </w:rPr>
-        <w:t>The distinction between groups that had formed during the previous semester and that was described in section 6.6.1 was also noticeable during the second semester. Some groups, like Team D, had a good head start from the previous semester and their work focused more on refining the project. On the other hand, other groups had to reform, keep working with less team members or start with a new proposal, creating a more intense scenario for their work.</w:t>
-      </w:r>
-    </w:p>
-    <w:p>
-      <w:pPr>
-        <w:pStyle w:val="Normal"/>
-        <w:jc w:val="both"/>
-        <w:rPr>
-          <w:lang w:val="en-NZ"/>
-        </w:rPr>
-      </w:pPr>
-      <w:r>
-        <w:rPr>
-          <w:lang w:val="en-NZ"/>
-        </w:rPr>
-        <w:t>Team D obtained very good results in the previous semester, and they were a bit complacent with their work. The general observations described for weeks ten to thirteen remained present throughout the new semester: collaboration was minimal because the intensity of the work was also down, and they kept coming to the classroom because it was the best place to advance in their work throughout the week. It could also be added that this semester was also the last for many of the students, which saw this project as the very last effort before graduation and just wanted to get over with it.</w:t>
-      </w:r>
-    </w:p>
-    <w:p>
-      <w:pPr>
-        <w:pStyle w:val="Normal"/>
-        <w:jc w:val="both"/>
-        <w:rPr>
-          <w:lang w:val="en-NZ"/>
-        </w:rPr>
-      </w:pPr>
-      <w:r>
-        <w:rPr>
-          <w:lang w:val="en-NZ"/>
-        </w:rPr>
-        <w:t>Team E offered an interesting contrast. First, they will be referred as Team E just for simplicity, because the observation took place when several students were working together with the aid of one of the lectures, but they were not necessarily from the same group. In fact, some members of Team B were present there. They commented that they had a lot of communication problems towards the end of the poster presentation principally because a lot of the members never showed up for class. At the end, the two members present tried their best to gather as much information as possible to later coordinate with the rest of the group via instant messaging. It was not ideal, but it was the process that worked best for them.</w:t>
-      </w:r>
-    </w:p>
-    <w:p>
-      <w:pPr>
-        <w:pStyle w:val="Normal"/>
-        <w:jc w:val="both"/>
-        <w:rPr>
-          <w:lang w:val="en-NZ"/>
-        </w:rPr>
-      </w:pPr>
-      <w:r>
-        <w:rPr>
-          <w:lang w:val="en-NZ"/>
-        </w:rPr>
-        <w:t xml:space="preserve">As with Team D, the work in Tem E consisted mostly of individual efforts using computers and the direct help of the lecturer, who was giving feedback to the students and making some conversation to help them think more critically about the tasks they were doing. </w:t>
-      </w:r>
-    </w:p>
-    <w:p>
-      <w:pPr>
-        <w:pStyle w:val="Normal"/>
-        <w:jc w:val="both"/>
-        <w:rPr>
-          <w:lang w:val="en-NZ"/>
-        </w:rPr>
-      </w:pPr>
-      <w:r>
-        <w:rPr>
-          <w:lang w:val="en-NZ"/>
-        </w:rPr>
-        <w:t>Although information was flowing better between the students, the work observed turned out more individual since the groups were mostly linked by the architectural design they were working on in the previous semester rather than by the need for collaboration. There was not much value any more to be present in the classroom session, therefore, assistance was very low.</w:t>
-      </w:r>
-    </w:p>
-    <w:p>
-      <w:pPr>
-        <w:pStyle w:val="Normal"/>
-        <w:jc w:val="both"/>
-        <w:rPr>
-          <w:lang w:val="en-NZ"/>
-        </w:rPr>
-      </w:pPr>
-      <w:r>
-        <w:rPr>
-          <w:lang w:val="en-NZ"/>
-        </w:rPr>
-        <w:t>The situation was similar to what was observed during the last weeks of the previous semester, and for the activities with WorkshopAR, there were less opportunities for more extensive discussions as the ones found previously, but it was possible to gather some interesting responses to the changes made to the approach with the tool, as detailed in the next section.</w:t>
-      </w:r>
-    </w:p>
-    <w:p>
-      <w:pPr>
-        <w:pStyle w:val="Heading2"/>
-        <w:rPr>
-          <w:lang w:val="en-NZ"/>
-        </w:rPr>
-      </w:pPr>
-      <w:r>
-        <w:rPr>
-          <w:lang w:val="en-NZ"/>
-        </w:rPr>
-        <w:t>6.8.2 Intervention with WorkshopAR</w:t>
-      </w:r>
-    </w:p>
-    <w:p>
-      <w:pPr>
-        <w:pStyle w:val="Normal"/>
-        <w:jc w:val="both"/>
-        <w:rPr>
-          <w:lang w:val="en-NZ"/>
-        </w:rPr>
-      </w:pPr>
-      <w:r>
-        <w:rPr>
-          <w:lang w:val="en-NZ"/>
-        </w:rPr>
-        <w:t>The observations with Teams D and E had the same objectives in mind: test the clamp arm set up and the adjustments to the social communication tools added to the annotations and debate tools. Other features of WorkshopAR also undertook some adjustments that had been tested more thoroughly during the unstructured testing stages, and it was considered more interesting for the observations to focus on the changes mentioned initially.</w:t>
-      </w:r>
-    </w:p>
-    <w:p>
-      <w:pPr>
-        <w:pStyle w:val="Normal"/>
-        <w:jc w:val="both"/>
-        <w:rPr>
-          <w:lang w:val="en-NZ"/>
-        </w:rPr>
-      </w:pPr>
-      <w:r>
-        <w:rPr>
-          <w:lang w:val="en-NZ"/>
-        </w:rPr>
-        <w:t>The process followed for Team E was slightly different since they needed a quick tour of WorkshopAR. Their general response to those initial features did not add much to what had already been documented in previous sections. Team D recognized the changes done to the original proposal, which also included an updated UI look, so their response was very positive in general and highlighted the fact that the tool was evolving based on what had been discussed previously with them.</w:t>
-      </w:r>
-    </w:p>
-    <w:p>
-      <w:pPr>
-        <w:pStyle w:val="Heading3"/>
-        <w:rPr>
-          <w:lang w:val="en-NZ"/>
-        </w:rPr>
-      </w:pPr>
-      <w:r>
-        <w:rPr>
-          <w:lang w:val="en-NZ"/>
-        </w:rPr>
-        <w:t>6.8.2.1 Set up with the clamp arms</w:t>
-      </w:r>
-    </w:p>
-    <w:p>
-      <w:pPr>
-        <w:pStyle w:val="Normal"/>
-        <w:jc w:val="both"/>
-        <w:rPr>
-          <w:lang w:val="en-NZ"/>
-        </w:rPr>
-      </w:pPr>
-      <w:r>
-        <w:rPr>
-          <w:lang w:val="en-NZ"/>
-        </w:rPr>
-        <w:t>The idea with the clamp arms was aimed at exploring how the phone could be used in the classroom in a way that was seen as an enhancement and not a distraction. Studies analysing this same problem in other contexts and through different perspectives can be found in Forsling (2023), Flanigan et al. (2023), Fälth &amp; Selenius (2024) and Consoli et al. (2025). The idea was also strongly linked to the way students had been observed to work for the Industry Project group, setting up a table with the equipment they were using to work during the classroom session. They had access to the teaching staff and to all the other activities in the classroom without the need to take down the setup.</w:t>
-      </w:r>
-    </w:p>
-    <w:p>
-      <w:pPr>
-        <w:pStyle w:val="Normal"/>
-        <w:jc w:val="both"/>
-        <w:rPr>
-          <w:lang w:val="en-NZ"/>
-        </w:rPr>
-      </w:pPr>
-      <w:r>
-        <w:rPr>
-          <w:lang w:val="en-NZ"/>
-        </w:rPr>
-        <w:t>Section 5.2.4.1 gives more details of the implementation of this idea and the interaction design done around it. During the observations, some problems were found with the setup, mostly at the usability level:</w:t>
-      </w:r>
-    </w:p>
-    <w:p>
-      <w:pPr>
-        <w:pStyle w:val="ListParagraph"/>
-        <w:numPr>
-          <w:ilvl w:val="0"/>
-          <w:numId w:val="27"/>
-        </w:numPr>
-        <w:jc w:val="both"/>
-        <w:rPr>
-          <w:lang w:val="en-NZ"/>
-        </w:rPr>
-      </w:pPr>
-      <w:r>
-        <w:rPr>
-          <w:lang w:val="en-NZ"/>
-        </w:rPr>
-        <w:t>The setup was a very intensive process, and it required access to a lot of resources like the clamp arms, a table and enough time in the work session for the whole ordeal to be worth of the time expended.</w:t>
-      </w:r>
-    </w:p>
-    <w:p>
-      <w:pPr>
-        <w:pStyle w:val="ListParagraph"/>
-        <w:numPr>
-          <w:ilvl w:val="0"/>
-          <w:numId w:val="27"/>
-        </w:numPr>
-        <w:jc w:val="both"/>
-        <w:rPr>
-          <w:lang w:val="en-NZ"/>
-        </w:rPr>
-      </w:pPr>
-      <w:r>
-        <w:rPr>
-          <w:lang w:val="en-NZ"/>
-        </w:rPr>
-        <w:t>It eliminated the flexibility of creating a room in any space the group found available, running in contradiction with one of the core design principles of the tool.</w:t>
-      </w:r>
-    </w:p>
-    <w:p>
-      <w:pPr>
-        <w:pStyle w:val="ListParagraph"/>
-        <w:numPr>
-          <w:ilvl w:val="0"/>
-          <w:numId w:val="27"/>
-        </w:numPr>
-        <w:jc w:val="both"/>
-        <w:rPr>
-          <w:lang w:val="en-NZ"/>
-        </w:rPr>
-      </w:pPr>
-      <w:r>
-        <w:rPr>
-          <w:lang w:val="en-NZ"/>
-        </w:rPr>
-        <w:t>It gave too much emphasis to the phone, which was also in contradiction with the initial premise of the solution.</w:t>
-      </w:r>
-    </w:p>
-    <w:p>
-      <w:pPr>
-        <w:pStyle w:val="Normal"/>
-        <w:jc w:val="both"/>
-        <w:rPr>
-          <w:lang w:val="en-NZ"/>
-        </w:rPr>
-      </w:pPr>
-      <w:r>
-        <w:rPr>
-          <w:lang w:val="en-NZ"/>
-        </w:rPr>
-        <w:t>Team E offered the most positive remarks to the idea, comparing the setup to a streaming rig used to create content in a professional way. That comment prompted a conversation about having access to a space that already provided the setup and that could be used to work in a hot desk fashion, like how some creative labs work in faculties like design or art. The setup could be adapted to be a laboratory for digital collaborative work, offering all the resources needed for the students. It was an interesting comparison that came from conversations with the students, and although it would run in contradiction with the premise of a flexible room for the group and the BYOD philosophy, it could be the basis for a future exploration of the idea.</w:t>
-      </w:r>
-    </w:p>
-    <w:p>
-      <w:pPr>
-        <w:pStyle w:val="Normal"/>
-        <w:jc w:val="both"/>
-        <w:rPr>
-          <w:lang w:val="en-NZ"/>
-        </w:rPr>
-      </w:pPr>
-      <w:r>
-        <w:rPr>
-          <w:lang w:val="en-NZ"/>
-        </w:rPr>
-        <w:t>Team D was more critical of the setup with the clamp arms. In was possible to run the whole configuration process of WorkshopAR with the team and retest the functionalities while using the setup. The most telling observation was that the students quickly removed the phone from the clamps to make the process easier, giving a strong impression that the idea was not a practical solution.</w:t>
-      </w:r>
-    </w:p>
-    <w:p>
-      <w:pPr>
-        <w:pStyle w:val="Normal"/>
-        <w:jc w:val="both"/>
-        <w:rPr>
-          <w:lang w:val="en-NZ"/>
-        </w:rPr>
-      </w:pPr>
-      <w:r>
-        <w:rPr>
-          <w:lang w:val="en-NZ"/>
-        </w:rPr>
-        <w:t>The clamp arms setup tried to give the interactions with the phone a better position inside the activity, more in line with the working mindset the group wanted to follow. Some students saw the potential in the setup to create that working space, but others still felt that they were playing with their phones. A third group felt annoyed that they were losing access to their phone and using it only for work, and not for other activities, which was in direct contrapositions to all the other attitudes seen before.</w:t>
-      </w:r>
-    </w:p>
-    <w:p>
-      <w:pPr>
-        <w:pStyle w:val="Normal"/>
-        <w:jc w:val="both"/>
-        <w:rPr>
-          <w:lang w:val="en-NZ"/>
-        </w:rPr>
-      </w:pPr>
-      <w:r>
-        <w:rPr>
-          <w:lang w:val="en-NZ"/>
-        </w:rPr>
-        <w:t>This is a situation in which it is difficult to find a solution that accommodates every perspective, and with any proposal, at the end someone will feel alienated. A stationary setup using non-smartphone mobile platform like tablets could create an interesting solution using AR. Projects using this idea to provide an assistance tool in diverse scenarios can be found in Barbieri et al. (2025) or Ma et al. (2026).</w:t>
-      </w:r>
-    </w:p>
-    <w:p>
-      <w:pPr>
-        <w:pStyle w:val="Heading3"/>
-        <w:rPr>
-          <w:lang w:val="en-NZ"/>
-        </w:rPr>
-      </w:pPr>
-      <w:r>
-        <w:rPr>
-          <w:lang w:val="en-NZ"/>
-        </w:rPr>
-        <w:t>6.8.2.2 Communication Features and Emotes</w:t>
-      </w:r>
-    </w:p>
-    <w:p>
-      <w:pPr>
-        <w:pStyle w:val="Normal"/>
-        <w:jc w:val="both"/>
-        <w:rPr>
-          <w:lang w:val="en-NZ"/>
-        </w:rPr>
-      </w:pPr>
-      <w:r>
-        <w:rPr>
-          <w:lang w:val="en-NZ"/>
-        </w:rPr>
-        <w:t>Based on the comments and reactions of the students, as well as the participants in the unstructured tests, it was identified that the visuals used to quickly convey information in the debate feature could be used by the students in other contexts, creating more freedom and flexibility in the communication features provided by WorkshopAR.</w:t>
-      </w:r>
-    </w:p>
-    <w:p>
-      <w:pPr>
-        <w:pStyle w:val="Normal"/>
-        <w:jc w:val="both"/>
-        <w:rPr>
-          <w:lang w:val="en-NZ"/>
-        </w:rPr>
-      </w:pPr>
-      <w:r>
-        <w:rPr>
-          <w:lang w:val="en-NZ"/>
-        </w:rPr>
-        <w:t>The same type of visuals was implemented in the annotation feature, and the unstructured configuration of the debates also allowed for a free flow of conversations that had access to the visuals meant initially for the responses. Originally, the visuals were used to convey information like yes, no or an option in a multi-option question, but students commented that the responses reminded them of the emojis use in text messages, prompting the idea of using “floating” emojis that could add some context or connotation to a conversation.</w:t>
-      </w:r>
-    </w:p>
-    <w:p>
-      <w:pPr>
-        <w:pStyle w:val="Normal"/>
-        <w:jc w:val="both"/>
-        <w:rPr>
-          <w:lang w:val="en-NZ"/>
-        </w:rPr>
-      </w:pPr>
-      <w:r>
-        <w:rPr>
-          <w:lang w:val="en-NZ"/>
-        </w:rPr>
-        <w:t>The idea was tested in two different scenarios. The first one offered a more conventional activity using highly structured questions in the debate tool and waiting for the participants to provide answers through the tool. The idea was to provide an opportunity for a real discussion to take place among the students, but neither Team D nor E engaged significantly in that way. They interacted briefly only through mock-up questions about the progress of the project or technical aspects of the design without much substance in them.</w:t>
-      </w:r>
-    </w:p>
-    <w:p>
-      <w:pPr>
-        <w:pStyle w:val="Normal"/>
-        <w:jc w:val="both"/>
-        <w:rPr>
-          <w:lang w:val="en-NZ"/>
-        </w:rPr>
-      </w:pPr>
-      <w:r>
-        <w:rPr>
-          <w:lang w:val="en-NZ"/>
-        </w:rPr>
-        <w:t>Observed behaviours in both teams were similar: some students preferred more textual answers while other chose the more visual version, with no strong observable tendency for one option or the other. The graphical cues offered by the app like colours and symbols were easily understood, students could read the information quickly and react to the information communicated by their peers without a problem. Technically it was a sound implementation, but it was not possible to observe any substantial behaviour with the current approach to work that both teams had during the classroom session.</w:t>
-      </w:r>
-    </w:p>
-    <w:p>
-      <w:pPr>
-        <w:pStyle w:val="Normal"/>
-        <w:jc w:val="both"/>
-        <w:rPr>
-          <w:lang w:val="en-NZ"/>
-        </w:rPr>
-      </w:pPr>
-      <w:r>
-        <w:rPr>
-          <w:lang w:val="en-NZ"/>
-        </w:rPr>
-        <w:t>The second scenario was more open and used the unstructured version of the debate function to let the students openly talk and discuss things during the work session. This setup prompted more conversation than the previous scenario, student tested more the unstructured questions and also started to be more playful with the activity, proposing question unrelated to the project and more humorous uses of the emotes, taking advantage of the visuals provided to give a stronger emotional context to whatever was the centre of discussion.</w:t>
-      </w:r>
-    </w:p>
-    <w:p>
-      <w:pPr>
-        <w:pStyle w:val="Normal"/>
-        <w:jc w:val="both"/>
-        <w:rPr>
-          <w:lang w:val="en-NZ"/>
-        </w:rPr>
-      </w:pPr>
-      <w:r>
-        <w:rPr>
-          <w:lang w:val="en-NZ"/>
-        </w:rPr>
-        <w:t>Team D found the free conversation very enticing, and it was interesting to see, after the activity itself was already over, that the group was coming back to the tool to show their reactions to a comment or a situation during their work. Most of those conversations were unrelated to the project and played more for fun than for actual communication, but it was telling that the tool was used to properly convey meaning and was able to be integrated naturally into the actions of the students.</w:t>
-      </w:r>
-    </w:p>
-    <w:p>
-      <w:pPr>
-        <w:pStyle w:val="Normal"/>
-        <w:jc w:val="both"/>
-        <w:rPr>
-          <w:lang w:val="en-NZ"/>
-        </w:rPr>
-      </w:pPr>
-      <w:r>
-        <w:rPr>
-          <w:lang w:val="en-NZ"/>
-        </w:rPr>
-        <w:t>Team E on the other hand did not show any instance of such natural use of the tool, but in general they were not speaking between them at all. The mood of the session was more relaxed with Team D than with Team E, which also promoted a better environment for casual conversation and a more playful attitude, which seemed to be the better context for the use of the tool.</w:t>
-      </w:r>
-    </w:p>
-    <w:p>
-      <w:pPr>
-        <w:pStyle w:val="Heading2"/>
-        <w:rPr>
-          <w:lang w:val="en-NZ"/>
-        </w:rPr>
-      </w:pPr>
-      <w:r>
-        <w:rPr>
-          <w:lang w:val="en-NZ"/>
-        </w:rPr>
-        <w:t>6.8.3 Preliminary Analysis</w:t>
-      </w:r>
-    </w:p>
-    <w:p>
-      <w:pPr>
-        <w:pStyle w:val="Normal"/>
-        <w:jc w:val="both"/>
-        <w:rPr>
-          <w:lang w:val="en-NZ"/>
-        </w:rPr>
-      </w:pPr>
-      <w:r>
-        <w:rPr>
-          <w:lang w:val="en-NZ"/>
-        </w:rPr>
-        <w:t>These weeks represented the end of the observation stage, and based on the previous preliminary processes of analysis, it is possible to summarize some of the most important themes extracted from the observations gathered:</w:t>
-      </w:r>
-    </w:p>
-    <w:p>
-      <w:pPr>
-        <w:pStyle w:val="ListParagraph"/>
-        <w:numPr>
-          <w:ilvl w:val="0"/>
-          <w:numId w:val="28"/>
-        </w:numPr>
-        <w:jc w:val="both"/>
-        <w:rPr>
-          <w:lang w:val="en-NZ"/>
-        </w:rPr>
-      </w:pPr>
-      <w:r>
-        <w:rPr>
-          <w:lang w:val="en-NZ"/>
-        </w:rPr>
-        <w:t>The dynamics observer for any group would determine if they preferred a more structured approach to teamwork, needing more guidance from the available teaching staff and using more the tools provided by WorkshopAR to help them in the first steps of consolidating the group.</w:t>
-      </w:r>
-    </w:p>
-    <w:p>
-      <w:pPr>
-        <w:pStyle w:val="ListParagraph"/>
-        <w:numPr>
-          <w:ilvl w:val="0"/>
-          <w:numId w:val="28"/>
-        </w:numPr>
-        <w:jc w:val="both"/>
-        <w:rPr>
-          <w:lang w:val="en-NZ"/>
-        </w:rPr>
-      </w:pPr>
-      <w:r>
-        <w:rPr>
-          <w:lang w:val="en-NZ"/>
-        </w:rPr>
-        <w:t>Better stablished groups would prefer a more flexible approach to the activity, relying in the mechanisms they themselves had built and finding any external intervention, either the lecturers or the use of WorkshopAR, more as a hindrance than an actual help.</w:t>
-      </w:r>
-    </w:p>
-    <w:p>
-      <w:pPr>
-        <w:pStyle w:val="ListParagraph"/>
-        <w:numPr>
-          <w:ilvl w:val="0"/>
-          <w:numId w:val="28"/>
-        </w:numPr>
-        <w:jc w:val="both"/>
-        <w:rPr>
-          <w:lang w:val="en-NZ"/>
-        </w:rPr>
-      </w:pPr>
-      <w:r>
-        <w:rPr>
-          <w:lang w:val="en-NZ"/>
-        </w:rPr>
-        <w:t>In either case, the need for structure would be greater at the beginning and would fade towards the end of the project, either because the mechanisms for groupwork are clear or because the tool is not helping in creating of reinforcing those mechanisms.</w:t>
-      </w:r>
-    </w:p>
-    <w:p>
-      <w:pPr>
-        <w:pStyle w:val="ListParagraph"/>
-        <w:numPr>
-          <w:ilvl w:val="0"/>
-          <w:numId w:val="28"/>
-        </w:numPr>
-        <w:jc w:val="both"/>
-        <w:rPr>
-          <w:lang w:val="en-NZ"/>
-        </w:rPr>
-      </w:pPr>
-      <w:r>
-        <w:rPr>
-          <w:lang w:val="en-NZ"/>
-        </w:rPr>
-        <w:t>Digital tools need to be able to adapt and connect to the environment they live in. All students have their own set of tools and favourite channels of communication than often collide with any other alternative or even with the official channels proposed by the course.</w:t>
-      </w:r>
-    </w:p>
-    <w:p>
-      <w:pPr>
-        <w:pStyle w:val="ListParagraph"/>
-        <w:numPr>
-          <w:ilvl w:val="0"/>
-          <w:numId w:val="28"/>
-        </w:numPr>
-        <w:jc w:val="both"/>
-        <w:rPr>
-          <w:lang w:val="en-NZ"/>
-        </w:rPr>
-      </w:pPr>
-      <w:r>
-        <w:rPr>
-          <w:lang w:val="en-NZ"/>
-        </w:rPr>
-        <w:t>Visual communication is a powerful tool to promote all sort of behaviours. Activities related to the organization of ideas, communication between peers and teaching staff, backlog of activities and the contextual meaning of a conversation were all using some form of visual aide, and students resonated the most with WorkshopAR when they found those visual elements to interact with.</w:t>
-      </w:r>
-    </w:p>
-    <w:p>
-      <w:pPr>
-        <w:pStyle w:val="Normal"/>
-        <w:jc w:val="both"/>
-        <w:rPr>
-          <w:lang w:val="en-NZ"/>
-        </w:rPr>
-      </w:pPr>
-      <w:r>
-        <w:rPr>
-          <w:lang w:val="en-NZ"/>
-        </w:rPr>
-        <w:t>Industry Project offered an interesting environment to build the skills necessary for a healthy teamwork experience. The course particularly excels at creating opportunities for students to analyse a problem, identify needed resources and formulate a plan to build a solution. Some students thrived more in this process individually, but it was clear that a group approach was better suited to provide a successful plan. If there is something where the course was lacking was in making these scenarios for the development of collaboration more explicit to the students and not rely completely in a self-exploratory.</w:t>
-      </w:r>
-    </w:p>
-    <w:p>
-      <w:pPr>
-        <w:pStyle w:val="Normal"/>
-        <w:jc w:val="both"/>
-        <w:rPr>
-          <w:lang w:val="en-NZ"/>
-        </w:rPr>
-      </w:pPr>
-      <w:r>
-        <w:rPr>
-          <w:lang w:val="en-NZ"/>
-        </w:rPr>
-        <w:t>The involvement of WorkshopAR in these scenarios had its ups and lows. A summary of the whole experience could be as follows: WorkshopAR succeeded at initiating discussions and reflections around the dynamics a team could be using to manage their collaborative effort, both failed at integrating into the actual mechanisms that the students implemented to fulfil their tasks. WorkshopAR was a good conversation starter, but it needs more iterations to offer a real implementation.</w:t>
-      </w:r>
-    </w:p>
-    <w:p>
-      <w:pPr>
-        <w:pStyle w:val="Normal"/>
-        <w:jc w:val="both"/>
-        <w:rPr>
-          <w:lang w:val="en-NZ"/>
-        </w:rPr>
-      </w:pPr>
-      <w:r>
-        <w:rPr>
-          <w:lang w:val="en-NZ"/>
-        </w:rPr>
         <w:t>The following sections will complement the points previously explained by painting a more specific view of both the teaching staff and the students of how the course developed and how different key aspects of collaborative work and collaborative learning were perceived, and will be compared to the behaviours observed around the use of WorkshopAR to better construct a conclusion and identify the lessons that could be extracted from the case study.</w:t>
       </w:r>
     </w:p>
@@ -10411,7 +10249,19 @@
         <w:rPr>
           <w:lang w:val="en-NZ"/>
         </w:rPr>
-        <w:t>6.9 Analysis of Student’s Observations and Responses</w:t>
+        <w:t>6.</w:t>
+      </w:r>
+      <w:r>
+        <w:rPr>
+          <w:lang w:val="en-NZ"/>
+        </w:rPr>
+        <w:t>7</w:t>
+      </w:r>
+      <w:r>
+        <w:rPr>
+          <w:lang w:val="en-NZ"/>
+        </w:rPr>
+        <w:t xml:space="preserve"> Analysis of Student’s Observations and Responses</w:t>
       </w:r>
     </w:p>
     <w:p>
@@ -10647,7 +10497,7 @@
       </w:r>
       <w:r>
         <w:rPr>
-          <w:rFonts w:cs="Calibri" w:ascii="Calibri" w:hAnsi="Calibri" w:asciiTheme="majorHAnsi" w:cstheme="majorHAnsi" w:hAnsiTheme="majorHAnsi"/>
+          <w:rFonts w:cs="Calibri" w:ascii="Calibri" w:hAnsi="Calibri"/>
           <w:sz w:val="24"/>
           <w:szCs w:val="24"/>
           <w:lang w:val="en-NZ"/>
@@ -15490,7 +15340,19 @@
         <w:rPr>
           <w:lang w:val="en-NZ"/>
         </w:rPr>
-        <w:t>6.10 Analysis of Teaching Staff’s Observations and Responses</w:t>
+        <w:t>6.</w:t>
+      </w:r>
+      <w:r>
+        <w:rPr>
+          <w:lang w:val="en-NZ"/>
+        </w:rPr>
+        <w:t>8</w:t>
+      </w:r>
+      <w:r>
+        <w:rPr>
+          <w:lang w:val="en-NZ"/>
+        </w:rPr>
+        <w:t xml:space="preserve"> Analysis of Teaching Staff’s Observations and Responses</w:t>
       </w:r>
     </w:p>
     <w:p>
@@ -15543,7 +15405,7 @@
         <w:pStyle w:val="ListParagraph"/>
         <w:numPr>
           <w:ilvl w:val="0"/>
-          <w:numId w:val="29"/>
+          <w:numId w:val="26"/>
         </w:numPr>
         <w:jc w:val="both"/>
         <w:rPr>
@@ -15562,7 +15424,7 @@
         <w:pStyle w:val="ListParagraph"/>
         <w:numPr>
           <w:ilvl w:val="0"/>
-          <w:numId w:val="29"/>
+          <w:numId w:val="26"/>
         </w:numPr>
         <w:jc w:val="both"/>
         <w:rPr>
@@ -15581,7 +15443,7 @@
         <w:pStyle w:val="ListParagraph"/>
         <w:numPr>
           <w:ilvl w:val="0"/>
-          <w:numId w:val="29"/>
+          <w:numId w:val="26"/>
         </w:numPr>
         <w:jc w:val="both"/>
         <w:rPr>
@@ -15675,7 +15537,7 @@
         <w:pStyle w:val="ListParagraph"/>
         <w:numPr>
           <w:ilvl w:val="0"/>
-          <w:numId w:val="30"/>
+          <w:numId w:val="27"/>
         </w:numPr>
         <w:jc w:val="both"/>
         <w:rPr>
@@ -15694,7 +15556,7 @@
         <w:pStyle w:val="ListParagraph"/>
         <w:numPr>
           <w:ilvl w:val="0"/>
-          <w:numId w:val="30"/>
+          <w:numId w:val="27"/>
         </w:numPr>
         <w:jc w:val="both"/>
         <w:rPr>
@@ -15713,7 +15575,7 @@
         <w:pStyle w:val="ListParagraph"/>
         <w:numPr>
           <w:ilvl w:val="0"/>
-          <w:numId w:val="30"/>
+          <w:numId w:val="27"/>
         </w:numPr>
         <w:jc w:val="both"/>
         <w:rPr>
@@ -15808,7 +15670,7 @@
       </w:r>
       <w:r>
         <w:rPr>
-          <w:rFonts w:cs="Calibri" w:ascii="Calibri" w:hAnsi="Calibri" w:asciiTheme="majorHAnsi" w:cstheme="majorHAnsi" w:hAnsiTheme="majorHAnsi"/>
+          <w:rFonts w:cs="Calibri" w:ascii="Calibri" w:hAnsi="Calibri"/>
           <w:sz w:val="24"/>
           <w:szCs w:val="24"/>
           <w:lang w:val="en-NZ"/>
@@ -19002,7 +18864,19 @@
         <w:rPr>
           <w:lang w:val="en-NZ"/>
         </w:rPr>
-        <w:t>6.11 Conclusions</w:t>
+        <w:t>6.</w:t>
+      </w:r>
+      <w:r>
+        <w:rPr>
+          <w:lang w:val="en-NZ"/>
+        </w:rPr>
+        <w:t>9</w:t>
+      </w:r>
+      <w:r>
+        <w:rPr>
+          <w:lang w:val="en-NZ"/>
+        </w:rPr>
+        <w:t xml:space="preserve"> Conclusions</w:t>
       </w:r>
     </w:p>
     <w:p>
@@ -19139,7 +19013,7 @@
         <w:pStyle w:val="ListParagraph"/>
         <w:numPr>
           <w:ilvl w:val="0"/>
-          <w:numId w:val="31"/>
+          <w:numId w:val="28"/>
         </w:numPr>
         <w:jc w:val="both"/>
         <w:rPr>
@@ -19158,7 +19032,7 @@
         <w:pStyle w:val="ListParagraph"/>
         <w:numPr>
           <w:ilvl w:val="0"/>
-          <w:numId w:val="31"/>
+          <w:numId w:val="28"/>
         </w:numPr>
         <w:jc w:val="both"/>
         <w:rPr>
@@ -19177,7 +19051,7 @@
         <w:pStyle w:val="ListParagraph"/>
         <w:numPr>
           <w:ilvl w:val="0"/>
-          <w:numId w:val="31"/>
+          <w:numId w:val="28"/>
         </w:numPr>
         <w:jc w:val="both"/>
         <w:rPr>
@@ -19333,7 +19207,7 @@
         <w:pStyle w:val="ListParagraph"/>
         <w:numPr>
           <w:ilvl w:val="0"/>
-          <w:numId w:val="32"/>
+          <w:numId w:val="29"/>
         </w:numPr>
         <w:jc w:val="both"/>
         <w:rPr>
@@ -19352,7 +19226,7 @@
         <w:pStyle w:val="ListParagraph"/>
         <w:numPr>
           <w:ilvl w:val="0"/>
-          <w:numId w:val="32"/>
+          <w:numId w:val="29"/>
         </w:numPr>
         <w:jc w:val="both"/>
         <w:rPr>
@@ -19371,7 +19245,7 @@
         <w:pStyle w:val="ListParagraph"/>
         <w:numPr>
           <w:ilvl w:val="0"/>
-          <w:numId w:val="32"/>
+          <w:numId w:val="29"/>
         </w:numPr>
         <w:jc w:val="both"/>
         <w:rPr>
@@ -19390,7 +19264,7 @@
         <w:pStyle w:val="ListParagraph"/>
         <w:numPr>
           <w:ilvl w:val="0"/>
-          <w:numId w:val="32"/>
+          <w:numId w:val="29"/>
         </w:numPr>
         <w:jc w:val="both"/>
         <w:rPr>
@@ -22739,7 +22613,7 @@
         <w:tabs>
           <w:tab w:val="num" w:pos="0"/>
         </w:tabs>
-        <w:ind w:left="720" w:hanging="360"/>
+        <w:ind w:left="780" w:hanging="360"/>
       </w:pPr>
       <w:rPr>
         <w:rFonts w:ascii="Symbol" w:hAnsi="Symbol" w:cs="Symbol" w:hint="default"/>
@@ -22754,7 +22628,7 @@
         <w:tabs>
           <w:tab w:val="num" w:pos="0"/>
         </w:tabs>
-        <w:ind w:left="1440" w:hanging="360"/>
+        <w:ind w:left="1500" w:hanging="360"/>
       </w:pPr>
       <w:rPr>
         <w:rFonts w:ascii="Courier New" w:hAnsi="Courier New" w:cs="Courier New" w:hint="default"/>
@@ -22769,7 +22643,7 @@
         <w:tabs>
           <w:tab w:val="num" w:pos="0"/>
         </w:tabs>
-        <w:ind w:left="2160" w:hanging="360"/>
+        <w:ind w:left="2220" w:hanging="360"/>
       </w:pPr>
       <w:rPr>
         <w:rFonts w:ascii="Wingdings" w:hAnsi="Wingdings" w:cs="Wingdings" w:hint="default"/>
@@ -22784,7 +22658,7 @@
         <w:tabs>
           <w:tab w:val="num" w:pos="0"/>
         </w:tabs>
-        <w:ind w:left="2880" w:hanging="360"/>
+        <w:ind w:left="2940" w:hanging="360"/>
       </w:pPr>
       <w:rPr>
         <w:rFonts w:ascii="Symbol" w:hAnsi="Symbol" w:cs="Symbol" w:hint="default"/>
@@ -22799,7 +22673,7 @@
         <w:tabs>
           <w:tab w:val="num" w:pos="0"/>
         </w:tabs>
-        <w:ind w:left="3600" w:hanging="360"/>
+        <w:ind w:left="3660" w:hanging="360"/>
       </w:pPr>
       <w:rPr>
         <w:rFonts w:ascii="Courier New" w:hAnsi="Courier New" w:cs="Courier New" w:hint="default"/>
@@ -22814,7 +22688,7 @@
         <w:tabs>
           <w:tab w:val="num" w:pos="0"/>
         </w:tabs>
-        <w:ind w:left="4320" w:hanging="360"/>
+        <w:ind w:left="4380" w:hanging="360"/>
       </w:pPr>
       <w:rPr>
         <w:rFonts w:ascii="Wingdings" w:hAnsi="Wingdings" w:cs="Wingdings" w:hint="default"/>
@@ -22829,7 +22703,7 @@
         <w:tabs>
           <w:tab w:val="num" w:pos="0"/>
         </w:tabs>
-        <w:ind w:left="5040" w:hanging="360"/>
+        <w:ind w:left="5100" w:hanging="360"/>
       </w:pPr>
       <w:rPr>
         <w:rFonts w:ascii="Symbol" w:hAnsi="Symbol" w:cs="Symbol" w:hint="default"/>
@@ -22844,7 +22718,7 @@
         <w:tabs>
           <w:tab w:val="num" w:pos="0"/>
         </w:tabs>
-        <w:ind w:left="5760" w:hanging="360"/>
+        <w:ind w:left="5820" w:hanging="360"/>
       </w:pPr>
       <w:rPr>
         <w:rFonts w:ascii="Courier New" w:hAnsi="Courier New" w:cs="Courier New" w:hint="default"/>
@@ -22859,7 +22733,7 @@
         <w:tabs>
           <w:tab w:val="num" w:pos="0"/>
         </w:tabs>
-        <w:ind w:left="6480" w:hanging="360"/>
+        <w:ind w:left="6540" w:hanging="360"/>
       </w:pPr>
       <w:rPr>
         <w:rFonts w:ascii="Wingdings" w:hAnsi="Wingdings" w:cs="Wingdings" w:hint="default"/>
@@ -23150,7 +23024,7 @@
         <w:tabs>
           <w:tab w:val="num" w:pos="0"/>
         </w:tabs>
-        <w:ind w:left="780" w:hanging="360"/>
+        <w:ind w:left="720" w:hanging="360"/>
       </w:pPr>
       <w:rPr>
         <w:rFonts w:ascii="Symbol" w:hAnsi="Symbol" w:cs="Symbol" w:hint="default"/>
@@ -23165,7 +23039,7 @@
         <w:tabs>
           <w:tab w:val="num" w:pos="0"/>
         </w:tabs>
-        <w:ind w:left="1500" w:hanging="360"/>
+        <w:ind w:left="1440" w:hanging="360"/>
       </w:pPr>
       <w:rPr>
         <w:rFonts w:ascii="Courier New" w:hAnsi="Courier New" w:cs="Courier New" w:hint="default"/>
@@ -23180,7 +23054,7 @@
         <w:tabs>
           <w:tab w:val="num" w:pos="0"/>
         </w:tabs>
-        <w:ind w:left="2220" w:hanging="360"/>
+        <w:ind w:left="2160" w:hanging="360"/>
       </w:pPr>
       <w:rPr>
         <w:rFonts w:ascii="Wingdings" w:hAnsi="Wingdings" w:cs="Wingdings" w:hint="default"/>
@@ -23195,7 +23069,7 @@
         <w:tabs>
           <w:tab w:val="num" w:pos="0"/>
         </w:tabs>
-        <w:ind w:left="2940" w:hanging="360"/>
+        <w:ind w:left="2880" w:hanging="360"/>
       </w:pPr>
       <w:rPr>
         <w:rFonts w:ascii="Symbol" w:hAnsi="Symbol" w:cs="Symbol" w:hint="default"/>
@@ -23210,7 +23084,7 @@
         <w:tabs>
           <w:tab w:val="num" w:pos="0"/>
         </w:tabs>
-        <w:ind w:left="3660" w:hanging="360"/>
+        <w:ind w:left="3600" w:hanging="360"/>
       </w:pPr>
       <w:rPr>
         <w:rFonts w:ascii="Courier New" w:hAnsi="Courier New" w:cs="Courier New" w:hint="default"/>
@@ -23225,7 +23099,7 @@
         <w:tabs>
           <w:tab w:val="num" w:pos="0"/>
         </w:tabs>
-        <w:ind w:left="4380" w:hanging="360"/>
+        <w:ind w:left="4320" w:hanging="360"/>
       </w:pPr>
       <w:rPr>
         <w:rFonts w:ascii="Wingdings" w:hAnsi="Wingdings" w:cs="Wingdings" w:hint="default"/>
@@ -23240,7 +23114,7 @@
         <w:tabs>
           <w:tab w:val="num" w:pos="0"/>
         </w:tabs>
-        <w:ind w:left="5100" w:hanging="360"/>
+        <w:ind w:left="5040" w:hanging="360"/>
       </w:pPr>
       <w:rPr>
         <w:rFonts w:ascii="Symbol" w:hAnsi="Symbol" w:cs="Symbol" w:hint="default"/>
@@ -23255,7 +23129,7 @@
         <w:tabs>
           <w:tab w:val="num" w:pos="0"/>
         </w:tabs>
-        <w:ind w:left="5820" w:hanging="360"/>
+        <w:ind w:left="5760" w:hanging="360"/>
       </w:pPr>
       <w:rPr>
         <w:rFonts w:ascii="Courier New" w:hAnsi="Courier New" w:cs="Courier New" w:hint="default"/>
@@ -23270,7 +23144,7 @@
         <w:tabs>
           <w:tab w:val="num" w:pos="0"/>
         </w:tabs>
-        <w:ind w:left="6540" w:hanging="360"/>
+        <w:ind w:left="6480" w:hanging="360"/>
       </w:pPr>
       <w:rPr>
         <w:rFonts w:ascii="Wingdings" w:hAnsi="Wingdings" w:cs="Wingdings" w:hint="default"/>
@@ -23415,417 +23289,6 @@
     </w:lvl>
   </w:abstractNum>
   <w:abstractNum w:abstractNumId="30">
-    <w:lvl w:ilvl="0">
-      <w:start w:val="1"/>
-      <w:numFmt w:val="bullet"/>
-      <w:lvlText w:val=""/>
-      <w:lvlJc w:val="left"/>
-      <w:pPr>
-        <w:tabs>
-          <w:tab w:val="num" w:pos="0"/>
-        </w:tabs>
-        <w:ind w:left="720" w:hanging="360"/>
-      </w:pPr>
-      <w:rPr>
-        <w:rFonts w:ascii="Symbol" w:hAnsi="Symbol" w:cs="Symbol" w:hint="default"/>
-      </w:rPr>
-    </w:lvl>
-    <w:lvl w:ilvl="1">
-      <w:start w:val="1"/>
-      <w:numFmt w:val="bullet"/>
-      <w:lvlText w:val="o"/>
-      <w:lvlJc w:val="left"/>
-      <w:pPr>
-        <w:tabs>
-          <w:tab w:val="num" w:pos="0"/>
-        </w:tabs>
-        <w:ind w:left="1440" w:hanging="360"/>
-      </w:pPr>
-      <w:rPr>
-        <w:rFonts w:ascii="Courier New" w:hAnsi="Courier New" w:cs="Courier New" w:hint="default"/>
-      </w:rPr>
-    </w:lvl>
-    <w:lvl w:ilvl="2">
-      <w:start w:val="1"/>
-      <w:numFmt w:val="bullet"/>
-      <w:lvlText w:val=""/>
-      <w:lvlJc w:val="left"/>
-      <w:pPr>
-        <w:tabs>
-          <w:tab w:val="num" w:pos="0"/>
-        </w:tabs>
-        <w:ind w:left="2160" w:hanging="360"/>
-      </w:pPr>
-      <w:rPr>
-        <w:rFonts w:ascii="Wingdings" w:hAnsi="Wingdings" w:cs="Wingdings" w:hint="default"/>
-      </w:rPr>
-    </w:lvl>
-    <w:lvl w:ilvl="3">
-      <w:start w:val="1"/>
-      <w:numFmt w:val="bullet"/>
-      <w:lvlText w:val=""/>
-      <w:lvlJc w:val="left"/>
-      <w:pPr>
-        <w:tabs>
-          <w:tab w:val="num" w:pos="0"/>
-        </w:tabs>
-        <w:ind w:left="2880" w:hanging="360"/>
-      </w:pPr>
-      <w:rPr>
-        <w:rFonts w:ascii="Symbol" w:hAnsi="Symbol" w:cs="Symbol" w:hint="default"/>
-      </w:rPr>
-    </w:lvl>
-    <w:lvl w:ilvl="4">
-      <w:start w:val="1"/>
-      <w:numFmt w:val="bullet"/>
-      <w:lvlText w:val="o"/>
-      <w:lvlJc w:val="left"/>
-      <w:pPr>
-        <w:tabs>
-          <w:tab w:val="num" w:pos="0"/>
-        </w:tabs>
-        <w:ind w:left="3600" w:hanging="360"/>
-      </w:pPr>
-      <w:rPr>
-        <w:rFonts w:ascii="Courier New" w:hAnsi="Courier New" w:cs="Courier New" w:hint="default"/>
-      </w:rPr>
-    </w:lvl>
-    <w:lvl w:ilvl="5">
-      <w:start w:val="1"/>
-      <w:numFmt w:val="bullet"/>
-      <w:lvlText w:val=""/>
-      <w:lvlJc w:val="left"/>
-      <w:pPr>
-        <w:tabs>
-          <w:tab w:val="num" w:pos="0"/>
-        </w:tabs>
-        <w:ind w:left="4320" w:hanging="360"/>
-      </w:pPr>
-      <w:rPr>
-        <w:rFonts w:ascii="Wingdings" w:hAnsi="Wingdings" w:cs="Wingdings" w:hint="default"/>
-      </w:rPr>
-    </w:lvl>
-    <w:lvl w:ilvl="6">
-      <w:start w:val="1"/>
-      <w:numFmt w:val="bullet"/>
-      <w:lvlText w:val=""/>
-      <w:lvlJc w:val="left"/>
-      <w:pPr>
-        <w:tabs>
-          <w:tab w:val="num" w:pos="0"/>
-        </w:tabs>
-        <w:ind w:left="5040" w:hanging="360"/>
-      </w:pPr>
-      <w:rPr>
-        <w:rFonts w:ascii="Symbol" w:hAnsi="Symbol" w:cs="Symbol" w:hint="default"/>
-      </w:rPr>
-    </w:lvl>
-    <w:lvl w:ilvl="7">
-      <w:start w:val="1"/>
-      <w:numFmt w:val="bullet"/>
-      <w:lvlText w:val="o"/>
-      <w:lvlJc w:val="left"/>
-      <w:pPr>
-        <w:tabs>
-          <w:tab w:val="num" w:pos="0"/>
-        </w:tabs>
-        <w:ind w:left="5760" w:hanging="360"/>
-      </w:pPr>
-      <w:rPr>
-        <w:rFonts w:ascii="Courier New" w:hAnsi="Courier New" w:cs="Courier New" w:hint="default"/>
-      </w:rPr>
-    </w:lvl>
-    <w:lvl w:ilvl="8">
-      <w:start w:val="1"/>
-      <w:numFmt w:val="bullet"/>
-      <w:lvlText w:val=""/>
-      <w:lvlJc w:val="left"/>
-      <w:pPr>
-        <w:tabs>
-          <w:tab w:val="num" w:pos="0"/>
-        </w:tabs>
-        <w:ind w:left="6480" w:hanging="360"/>
-      </w:pPr>
-      <w:rPr>
-        <w:rFonts w:ascii="Wingdings" w:hAnsi="Wingdings" w:cs="Wingdings" w:hint="default"/>
-      </w:rPr>
-    </w:lvl>
-  </w:abstractNum>
-  <w:abstractNum w:abstractNumId="31">
-    <w:lvl w:ilvl="0">
-      <w:start w:val="1"/>
-      <w:numFmt w:val="bullet"/>
-      <w:lvlText w:val=""/>
-      <w:lvlJc w:val="left"/>
-      <w:pPr>
-        <w:tabs>
-          <w:tab w:val="num" w:pos="0"/>
-        </w:tabs>
-        <w:ind w:left="720" w:hanging="360"/>
-      </w:pPr>
-      <w:rPr>
-        <w:rFonts w:ascii="Symbol" w:hAnsi="Symbol" w:cs="Symbol" w:hint="default"/>
-      </w:rPr>
-    </w:lvl>
-    <w:lvl w:ilvl="1">
-      <w:start w:val="1"/>
-      <w:numFmt w:val="bullet"/>
-      <w:lvlText w:val="o"/>
-      <w:lvlJc w:val="left"/>
-      <w:pPr>
-        <w:tabs>
-          <w:tab w:val="num" w:pos="0"/>
-        </w:tabs>
-        <w:ind w:left="1440" w:hanging="360"/>
-      </w:pPr>
-      <w:rPr>
-        <w:rFonts w:ascii="Courier New" w:hAnsi="Courier New" w:cs="Courier New" w:hint="default"/>
-      </w:rPr>
-    </w:lvl>
-    <w:lvl w:ilvl="2">
-      <w:start w:val="1"/>
-      <w:numFmt w:val="bullet"/>
-      <w:lvlText w:val=""/>
-      <w:lvlJc w:val="left"/>
-      <w:pPr>
-        <w:tabs>
-          <w:tab w:val="num" w:pos="0"/>
-        </w:tabs>
-        <w:ind w:left="2160" w:hanging="360"/>
-      </w:pPr>
-      <w:rPr>
-        <w:rFonts w:ascii="Wingdings" w:hAnsi="Wingdings" w:cs="Wingdings" w:hint="default"/>
-      </w:rPr>
-    </w:lvl>
-    <w:lvl w:ilvl="3">
-      <w:start w:val="1"/>
-      <w:numFmt w:val="bullet"/>
-      <w:lvlText w:val=""/>
-      <w:lvlJc w:val="left"/>
-      <w:pPr>
-        <w:tabs>
-          <w:tab w:val="num" w:pos="0"/>
-        </w:tabs>
-        <w:ind w:left="2880" w:hanging="360"/>
-      </w:pPr>
-      <w:rPr>
-        <w:rFonts w:ascii="Symbol" w:hAnsi="Symbol" w:cs="Symbol" w:hint="default"/>
-      </w:rPr>
-    </w:lvl>
-    <w:lvl w:ilvl="4">
-      <w:start w:val="1"/>
-      <w:numFmt w:val="bullet"/>
-      <w:lvlText w:val="o"/>
-      <w:lvlJc w:val="left"/>
-      <w:pPr>
-        <w:tabs>
-          <w:tab w:val="num" w:pos="0"/>
-        </w:tabs>
-        <w:ind w:left="3600" w:hanging="360"/>
-      </w:pPr>
-      <w:rPr>
-        <w:rFonts w:ascii="Courier New" w:hAnsi="Courier New" w:cs="Courier New" w:hint="default"/>
-      </w:rPr>
-    </w:lvl>
-    <w:lvl w:ilvl="5">
-      <w:start w:val="1"/>
-      <w:numFmt w:val="bullet"/>
-      <w:lvlText w:val=""/>
-      <w:lvlJc w:val="left"/>
-      <w:pPr>
-        <w:tabs>
-          <w:tab w:val="num" w:pos="0"/>
-        </w:tabs>
-        <w:ind w:left="4320" w:hanging="360"/>
-      </w:pPr>
-      <w:rPr>
-        <w:rFonts w:ascii="Wingdings" w:hAnsi="Wingdings" w:cs="Wingdings" w:hint="default"/>
-      </w:rPr>
-    </w:lvl>
-    <w:lvl w:ilvl="6">
-      <w:start w:val="1"/>
-      <w:numFmt w:val="bullet"/>
-      <w:lvlText w:val=""/>
-      <w:lvlJc w:val="left"/>
-      <w:pPr>
-        <w:tabs>
-          <w:tab w:val="num" w:pos="0"/>
-        </w:tabs>
-        <w:ind w:left="5040" w:hanging="360"/>
-      </w:pPr>
-      <w:rPr>
-        <w:rFonts w:ascii="Symbol" w:hAnsi="Symbol" w:cs="Symbol" w:hint="default"/>
-      </w:rPr>
-    </w:lvl>
-    <w:lvl w:ilvl="7">
-      <w:start w:val="1"/>
-      <w:numFmt w:val="bullet"/>
-      <w:lvlText w:val="o"/>
-      <w:lvlJc w:val="left"/>
-      <w:pPr>
-        <w:tabs>
-          <w:tab w:val="num" w:pos="0"/>
-        </w:tabs>
-        <w:ind w:left="5760" w:hanging="360"/>
-      </w:pPr>
-      <w:rPr>
-        <w:rFonts w:ascii="Courier New" w:hAnsi="Courier New" w:cs="Courier New" w:hint="default"/>
-      </w:rPr>
-    </w:lvl>
-    <w:lvl w:ilvl="8">
-      <w:start w:val="1"/>
-      <w:numFmt w:val="bullet"/>
-      <w:lvlText w:val=""/>
-      <w:lvlJc w:val="left"/>
-      <w:pPr>
-        <w:tabs>
-          <w:tab w:val="num" w:pos="0"/>
-        </w:tabs>
-        <w:ind w:left="6480" w:hanging="360"/>
-      </w:pPr>
-      <w:rPr>
-        <w:rFonts w:ascii="Wingdings" w:hAnsi="Wingdings" w:cs="Wingdings" w:hint="default"/>
-      </w:rPr>
-    </w:lvl>
-  </w:abstractNum>
-  <w:abstractNum w:abstractNumId="32">
-    <w:lvl w:ilvl="0">
-      <w:start w:val="1"/>
-      <w:numFmt w:val="bullet"/>
-      <w:lvlText w:val=""/>
-      <w:lvlJc w:val="left"/>
-      <w:pPr>
-        <w:tabs>
-          <w:tab w:val="num" w:pos="0"/>
-        </w:tabs>
-        <w:ind w:left="720" w:hanging="360"/>
-      </w:pPr>
-      <w:rPr>
-        <w:rFonts w:ascii="Symbol" w:hAnsi="Symbol" w:cs="Symbol" w:hint="default"/>
-      </w:rPr>
-    </w:lvl>
-    <w:lvl w:ilvl="1">
-      <w:start w:val="1"/>
-      <w:numFmt w:val="bullet"/>
-      <w:lvlText w:val="o"/>
-      <w:lvlJc w:val="left"/>
-      <w:pPr>
-        <w:tabs>
-          <w:tab w:val="num" w:pos="0"/>
-        </w:tabs>
-        <w:ind w:left="1440" w:hanging="360"/>
-      </w:pPr>
-      <w:rPr>
-        <w:rFonts w:ascii="Courier New" w:hAnsi="Courier New" w:cs="Courier New" w:hint="default"/>
-      </w:rPr>
-    </w:lvl>
-    <w:lvl w:ilvl="2">
-      <w:start w:val="1"/>
-      <w:numFmt w:val="bullet"/>
-      <w:lvlText w:val=""/>
-      <w:lvlJc w:val="left"/>
-      <w:pPr>
-        <w:tabs>
-          <w:tab w:val="num" w:pos="0"/>
-        </w:tabs>
-        <w:ind w:left="2160" w:hanging="360"/>
-      </w:pPr>
-      <w:rPr>
-        <w:rFonts w:ascii="Wingdings" w:hAnsi="Wingdings" w:cs="Wingdings" w:hint="default"/>
-      </w:rPr>
-    </w:lvl>
-    <w:lvl w:ilvl="3">
-      <w:start w:val="1"/>
-      <w:numFmt w:val="bullet"/>
-      <w:lvlText w:val=""/>
-      <w:lvlJc w:val="left"/>
-      <w:pPr>
-        <w:tabs>
-          <w:tab w:val="num" w:pos="0"/>
-        </w:tabs>
-        <w:ind w:left="2880" w:hanging="360"/>
-      </w:pPr>
-      <w:rPr>
-        <w:rFonts w:ascii="Symbol" w:hAnsi="Symbol" w:cs="Symbol" w:hint="default"/>
-      </w:rPr>
-    </w:lvl>
-    <w:lvl w:ilvl="4">
-      <w:start w:val="1"/>
-      <w:numFmt w:val="bullet"/>
-      <w:lvlText w:val="o"/>
-      <w:lvlJc w:val="left"/>
-      <w:pPr>
-        <w:tabs>
-          <w:tab w:val="num" w:pos="0"/>
-        </w:tabs>
-        <w:ind w:left="3600" w:hanging="360"/>
-      </w:pPr>
-      <w:rPr>
-        <w:rFonts w:ascii="Courier New" w:hAnsi="Courier New" w:cs="Courier New" w:hint="default"/>
-      </w:rPr>
-    </w:lvl>
-    <w:lvl w:ilvl="5">
-      <w:start w:val="1"/>
-      <w:numFmt w:val="bullet"/>
-      <w:lvlText w:val=""/>
-      <w:lvlJc w:val="left"/>
-      <w:pPr>
-        <w:tabs>
-          <w:tab w:val="num" w:pos="0"/>
-        </w:tabs>
-        <w:ind w:left="4320" w:hanging="360"/>
-      </w:pPr>
-      <w:rPr>
-        <w:rFonts w:ascii="Wingdings" w:hAnsi="Wingdings" w:cs="Wingdings" w:hint="default"/>
-      </w:rPr>
-    </w:lvl>
-    <w:lvl w:ilvl="6">
-      <w:start w:val="1"/>
-      <w:numFmt w:val="bullet"/>
-      <w:lvlText w:val=""/>
-      <w:lvlJc w:val="left"/>
-      <w:pPr>
-        <w:tabs>
-          <w:tab w:val="num" w:pos="0"/>
-        </w:tabs>
-        <w:ind w:left="5040" w:hanging="360"/>
-      </w:pPr>
-      <w:rPr>
-        <w:rFonts w:ascii="Symbol" w:hAnsi="Symbol" w:cs="Symbol" w:hint="default"/>
-      </w:rPr>
-    </w:lvl>
-    <w:lvl w:ilvl="7">
-      <w:start w:val="1"/>
-      <w:numFmt w:val="bullet"/>
-      <w:lvlText w:val="o"/>
-      <w:lvlJc w:val="left"/>
-      <w:pPr>
-        <w:tabs>
-          <w:tab w:val="num" w:pos="0"/>
-        </w:tabs>
-        <w:ind w:left="5760" w:hanging="360"/>
-      </w:pPr>
-      <w:rPr>
-        <w:rFonts w:ascii="Courier New" w:hAnsi="Courier New" w:cs="Courier New" w:hint="default"/>
-      </w:rPr>
-    </w:lvl>
-    <w:lvl w:ilvl="8">
-      <w:start w:val="1"/>
-      <w:numFmt w:val="bullet"/>
-      <w:lvlText w:val=""/>
-      <w:lvlJc w:val="left"/>
-      <w:pPr>
-        <w:tabs>
-          <w:tab w:val="num" w:pos="0"/>
-        </w:tabs>
-        <w:ind w:left="6480" w:hanging="360"/>
-      </w:pPr>
-      <w:rPr>
-        <w:rFonts w:ascii="Wingdings" w:hAnsi="Wingdings" w:cs="Wingdings" w:hint="default"/>
-      </w:rPr>
-    </w:lvl>
-  </w:abstractNum>
-  <w:abstractNum w:abstractNumId="33">
     <w:lvl w:ilvl="0">
       <w:start w:val="1"/>
       <w:numFmt w:val="none"/>
@@ -24033,15 +23496,6 @@
   </w:num>
   <w:num w:numId="30">
     <w:abstractNumId w:val="30"/>
-  </w:num>
-  <w:num w:numId="31">
-    <w:abstractNumId w:val="31"/>
-  </w:num>
-  <w:num w:numId="32">
-    <w:abstractNumId w:val="32"/>
-  </w:num>
-  <w:num w:numId="33">
-    <w:abstractNumId w:val="33"/>
   </w:num>
 </w:numbering>
 </file>
@@ -24446,6 +23900,7 @@
     <w:qFormat/>
     <w:pPr>
       <w:widowControl/>
+      <w:suppressAutoHyphens w:val="true"/>
       <w:bidi w:val="0"/>
       <w:spacing w:lineRule="auto" w:line="276" w:before="0" w:after="200"/>
       <w:jc w:val="left"/>
@@ -24593,7 +24048,6 @@
   </w:style>
   <w:style w:type="character" w:styleId="FootnoteCharacters">
     <w:name w:val="Footnote Characters"/>
-    <w:basedOn w:val="DefaultParagraphFont"/>
     <w:uiPriority w:val="99"/>
     <w:semiHidden/>
     <w:unhideWhenUsed/>
@@ -24658,16 +24112,16 @@
       <w:color w:themeColor="text1" w:themeTint="bf" w:val="404040"/>
     </w:rPr>
   </w:style>
+  <w:style w:type="character" w:styleId="EndnoteCharacters">
+    <w:name w:val="Endnote Characters"/>
+    <w:qFormat/>
+    <w:rPr/>
+  </w:style>
   <w:style w:type="character" w:styleId="EndnoteReference">
     <w:name w:val="Endnote Reference"/>
     <w:rPr>
       <w:vertAlign w:val="superscript"/>
     </w:rPr>
-  </w:style>
-  <w:style w:type="character" w:styleId="EndnoteCharacters">
-    <w:name w:val="Endnote Characters"/>
-    <w:qFormat/>
-    <w:rPr/>
   </w:style>
   <w:style w:type="paragraph" w:styleId="Heading">
     <w:name w:val="Heading"/>

</xml_diff>